<commit_message>
Build-Skripte lesen Versionsnummer aus KI-Ökonomie.md
Bisher war die Version in build_pdf.py und build_docx.py hardcoded
("Version 16.0"). Bei Versionssprüngen wurden Markdown und Build-Skript
nicht synchron gepflegt - der PDF/DOCX-Footer zeigte v16.0, obwohl die
Markdown-Datei längst auf v19.0 stand.

Neue Logik: _extract_version() liest die Versionsnummer aus dem
Dokumentkopf der Markdown-Datei (Zeile **Version:** X.0). Daraus wird
DOC_VERSION_NUMBER abgeleitet, das an Footer, Deckseite und Metadaten
fliesst.

Daily-Update muss damit nur noch die Markdown-Versionsnummer pflegen,
PDF/DOCX ziehen automatisch nach.

PDF und DOCX neu gebaut - Footer zeigt jetzt korrekt v19.0.

https://claude.ai/code/session_01X4Y8FHCuGq6Ay5drV4mFuG
</commit_message>
<xml_diff>
--- a/KI-Ökonomie.docx
+++ b/KI-Ökonomie.docx
@@ -112,7 +112,7 @@
           <w:color w:val="666666"/>
           <w:sz w:val="18"/>
         </w:rPr>
-        <w:t>Version 16.0</w:t>
+        <w:t>Version 19.0</w:t>
       </w:r>
     </w:p>
     <w:p>
@@ -10319,7 +10319,7 @@
         <w:color w:val="999999"/>
         <w:sz w:val="15"/>
       </w:rPr>
-      <w:t>Version 16.0 — Mai 2026 — CC BY 4.0</w:t>
+      <w:t>Version 19.0 — Mai 2026 — CC BY 4.0</w:t>
       <w:tab/>
       <w:t xml:space="preserve">Seite </w:t>
     </w:r>

</xml_diff>

<commit_message>
Daily-Update 2026-05-07 — Version 20.0 (Cluster: D)
Lauf 002 (Tagesfolge zu Lauf 001 vom selben Tag) integriert das Bloomberg
Editorial Board *„Taxing Artificial Intelligence Would Hurt Innovation
and Prosperity"* (29. April 2026; syndizierte Fassung *„Taxing Artificial
Intelligence Would Be a Big Mistake"* via Advisor Perspectives 2. Mai,
RealClearPolitics 4. Mai, West Hawaii Today 5. Mai, Las Vegas Sun
6. Mai 2026) als mainstream-finanzpublizistische Gegenstimme zur
Sanders/OpenAI-Linie in § 4.5; § 11.5 und Aktualitätshinweis ergänzt.
Validierung gemäß Validierung.md durchlaufen, PDF und DOCX neu erstellt,
Versionssprung 19.0 → 20.0 in Hauptdokument, README und
Validierung-Ergebnisse.
</commit_message>
<xml_diff>
--- a/KI-Ökonomie.docx
+++ b/KI-Ökonomie.docx
@@ -2776,6 +2776,173 @@
           <w:i w:val="0"/>
           <w:sz w:val="19"/>
         </w:rPr>
+        <w:t>Bloomberg-Editorial (29. April 2026):</w:t>
+      </w:r>
+      <w:r>
+        <w:rPr>
+          <w:rFonts w:ascii="Arial" w:hAnsi="Arial"/>
+          <w:b w:val="0"/>
+          <w:i w:val="0"/>
+          <w:sz w:val="19"/>
+        </w:rPr>
+        <w:t xml:space="preserve"> Eine zusätzliche, mainstream-finanzpublizistische Gegenstimme zur Sanders/OpenAI-Linie hat die </w:t>
+      </w:r>
+      <w:r>
+        <w:rPr>
+          <w:rFonts w:ascii="Arial" w:hAnsi="Arial"/>
+          <w:b w:val="0"/>
+          <w:i/>
+          <w:sz w:val="19"/>
+        </w:rPr>
+        <w:t>Bloomberg Editorial Board</w:t>
+      </w:r>
+      <w:r>
+        <w:rPr>
+          <w:rFonts w:ascii="Arial" w:hAnsi="Arial"/>
+          <w:b w:val="0"/>
+          <w:i w:val="0"/>
+          <w:sz w:val="19"/>
+        </w:rPr>
+        <w:t xml:space="preserve"> am 29. April 2026 unter dem Titel </w:t>
+      </w:r>
+      <w:r>
+        <w:rPr>
+          <w:rFonts w:ascii="Arial" w:hAnsi="Arial"/>
+          <w:b w:val="0"/>
+          <w:i/>
+          <w:sz w:val="19"/>
+        </w:rPr>
+        <w:t>„Taxing Artificial Intelligence Would Hurt Innovation and Prosperity"</w:t>
+      </w:r>
+      <w:r>
+        <w:rPr>
+          <w:rFonts w:ascii="Arial" w:hAnsi="Arial"/>
+          <w:b w:val="0"/>
+          <w:i w:val="0"/>
+          <w:sz w:val="19"/>
+        </w:rPr>
+        <w:t xml:space="preserve"> (in der syndizierten Fassung </w:t>
+      </w:r>
+      <w:r>
+        <w:rPr>
+          <w:rFonts w:ascii="Arial" w:hAnsi="Arial"/>
+          <w:b w:val="0"/>
+          <w:i/>
+          <w:sz w:val="19"/>
+        </w:rPr>
+        <w:t>„Taxing Artificial Intelligence Would Be a Big Mistake"</w:t>
+      </w:r>
+      <w:r>
+        <w:rPr>
+          <w:rFonts w:ascii="Arial" w:hAnsi="Arial"/>
+          <w:b w:val="0"/>
+          <w:i w:val="0"/>
+          <w:sz w:val="19"/>
+        </w:rPr>
+        <w:t xml:space="preserve">, u. a. </w:t>
+      </w:r>
+      <w:r>
+        <w:rPr>
+          <w:rFonts w:ascii="Arial" w:hAnsi="Arial"/>
+          <w:b w:val="0"/>
+          <w:i/>
+          <w:sz w:val="19"/>
+        </w:rPr>
+        <w:t>Advisor Perspectives</w:t>
+      </w:r>
+      <w:r>
+        <w:rPr>
+          <w:rFonts w:ascii="Arial" w:hAnsi="Arial"/>
+          <w:b w:val="0"/>
+          <w:i w:val="0"/>
+          <w:sz w:val="19"/>
+        </w:rPr>
+        <w:t xml:space="preserve"> 2. Mai 2026, </w:t>
+      </w:r>
+      <w:r>
+        <w:rPr>
+          <w:rFonts w:ascii="Arial" w:hAnsi="Arial"/>
+          <w:b w:val="0"/>
+          <w:i/>
+          <w:sz w:val="19"/>
+        </w:rPr>
+        <w:t>RealClearPolitics</w:t>
+      </w:r>
+      <w:r>
+        <w:rPr>
+          <w:rFonts w:ascii="Arial" w:hAnsi="Arial"/>
+          <w:b w:val="0"/>
+          <w:i w:val="0"/>
+          <w:sz w:val="19"/>
+        </w:rPr>
+        <w:t xml:space="preserve"> 4. Mai 2026, </w:t>
+      </w:r>
+      <w:r>
+        <w:rPr>
+          <w:rFonts w:ascii="Arial" w:hAnsi="Arial"/>
+          <w:b w:val="0"/>
+          <w:i/>
+          <w:sz w:val="19"/>
+        </w:rPr>
+        <w:t>West Hawaii Today</w:t>
+      </w:r>
+      <w:r>
+        <w:rPr>
+          <w:rFonts w:ascii="Arial" w:hAnsi="Arial"/>
+          <w:b w:val="0"/>
+          <w:i w:val="0"/>
+          <w:sz w:val="19"/>
+        </w:rPr>
+        <w:t xml:space="preserve"> 5. Mai 2026, </w:t>
+      </w:r>
+      <w:r>
+        <w:rPr>
+          <w:rFonts w:ascii="Arial" w:hAnsi="Arial"/>
+          <w:b w:val="0"/>
+          <w:i/>
+          <w:sz w:val="19"/>
+        </w:rPr>
+        <w:t>Las Vegas Sun</w:t>
+      </w:r>
+      <w:r>
+        <w:rPr>
+          <w:rFonts w:ascii="Arial" w:hAnsi="Arial"/>
+          <w:b w:val="0"/>
+          <w:i w:val="0"/>
+          <w:sz w:val="19"/>
+        </w:rPr>
+        <w:t xml:space="preserve"> 6. Mai 2026) vorgelegt. Das Editorial argumentiert, eine fiskalische Eindämmung von KI-Diensten oder -Investitionen würde Innovation und damit Produktivität bremsen und im internationalen Wettbewerb einen relativen Niedergang gegenüber führenden Konkurrenten beschleunigen; eine praktikable Abgrenzung zwischen verdrängender Automatisierung und produktivitätsergänzender Augmentation sei nicht zu leisten, und welche Qualifikationen künftig gebraucht würden, lasse sich nicht prognostizieren. Statt einer Abgabe empfiehlt das Editorial im Konjunktiv eine Lockerung berufsrechtlicher Lizenzschranken, eine Reform der Arbeitslosenversicherung, gezielte Steueranreize für Umschulung und eine Ausweitung der </w:t>
+      </w:r>
+      <w:r>
+        <w:rPr>
+          <w:rFonts w:ascii="Arial" w:hAnsi="Arial"/>
+          <w:b w:val="0"/>
+          <w:i/>
+          <w:sz w:val="19"/>
+        </w:rPr>
+        <w:t>Earned Income Tax Credit</w:t>
+      </w:r>
+      <w:r>
+        <w:rPr>
+          <w:rFonts w:ascii="Arial" w:hAnsi="Arial"/>
+          <w:b w:val="0"/>
+          <w:i w:val="0"/>
+          <w:sz w:val="19"/>
+        </w:rPr>
+        <w:t xml:space="preserve"> zur Stützung verdrängter Beschäftigter. Die Position ergänzt die in § 3.3 (de la Feria) und § 3.4 (IW Köln/Hentze) referierten ökonomischen Einwände um eine prominente publizistische Stimme aus der Wirtschaftspresse — und liefert damit für die in Kapitel 10 zu treffende Bewertung das spiegelbildliche Pendant zu den OpenAI-/Sanders-Vorschlägen aus demselben Zeitfenster.</w:t>
+      </w:r>
+    </w:p>
+    <w:p>
+      <w:pPr>
+        <w:jc w:val="both"/>
+      </w:pPr>
+      <w:r>
+        <w:rPr>
+          <w:rFonts w:ascii="Arial" w:hAnsi="Arial"/>
+          <w:b/>
+          <w:i w:val="0"/>
+          <w:sz w:val="19"/>
+        </w:rPr>
         <w:t>Andrew Yang (CNBC-Interview, März 2026):</w:t>
       </w:r>
       <w:r>
@@ -10064,6 +10231,56 @@
       <w:r>
         <w:rPr>
           <w:rFonts w:ascii="Arial" w:hAnsi="Arial"/>
+          <w:b w:val="0"/>
+          <w:i w:val="0"/>
+          <w:sz w:val="19"/>
+        </w:rPr>
+        <w:t xml:space="preserve">Bloomberg Editorial Board. (29. April 2026). </w:t>
+      </w:r>
+      <w:r>
+        <w:rPr>
+          <w:rFonts w:ascii="Arial" w:hAnsi="Arial"/>
+          <w:b w:val="0"/>
+          <w:i/>
+          <w:sz w:val="19"/>
+        </w:rPr>
+        <w:t>Taxing Artificial Intelligence Would Hurt Innovation and Prosperity</w:t>
+      </w:r>
+      <w:r>
+        <w:rPr>
+          <w:rFonts w:ascii="Arial" w:hAnsi="Arial"/>
+          <w:b w:val="0"/>
+          <w:i w:val="0"/>
+          <w:sz w:val="19"/>
+        </w:rPr>
+        <w:t xml:space="preserve"> (syndizierte Fassung: </w:t>
+      </w:r>
+      <w:r>
+        <w:rPr>
+          <w:rFonts w:ascii="Arial" w:hAnsi="Arial"/>
+          <w:b w:val="0"/>
+          <w:i/>
+          <w:sz w:val="19"/>
+        </w:rPr>
+        <w:t>Taxing Artificial Intelligence Would Be a Big Mistake</w:t>
+      </w:r>
+      <w:r>
+        <w:rPr>
+          <w:rFonts w:ascii="Arial" w:hAnsi="Arial"/>
+          <w:b w:val="0"/>
+          <w:i w:val="0"/>
+          <w:sz w:val="19"/>
+        </w:rPr>
+        <w:t>, Advisor Perspectives 2. Mai 2026, RealClearPolitics 4. Mai 2026, West Hawaii Today 5. Mai 2026, Las Vegas Sun 6. Mai 2026). Mainstream-finanzpublizistische Gegenstimme zur Sanders/OpenAI-Linie; Argumente: Innovations- und Produktivitätsbremse, internationaler Wettbewerbsnachteil, Unmöglichkeit der Abgrenzung Verdrängung/Augmentation; alternative Empfehlungen: Lockerung berufsrechtlicher Lizenzschranken, Reform der Arbeitslosenversicherung, Steueranreize für Umschulung, Ausweitung der Earned Income Tax Credit. https://www.bloomberg.com/opinion/articles/2026-04-29/taxing-artificial-intelligence-would-hurt-innovation-and-prosperity | https://www.advisorperspectives.com/articles/2026/05/02/taxing-artificial-intelligence-big-mistake | https://www.realclearpolitics.com/2026/05/04/taxing_artificial_intelligence_would_be_a_big_mistake_698781.html | https://lasvegassun.com/news/2026/may/06/taxing-artificial-intelligence-would-be-a-big-mist/</w:t>
+      </w:r>
+    </w:p>
+    <w:p>
+      <w:pPr>
+        <w:jc w:val="both"/>
+      </w:pPr>
+      <w:r>
+        <w:rPr>
+          <w:rFonts w:ascii="Arial" w:hAnsi="Arial"/>
           <w:b/>
           <w:i w:val="0"/>
           <w:sz w:val="19"/>
@@ -10077,7 +10294,7 @@
           <w:i w:val="0"/>
           <w:sz w:val="19"/>
         </w:rPr>
-        <w:t xml:space="preserve"> Dieses Arbeitspapier gibt den Stand Anfang Mai 2026 (Schnitt am 7. Mai 2026 — abendliche Folgeaktualisierung) wieder. Die Debatte entwickelt sich dynamisch, insbesondere im Zuge der OpenAI-Strategiepapiere und der Eröffnung des OpenAI Workshop in Washington, D.C. im Mai 2026, des Erstdurchgangs des GKV-Beitragssatzstabilisierungsgesetzes in der 1065. Bundesratssitzung am 8. Mai 2026 mit 79 Tagesordnungspunkten (Kabinettsbeschluss 29. April 2026, parlamentarische Behandlung vor der Sommerpause 2026 angekündigt), der laufenden Trilog-Verhandlungen zum Digital Omnibus on AI (zweite Runde 28. April 2026 ohne Einigung; nächste Runde 13. Mai 2026 — Knackpunkt ist nicht die Verschiebung der Hochrisiko-Pflichten, sondern die Konformitätsbewertungs-Architektur für Anhang I; die zypriotische Ratspräsidentschaft strebt einen Abschluss vor Ablauf ihrer Amtszeit am 30. Juni 2026 an, andernfalls übernimmt die irische Präsidentschaft), der am 5. Mai 2026 erfolgten Arraignment-Verhandlung im Altman-Verfahren mit „nicht schuldig"-Plädoyer und angeordneter psychiatrischer Begutachtung, des am 7. Mai 2026 versandten individuellen Microsoft-Buyout-Angebots (Annahmefrist 8. Juni 2026, VRSAR-Unterzeichnung 9.–22. Juni 2026, bis zu fünfjährige Krankenversicherungs-Verlängerung), des am 1. Mai 2026 vom Connecticut-Repräsentantenhaus mit 131 zu 17 Stimmen verabschiedeten </w:t>
+        <w:t xml:space="preserve"> Dieses Arbeitspapier gibt den Stand Anfang Mai 2026 (Schnitt am 7. Mai 2026 — Lauf 002, abendliche Tagesaktualisierung) wieder. Die Debatte entwickelt sich dynamisch, insbesondere im Zuge der OpenAI-Strategiepapiere und der Eröffnung des OpenAI Workshop in Washington, D.C. im Mai 2026, des Erstdurchgangs des GKV-Beitragssatzstabilisierungsgesetzes in der 1065. Bundesratssitzung am 8. Mai 2026 mit 79 Tagesordnungspunkten (Kabinettsbeschluss 29. April 2026, parlamentarische Behandlung vor der Sommerpause 2026 angekündigt), der laufenden Trilog-Verhandlungen zum Digital Omnibus on AI (zweite Runde 28. April 2026 ohne Einigung; nächste Runde 13. Mai 2026 — Knackpunkt ist nicht die Verschiebung der Hochrisiko-Pflichten, sondern die Konformitätsbewertungs-Architektur für Anhang I; die zypriotische Ratspräsidentschaft strebt einen Abschluss vor Ablauf ihrer Amtszeit am 30. Juni 2026 an, andernfalls übernimmt die irische Präsidentschaft), der am 5. Mai 2026 erfolgten Arraignment-Verhandlung im Altman-Verfahren mit „nicht schuldig"-Plädoyer und angeordneter psychiatrischer Begutachtung, des am 7. Mai 2026 versandten individuellen Microsoft-Buyout-Angebots (Annahmefrist 8. Juni 2026, VRSAR-Unterzeichnung 9.–22. Juni 2026, bis zu fünfjährige Krankenversicherungs-Verlängerung), des am 1. Mai 2026 vom Connecticut-Repräsentantenhaus mit 131 zu 17 Stimmen verabschiedeten </w:t>
       </w:r>
       <w:r>
         <w:rPr>
@@ -10239,7 +10456,25 @@
           <w:i w:val="0"/>
           <w:sz w:val="19"/>
         </w:rPr>
-        <w:t xml:space="preserve"> 2. Juli 2026) und des Yale-Budget-Lab-Befundes vom April/6. Mai 2026 (kein aggregierter KI-Disruptionseffekt im US-Arbeitsmarkt; fiskalische Modellrechnung 39 Bio. USD Schulden vs. 5.500–42.400 USD Übergangshilfe pro Verdrängtem) sowie des Big-Tech-AI-Capex-Programms 2026 mit einem Q1-Volumen von rund 130,65 Milliarden US-Dollar und einer Konsens-Schätzung von 660–700 Milliarden US-Dollar für das Gesamtjahr. Eine regelmäßige Aktualisierung ist vorgesehen.</w:t>
+        <w:t xml:space="preserve"> 2. Juli 2026) und des Yale-Budget-Lab-Befundes vom April/6. Mai 2026 (kein aggregierter KI-Disruptionseffekt im US-Arbeitsmarkt; fiskalische Modellrechnung 39 Bio. USD Schulden vs. 5.500–42.400 USD Übergangshilfe pro Verdrängtem), des Big-Tech-AI-Capex-Programms 2026 mit einem Q1-Volumen von rund 130,65 Milliarden US-Dollar und einer Konsens-Schätzung von 660–700 Milliarden US-Dollar für das Gesamtjahr sowie des am 29. April 2026 veröffentlichten </w:t>
+      </w:r>
+      <w:r>
+        <w:rPr>
+          <w:rFonts w:ascii="Arial" w:hAnsi="Arial"/>
+          <w:b w:val="0"/>
+          <w:i/>
+          <w:sz w:val="19"/>
+        </w:rPr>
+        <w:t>Bloomberg-Editorials</w:t>
+      </w:r>
+      <w:r>
+        <w:rPr>
+          <w:rFonts w:ascii="Arial" w:hAnsi="Arial"/>
+          <w:b w:val="0"/>
+          <w:i w:val="0"/>
+          <w:sz w:val="19"/>
+        </w:rPr>
+        <w:t xml:space="preserve"> gegen eine KI-Steuer (syndiziert in Advisor Perspectives, RealClearPolitics, West Hawaii Today und Las Vegas Sun zwischen dem 2. und 6. Mai 2026), das Innovationsbremse, Wettbewerbsnachteil und Unmöglichkeit der Abgrenzung Verdrängung/Augmentation als Hauptargumente gegen die Sanders/OpenAI-Linie führt und stattdessen Lockerung berufsrechtlicher Lizenzschranken, Reform der Arbeitslosenversicherung, Umschulungs-Steueranreize sowie eine Ausweitung der Earned Income Tax Credit empfiehlt. Eine regelmäßige Aktualisierung ist vorgesehen.</w:t>
       </w:r>
     </w:p>
     <w:p>

</xml_diff>

<commit_message>
Build PDF/DOCX aus Version 20.0 nach Merge (Reproduzierbarkeit)
</commit_message>
<xml_diff>
--- a/KI-Ökonomie.docx
+++ b/KI-Ökonomie.docx
@@ -112,7 +112,7 @@
           <w:color w:val="666666"/>
           <w:sz w:val="18"/>
         </w:rPr>
-        <w:t>Version 16.0</w:t>
+        <w:t>Version 20.0</w:t>
       </w:r>
     </w:p>
     <w:p>
@@ -10554,7 +10554,7 @@
         <w:color w:val="999999"/>
         <w:sz w:val="15"/>
       </w:rPr>
-      <w:t>Version 16.0 — Mai 2026 — CC BY 4.0</w:t>
+      <w:t>Version 20.0 — Mai 2026 — CC BY 4.0</w:t>
       <w:tab/>
       <w:t xml:space="preserve">Seite </w:t>
     </w:r>

</xml_diff>

<commit_message>
Daily-Update 2026-05-07 — Version 21.0 (Cluster: F)
Lauf 003 (dritte Tagesaktualisierung) verfeinert in § 1.1 das
Hyperscaler-AI-Capex-Aggregat 2026: nach den Q1-2026-Earnings-Calls
vom 28.–30. April 2026 von der Konsens-Schätzung 660–700 Mrd. USD auf
rund 725 Mrd. USD nach oben revidiert (+77 % gegenüber 410 Mrd. USD
2025; Microsoft 190, Alphabet 190, Amazon 200, Meta 125–145 Mrd. USD).
Komponentenkostentreiber DRAM-Verteuerung +95 % q/q im Q1 2026
(TrendForce), +58–63 % Q2-Projektion; Microsoft führt rund 25 Mrd. USD
des eigenen Aufschlags auf gestiegene Speicher- und Chip-Kosten zurück.
Alte Konsens-Größe als zeitlich frühere Referenz Anfang April 2026
erhalten (Claude.md § 4.2). § 11.5 um Sammelbeleg Tom's Hardware /
Statista / Invezz erweitert; README, Aktualitätshinweis und
Validierung-Ergebnisse auf 21.0 aktualisiert; PDF/DOCX neu gebaut.
</commit_message>
<xml_diff>
--- a/KI-Ökonomie.docx
+++ b/KI-Ökonomie.docx
@@ -112,7 +112,7 @@
           <w:color w:val="666666"/>
           <w:sz w:val="18"/>
         </w:rPr>
-        <w:t>Version 20.0</w:t>
+        <w:t>Version 21.0</w:t>
       </w:r>
     </w:p>
     <w:p>
@@ -310,7 +310,61 @@
           <w:i w:val="0"/>
           <w:sz w:val="19"/>
         </w:rPr>
-        <w:t xml:space="preserve"> (12.000 bis 15.000 Stellen weltweit unter dem internen Programm „Project Leap", Abfindungsaufwand 230 bis 320 Millionen US-Dollar; bei rund 357.000 Beschäftigten weltweit und 250.000 in Indien dürfte der Großteil der Streichungen den dortigen Standort treffen) gespeist sind; der parallele Lauf der Branchen-AI-Capex-Programme (Q1-2026-Investitionen der Hyperscaler von rund 130,65 Milliarden US-Dollar; Konsens-Schätzung für 2026 zwischen 660 und 700 Milliarden US-Dollar; Ausblick auf über 1 Billion US-Dollar im Jahr 2027) verdeutlicht die Asymmetrie zwischen Personalreduktion und Infrastrukturausbau, die die Steuerdebatte über die Anknüpfung an Maschinenkapital (§ 5.1, § 8.3) zusätzlich strukturiert. Eine ergänzende Auswertung von Goldman Sachs (Anfang April 2026) schätzt den US-weiten KI-Verdrängungseffekt auf rund 16.000 Stellen pro Monat, mit überproportionaler Betroffenheit von Berufseinsteigerinnen und -einsteigern (Gen Z) in routinisierten Bürotätigkeiten — diese Größenordnung stützt die in § 3.5 referierten Beobachtungen aus dem </w:t>
+        <w:t xml:space="preserve"> (12.000 bis 15.000 Stellen weltweit unter dem internen Programm „Project Leap", Abfindungsaufwand 230 bis 320 Millionen US-Dollar; bei rund 357.000 Beschäftigten weltweit und 250.000 in Indien dürfte der Großteil der Streichungen den dortigen Standort treffen) gespeist sind; der parallele Lauf der Branchen-AI-Capex-Programme (Q1-2026-Investitionen der Hyperscaler von rund 130,65 Milliarden US-Dollar; Konsens-Schätzung Anfang April 2026 zwischen 660 und 700 Milliarden US-Dollar, nach den Q1-2026-Earnings-Calls vom 28.–30. April 2026 — von der </w:t>
+      </w:r>
+      <w:r>
+        <w:rPr>
+          <w:rFonts w:ascii="Arial" w:hAnsi="Arial"/>
+          <w:b w:val="0"/>
+          <w:i/>
+          <w:sz w:val="19"/>
+        </w:rPr>
+        <w:t>Financial Times</w:t>
+      </w:r>
+      <w:r>
+        <w:rPr>
+          <w:rFonts w:ascii="Arial" w:hAnsi="Arial"/>
+          <w:b w:val="0"/>
+          <w:i w:val="0"/>
+          <w:sz w:val="19"/>
+        </w:rPr>
+        <w:t xml:space="preserve"> aggregiert und Anfang Mai 2026 unter anderem von </w:t>
+      </w:r>
+      <w:r>
+        <w:rPr>
+          <w:rFonts w:ascii="Arial" w:hAnsi="Arial"/>
+          <w:b w:val="0"/>
+          <w:i/>
+          <w:sz w:val="19"/>
+        </w:rPr>
+        <w:t>Tom's Hardware</w:t>
+      </w:r>
+      <w:r>
+        <w:rPr>
+          <w:rFonts w:ascii="Arial" w:hAnsi="Arial"/>
+          <w:b w:val="0"/>
+          <w:i w:val="0"/>
+          <w:sz w:val="19"/>
+        </w:rPr>
+        <w:t xml:space="preserve"> (5./6. Mai 2026) und </w:t>
+      </w:r>
+      <w:r>
+        <w:rPr>
+          <w:rFonts w:ascii="Arial" w:hAnsi="Arial"/>
+          <w:b w:val="0"/>
+          <w:i/>
+          <w:sz w:val="19"/>
+        </w:rPr>
+        <w:t>Invezz</w:t>
+      </w:r>
+      <w:r>
+        <w:rPr>
+          <w:rFonts w:ascii="Arial" w:hAnsi="Arial"/>
+          <w:b w:val="0"/>
+          <w:i w:val="0"/>
+          <w:sz w:val="19"/>
+        </w:rPr>
+        <w:t xml:space="preserve"> (4. Mai 2026) referiert — auf rund 725 Milliarden US-Dollar nach oben revidiert, eine Steigerung um rund 77 % gegenüber dem Vorjahresniveau von 410 Milliarden US-Dollar; Microsoft 190, Alphabet 190, Amazon 200 und Meta 125–145 Milliarden US-Dollar, wobei Microsoft rund 25 Milliarden US-Dollar des eigenen Aufschlags auf gestiegene Speicher- und Chip-Kosten zurückführt — DRAM-Vertragspreise sind nach Auswertung von TrendForce im ersten Quartal 2026 um rund 95 % gegenüber dem Vorquartal gestiegen, mit einer für das zweite Quartal projizierten weiteren Verteuerung von 58 bis 63 %; Ausblick auf über 1 Billion US-Dollar im Jahr 2027) verdeutlicht die Asymmetrie zwischen Personalreduktion und Infrastrukturausbau, die die Steuerdebatte über die Anknüpfung an Maschinenkapital (§ 5.1, § 8.3) zusätzlich strukturiert. Eine ergänzende Auswertung von Goldman Sachs (Anfang April 2026) schätzt den US-weiten KI-Verdrängungseffekt auf rund 16.000 Stellen pro Monat, mit überproportionaler Betroffenheit von Berufseinsteigerinnen und -einsteigern (Gen Z) in routinisierten Bürotätigkeiten — diese Größenordnung stützt die in § 3.5 referierten Beobachtungen aus dem </w:t>
       </w:r>
       <w:r>
         <w:rPr>
@@ -10107,6 +10161,56 @@
           <w:i w:val="0"/>
           <w:sz w:val="19"/>
         </w:rPr>
+        <w:t xml:space="preserve">Tom's Hardware / Statista / Invezz. (Anfang Mai 2026). </w:t>
+      </w:r>
+      <w:r>
+        <w:rPr>
+          <w:rFonts w:ascii="Arial" w:hAnsi="Arial"/>
+          <w:b w:val="0"/>
+          <w:i/>
+          <w:sz w:val="19"/>
+        </w:rPr>
+        <w:t>Google, Microsoft, Meta, and Amazon capex spending to hit $725 billion in 2026, up 77% from last year — analyst says bear thesis is „garbage" / Skyrocketing component prices push Big Tech capex to record $725 billion — Microsoft alone attributes $25 billion of AI budget to increased memory and chip costs / Big Tech's AI Spending to Reach $725 Billion in 2026 / Is Big Tech's $725B AI splurge being funded by mass layoffs?</w:t>
+      </w:r>
+      <w:r>
+        <w:rPr>
+          <w:rFonts w:ascii="Arial" w:hAnsi="Arial"/>
+          <w:b w:val="0"/>
+          <w:i w:val="0"/>
+          <w:sz w:val="19"/>
+        </w:rPr>
+        <w:t xml:space="preserve"> Aggregat-Total nach Q1-2026-Earnings-Calls (28.–30. April 2026), von der </w:t>
+      </w:r>
+      <w:r>
+        <w:rPr>
+          <w:rFonts w:ascii="Arial" w:hAnsi="Arial"/>
+          <w:b w:val="0"/>
+          <w:i/>
+          <w:sz w:val="19"/>
+        </w:rPr>
+        <w:t>Financial Times</w:t>
+      </w:r>
+      <w:r>
+        <w:rPr>
+          <w:rFonts w:ascii="Arial" w:hAnsi="Arial"/>
+          <w:b w:val="0"/>
+          <w:i w:val="0"/>
+          <w:sz w:val="19"/>
+        </w:rPr>
+        <w:t xml:space="preserve"> zusammengeführt: Microsoft 190 Mrd. USD, Alphabet 190 Mrd. USD, Amazon 200 Mrd. USD, Meta 125–145 Mrd. USD; +77 % gegenüber 410 Mrd. USD im Jahr 2025. Komponentenkosten: DRAM-Vertragspreise +95 % q/q im Q1 2026 (TrendForce), +58–63 % für Q2 2026 projiziert; Microsoft führt rund 25 Mrd. USD des Aufschlags auf gestiegene Speicher- und Chip-Kosten zurück. https://www.tomshardware.com/tech-industry/big-tech/big-techs-ai-spending-plans-reach-725-billion | https://www.tomshardware.com/tech-industry/big-tech/microsoft-attributed-25-billion-of-its-record-ai-budget-to-memory-chip-costs | https://www.statista.com/chart/35046/capital-expenditure-of-meta-alphabet-amazon-and-microsoft/ | https://invezz.com/news/2026/05/04/is-big-techs-725b-ai-splurge-being-funded-by-mass-layoffs/</w:t>
+      </w:r>
+    </w:p>
+    <w:p>
+      <w:pPr>
+        <w:jc w:val="both"/>
+      </w:pPr>
+      <w:r>
+        <w:rPr>
+          <w:rFonts w:ascii="Arial" w:hAnsi="Arial"/>
+          <w:b w:val="0"/>
+          <w:i w:val="0"/>
+          <w:sz w:val="19"/>
+        </w:rPr>
         <w:t xml:space="preserve">Washington Times / WSLS / Boston Globe / Las Vegas Sun / Local10 / Greenfield Reporter. (5. Mai 2026). </w:t>
       </w:r>
       <w:r>
@@ -10294,7 +10398,7 @@
           <w:i w:val="0"/>
           <w:sz w:val="19"/>
         </w:rPr>
-        <w:t xml:space="preserve"> Dieses Arbeitspapier gibt den Stand Anfang Mai 2026 (Schnitt am 7. Mai 2026 — Lauf 002, abendliche Tagesaktualisierung) wieder. Die Debatte entwickelt sich dynamisch, insbesondere im Zuge der OpenAI-Strategiepapiere und der Eröffnung des OpenAI Workshop in Washington, D.C. im Mai 2026, des Erstdurchgangs des GKV-Beitragssatzstabilisierungsgesetzes in der 1065. Bundesratssitzung am 8. Mai 2026 mit 79 Tagesordnungspunkten (Kabinettsbeschluss 29. April 2026, parlamentarische Behandlung vor der Sommerpause 2026 angekündigt), der laufenden Trilog-Verhandlungen zum Digital Omnibus on AI (zweite Runde 28. April 2026 ohne Einigung; nächste Runde 13. Mai 2026 — Knackpunkt ist nicht die Verschiebung der Hochrisiko-Pflichten, sondern die Konformitätsbewertungs-Architektur für Anhang I; die zypriotische Ratspräsidentschaft strebt einen Abschluss vor Ablauf ihrer Amtszeit am 30. Juni 2026 an, andernfalls übernimmt die irische Präsidentschaft), der am 5. Mai 2026 erfolgten Arraignment-Verhandlung im Altman-Verfahren mit „nicht schuldig"-Plädoyer und angeordneter psychiatrischer Begutachtung, des am 7. Mai 2026 versandten individuellen Microsoft-Buyout-Angebots (Annahmefrist 8. Juni 2026, VRSAR-Unterzeichnung 9.–22. Juni 2026, bis zu fünfjährige Krankenversicherungs-Verlängerung), des am 1. Mai 2026 vom Connecticut-Repräsentantenhaus mit 131 zu 17 Stimmen verabschiedeten </w:t>
+        <w:t xml:space="preserve"> Dieses Arbeitspapier gibt den Stand Anfang Mai 2026 (Schnitt am 7. Mai 2026 — Lauf 003, dritte Tagesaktualisierung) wieder. Die Debatte entwickelt sich dynamisch, insbesondere im Zuge der OpenAI-Strategiepapiere und der Eröffnung des OpenAI Workshop in Washington, D.C. im Mai 2026, des Erstdurchgangs des GKV-Beitragssatzstabilisierungsgesetzes in der 1065. Bundesratssitzung am 8. Mai 2026 mit 79 Tagesordnungspunkten (Kabinettsbeschluss 29. April 2026, parlamentarische Behandlung vor der Sommerpause 2026 angekündigt), der laufenden Trilog-Verhandlungen zum Digital Omnibus on AI (zweite Runde 28. April 2026 ohne Einigung; nächste Runde 13. Mai 2026 — Knackpunkt ist nicht die Verschiebung der Hochrisiko-Pflichten, sondern die Konformitätsbewertungs-Architektur für Anhang I; die zypriotische Ratspräsidentschaft strebt einen Abschluss vor Ablauf ihrer Amtszeit am 30. Juni 2026 an, andernfalls übernimmt die irische Präsidentschaft), der am 5. Mai 2026 erfolgten Arraignment-Verhandlung im Altman-Verfahren mit „nicht schuldig"-Plädoyer und angeordneter psychiatrischer Begutachtung, des am 7. Mai 2026 versandten individuellen Microsoft-Buyout-Angebots (Annahmefrist 8. Juni 2026, VRSAR-Unterzeichnung 9.–22. Juni 2026, bis zu fünfjährige Krankenversicherungs-Verlängerung), des am 1. Mai 2026 vom Connecticut-Repräsentantenhaus mit 131 zu 17 Stimmen verabschiedeten </w:t>
       </w:r>
       <w:r>
         <w:rPr>
@@ -10456,7 +10560,7 @@
           <w:i w:val="0"/>
           <w:sz w:val="19"/>
         </w:rPr>
-        <w:t xml:space="preserve"> 2. Juli 2026) und des Yale-Budget-Lab-Befundes vom April/6. Mai 2026 (kein aggregierter KI-Disruptionseffekt im US-Arbeitsmarkt; fiskalische Modellrechnung 39 Bio. USD Schulden vs. 5.500–42.400 USD Übergangshilfe pro Verdrängtem), des Big-Tech-AI-Capex-Programms 2026 mit einem Q1-Volumen von rund 130,65 Milliarden US-Dollar und einer Konsens-Schätzung von 660–700 Milliarden US-Dollar für das Gesamtjahr sowie des am 29. April 2026 veröffentlichten </w:t>
+        <w:t xml:space="preserve"> 2. Juli 2026) und des Yale-Budget-Lab-Befundes vom April/6. Mai 2026 (kein aggregierter KI-Disruptionseffekt im US-Arbeitsmarkt; fiskalische Modellrechnung 39 Bio. USD Schulden vs. 5.500–42.400 USD Übergangshilfe pro Verdrängtem), des Big-Tech-AI-Capex-Programms 2026 mit einem Q1-Volumen von rund 130,65 Milliarden US-Dollar und einer nach den Q1-2026-Earnings-Calls (28.–30. April 2026) auf rund 725 Milliarden US-Dollar (+77 % gegenüber 410 Mrd. USD in 2025; Microsoft 190, Alphabet 190, Amazon 200, Meta 125–145 Mrd. USD; rund 25 Mrd. USD Microsoft-Aufschlag durch DRAM-Verteuerung von rund 95 % q/q im Q1 erklärt) nach oben revidierten Aggregat-Schätzung für das Gesamtjahr (zuvor 660–700 Mrd. USD Anfang April 2026) sowie des am 29. April 2026 veröffentlichten </w:t>
       </w:r>
       <w:r>
         <w:rPr>
@@ -10554,7 +10658,7 @@
         <w:color w:val="999999"/>
         <w:sz w:val="15"/>
       </w:rPr>
-      <w:t>Version 20.0 — Mai 2026 — CC BY 4.0</w:t>
+      <w:t>Version 21.0 — Mai 2026 — CC BY 4.0</w:t>
       <w:tab/>
       <w:t xml:space="preserve">Seite </w:t>
     </w:r>

</xml_diff>

<commit_message>
Daily-Update 2026-05-08 — Version 22.0 (Cluster: F)
Cloudflare-Layoff (7. Mai 2026, 1.100 Stellen / 20 %, agentic-AI-first),
Challenger April-2026-Report (KI YTD 16 % aller 2026-Plaene) und
TrueUp-Tagesfortschreibung 8. Mai 2026 (127.411 / 283, > 1.003/Tag) in
§ 1.1 eingearbeitet; § 11.5 mit drei neuen Sammelbelegen ergaenzt;
Aktualitaetshinweis und README mit Versionseintrag 22.0 fortgeschrieben;
neuer Validierungsblock (Pruefschritte 2.1.1 - 2.6 alle OK) angelegt.
</commit_message>
<xml_diff>
--- a/KI-Ökonomie.docx
+++ b/KI-Ökonomie.docx
@@ -112,7 +112,7 @@
           <w:color w:val="666666"/>
           <w:sz w:val="18"/>
         </w:rPr>
-        <w:t>Version 21.0</w:t>
+        <w:t>Version 22.0</w:t>
       </w:r>
     </w:p>
     <w:p>
@@ -238,7 +238,7 @@
           <w:i w:val="0"/>
           <w:sz w:val="19"/>
         </w:rPr>
-        <w:t xml:space="preserve"> fällt auf den 2. Juli 2026; nach den am 7. Mai 2026 publizierten Programmkonditionen sind rund 8.500 Beschäftigte angebotsberechtigt, das Paket umfasst eine Cash-Einmalzahlung sowie eine bis zu fünfjährige Krankenversicherungs-Verlängerung und enthält keine Wettbewerbs- oder Beschäftigungsverbote. Im Zusammenspiel mit den am selben Tag bekräftigten Meta-Streichungen ordneten Wirtschaftsmedien (CNBC, 24. April 2026) die Welle erstmals als „AI-driven labor crisis" ein — ein Begriff, der den Übergang von Einzelfällen zu einer kumulativen Branchenerzählung markiert. Bis zur Wochenmitte des 25. April 2026 weisen Branchen-Tracker einen kumulierten Bestand von über 92.000 Tech-Stellenstreichungen für das laufende Jahr 2026 aus; eine Aktualisierung zum 2. Mai 2026 hebt die Marke nach Tracker-Methodik des SkillSyncer auf 113.863 betroffene Beschäftigte aus 179 erfassten Layoff-Ereignissen (durchschnittlich rund 933 Stellen pro Tag), während TrueUp parallel 95.878 Personen aus 249 Einzelmeldungen zählt; die Methodikspanne erklärt die unterschiedlichen Größenordnungen, das Niveau einer sechsstelligen Tech-Reduktion innerhalb von vier Monaten ist über alle Tracker hinweg konsistent. Eine erneute Aktualisierung zum 6. Mai 2026 zeigt, dass die TrueUp-Zählung weiter auf 119.721 betroffene Personen aus 265 Layoff-Meldungen gestiegen ist (rund 958 Stellen pro Tag), während SkillSyncer mit 113.863 Personen aus 179 Ereignissen weitgehend unverändert bleibt; eine Tagesfortschreibung der TrueUp-Methodik weist zum 7. Mai 2026 bereits 121.111 Personen aus 273 Layoff-Meldungen aus (rund 961 Personen pro Tag), wobei die zusätzlichen Meldungen primär aus den am 5./6. Mai 2026 angekündigten Stellenstreichungen bei </w:t>
+        <w:t xml:space="preserve"> fällt auf den 2. Juli 2026; nach den am 7. Mai 2026 publizierten Programmkonditionen sind rund 8.500 Beschäftigte angebotsberechtigt, das Paket umfasst eine Cash-Einmalzahlung sowie eine bis zu fünfjährige Krankenversicherungs-Verlängerung und enthält keine Wettbewerbs- oder Beschäftigungsverbote. Im Zusammenspiel mit den am selben Tag bekräftigten Meta-Streichungen ordneten Wirtschaftsmedien (CNBC, 24. April 2026) die Welle erstmals als „AI-driven labor crisis" ein — ein Begriff, der den Übergang von Einzelfällen zu einer kumulativen Branchenerzählung markiert. Bis zur Wochenmitte des 25. April 2026 weisen Branchen-Tracker einen kumulierten Bestand von über 92.000 Tech-Stellenstreichungen für das laufende Jahr 2026 aus; eine Aktualisierung zum 2. Mai 2026 hebt die Marke nach Tracker-Methodik des SkillSyncer auf 113.863 betroffene Beschäftigte aus 179 erfassten Layoff-Ereignissen (durchschnittlich rund 933 Stellen pro Tag), während TrueUp parallel 95.878 Personen aus 249 Einzelmeldungen zählt; die Methodikspanne erklärt die unterschiedlichen Größenordnungen, das Niveau einer sechsstelligen Tech-Reduktion innerhalb von vier Monaten ist über alle Tracker hinweg konsistent. Eine erneute Aktualisierung zum 6. Mai 2026 zeigt, dass die TrueUp-Zählung weiter auf 119.721 betroffene Personen aus 265 Layoff-Meldungen gestiegen ist (rund 958 Stellen pro Tag), während SkillSyncer mit 113.863 Personen aus 179 Ereignissen weitgehend unverändert bleibt; eine Tagesfortschreibung der TrueUp-Methodik weist zum 7. Mai 2026 bereits 121.111 Personen aus 273 Layoff-Meldungen aus (rund 961 Personen pro Tag); die nochmalige Aktualisierung zum 8. Mai 2026 hebt die Marke nach den am Vortag angekündigten Cloudflare-Streichungen auf 127.411 betroffene Personen aus 283 Layoff-Meldungen (rund 1.003 Stellen pro Tag), wobei die zusätzlichen Meldungen primär aus den am 5./6. Mai 2026 angekündigten Stellenstreichungen bei </w:t>
       </w:r>
       <w:r>
         <w:rPr>
@@ -310,7 +310,79 @@
           <w:i w:val="0"/>
           <w:sz w:val="19"/>
         </w:rPr>
-        <w:t xml:space="preserve"> (12.000 bis 15.000 Stellen weltweit unter dem internen Programm „Project Leap", Abfindungsaufwand 230 bis 320 Millionen US-Dollar; bei rund 357.000 Beschäftigten weltweit und 250.000 in Indien dürfte der Großteil der Streichungen den dortigen Standort treffen) gespeist sind; der parallele Lauf der Branchen-AI-Capex-Programme (Q1-2026-Investitionen der Hyperscaler von rund 130,65 Milliarden US-Dollar; Konsens-Schätzung Anfang April 2026 zwischen 660 und 700 Milliarden US-Dollar, nach den Q1-2026-Earnings-Calls vom 28.–30. April 2026 — von der </w:t>
+        <w:t xml:space="preserve"> (12.000 bis 15.000 Stellen weltweit unter dem internen Programm „Project Leap", Abfindungsaufwand 230 bis 320 Millionen US-Dollar; bei rund 357.000 Beschäftigten weltweit und 250.000 in Indien dürfte der Großteil der Streichungen den dortigen Standort treffen) sowie aus der am 7. Mai 2026 vom Cloud-Anbieter </w:t>
+      </w:r>
+      <w:r>
+        <w:rPr>
+          <w:rFonts w:ascii="Arial" w:hAnsi="Arial"/>
+          <w:b w:val="0"/>
+          <w:i/>
+          <w:sz w:val="19"/>
+        </w:rPr>
+        <w:t>Cloudflare</w:t>
+      </w:r>
+      <w:r>
+        <w:rPr>
+          <w:rFonts w:ascii="Arial" w:hAnsi="Arial"/>
+          <w:b w:val="0"/>
+          <w:i w:val="0"/>
+          <w:sz w:val="19"/>
+        </w:rPr>
+        <w:t xml:space="preserve"> parallel zu den Q1-2026-Quartalszahlen (Umsatz +34 % gegenüber dem Vorjahr) angekündigten Streichung von rund 1.100 Stellen — etwa 20 % der globalen Belegschaft — als Übergang zu einem „agentic AI-first operating model" gespeist sind; der gemeinsame Mitarbeitendenbrief von Vorstandsvorsitzendem Matthew Prince und Mitgründerin Michelle Zatlyn („Building for the future") begründet die Reduktion ausdrücklich nicht als Kostenmaßnahme oder leistungsabhängige Auswahl, sondern als strukturelle Anpassung an einen über das Quartal um rund 600 % gestiegenen unternehmensinternen KI-Einsatz; das Restrukturierungsvolumen wird mit 140 bis 150 Millionen US-Dollar im zweiten Quartal beziffert, ausscheidende Beschäftigte erhalten ihre Grundvergütung bis Ende 2026, US-Beschäftigte zusätzlich Krankenversicherungsschutz bis Jahresende und Equity-Vesting bis 15. August 2026; der Aktienkurs gab nach Bekanntgabe rund 18 % ab. Eine Aggregat-Bestätigung dieser Welle liefert der </w:t>
+      </w:r>
+      <w:r>
+        <w:rPr>
+          <w:rFonts w:ascii="Arial" w:hAnsi="Arial"/>
+          <w:b w:val="0"/>
+          <w:i/>
+          <w:sz w:val="19"/>
+        </w:rPr>
+        <w:t>April-2026-Job-Cuts-Report</w:t>
+      </w:r>
+      <w:r>
+        <w:rPr>
+          <w:rFonts w:ascii="Arial" w:hAnsi="Arial"/>
+          <w:b w:val="0"/>
+          <w:i w:val="0"/>
+          <w:sz w:val="19"/>
+        </w:rPr>
+        <w:t xml:space="preserve"> von </w:t>
+      </w:r>
+      <w:r>
+        <w:rPr>
+          <w:rFonts w:ascii="Arial" w:hAnsi="Arial"/>
+          <w:b w:val="0"/>
+          <w:i/>
+          <w:sz w:val="19"/>
+        </w:rPr>
+        <w:t>Challenger, Gray &amp; Christmas</w:t>
+      </w:r>
+      <w:r>
+        <w:rPr>
+          <w:rFonts w:ascii="Arial" w:hAnsi="Arial"/>
+          <w:b w:val="0"/>
+          <w:i w:val="0"/>
+          <w:sz w:val="19"/>
+        </w:rPr>
+        <w:t xml:space="preserve"> (veröffentlicht zum 1. Mai 2026): KI ist nach März 2026 zum zweiten Mal in Folge der am häufigsten genannte Einzelgrund für US-Stellenstreichungen mit 21.490 angekündigten KI-bezogenen Streichungen im April 2026 — entsprechend 26 % der insgesamt 83.387 Streichungen des Monats und einer Steigerung um 38 % gegenüber März 2026; im laufenden Jahr liegt die Tech-Branche bei 85.411 Streichungen kumuliert (+33 % gegenüber dem Vorjahresstand) und KI-bezogen bei 49.135 — entsprechend rund 16 % aller bislang im Jahr 2026 angekündigten Streichungen, gegenüber rund 13 % zum März-Stand; gesamtwirtschaftlich sind die Streichungen 2026 nach Challenger-Methodik bislang um rund 50 % unter dem Vorjahresvergleichszeitraum, was die in der </w:t>
+      </w:r>
+      <w:r>
+        <w:rPr>
+          <w:rFonts w:ascii="Arial" w:hAnsi="Arial"/>
+          <w:b w:val="0"/>
+          <w:i/>
+          <w:sz w:val="19"/>
+        </w:rPr>
+        <w:t>Washington-Post</w:t>
+      </w:r>
+      <w:r>
+        <w:rPr>
+          <w:rFonts w:ascii="Arial" w:hAnsi="Arial"/>
+          <w:b w:val="0"/>
+          <w:i w:val="0"/>
+          <w:sz w:val="19"/>
+        </w:rPr>
+        <w:t xml:space="preserve">-Differenzierung vom 1. Mai 2026 genannte Mehrkanalerklärung (KI-Verdrängung, Austerity-Logik, Pandemie-Korrekturen, Routine-Restrukturierung) zusätzlich stützt. Der parallele Lauf der Branchen-AI-Capex-Programme (Q1-2026-Investitionen der Hyperscaler von rund 130,65 Milliarden US-Dollar; Konsens-Schätzung Anfang April 2026 zwischen 660 und 700 Milliarden US-Dollar, nach den Q1-2026-Earnings-Calls vom 28.–30. April 2026 — von der </w:t>
       </w:r>
       <w:r>
         <w:rPr>
@@ -10001,6 +10073,102 @@
           <w:i w:val="0"/>
           <w:sz w:val="19"/>
         </w:rPr>
+        <w:t xml:space="preserve">TrueUp / InformationWeek. (Stand 8. Mai 2026). </w:t>
+      </w:r>
+      <w:r>
+        <w:rPr>
+          <w:rFonts w:ascii="Arial" w:hAnsi="Arial"/>
+          <w:b w:val="0"/>
+          <w:i/>
+          <w:sz w:val="19"/>
+        </w:rPr>
+        <w:t>Tech Layoffs Tracker — Tagesfortschreibung: 127.411 Personen aus 283 Layoff-Meldungen (rund 1.003 Personen pro Tag).</w:t>
+      </w:r>
+      <w:r>
+        <w:rPr>
+          <w:rFonts w:ascii="Arial" w:hAnsi="Arial"/>
+          <w:b w:val="0"/>
+          <w:i w:val="0"/>
+          <w:sz w:val="19"/>
+        </w:rPr>
+        <w:t xml:space="preserve"> https://www.trueup.io/layoffs | https://www.informationweek.com/it-staffing-careers/2026-tech-company-layoffs</w:t>
+      </w:r>
+    </w:p>
+    <w:p>
+      <w:pPr>
+        <w:jc w:val="both"/>
+      </w:pPr>
+      <w:r>
+        <w:rPr>
+          <w:rFonts w:ascii="Arial" w:hAnsi="Arial"/>
+          <w:b w:val="0"/>
+          <w:i w:val="0"/>
+          <w:sz w:val="19"/>
+        </w:rPr>
+        <w:t xml:space="preserve">CNBC / Bloomberg / AOL / The Register. (7./8. Mai 2026). </w:t>
+      </w:r>
+      <w:r>
+        <w:rPr>
+          <w:rFonts w:ascii="Arial" w:hAnsi="Arial"/>
+          <w:b w:val="0"/>
+          <w:i/>
+          <w:sz w:val="19"/>
+        </w:rPr>
+        <w:t>Cloudflare stock sinks 18% after earnings as company cuts 1,100 employees due to AI changes / Cloudflare to Cut 1,100 Jobs as It Shifts to AI-First Operating Model / Read the memo: Cloudflare is laying off 1,100 employees to prepare for ‚the agentic AI era‘ / Cloudflare to fire 1,100 staff whose jobs just aren't AI enough.</w:t>
+      </w:r>
+      <w:r>
+        <w:rPr>
+          <w:rFonts w:ascii="Arial" w:hAnsi="Arial"/>
+          <w:b w:val="0"/>
+          <w:i w:val="0"/>
+          <w:sz w:val="19"/>
+        </w:rPr>
+        <w:t xml:space="preserve"> Streichung von rund 1.100 Stellen (20 % der globalen Belegschaft) parallel zu Q1-2026-Earnings (Umsatz +34 % YoY); Memo CEO Matthew Prince und Co-Gründerin Michelle Zatlyn („Building for the future"); AI-Einsatz im Konzern in drei Monaten +600 %; Restrukturierungsaufwand 140–150 Mio. USD im Q2 2026; Grundvergütung bis Ende 2026, US-Krankenversicherung bis Jahresende, Equity-Vesting bis 15. August 2026. https://www.cnbc.com/2026/05/07/cloudflare-net-q1-2026-stock-earnings-layoffs.html | https://www.bloomberg.com/news/articles/2026-05-07/cloudflare-to-cut-one-fifth-of-workers-in-move-to-ai-first-model | https://www.aol.com/articles/read-memo-cloudflare-laying-off-212614000.html | https://www.theregister.com/off-prem/2026/05/08/cloudflare-to-fire-1100-staff-whose-jobs-just-arent-ai-enough/5235536</w:t>
+      </w:r>
+    </w:p>
+    <w:p>
+      <w:pPr>
+        <w:jc w:val="both"/>
+      </w:pPr>
+      <w:r>
+        <w:rPr>
+          <w:rFonts w:ascii="Arial" w:hAnsi="Arial"/>
+          <w:b w:val="0"/>
+          <w:i w:val="0"/>
+          <w:sz w:val="19"/>
+        </w:rPr>
+        <w:t xml:space="preserve">Challenger, Gray &amp; Christmas / CBS News / Fast Company. (1./3. Mai 2026). </w:t>
+      </w:r>
+      <w:r>
+        <w:rPr>
+          <w:rFonts w:ascii="Arial" w:hAnsi="Arial"/>
+          <w:b w:val="0"/>
+          <w:i/>
+          <w:sz w:val="19"/>
+        </w:rPr>
+        <w:t>Challenger Report: April Job Cuts Rise 38 % from March; YTD Cuts Down 50 % / AI emerges as a top cause of layoffs, accounting for 26 % of April's job cuts / Layoffs are actually on the decline in 2026 — but not in tech.</w:t>
+      </w:r>
+      <w:r>
+        <w:rPr>
+          <w:rFonts w:ascii="Arial" w:hAnsi="Arial"/>
+          <w:b w:val="0"/>
+          <w:i w:val="0"/>
+          <w:sz w:val="19"/>
+        </w:rPr>
+        <w:t xml:space="preserve"> Methodische Aggregat-Bestätigung: April-2026-Streichungen 83.387 (+38 % gegenüber März; −21 % gegenüber April 2025), KI-bezogen 21.490 (26 %, zweitens in Folge führender Einzelgrund); Tech 33.361 im April; YTD 85.411 (+33 % gegenüber Vorjahresstand); KI-bezogen YTD 49.135 (16 % aller 2026-Pläne, von 13 % zum März-Stand); Gesamtjahr 2026 bislang −50 % gegenüber Vorjahresvergleichszeitraum. https://www.challengergray.com/blog/challenger-report-april-job-cuts-rise-38-from-march-ytd-cuts-down-50/ | https://www.cbsnews.com/news/ai-layoffs-job-cuts-challenger-report-april-2026/ | https://www.fastcompany.com/91538649/layoffs-are-actually-on-the-decline-in-2026-but-not-in-the-tech-industry</w:t>
+      </w:r>
+    </w:p>
+    <w:p>
+      <w:pPr>
+        <w:jc w:val="both"/>
+      </w:pPr>
+      <w:r>
+        <w:rPr>
+          <w:rFonts w:ascii="Arial" w:hAnsi="Arial"/>
+          <w:b w:val="0"/>
+          <w:i w:val="0"/>
+          <w:sz w:val="19"/>
+        </w:rPr>
         <w:t xml:space="preserve">CNBC / Engadget / Coindesk / Fortune. (5. Mai 2026). </w:t>
       </w:r>
       <w:r>
@@ -10398,7 +10566,7 @@
           <w:i w:val="0"/>
           <w:sz w:val="19"/>
         </w:rPr>
-        <w:t xml:space="preserve"> Dieses Arbeitspapier gibt den Stand Anfang Mai 2026 (Schnitt am 7. Mai 2026 — Lauf 003, dritte Tagesaktualisierung) wieder. Die Debatte entwickelt sich dynamisch, insbesondere im Zuge der OpenAI-Strategiepapiere und der Eröffnung des OpenAI Workshop in Washington, D.C. im Mai 2026, des Erstdurchgangs des GKV-Beitragssatzstabilisierungsgesetzes in der 1065. Bundesratssitzung am 8. Mai 2026 mit 79 Tagesordnungspunkten (Kabinettsbeschluss 29. April 2026, parlamentarische Behandlung vor der Sommerpause 2026 angekündigt), der laufenden Trilog-Verhandlungen zum Digital Omnibus on AI (zweite Runde 28. April 2026 ohne Einigung; nächste Runde 13. Mai 2026 — Knackpunkt ist nicht die Verschiebung der Hochrisiko-Pflichten, sondern die Konformitätsbewertungs-Architektur für Anhang I; die zypriotische Ratspräsidentschaft strebt einen Abschluss vor Ablauf ihrer Amtszeit am 30. Juni 2026 an, andernfalls übernimmt die irische Präsidentschaft), der am 5. Mai 2026 erfolgten Arraignment-Verhandlung im Altman-Verfahren mit „nicht schuldig"-Plädoyer und angeordneter psychiatrischer Begutachtung, des am 7. Mai 2026 versandten individuellen Microsoft-Buyout-Angebots (Annahmefrist 8. Juni 2026, VRSAR-Unterzeichnung 9.–22. Juni 2026, bis zu fünfjährige Krankenversicherungs-Verlängerung), des am 1. Mai 2026 vom Connecticut-Repräsentantenhaus mit 131 zu 17 Stimmen verabschiedeten </w:t>
+        <w:t xml:space="preserve"> Dieses Arbeitspapier gibt den Stand Anfang Mai 2026 (Schnitt am 8. Mai 2026 — Lauf 001 vom 8. Mai 2026) wieder. Die Debatte entwickelt sich dynamisch, insbesondere im Zuge der OpenAI-Strategiepapiere und der Eröffnung des OpenAI Workshop in Washington, D.C. im Mai 2026, des Erstdurchgangs des GKV-Beitragssatzstabilisierungsgesetzes in der 1065. Bundesratssitzung am 8. Mai 2026 mit 79 Tagesordnungspunkten (Kabinettsbeschluss 29. April 2026, parlamentarische Behandlung vor der Sommerpause 2026 angekündigt), der laufenden Trilog-Verhandlungen zum Digital Omnibus on AI (zweite Runde 28. April 2026 ohne Einigung; nächste Runde 13. Mai 2026 — Knackpunkt ist nicht die Verschiebung der Hochrisiko-Pflichten, sondern die Konformitätsbewertungs-Architektur für Anhang I; die zypriotische Ratspräsidentschaft strebt einen Abschluss vor Ablauf ihrer Amtszeit am 30. Juni 2026 an, andernfalls übernimmt die irische Präsidentschaft), der am 5. Mai 2026 erfolgten Arraignment-Verhandlung im Altman-Verfahren mit „nicht schuldig"-Plädoyer und angeordneter psychiatrischer Begutachtung, des am 7. Mai 2026 versandten individuellen Microsoft-Buyout-Angebots (Annahmefrist 8. Juni 2026, VRSAR-Unterzeichnung 9.–22. Juni 2026, bis zu fünfjährige Krankenversicherungs-Verlängerung), des am 1. Mai 2026 vom Connecticut-Repräsentantenhaus mit 131 zu 17 Stimmen verabschiedeten </w:t>
       </w:r>
       <w:r>
         <w:rPr>
@@ -10542,7 +10710,43 @@
           <w:i w:val="0"/>
           <w:sz w:val="19"/>
         </w:rPr>
-        <w:t xml:space="preserve"> auf 100 % bei zugleich ablehnender Position des Finanzministeriums, der revidierten IAB-Frühjahrsprognose vom 24. März 2026 (Erwerbstätigkeit −90.000, BIP +0,8 % bei 0,2 bis 0,3 Pp. Iran-Krieg-Dämpfung), der aktualisierten Tech-Layoff-Trackerstände zum 6./7. Mai 2026 (TrueUp 119.721 Personen aus 265 Layoff-Meldungen am 6. Mai bzw. 121.111 Personen aus 273 Meldungen am 7. Mai, SkillSyncer 113.863 Personen aus 179 Ereignissen) sowie der am 5./6. Mai 2026 angekündigten KI-getriebenen Stellenstreichungen bei Coinbase (700 Stellen, 14 %), PayPal (rund 4.760 Stellen, 20 % über 2–3 Jahre), Freshworks (rund 500 Stellen, 11 %) und Cognizant (12.000–15.000 Stellen unter „Project Leap"), des am 7. Mai 2026 publizierten Microsoft-VRSAR-Programmstatus (rund 8.500 angebotsberechtigte Beschäftigte, </w:t>
+        <w:t xml:space="preserve"> auf 100 % bei zugleich ablehnender Position des Finanzministeriums, der revidierten IAB-Frühjahrsprognose vom 24. März 2026 (Erwerbstätigkeit −90.000, BIP +0,8 % bei 0,2 bis 0,3 Pp. Iran-Krieg-Dämpfung), der aktualisierten Tech-Layoff-Trackerstände zum 6./7./8. Mai 2026 (TrueUp 119.721 Personen aus 265 Layoff-Meldungen am 6. Mai, 121.111 Personen aus 273 Meldungen am 7. Mai bzw. 127.411 Personen aus 283 Meldungen am 8. Mai 2026 — rund 1.003 Personen pro Tag; SkillSyncer 113.863 Personen aus 179 Ereignissen) sowie der am 5./6. Mai 2026 angekündigten KI-getriebenen Stellenstreichungen bei Coinbase (700 Stellen, 14 %), PayPal (rund 4.760 Stellen, 20 % über 2–3 Jahre), Freshworks (rund 500 Stellen, 11 %) und Cognizant (12.000–15.000 Stellen unter „Project Leap") sowie der am 7. Mai 2026 von Cloudflare angekündigten Streichung von rund 1.100 Stellen (20 % der globalen Belegschaft) zum Übergang zu einem „agentic AI-first operating model" (Restrukturierungsaufwand 140–150 Mio. USD, AI-Einsatz im Konzern +600 % im Quartal, Aktienkurs −18 %), des am 1. Mai 2026 von </w:t>
+      </w:r>
+      <w:r>
+        <w:rPr>
+          <w:rFonts w:ascii="Arial" w:hAnsi="Arial"/>
+          <w:b w:val="0"/>
+          <w:i/>
+          <w:sz w:val="19"/>
+        </w:rPr>
+        <w:t>Challenger, Gray &amp; Christmas</w:t>
+      </w:r>
+      <w:r>
+        <w:rPr>
+          <w:rFonts w:ascii="Arial" w:hAnsi="Arial"/>
+          <w:b w:val="0"/>
+          <w:i w:val="0"/>
+          <w:sz w:val="19"/>
+        </w:rPr>
+        <w:t xml:space="preserve"> veröffentlichten </w:t>
+      </w:r>
+      <w:r>
+        <w:rPr>
+          <w:rFonts w:ascii="Arial" w:hAnsi="Arial"/>
+          <w:b w:val="0"/>
+          <w:i/>
+          <w:sz w:val="19"/>
+        </w:rPr>
+        <w:t>April-2026-Job-Cuts-Reports</w:t>
+      </w:r>
+      <w:r>
+        <w:rPr>
+          <w:rFonts w:ascii="Arial" w:hAnsi="Arial"/>
+          <w:b w:val="0"/>
+          <w:i w:val="0"/>
+          <w:sz w:val="19"/>
+        </w:rPr>
+        <w:t xml:space="preserve"> (KI-bezogene Streichungen 21.490 im April — 26 % aller April-Streichungen, zweitens in Folge führender Einzelgrund; Tech YTD 85.411 mit +33 % gegenüber Vorjahr; KI-bezogen YTD 49.135 — Anteil an allen 2026-Streichungs­plänen 16 %, gestiegen von 13 % zum März-Stand; gesamtwirtschaftlich −50 % gegenüber Vorjahresvergleich), des am 7. Mai 2026 publizierten Microsoft-VRSAR-Programmstatus (rund 8.500 angebotsberechtigte Beschäftigte, </w:t>
       </w:r>
       <w:r>
         <w:rPr>
@@ -10658,7 +10862,7 @@
         <w:color w:val="999999"/>
         <w:sz w:val="15"/>
       </w:rPr>
-      <w:t>Version 21.0 — Mai 2026 — CC BY 4.0</w:t>
+      <w:t>Version 22.0 — Mai 2026 — CC BY 4.0</w:t>
       <w:tab/>
       <w:t xml:space="preserve">Seite </w:t>
     </w:r>

</xml_diff>

<commit_message>
Daily-Update 2026-05-16 — Version 23.0 (Cluster: B, F)
- § 4.3: EU-Trilog-Einigung Digital Omnibus on AI vom 7. Mai 2026 (Stichtage 2027/2028, Watermarking auf 2.12.2026, Maschinenverordnung in Section B)
- § 1.1: Cisco-Layoff 14. Mai (~4.000, +15% Aktienkurs); LinkedIn 13. Mai (~875, trotz +12% Quartalsumsatz); Upwork 7. Mai (145/24%); TrueUp-Stand 15./16. Mai (128.270/286/~1.002 pro Tag); American Bazaar Aggregat 38.000 US-Stellen erste 10 Tage Mai 2026
- § 11.3 / § 11.5: neue Primärquellen-Einträge zur Trilog-Einigung sowie sechs neue Sammelbelege zu Cisco/LinkedIn/Upwork/Tracker
- README.md, Aktualitätshinweis und Validierung-Ergebnisse.md auf Version 23.0 aktualisiert
</commit_message>
<xml_diff>
--- a/KI-Ökonomie.docx
+++ b/KI-Ökonomie.docx
@@ -112,7 +112,7 @@
           <w:color w:val="666666"/>
           <w:sz w:val="18"/>
         </w:rPr>
-        <w:t>Version 22.0</w:t>
+        <w:t>Version 23.0</w:t>
       </w:r>
     </w:p>
     <w:p>
@@ -238,7 +238,115 @@
           <w:i w:val="0"/>
           <w:sz w:val="19"/>
         </w:rPr>
-        <w:t xml:space="preserve"> fällt auf den 2. Juli 2026; nach den am 7. Mai 2026 publizierten Programmkonditionen sind rund 8.500 Beschäftigte angebotsberechtigt, das Paket umfasst eine Cash-Einmalzahlung sowie eine bis zu fünfjährige Krankenversicherungs-Verlängerung und enthält keine Wettbewerbs- oder Beschäftigungsverbote. Im Zusammenspiel mit den am selben Tag bekräftigten Meta-Streichungen ordneten Wirtschaftsmedien (CNBC, 24. April 2026) die Welle erstmals als „AI-driven labor crisis" ein — ein Begriff, der den Übergang von Einzelfällen zu einer kumulativen Branchenerzählung markiert. Bis zur Wochenmitte des 25. April 2026 weisen Branchen-Tracker einen kumulierten Bestand von über 92.000 Tech-Stellenstreichungen für das laufende Jahr 2026 aus; eine Aktualisierung zum 2. Mai 2026 hebt die Marke nach Tracker-Methodik des SkillSyncer auf 113.863 betroffene Beschäftigte aus 179 erfassten Layoff-Ereignissen (durchschnittlich rund 933 Stellen pro Tag), während TrueUp parallel 95.878 Personen aus 249 Einzelmeldungen zählt; die Methodikspanne erklärt die unterschiedlichen Größenordnungen, das Niveau einer sechsstelligen Tech-Reduktion innerhalb von vier Monaten ist über alle Tracker hinweg konsistent. Eine erneute Aktualisierung zum 6. Mai 2026 zeigt, dass die TrueUp-Zählung weiter auf 119.721 betroffene Personen aus 265 Layoff-Meldungen gestiegen ist (rund 958 Stellen pro Tag), während SkillSyncer mit 113.863 Personen aus 179 Ereignissen weitgehend unverändert bleibt; eine Tagesfortschreibung der TrueUp-Methodik weist zum 7. Mai 2026 bereits 121.111 Personen aus 273 Layoff-Meldungen aus (rund 961 Personen pro Tag); die nochmalige Aktualisierung zum 8. Mai 2026 hebt die Marke nach den am Vortag angekündigten Cloudflare-Streichungen auf 127.411 betroffene Personen aus 283 Layoff-Meldungen (rund 1.003 Stellen pro Tag), wobei die zusätzlichen Meldungen primär aus den am 5./6. Mai 2026 angekündigten Stellenstreichungen bei </w:t>
+        <w:t xml:space="preserve"> fällt auf den 2. Juli 2026; nach den am 7. Mai 2026 publizierten Programmkonditionen sind rund 8.500 Beschäftigte angebotsberechtigt, das Paket umfasst eine Cash-Einmalzahlung sowie eine bis zu fünfjährige Krankenversicherungs-Verlängerung und enthält keine Wettbewerbs- oder Beschäftigungsverbote. Im Zusammenspiel mit den am selben Tag bekräftigten Meta-Streichungen ordneten Wirtschaftsmedien (CNBC, 24. April 2026) die Welle erstmals als „AI-driven labor crisis" ein — ein Begriff, der den Übergang von Einzelfällen zu einer kumulativen Branchenerzählung markiert. Bis zur Wochenmitte des 25. April 2026 weisen Branchen-Tracker einen kumulierten Bestand von über 92.000 Tech-Stellenstreichungen für das laufende Jahr 2026 aus; eine Aktualisierung zum 2. Mai 2026 hebt die Marke nach Tracker-Methodik des SkillSyncer auf 113.863 betroffene Beschäftigte aus 179 erfassten Layoff-Ereignissen (durchschnittlich rund 933 Stellen pro Tag), während TrueUp parallel 95.878 Personen aus 249 Einzelmeldungen zählt; die Methodikspanne erklärt die unterschiedlichen Größenordnungen, das Niveau einer sechsstelligen Tech-Reduktion innerhalb von vier Monaten ist über alle Tracker hinweg konsistent. Eine erneute Aktualisierung zum 6. Mai 2026 zeigt, dass die TrueUp-Zählung weiter auf 119.721 betroffene Personen aus 265 Layoff-Meldungen gestiegen ist (rund 958 Stellen pro Tag), während SkillSyncer mit 113.863 Personen aus 179 Ereignissen weitgehend unverändert bleibt; eine Tagesfortschreibung der TrueUp-Methodik weist zum 7. Mai 2026 bereits 121.111 Personen aus 273 Layoff-Meldungen aus (rund 961 Personen pro Tag); die nochmalige Aktualisierung zum 8. Mai 2026 hebt die Marke nach den am Vortag angekündigten Cloudflare-Streichungen auf 127.411 betroffene Personen aus 283 Layoff-Meldungen (rund 1.003 Stellen pro Tag), und eine erneute Fortschreibung zum 15./16. Mai 2026 ergibt nach den am 13. Mai 2026 von </w:t>
+      </w:r>
+      <w:r>
+        <w:rPr>
+          <w:rFonts w:ascii="Arial" w:hAnsi="Arial"/>
+          <w:b w:val="0"/>
+          <w:i/>
+          <w:sz w:val="19"/>
+        </w:rPr>
+        <w:t>LinkedIn</w:t>
+      </w:r>
+      <w:r>
+        <w:rPr>
+          <w:rFonts w:ascii="Arial" w:hAnsi="Arial"/>
+          <w:b w:val="0"/>
+          <w:i w:val="0"/>
+          <w:sz w:val="19"/>
+        </w:rPr>
+        <w:t xml:space="preserve"> (rund 875 Beschäftigte beziehungsweise 5 % von 17.500 trotz +12 % Jahresumsatz im Quartal, parallel zur AI-getriebenen Reorganisation unter Chief Product Officer Hari Srinivasan) und am 14. Mai 2026 von </w:t>
+      </w:r>
+      <w:r>
+        <w:rPr>
+          <w:rFonts w:ascii="Arial" w:hAnsi="Arial"/>
+          <w:b w:val="0"/>
+          <w:i/>
+          <w:sz w:val="19"/>
+        </w:rPr>
+        <w:t>Cisco</w:t>
+      </w:r>
+      <w:r>
+        <w:rPr>
+          <w:rFonts w:ascii="Arial" w:hAnsi="Arial"/>
+          <w:b w:val="0"/>
+          <w:i w:val="0"/>
+          <w:sz w:val="19"/>
+        </w:rPr>
+        <w:t xml:space="preserve"> (rund 4.000 Stellen — unter 5 % der globalen Belegschaft — am gleichen Tag wie der Q3-FY2026-Rekordumsatz von 15,8 Milliarden US-Dollar und 5,3 Milliarden US-Dollar AI-Infrastrukturbestellungen bis Anfang Mai 2026; </w:t>
+      </w:r>
+      <w:r>
+        <w:rPr>
+          <w:rFonts w:ascii="Arial" w:hAnsi="Arial"/>
+          <w:b w:val="0"/>
+          <w:i/>
+          <w:sz w:val="19"/>
+        </w:rPr>
+        <w:t>Project Leap</w:t>
+      </w:r>
+      <w:r>
+        <w:rPr>
+          <w:rFonts w:ascii="Arial" w:hAnsi="Arial"/>
+          <w:b w:val="0"/>
+          <w:i w:val="0"/>
+          <w:sz w:val="19"/>
+        </w:rPr>
+        <w:t xml:space="preserve">-vergleichbare CFO-Begründung als Re-Allokation in Silizium, Optik, Sicherheit und KI, nicht als Kosteneinsparung; Aktienkurs +15 %; CEO Chuck Robbins) angekündigten Streichungen einen TrueUp-Stand von 128.270 Personen aus 286 Layoff-Meldungen (rund 1.002 Personen pro Tag) — die kumulierten US-Stellenstreichungen aller Branchen in den ersten zehn Tagen des Mai 2026 belaufen sich nach </w:t>
+      </w:r>
+      <w:r>
+        <w:rPr>
+          <w:rFonts w:ascii="Arial" w:hAnsi="Arial"/>
+          <w:b w:val="0"/>
+          <w:i/>
+          <w:sz w:val="19"/>
+        </w:rPr>
+        <w:t>American Bazaar</w:t>
+      </w:r>
+      <w:r>
+        <w:rPr>
+          <w:rFonts w:ascii="Arial" w:hAnsi="Arial"/>
+          <w:b w:val="0"/>
+          <w:i w:val="0"/>
+          <w:sz w:val="19"/>
+        </w:rPr>
+        <w:t xml:space="preserve"> vom 10. Mai 2026 auf nahe 38.000 Stellen; ergänzend kündigt die KI-gestützte Freelancer-Plattform </w:t>
+      </w:r>
+      <w:r>
+        <w:rPr>
+          <w:rFonts w:ascii="Arial" w:hAnsi="Arial"/>
+          <w:b w:val="0"/>
+          <w:i/>
+          <w:sz w:val="19"/>
+        </w:rPr>
+        <w:t>Upwork</w:t>
+      </w:r>
+      <w:r>
+        <w:rPr>
+          <w:rFonts w:ascii="Arial" w:hAnsi="Arial"/>
+          <w:b w:val="0"/>
+          <w:i w:val="0"/>
+          <w:sz w:val="19"/>
+        </w:rPr>
+        <w:t xml:space="preserve"> am 7. Mai 2026 die Streichung von rund 145 der rund 600 Stellen (etwa 24 % der Belegschaft) und einen Restrukturierungsaufwand von 16 bis 23 Millionen US-Dollar im zweiten Quartal 2026 an — CEO Hayden Brown begründet die dritte Streichungswelle binnen drei Jahren mit dem Schlagwort </w:t>
+      </w:r>
+      <w:r>
+        <w:rPr>
+          <w:rFonts w:ascii="Arial" w:hAnsi="Arial"/>
+          <w:b w:val="0"/>
+          <w:i/>
+          <w:sz w:val="19"/>
+        </w:rPr>
+        <w:t>„two pizza teams are dead"</w:t>
+      </w:r>
+      <w:r>
+        <w:rPr>
+          <w:rFonts w:ascii="Arial" w:hAnsi="Arial"/>
+          <w:b w:val="0"/>
+          <w:i w:val="0"/>
+          <w:sz w:val="19"/>
+        </w:rPr>
+        <w:t xml:space="preserve"> und der Strategie, mehr Umsatz über KI-Agenten zu routen; der Aktienkurs gibt rund 19 % ab, wobei die zusätzlichen Meldungen primär aus den am 5./6. Mai 2026 angekündigten Stellenstreichungen bei </w:t>
       </w:r>
       <w:r>
         <w:rPr>
@@ -2128,7 +2236,133 @@
           <w:i w:val="0"/>
           <w:sz w:val="19"/>
         </w:rPr>
-        <w:t xml:space="preserve"> Eine rein nationale Lösung kann mit der Warenverkehrsfreiheit, der Dienstleistungsfreiheit und der Niederlassungsfreiheit in Konflikt geraten. Eine Regelung, die nur inländische Roboterbetreiber trifft, während grenzüberschreitende KI-Dienstleistungen unbesteuert bleiben, wäre diskriminierungsrechtlich problematisch und praktisch kaum durchsetzbar. Der EU AI Act (Verordnung 2024/1689) schafft ab dem 2. August 2026 einen unionsweit einheitlichen Regulierungsrahmen für KI-Systeme (Hochrisiko-Systeme gemäß Anhang III, Transparenzpflichten nach Art. 50, Durchsetzungsregime); dies legt einen einheitlichen Definitionsrahmen, der steuerpolitische Anknüpfungen an KI-Systemklassen mittelfristig erleichtern kann, ohne selbst steuerrechtliche Wirkung zu entfalten. Die Europäische Kommission hat am 19. November 2025 mit dem „Digital Omnibus on AI" einen Vereinfachungsvorschlag vorgelegt, den das Europäische Parlament am 16. März 2026 im Ausschuss und am 23. März 2026 im Plenum unterstützt hat. Er sieht eine Verschiebung der Hochrisiko-Pflichten vor — je nach Systemtyp bis maximal zum 2. Dezember 2027 bzw. 2. August 2028 — und koppelt ihre Anwendbarkeit an die Verfügbarkeit harmonisierter Normen; zudem wird die Kennzeichnungspflicht für KI-generierte Inhalte (Art. 50) bis zum 2. November 2026 verlängert. Die Kommissionsdurchsetzungsbefugnisse gegenüber Anbietern von Allzweck-KI-Modellen (GPAI) treten wie vorgesehen am 2. August 2026 in Kraft. Parlament und Rat haben die Trilogverhandlungen aufgenommen; der zweite Trilogtermin am 28. April 2026 endete nach Berichterstattung von IAPP und A&amp;O Shearman ohne Einigung — Streitpunkt war primär das Verhältnis zwischen AI Act und sektorspezifischen EU-Regelungen für eingebettete KI-Systeme (Anhang I) sowie die Rechtsgrundlage für die Verarbeitung personenbezogener Daten zur Bias-Erkennung. Beide Institutionen konvergieren auf Stichtage 2. Dezember 2027 (Anhang III) und 2. August 2028 (Anhang I) für die Hochrisiko-Pflichten. Die nächste Trilogrunde ist auf den 13. Mai 2026 terminiert; Ziel bleibt eine förmliche Verabschiedung vor dem ursprünglichen Stichtag am 2. August 2026. Die zypriotische Ratspräsidentschaft hat sich vorgenommen, das Dossier vor Ablauf ihrer Amtszeit am 30. Juni 2026 abzuschließen; gelingt das nicht, übernimmt zur zweiten Jahreshälfte 2026 die irische Präsidentschaft. Scheitert die Einigung bis zum 2. August 2026, würden die Hochrisiko-Pflichten in ihrer ursprünglich vorgesehenen Fassung anwendbar. Für die Steuerdebatte folgt daraus, dass der zeitliche Vorlauf für KI-Definitionen aus dem AI Act enger als ursprünglich gedacht ist — eine mittelfristige Anknüpfung steuerlicher Tatbestände an AI-Act-Kategorien bleibt möglich, setzt aber voraus, dass die Normenlandschaft nach 2027 verlässlich vorliegt.</w:t>
+        <w:t xml:space="preserve"> Eine rein nationale Lösung kann mit der Warenverkehrsfreiheit, der Dienstleistungsfreiheit und der Niederlassungsfreiheit in Konflikt geraten. Eine Regelung, die nur inländische Roboterbetreiber trifft, während grenzüberschreitende KI-Dienstleistungen unbesteuert bleiben, wäre diskriminierungsrechtlich problematisch und praktisch kaum durchsetzbar. Der EU AI Act (Verordnung 2024/1689) schafft ab dem 2. August 2026 einen unionsweit einheitlichen Regulierungsrahmen für KI-Systeme (Hochrisiko-Systeme gemäß Anhang III, Transparenzpflichten nach Art. 50, Durchsetzungsregime); dies legt einen einheitlichen Definitionsrahmen, der steuerpolitische Anknüpfungen an KI-Systemklassen mittelfristig erleichtern kann, ohne selbst steuerrechtliche Wirkung zu entfalten. Die Europäische Kommission hat am 19. November 2025 mit dem „Digital Omnibus on AI" einen Vereinfachungsvorschlag vorgelegt, den das Europäische Parlament am 16. März 2026 im Ausschuss und am 23. März 2026 im Plenum unterstützt hat. Er sieht eine Verschiebung der Hochrisiko-Pflichten vor — je nach Systemtyp bis maximal zum 2. Dezember 2027 bzw. 2. August 2028 — und koppelt ihre Anwendbarkeit an die Verfügbarkeit harmonisierter Normen; zudem wird die Kennzeichnungspflicht für KI-generierte Inhalte (Art. 50) bis zum 2. November 2026 verlängert. Die Kommissionsdurchsetzungsbefugnisse gegenüber Anbietern von Allzweck-KI-Modellen (GPAI) treten wie vorgesehen am 2. August 2026 in Kraft. Parlament und Rat haben die Trilogverhandlungen aufgenommen; der zweite Trilogtermin am 28. April 2026 endete nach Berichterstattung von IAPP und A&amp;O Shearman ohne Einigung — Streitpunkt war primär das Verhältnis zwischen AI Act und sektorspezifischen EU-Regelungen für eingebettete KI-Systeme (Anhang I) sowie die Rechtsgrundlage für die Verarbeitung personenbezogener Daten zur Bias-Erkennung. Am 7. Mai 2026 erzielten Rat und Parlament dann nach Berichterstattung unter anderem von </w:t>
+      </w:r>
+      <w:r>
+        <w:rPr>
+          <w:rFonts w:ascii="Arial" w:hAnsi="Arial"/>
+          <w:b w:val="0"/>
+          <w:i/>
+          <w:sz w:val="19"/>
+        </w:rPr>
+        <w:t>White &amp; Case</w:t>
+      </w:r>
+      <w:r>
+        <w:rPr>
+          <w:rFonts w:ascii="Arial" w:hAnsi="Arial"/>
+          <w:b w:val="0"/>
+          <w:i w:val="0"/>
+          <w:sz w:val="19"/>
+        </w:rPr>
+        <w:t xml:space="preserve">, </w:t>
+      </w:r>
+      <w:r>
+        <w:rPr>
+          <w:rFonts w:ascii="Arial" w:hAnsi="Arial"/>
+          <w:b w:val="0"/>
+          <w:i/>
+          <w:sz w:val="19"/>
+        </w:rPr>
+        <w:t>Lewis Silkin</w:t>
+      </w:r>
+      <w:r>
+        <w:rPr>
+          <w:rFonts w:ascii="Arial" w:hAnsi="Arial"/>
+          <w:b w:val="0"/>
+          <w:i w:val="0"/>
+          <w:sz w:val="19"/>
+        </w:rPr>
+        <w:t xml:space="preserve">, </w:t>
+      </w:r>
+      <w:r>
+        <w:rPr>
+          <w:rFonts w:ascii="Arial" w:hAnsi="Arial"/>
+          <w:b w:val="0"/>
+          <w:i/>
+          <w:sz w:val="19"/>
+        </w:rPr>
+        <w:t>Hogan Lovells</w:t>
+      </w:r>
+      <w:r>
+        <w:rPr>
+          <w:rFonts w:ascii="Arial" w:hAnsi="Arial"/>
+          <w:b w:val="0"/>
+          <w:i w:val="0"/>
+          <w:sz w:val="19"/>
+        </w:rPr>
+        <w:t xml:space="preserve">, </w:t>
+      </w:r>
+      <w:r>
+        <w:rPr>
+          <w:rFonts w:ascii="Arial" w:hAnsi="Arial"/>
+          <w:b w:val="0"/>
+          <w:i/>
+          <w:sz w:val="19"/>
+        </w:rPr>
+        <w:t>Taylor Wessing</w:t>
+      </w:r>
+      <w:r>
+        <w:rPr>
+          <w:rFonts w:ascii="Arial" w:hAnsi="Arial"/>
+          <w:b w:val="0"/>
+          <w:i w:val="0"/>
+          <w:sz w:val="19"/>
+        </w:rPr>
+        <w:t xml:space="preserve">, </w:t>
+      </w:r>
+      <w:r>
+        <w:rPr>
+          <w:rFonts w:ascii="Arial" w:hAnsi="Arial"/>
+          <w:b w:val="0"/>
+          <w:i/>
+          <w:sz w:val="19"/>
+        </w:rPr>
+        <w:t>Orrick</w:t>
+      </w:r>
+      <w:r>
+        <w:rPr>
+          <w:rFonts w:ascii="Arial" w:hAnsi="Arial"/>
+          <w:b w:val="0"/>
+          <w:i w:val="0"/>
+          <w:sz w:val="19"/>
+        </w:rPr>
+        <w:t xml:space="preserve">, </w:t>
+      </w:r>
+      <w:r>
+        <w:rPr>
+          <w:rFonts w:ascii="Arial" w:hAnsi="Arial"/>
+          <w:b w:val="0"/>
+          <w:i/>
+          <w:sz w:val="19"/>
+        </w:rPr>
+        <w:t>Tech Policy Press</w:t>
+      </w:r>
+      <w:r>
+        <w:rPr>
+          <w:rFonts w:ascii="Arial" w:hAnsi="Arial"/>
+          <w:b w:val="0"/>
+          <w:i w:val="0"/>
+          <w:sz w:val="19"/>
+        </w:rPr>
+        <w:t xml:space="preserve"> und der offiziellen Pressemitteilung des Rates eine vorläufige politische Einigung über das Digital-Omnibus-on-AI-Paket (Abschluss der Verhandlungen um 04:30 Uhr Brüsseler Zeit); die Stichtage für die Hochrisiko-Pflichten werden auf den 2. Dezember 2027 für eigenständige Annex-III-Systeme und auf den 2. August 2028 für in regulierte Produkte eingebettete Annex-I-Systeme fixiert, die Watermarking-/Transparenzpflicht nach Art. 50 Abs. 2 wird vom 2. August 2026 auf den 2. Dezember 2026 verschoben, und das ebenfalls zum 2. Dezember 2026 anwendbare Verbot KI-generierter nicht-einvernehmlicher intimer Inhalte sowie kindlicher Missbrauchsdarstellungen ergänzt den Verbotskatalog. Bemerkenswert für die steuerpolitische Anknüpfungsfrage ist die Verschiebung der Maschinenverordnung aus Sektion A in Sektion B von Anhang I: Eingebettete KI-Systeme im Maschinenrecht würden künftig primär über das sektorspezifische Regime adressiert, nicht über die AI-Act-Konformitätsbewertung; vereinfachte Dokumentations- und Sanktionsanforderungen für kleinere und mittlere Unternehmen sowie für </w:t>
+      </w:r>
+      <w:r>
+        <w:rPr>
+          <w:rFonts w:ascii="Arial" w:hAnsi="Arial"/>
+          <w:b w:val="0"/>
+          <w:i/>
+          <w:sz w:val="19"/>
+        </w:rPr>
+        <w:t>small mid-caps</w:t>
+      </w:r>
+      <w:r>
+        <w:rPr>
+          <w:rFonts w:ascii="Arial" w:hAnsi="Arial"/>
+          <w:b w:val="0"/>
+          <w:i w:val="0"/>
+          <w:sz w:val="19"/>
+        </w:rPr>
+        <w:t xml:space="preserve"> sind ergänzend vorgesehen. Die förmliche Annahme durch Parlament und Rat wird vor dem 2. August 2026 erwartet; scheitert sie wider Erwarten, würden die ursprünglichen Hochrisiko-Pflichten wirksam. Die zypriotische Ratspräsidentschaft hatte sich vorgenommen, das Dossier vor Ablauf ihrer Amtszeit am 30. Juni 2026 abzuschließen — ein Ziel, das mit der Einigung vom 7. Mai 2026 vorzeitig erreicht ist. Für die Steuerdebatte folgt daraus, dass der zeitliche Vorlauf für KI-Definitionen aus dem AI Act gegenüber der ursprünglichen Erwartung um rund anderthalb Jahre weiter gestreckt ist — eine mittelfristige Anknüpfung steuerlicher Tatbestände an AI-Act-Kategorien bleibt möglich, setzt aber voraus, dass die Normenlandschaft nach 2027 verlässlich vorliegt; gleichzeitig macht die Auslagerung eingebetteter Maschinen-KI in das sektorale Regime deutlich, dass eine einheitliche steuerliche Anknüpfung an „KI-Systeme" definitionsrechtlich noch schwieriger wird.</w:t>
       </w:r>
     </w:p>
     <w:p>
@@ -8718,6 +8952,70 @@
           <w:i w:val="0"/>
           <w:sz w:val="19"/>
         </w:rPr>
+        <w:t xml:space="preserve">Rat der Europäischen Union. (7. Mai 2026). </w:t>
+      </w:r>
+      <w:r>
+        <w:rPr>
+          <w:rFonts w:ascii="Arial" w:hAnsi="Arial"/>
+          <w:b w:val="0"/>
+          <w:i/>
+          <w:sz w:val="19"/>
+        </w:rPr>
+        <w:t>Artificial Intelligence: Council and Parliament agree to simplify and streamline rules.</w:t>
+      </w:r>
+      <w:r>
+        <w:rPr>
+          <w:rFonts w:ascii="Arial" w:hAnsi="Arial"/>
+          <w:b w:val="0"/>
+          <w:i w:val="0"/>
+          <w:sz w:val="19"/>
+        </w:rPr>
+        <w:t xml:space="preserve"> Pressemitteilung zur vorläufigen politischen Einigung über das Digital-Omnibus-on-AI-Paket; Stichtage 2. Dezember 2027 (Annex III), 2. August 2028 (Annex I), Art. 50 Abs. 2 zum 2. Dezember 2026; Verschiebung der Maschinenverordnung in Section B von Annex I; SME- und small-mid-cap-Vereinfachungen; formale Annahme vor 2. August 2026 erwartet. https://www.consilium.europa.eu/en/press/press-releases/2026/05/07/artificial-intelligence-council-and-parliament-agree-to-simplify-and-streamline-rules/</w:t>
+      </w:r>
+    </w:p>
+    <w:p>
+      <w:pPr>
+        <w:jc w:val="both"/>
+      </w:pPr>
+      <w:r>
+        <w:rPr>
+          <w:rFonts w:ascii="Arial" w:hAnsi="Arial"/>
+          <w:b w:val="0"/>
+          <w:i w:val="0"/>
+          <w:sz w:val="19"/>
+        </w:rPr>
+        <w:t xml:space="preserve">White &amp; Case / Lewis Silkin / Hogan Lovells / Taylor Wessing / Orrick / IAPP / Tech Policy Press. (7.–15. Mai 2026). </w:t>
+      </w:r>
+      <w:r>
+        <w:rPr>
+          <w:rFonts w:ascii="Arial" w:hAnsi="Arial"/>
+          <w:b w:val="0"/>
+          <w:i/>
+          <w:sz w:val="19"/>
+        </w:rPr>
+        <w:t>EU agrees Digital Omnibus deal to simplify AI rules / The Council and Parliament agree to slim down and delay parts of the EU AI Act / EU legislators agree to delay for high-risk AI rules / The EU Digital Omnibus on AI – What the political deal means / EU's Digital Omnibus on AI: 7 Key Changes / EU agrees to amend AI Act, clarifies overlap with machinery rules / What the EU AI Omnibus Deal Changes for the AI Act and What Lies Ahead.</w:t>
+      </w:r>
+      <w:r>
+        <w:rPr>
+          <w:rFonts w:ascii="Arial" w:hAnsi="Arial"/>
+          <w:b w:val="0"/>
+          <w:i w:val="0"/>
+          <w:sz w:val="19"/>
+        </w:rPr>
+        <w:t xml:space="preserve"> Kanzlei- und Fachanalysen zur Trilog-Einigung vom 7. Mai 2026 (04:30 Uhr Brüsseler Zeit): gestaffelte Geltungsdaten, Watermarking-Verschiebung, Verschiebung der Maschinenverordnung, neues Verbot KI-generierter nicht-einvernehmlicher intimer Inhalte und kindlicher Missbrauchsdarstellungen. https://www.whitecase.com/insight-alert/eu-agrees-digital-omnibus-deal-simplify-ai-rules | https://www.lewissilkin.com/insights/2026/05/07/the-council-and-parliament-agree-to-slim-down-and-delay-parts-of-the-eu-ai-act-102ms0v | https://www.hoganlovells.com/en/publications/eu-legislators-agree-to-delay-for-highrisk-ai-rules | https://www.taylorwessing.com/en/insights-and-events/insights/2026/05/the-eu-digital-omnibus-on-ai-what-the-political-deal-means | https://www.orrick.com/en/Insights/2026/05/EUs-Digital-Omnibus-on-AI-7-Key-Changes-You-Need-to-Know | https://iapp.org/news/a/eu-agrees-to-amend-ai-act-clarifies-overlap-with-machinery-rules | https://www.techpolicy.press/what-the-eu-ai-omnibus-deal-changes-for-the-ai-act-and-what-lies-ahead/</w:t>
+      </w:r>
+    </w:p>
+    <w:p>
+      <w:pPr>
+        <w:jc w:val="both"/>
+      </w:pPr>
+      <w:r>
+        <w:rPr>
+          <w:rFonts w:ascii="Arial" w:hAnsi="Arial"/>
+          <w:b w:val="0"/>
+          <w:i w:val="0"/>
+          <w:sz w:val="19"/>
+        </w:rPr>
         <w:t>Europäische Union. (2024). Verordnung (EU) 2024/1689 des Europäischen Parlaments und des Rates vom 13. Juni 2024 zur Festlegung harmonisierter Vorschriften für künstliche Intelligenz (</w:t>
       </w:r>
       <w:r>
@@ -10105,6 +10403,216 @@
           <w:i w:val="0"/>
           <w:sz w:val="19"/>
         </w:rPr>
+        <w:t xml:space="preserve">TrueUp. (Stand 15./16. Mai 2026). </w:t>
+      </w:r>
+      <w:r>
+        <w:rPr>
+          <w:rFonts w:ascii="Arial" w:hAnsi="Arial"/>
+          <w:b w:val="0"/>
+          <w:i/>
+          <w:sz w:val="19"/>
+        </w:rPr>
+        <w:t>Tech Layoffs Tracker — Tagesfortschreibung nach den LinkedIn- und Cisco-Streichungen: 128.270 Personen aus 286 Layoff-Meldungen (rund 1.002 Personen pro Tag).</w:t>
+      </w:r>
+      <w:r>
+        <w:rPr>
+          <w:rFonts w:ascii="Arial" w:hAnsi="Arial"/>
+          <w:b w:val="0"/>
+          <w:i w:val="0"/>
+          <w:sz w:val="19"/>
+        </w:rPr>
+        <w:t xml:space="preserve"> https://www.trueup.io/layoffs</w:t>
+      </w:r>
+    </w:p>
+    <w:p>
+      <w:pPr>
+        <w:jc w:val="both"/>
+      </w:pPr>
+      <w:r>
+        <w:rPr>
+          <w:rFonts w:ascii="Arial" w:hAnsi="Arial"/>
+          <w:b w:val="0"/>
+          <w:i w:val="0"/>
+          <w:sz w:val="19"/>
+        </w:rPr>
+        <w:t xml:space="preserve">American Bazaar. (10. Mai 2026). </w:t>
+      </w:r>
+      <w:r>
+        <w:rPr>
+          <w:rFonts w:ascii="Arial" w:hAnsi="Arial"/>
+          <w:b w:val="0"/>
+          <w:i/>
+          <w:sz w:val="19"/>
+        </w:rPr>
+        <w:t>US layoffs in first 10 days of May 2026: Nearly 38,000 jobs cut.</w:t>
+      </w:r>
+      <w:r>
+        <w:rPr>
+          <w:rFonts w:ascii="Arial" w:hAnsi="Arial"/>
+          <w:b w:val="0"/>
+          <w:i w:val="0"/>
+          <w:sz w:val="19"/>
+        </w:rPr>
+        <w:t xml:space="preserve"> Aggregat-Berichterstattung zu US-Stellenstreichungen in den ersten zehn Tagen des Mai 2026. https://americanbazaaronline.com/2026/05/10/us-layoffs-in-first-10-days-of-may-2026-nearly-38000-jobs-cut-480502/</w:t>
+      </w:r>
+    </w:p>
+    <w:p>
+      <w:pPr>
+        <w:jc w:val="both"/>
+      </w:pPr>
+      <w:r>
+        <w:rPr>
+          <w:rFonts w:ascii="Arial" w:hAnsi="Arial"/>
+          <w:b w:val="0"/>
+          <w:i w:val="0"/>
+          <w:sz w:val="19"/>
+        </w:rPr>
+        <w:t xml:space="preserve">Fast Company / Yahoo Finance. (Mai 2026). </w:t>
+      </w:r>
+      <w:r>
+        <w:rPr>
+          <w:rFonts w:ascii="Arial" w:hAnsi="Arial"/>
+          <w:b w:val="0"/>
+          <w:i/>
+          <w:sz w:val="19"/>
+        </w:rPr>
+        <w:t>Tech layoffs this week: Cloudflare, Coinbase, Upwork, and others point to AI as they slash jobs / Layoffs Accelerate in May 2026 as Firms Restructure Around AI.</w:t>
+      </w:r>
+      <w:r>
+        <w:rPr>
+          <w:rFonts w:ascii="Arial" w:hAnsi="Arial"/>
+          <w:b w:val="0"/>
+          <w:i w:val="0"/>
+          <w:sz w:val="19"/>
+        </w:rPr>
+        <w:t xml:space="preserve"> Sammelberichterstattung zur Mai-2026-Welle (Cloudflare, Coinbase, Upwork, PayPal, Freshworks, Cognizant, LinkedIn, Cisco). https://www.fastcompany.com/91538995/tech-layoffs-due-to-ai-this-week-cloudflare-paypal-coinbase-upwork | https://finance.yahoo.com/sectors/technology/articles/layoffs-accelerate-may-2026-firms-040430218.html</w:t>
+      </w:r>
+    </w:p>
+    <w:p>
+      <w:pPr>
+        <w:jc w:val="both"/>
+      </w:pPr>
+      <w:r>
+        <w:rPr>
+          <w:rFonts w:ascii="Arial" w:hAnsi="Arial"/>
+          <w:b w:val="0"/>
+          <w:i w:val="0"/>
+          <w:sz w:val="19"/>
+        </w:rPr>
+        <w:t xml:space="preserve">Upwork / Barchart / Layoffhedge / OfficeChai. (7. Mai 2026). </w:t>
+      </w:r>
+      <w:r>
+        <w:rPr>
+          <w:rFonts w:ascii="Arial" w:hAnsi="Arial"/>
+          <w:b w:val="0"/>
+          <w:i/>
+          <w:sz w:val="19"/>
+        </w:rPr>
+        <w:t>A Message from Hayden Brown, Upwork CEO / Upwork Stock Plunges Amid 24% Layoffs: CEO Says „Two Pizza Teams Are Dead" / Upwork Layoffs 2026 — 145 Jobs Cut, ~24% of Workforce as Stock Falls 19% / Upwork Lays Off 25% Of Its Workforce, Says AI Will Lead To Smaller Teams.</w:t>
+      </w:r>
+      <w:r>
+        <w:rPr>
+          <w:rFonts w:ascii="Arial" w:hAnsi="Arial"/>
+          <w:b w:val="0"/>
+          <w:i w:val="0"/>
+          <w:sz w:val="19"/>
+        </w:rPr>
+        <w:t xml:space="preserve"> Streichung von rund 145 von rund 600 Stellen (ca. 24 % der Belegschaft); Restrukturierungsaufwand 16–23 Mio. USD im Q2 2026; KI-getriebene Reorganisation zugunsten KI-Agenten auf der Plattform; Aktienkurs −19,3 %. https://www.upwork.com/press/releases/upwork-ceo-hayden-brown-shared-the-following-message-with-employees-on-may-7-2026 | https://www.barchart.com/story/news/1887310/upwork-stock-plunges-amid-24-layoffs-ceo-says-two-pizza-teams-are-dead | https://layoffhedge.com/company/upwork | https://officechai.com/ai/upwork-lays-off-25-of-its-workforce-says-ai-will-lead-to-smaller-teams/</w:t>
+      </w:r>
+    </w:p>
+    <w:p>
+      <w:pPr>
+        <w:jc w:val="both"/>
+      </w:pPr>
+      <w:r>
+        <w:rPr>
+          <w:rFonts w:ascii="Arial" w:hAnsi="Arial"/>
+          <w:b w:val="0"/>
+          <w:i w:val="0"/>
+          <w:sz w:val="19"/>
+        </w:rPr>
+        <w:t xml:space="preserve">LinkedIn / Quartz / GeekWire / Republic World / IndMoney / Seeking Alpha / Seattle Times. (13. Mai 2026). </w:t>
+      </w:r>
+      <w:r>
+        <w:rPr>
+          <w:rFonts w:ascii="Arial" w:hAnsi="Arial"/>
+          <w:b w:val="0"/>
+          <w:i/>
+          <w:sz w:val="19"/>
+        </w:rPr>
+        <w:t>LinkedIn layoffs 2026: company cutting 5% of workforce / LinkedIn Layoffs: Microsoft-Owned Platform Trims Engineering and Product Roles / LinkedIn Layoffs 2026: 900 Jobs Cut as Microsoft-Owned Platform Restructures Teams Around AI / LinkedIn Cuts 875 Jobs in May 2026 — Revenue Soars / Microsoft-owned LinkedIn cuts hundreds of roles, reports say.</w:t>
+      </w:r>
+      <w:r>
+        <w:rPr>
+          <w:rFonts w:ascii="Arial" w:hAnsi="Arial"/>
+          <w:b w:val="0"/>
+          <w:i w:val="0"/>
+          <w:sz w:val="19"/>
+        </w:rPr>
+        <w:t xml:space="preserve"> Streichung von rund 875 Beschäftigten (ca. 5 % von 17.500) trotz +12 % Jahresumsatz im LinkedIn-Quartalsergebnis; betroffen sind Global Business Organization, Marketing, Engineering, Produkt; Reorganisation unter Chief Product Officer Hari Srinivasan zugunsten kleinerer, KI-gestützter Teams. https://qz.com/linkedin-layoffs-workforce-reduction-reorganization-051326 | https://www.geekwire.com/2026/report-linkedin-makes-job-cuts-to-position-for-future-success-amid-record-quarterly-revenue/ | https://www.republicworld.com/tech/linkedin-layoffs-2026-900-jobs-cut-as-microsoft-owned-platform-restructures-teams-around-ai-2026-05-14-124183 | https://www.indmoney.com/blog/us-stocks/linkedin-layoffs-2026-microsoft-ai-spending-msft-stock-analysis | https://seekingalpha.com/news/4592192-microsoft-owned-linkedin-plans-to-reduce-staff-in-latest-tech-sector-layoff | https://www.seattletimes.com/business/microsoft/microsoft-owned-linkedin-cuts-hundreds-of-roles-reports-say/</w:t>
+      </w:r>
+    </w:p>
+    <w:p>
+      <w:pPr>
+        <w:jc w:val="both"/>
+      </w:pPr>
+      <w:r>
+        <w:rPr>
+          <w:rFonts w:ascii="Arial" w:hAnsi="Arial"/>
+          <w:b w:val="0"/>
+          <w:i w:val="0"/>
+          <w:sz w:val="19"/>
+        </w:rPr>
+        <w:t xml:space="preserve">Cisco / CNBC / TechCrunch / Benzinga / Business Today / Fox Business. (13./14./15. Mai 2026). </w:t>
+      </w:r>
+      <w:r>
+        <w:rPr>
+          <w:rFonts w:ascii="Arial" w:hAnsi="Arial"/>
+          <w:b w:val="0"/>
+          <w:i/>
+          <w:sz w:val="19"/>
+        </w:rPr>
+        <w:t>Cisco's stock pops 15% on surging AI orders, as company says it's cutting almost 4,000 jobs / Cisco cuts nearly 4,000 jobs to spend more on AI, reports „record quarterly revenue" / Cisco Lays Off 4,000 Employees In AI Overhaul, CFO Mark Patterson Says Move Not „Savings" Driven But About AI Re-Allocation / „While we are reducing roles…": Cisco CEO outlines company plans as it cuts 4,000 jobs / Cisco to cut thousands of jobs as AI push accelerates after earnings beat.</w:t>
+      </w:r>
+      <w:r>
+        <w:rPr>
+          <w:rFonts w:ascii="Arial" w:hAnsi="Arial"/>
+          <w:b w:val="0"/>
+          <w:i w:val="0"/>
+          <w:sz w:val="19"/>
+        </w:rPr>
+        <w:t xml:space="preserve"> Streichung von unter 4.000 Stellen (&lt;5 % der globalen Belegschaft); Mitteilungen ab 14. Mai 2026; Q3-FY2026-Rekordumsatz 15,8 Mrd. USD (+12 % YoY); 5,3 Mrd. USD AI-Infrastrukturbestellungen YTD, Projektion auf 9 Mrd. USD AI-Orders im FY2026 (zuvor 5 Mrd. USD); CFO Mark Patterson explizit: Restrukturierung nicht </w:t>
+      </w:r>
+      <w:r>
+        <w:rPr>
+          <w:rFonts w:ascii="Arial" w:hAnsi="Arial"/>
+          <w:b w:val="0"/>
+          <w:i/>
+          <w:sz w:val="19"/>
+        </w:rPr>
+        <w:t>„savings-driven"</w:t>
+      </w:r>
+      <w:r>
+        <w:rPr>
+          <w:rFonts w:ascii="Arial" w:hAnsi="Arial"/>
+          <w:b w:val="0"/>
+          <w:i w:val="0"/>
+          <w:sz w:val="19"/>
+        </w:rPr>
+        <w:t>, sondern Re-Allokation zu Silizium, Optik, Sicherheit und KI; CEO Chuck Robbins; Aktienkurs +15 % am Earnings-Tag. https://www.cnbc.com/2026/05/13/cisco-csco-q3-earnings-report-2026.html | https://techcrunch.com/2026/05/14/cisco-cuts-nearly-4000-jobs-to-spend-more-on-ai-reports-record-quarterly-revenue/ | https://www.benzinga.com/markets/tech/26/05/52550445/cisco-lays-off-4000-employees-ai-overhaul | https://www.businesstoday.in/technology/news/story/while-we-are-reducing-roles-cisco-ceo-outlines-company-plans-as-it-cuts-4000-jobs-531734-2026-05-15 | https://www.foxbusiness.com/technology/cisco-cut-thousands-jobs-ai-push-accelerates-earnings-beat</w:t>
+      </w:r>
+    </w:p>
+    <w:p>
+      <w:pPr>
+        <w:jc w:val="both"/>
+      </w:pPr>
+      <w:r>
+        <w:rPr>
+          <w:rFonts w:ascii="Arial" w:hAnsi="Arial"/>
+          <w:b w:val="0"/>
+          <w:i w:val="0"/>
+          <w:sz w:val="19"/>
+        </w:rPr>
         <w:t xml:space="preserve">CNBC / Bloomberg / AOL / The Register. (7./8. Mai 2026). </w:t>
       </w:r>
       <w:r>
@@ -10566,7 +11074,7 @@
           <w:i w:val="0"/>
           <w:sz w:val="19"/>
         </w:rPr>
-        <w:t xml:space="preserve"> Dieses Arbeitspapier gibt den Stand Anfang Mai 2026 (Schnitt am 8. Mai 2026 — Lauf 001 vom 8. Mai 2026) wieder. Die Debatte entwickelt sich dynamisch, insbesondere im Zuge der OpenAI-Strategiepapiere und der Eröffnung des OpenAI Workshop in Washington, D.C. im Mai 2026, des Erstdurchgangs des GKV-Beitragssatzstabilisierungsgesetzes in der 1065. Bundesratssitzung am 8. Mai 2026 mit 79 Tagesordnungspunkten (Kabinettsbeschluss 29. April 2026, parlamentarische Behandlung vor der Sommerpause 2026 angekündigt), der laufenden Trilog-Verhandlungen zum Digital Omnibus on AI (zweite Runde 28. April 2026 ohne Einigung; nächste Runde 13. Mai 2026 — Knackpunkt ist nicht die Verschiebung der Hochrisiko-Pflichten, sondern die Konformitätsbewertungs-Architektur für Anhang I; die zypriotische Ratspräsidentschaft strebt einen Abschluss vor Ablauf ihrer Amtszeit am 30. Juni 2026 an, andernfalls übernimmt die irische Präsidentschaft), der am 5. Mai 2026 erfolgten Arraignment-Verhandlung im Altman-Verfahren mit „nicht schuldig"-Plädoyer und angeordneter psychiatrischer Begutachtung, des am 7. Mai 2026 versandten individuellen Microsoft-Buyout-Angebots (Annahmefrist 8. Juni 2026, VRSAR-Unterzeichnung 9.–22. Juni 2026, bis zu fünfjährige Krankenversicherungs-Verlängerung), des am 1. Mai 2026 vom Connecticut-Repräsentantenhaus mit 131 zu 17 Stimmen verabschiedeten </w:t>
+        <w:t xml:space="preserve"> Dieses Arbeitspapier gibt den Stand Mitte Mai 2026 (Schnitt am 16. Mai 2026 — Lauf 002 vom 16. Mai 2026) wieder. Die Debatte entwickelt sich dynamisch, insbesondere im Zuge der OpenAI-Strategiepapiere und der Eröffnung des OpenAI Workshop in Washington, D.C. im Mai 2026, des Erstdurchgangs des GKV-Beitragssatzstabilisierungsgesetzes in der 1065. Bundesratssitzung am 8. Mai 2026 mit 79 Tagesordnungspunkten (Kabinettsbeschluss 29. April 2026, parlamentarische Behandlung vor der Sommerpause 2026 angekündigt), der am 7. Mai 2026 um 04:30 Uhr Brüsseler Zeit erzielten Trilog-Einigung zum Digital Omnibus on AI (Stichtage 2. Dezember 2027 für Annex III und 2. August 2028 für Annex I; Watermarking nach Art. 50 Abs. 2 zum 2. Dezember 2026; neues Verbot KI-generierter nicht-einvernehmlicher intimer Inhalte und kindlicher Missbrauchsdarstellungen ab 2. Dezember 2026; Verschiebung der Maschinenverordnung in Section B von Annex I; SME-/small-mid-cap-Vereinfachungen; formale Annahme vor 2. August 2026 erwartet), der am 5. Mai 2026 erfolgten Arraignment-Verhandlung im Altman-Verfahren mit „nicht schuldig"-Plädoyer und angeordneter psychiatrischer Begutachtung, des am 7. Mai 2026 versandten individuellen Microsoft-Buyout-Angebots (Annahmefrist 8. Juni 2026, VRSAR-Unterzeichnung 9.–22. Juni 2026, bis zu fünfjährige Krankenversicherungs-Verlängerung), des am 1. Mai 2026 vom Connecticut-Repräsentantenhaus mit 131 zu 17 Stimmen verabschiedeten </w:t>
       </w:r>
       <w:r>
         <w:rPr>
@@ -10710,7 +11218,79 @@
           <w:i w:val="0"/>
           <w:sz w:val="19"/>
         </w:rPr>
-        <w:t xml:space="preserve"> auf 100 % bei zugleich ablehnender Position des Finanzministeriums, der revidierten IAB-Frühjahrsprognose vom 24. März 2026 (Erwerbstätigkeit −90.000, BIP +0,8 % bei 0,2 bis 0,3 Pp. Iran-Krieg-Dämpfung), der aktualisierten Tech-Layoff-Trackerstände zum 6./7./8. Mai 2026 (TrueUp 119.721 Personen aus 265 Layoff-Meldungen am 6. Mai, 121.111 Personen aus 273 Meldungen am 7. Mai bzw. 127.411 Personen aus 283 Meldungen am 8. Mai 2026 — rund 1.003 Personen pro Tag; SkillSyncer 113.863 Personen aus 179 Ereignissen) sowie der am 5./6. Mai 2026 angekündigten KI-getriebenen Stellenstreichungen bei Coinbase (700 Stellen, 14 %), PayPal (rund 4.760 Stellen, 20 % über 2–3 Jahre), Freshworks (rund 500 Stellen, 11 %) und Cognizant (12.000–15.000 Stellen unter „Project Leap") sowie der am 7. Mai 2026 von Cloudflare angekündigten Streichung von rund 1.100 Stellen (20 % der globalen Belegschaft) zum Übergang zu einem „agentic AI-first operating model" (Restrukturierungsaufwand 140–150 Mio. USD, AI-Einsatz im Konzern +600 % im Quartal, Aktienkurs −18 %), des am 1. Mai 2026 von </w:t>
+        <w:t xml:space="preserve"> auf 100 % bei zugleich ablehnender Position des Finanzministeriums, der revidierten IAB-Frühjahrsprognose vom 24. März 2026 (Erwerbstätigkeit −90.000, BIP +0,8 % bei 0,2 bis 0,3 Pp. Iran-Krieg-Dämpfung), der aktualisierten Tech-Layoff-Trackerstände zum 6./7./8./15.–16. Mai 2026 (TrueUp 119.721 Personen aus 265 Layoff-Meldungen am 6. Mai, 121.111 Personen aus 273 Meldungen am 7. Mai, 127.411 Personen aus 283 Meldungen am 8. Mai bzw. 128.270 Personen aus 286 Meldungen am 15./16. Mai 2026 — rund 1.002 Personen pro Tag; SkillSyncer 113.863 Personen aus 179 Ereignissen; nach </w:t>
+      </w:r>
+      <w:r>
+        <w:rPr>
+          <w:rFonts w:ascii="Arial" w:hAnsi="Arial"/>
+          <w:b w:val="0"/>
+          <w:i/>
+          <w:sz w:val="19"/>
+        </w:rPr>
+        <w:t>American Bazaar</w:t>
+      </w:r>
+      <w:r>
+        <w:rPr>
+          <w:rFonts w:ascii="Arial" w:hAnsi="Arial"/>
+          <w:b w:val="0"/>
+          <w:i w:val="0"/>
+          <w:sz w:val="19"/>
+        </w:rPr>
+        <w:t xml:space="preserve"> nahezu 38.000 Stellenstreichungen aller Branchen in den ersten zehn Tagen des Mai 2026) sowie der am 5./6. Mai 2026 angekündigten KI-getriebenen Stellenstreichungen bei Coinbase (700 Stellen, 14 %), PayPal (rund 4.760 Stellen, 20 % über 2–3 Jahre), Freshworks (rund 500 Stellen, 11 %) und Cognizant (12.000–15.000 Stellen unter „Project Leap"), der am 7. Mai 2026 von Cloudflare angekündigten Streichung von rund 1.100 Stellen (20 % der globalen Belegschaft) zum Übergang zu einem „agentic AI-first operating model" (Restrukturierungsaufwand 140–150 Mio. USD, AI-Einsatz im Konzern +600 % im Quartal, Aktienkurs −18 %), der ebenfalls am 7. Mai 2026 von </w:t>
+      </w:r>
+      <w:r>
+        <w:rPr>
+          <w:rFonts w:ascii="Arial" w:hAnsi="Arial"/>
+          <w:b w:val="0"/>
+          <w:i/>
+          <w:sz w:val="19"/>
+        </w:rPr>
+        <w:t>Upwork</w:t>
+      </w:r>
+      <w:r>
+        <w:rPr>
+          <w:rFonts w:ascii="Arial" w:hAnsi="Arial"/>
+          <w:b w:val="0"/>
+          <w:i w:val="0"/>
+          <w:sz w:val="19"/>
+        </w:rPr>
+        <w:t xml:space="preserve"> angekündigten Streichung von rund 145 Stellen (rund 24 % von rund 600 Beschäftigten; Restrukturierung 16–23 Mio. USD; CEO Hayden Brown: </w:t>
+      </w:r>
+      <w:r>
+        <w:rPr>
+          <w:rFonts w:ascii="Arial" w:hAnsi="Arial"/>
+          <w:b w:val="0"/>
+          <w:i/>
+          <w:sz w:val="19"/>
+        </w:rPr>
+        <w:t>„two pizza teams are dead"</w:t>
+      </w:r>
+      <w:r>
+        <w:rPr>
+          <w:rFonts w:ascii="Arial" w:hAnsi="Arial"/>
+          <w:b w:val="0"/>
+          <w:i w:val="0"/>
+          <w:sz w:val="19"/>
+        </w:rPr>
+        <w:t xml:space="preserve">; Aktienkurs −19 %), der am 13. Mai 2026 von LinkedIn angekündigten Streichung von rund 875 Stellen (rund 5 % von 17.500; Reorganisation unter Chief Product Officer Hari Srinivasan trotz +12 % Quartalsumsatz) sowie der am 14. Mai 2026 von Cisco parallel zum Q3-FY2026-Rekordumsatz von 15,8 Milliarden US-Dollar (+12 % YoY, 5,3 Mrd. USD AI-Infrastrukturbestellungen YTD, Projektion 9 Mrd. USD AI-Orders im FY2026) angekündigten Streichung von unter 4.000 Stellen (&lt;5 % der globalen Belegschaft; CFO Mark Patterson: nicht </w:t>
+      </w:r>
+      <w:r>
+        <w:rPr>
+          <w:rFonts w:ascii="Arial" w:hAnsi="Arial"/>
+          <w:b w:val="0"/>
+          <w:i/>
+          <w:sz w:val="19"/>
+        </w:rPr>
+        <w:t>„savings-driven"</w:t>
+      </w:r>
+      <w:r>
+        <w:rPr>
+          <w:rFonts w:ascii="Arial" w:hAnsi="Arial"/>
+          <w:b w:val="0"/>
+          <w:i w:val="0"/>
+          <w:sz w:val="19"/>
+        </w:rPr>
+        <w:t xml:space="preserve">, sondern Re-Allokation zu Silizium, Optik, Sicherheit und KI; CEO Chuck Robbins; Aktienkurs +15 % am Earnings-Tag), des am 1. Mai 2026 von </w:t>
       </w:r>
       <w:r>
         <w:rPr>
@@ -10862,7 +11442,7 @@
         <w:color w:val="999999"/>
         <w:sz w:val="15"/>
       </w:rPr>
-      <w:t>Version 22.0 — Mai 2026 — CC BY 4.0</w:t>
+      <w:t>Version 23.0 — Mai 2026 — CC BY 4.0</w:t>
       <w:tab/>
       <w:t xml:space="preserve">Seite </w:t>
     </w:r>

</xml_diff>

<commit_message>
Daily-Update 2026-05-25 — Version 23.0 (Cluster: B, F)
- § 4.3: Politische Trilogeinigung Digital Omnibus on AI am 7. Mai 2026
  (Hochrisiko-Stichtage 2.12.2027 / 2.8.2028 bestätigt; neue Art.-5-Verbotsnorm
  gegen KI-generierte CSAM-/NCII-Inhalte ab 2.12.2026; Übergangsfrist Art. 50
  bis 2.12.2026; Ratsdokument 9247/26 vom 13.5.2026).
- § 1.1: Zweite Welle KI-getriebener Stellenstreichungen 14.-21. Mai 2026
  (Cisco ~4.000, Meta ~8.000 + 6.000 offene Stellen, Intuit ~3.000, ClickUp 22 %,
  BILL bis 30 %, Upwork ~24 %).
- § 1.1: TrueUp-Tracker Stand 25.5.2026 (142.985 Personen / 339 Meldungen / 993
  pro Tag).
- § 11.3 / § 11.5: Sieben neue Quelleneinträge.
- Aktualitätshinweis aktualisiert (Schnitt 25.5.2026).
- Validierung 25.5.2026 protokolliert (alle Schritte OK, keine Fehler).

https://claude.ai/code/session_01XYNRDxbWmDM5Yb4Zo3rTpb
</commit_message>
<xml_diff>
--- a/KI-Ökonomie.docx
+++ b/KI-Ökonomie.docx
@@ -112,7 +112,7 @@
           <w:color w:val="666666"/>
           <w:sz w:val="18"/>
         </w:rPr>
-        <w:t>Version 22.0</w:t>
+        <w:t>Version 23.0</w:t>
       </w:r>
     </w:p>
     <w:p>
@@ -328,7 +328,277 @@
           <w:i w:val="0"/>
           <w:sz w:val="19"/>
         </w:rPr>
-        <w:t xml:space="preserve"> parallel zu den Q1-2026-Quartalszahlen (Umsatz +34 % gegenüber dem Vorjahr) angekündigten Streichung von rund 1.100 Stellen — etwa 20 % der globalen Belegschaft — als Übergang zu einem „agentic AI-first operating model" gespeist sind; der gemeinsame Mitarbeitendenbrief von Vorstandsvorsitzendem Matthew Prince und Mitgründerin Michelle Zatlyn („Building for the future") begründet die Reduktion ausdrücklich nicht als Kostenmaßnahme oder leistungsabhängige Auswahl, sondern als strukturelle Anpassung an einen über das Quartal um rund 600 % gestiegenen unternehmensinternen KI-Einsatz; das Restrukturierungsvolumen wird mit 140 bis 150 Millionen US-Dollar im zweiten Quartal beziffert, ausscheidende Beschäftigte erhalten ihre Grundvergütung bis Ende 2026, US-Beschäftigte zusätzlich Krankenversicherungsschutz bis Jahresende und Equity-Vesting bis 15. August 2026; der Aktienkurs gab nach Bekanntgabe rund 18 % ab. Eine Aggregat-Bestätigung dieser Welle liefert der </w:t>
+        <w:t xml:space="preserve"> parallel zu den Q1-2026-Quartalszahlen (Umsatz +34 % gegenüber dem Vorjahr) angekündigten Streichung von rund 1.100 Stellen — etwa 20 % der globalen Belegschaft — als Übergang zu einem „agentic AI-first operating model" gespeist sind; der gemeinsame Mitarbeitendenbrief von Vorstandsvorsitzendem Matthew Prince und Mitgründerin Michelle Zatlyn („Building for the future") begründet die Reduktion ausdrücklich nicht als Kostenmaßnahme oder leistungsabhängige Auswahl, sondern als strukturelle Anpassung an einen über das Quartal um rund 600 % gestiegenen unternehmensinternen KI-Einsatz; das Restrukturierungsvolumen wird mit 140 bis 150 Millionen US-Dollar im zweiten Quartal beziffert, ausscheidende Beschäftigte erhalten ihre Grundvergütung bis Ende 2026, US-Beschäftigte zusätzlich Krankenversicherungsschutz bis Jahresende und Equity-Vesting bis 15. August 2026; der Aktienkurs gab nach Bekanntgabe rund 18 % ab. Eine zweite Welle KI-getriebener Ankündigungen folgte zwischen dem 14. und 21. Mai 2026: </w:t>
+      </w:r>
+      <w:r>
+        <w:rPr>
+          <w:rFonts w:ascii="Arial" w:hAnsi="Arial"/>
+          <w:b w:val="0"/>
+          <w:i/>
+          <w:sz w:val="19"/>
+        </w:rPr>
+        <w:t>Cisco</w:t>
+      </w:r>
+      <w:r>
+        <w:rPr>
+          <w:rFonts w:ascii="Arial" w:hAnsi="Arial"/>
+          <w:b w:val="0"/>
+          <w:i w:val="0"/>
+          <w:sz w:val="19"/>
+        </w:rPr>
+        <w:t xml:space="preserve"> gab am 14. Mai 2026 parallel zu den Q3-Zahlen (Q3-AI-Auftragseingang 1,9 Mrd. USD; Jahresumsatzprognose auf 62,8 – 63,0 Mrd. USD angehoben) die Streichung von knapp 4.000 Stellen (weniger als 5 % der Belegschaft, Restrukturierungsaufwand bis zu 1 Mrd. USD, davon rund 450 Mio. USD im Q4) bekannt, mit dem ausdrücklichen Ziel, Mittel auf Silicon-One-Networking-Systeme, Optik, Sicherheit und KI-Werkzeuge für Beschäftigte umzuwidmen; </w:t>
+      </w:r>
+      <w:r>
+        <w:rPr>
+          <w:rFonts w:ascii="Arial" w:hAnsi="Arial"/>
+          <w:b w:val="0"/>
+          <w:i/>
+          <w:sz w:val="19"/>
+        </w:rPr>
+        <w:t>Meta</w:t>
+      </w:r>
+      <w:r>
+        <w:rPr>
+          <w:rFonts w:ascii="Arial" w:hAnsi="Arial"/>
+          <w:b w:val="0"/>
+          <w:i w:val="0"/>
+          <w:sz w:val="19"/>
+        </w:rPr>
+        <w:t xml:space="preserve"> startete am 20. Mai 2026 die Streichung von rund 8.000 Stellen — etwa 10 % der globalen Belegschaft — und strich zusätzlich 6.000 offene Stellen, sodass die effektive Kopfzahl-Reduktion bei rund 14.000 Personen liegt, kombiniert mit einer Reorganisation in „AI-Pods" und der Schaffung neuer Rollenkategorien („AI builder", „AI pod lead", „AI org lead"); rund 7.000 Beschäftigte werden in die </w:t>
+      </w:r>
+      <w:r>
+        <w:rPr>
+          <w:rFonts w:ascii="Arial" w:hAnsi="Arial"/>
+          <w:b w:val="0"/>
+          <w:i/>
+          <w:sz w:val="19"/>
+        </w:rPr>
+        <w:t>Applied AI</w:t>
+      </w:r>
+      <w:r>
+        <w:rPr>
+          <w:rFonts w:ascii="Arial" w:hAnsi="Arial"/>
+          <w:b w:val="0"/>
+          <w:i w:val="0"/>
+          <w:sz w:val="19"/>
+        </w:rPr>
+        <w:t xml:space="preserve">-Organisation, die </w:t>
+      </w:r>
+      <w:r>
+        <w:rPr>
+          <w:rFonts w:ascii="Arial" w:hAnsi="Arial"/>
+          <w:b w:val="0"/>
+          <w:i/>
+          <w:sz w:val="19"/>
+        </w:rPr>
+        <w:t>Agent Transformation Accelerator</w:t>
+      </w:r>
+      <w:r>
+        <w:rPr>
+          <w:rFonts w:ascii="Arial" w:hAnsi="Arial"/>
+          <w:b w:val="0"/>
+          <w:i w:val="0"/>
+          <w:sz w:val="19"/>
+        </w:rPr>
+        <w:t xml:space="preserve"> und die </w:t>
+      </w:r>
+      <w:r>
+        <w:rPr>
+          <w:rFonts w:ascii="Arial" w:hAnsi="Arial"/>
+          <w:b w:val="0"/>
+          <w:i/>
+          <w:sz w:val="19"/>
+        </w:rPr>
+        <w:t>Central Analytics</w:t>
+      </w:r>
+      <w:r>
+        <w:rPr>
+          <w:rFonts w:ascii="Arial" w:hAnsi="Arial"/>
+          <w:b w:val="0"/>
+          <w:i w:val="0"/>
+          <w:sz w:val="19"/>
+        </w:rPr>
+        <w:t xml:space="preserve">-Einheit überführt, US-Beschäftigte erhalten 16 Wochen Grundvergütung zuzüglich zwei Wochen je Dienstjahr und 18 Monate Krankenversicherung, weitere Streichungen sind für die zweite Jahreshälfte 2026 angekündigt — der kumulative Stellenabbau Meta seit 2022 übersteigt damit 33.000 Stellen, parallel hat der Konzern die Capex-Spanne für 2026 auf 115 bis 135 Milliarden US-Dollar (+73 % gegenüber 72,2 Mrd. USD in 2025) bekräftigt; </w:t>
+      </w:r>
+      <w:r>
+        <w:rPr>
+          <w:rFonts w:ascii="Arial" w:hAnsi="Arial"/>
+          <w:b w:val="0"/>
+          <w:i/>
+          <w:sz w:val="19"/>
+        </w:rPr>
+        <w:t>Intuit</w:t>
+      </w:r>
+      <w:r>
+        <w:rPr>
+          <w:rFonts w:ascii="Arial" w:hAnsi="Arial"/>
+          <w:b w:val="0"/>
+          <w:i w:val="0"/>
+          <w:sz w:val="19"/>
+        </w:rPr>
+        <w:t xml:space="preserve"> hat am 20. Mai 2026 in einem CEO-Memo (Sasan Goodarzi) die Streichung von rund 3.000 Stellen — 17 % der Belegschaft — angekündigt und zugleich mehrjährige Partnerschaften mit </w:t>
+      </w:r>
+      <w:r>
+        <w:rPr>
+          <w:rFonts w:ascii="Arial" w:hAnsi="Arial"/>
+          <w:b w:val="0"/>
+          <w:i/>
+          <w:sz w:val="19"/>
+        </w:rPr>
+        <w:t>Anthropic</w:t>
+      </w:r>
+      <w:r>
+        <w:rPr>
+          <w:rFonts w:ascii="Arial" w:hAnsi="Arial"/>
+          <w:b w:val="0"/>
+          <w:i w:val="0"/>
+          <w:sz w:val="19"/>
+        </w:rPr>
+        <w:t xml:space="preserve"> und </w:t>
+      </w:r>
+      <w:r>
+        <w:rPr>
+          <w:rFonts w:ascii="Arial" w:hAnsi="Arial"/>
+          <w:b w:val="0"/>
+          <w:i/>
+          <w:sz w:val="19"/>
+        </w:rPr>
+        <w:t>OpenAI</w:t>
+      </w:r>
+      <w:r>
+        <w:rPr>
+          <w:rFonts w:ascii="Arial" w:hAnsi="Arial"/>
+          <w:b w:val="0"/>
+          <w:i w:val="0"/>
+          <w:sz w:val="19"/>
+        </w:rPr>
+        <w:t xml:space="preserve"> zur Einbettung von KI in </w:t>
+      </w:r>
+      <w:r>
+        <w:rPr>
+          <w:rFonts w:ascii="Arial" w:hAnsi="Arial"/>
+          <w:b w:val="0"/>
+          <w:i/>
+          <w:sz w:val="19"/>
+        </w:rPr>
+        <w:t>TurboTax</w:t>
+      </w:r>
+      <w:r>
+        <w:rPr>
+          <w:rFonts w:ascii="Arial" w:hAnsi="Arial"/>
+          <w:b w:val="0"/>
+          <w:i w:val="0"/>
+          <w:sz w:val="19"/>
+        </w:rPr>
+        <w:t xml:space="preserve">, </w:t>
+      </w:r>
+      <w:r>
+        <w:rPr>
+          <w:rFonts w:ascii="Arial" w:hAnsi="Arial"/>
+          <w:b w:val="0"/>
+          <w:i/>
+          <w:sz w:val="19"/>
+        </w:rPr>
+        <w:t>QuickBooks</w:t>
+      </w:r>
+      <w:r>
+        <w:rPr>
+          <w:rFonts w:ascii="Arial" w:hAnsi="Arial"/>
+          <w:b w:val="0"/>
+          <w:i w:val="0"/>
+          <w:sz w:val="19"/>
+        </w:rPr>
+        <w:t xml:space="preserve"> und </w:t>
+      </w:r>
+      <w:r>
+        <w:rPr>
+          <w:rFonts w:ascii="Arial" w:hAnsi="Arial"/>
+          <w:b w:val="0"/>
+          <w:i/>
+          <w:sz w:val="19"/>
+        </w:rPr>
+        <w:t>Credit Karma</w:t>
+      </w:r>
+      <w:r>
+        <w:rPr>
+          <w:rFonts w:ascii="Arial" w:hAnsi="Arial"/>
+          <w:b w:val="0"/>
+          <w:i w:val="0"/>
+          <w:sz w:val="19"/>
+        </w:rPr>
+        <w:t xml:space="preserve"> publik gemacht (Severance-Paket 16 Wochen Grundvergütung zuzüglich zwei Wochen je Dienstjahr; Schließung des Standorts Reno); </w:t>
+      </w:r>
+      <w:r>
+        <w:rPr>
+          <w:rFonts w:ascii="Arial" w:hAnsi="Arial"/>
+          <w:b w:val="0"/>
+          <w:i/>
+          <w:sz w:val="19"/>
+        </w:rPr>
+        <w:t>ClickUp</w:t>
+      </w:r>
+      <w:r>
+        <w:rPr>
+          <w:rFonts w:ascii="Arial" w:hAnsi="Arial"/>
+          <w:b w:val="0"/>
+          <w:i w:val="0"/>
+          <w:sz w:val="19"/>
+        </w:rPr>
+        <w:t xml:space="preserve"> hat am 21. Mai 2026 22 % seiner Belegschaft entlassen und parallel eine Vergütungsstruktur mit Bändern bis zu 1 Mio. US-Dollar Jahresgehalt eingeführt, mit der ausdrücklichen Begründung, das Unternehmen werde auf ein „100x"-Modell umgebaut, in dem KI-Agenten Beschäftigte im Verhältnis 3:1 übertreffen; </w:t>
+      </w:r>
+      <w:r>
+        <w:rPr>
+          <w:rFonts w:ascii="Arial" w:hAnsi="Arial"/>
+          <w:b w:val="0"/>
+          <w:i/>
+          <w:sz w:val="19"/>
+        </w:rPr>
+        <w:t>BILL</w:t>
+      </w:r>
+      <w:r>
+        <w:rPr>
+          <w:rFonts w:ascii="Arial" w:hAnsi="Arial"/>
+          <w:b w:val="0"/>
+          <w:i w:val="0"/>
+          <w:sz w:val="19"/>
+        </w:rPr>
+        <w:t xml:space="preserve"> (Zahlungs- und Spend-Management-Plattform) hat einen Personalabbau von bis zu 30 % angekündigt; </w:t>
+      </w:r>
+      <w:r>
+        <w:rPr>
+          <w:rFonts w:ascii="Arial" w:hAnsi="Arial"/>
+          <w:b w:val="0"/>
+          <w:i/>
+          <w:sz w:val="19"/>
+        </w:rPr>
+        <w:t>Upwork</w:t>
+      </w:r>
+      <w:r>
+        <w:rPr>
+          <w:rFonts w:ascii="Arial" w:hAnsi="Arial"/>
+          <w:b w:val="0"/>
+          <w:i w:val="0"/>
+          <w:sz w:val="19"/>
+        </w:rPr>
+        <w:t xml:space="preserve"> hat in der ersten Maihälfte 2026 rund 24 % der Belegschaft gestrichen (Restrukturierungsaufwand 16 bis 23 Mio. US-Dollar). Die Tagesfortschreibung des </w:t>
+      </w:r>
+      <w:r>
+        <w:rPr>
+          <w:rFonts w:ascii="Arial" w:hAnsi="Arial"/>
+          <w:b w:val="0"/>
+          <w:i/>
+          <w:sz w:val="19"/>
+        </w:rPr>
+        <w:t>TrueUp</w:t>
+      </w:r>
+      <w:r>
+        <w:rPr>
+          <w:rFonts w:ascii="Arial" w:hAnsi="Arial"/>
+          <w:b w:val="0"/>
+          <w:i w:val="0"/>
+          <w:sz w:val="19"/>
+        </w:rPr>
+        <w:t xml:space="preserve">-Trackers weist zum 25. Mai 2026 142.985 betroffene Personen aus 339 Layoff-Meldungen aus (rund 993 Stellen pro Tag) — gegenüber dem Stand vom 8. Mai 2026 (127.411 / 283) eine Zunahme um etwa 15.500 Personen und 56 Meldungen binnen 17 Tagen, im Einklang mit der seit Anfang Mai 2026 beobachteten Welle von über 1.000 Tech-Stellenstreichungen pro Tag. Eine Aggregat-Bestätigung dieser Welle liefert der </w:t>
       </w:r>
       <w:r>
         <w:rPr>
@@ -2128,7 +2398,43 @@
           <w:i w:val="0"/>
           <w:sz w:val="19"/>
         </w:rPr>
-        <w:t xml:space="preserve"> Eine rein nationale Lösung kann mit der Warenverkehrsfreiheit, der Dienstleistungsfreiheit und der Niederlassungsfreiheit in Konflikt geraten. Eine Regelung, die nur inländische Roboterbetreiber trifft, während grenzüberschreitende KI-Dienstleistungen unbesteuert bleiben, wäre diskriminierungsrechtlich problematisch und praktisch kaum durchsetzbar. Der EU AI Act (Verordnung 2024/1689) schafft ab dem 2. August 2026 einen unionsweit einheitlichen Regulierungsrahmen für KI-Systeme (Hochrisiko-Systeme gemäß Anhang III, Transparenzpflichten nach Art. 50, Durchsetzungsregime); dies legt einen einheitlichen Definitionsrahmen, der steuerpolitische Anknüpfungen an KI-Systemklassen mittelfristig erleichtern kann, ohne selbst steuerrechtliche Wirkung zu entfalten. Die Europäische Kommission hat am 19. November 2025 mit dem „Digital Omnibus on AI" einen Vereinfachungsvorschlag vorgelegt, den das Europäische Parlament am 16. März 2026 im Ausschuss und am 23. März 2026 im Plenum unterstützt hat. Er sieht eine Verschiebung der Hochrisiko-Pflichten vor — je nach Systemtyp bis maximal zum 2. Dezember 2027 bzw. 2. August 2028 — und koppelt ihre Anwendbarkeit an die Verfügbarkeit harmonisierter Normen; zudem wird die Kennzeichnungspflicht für KI-generierte Inhalte (Art. 50) bis zum 2. November 2026 verlängert. Die Kommissionsdurchsetzungsbefugnisse gegenüber Anbietern von Allzweck-KI-Modellen (GPAI) treten wie vorgesehen am 2. August 2026 in Kraft. Parlament und Rat haben die Trilogverhandlungen aufgenommen; der zweite Trilogtermin am 28. April 2026 endete nach Berichterstattung von IAPP und A&amp;O Shearman ohne Einigung — Streitpunkt war primär das Verhältnis zwischen AI Act und sektorspezifischen EU-Regelungen für eingebettete KI-Systeme (Anhang I) sowie die Rechtsgrundlage für die Verarbeitung personenbezogener Daten zur Bias-Erkennung. Beide Institutionen konvergieren auf Stichtage 2. Dezember 2027 (Anhang III) und 2. August 2028 (Anhang I) für die Hochrisiko-Pflichten. Die nächste Trilogrunde ist auf den 13. Mai 2026 terminiert; Ziel bleibt eine förmliche Verabschiedung vor dem ursprünglichen Stichtag am 2. August 2026. Die zypriotische Ratspräsidentschaft hat sich vorgenommen, das Dossier vor Ablauf ihrer Amtszeit am 30. Juni 2026 abzuschließen; gelingt das nicht, übernimmt zur zweiten Jahreshälfte 2026 die irische Präsidentschaft. Scheitert die Einigung bis zum 2. August 2026, würden die Hochrisiko-Pflichten in ihrer ursprünglich vorgesehenen Fassung anwendbar. Für die Steuerdebatte folgt daraus, dass der zeitliche Vorlauf für KI-Definitionen aus dem AI Act enger als ursprünglich gedacht ist — eine mittelfristige Anknüpfung steuerlicher Tatbestände an AI-Act-Kategorien bleibt möglich, setzt aber voraus, dass die Normenlandschaft nach 2027 verlässlich vorliegt.</w:t>
+        <w:t xml:space="preserve"> Eine rein nationale Lösung kann mit der Warenverkehrsfreiheit, der Dienstleistungsfreiheit und der Niederlassungsfreiheit in Konflikt geraten. Eine Regelung, die nur inländische Roboterbetreiber trifft, während grenzüberschreitende KI-Dienstleistungen unbesteuert bleiben, wäre diskriminierungsrechtlich problematisch und praktisch kaum durchsetzbar. Der EU AI Act (Verordnung 2024/1689) schafft ab dem 2. August 2026 einen unionsweit einheitlichen Regulierungsrahmen für KI-Systeme (Hochrisiko-Systeme gemäß Anhang III, Transparenzpflichten nach Art. 50, Durchsetzungsregime); dies legt einen einheitlichen Definitionsrahmen, der steuerpolitische Anknüpfungen an KI-Systemklassen mittelfristig erleichtern kann, ohne selbst steuerrechtliche Wirkung zu entfalten. Die Europäische Kommission hat am 19. November 2025 mit dem „Digital Omnibus on AI" einen Vereinfachungsvorschlag vorgelegt, den das Europäische Parlament am 16. März 2026 im Ausschuss und am 23. März 2026 im Plenum unterstützt hat. Er sieht eine Verschiebung der Hochrisiko-Pflichten vor — je nach Systemtyp bis maximal zum 2. Dezember 2027 bzw. 2. August 2028 — und koppelt ihre Anwendbarkeit an die Verfügbarkeit harmonisierter Normen; zudem wird die Kennzeichnungspflicht für KI-generierte Inhalte (Art. 50) bis zum 2. November 2026 verlängert. Die Kommissionsdurchsetzungsbefugnisse gegenüber Anbietern von Allzweck-KI-Modellen (GPAI) treten wie vorgesehen am 2. August 2026 in Kraft. Parlament und Rat haben die Trilogverhandlungen aufgenommen; der zweite Trilogtermin am 28. April 2026 endete nach Berichterstattung von IAPP und A&amp;O Shearman ohne Einigung — Streitpunkt war primär das Verhältnis zwischen AI Act und sektorspezifischen EU-Regelungen für eingebettete KI-Systeme (Anhang I) sowie die Rechtsgrundlage für die Verarbeitung personenbezogener Daten zur Bias-Erkennung. In den frühen Morgenstunden des 7. Mai 2026 haben Rat und Parlament beim dritten Trilog eine politische Einigung über den </w:t>
+      </w:r>
+      <w:r>
+        <w:rPr>
+          <w:rFonts w:ascii="Arial" w:hAnsi="Arial"/>
+          <w:b w:val="0"/>
+          <w:i/>
+          <w:sz w:val="19"/>
+        </w:rPr>
+        <w:t>Digital Omnibus on AI</w:t>
+      </w:r>
+      <w:r>
+        <w:rPr>
+          <w:rFonts w:ascii="Arial" w:hAnsi="Arial"/>
+          <w:b w:val="0"/>
+          <w:i w:val="0"/>
+          <w:sz w:val="19"/>
+        </w:rPr>
+        <w:t xml:space="preserve"> erzielt (gemeinsame Pressemitteilung des Rats vom 7. Mai 2026; konsolidierter Kompromisstext in Ratsdokument 9247/26 vom 13. Mai 2026). Die Einigung bestätigt die Verschiebung der Hochrisiko-Pflichten auf den 2. Dezember 2027 (Anhang III) bzw. den 2. August 2028 (Anhang I), löst den den vorangegangenen Trilog blockierenden Streit über die Konformitätsbewertungs-Architektur für Anhang I und ergänzt den Katalog der nach Art. 5 verbotenen Praktiken um eine neue Tatbestandsgruppe: KI-Systeme, die für die Erzeugung von Darstellungen sexuellen Missbrauchs von Kindern (CSAM) oder von nicht-einvernehmlichen intimen Inhalten (Bild, Video, Ton) entwickelt oder bereitgestellt werden, sind unionsweit ab dem 2. Dezember 2026 untersagt — adressiert werden sowohl Inverkehrbringen mit entsprechender Zweckbestimmung als auch Bereitstellen ohne angemessene Schutzvorkehrungen sowie die Nutzung durch </w:t>
+      </w:r>
+      <w:r>
+        <w:rPr>
+          <w:rFonts w:ascii="Arial" w:hAnsi="Arial"/>
+          <w:b w:val="0"/>
+          <w:i/>
+          <w:sz w:val="19"/>
+        </w:rPr>
+        <w:t>Deployer</w:t>
+      </w:r>
+      <w:r>
+        <w:rPr>
+          <w:rFonts w:ascii="Arial" w:hAnsi="Arial"/>
+          <w:b w:val="0"/>
+          <w:i w:val="0"/>
+          <w:sz w:val="19"/>
+        </w:rPr>
+        <w:t>. Die Kennzeichnungspflicht für KI-generierte Inhalte (Art. 50 Abs. 2) bleibt zum 2. August 2026 anwendbar; für Systeme, die vor diesem Stichtag bereits in Verkehr gebracht sind, gilt eine Übergangsfrist bis zum 2. Dezember 2026. Die förmliche Verabschiedung durch Rat und Parlament wird nach legal-linguistischer Überarbeitung vor dem 2. August 2026 angestrebt. Die zypriotische Ratspräsidentschaft hat das Dossier damit vor Ablauf ihrer Amtszeit am 30. Juni 2026 zu einem politischen Abschluss geführt. Für die Steuerdebatte folgt daraus, dass die KI-rechtliche Definitionslandschaft des AI Act nun mit einem konkreten Zeitplan ausgestattet ist: Die für eine steuerliche Anknüpfung an Systemklassen relevanten Hochrisiko-Definitionen werden nicht vor Dezember 2027 verbindlich operativ, womit fiskalpolitische Anknüpfungen an AI-Act-Kategorien mittelfristig planbar, aber bis dahin nur in vorbereitender Form möglich bleiben.</w:t>
       </w:r>
     </w:p>
     <w:p>
@@ -8718,6 +9024,56 @@
           <w:i w:val="0"/>
           <w:sz w:val="19"/>
         </w:rPr>
+        <w:t xml:space="preserve">Rat der Europäischen Union. (7. Mai 2026). </w:t>
+      </w:r>
+      <w:r>
+        <w:rPr>
+          <w:rFonts w:ascii="Arial" w:hAnsi="Arial"/>
+          <w:b w:val="0"/>
+          <w:i/>
+          <w:sz w:val="19"/>
+        </w:rPr>
+        <w:t>Artificial Intelligence: Council and Parliament agree to simplify and streamline rules.</w:t>
+      </w:r>
+      <w:r>
+        <w:rPr>
+          <w:rFonts w:ascii="Arial" w:hAnsi="Arial"/>
+          <w:b w:val="0"/>
+          <w:i w:val="0"/>
+          <w:sz w:val="19"/>
+        </w:rPr>
+        <w:t xml:space="preserve"> Pressemitteilung zur politischen Einigung im Trilog über den </w:t>
+      </w:r>
+      <w:r>
+        <w:rPr>
+          <w:rFonts w:ascii="Arial" w:hAnsi="Arial"/>
+          <w:b w:val="0"/>
+          <w:i/>
+          <w:sz w:val="19"/>
+        </w:rPr>
+        <w:t>Digital Omnibus on AI</w:t>
+      </w:r>
+      <w:r>
+        <w:rPr>
+          <w:rFonts w:ascii="Arial" w:hAnsi="Arial"/>
+          <w:b w:val="0"/>
+          <w:i w:val="0"/>
+          <w:sz w:val="19"/>
+        </w:rPr>
+        <w:t>: Bestätigung der Verschiebung der Hochrisiko-Pflichten auf den 2. Dezember 2027 (Anhang III) bzw. 2. August 2028 (Anhang I); neue Art.-5-Verbotsnorm gegen KI-Systeme zur Erzeugung von Darstellungen sexuellen Missbrauchs von Kindern und nicht-einvernehmlichen intimen Inhalten (anwendbar ab 2. Dezember 2026); Übergangsfrist für die Art.-50-Kennzeichnung bis 2. Dezember 2026 für vor dem 2. August 2026 in Verkehr gebrachte Systeme; konsolidierter Kompromisstext in Ratsdokument 9247/26 (13. Mai 2026). https://www.consilium.europa.eu/en/press/press-releases/2026/05/07/artificial-intelligence-council-and-parliament-agree-to-simplify-and-streamline-rules/</w:t>
+      </w:r>
+    </w:p>
+    <w:p>
+      <w:pPr>
+        <w:jc w:val="both"/>
+      </w:pPr>
+      <w:r>
+        <w:rPr>
+          <w:rFonts w:ascii="Arial" w:hAnsi="Arial"/>
+          <w:b w:val="0"/>
+          <w:i w:val="0"/>
+          <w:sz w:val="19"/>
+        </w:rPr>
         <w:t>Europäische Union. (2024). Verordnung (EU) 2024/1689 des Europäischen Parlaments und des Rates vom 13. Juni 2024 zur Festlegung harmonisierter Vorschriften für künstliche Intelligenz (</w:t>
       </w:r>
       <w:r>
@@ -10553,6 +10909,252 @@
       <w:r>
         <w:rPr>
           <w:rFonts w:ascii="Arial" w:hAnsi="Arial"/>
+          <w:b w:val="0"/>
+          <w:i w:val="0"/>
+          <w:sz w:val="19"/>
+        </w:rPr>
+        <w:t xml:space="preserve">Bird &amp; Bird / White &amp; Case / Hogan Lovells / Taylor Wessing. (Mai 2026). </w:t>
+      </w:r>
+      <w:r>
+        <w:rPr>
+          <w:rFonts w:ascii="Arial" w:hAnsi="Arial"/>
+          <w:b w:val="0"/>
+          <w:i/>
+          <w:sz w:val="19"/>
+        </w:rPr>
+        <w:t>Digital Omnibus on AI Provisional Agreement Reached at the May Trilogue / EU agrees Digital Omnibus deal to simplify AI rules / EU legislators agree to delay for high-risk AI rules / The EU Digital Omnibus on AI — What the political deal means.</w:t>
+      </w:r>
+      <w:r>
+        <w:rPr>
+          <w:rFonts w:ascii="Arial" w:hAnsi="Arial"/>
+          <w:b w:val="0"/>
+          <w:i w:val="0"/>
+          <w:sz w:val="19"/>
+        </w:rPr>
+        <w:t xml:space="preserve"> Kanzlei­analysen zur politischen Einigung vom 7. Mai 2026 mit Detailaufnahme der neuen Art.-5-Verbotstatbestände, der Verschiebung der Hochrisiko-Pflichten und der Übergangsfristen für die Art.-50-Kennzeichnung. https://www.twobirds.com/en/insights/2026/digital-omnibus-on-ai-provisional-agreement-reached-at-the-may-trilogue | https://www.whitecase.com/insight-alert/eu-agrees-digital-omnibus-deal-simplify-ai-rules | https://www.hoganlovells.com/en/publications/eu-legislators-agree-to-delay-for-highrisk-ai-rules | https://www.taylorwessing.com/en/insights-and-events/insights/2026/05/the-eu-digital-omnibus-on-ai-what-the-political-deal-means</w:t>
+      </w:r>
+    </w:p>
+    <w:p>
+      <w:pPr>
+        <w:jc w:val="both"/>
+      </w:pPr>
+      <w:r>
+        <w:rPr>
+          <w:rFonts w:ascii="Arial" w:hAnsi="Arial"/>
+          <w:b w:val="0"/>
+          <w:i w:val="0"/>
+          <w:sz w:val="19"/>
+        </w:rPr>
+        <w:t xml:space="preserve">TechCrunch / TechStartups. (14. Mai 2026). </w:t>
+      </w:r>
+      <w:r>
+        <w:rPr>
+          <w:rFonts w:ascii="Arial" w:hAnsi="Arial"/>
+          <w:b w:val="0"/>
+          <w:i/>
+          <w:sz w:val="19"/>
+        </w:rPr>
+        <w:t>Cisco cuts nearly 4,000 jobs to spend more on AI, reports „record quarterly revenue" / Cisco lays off 4,000 employees while doubling down on AI infrastructure.</w:t>
+      </w:r>
+      <w:r>
+        <w:rPr>
+          <w:rFonts w:ascii="Arial" w:hAnsi="Arial"/>
+          <w:b w:val="0"/>
+          <w:i w:val="0"/>
+          <w:sz w:val="19"/>
+        </w:rPr>
+        <w:t xml:space="preserve"> Streichung von knapp 4.000 Stellen (&lt;5 % der Belegschaft) parallel zu Q3-2026-Earnings; Restrukturierungsaufwand bis zu 1 Mrd. USD, davon rund 450 Mio. USD im Q4; Q3-AI-Auftragseingang 1,9 Mrd. USD; Jahresumsatzprognose 62,8–63,0 Mrd. USD; strategische Reallokation auf Silicon One, Optik, Sicherheit, KI-Tooling. https://techcrunch.com/2026/05/14/cisco-cuts-nearly-4000-jobs-to-spend-more-on-ai-reports-record-quarterly-revenue/ | https://techstartups.com/2026/05/14/cisco-lays-off-4000-employees-while-doubling-down-on-ai-infrastructure/</w:t>
+      </w:r>
+    </w:p>
+    <w:p>
+      <w:pPr>
+        <w:jc w:val="both"/>
+      </w:pPr>
+      <w:r>
+        <w:rPr>
+          <w:rFonts w:ascii="Arial" w:hAnsi="Arial"/>
+          <w:b w:val="0"/>
+          <w:i w:val="0"/>
+          <w:sz w:val="19"/>
+        </w:rPr>
+        <w:t xml:space="preserve">NPR / TheNextWeb / TechStartups / Yahoo Finance. (19./20. Mai 2026). </w:t>
+      </w:r>
+      <w:r>
+        <w:rPr>
+          <w:rFonts w:ascii="Arial" w:hAnsi="Arial"/>
+          <w:b w:val="0"/>
+          <w:i/>
+          <w:sz w:val="19"/>
+        </w:rPr>
+        <w:t>Meta slashes 8,000 jobs as it pivots towards AI / Meta cuts 8,000 jobs and cancels 6,000 open roles as $135B AI spending reshapes the company from the inside / Meta begins layoffs of 8,000 employees as Zuckerberg doubles down on AI overhaul.</w:t>
+      </w:r>
+      <w:r>
+        <w:rPr>
+          <w:rFonts w:ascii="Arial" w:hAnsi="Arial"/>
+          <w:b w:val="0"/>
+          <w:i w:val="0"/>
+          <w:sz w:val="19"/>
+        </w:rPr>
+        <w:t xml:space="preserve"> Streichung von rund 8.000 Stellen (10 % der globalen Belegschaft); zusätzlich Streichung von 6.000 offenen Stellen (effektive Reduktion ca. 14.000); Reorganisation in „AI-Pods" mit Rollenkategorien „AI builder", „AI pod lead", „AI org lead"; rund 7.000 Beschäftigte werden in Applied AI, Agent Transformation Accelerator und Central Analytics überführt; Severance 16 Wochen Grundvergütung + zwei Wochen je Dienstjahr + 18 Monate Krankenversicherung; Capex 2026 115–135 Mrd. USD (+73 % gegenüber 72,2 Mrd. USD in 2025). https://www.npr.org/2026/05/20/nx-s1-5826917/meta-layoffs-ai-jobs | https://thenextweb.com/news/meta-layoffs-8000-ai-restructuring-may-2026 | https://techstartups.com/2026/05/19/meta-begins-layoffs-of-8000-employees-as-zuckerberg-doubles-down-on-ai-overhaul/ | https://finance.yahoo.com/sectors/technology/articles/meta-layoffs-2026-8-000-114209703.html</w:t>
+      </w:r>
+    </w:p>
+    <w:p>
+      <w:pPr>
+        <w:jc w:val="both"/>
+      </w:pPr>
+      <w:r>
+        <w:rPr>
+          <w:rFonts w:ascii="Arial" w:hAnsi="Arial"/>
+          <w:b w:val="0"/>
+          <w:i w:val="0"/>
+          <w:sz w:val="19"/>
+        </w:rPr>
+        <w:t xml:space="preserve">TechCrunch / CFO Dive / HRD / Mirror Review. (20./21. Mai 2026). </w:t>
+      </w:r>
+      <w:r>
+        <w:rPr>
+          <w:rFonts w:ascii="Arial" w:hAnsi="Arial"/>
+          <w:b w:val="0"/>
+          <w:i/>
+          <w:sz w:val="19"/>
+        </w:rPr>
+        <w:t>Intuit to lay off over 3,000 employees to refocus on AI / Intuit to slash workforce by 17% / Intuit slashes staff, signs deals with Anthropic and Open AI / Intuit Layoffs 2026: Finance Software Firm Cuts 3,000 Jobs (17% Workforce) Amid AI Restructuring.</w:t>
+      </w:r>
+      <w:r>
+        <w:rPr>
+          <w:rFonts w:ascii="Arial" w:hAnsi="Arial"/>
+          <w:b w:val="0"/>
+          <w:i w:val="0"/>
+          <w:sz w:val="19"/>
+        </w:rPr>
+        <w:t xml:space="preserve"> Streichung von rund 3.000 Stellen (17 % der Belegschaft) gemäß CEO-Memo Sasan Goodarzi (20. Mai 2026); mehrjährige Partnerschaften mit Anthropic und OpenAI zur KI-Integration in TurboTax, QuickBooks, Credit Karma; Severance 16 Wochen Grundvergütung + zwei Wochen je Dienstjahr; Schließung des Standorts Reno. https://techcrunch.com/2026/05/20/intuit-to-lay-off-over-3000-employees-to-refocus-on-ai/ | https://www.cfodive.com/news/intuit-slash-workforce-layoffs-labor-generativeai/821040/ | https://www.hcamag.com/us/specialization/transformation/intuit-slashes-staff-signs-deals-with-anthropic-and-open-ai/576021 | https://www.mirrorreview.com/news/intuit-layoffs/</w:t>
+      </w:r>
+    </w:p>
+    <w:p>
+      <w:pPr>
+        <w:jc w:val="both"/>
+      </w:pPr>
+      <w:r>
+        <w:rPr>
+          <w:rFonts w:ascii="Arial" w:hAnsi="Arial"/>
+          <w:b w:val="0"/>
+          <w:i w:val="0"/>
+          <w:sz w:val="19"/>
+        </w:rPr>
+        <w:t xml:space="preserve">TheNextWeb / Fast Company / Yahoo Finance. (Mai 2026). </w:t>
+      </w:r>
+      <w:r>
+        <w:rPr>
+          <w:rFonts w:ascii="Arial" w:hAnsi="Arial"/>
+          <w:b w:val="0"/>
+          <w:i/>
+          <w:sz w:val="19"/>
+        </w:rPr>
+        <w:t>ClickUp cuts 22% of staff, offers $1M salaries in AI restructuring / Tech layoffs this week: Cloudflare, Coinbase, Upwork, and others point to AI as they slash jobs / Layoffs Accelerate in May 2026 as Firms Restructure Around AI.</w:t>
+      </w:r>
+      <w:r>
+        <w:rPr>
+          <w:rFonts w:ascii="Arial" w:hAnsi="Arial"/>
+          <w:b w:val="0"/>
+          <w:i w:val="0"/>
+          <w:sz w:val="19"/>
+        </w:rPr>
+        <w:t xml:space="preserve"> Sammelbeleg für die Welle in der zweiten Maihälfte: </w:t>
+      </w:r>
+      <w:r>
+        <w:rPr>
+          <w:rFonts w:ascii="Arial" w:hAnsi="Arial"/>
+          <w:b w:val="0"/>
+          <w:i/>
+          <w:sz w:val="19"/>
+        </w:rPr>
+        <w:t>ClickUp</w:t>
+      </w:r>
+      <w:r>
+        <w:rPr>
+          <w:rFonts w:ascii="Arial" w:hAnsi="Arial"/>
+          <w:b w:val="0"/>
+          <w:i w:val="0"/>
+          <w:sz w:val="19"/>
+        </w:rPr>
+        <w:t xml:space="preserve"> 22 % der Belegschaft am 21. Mai 2026 mit Vergütungsbändern bis 1 Mio. USD und „100x"-Modell (KI-Agenten zu Beschäftigten im Verhältnis 3:1); </w:t>
+      </w:r>
+      <w:r>
+        <w:rPr>
+          <w:rFonts w:ascii="Arial" w:hAnsi="Arial"/>
+          <w:b w:val="0"/>
+          <w:i/>
+          <w:sz w:val="19"/>
+        </w:rPr>
+        <w:t>BILL</w:t>
+      </w:r>
+      <w:r>
+        <w:rPr>
+          <w:rFonts w:ascii="Arial" w:hAnsi="Arial"/>
+          <w:b w:val="0"/>
+          <w:i w:val="0"/>
+          <w:sz w:val="19"/>
+        </w:rPr>
+        <w:t xml:space="preserve"> bis zu 30 % Personalabbau; </w:t>
+      </w:r>
+      <w:r>
+        <w:rPr>
+          <w:rFonts w:ascii="Arial" w:hAnsi="Arial"/>
+          <w:b w:val="0"/>
+          <w:i/>
+          <w:sz w:val="19"/>
+        </w:rPr>
+        <w:t>Upwork</w:t>
+      </w:r>
+      <w:r>
+        <w:rPr>
+          <w:rFonts w:ascii="Arial" w:hAnsi="Arial"/>
+          <w:b w:val="0"/>
+          <w:i w:val="0"/>
+          <w:sz w:val="19"/>
+        </w:rPr>
+        <w:t xml:space="preserve"> rund 24 % der Belegschaft (Restrukturierungsaufwand 16–23 Mio. USD); kumulierte Tech-Layoff-Zählung über 113.000 Stellen bis Mitte Mai 2026. https://thenextweb.com/news/clickup-layoffs-22-percent-ai-100x-org-million-salary | https://www.fastcompany.com/91538995/tech-layoffs-due-to-ai-this-week-cloudflare-paypal-coinbase-upwork | https://finance.yahoo.com/sectors/technology/articles/layoffs-accelerate-may-2026-firms-040430218.html</w:t>
+      </w:r>
+    </w:p>
+    <w:p>
+      <w:pPr>
+        <w:jc w:val="both"/>
+      </w:pPr>
+      <w:r>
+        <w:rPr>
+          <w:rFonts w:ascii="Arial" w:hAnsi="Arial"/>
+          <w:b w:val="0"/>
+          <w:i w:val="0"/>
+          <w:sz w:val="19"/>
+        </w:rPr>
+        <w:t xml:space="preserve">TrueUp. (Stand 25. Mai 2026). </w:t>
+      </w:r>
+      <w:r>
+        <w:rPr>
+          <w:rFonts w:ascii="Arial" w:hAnsi="Arial"/>
+          <w:b w:val="0"/>
+          <w:i/>
+          <w:sz w:val="19"/>
+        </w:rPr>
+        <w:t>Tech Layoffs Tracker — Tagesfortschreibung: 142.985 betroffene Personen aus 339 Layoff-Meldungen (rund 993 Stellen pro Tag).</w:t>
+      </w:r>
+      <w:r>
+        <w:rPr>
+          <w:rFonts w:ascii="Arial" w:hAnsi="Arial"/>
+          <w:b w:val="0"/>
+          <w:i w:val="0"/>
+          <w:sz w:val="19"/>
+        </w:rPr>
+        <w:t xml:space="preserve"> Zunahme um rund 15.500 Personen und 56 Meldungen gegenüber dem 8. Mai 2026 (127.411 / 283), parallel zur Cisco-, Meta-, Intuit- und ClickUp-Welle. https://www.trueup.io/layoffs</w:t>
+      </w:r>
+    </w:p>
+    <w:p>
+      <w:pPr>
+        <w:jc w:val="both"/>
+      </w:pPr>
+      <w:r>
+        <w:rPr>
+          <w:rFonts w:ascii="Arial" w:hAnsi="Arial"/>
           <w:b/>
           <w:i w:val="0"/>
           <w:sz w:val="19"/>
@@ -10566,7 +11168,7 @@
           <w:i w:val="0"/>
           <w:sz w:val="19"/>
         </w:rPr>
-        <w:t xml:space="preserve"> Dieses Arbeitspapier gibt den Stand Anfang Mai 2026 (Schnitt am 8. Mai 2026 — Lauf 001 vom 8. Mai 2026) wieder. Die Debatte entwickelt sich dynamisch, insbesondere im Zuge der OpenAI-Strategiepapiere und der Eröffnung des OpenAI Workshop in Washington, D.C. im Mai 2026, des Erstdurchgangs des GKV-Beitragssatzstabilisierungsgesetzes in der 1065. Bundesratssitzung am 8. Mai 2026 mit 79 Tagesordnungspunkten (Kabinettsbeschluss 29. April 2026, parlamentarische Behandlung vor der Sommerpause 2026 angekündigt), der laufenden Trilog-Verhandlungen zum Digital Omnibus on AI (zweite Runde 28. April 2026 ohne Einigung; nächste Runde 13. Mai 2026 — Knackpunkt ist nicht die Verschiebung der Hochrisiko-Pflichten, sondern die Konformitätsbewertungs-Architektur für Anhang I; die zypriotische Ratspräsidentschaft strebt einen Abschluss vor Ablauf ihrer Amtszeit am 30. Juni 2026 an, andernfalls übernimmt die irische Präsidentschaft), der am 5. Mai 2026 erfolgten Arraignment-Verhandlung im Altman-Verfahren mit „nicht schuldig"-Plädoyer und angeordneter psychiatrischer Begutachtung, des am 7. Mai 2026 versandten individuellen Microsoft-Buyout-Angebots (Annahmefrist 8. Juni 2026, VRSAR-Unterzeichnung 9.–22. Juni 2026, bis zu fünfjährige Krankenversicherungs-Verlängerung), des am 1. Mai 2026 vom Connecticut-Repräsentantenhaus mit 131 zu 17 Stimmen verabschiedeten </w:t>
+        <w:t xml:space="preserve"> Dieses Arbeitspapier gibt den Stand Mitte/Ende Mai 2026 (Schnitt am 25. Mai 2026 — Lauf 001 vom 25. Mai 2026) wieder. Die Debatte entwickelt sich dynamisch, insbesondere im Zuge der OpenAI-Strategiepapiere und der Eröffnung des OpenAI Workshop in Washington, D.C. im Mai 2026, des Erstdurchgangs des GKV-Beitragssatzstabilisierungsgesetzes in der 1065. Bundesratssitzung am 8. Mai 2026 mit 79 Tagesordnungspunkten (Kabinettsbeschluss 29. April 2026, parlamentarische Behandlung vor der Sommerpause 2026 angekündigt), der im dritten Trilog am 7. Mai 2026 erzielten politischen Einigung über den </w:t>
       </w:r>
       <w:r>
         <w:rPr>
@@ -10575,6 +11177,24 @@
           <w:i/>
           <w:sz w:val="19"/>
         </w:rPr>
+        <w:t>Digital Omnibus on AI</w:t>
+      </w:r>
+      <w:r>
+        <w:rPr>
+          <w:rFonts w:ascii="Arial" w:hAnsi="Arial"/>
+          <w:b w:val="0"/>
+          <w:i w:val="0"/>
+          <w:sz w:val="19"/>
+        </w:rPr>
+        <w:t xml:space="preserve"> (Bestätigung der Hochrisiko-Stichtage 2. Dezember 2027 und 2. August 2028, neue Art.-5-Verbotsnorm gegen KI-generierte CSAM-/Non-Consensual-Intimate-Inhalte mit Anwendbarkeit ab 2. Dezember 2026, Übergangsfrist für die Art.-50-Kennzeichnung bis 2. Dezember 2026; konsolidierter Kompromisstext in Ratsdokument 9247/26 vom 13. Mai 2026; legal-linguistische Überarbeitung und förmliche Verabschiedung bis 2. August 2026 angestrebt), der am 5. Mai 2026 erfolgten Arraignment-Verhandlung im Altman-Verfahren mit „nicht schuldig"-Plädoyer und angeordneter psychiatrischer Begutachtung, des am 7. Mai 2026 versandten individuellen Microsoft-Buyout-Angebots (Annahmefrist 8. Juni 2026, VRSAR-Unterzeichnung 9.–22. Juni 2026, bis zu fünfjährige Krankenversicherungs-Verlängerung), des am 1. Mai 2026 vom Connecticut-Repräsentantenhaus mit 131 zu 17 Stimmen verabschiedeten </w:t>
+      </w:r>
+      <w:r>
+        <w:rPr>
+          <w:rFonts w:ascii="Arial" w:hAnsi="Arial"/>
+          <w:b w:val="0"/>
+          <w:i/>
+          <w:sz w:val="19"/>
+        </w:rPr>
         <w:t>SB 5 — Connecticut Artificial Intelligence Responsibility and Transparency Act</w:t>
       </w:r>
       <w:r>
@@ -10710,7 +11330,7 @@
           <w:i w:val="0"/>
           <w:sz w:val="19"/>
         </w:rPr>
-        <w:t xml:space="preserve"> auf 100 % bei zugleich ablehnender Position des Finanzministeriums, der revidierten IAB-Frühjahrsprognose vom 24. März 2026 (Erwerbstätigkeit −90.000, BIP +0,8 % bei 0,2 bis 0,3 Pp. Iran-Krieg-Dämpfung), der aktualisierten Tech-Layoff-Trackerstände zum 6./7./8. Mai 2026 (TrueUp 119.721 Personen aus 265 Layoff-Meldungen am 6. Mai, 121.111 Personen aus 273 Meldungen am 7. Mai bzw. 127.411 Personen aus 283 Meldungen am 8. Mai 2026 — rund 1.003 Personen pro Tag; SkillSyncer 113.863 Personen aus 179 Ereignissen) sowie der am 5./6. Mai 2026 angekündigten KI-getriebenen Stellenstreichungen bei Coinbase (700 Stellen, 14 %), PayPal (rund 4.760 Stellen, 20 % über 2–3 Jahre), Freshworks (rund 500 Stellen, 11 %) und Cognizant (12.000–15.000 Stellen unter „Project Leap") sowie der am 7. Mai 2026 von Cloudflare angekündigten Streichung von rund 1.100 Stellen (20 % der globalen Belegschaft) zum Übergang zu einem „agentic AI-first operating model" (Restrukturierungsaufwand 140–150 Mio. USD, AI-Einsatz im Konzern +600 % im Quartal, Aktienkurs −18 %), des am 1. Mai 2026 von </w:t>
+        <w:t xml:space="preserve"> auf 100 % bei zugleich ablehnender Position des Finanzministeriums, der revidierten IAB-Frühjahrsprognose vom 24. März 2026 (Erwerbstätigkeit −90.000, BIP +0,8 % bei 0,2 bis 0,3 Pp. Iran-Krieg-Dämpfung), der aktualisierten Tech-Layoff-Trackerstände zum 6./7./8./25. Mai 2026 (TrueUp 119.721 Personen aus 265 Layoff-Meldungen am 6. Mai, 121.111 Personen aus 273 Meldungen am 7. Mai, 127.411 Personen aus 283 Meldungen am 8. Mai bzw. 142.985 Personen aus 339 Meldungen am 25. Mai 2026 — rund 993 Personen pro Tag; SkillSyncer 113.863 Personen aus 179 Ereignissen) sowie der am 5./6. Mai 2026 angekündigten KI-getriebenen Stellenstreichungen bei Coinbase (700 Stellen, 14 %), PayPal (rund 4.760 Stellen, 20 % über 2–3 Jahre), Freshworks (rund 500 Stellen, 11 %) und Cognizant (12.000–15.000 Stellen unter „Project Leap") sowie der am 7. Mai 2026 von Cloudflare angekündigten Streichung von rund 1.100 Stellen (20 % der globalen Belegschaft) zum Übergang zu einem „agentic AI-first operating model" (Restrukturierungsaufwand 140–150 Mio. USD, AI-Einsatz im Konzern +600 % im Quartal, Aktienkurs −18 %), der zwischen dem 14. und 21. Mai 2026 angekündigten zweiten Welle KI-getriebener Stellenstreichungen — Cisco rund 4.000 Stellen am 14. Mai 2026 (Restrukturierungsaufwand bis 1 Mrd. USD, Q3-AI-Auftragseingang 1,9 Mrd. USD), Meta rund 8.000 Stellen am 20. Mai 2026 (10 % der Belegschaft, zusätzliche Streichung von 6.000 offenen Stellen, Reorganisation in „AI-Pods" mit Überführung von rund 7.000 Beschäftigten in die Applied-AI-Organisation, Capex 2026 115–135 Mrd. USD), Intuit rund 3.000 Stellen am 20. Mai 2026 (17 % der Belegschaft, mehrjährige Partnerschaften mit Anthropic und OpenAI für TurboTax, QuickBooks und Credit Karma), ClickUp 22 % der Belegschaft am 21. Mai 2026 (Vergütungsbänder bis 1 Mio. USD und „100x"-Modell mit KI-Agenten im Verhältnis 3:1), BILL bis zu 30 % der Belegschaft sowie Upwork rund 24 % der Belegschaft (Restrukturierungsaufwand 16–23 Mio. USD), des am 1. Mai 2026 von </w:t>
       </w:r>
       <w:r>
         <w:rPr>
@@ -10862,7 +11482,7 @@
         <w:color w:val="999999"/>
         <w:sz w:val="15"/>
       </w:rPr>
-      <w:t>Version 22.0 — Mai 2026 — CC BY 4.0</w:t>
+      <w:t>Version 23.0 — Mai 2026 — CC BY 4.0</w:t>
       <w:tab/>
       <w:t xml:space="preserve">Seite </w:t>
     </w:r>

</xml_diff>

<commit_message>
Daily-Update 2026-05-27 — Version 23.0 (Cluster: B, F)
Lauf 002 vom 27. Mai 2026. Versionssprung 22.0 → 23.0.

Wesentliche Ergänzungen:
- § 4.3: EU-Trilog zum Digital Omnibus on AI mit vorläufiger politischer Einigung in der Nacht 6./7. Mai 2026 (Nachtrag zum in Lauf 001 noch nicht erfassten Stichtag) — Stichtage 2027/2028 bestätigt, Art. 5-Tatbestand zu CSAM, Wasserzeichen-Frist auf 3 Monate verkürzt, SMC-Erleichterungen.
- § 1.1: Meta-Notification 20. Mai 2026 (8.000 Stellen, 3 Wellen, Memo "Success isn't a given", 145 Mrd. USD AI-Capex 2026), Intuit-Streichung 20. Mai 2026 (3.000 Stellen / 17 %, CEO "nothing to do with AI"), Walmart-Streichung 12. Mai 2026 (1.000 Stellen, ausdrücklich kein KI-Framing), TrueUp-Tracker 27. Mai 2026 (143.985 / 342 / 993 pro Tag).
- § 11.3 / § 11.5: Neue Belege zur Trilog-Einigung und zu den Mai-Layoffs.
- README.md, Validierung-Ergebnisse.md, Änderungshistorie.md aktualisiert.

https://claude.ai/code/session_011bC2hQae4iBQjuH4A4xSoS
</commit_message>
<xml_diff>
--- a/KI-Ökonomie.docx
+++ b/KI-Ökonomie.docx
@@ -112,7 +112,7 @@
           <w:color w:val="666666"/>
           <w:sz w:val="18"/>
         </w:rPr>
-        <w:t>Version 22.0</w:t>
+        <w:t>Version 23.0</w:t>
       </w:r>
     </w:p>
     <w:p>
@@ -184,7 +184,7 @@
           <w:i w:val="0"/>
           <w:sz w:val="19"/>
         </w:rPr>
-        <w:t xml:space="preserve">Der Einsatz von KI-Systemen und Robotik in produktiven und dienstleistenden Tätigkeiten beschleunigt sich. Zwei parallele Entwicklungen erzeugen politischen Handlungsdruck: Einerseits warnen Studien vor erheblichen Verschiebungen auf dem Arbeitsmarkt — das IAB (Institut für Arbeitsmarkt- und Berufsforschung) rechnet im KI-Szenario für Deutschland mit einem Wegfall oder Neuentstehen von rund 1,6 Millionen Stellen in den nächsten 15 Jahren bei gleichzeitigem Wertschöpfungszuwachs von 4,5 Billionen Euro; kurzfristig hat das IAB seine Prognose für 2026 mit der Fassung vom 24. März 2026 („Fiskalpolitischer Rückenwind trifft auf geopolitischen Gegenwind") gegenüber dem IAB-Kurzbericht 19/2025 (24. September 2025, damals: −20.000 Erwerbstätigkeit) deutlich nach unten revidiert: Bei einem Wachstum des Bruttoinlandsprodukts von 0,8 % — laut IAB infolge des Iran-Krieges um 0,2 bis 0,3 Prozentpunkte gedämpft — wird nun ein Rückgang der Erwerbstätigkeit um 90.000 auf 45,89 Millionen Personen erwartet, ein erstmals seit der Finanzkrise 2009 nicht mehr wachsender Bestand sozialversicherungspflichtiger Beschäftigung (−30.000 auf 34,93 Millionen) sowie ein Anstieg der Arbeitslosigkeit um 40.000; in dreizehn der sechzehn Bundesländer ist nach der parallelen IAB-Regionalprognose mit einem weiteren Anstieg der Arbeitslosigkeit zu rechnen. Sektoral fällt der Befund zweigeteilt aus: Der Industriesektor verliert rund 140.000 Stellen, während öffentliche Dienste, Erziehung und Gesundheit zusammen rund 180.000 Stellen aufbauen. Das Erwerbspersonenpotenzial sinkt nach der aktualisierten Prognose erstmals um 40.000 auf 48,62 Millionen Personen — eine strukturelle Kenngröße, die das Finanzierungsproblem der lohnbasierten Sozialversicherung unabhängig von KI-Effekten verschärft. Parallel dazu dokumentiert eine Branchenauswertung für das erste Quartal 2026 rund 78.500 Stellenstreichungen in der weltweiten Tech-Industrie, davon etwa 48 % explizit als KI- oder Automatisierungsmaßnahmen begründet; im April 2026 traten Oracle (20.000 – 30.000 Stellen mit Bezug zur AI-Rechenzentrumsinfrastruktur), Meta (rund 8.000 Stellen ab 20. Mai 2026) und Amazon (rund 16.000 Stellen im Zuge einer KI-induzierten Umstrukturierung) hinzu; Branchen-Tracker weisen für 2026 bis Mitte April einen kumulierten Bestand von über 150.000 Tech-Stellenstreichungen aus. Am 24. April 2026 hat Microsoft zusätzlich Buyout-Programme für rund sieben Prozent seiner länger beschäftigten US-Belegschaft angekündigt; das Programm gilt nach Berichterstattung als das erste </w:t>
+        <w:t xml:space="preserve">Der Einsatz von KI-Systemen und Robotik in produktiven und dienstleistenden Tätigkeiten beschleunigt sich. Zwei parallele Entwicklungen erzeugen politischen Handlungsdruck: Einerseits warnen Studien vor erheblichen Verschiebungen auf dem Arbeitsmarkt — das IAB (Institut für Arbeitsmarkt- und Berufsforschung) rechnet im KI-Szenario für Deutschland mit einem Wegfall oder Neuentstehen von rund 1,6 Millionen Stellen in den nächsten 15 Jahren bei gleichzeitigem Wertschöpfungszuwachs von 4,5 Billionen Euro; kurzfristig hat das IAB seine Prognose für 2026 mit der Fassung vom 24. März 2026 („Fiskalpolitischer Rückenwind trifft auf geopolitischen Gegenwind") gegenüber dem IAB-Kurzbericht 19/2025 (24. September 2025, damals: −20.000 Erwerbstätigkeit) deutlich nach unten revidiert: Bei einem Wachstum des Bruttoinlandsprodukts von 0,8 % — laut IAB infolge des Iran-Krieges um 0,2 bis 0,3 Prozentpunkte gedämpft — wird nun ein Rückgang der Erwerbstätigkeit um 90.000 auf 45,89 Millionen Personen erwartet, ein erstmals seit der Finanzkrise 2009 nicht mehr wachsender Bestand sozialversicherungspflichtiger Beschäftigung (−30.000 auf 34,93 Millionen) sowie ein Anstieg der Arbeitslosigkeit um 40.000; in dreizehn der sechzehn Bundesländer ist nach der parallelen IAB-Regionalprognose mit einem weiteren Anstieg der Arbeitslosigkeit zu rechnen. Sektoral fällt der Befund zweigeteilt aus: Der Industriesektor verliert rund 140.000 Stellen, während öffentliche Dienste, Erziehung und Gesundheit zusammen rund 180.000 Stellen aufbauen. Das Erwerbspersonenpotenzial sinkt nach der aktualisierten Prognose erstmals um 40.000 auf 48,62 Millionen Personen — eine strukturelle Kenngröße, die das Finanzierungsproblem der lohnbasierten Sozialversicherung unabhängig von KI-Effekten verschärft. Parallel dazu dokumentiert eine Branchenauswertung für das erste Quartal 2026 rund 78.500 Stellenstreichungen in der weltweiten Tech-Industrie, davon etwa 48 % explizit als KI- oder Automatisierungsmaßnahmen begründet; im April 2026 traten Oracle (20.000 – 30.000 Stellen mit Bezug zur AI-Rechenzentrumsinfrastruktur), Meta (rund 8.000 Stellen — Beginn der Mitarbeitendenbenachrichtigung in drei Wellen ab Mittwoch, 20. Mai 2026, 4 Uhr Ortszeit; Memo von Vorstandsvorsitzendem Mark Zuckerberg „Success isn't a given" in der KI-Phase; zugleich Streichung von rund 6.000 unbesetzten Stellen und interne Versetzung von rund 7.000 Beschäftigten in KI-fokussierte Rollen; betroffen sind nach Berichterstattung von Al Jazeera, NPR und CNBC schwerpunktmäßig Integrity-, Cybersecurity- und Content-Design-Teams; US-Beschäftigte erhalten 16 Wochen Grundabfindung zuzüglich zwei Wochen je Beschäftigungsjahr; parallel meldet Meta Q1-2026-Rekord-Umsätze von 56,31 Mrd. US-Dollar und hebt die eigene AI-Capex-Linie für 2026 auf bis zu 145 Mrd. US-Dollar an — die Personalreduktion erfolgt also in einer Phase steigender Investitions- und Umsatzbasis und ist als interne Ressourcen-Verlagerung zugunsten der AI-Capex-Linie lesbar) und Amazon (rund 16.000 Stellen im Zuge einer KI-induzierten Umstrukturierung) hinzu; Branchen-Tracker weisen für 2026 bis Mitte April einen kumulierten Bestand von über 150.000 Tech-Stellenstreichungen aus. Am 24. April 2026 hat Microsoft zusätzlich Buyout-Programme für rund sieben Prozent seiner länger beschäftigten US-Belegschaft angekündigt; das Programm gilt nach Berichterstattung als das erste </w:t>
       </w:r>
       <w:r>
         <w:rPr>
@@ -238,7 +238,7 @@
           <w:i w:val="0"/>
           <w:sz w:val="19"/>
         </w:rPr>
-        <w:t xml:space="preserve"> fällt auf den 2. Juli 2026; nach den am 7. Mai 2026 publizierten Programmkonditionen sind rund 8.500 Beschäftigte angebotsberechtigt, das Paket umfasst eine Cash-Einmalzahlung sowie eine bis zu fünfjährige Krankenversicherungs-Verlängerung und enthält keine Wettbewerbs- oder Beschäftigungsverbote. Im Zusammenspiel mit den am selben Tag bekräftigten Meta-Streichungen ordneten Wirtschaftsmedien (CNBC, 24. April 2026) die Welle erstmals als „AI-driven labor crisis" ein — ein Begriff, der den Übergang von Einzelfällen zu einer kumulativen Branchenerzählung markiert. Bis zur Wochenmitte des 25. April 2026 weisen Branchen-Tracker einen kumulierten Bestand von über 92.000 Tech-Stellenstreichungen für das laufende Jahr 2026 aus; eine Aktualisierung zum 2. Mai 2026 hebt die Marke nach Tracker-Methodik des SkillSyncer auf 113.863 betroffene Beschäftigte aus 179 erfassten Layoff-Ereignissen (durchschnittlich rund 933 Stellen pro Tag), während TrueUp parallel 95.878 Personen aus 249 Einzelmeldungen zählt; die Methodikspanne erklärt die unterschiedlichen Größenordnungen, das Niveau einer sechsstelligen Tech-Reduktion innerhalb von vier Monaten ist über alle Tracker hinweg konsistent. Eine erneute Aktualisierung zum 6. Mai 2026 zeigt, dass die TrueUp-Zählung weiter auf 119.721 betroffene Personen aus 265 Layoff-Meldungen gestiegen ist (rund 958 Stellen pro Tag), während SkillSyncer mit 113.863 Personen aus 179 Ereignissen weitgehend unverändert bleibt; eine Tagesfortschreibung der TrueUp-Methodik weist zum 7. Mai 2026 bereits 121.111 Personen aus 273 Layoff-Meldungen aus (rund 961 Personen pro Tag); die nochmalige Aktualisierung zum 8. Mai 2026 hebt die Marke nach den am Vortag angekündigten Cloudflare-Streichungen auf 127.411 betroffene Personen aus 283 Layoff-Meldungen (rund 1.003 Stellen pro Tag), wobei die zusätzlichen Meldungen primär aus den am 5./6. Mai 2026 angekündigten Stellenstreichungen bei </w:t>
+        <w:t xml:space="preserve"> fällt auf den 2. Juli 2026; nach den am 7. Mai 2026 publizierten Programmkonditionen sind rund 8.500 Beschäftigte angebotsberechtigt, das Paket umfasst eine Cash-Einmalzahlung sowie eine bis zu fünfjährige Krankenversicherungs-Verlängerung und enthält keine Wettbewerbs- oder Beschäftigungsverbote. Im Zusammenspiel mit den am selben Tag bekräftigten Meta-Streichungen ordneten Wirtschaftsmedien (CNBC, 24. April 2026) die Welle erstmals als „AI-driven labor crisis" ein — ein Begriff, der den Übergang von Einzelfällen zu einer kumulativen Branchenerzählung markiert. Bis zur Wochenmitte des 25. April 2026 weisen Branchen-Tracker einen kumulierten Bestand von über 92.000 Tech-Stellenstreichungen für das laufende Jahr 2026 aus; eine Aktualisierung zum 2. Mai 2026 hebt die Marke nach Tracker-Methodik des SkillSyncer auf 113.863 betroffene Beschäftigte aus 179 erfassten Layoff-Ereignissen (durchschnittlich rund 933 Stellen pro Tag), während TrueUp parallel 95.878 Personen aus 249 Einzelmeldungen zählt; die Methodikspanne erklärt die unterschiedlichen Größenordnungen, das Niveau einer sechsstelligen Tech-Reduktion innerhalb von vier Monaten ist über alle Tracker hinweg konsistent. Eine erneute Aktualisierung zum 6. Mai 2026 zeigt, dass die TrueUp-Zählung weiter auf 119.721 betroffene Personen aus 265 Layoff-Meldungen gestiegen ist (rund 958 Stellen pro Tag), während SkillSyncer mit 113.863 Personen aus 179 Ereignissen weitgehend unverändert bleibt; eine Tagesfortschreibung der TrueUp-Methodik weist zum 7. Mai 2026 bereits 121.111 Personen aus 273 Layoff-Meldungen aus (rund 961 Personen pro Tag); die nochmalige Aktualisierung zum 8. Mai 2026 hebt die Marke nach den am Vortag angekündigten Cloudflare-Streichungen auf 127.411 betroffene Personen aus 283 Layoff-Meldungen (rund 1.003 Stellen pro Tag); eine erneute Fortschreibung zum 27. Mai 2026 weist 143.985 betroffene Personen aus 342 Layoff-Meldungen aus (rund 993 Stellen pro Tag) — die Zahl integriert insbesondere die am 20. Mai 2026 begonnenen Meta-Streichungen (rund 8.000 Stellen) sowie die am selben Tag angekündigten Intuit-Streichungen (rund 3.000 Stellen, 17 % der weltweiten Belegschaft; Restrukturierungsaufwand rund 300 Mio. US-Dollar; letzter Beschäftigungstag der Betroffenen 31. Juli 2026; Vorstandsvorsitzender Sasan Goodarzi begründete die Maßnahme in der internen Mitteilung mit der Reduktion der Konzernkomplexität und der Konzentration auf KI-Produkte, betonte gegenüber CNBC am 20. Mai 2026 zugleich, „nichts davon" sei der KI geschuldet — gleichwohl hat Intuit 2025 einen 100-Mio.-US-Dollar-Mehrjahresvertrag mit OpenAI geschlossen und arbeitet mit Anthropic an der KI-Integration der Hauptprodukte TurboTax, QuickBooks, Credit Karma und Mailchimp, was die Public-Framing-Spannung zwischen Kausalverneinung und produktstrategischer KI-Verlagerung illustriert) und ergänzend die am 12. Mai 2026 von Walmart bekanntgegebene Streichung oder Verlagerung von rund 1.000 Konzern-Tech- und KI-Produktstellen (im Memo der Manager Daniel Danker und Suresh Kumar an die Belegschaft als Konsolidierung redundanter Teams gerahmt; ausdrücklich nicht als KI-Ersatz von Arbeitsplätzen begründet — eine bewusste Abkehr vom Coinbase/Freshworks-Framing); die zusätzlichen Meldungen bis zum 8. Mai 2026 stammten primär aus den am 5./6. Mai 2026 angekündigten Stellenstreichungen bei </w:t>
       </w:r>
       <w:r>
         <w:rPr>
@@ -2128,7 +2128,7 @@
           <w:i w:val="0"/>
           <w:sz w:val="19"/>
         </w:rPr>
-        <w:t xml:space="preserve"> Eine rein nationale Lösung kann mit der Warenverkehrsfreiheit, der Dienstleistungsfreiheit und der Niederlassungsfreiheit in Konflikt geraten. Eine Regelung, die nur inländische Roboterbetreiber trifft, während grenzüberschreitende KI-Dienstleistungen unbesteuert bleiben, wäre diskriminierungsrechtlich problematisch und praktisch kaum durchsetzbar. Der EU AI Act (Verordnung 2024/1689) schafft ab dem 2. August 2026 einen unionsweit einheitlichen Regulierungsrahmen für KI-Systeme (Hochrisiko-Systeme gemäß Anhang III, Transparenzpflichten nach Art. 50, Durchsetzungsregime); dies legt einen einheitlichen Definitionsrahmen, der steuerpolitische Anknüpfungen an KI-Systemklassen mittelfristig erleichtern kann, ohne selbst steuerrechtliche Wirkung zu entfalten. Die Europäische Kommission hat am 19. November 2025 mit dem „Digital Omnibus on AI" einen Vereinfachungsvorschlag vorgelegt, den das Europäische Parlament am 16. März 2026 im Ausschuss und am 23. März 2026 im Plenum unterstützt hat. Er sieht eine Verschiebung der Hochrisiko-Pflichten vor — je nach Systemtyp bis maximal zum 2. Dezember 2027 bzw. 2. August 2028 — und koppelt ihre Anwendbarkeit an die Verfügbarkeit harmonisierter Normen; zudem wird die Kennzeichnungspflicht für KI-generierte Inhalte (Art. 50) bis zum 2. November 2026 verlängert. Die Kommissionsdurchsetzungsbefugnisse gegenüber Anbietern von Allzweck-KI-Modellen (GPAI) treten wie vorgesehen am 2. August 2026 in Kraft. Parlament und Rat haben die Trilogverhandlungen aufgenommen; der zweite Trilogtermin am 28. April 2026 endete nach Berichterstattung von IAPP und A&amp;O Shearman ohne Einigung — Streitpunkt war primär das Verhältnis zwischen AI Act und sektorspezifischen EU-Regelungen für eingebettete KI-Systeme (Anhang I) sowie die Rechtsgrundlage für die Verarbeitung personenbezogener Daten zur Bias-Erkennung. Beide Institutionen konvergieren auf Stichtage 2. Dezember 2027 (Anhang III) und 2. August 2028 (Anhang I) für die Hochrisiko-Pflichten. Die nächste Trilogrunde ist auf den 13. Mai 2026 terminiert; Ziel bleibt eine förmliche Verabschiedung vor dem ursprünglichen Stichtag am 2. August 2026. Die zypriotische Ratspräsidentschaft hat sich vorgenommen, das Dossier vor Ablauf ihrer Amtszeit am 30. Juni 2026 abzuschließen; gelingt das nicht, übernimmt zur zweiten Jahreshälfte 2026 die irische Präsidentschaft. Scheitert die Einigung bis zum 2. August 2026, würden die Hochrisiko-Pflichten in ihrer ursprünglich vorgesehenen Fassung anwendbar. Für die Steuerdebatte folgt daraus, dass der zeitliche Vorlauf für KI-Definitionen aus dem AI Act enger als ursprünglich gedacht ist — eine mittelfristige Anknüpfung steuerlicher Tatbestände an AI-Act-Kategorien bleibt möglich, setzt aber voraus, dass die Normenlandschaft nach 2027 verlässlich vorliegt.</w:t>
+        <w:t xml:space="preserve"> Eine rein nationale Lösung kann mit der Warenverkehrsfreiheit, der Dienstleistungsfreiheit und der Niederlassungsfreiheit in Konflikt geraten. Eine Regelung, die nur inländische Roboterbetreiber trifft, während grenzüberschreitende KI-Dienstleistungen unbesteuert bleiben, wäre diskriminierungsrechtlich problematisch und praktisch kaum durchsetzbar. Der EU AI Act (Verordnung 2024/1689) schafft ab dem 2. August 2026 einen unionsweit einheitlichen Regulierungsrahmen für KI-Systeme (Hochrisiko-Systeme gemäß Anhang III, Transparenzpflichten nach Art. 50, Durchsetzungsregime); dies legt einen einheitlichen Definitionsrahmen, der steuerpolitische Anknüpfungen an KI-Systemklassen mittelfristig erleichtern kann, ohne selbst steuerrechtliche Wirkung zu entfalten. Die Europäische Kommission hat am 19. November 2025 mit dem „Digital Omnibus on AI" einen Vereinfachungsvorschlag vorgelegt, den das Europäische Parlament am 16. März 2026 im Ausschuss und am 23. März 2026 im Plenum unterstützt hat. Er sieht eine Verschiebung der Hochrisiko-Pflichten vor — je nach Systemtyp bis maximal zum 2. Dezember 2027 bzw. 2. August 2028 — und koppelt ihre Anwendbarkeit an die Verfügbarkeit harmonisierter Normen; zudem wird die Kennzeichnungspflicht für KI-generierte Inhalte (Art. 50) bis zum 2. November 2026 verlängert. Die Kommissionsdurchsetzungsbefugnisse gegenüber Anbietern von Allzweck-KI-Modellen (GPAI) treten wie vorgesehen am 2. August 2026 in Kraft. Parlament und Rat haben die Trilogverhandlungen aufgenommen; der zweite Trilogtermin am 28. April 2026 endete nach Berichterstattung von IAPP und A&amp;O Shearman ohne Einigung — Streitpunkt war primär das Verhältnis zwischen AI Act und sektorspezifischen EU-Regelungen für eingebettete KI-Systeme (Anhang I) sowie die Rechtsgrundlage für die Verarbeitung personenbezogener Daten zur Bias-Erkennung. Beide Institutionen haben in einer dritten, vorgezogenen Verhandlungsrunde in der Nacht vom 6. zum 7. Mai 2026 unter zypriotischer Ratspräsidentschaft eine vorläufige politische Einigung erzielt (Pressemitteilung des EU-Rates vom 7. Mai 2026, Berichterstattung Bird &amp; Bird, White &amp; Case, Hogan Lovells, IAPP, TechPolicy Press, Lexology, Latham &amp; Watkins). Die Einigung bestätigt die gestaffelten Stichtage für Hochrisiko-Pflichten — 2. Dezember 2027 für Anhang III (eigenständige Hochrisiko-Systeme in Beschäftigung, Bildung, Biometrie, kritische Infrastruktur, Strafverfolgung, Justiz, Migration, wesentliche Dienstleistungen) und 2. August 2028 für Anhang I (in geregelte Produkte eingebettete KI-Systeme) —, beendet den Streit um die Konformitätsbewertungs-Architektur für Anhang I und ergänzt einen neuen Art. 5-Tatbestand, der KI-Systeme zur Erzeugung von Darstellungen sexuellen Missbrauchs von Kindern oder nicht-einvernehmlicher intimer Bilddaten verbietet. Die Übergangsfrist nach Art. 50 Abs. 2 für die Kennzeichnung (Wasserzeichen, Provenienz-Markierung) KI-generierter Audio-, Bild-, Video- und Textinhalte wurde von ursprünglich sechs auf drei Monate verkürzt; Anbieter generativer KI-Systeme, die vor dem 2. August 2026 auf dem Markt waren, müssen die Transparenzpflichten bis zum 2. Dezember 2026 umsetzen (gegenüber dem ursprünglich vorgeschlagenen 2. Februar 2027). Die Rechtsgrundlage für die Verarbeitung besonderer Kategorien personenbezogener Daten zur Bias-Erkennung und -Korrektur wurde auf Anbieter und Nutzer von Nicht-Hochrisiko-Systemen und KI-Modellen erstreckt, und die KMU-Erleichterungen werden auf kleine Mid-Cap-Unternehmen (Small Mid-Cap Enterprises, SMCs) ausgeweitet. Die vorläufige Einigung muss noch durch Rat und Europäisches Parlament formal angenommen werden; beide Institutionen streben den Abschluss vor dem 2. August 2026 an. Scheitert die formelle Annahme bis dahin, würden die Hochrisiko-Pflichten in ihrer ursprünglich vorgesehenen Fassung anwendbar. Für die Steuerdebatte folgt daraus, dass der zeitliche Vorlauf für KI-Definitionen aus dem AI Act enger als ursprünglich gedacht ist — eine mittelfristige Anknüpfung steuerlicher Tatbestände an AI-Act-Kategorien bleibt möglich, setzt aber voraus, dass die Normenlandschaft nach 2027 verlässlich vorliegt.</w:t>
       </w:r>
     </w:p>
     <w:p>
@@ -8695,7 +8695,7 @@
           <w:i/>
           <w:sz w:val="19"/>
         </w:rPr>
-        <w:t>Trilog zu Digital Omnibus on AI — Zweite Runde am 28. April 2026 ohne Einigung; nächste Runde 13. Mai 2026; Konvergenz auf Stichtage 2. Dezember 2027 (Anhang III) und 2. August 2028 (Anhang I).</w:t>
+        <w:t>Trilog zu Digital Omnibus on AI — Zweite Runde am 28. April 2026 ohne Einigung; vorgezogene dritte Runde in der Nacht 6./7. Mai 2026 mit vorläufiger politischer Einigung; Konvergenz auf Stichtage 2. Dezember 2027 (Anhang III) und 2. August 2028 (Anhang I).</w:t>
       </w:r>
       <w:r>
         <w:rPr>
@@ -8705,6 +8705,70 @@
           <w:sz w:val="19"/>
         </w:rPr>
         <w:t xml:space="preserve"> Legislative Train Schedule und Berichterstattung IAPP, A&amp;O Shearman, OneTrust, DLA Piper. https://www.europarl.europa.eu/legislative-train/package-digital-package/file-digital-omnibus-on-ai | https://iapp.org/news/a/ai-act-omnibus-what-just-happened-and-what-comes-next | https://www.aoshearman.com/en/insights/digital-omnibus-on-ai-what-is-really-on-the-table-as-trilogues-begin</w:t>
+      </w:r>
+    </w:p>
+    <w:p>
+      <w:pPr>
+        <w:jc w:val="both"/>
+      </w:pPr>
+      <w:r>
+        <w:rPr>
+          <w:rFonts w:ascii="Arial" w:hAnsi="Arial"/>
+          <w:b w:val="0"/>
+          <w:i w:val="0"/>
+          <w:sz w:val="19"/>
+        </w:rPr>
+        <w:t xml:space="preserve">Rat der Europäischen Union / Europäisches Parlament. (7. Mai 2026). </w:t>
+      </w:r>
+      <w:r>
+        <w:rPr>
+          <w:rFonts w:ascii="Arial" w:hAnsi="Arial"/>
+          <w:b w:val="0"/>
+          <w:i/>
+          <w:sz w:val="19"/>
+        </w:rPr>
+        <w:t>Artificial Intelligence: Council and Parliament agree to simplify and streamline rules — Provisional Agreement on the Digital Omnibus on AI.</w:t>
+      </w:r>
+      <w:r>
+        <w:rPr>
+          <w:rFonts w:ascii="Arial" w:hAnsi="Arial"/>
+          <w:b w:val="0"/>
+          <w:i w:val="0"/>
+          <w:sz w:val="19"/>
+        </w:rPr>
+        <w:t xml:space="preserve"> Pressemitteilung des EU-Rates; Bestätigung der Stichtage 2. Dezember 2027 (Anhang III) und 2. August 2028 (Anhang I); neuer Art. 5-Tatbestand zu KI-Systemen für CSAM und nicht-einvernehmliche intime Bilddaten; Übergangsfrist Art. 50 Abs. 2 auf drei Monate verkürzt (Stichtag 2. Dezember 2026 für vor dem 2. August 2026 vermarktete Systeme); Bias-Detection-Rechtsgrundlage auf Nicht-Hochrisiko-Systeme erweitert; KMU-Erleichterungen auf Small Mid-Cap Enterprises (SMCs) ausgedehnt; formale Annahme durch beide Institutionen vor dem 2. August 2026 angestrebt. https://www.consilium.europa.eu/en/press/press-releases/2026/05/07/artificial-intelligence-council-and-parliament-agree-to-simplify-and-streamline-rules/</w:t>
+      </w:r>
+    </w:p>
+    <w:p>
+      <w:pPr>
+        <w:jc w:val="both"/>
+      </w:pPr>
+      <w:r>
+        <w:rPr>
+          <w:rFonts w:ascii="Arial" w:hAnsi="Arial"/>
+          <w:b w:val="0"/>
+          <w:i w:val="0"/>
+          <w:sz w:val="19"/>
+        </w:rPr>
+        <w:t xml:space="preserve">Bird &amp; Bird / White &amp; Case / Hogan Lovells / Latham &amp; Watkins / TechPolicy Press / Lexology / Modulos. (Anfang Mai 2026). </w:t>
+      </w:r>
+      <w:r>
+        <w:rPr>
+          <w:rFonts w:ascii="Arial" w:hAnsi="Arial"/>
+          <w:b w:val="0"/>
+          <w:i/>
+          <w:sz w:val="19"/>
+        </w:rPr>
+        <w:t>Digital Omnibus on AI Provisional Agreement Reached at the May Trilogue / EU agrees Digital Omnibus deal to simplify AI rules / EU legislators agree to delay for high-risk AI rules / AI Act Update: EU Resolves to Change Rules and Extend Deadlines / What the EU AI Omnibus Deal Changes for the AI Act and What Lies Ahead / EU Digital Omnibus Deal: Simplification of AI Act and Postponed Deadlines / EU AI Act Delayed: The Omnibus Deal Closed on 7 May 2026.</w:t>
+      </w:r>
+      <w:r>
+        <w:rPr>
+          <w:rFonts w:ascii="Arial" w:hAnsi="Arial"/>
+          <w:b w:val="0"/>
+          <w:i w:val="0"/>
+          <w:sz w:val="19"/>
+        </w:rPr>
+        <w:t xml:space="preserve"> Kanzlei- und Fachanalysen zur vorläufigen Einigung vom 7. Mai 2026 (Verkürzung der Wasserzeichen-Übergangsfrist; Bias-Detection-Erweiterung; SMC-Erleichterungen; formale Annahme vor 2. August 2026 angestrebt). https://www.twobirds.com/en/insights/2026/digital-omnibus-on-ai-provisional-agreement-reached-at-the-may-trilogue | https://www.whitecase.com/insight-alert/eu-agrees-digital-omnibus-deal-simplify-ai-rules | https://www.hoganlovells.com/en/publications/eu-legislators-agree-to-delay-for-highrisk-ai-rules | https://www.lw.com/en/insights/ai-act-update-eu-resolves-to-change-rules-and-extend-deadlines | https://www.techpolicy.press/what-the-eu-ai-omnibus-deal-changes-for-the-ai-act-and-what-lies-ahead/ | https://www.lexology.com/library/detail.aspx?g=34c6a42f-af33-4189-a32c-dc2e3d7a109f | https://www.modulos.ai/blog/eu-ai-act-omnibus-deal/</w:t>
       </w:r>
     </w:p>
     <w:p>
@@ -10507,6 +10571,134 @@
           <w:i w:val="0"/>
           <w:sz w:val="19"/>
         </w:rPr>
+        <w:t xml:space="preserve">Al Jazeera / NPR / CNBC / Yahoo Finance / Quartz. (20. Mai 2026). </w:t>
+      </w:r>
+      <w:r>
+        <w:rPr>
+          <w:rFonts w:ascii="Arial" w:hAnsi="Arial"/>
+          <w:b w:val="0"/>
+          <w:i/>
+          <w:sz w:val="19"/>
+        </w:rPr>
+        <w:t>Meta cuts 8,000 jobs in sweeping global layoffs / Meta slashes 8,000 jobs as it pivots towards AI / Zuckerberg's Meta layoffs memo: „Success isn't a given" in the AI era / Meta layoffs 2026: 8,000 jobs cut in AI restructuring.</w:t>
+      </w:r>
+      <w:r>
+        <w:rPr>
+          <w:rFonts w:ascii="Arial" w:hAnsi="Arial"/>
+          <w:b w:val="0"/>
+          <w:i w:val="0"/>
+          <w:sz w:val="19"/>
+        </w:rPr>
+        <w:t xml:space="preserve"> Drei-Wellen-Notification ab 4 Uhr Ortszeit, US-Severance 16 Wochen Grundabfindung zuzüglich zwei Wochen je Beschäftigungsjahr; 6.000 unbesetzte Stellen gestrichen, rund 7.000 Beschäftigte in KI-fokussierte Rollen versetzt; Q1-2026-Rekord-Umsatz 56,31 Mrd. USD; AI-Capex 2026 auf bis zu 145 Mrd. USD angehoben. https://www.aljazeera.com/economy/2026/5/20/meta-cuts-8000-jobs-in-sweeping-global-layoffs | https://www.npr.org/2026/05/20/nx-s1-5826917/meta-layoffs-ai-jobs | https://www.cnbc.com/2026/05/20/meta-layoffs-zuckerberg-says-success-isnt-a-given-in-memo.html | https://finance.yahoo.com/sectors/technology/articles/meta-layoffs-2026-8-000-114209703.html | https://qz.com/meta-layoffs-8000-jobs-ai-restructuring-052026</w:t>
+      </w:r>
+    </w:p>
+    <w:p>
+      <w:pPr>
+        <w:jc w:val="both"/>
+      </w:pPr>
+      <w:r>
+        <w:rPr>
+          <w:rFonts w:ascii="Arial" w:hAnsi="Arial"/>
+          <w:b w:val="0"/>
+          <w:i w:val="0"/>
+          <w:sz w:val="19"/>
+        </w:rPr>
+        <w:t xml:space="preserve">TechCrunch / Quartz / CBC News / CNBC / Inc. (20./21. Mai 2026). </w:t>
+      </w:r>
+      <w:r>
+        <w:rPr>
+          <w:rFonts w:ascii="Arial" w:hAnsi="Arial"/>
+          <w:b w:val="0"/>
+          <w:i/>
+          <w:sz w:val="19"/>
+        </w:rPr>
+        <w:t>Intuit to lay off over 3,000 employees to refocus on AI / Intuit layoffs: company cutting 17% of workforce in AI push / Intuit lays off 17% of its global workforce / Intuit CEO says company's 17 % workforce cut had „nothing to do with AI" / Intuit, TurboTax's Parent Company, Lays Off 17 Percent of Workforce to Fund AI Expansion.</w:t>
+      </w:r>
+      <w:r>
+        <w:rPr>
+          <w:rFonts w:ascii="Arial" w:hAnsi="Arial"/>
+          <w:b w:val="0"/>
+          <w:i w:val="0"/>
+          <w:sz w:val="19"/>
+        </w:rPr>
+        <w:t xml:space="preserve"> Rund 3.000 Stellen (17 % der weltweiten Belegschaft); Restrukturierungsaufwand rund 300 Mio. USD; letzter Beschäftigungstag 31. Juli 2026; CEO Sasan Goodarzi öffentlich „nothing to do with AI", interner Memo „Reduktion von Komplexität durch Vereinfachung der Konzernstruktur und Fokus auf KI"; Intuit 2025 100-Mio.-USD-Vertrag mit OpenAI sowie Anthropic-Partnerschaft für TurboTax, QuickBooks, Credit Karma und Mailchimp. https://techcrunch.com/2026/05/20/intuit-to-lay-off-over-3000-employees-to-refocus-on-ai/ | https://qz.com/intuit-layoffs-workforce-reduction-ai-restructuring-052026 | https://www.cbc.ca/news/business/intuit-layoffs-2026-9.7207948 | https://www.cnbc.com/2026/05/20/intuit-ceo-says-companys-17percent-workforce-cut-had-nothing-to-do-with-ai.html | https://www.inc.com/moses-jeanfrancois/intuit-turbo-tax-parent-company-lays-off-17-percent-of-workforce-for-ai-expansion/91348097</w:t>
+      </w:r>
+    </w:p>
+    <w:p>
+      <w:pPr>
+        <w:jc w:val="both"/>
+      </w:pPr>
+      <w:r>
+        <w:rPr>
+          <w:rFonts w:ascii="Arial" w:hAnsi="Arial"/>
+          <w:b w:val="0"/>
+          <w:i w:val="0"/>
+          <w:sz w:val="19"/>
+        </w:rPr>
+        <w:t xml:space="preserve">Quartz / Business Insider / Meta Intro. (12. Mai 2026). </w:t>
+      </w:r>
+      <w:r>
+        <w:rPr>
+          <w:rFonts w:ascii="Arial" w:hAnsi="Arial"/>
+          <w:b w:val="0"/>
+          <w:i/>
+          <w:sz w:val="19"/>
+        </w:rPr>
+        <w:t>Walmart cuts 1,000 tech and product jobs in AI push / Walmart Layoffs 2026: 1,000 Corporate Jobs Cut or Relocated in AI Technology Restructuring.</w:t>
+      </w:r>
+      <w:r>
+        <w:rPr>
+          <w:rFonts w:ascii="Arial" w:hAnsi="Arial"/>
+          <w:b w:val="0"/>
+          <w:i w:val="0"/>
+          <w:sz w:val="19"/>
+        </w:rPr>
+        <w:t xml:space="preserve"> Internes Memo der Manager Daniel Danker (Head of Global AI Acceleration) und Suresh Kumar (Global Technology Chief); Konsolidierung redundanter Technologie- und KI-Produktteams; ausdrücklich nicht als KI-Ersatz von Arbeitsplätzen gerahmt — bewusste Abkehr vom Coinbase/Freshworks-Framing. https://qz.com/walmart-layoffs-tech-product-jobs-restructuring-051326 | https://www.metaintro.com/blog/walmart-layoffs-1000-corporate-roles-cut-ai-not-cited-2026</w:t>
+      </w:r>
+    </w:p>
+    <w:p>
+      <w:pPr>
+        <w:jc w:val="both"/>
+      </w:pPr>
+      <w:r>
+        <w:rPr>
+          <w:rFonts w:ascii="Arial" w:hAnsi="Arial"/>
+          <w:b w:val="0"/>
+          <w:i w:val="0"/>
+          <w:sz w:val="19"/>
+        </w:rPr>
+        <w:t xml:space="preserve">TrueUp. (Stand 27. Mai 2026). </w:t>
+      </w:r>
+      <w:r>
+        <w:rPr>
+          <w:rFonts w:ascii="Arial" w:hAnsi="Arial"/>
+          <w:b w:val="0"/>
+          <w:i/>
+          <w:sz w:val="19"/>
+        </w:rPr>
+        <w:t>Tech Layoffs Tracker — Tagesfortschreibung: 143.985 Personen aus 342 Layoff-Meldungen (rund 993 Stellen pro Tag); integriert insbesondere Meta (rund 8.000 Stellen, Notification ab 20. Mai 2026) und Intuit (rund 3.000 Stellen, 17 %, Ankündigung 20. Mai 2026).</w:t>
+      </w:r>
+      <w:r>
+        <w:rPr>
+          <w:rFonts w:ascii="Arial" w:hAnsi="Arial"/>
+          <w:b w:val="0"/>
+          <w:i w:val="0"/>
+          <w:sz w:val="19"/>
+        </w:rPr>
+        <w:t xml:space="preserve"> https://www.trueup.io/layoffs</w:t>
+      </w:r>
+    </w:p>
+    <w:p>
+      <w:pPr>
+        <w:jc w:val="both"/>
+      </w:pPr>
+      <w:r>
+        <w:rPr>
+          <w:rFonts w:ascii="Arial" w:hAnsi="Arial"/>
+          <w:b w:val="0"/>
+          <w:i w:val="0"/>
+          <w:sz w:val="19"/>
+        </w:rPr>
         <w:t xml:space="preserve">Bloomberg Editorial Board. (29. April 2026). </w:t>
       </w:r>
       <w:r>
@@ -10566,7 +10758,7 @@
           <w:i w:val="0"/>
           <w:sz w:val="19"/>
         </w:rPr>
-        <w:t xml:space="preserve"> Dieses Arbeitspapier gibt den Stand Anfang Mai 2026 (Schnitt am 8. Mai 2026 — Lauf 001 vom 8. Mai 2026) wieder. Die Debatte entwickelt sich dynamisch, insbesondere im Zuge der OpenAI-Strategiepapiere und der Eröffnung des OpenAI Workshop in Washington, D.C. im Mai 2026, des Erstdurchgangs des GKV-Beitragssatzstabilisierungsgesetzes in der 1065. Bundesratssitzung am 8. Mai 2026 mit 79 Tagesordnungspunkten (Kabinettsbeschluss 29. April 2026, parlamentarische Behandlung vor der Sommerpause 2026 angekündigt), der laufenden Trilog-Verhandlungen zum Digital Omnibus on AI (zweite Runde 28. April 2026 ohne Einigung; nächste Runde 13. Mai 2026 — Knackpunkt ist nicht die Verschiebung der Hochrisiko-Pflichten, sondern die Konformitätsbewertungs-Architektur für Anhang I; die zypriotische Ratspräsidentschaft strebt einen Abschluss vor Ablauf ihrer Amtszeit am 30. Juni 2026 an, andernfalls übernimmt die irische Präsidentschaft), der am 5. Mai 2026 erfolgten Arraignment-Verhandlung im Altman-Verfahren mit „nicht schuldig"-Plädoyer und angeordneter psychiatrischer Begutachtung, des am 7. Mai 2026 versandten individuellen Microsoft-Buyout-Angebots (Annahmefrist 8. Juni 2026, VRSAR-Unterzeichnung 9.–22. Juni 2026, bis zu fünfjährige Krankenversicherungs-Verlängerung), des am 1. Mai 2026 vom Connecticut-Repräsentantenhaus mit 131 zu 17 Stimmen verabschiedeten </w:t>
+        <w:t xml:space="preserve"> Dieses Arbeitspapier gibt den Stand Ende Mai 2026 (Schnitt am 27. Mai 2026 — Lauf 002 vom 27. Mai 2026) wieder. Die Debatte entwickelt sich dynamisch, insbesondere im Zuge der OpenAI-Strategiepapiere und der Eröffnung des OpenAI Workshop in Washington, D.C. im Mai 2026, des Erstdurchgangs des GKV-Beitragssatzstabilisierungsgesetzes in der 1065. Bundesratssitzung am 8. Mai 2026 mit 79 Tagesordnungspunkten (Kabinettsbeschluss 29. April 2026, parlamentarische Behandlung vor der Sommerpause 2026 angekündigt), der vorläufigen politischen Einigung im Trilog zum Digital Omnibus on AI in der Nacht 6./7. Mai 2026 (zypriotische Ratspräsidentschaft; Bestätigung der Stichtage 2. Dezember 2027 für Anhang III und 2. August 2028 für Anhang I; neuer Art. 5-Tatbestand zu CSAM und nicht-einvernehmlichen intimen Bilddaten; verkürzte Wasserzeichen-Übergangsfrist von sechs auf drei Monate mit Stichtag 2. Dezember 2026 für Bestandssysteme; KMU-Erleichterungen auf Small Mid-Cap Enterprises ausgedehnt; formale Annahme durch Rat und Europäisches Parlament vor 2. August 2026 angestrebt), der am 5. Mai 2026 erfolgten Arraignment-Verhandlung im Altman-Verfahren mit „nicht schuldig"-Plädoyer und angeordneter psychiatrischer Begutachtung, des am 7. Mai 2026 versandten individuellen Microsoft-Buyout-Angebots (Annahmefrist 8. Juni 2026, VRSAR-Unterzeichnung 9.–22. Juni 2026, bis zu fünfjährige Krankenversicherungs-Verlängerung), des am 1. Mai 2026 vom Connecticut-Repräsentantenhaus mit 131 zu 17 Stimmen verabschiedeten </w:t>
       </w:r>
       <w:r>
         <w:rPr>
@@ -10710,7 +10902,7 @@
           <w:i w:val="0"/>
           <w:sz w:val="19"/>
         </w:rPr>
-        <w:t xml:space="preserve"> auf 100 % bei zugleich ablehnender Position des Finanzministeriums, der revidierten IAB-Frühjahrsprognose vom 24. März 2026 (Erwerbstätigkeit −90.000, BIP +0,8 % bei 0,2 bis 0,3 Pp. Iran-Krieg-Dämpfung), der aktualisierten Tech-Layoff-Trackerstände zum 6./7./8. Mai 2026 (TrueUp 119.721 Personen aus 265 Layoff-Meldungen am 6. Mai, 121.111 Personen aus 273 Meldungen am 7. Mai bzw. 127.411 Personen aus 283 Meldungen am 8. Mai 2026 — rund 1.003 Personen pro Tag; SkillSyncer 113.863 Personen aus 179 Ereignissen) sowie der am 5./6. Mai 2026 angekündigten KI-getriebenen Stellenstreichungen bei Coinbase (700 Stellen, 14 %), PayPal (rund 4.760 Stellen, 20 % über 2–3 Jahre), Freshworks (rund 500 Stellen, 11 %) und Cognizant (12.000–15.000 Stellen unter „Project Leap") sowie der am 7. Mai 2026 von Cloudflare angekündigten Streichung von rund 1.100 Stellen (20 % der globalen Belegschaft) zum Übergang zu einem „agentic AI-first operating model" (Restrukturierungsaufwand 140–150 Mio. USD, AI-Einsatz im Konzern +600 % im Quartal, Aktienkurs −18 %), des am 1. Mai 2026 von </w:t>
+        <w:t xml:space="preserve"> auf 100 % bei zugleich ablehnender Position des Finanzministeriums, der revidierten IAB-Frühjahrsprognose vom 24. März 2026 (Erwerbstätigkeit −90.000, BIP +0,8 % bei 0,2 bis 0,3 Pp. Iran-Krieg-Dämpfung), der aktualisierten Tech-Layoff-Trackerstände zum 6./7./8. Mai 2026 (TrueUp 119.721 Personen aus 265 Layoff-Meldungen am 6. Mai, 121.111 Personen aus 273 Meldungen am 7. Mai bzw. 127.411 Personen aus 283 Meldungen am 8. Mai 2026 — rund 1.003 Personen pro Tag; SkillSyncer 113.863 Personen aus 179 Ereignissen) und der erneuten Fortschreibung zum 27. Mai 2026 (TrueUp 143.985 Personen aus 342 Layoff-Meldungen, rund 993 Stellen pro Tag), die maßgeblich durch die am 20. Mai 2026 begonnene Meta-Notification (rund 8.000 Stellen, drei Wellen ab 4 Uhr Ortszeit, Memo „Success isn't a given", 16 Wochen Severance plus zwei Wochen je Beschäftigungsjahr; Q1-2026-Umsatz 56,31 Mrd. USD und AI-Capex 2026 bis zu 145 Mrd. USD), die am 20. Mai 2026 angekündigten Intuit-Streichungen (rund 3.000 Stellen, 17 %, Restrukturierungsaufwand rund 300 Mio. USD, letzter Beschäftigungstag 31. Juli 2026; CEO-Public-Framing „nothing to do with AI" trotz 100-Mio.-USD-OpenAI-Vertrag und Anthropic-Integration in TurboTax/QuickBooks/Credit Karma/Mailchimp) und die am 12. Mai 2026 von Walmart bekanntgegebene Streichung oder Verlagerung von rund 1.000 Konzern-Tech- und KI-Produktstellen (ausdrücklich nicht als KI-Ersatz von Arbeitsplätzen gerahmt) getrieben ist, sowie der am 5./6. Mai 2026 angekündigten KI-getriebenen Stellenstreichungen bei Coinbase (700 Stellen, 14 %), PayPal (rund 4.760 Stellen, 20 % über 2–3 Jahre), Freshworks (rund 500 Stellen, 11 %) und Cognizant (12.000–15.000 Stellen unter „Project Leap") sowie der am 7. Mai 2026 von Cloudflare angekündigten Streichung von rund 1.100 Stellen (20 % der globalen Belegschaft) zum Übergang zu einem „agentic AI-first operating model" (Restrukturierungsaufwand 140–150 Mio. USD, AI-Einsatz im Konzern +600 % im Quartal, Aktienkurs −18 %), des am 1. Mai 2026 von </w:t>
       </w:r>
       <w:r>
         <w:rPr>
@@ -10862,7 +11054,7 @@
         <w:color w:val="999999"/>
         <w:sz w:val="15"/>
       </w:rPr>
-      <w:t>Version 22.0 — Mai 2026 — CC BY 4.0</w:t>
+      <w:t>Version 23.0 — Mai 2026 — CC BY 4.0</w:t>
       <w:tab/>
       <w:t xml:space="preserve">Seite </w:t>
     </w:r>

</xml_diff>

<commit_message>
Daily-Update 2026-05-30 — Version 23.0 (Cluster: B, D, F; Nachholrunde)
Lauf 001 vom 30. Mai 2026 nach 22-tägiger Pause seit Lauf 001 vom
8. Mai 2026; Zeitfenster pragmatisch auf 8.–30. Mai 2026 erweitert.

Wesentliche Ergänzungen:
- § 4.3: Digital Omnibus on AI — Rat/Parlament-Einigung vom 7. Mai
  2026 (Stichtage 2.12.2027/2.8.2028 fixiert; Art. 50 auf 2.12.2026;
  CSAM/NCII-Verbot; Annahme vor 2.8.2026).
- § 4.5: Warren-Op-Ed Time, 27. Mai 2026 — Verbrauchsteuer auf
  KI-Rechenzentren plus Vermögensabgabe; Aufkommen zweckgebunden für
  Gesundheit/Bildung/UI.
- § 4.5: Connecticut SB 5 — Lamont-Unterzeichnung Mai 2026 vollzogen.
- § 1.1: Mai-Layoff-Welle Meta (8.000 ab 20.5. + 6.000 cancelled),
  Intuit (3.000+ am 20.5.), Wix (~1.000 am 28.5.); Techtimes-Aggregat
  29. Mai: 142.000 für die ersten 5 Monate 2026.

Validierung 2.1.1–2.6 ohne Befund; PDF und Word neu erstellt;
README und Validierung-Ergebnisse mit neuem Versionsblock.
</commit_message>
<xml_diff>
--- a/KI-Ökonomie.docx
+++ b/KI-Ökonomie.docx
@@ -112,7 +112,7 @@
           <w:color w:val="666666"/>
           <w:sz w:val="18"/>
         </w:rPr>
-        <w:t>Version 22.0</w:t>
+        <w:t>Version 23.0</w:t>
       </w:r>
     </w:p>
     <w:p>
@@ -328,7 +328,97 @@
           <w:i w:val="0"/>
           <w:sz w:val="19"/>
         </w:rPr>
-        <w:t xml:space="preserve"> parallel zu den Q1-2026-Quartalszahlen (Umsatz +34 % gegenüber dem Vorjahr) angekündigten Streichung von rund 1.100 Stellen — etwa 20 % der globalen Belegschaft — als Übergang zu einem „agentic AI-first operating model" gespeist sind; der gemeinsame Mitarbeitendenbrief von Vorstandsvorsitzendem Matthew Prince und Mitgründerin Michelle Zatlyn („Building for the future") begründet die Reduktion ausdrücklich nicht als Kostenmaßnahme oder leistungsabhängige Auswahl, sondern als strukturelle Anpassung an einen über das Quartal um rund 600 % gestiegenen unternehmensinternen KI-Einsatz; das Restrukturierungsvolumen wird mit 140 bis 150 Millionen US-Dollar im zweiten Quartal beziffert, ausscheidende Beschäftigte erhalten ihre Grundvergütung bis Ende 2026, US-Beschäftigte zusätzlich Krankenversicherungsschutz bis Jahresende und Equity-Vesting bis 15. August 2026; der Aktienkurs gab nach Bekanntgabe rund 18 % ab. Eine Aggregat-Bestätigung dieser Welle liefert der </w:t>
+        <w:t xml:space="preserve"> parallel zu den Q1-2026-Quartalszahlen (Umsatz +34 % gegenüber dem Vorjahr) angekündigten Streichung von rund 1.100 Stellen — etwa 20 % der globalen Belegschaft — als Übergang zu einem „agentic AI-first operating model" gespeist sind; der gemeinsame Mitarbeitendenbrief von Vorstandsvorsitzendem Matthew Prince und Mitgründerin Michelle Zatlyn („Building for the future") begründet die Reduktion ausdrücklich nicht als Kostenmaßnahme oder leistungsabhängige Auswahl, sondern als strukturelle Anpassung an einen über das Quartal um rund 600 % gestiegenen unternehmensinternen KI-Einsatz; das Restrukturierungsvolumen wird mit 140 bis 150 Millionen US-Dollar im zweiten Quartal beziffert, ausscheidende Beschäftigte erhalten ihre Grundvergütung bis Ende 2026, US-Beschäftigte zusätzlich Krankenversicherungsschutz bis Jahresende und Equity-Vesting bis 15. August 2026; der Aktienkurs gab nach Bekanntgabe rund 18 % ab. Die Welle setzte sich im Mai 2026 nahezu unverändert fort: Am 20. Mai 2026 begann </w:t>
+      </w:r>
+      <w:r>
+        <w:rPr>
+          <w:rFonts w:ascii="Arial" w:hAnsi="Arial"/>
+          <w:b w:val="0"/>
+          <w:i/>
+          <w:sz w:val="19"/>
+        </w:rPr>
+        <w:t>Meta</w:t>
+      </w:r>
+      <w:r>
+        <w:rPr>
+          <w:rFonts w:ascii="Arial" w:hAnsi="Arial"/>
+          <w:b w:val="0"/>
+          <w:i w:val="0"/>
+          <w:sz w:val="19"/>
+        </w:rPr>
+        <w:t xml:space="preserve"> die individuelle Benachrichtigung von rund 8.000 Beschäftigten — etwa zehn Prozent der globalen Belegschaft — und strich parallel rund 6.000 offene, bereits ausgeschriebene Stellen; </w:t>
+      </w:r>
+      <w:r>
+        <w:rPr>
+          <w:rFonts w:ascii="Arial" w:hAnsi="Arial"/>
+          <w:b w:val="0"/>
+          <w:i/>
+          <w:sz w:val="19"/>
+        </w:rPr>
+        <w:t>Chief People Officer</w:t>
+      </w:r>
+      <w:r>
+        <w:rPr>
+          <w:rFonts w:ascii="Arial" w:hAnsi="Arial"/>
+          <w:b w:val="0"/>
+          <w:i w:val="0"/>
+          <w:sz w:val="19"/>
+        </w:rPr>
+        <w:t xml:space="preserve"> Janelle Gale ordnete bis zu 7.000 Beschäftigte neu strukturierten KI-Teams (Applied AI Engineering, Agent Transformation Accelerator XFN, Central Analytics) zu, der interne Memo des Vorstandsvorsitzenden Mark Zuckerberg begründete den Schritt damit, dass „Erfolg im KI-Wettbewerb nicht gegeben" sei und nannte ausdrücklich die Capex-Belastung 2026 (125 bis 145 Milliarden US-Dollar). Am selben Tag kündigte </w:t>
+      </w:r>
+      <w:r>
+        <w:rPr>
+          <w:rFonts w:ascii="Arial" w:hAnsi="Arial"/>
+          <w:b w:val="0"/>
+          <w:i/>
+          <w:sz w:val="19"/>
+        </w:rPr>
+        <w:t>Intuit</w:t>
+      </w:r>
+      <w:r>
+        <w:rPr>
+          <w:rFonts w:ascii="Arial" w:hAnsi="Arial"/>
+          <w:b w:val="0"/>
+          <w:i w:val="0"/>
+          <w:sz w:val="19"/>
+        </w:rPr>
+        <w:t xml:space="preserve"> die Streichung von über 3.000 Stellen — rund 17 Prozent der globalen Belegschaft — zur Refokussierung auf eine KI-Plattform an; </w:t>
+      </w:r>
+      <w:r>
+        <w:rPr>
+          <w:rFonts w:ascii="Arial" w:hAnsi="Arial"/>
+          <w:b w:val="0"/>
+          <w:i/>
+          <w:sz w:val="19"/>
+        </w:rPr>
+        <w:t>Wix</w:t>
+      </w:r>
+      <w:r>
+        <w:rPr>
+          <w:rFonts w:ascii="Arial" w:hAnsi="Arial"/>
+          <w:b w:val="0"/>
+          <w:i w:val="0"/>
+          <w:sz w:val="19"/>
+        </w:rPr>
+        <w:t xml:space="preserve"> informierte am 28. Mai 2026 über die Reduktion von etwas mehr als 1.000 Beschäftigten — rund 20 Prozent der ersten Quartalsbelegschaft — und verwies in der Presseerklärung ausdrücklich auf KI-Automatisierungseffekte. Eine Folgeauswertung von </w:t>
+      </w:r>
+      <w:r>
+        <w:rPr>
+          <w:rFonts w:ascii="Arial" w:hAnsi="Arial"/>
+          <w:b w:val="0"/>
+          <w:i/>
+          <w:sz w:val="19"/>
+        </w:rPr>
+        <w:t>Techtimes</w:t>
+      </w:r>
+      <w:r>
+        <w:rPr>
+          <w:rFonts w:ascii="Arial" w:hAnsi="Arial"/>
+          <w:b w:val="0"/>
+          <w:i w:val="0"/>
+          <w:sz w:val="19"/>
+        </w:rPr>
+        <w:t xml:space="preserve"> zum 29. Mai 2026 weist für die ersten fünf Monate 2026 kumuliert rund 142.000 Tech-Stellenstreichungen aus und projiziert eine Vollejahresgröße nahe dem Post-Pandemie-Rekord 2023 (rund 430.000) — Oracle (rund 30.000), Meta (8.000) und Cisco (rund 4.000) machen den nominell größten Anteil der bisherigen 2026-Streichungen aus, während die Big-Tech-Hyperscaler den Capex-Pool von rund 700 Milliarden US-Dollar für 2026 (Amazon 200; Microsoft, Alphabet je rund 190; Meta 125–145 Milliarden US-Dollar) ohne Personalaufbau finanzieren. Eine Aggregat-Bestätigung dieser Welle liefert der </w:t>
       </w:r>
       <w:r>
         <w:rPr>
@@ -2128,7 +2218,7 @@
           <w:i w:val="0"/>
           <w:sz w:val="19"/>
         </w:rPr>
-        <w:t xml:space="preserve"> Eine rein nationale Lösung kann mit der Warenverkehrsfreiheit, der Dienstleistungsfreiheit und der Niederlassungsfreiheit in Konflikt geraten. Eine Regelung, die nur inländische Roboterbetreiber trifft, während grenzüberschreitende KI-Dienstleistungen unbesteuert bleiben, wäre diskriminierungsrechtlich problematisch und praktisch kaum durchsetzbar. Der EU AI Act (Verordnung 2024/1689) schafft ab dem 2. August 2026 einen unionsweit einheitlichen Regulierungsrahmen für KI-Systeme (Hochrisiko-Systeme gemäß Anhang III, Transparenzpflichten nach Art. 50, Durchsetzungsregime); dies legt einen einheitlichen Definitionsrahmen, der steuerpolitische Anknüpfungen an KI-Systemklassen mittelfristig erleichtern kann, ohne selbst steuerrechtliche Wirkung zu entfalten. Die Europäische Kommission hat am 19. November 2025 mit dem „Digital Omnibus on AI" einen Vereinfachungsvorschlag vorgelegt, den das Europäische Parlament am 16. März 2026 im Ausschuss und am 23. März 2026 im Plenum unterstützt hat. Er sieht eine Verschiebung der Hochrisiko-Pflichten vor — je nach Systemtyp bis maximal zum 2. Dezember 2027 bzw. 2. August 2028 — und koppelt ihre Anwendbarkeit an die Verfügbarkeit harmonisierter Normen; zudem wird die Kennzeichnungspflicht für KI-generierte Inhalte (Art. 50) bis zum 2. November 2026 verlängert. Die Kommissionsdurchsetzungsbefugnisse gegenüber Anbietern von Allzweck-KI-Modellen (GPAI) treten wie vorgesehen am 2. August 2026 in Kraft. Parlament und Rat haben die Trilogverhandlungen aufgenommen; der zweite Trilogtermin am 28. April 2026 endete nach Berichterstattung von IAPP und A&amp;O Shearman ohne Einigung — Streitpunkt war primär das Verhältnis zwischen AI Act und sektorspezifischen EU-Regelungen für eingebettete KI-Systeme (Anhang I) sowie die Rechtsgrundlage für die Verarbeitung personenbezogener Daten zur Bias-Erkennung. Beide Institutionen konvergieren auf Stichtage 2. Dezember 2027 (Anhang III) und 2. August 2028 (Anhang I) für die Hochrisiko-Pflichten. Die nächste Trilogrunde ist auf den 13. Mai 2026 terminiert; Ziel bleibt eine förmliche Verabschiedung vor dem ursprünglichen Stichtag am 2. August 2026. Die zypriotische Ratspräsidentschaft hat sich vorgenommen, das Dossier vor Ablauf ihrer Amtszeit am 30. Juni 2026 abzuschließen; gelingt das nicht, übernimmt zur zweiten Jahreshälfte 2026 die irische Präsidentschaft. Scheitert die Einigung bis zum 2. August 2026, würden die Hochrisiko-Pflichten in ihrer ursprünglich vorgesehenen Fassung anwendbar. Für die Steuerdebatte folgt daraus, dass der zeitliche Vorlauf für KI-Definitionen aus dem AI Act enger als ursprünglich gedacht ist — eine mittelfristige Anknüpfung steuerlicher Tatbestände an AI-Act-Kategorien bleibt möglich, setzt aber voraus, dass die Normenlandschaft nach 2027 verlässlich vorliegt.</w:t>
+        <w:t xml:space="preserve"> Eine rein nationale Lösung kann mit der Warenverkehrsfreiheit, der Dienstleistungsfreiheit und der Niederlassungsfreiheit in Konflikt geraten. Eine Regelung, die nur inländische Roboterbetreiber trifft, während grenzüberschreitende KI-Dienstleistungen unbesteuert bleiben, wäre diskriminierungsrechtlich problematisch und praktisch kaum durchsetzbar. Der EU AI Act (Verordnung 2024/1689) schafft ab dem 2. August 2026 einen unionsweit einheitlichen Regulierungsrahmen für KI-Systeme (Hochrisiko-Systeme gemäß Anhang III, Transparenzpflichten nach Art. 50, Durchsetzungsregime); dies legt einen einheitlichen Definitionsrahmen, der steuerpolitische Anknüpfungen an KI-Systemklassen mittelfristig erleichtern kann, ohne selbst steuerrechtliche Wirkung zu entfalten. Die Europäische Kommission hat am 19. November 2025 mit dem „Digital Omnibus on AI" einen Vereinfachungsvorschlag vorgelegt, den das Europäische Parlament am 16. März 2026 im Ausschuss und am 23. März 2026 im Plenum unterstützt hat. Er sieht eine Verschiebung der Hochrisiko-Pflichten vor — je nach Systemtyp bis maximal zum 2. Dezember 2027 bzw. 2. August 2028 — und koppelt ihre Anwendbarkeit an die Verfügbarkeit harmonisierter Normen; zudem wird die Kennzeichnungspflicht für KI-generierte Inhalte (Art. 50) bis zum 2. November 2026 verlängert. Die Kommissionsdurchsetzungsbefugnisse gegenüber Anbietern von Allzweck-KI-Modellen (GPAI) treten wie vorgesehen am 2. August 2026 in Kraft. Parlament und Rat haben die Trilogverhandlungen aufgenommen; der zweite Trilogtermin am 28. April 2026 endete nach Berichterstattung von IAPP und A&amp;O Shearman ohne Einigung — Streitpunkt war primär das Verhältnis zwischen AI Act und sektorspezifischen EU-Regelungen für eingebettete KI-Systeme (Anhang I) sowie die Rechtsgrundlage für die Verarbeitung personenbezogener Daten zur Bias-Erkennung. Am 7. Mai 2026 haben Rat und Parlament dann nach einer dritten Trilogrunde eine provisorische politische Einigung erzielt: Die Stichtage 2. Dezember 2027 (Anhang III) und 2. August 2028 (Anhang I) sind förmlich fixiert; die Anwendbarkeit der Transparenz- und Kennzeichnungspflichten für KI-generierte Inhalte (Art. 50) wird einheitlich auf den 2. Dezember 2026 verschoben (zuvor 2. August 2026), die nationale Etablierung der Regulatory Sandboxes auf den 2. August 2027 erstreckt. Ergänzend wird ein neues Verbot nach Art. 5 für KI-Systeme aufgenommen, die kindesmissbrauchsrelevantes Material (CSAM) oder nicht-einvernehmliche intime Aufnahmen (NCII) generieren — bestehende Systeme sind bis zum 2. Dezember 2026 anzupassen. Die förmliche Annahme durch Rat und Parlament soll nach gemeinsamer Erklärung vor dem ursprünglichen Stichtag 2. August 2026 erfolgen; die Konvergenz zur 13. Mai 2026 ursprünglich geplanten Folgerunde wurde durch die Einigung vom 7. Mai 2026 obsolet. Die zypriotische Ratspräsidentschaft hat sich vorgenommen, das Dossier vor Ablauf ihrer Amtszeit am 30. Juni 2026 abzuschließen; gelingt das nicht, übernimmt zur zweiten Jahreshälfte 2026 die irische Präsidentschaft. Scheitert die Einigung bis zum 2. August 2026, würden die Hochrisiko-Pflichten in ihrer ursprünglich vorgesehenen Fassung anwendbar. Für die Steuerdebatte folgt daraus, dass der zeitliche Vorlauf für KI-Definitionen aus dem AI Act enger als ursprünglich gedacht ist — eine mittelfristige Anknüpfung steuerlicher Tatbestände an AI-Act-Kategorien bleibt möglich, setzt aber voraus, dass die Normenlandschaft nach 2027 verlässlich vorliegt.</w:t>
       </w:r>
     </w:p>
     <w:p>
@@ -2562,7 +2652,7 @@
           <w:i w:val="0"/>
           <w:sz w:val="19"/>
         </w:rPr>
-        <w:t xml:space="preserve"> am 1. Mai 2026 mit 131 zu 17 Stimmen verabschiedet, Gouverneur Ned Lamont hat seine Unterzeichnung angekündigt. Für die Steuerdebatte ist neben Frontier- und Sandbox-Komponenten vor allem ein arbeitsrechtlicher Baustein bemerkenswert: </w:t>
+        <w:t xml:space="preserve"> am 1. Mai 2026 mit 131 zu 17 Stimmen verabschiedet; Gouverneur Ned Lamont hat das Gesetz im Mai 2026 unterzeichnet und damit das erste US-bundesstaatliche Omnibus-Regelwerk für KI-Verantwortung und Transparenz in Kraft gesetzt. Für die Steuerdebatte ist neben Frontier- und Sandbox-Komponenten vor allem ein arbeitsrechtlicher Baustein bemerkenswert: </w:t>
       </w:r>
       <w:r>
         <w:rPr>
@@ -3056,6 +3146,119 @@
           <w:sz w:val="19"/>
         </w:rPr>
         <w:t xml:space="preserve"> zur Stützung verdrängter Beschäftigter. Die Position ergänzt die in § 3.3 (de la Feria) und § 3.4 (IW Köln/Hentze) referierten ökonomischen Einwände um eine prominente publizistische Stimme aus der Wirtschaftspresse — und liefert damit für die in Kapitel 10 zu treffende Bewertung das spiegelbildliche Pendant zu den OpenAI-/Sanders-Vorschlägen aus demselben Zeitfenster.</w:t>
+      </w:r>
+    </w:p>
+    <w:p>
+      <w:pPr>
+        <w:jc w:val="both"/>
+      </w:pPr>
+      <w:r>
+        <w:rPr>
+          <w:rFonts w:ascii="Arial" w:hAnsi="Arial"/>
+          <w:b/>
+          <w:i w:val="0"/>
+          <w:sz w:val="19"/>
+        </w:rPr>
+        <w:t>Warren-Vorstoß (Time, 27. Mai 2026):</w:t>
+      </w:r>
+      <w:r>
+        <w:rPr>
+          <w:rFonts w:ascii="Arial" w:hAnsi="Arial"/>
+          <w:b w:val="0"/>
+          <w:i w:val="0"/>
+          <w:sz w:val="19"/>
+        </w:rPr>
+        <w:t xml:space="preserve"> Mit einem Namensbeitrag in </w:t>
+      </w:r>
+      <w:r>
+        <w:rPr>
+          <w:rFonts w:ascii="Arial" w:hAnsi="Arial"/>
+          <w:b w:val="0"/>
+          <w:i/>
+          <w:sz w:val="19"/>
+        </w:rPr>
+        <w:t>Time</w:t>
+      </w:r>
+      <w:r>
+        <w:rPr>
+          <w:rFonts w:ascii="Arial" w:hAnsi="Arial"/>
+          <w:b w:val="0"/>
+          <w:i w:val="0"/>
+          <w:sz w:val="19"/>
+        </w:rPr>
+        <w:t xml:space="preserve"> unter dem Titel </w:t>
+      </w:r>
+      <w:r>
+        <w:rPr>
+          <w:rFonts w:ascii="Arial" w:hAnsi="Arial"/>
+          <w:b w:val="0"/>
+          <w:i/>
+          <w:sz w:val="19"/>
+        </w:rPr>
+        <w:t>„Why We Need to Tax AI"</w:t>
+      </w:r>
+      <w:r>
+        <w:rPr>
+          <w:rFonts w:ascii="Arial" w:hAnsi="Arial"/>
+          <w:b w:val="0"/>
+          <w:i w:val="0"/>
+          <w:sz w:val="19"/>
+        </w:rPr>
+        <w:t xml:space="preserve"> (27. Mai 2026) hat US-Senatorin Elizabeth Warren (D-MA, Banking, Housing &amp; Urban Affairs) die Sanders-Linie um eine zweite progressive Konzeption ergänzt. Sie schlüge zwei Mechanismen vor: eine bundesweite Verbrauchsteuer (</w:t>
+      </w:r>
+      <w:r>
+        <w:rPr>
+          <w:rFonts w:ascii="Arial" w:hAnsi="Arial"/>
+          <w:b w:val="0"/>
+          <w:i/>
+          <w:sz w:val="19"/>
+        </w:rPr>
+        <w:t>excise tax</w:t>
+      </w:r>
+      <w:r>
+        <w:rPr>
+          <w:rFonts w:ascii="Arial" w:hAnsi="Arial"/>
+          <w:b w:val="0"/>
+          <w:i w:val="0"/>
+          <w:sz w:val="19"/>
+        </w:rPr>
+        <w:t xml:space="preserve">) auf den Stromverbrauch von KI-Rechenzentren — der konkrete Pro-Kilowattstunden-Satz wurde im Op-Ed nicht beziffert, sondern als „reasonable" qualifiziert — sowie eine Vermögensabgabe auf KI-affines Großvermögen, die an die im März 2026 erneut eingebrachte </w:t>
+      </w:r>
+      <w:r>
+        <w:rPr>
+          <w:rFonts w:ascii="Arial" w:hAnsi="Arial"/>
+          <w:b w:val="0"/>
+          <w:i/>
+          <w:sz w:val="19"/>
+        </w:rPr>
+        <w:t>Ultra-Millionaire Tax Act of 2026</w:t>
+      </w:r>
+      <w:r>
+        <w:rPr>
+          <w:rFonts w:ascii="Arial" w:hAnsi="Arial"/>
+          <w:b w:val="0"/>
+          <w:i w:val="0"/>
+          <w:sz w:val="19"/>
+        </w:rPr>
+        <w:t xml:space="preserve"> anschlösse (2 % auf Nettovermögen über 50 Mio. USD, zusätzliche 1 % auf Milliardenvermögen; namentlich genannt sind Jeff Bezos und Sam Altman). Das Aufkommen soll laut Op-Ed für eine universelle Krankenversicherung, kostenfreie Hochschulbildung und eine ausgebaute Arbeitslosenversicherung für durch Automatisierung verdrängte Beschäftigte zweckgebunden werden. Die Argumentationslinie greift die im OpenAI-Strategiepapier April 2026 (§ 4.5) und im Sanders-Report Oktober 2025 (§ 4.5) angelegte Logik einer Verlagerung der Steuerlast von Arbeit auf Kapital und KI-Infrastruktur auf, akzentuiert aber den Energieverbrauch der Rechenzentren als steuerliche Anknüpfung — strukturell ein Hybrid aus Typ 2 (Investitionsanreiz-Steuer) und Typ 4 (Verschiebung der relativen Steuerlast) nach der Typologie in § 2.1, mit Bezug zur in § 4.5 (Sanders/Ocasio-Cortez, </w:t>
+      </w:r>
+      <w:r>
+        <w:rPr>
+          <w:rFonts w:ascii="Arial" w:hAnsi="Arial"/>
+          <w:b w:val="0"/>
+          <w:i/>
+          <w:sz w:val="19"/>
+        </w:rPr>
+        <w:t>Artificial Intelligence Data Center Moratorium Act</w:t>
+      </w:r>
+      <w:r>
+        <w:rPr>
+          <w:rFonts w:ascii="Arial" w:hAnsi="Arial"/>
+          <w:b w:val="0"/>
+          <w:i w:val="0"/>
+          <w:sz w:val="19"/>
+        </w:rPr>
+        <w:t>, S. 4214) bereits etablierten infrastrukturzentrierten Anknüpfung. Warren zitiert sich selbst mit der Forderung, das Spielfeld durch höhere Unternehmens- und Kapitalertragsteuern und das Schließen von Schlupflöchern zu nivellieren, und zeigt sich offen für „noch größere und mutigere" KI-Besteuerungs­vorschläge. Aussichten auf eine Verabschiedung in einem republikanisch geführten Kongress gelten — wie beim Sanders-Vorstoß — als gering; signalpolitisch markiert der Beitrag aber den ersten KI-spezifischen Besteuerungs­vorschlag aus dem Senatsumfeld der demokratischen Partei seit dem Sanders-Report und schließt das US-Spektrum zwischen Sanders/AOC (Typ 5 plus Moratorium), Warren (Energie-Excise plus Vermögensabgabe), OpenAI (Typ 4) und Yang (Typ 4 mit Konsumsteuer-Komponente).</w:t>
       </w:r>
     </w:p>
     <w:p>
@@ -8718,6 +8921,56 @@
           <w:i w:val="0"/>
           <w:sz w:val="19"/>
         </w:rPr>
+        <w:t xml:space="preserve">Rat der Europäischen Union / Europäisches Parlament. (7. Mai 2026). </w:t>
+      </w:r>
+      <w:r>
+        <w:rPr>
+          <w:rFonts w:ascii="Arial" w:hAnsi="Arial"/>
+          <w:b w:val="0"/>
+          <w:i/>
+          <w:sz w:val="19"/>
+        </w:rPr>
+        <w:t>Artificial Intelligence: Council and Parliament agree to simplify and streamline rules.</w:t>
+      </w:r>
+      <w:r>
+        <w:rPr>
+          <w:rFonts w:ascii="Arial" w:hAnsi="Arial"/>
+          <w:b w:val="0"/>
+          <w:i w:val="0"/>
+          <w:sz w:val="19"/>
+        </w:rPr>
+        <w:t xml:space="preserve"> Provisorische politische Einigung zum </w:t>
+      </w:r>
+      <w:r>
+        <w:rPr>
+          <w:rFonts w:ascii="Arial" w:hAnsi="Arial"/>
+          <w:b w:val="0"/>
+          <w:i/>
+          <w:sz w:val="19"/>
+        </w:rPr>
+        <w:t>Digital Omnibus on AI</w:t>
+      </w:r>
+      <w:r>
+        <w:rPr>
+          <w:rFonts w:ascii="Arial" w:hAnsi="Arial"/>
+          <w:b w:val="0"/>
+          <w:i w:val="0"/>
+          <w:sz w:val="19"/>
+        </w:rPr>
+        <w:t xml:space="preserve"> (Konsens auf Stichtage 2. Dezember 2027 für Anhang III und 2. August 2028 für Anhang I; Transparenz- und Kennzeichnungspflichten nach Art. 50 zum 2. Dezember 2026; nationale Regulatory Sandboxes zum 2. August 2027; neues Verbot nach Art. 5 für KI-generierte CSAM/NCII mit Anpassungsfrist zum 2. Dezember 2026; förmliche Annahme vor 2. August 2026 angekündigt). Sekundärbelege u. a. Bird &amp; Bird, White &amp; Case, Modulos, Inside Privacy, Orrick, Lexology. https://www.consilium.europa.eu/en/press/press-releases/2026/05/07/artificial-intelligence-council-and-parliament-agree-to-simplify-and-streamline-rules/ | https://www.twobirds.com/en/insights/2026/digital-omnibus-on-ai-provisional-agreement-reached-at-the-may-trilogue | https://www.whitecase.com/insight-alert/eu-agrees-digital-omnibus-deal-simplify-ai-rules | https://www.orrick.com/en/Insights/2026/05/EUs-Digital-Omnibus-on-AI-7-Key-Changes-You-Need-to-Know</w:t>
+      </w:r>
+    </w:p>
+    <w:p>
+      <w:pPr>
+        <w:jc w:val="both"/>
+      </w:pPr>
+      <w:r>
+        <w:rPr>
+          <w:rFonts w:ascii="Arial" w:hAnsi="Arial"/>
+          <w:b w:val="0"/>
+          <w:i w:val="0"/>
+          <w:sz w:val="19"/>
+        </w:rPr>
         <w:t>Europäische Union. (2024). Verordnung (EU) 2024/1689 des Europäischen Parlaments und des Rates vom 13. Juni 2024 zur Festlegung harmonisierter Vorschriften für künstliche Intelligenz (</w:t>
       </w:r>
       <w:r>
@@ -8943,6 +9196,74 @@
           <w:sz w:val="19"/>
         </w:rPr>
         <w:t xml:space="preserve"> Namensbeitrag begleitend zur HELP-Anhörung; Ankündigung flankierender Gesetzgebung (Robotersteuer und bundesweites Moratorium für neue KI-Rechenzentren).</w:t>
+      </w:r>
+    </w:p>
+    <w:p>
+      <w:pPr>
+        <w:jc w:val="both"/>
+      </w:pPr>
+      <w:r>
+        <w:rPr>
+          <w:rFonts w:ascii="Arial" w:hAnsi="Arial"/>
+          <w:b w:val="0"/>
+          <w:i w:val="0"/>
+          <w:sz w:val="19"/>
+        </w:rPr>
+        <w:t xml:space="preserve">Warren, E. (27. Mai 2026). </w:t>
+      </w:r>
+      <w:r>
+        <w:rPr>
+          <w:rFonts w:ascii="Arial" w:hAnsi="Arial"/>
+          <w:b w:val="0"/>
+          <w:i/>
+          <w:sz w:val="19"/>
+        </w:rPr>
+        <w:t>Why We Need to Tax AI.</w:t>
+      </w:r>
+      <w:r>
+        <w:rPr>
+          <w:rFonts w:ascii="Arial" w:hAnsi="Arial"/>
+          <w:b w:val="0"/>
+          <w:i w:val="0"/>
+          <w:sz w:val="19"/>
+        </w:rPr>
+        <w:t xml:space="preserve"> Namensbeitrag in </w:t>
+      </w:r>
+      <w:r>
+        <w:rPr>
+          <w:rFonts w:ascii="Arial" w:hAnsi="Arial"/>
+          <w:b w:val="0"/>
+          <w:i/>
+          <w:sz w:val="19"/>
+        </w:rPr>
+        <w:t>Time</w:t>
+      </w:r>
+      <w:r>
+        <w:rPr>
+          <w:rFonts w:ascii="Arial" w:hAnsi="Arial"/>
+          <w:b w:val="0"/>
+          <w:i w:val="0"/>
+          <w:sz w:val="19"/>
+        </w:rPr>
+        <w:t xml:space="preserve"> — Vorschlag einer bundesweiten Verbrauchsteuer auf den Stromverbrauch von KI-Rechenzentren und einer Vermögensabgabe auf KI-affines Großvermögen (Anschluss an </w:t>
+      </w:r>
+      <w:r>
+        <w:rPr>
+          <w:rFonts w:ascii="Arial" w:hAnsi="Arial"/>
+          <w:b w:val="0"/>
+          <w:i/>
+          <w:sz w:val="19"/>
+        </w:rPr>
+        <w:t>Ultra-Millionaire Tax Act of 2026</w:t>
+      </w:r>
+      <w:r>
+        <w:rPr>
+          <w:rFonts w:ascii="Arial" w:hAnsi="Arial"/>
+          <w:b w:val="0"/>
+          <w:i w:val="0"/>
+          <w:sz w:val="19"/>
+        </w:rPr>
+        <w:t>, März 2026: 2 % auf Nettovermögen &gt; 50 Mio. USD, +1 % auf Milliardenvermögen); zweckgebundene Verwendung für universelle Krankenversicherung, kostenfreie Hochschulbildung und Arbeitslosenversicherung für durch Automatisierung Verdrängte. Sekundärbelege Axios, The Hill, Newsweek, TechSpot, Techtimes. https://time.com/article/2026/05/27/why-we-need-to-tax-ai/ | https://www.axios.com/2026/05/27/elizabeth-warren-tax-ai-companies-benefit-americans | https://thehill.com/homenews/senate/5898081-warren-proposes-ai-tax/ | https://www.techspot.com/news/112549-elizabeth-warren-wants-tax-ai-data-centers-power.html | https://www.techtimes.com/articles/317294/20260527/warren-proposes-ai-data-center-tax-fund-workers-displaced-automation.htm</w:t>
       </w:r>
     </w:p>
     <w:p>
@@ -10553,6 +10874,170 @@
       <w:r>
         <w:rPr>
           <w:rFonts w:ascii="Arial" w:hAnsi="Arial"/>
+          <w:b w:val="0"/>
+          <w:i w:val="0"/>
+          <w:sz w:val="19"/>
+        </w:rPr>
+        <w:t xml:space="preserve">NPR / CNBC / Yahoo Finance / The Next Web / Quartz. (18.–20. Mai 2026). </w:t>
+      </w:r>
+      <w:r>
+        <w:rPr>
+          <w:rFonts w:ascii="Arial" w:hAnsi="Arial"/>
+          <w:b w:val="0"/>
+          <w:i/>
+          <w:sz w:val="19"/>
+        </w:rPr>
+        <w:t>Meta slashes 8,000 jobs as it pivots towards AI / Meta layoffs starting this week stress harsh AI reality inside Zuckerberg's company / Zuckerberg's Meta layoffs memo: ‚Success isn't a given' in the AI era / Meta cuts 8,000 jobs and cancels 6,000 open roles as $135B AI spending reshapes the company from the inside / Meta layoffs 2026: 8,000 jobs cut in AI restructuring.</w:t>
+      </w:r>
+      <w:r>
+        <w:rPr>
+          <w:rFonts w:ascii="Arial" w:hAnsi="Arial"/>
+          <w:b w:val="0"/>
+          <w:i w:val="0"/>
+          <w:sz w:val="19"/>
+        </w:rPr>
+        <w:t xml:space="preserve"> Erste Welle der Mai-Stellenstreichungen bei </w:t>
+      </w:r>
+      <w:r>
+        <w:rPr>
+          <w:rFonts w:ascii="Arial" w:hAnsi="Arial"/>
+          <w:b w:val="0"/>
+          <w:i/>
+          <w:sz w:val="19"/>
+        </w:rPr>
+        <w:t>Meta</w:t>
+      </w:r>
+      <w:r>
+        <w:rPr>
+          <w:rFonts w:ascii="Arial" w:hAnsi="Arial"/>
+          <w:b w:val="0"/>
+          <w:i w:val="0"/>
+          <w:sz w:val="19"/>
+        </w:rPr>
+        <w:t xml:space="preserve"> (rund 8.000 Beschäftigte, rund 10 % der Belegschaft; zusätzlich rund 6.000 offene Stellen gestrichen; CPO Janelle Gale ordnet bis zu 7.000 Beschäftigte neuen KI-Teams zu — Applied AI Engineering, Agent Transformation Accelerator XFN, Central Analytics; Memo Zuckerberg „Success isn't a given"; Capex 2026 125–145 Mrd. USD). https://www.npr.org/2026/05/20/nx-s1-5826917/meta-layoffs-ai-jobs | https://www.cnbc.com/2026/05/20/meta-layoffs-zuckerberg-says-success-isnt-a-given-in-memo.html | https://www.cnbc.com/2026/05/18/metas-layoffs-starting-this-week-underscore-zuckerbergs-ai-reality-.html | https://thenextweb.com/news/meta-layoffs-may-2026-ai-restructuring-thousands | https://qz.com/meta-layoffs-8000-jobs-ai-restructuring-052026</w:t>
+      </w:r>
+    </w:p>
+    <w:p>
+      <w:pPr>
+        <w:jc w:val="both"/>
+      </w:pPr>
+      <w:r>
+        <w:rPr>
+          <w:rFonts w:ascii="Arial" w:hAnsi="Arial"/>
+          <w:b w:val="0"/>
+          <w:i w:val="0"/>
+          <w:sz w:val="19"/>
+        </w:rPr>
+        <w:t xml:space="preserve">TechCrunch / Yahoo Finance. (20. Mai 2026). </w:t>
+      </w:r>
+      <w:r>
+        <w:rPr>
+          <w:rFonts w:ascii="Arial" w:hAnsi="Arial"/>
+          <w:b w:val="0"/>
+          <w:i/>
+          <w:sz w:val="19"/>
+        </w:rPr>
+        <w:t>Intuit to lay off over 3,000 employees to refocus on AI.</w:t>
+      </w:r>
+      <w:r>
+        <w:rPr>
+          <w:rFonts w:ascii="Arial" w:hAnsi="Arial"/>
+          <w:b w:val="0"/>
+          <w:i w:val="0"/>
+          <w:sz w:val="19"/>
+        </w:rPr>
+        <w:t xml:space="preserve"> Reduktion um rund 17 % der globalen Belegschaft mit explizitem KI-Bezug. https://techcrunch.com/2026/05/20/intuit-to-lay-off-over-3000-employees-to-refocus-on-ai/</w:t>
+      </w:r>
+    </w:p>
+    <w:p>
+      <w:pPr>
+        <w:jc w:val="both"/>
+      </w:pPr>
+      <w:r>
+        <w:rPr>
+          <w:rFonts w:ascii="Arial" w:hAnsi="Arial"/>
+          <w:b w:val="0"/>
+          <w:i w:val="0"/>
+          <w:sz w:val="19"/>
+        </w:rPr>
+        <w:t xml:space="preserve">CNBC / Yahoo Finance. (28. Mai 2026). </w:t>
+      </w:r>
+      <w:r>
+        <w:rPr>
+          <w:rFonts w:ascii="Arial" w:hAnsi="Arial"/>
+          <w:b w:val="0"/>
+          <w:i/>
+          <w:sz w:val="19"/>
+        </w:rPr>
+        <w:t>AI part of another tech layoff as Wix CEO announces 20% workforce cut / Layoffs Accelerate in May 2026 as Firms Restructure Around AI.</w:t>
+      </w:r>
+      <w:r>
+        <w:rPr>
+          <w:rFonts w:ascii="Arial" w:hAnsi="Arial"/>
+          <w:b w:val="0"/>
+          <w:i w:val="0"/>
+          <w:sz w:val="19"/>
+        </w:rPr>
+        <w:t xml:space="preserve"> </w:t>
+      </w:r>
+      <w:r>
+        <w:rPr>
+          <w:rFonts w:ascii="Arial" w:hAnsi="Arial"/>
+          <w:b w:val="0"/>
+          <w:i/>
+          <w:sz w:val="19"/>
+        </w:rPr>
+        <w:t>Wix</w:t>
+      </w:r>
+      <w:r>
+        <w:rPr>
+          <w:rFonts w:ascii="Arial" w:hAnsi="Arial"/>
+          <w:b w:val="0"/>
+          <w:i w:val="0"/>
+          <w:sz w:val="19"/>
+        </w:rPr>
+        <w:t xml:space="preserve"> reduziert rund 1.000 Beschäftigte — rund 20 % der ersten Quartalsbelegschaft von 5.277 — mit explizitem Bezug auf KI-Automatisierung und Wechselkurseffekte. https://www.cnbc.com/2026/05/28/wix-layoffs-ai-exchange-rates.html | https://finance.yahoo.com/sectors/technology/articles/layoffs-accelerate-may-2026-firms-040430218.html</w:t>
+      </w:r>
+    </w:p>
+    <w:p>
+      <w:pPr>
+        <w:jc w:val="both"/>
+      </w:pPr>
+      <w:r>
+        <w:rPr>
+          <w:rFonts w:ascii="Arial" w:hAnsi="Arial"/>
+          <w:b w:val="0"/>
+          <w:i w:val="0"/>
+          <w:sz w:val="19"/>
+        </w:rPr>
+        <w:t xml:space="preserve">Techtimes / Yahoo Finance / American Bazaar / TechSpot. (28./29. Mai 2026). </w:t>
+      </w:r>
+      <w:r>
+        <w:rPr>
+          <w:rFonts w:ascii="Arial" w:hAnsi="Arial"/>
+          <w:b w:val="0"/>
+          <w:i/>
+          <w:sz w:val="19"/>
+        </w:rPr>
+        <w:t>Tech Layoffs Reach 142,000 in 2026: Profitable Companies Cut Jobs to Fund $700B AI Infrastructure / 2026 Tech Layoffs Near 150,000 as Companies Pour Money Into AI / Losing a tech job in 2026 now costs workers nearly $14,400 a month, study finds / Tech layoffs have already passed 100,000 in 2026 as the industry cuts jobs to fund AI.</w:t>
+      </w:r>
+      <w:r>
+        <w:rPr>
+          <w:rFonts w:ascii="Arial" w:hAnsi="Arial"/>
+          <w:b w:val="0"/>
+          <w:i w:val="0"/>
+          <w:sz w:val="19"/>
+        </w:rPr>
+        <w:t xml:space="preserve"> Aggregat-Stand der ersten fünf Monate 2026: rund 142.000 Tech-Stellenstreichungen mit Projektion auf rund 370.000 für das Gesamtjahr (Post-Pandemie-Rekord 2023: 430.000); Konzern-Splits Oracle rund 30.000, Meta 8.000, Intuit 3.000, Cisco 4.000; Challenger-Methodik: KI als ausschlagebender Faktor für 25 % der Tech-Streichungen im März 2026 dokumentiert; Yale-Budget-Lab-Folgestudie 28. Mai 2026: durchschnittliches Einkommensloch verdrängter Tech-Beschäftigter rund 14.400 US-Dollar pro Monat. https://www.techtimes.com/articles/317392/20260529/tech-layoffs-reach-142000-2026-profitable-companies-cut-jobs-fund-700b-ai-infrastructure.htm | https://finance.yahoo.com/sectors/technology/articles/2026-tech-layoffs-near-150-110000224.html | https://americanbazaaronline.com/2026/05/28/losing-a-tech-job-in-2026-now-costs-workers-nearly-14400-month-481700/ | https://www.techspot.com/news/112493-tech-layoffs-pass-100000-2026-tracker-points-ai.html</w:t>
+      </w:r>
+    </w:p>
+    <w:p>
+      <w:pPr>
+        <w:jc w:val="both"/>
+      </w:pPr>
+      <w:r>
+        <w:rPr>
+          <w:rFonts w:ascii="Arial" w:hAnsi="Arial"/>
           <w:b/>
           <w:i w:val="0"/>
           <w:sz w:val="19"/>
@@ -10566,7 +11051,223 @@
           <w:i w:val="0"/>
           <w:sz w:val="19"/>
         </w:rPr>
-        <w:t xml:space="preserve"> Dieses Arbeitspapier gibt den Stand Anfang Mai 2026 (Schnitt am 8. Mai 2026 — Lauf 001 vom 8. Mai 2026) wieder. Die Debatte entwickelt sich dynamisch, insbesondere im Zuge der OpenAI-Strategiepapiere und der Eröffnung des OpenAI Workshop in Washington, D.C. im Mai 2026, des Erstdurchgangs des GKV-Beitragssatzstabilisierungsgesetzes in der 1065. Bundesratssitzung am 8. Mai 2026 mit 79 Tagesordnungspunkten (Kabinettsbeschluss 29. April 2026, parlamentarische Behandlung vor der Sommerpause 2026 angekündigt), der laufenden Trilog-Verhandlungen zum Digital Omnibus on AI (zweite Runde 28. April 2026 ohne Einigung; nächste Runde 13. Mai 2026 — Knackpunkt ist nicht die Verschiebung der Hochrisiko-Pflichten, sondern die Konformitätsbewertungs-Architektur für Anhang I; die zypriotische Ratspräsidentschaft strebt einen Abschluss vor Ablauf ihrer Amtszeit am 30. Juni 2026 an, andernfalls übernimmt die irische Präsidentschaft), der am 5. Mai 2026 erfolgten Arraignment-Verhandlung im Altman-Verfahren mit „nicht schuldig"-Plädoyer und angeordneter psychiatrischer Begutachtung, des am 7. Mai 2026 versandten individuellen Microsoft-Buyout-Angebots (Annahmefrist 8. Juni 2026, VRSAR-Unterzeichnung 9.–22. Juni 2026, bis zu fünfjährige Krankenversicherungs-Verlängerung), des am 1. Mai 2026 vom Connecticut-Repräsentantenhaus mit 131 zu 17 Stimmen verabschiedeten </w:t>
+        <w:t xml:space="preserve"> Dieses Arbeitspapier gibt den Stand Ende Mai 2026 (Schnitt am 30. Mai 2026 — Lauf 001 vom 30. Mai 2026; Nachholrunde nach 22-tägiger Pause seit Lauf 001 vom 8. Mai 2026) wieder. Neu eingearbeitet wurden insbesondere die am 7. Mai 2026 erzielte provisorische politische Einigung zum </w:t>
+      </w:r>
+      <w:r>
+        <w:rPr>
+          <w:rFonts w:ascii="Arial" w:hAnsi="Arial"/>
+          <w:b w:val="0"/>
+          <w:i/>
+          <w:sz w:val="19"/>
+        </w:rPr>
+        <w:t>Digital Omnibus on AI</w:t>
+      </w:r>
+      <w:r>
+        <w:rPr>
+          <w:rFonts w:ascii="Arial" w:hAnsi="Arial"/>
+          <w:b w:val="0"/>
+          <w:i w:val="0"/>
+          <w:sz w:val="19"/>
+        </w:rPr>
+        <w:t xml:space="preserve"> (Stichtage 2. Dezember 2027 für Anhang III und 2. August 2028 für Anhang I bestätigt; Transparenz- und Kennzeichnungspflichten nach Art. 50 auf den 2. Dezember 2026 verschoben; nationale Regulatory Sandboxes bis 2. August 2027; neues Verbot nach Art. 5 für KI-generierte CSAM/NCII; förmliche Annahme vor 2. August 2026 angekündigt), der zweite progressiver US-Senats-Vorstoß zur KI-Besteuerung in Form des Time-Op-Eds von Elizabeth Warren </w:t>
+      </w:r>
+      <w:r>
+        <w:rPr>
+          <w:rFonts w:ascii="Arial" w:hAnsi="Arial"/>
+          <w:b w:val="0"/>
+          <w:i/>
+          <w:sz w:val="19"/>
+        </w:rPr>
+        <w:t>„Why We Need to Tax AI"</w:t>
+      </w:r>
+      <w:r>
+        <w:rPr>
+          <w:rFonts w:ascii="Arial" w:hAnsi="Arial"/>
+          <w:b w:val="0"/>
+          <w:i w:val="0"/>
+          <w:sz w:val="19"/>
+        </w:rPr>
+        <w:t xml:space="preserve"> vom 27. Mai 2026 (Verbrauchsteuer auf den Stromverbrauch von KI-Rechenzentren plus Vermögensabgabe auf KI-affines Großvermögen mit zweckgebundener Verwendung für universelle Krankenversicherung, kostenfreie Hochschulbildung und Arbeitslosenversicherung Verdrängter), die im Mai 2026 vollzogene Unterzeichnung von </w:t>
+      </w:r>
+      <w:r>
+        <w:rPr>
+          <w:rFonts w:ascii="Arial" w:hAnsi="Arial"/>
+          <w:b w:val="0"/>
+          <w:i/>
+          <w:sz w:val="19"/>
+        </w:rPr>
+        <w:t>SB 5 — Connecticut Artificial Intelligence Responsibility and Transparency Act</w:t>
+      </w:r>
+      <w:r>
+        <w:rPr>
+          <w:rFonts w:ascii="Arial" w:hAnsi="Arial"/>
+          <w:b w:val="0"/>
+          <w:i w:val="0"/>
+          <w:sz w:val="19"/>
+        </w:rPr>
+        <w:t xml:space="preserve"> durch Gouverneur Ned Lamont sowie die Mai-Fortsetzung der KI-getriebenen Tech-Layoff-Welle (Meta 8.000 Stellen ab 20. Mai 2026 mit 6.000 zusätzlich gestrichenen offenen Stellen und CPO-Memo Janelle Gale zur Neuausrichtung auf KI-Teams; Intuit über 3.000 Stellen am 20. Mai 2026; Wix rund 1.000 Stellen ab 28. Mai 2026 mit explizitem KI-Bezug; Techtimes-Aggregat 29. Mai 2026: 142.000 Tech-Stellenstreichungen für die ersten fünf Monate 2026 mit Projektion auf rund 370.000 Vollejahr; Yale-Budget-Lab-Folgestudie 28. Mai 2026 zum durchschnittlichen Einkommensloch verdrängter Tech-Beschäftigter von rund 14.400 US-Dollar pro Monat). Die in der Vorversion 22.0 als noch laufend dokumentierten Verfahren (insbesondere die zypriotische Ratspräsidentschaft zum Digital Omnibus, die parlamentarische Behandlung des GKV-Beitragssatzstabilisierungsgesetzes, der Mikrosoft-VRSAR-Vollzug ab 9. Juni 2026 und die parallel laufenden Maine-Maßnahmen) gelten unverändert fort. Die Debatte entwickelt sich dynamisch, insbesondere im Zuge der OpenAI-Strategiepapiere und der Eröffnung des OpenAI Workshop in Washington, D.C. im Mai 2026, des Erstdurchgangs des GKV-Beitragssatzstabilisierungsgesetzes in der 1065. Bundesratssitzung am 8. Mai 2026 mit 79 Tagesordnungspunkten (Kabinettsbeschluss 29. April 2026, parlamentarische Behandlung vor der Sommerpause 2026 angekündigt — laut BMG-Zeitplan erste Lesung Bundestag 11. Juni 2026, zweite/dritte Lesung 26. Juni 2026, erste Bundesratslesung 12. Juni 2026, zweite 10. Juli 2026), der am 5. Mai 2026 erfolgten Arraignment-Verhandlung im Altman-Verfahren mit „nicht schuldig"-Plädoyer und angeordneter psychiatrischer Begutachtung, des am 7. Mai 2026 versandten individuellen Microsoft-Buyout-Angebots (Annahmefrist 8. Juni 2026, VRSAR-Unterzeichnung 9.–22. Juni 2026, bis zu fünfjährige Krankenversicherungs-Verlängerung), der parallelen exekutiven Maine-Maßnahmen (Executive Order Nr. 5 zum Data Center Advisory Council vom 29. April 2026, LD 713 zum Subventionsausschluss vom 24. April 2026), des im Februar 2026 vorgelegten Hamilton-Project-Papiers von Acemoglu, Autor und Johnson zu </w:t>
+      </w:r>
+      <w:r>
+        <w:rPr>
+          <w:rFonts w:ascii="Arial" w:hAnsi="Arial"/>
+          <w:b w:val="0"/>
+          <w:i/>
+          <w:sz w:val="19"/>
+        </w:rPr>
+        <w:t>„Building Pro-Worker Artificial Intelligence"</w:t>
+      </w:r>
+      <w:r>
+        <w:rPr>
+          <w:rFonts w:ascii="Arial" w:hAnsi="Arial"/>
+          <w:b w:val="0"/>
+          <w:i w:val="0"/>
+          <w:sz w:val="19"/>
+        </w:rPr>
+        <w:t xml:space="preserve">, des am 5. März 2026 publizierten Anthropic-Papiers von Massenkoff &amp; McCrory zu </w:t>
+      </w:r>
+      <w:r>
+        <w:rPr>
+          <w:rFonts w:ascii="Arial" w:hAnsi="Arial"/>
+          <w:b w:val="0"/>
+          <w:i/>
+          <w:sz w:val="19"/>
+        </w:rPr>
+        <w:t>„Labor market impacts of AI"</w:t>
+      </w:r>
+      <w:r>
+        <w:rPr>
+          <w:rFonts w:ascii="Arial" w:hAnsi="Arial"/>
+          <w:b w:val="0"/>
+          <w:i w:val="0"/>
+          <w:sz w:val="19"/>
+        </w:rPr>
+        <w:t xml:space="preserve"> (Computer-Programmierer 74,5 % beobachtete Exposition; keine systematische Arbeitslosigkeitserhöhung, tentative Hire-Verlangsamung 22–25-Jährige), des am 22. April 2026 gestarteten </w:t>
+      </w:r>
+      <w:r>
+        <w:rPr>
+          <w:rFonts w:ascii="Arial" w:hAnsi="Arial"/>
+          <w:b w:val="0"/>
+          <w:i/>
+          <w:sz w:val="19"/>
+        </w:rPr>
+        <w:t>Anthropic Economic Index Survey</w:t>
+      </w:r>
+      <w:r>
+        <w:rPr>
+          <w:rFonts w:ascii="Arial" w:hAnsi="Arial"/>
+          <w:b w:val="0"/>
+          <w:i w:val="0"/>
+          <w:sz w:val="19"/>
+        </w:rPr>
+        <w:t xml:space="preserve"> als monatliche qualitative Ergänzung zur nutzungsdatenbasierten Index-Reihe sowie des am 23. April 2026 nachgereichten ökonomischen Folgebands zur 81k-Befragung („Economic concerns and gains from AI use"), des am 24. März 2026 erschienenen </w:t>
+      </w:r>
+      <w:r>
+        <w:rPr>
+          <w:rFonts w:ascii="Arial" w:hAnsi="Arial"/>
+          <w:b w:val="0"/>
+          <w:i/>
+          <w:sz w:val="19"/>
+        </w:rPr>
+        <w:t>Anthropic-Economic-Index</w:t>
+      </w:r>
+      <w:r>
+        <w:rPr>
+          <w:rFonts w:ascii="Arial" w:hAnsi="Arial"/>
+          <w:b w:val="0"/>
+          <w:i w:val="0"/>
+          <w:sz w:val="19"/>
+        </w:rPr>
+        <w:t xml:space="preserve">-Folgeberichts </w:t>
+      </w:r>
+      <w:r>
+        <w:rPr>
+          <w:rFonts w:ascii="Arial" w:hAnsi="Arial"/>
+          <w:b w:val="0"/>
+          <w:i/>
+          <w:sz w:val="19"/>
+        </w:rPr>
+        <w:t>„Learning curves"</w:t>
+      </w:r>
+      <w:r>
+        <w:rPr>
+          <w:rFonts w:ascii="Arial" w:hAnsi="Arial"/>
+          <w:b w:val="0"/>
+          <w:i w:val="0"/>
+          <w:sz w:val="19"/>
+        </w:rPr>
+        <w:t xml:space="preserve">, des im Sejm anhängigen Abgeordnetenentwurfs zur Anhebung der polnischen </w:t>
+      </w:r>
+      <w:r>
+        <w:rPr>
+          <w:rFonts w:ascii="Arial" w:hAnsi="Arial"/>
+          <w:b w:val="0"/>
+          <w:i/>
+          <w:sz w:val="19"/>
+        </w:rPr>
+        <w:t>ulga na robotyzację</w:t>
+      </w:r>
+      <w:r>
+        <w:rPr>
+          <w:rFonts w:ascii="Arial" w:hAnsi="Arial"/>
+          <w:b w:val="0"/>
+          <w:i w:val="0"/>
+          <w:sz w:val="19"/>
+        </w:rPr>
+        <w:t xml:space="preserve"> auf 100 %, der revidierten IAB-Frühjahrsprognose vom 24. März 2026, der aktualisierten Tech-Layoff-Trackerstände zum 6./7./8. Mai 2026 (TrueUp 127.411 Personen aus 283 Layoff-Meldungen am 8. Mai 2026 — rund 1.003 Personen pro Tag) sowie der am 5./6./7. Mai 2026 angekündigten KI-getriebenen Stellenstreichungen bei Coinbase, PayPal, Freshworks, Cognizant und Cloudflare, des am 1. Mai 2026 von </w:t>
+      </w:r>
+      <w:r>
+        <w:rPr>
+          <w:rFonts w:ascii="Arial" w:hAnsi="Arial"/>
+          <w:b w:val="0"/>
+          <w:i/>
+          <w:sz w:val="19"/>
+        </w:rPr>
+        <w:t>Challenger, Gray &amp; Christmas</w:t>
+      </w:r>
+      <w:r>
+        <w:rPr>
+          <w:rFonts w:ascii="Arial" w:hAnsi="Arial"/>
+          <w:b w:val="0"/>
+          <w:i w:val="0"/>
+          <w:sz w:val="19"/>
+        </w:rPr>
+        <w:t xml:space="preserve"> veröffentlichten </w:t>
+      </w:r>
+      <w:r>
+        <w:rPr>
+          <w:rFonts w:ascii="Arial" w:hAnsi="Arial"/>
+          <w:b w:val="0"/>
+          <w:i/>
+          <w:sz w:val="19"/>
+        </w:rPr>
+        <w:t>April-2026-Job-Cuts-Reports</w:t>
+      </w:r>
+      <w:r>
+        <w:rPr>
+          <w:rFonts w:ascii="Arial" w:hAnsi="Arial"/>
+          <w:b w:val="0"/>
+          <w:i w:val="0"/>
+          <w:sz w:val="19"/>
+        </w:rPr>
+        <w:t xml:space="preserve">, des Big-Tech-AI-Capex-Programms 2026 mit nach oben revidierter Aggregat-Schätzung auf rund 725 Milliarden US-Dollar sowie des am 29. April 2026 veröffentlichten </w:t>
+      </w:r>
+      <w:r>
+        <w:rPr>
+          <w:rFonts w:ascii="Arial" w:hAnsi="Arial"/>
+          <w:b w:val="0"/>
+          <w:i/>
+          <w:sz w:val="19"/>
+        </w:rPr>
+        <w:t>Bloomberg-Editorials</w:t>
+      </w:r>
+      <w:r>
+        <w:rPr>
+          <w:rFonts w:ascii="Arial" w:hAnsi="Arial"/>
+          <w:b w:val="0"/>
+          <w:i w:val="0"/>
+          <w:sz w:val="19"/>
+        </w:rPr>
+        <w:t xml:space="preserve"> gegen eine KI-Steuer. Eine regelmäßige Aktualisierung ist vorgesehen. Die Debatte entwickelt sich dynamisch, insbesondere im Zuge der OpenAI-Strategiepapiere und der Eröffnung des OpenAI Workshop in Washington, D.C. im Mai 2026, des Erstdurchgangs des GKV-Beitragssatzstabilisierungsgesetzes in der 1065. Bundesratssitzung am 8. Mai 2026 mit 79 Tagesordnungspunkten (Kabinettsbeschluss 29. April 2026, parlamentarische Behandlung vor der Sommerpause 2026 angekündigt), der laufenden Trilog-Verhandlungen zum Digital Omnibus on AI (zweite Runde 28. April 2026 ohne Einigung; nächste Runde 13. Mai 2026 — Knackpunkt ist nicht die Verschiebung der Hochrisiko-Pflichten, sondern die Konformitätsbewertungs-Architektur für Anhang I; die zypriotische Ratspräsidentschaft strebt einen Abschluss vor Ablauf ihrer Amtszeit am 30. Juni 2026 an, andernfalls übernimmt die irische Präsidentschaft), der am 5. Mai 2026 erfolgten Arraignment-Verhandlung im Altman-Verfahren mit „nicht schuldig"-Plädoyer und angeordneter psychiatrischer Begutachtung, des am 7. Mai 2026 versandten individuellen Microsoft-Buyout-Angebots (Annahmefrist 8. Juni 2026, VRSAR-Unterzeichnung 9.–22. Juni 2026, bis zu fünfjährige Krankenversicherungs-Verlängerung), des am 1. Mai 2026 vom Connecticut-Repräsentantenhaus mit 131 zu 17 Stimmen verabschiedeten </w:t>
       </w:r>
       <w:r>
         <w:rPr>
@@ -10862,7 +11563,7 @@
         <w:color w:val="999999"/>
         <w:sz w:val="15"/>
       </w:rPr>
-      <w:t>Version 22.0 — Mai 2026 — CC BY 4.0</w:t>
+      <w:t>Version 23.0 — Mai 2026 — CC BY 4.0</w:t>
       <w:tab/>
       <w:t xml:space="preserve">Seite </w:t>
     </w:r>

</xml_diff>

<commit_message>
Daily-Update 2026-06-06 — Version 23.0 (Cluster: D, F)
Lauf 001 vom 6. Juni 2026 ergänzt vier belegbare Entwicklungen:
- § 4.5: Sanders' American AI Sovereign Wealth Fund Act (NYT-Op-Ed
  1. Juni 2026) — 50 % Anteilsabgabe OpenAI/Anthropic/xAI an
  US-Staatsfonds; Trump-Konvergenzsignal 5. Juni 2026
- § 1.1: Challenger Mai-2026-Job-Cuts-Report — 97.006 Streichungen
  (höchster Mai seit 2020); KI 38.579 / 40 % (Monatsrekord seit 2023);
  YTD KI 87.714 übertrifft 2025-Gesamt vor Jahresmitte
- § 1.1: Uber 3. Juni 2026 — 23 % People-Division, "nicht KI" vs.
  95 % Ingenieure mit KI-Tools / Forrester-"AI washing"
- § 1.1: Tracker 5. Juni 2026 — 149.935 / 363 Events, +44 % Tempo
  vs. 2025

Querverweise § 5.4 und § 8.3 um eigentumsrechtliche statt steuerliche
Pfadlogik ergänzt (Art. 14 GG / Art. 15 GG).
</commit_message>
<xml_diff>
--- a/KI-Ökonomie.docx
+++ b/KI-Ökonomie.docx
@@ -112,7 +112,7 @@
           <w:color w:val="666666"/>
           <w:sz w:val="18"/>
         </w:rPr>
-        <w:t>Version 22.0</w:t>
+        <w:t>Version 23.0</w:t>
       </w:r>
     </w:p>
     <w:p>
@@ -472,7 +472,187 @@
           <w:i w:val="0"/>
           <w:sz w:val="19"/>
         </w:rPr>
-        <w:t xml:space="preserve"> am 1. Mai 2026 vorgelegt: Die Tech-Streichungen bei Amazon, Meta und Microsoft seien nicht ausschließlich KI-getrieben, sondern speisten sich auch aus Austerity-Logiken (Kompensation der hohen KI-Investitionsausgaben), aus Korrekturen der pandemiebedingten Überbeschäftigung und aus Routine-Restrukturierungen; eine monokausale Zuschreibung verzerre damit die fiskalpolitischen Schlussfolgerungen. Für die Steuerdebatte ist diese Differenzierung relevant, weil sie die Anknüpfung von Steuern an „nachgewiesene KI-Verdrängung" (vgl. Typ 5 nach § 2.1, § 9.1) zusätzlich erschwert: Die Kausalattribution zwischen Stellenabbau, KI-Einführung und ausgabenseitiger Konsolidierung ist auch im sichtbarsten Marktsegment empirisch nicht trennscharf. Andererseits steht die Finanzierung der sozialen Sicherungssysteme — insbesondere der paritätisch über Löhne finanzierten Zweige Kranken-, Pflege-, Renten- und Arbeitslosenversicherung — vor strukturellen Herausforderungen durch den demografischen Wandel.</w:t>
+        <w:t xml:space="preserve"> am 1. Mai 2026 vorgelegt: Die Tech-Streichungen bei Amazon, Meta und Microsoft seien nicht ausschließlich KI-getrieben, sondern speisten sich auch aus Austerity-Logiken (Kompensation der hohen KI-Investitionsausgaben), aus Korrekturen der pandemiebedingten Überbeschäftigung und aus Routine-Restrukturierungen; eine monokausale Zuschreibung verzerre damit die fiskalpolitischen Schlussfolgerungen. Für die Steuerdebatte ist diese Differenzierung relevant, weil sie die Anknüpfung von Steuern an „nachgewiesene KI-Verdrängung" (vgl. Typ 5 nach § 2.1, § 9.1) zusätzlich erschwert: Die Kausalattribution zwischen Stellenabbau, KI-Einführung und ausgabenseitiger Konsolidierung ist auch im sichtbarsten Marktsegment empirisch nicht trennscharf. Eine Fortschreibung dieser Welle in den Folgewochen liefert der </w:t>
+      </w:r>
+      <w:r>
+        <w:rPr>
+          <w:rFonts w:ascii="Arial" w:hAnsi="Arial"/>
+          <w:b w:val="0"/>
+          <w:i/>
+          <w:sz w:val="19"/>
+        </w:rPr>
+        <w:t>Mai-2026-Job-Cuts-Report</w:t>
+      </w:r>
+      <w:r>
+        <w:rPr>
+          <w:rFonts w:ascii="Arial" w:hAnsi="Arial"/>
+          <w:b w:val="0"/>
+          <w:i w:val="0"/>
+          <w:sz w:val="19"/>
+        </w:rPr>
+        <w:t xml:space="preserve"> von </w:t>
+      </w:r>
+      <w:r>
+        <w:rPr>
+          <w:rFonts w:ascii="Arial" w:hAnsi="Arial"/>
+          <w:b w:val="0"/>
+          <w:i/>
+          <w:sz w:val="19"/>
+        </w:rPr>
+        <w:t>Challenger, Gray &amp; Christmas</w:t>
+      </w:r>
+      <w:r>
+        <w:rPr>
+          <w:rFonts w:ascii="Arial" w:hAnsi="Arial"/>
+          <w:b w:val="0"/>
+          <w:i w:val="0"/>
+          <w:sz w:val="19"/>
+        </w:rPr>
+        <w:t xml:space="preserve"> (veröffentlicht am 5. Juni 2026): Die US-Stellenstreichungen im Mai 2026 erreichten mit 97.006 angekündigten Streichungen das höchste Mai-Niveau seit dem Pandemie-Mai 2020 und stiegen damit um 16 % gegenüber April 2026, während KI im dritten Monat in Folge als am häufigsten genannter Einzelgrund firmierte: 38.579 Streichungen wurden explizit KI zugeschrieben — entsprechend 40 % aller Mai-Streichungen und dem höchsten je gemessenen Monatswert seit Beginn der Erhebung 2023 (Januar 2026: 7 %; März 2026: 25 %; April 2026: 26 %). Im laufenden Jahr summieren sich die KI-bezogenen Streichungen auf 87.714 und damit 22 % aller 397.755 bislang gemeldeten 2026-Streichungen — der Wert übertrifft die für das gesamte Jahr 2025 dokumentierten 54.836 KI-Zuschreibungen bereits zur Jahresmitte. Die Tech-Branche bleibt mit 38.242 Mai-Streichungen (höchster Monatswert seit August 2024) und 123.653 Streichungen kumuliert (+66 % gegenüber dem Vorjahresvergleichszeitraum) Treiber der Aggregat-Entwicklung; </w:t>
+      </w:r>
+      <w:r>
+        <w:rPr>
+          <w:rFonts w:ascii="Arial" w:hAnsi="Arial"/>
+          <w:b w:val="0"/>
+          <w:i/>
+          <w:sz w:val="19"/>
+        </w:rPr>
+        <w:t>Andy Challenger</w:t>
+      </w:r>
+      <w:r>
+        <w:rPr>
+          <w:rFonts w:ascii="Arial" w:hAnsi="Arial"/>
+          <w:b w:val="0"/>
+          <w:i w:val="0"/>
+          <w:sz w:val="19"/>
+        </w:rPr>
+        <w:t xml:space="preserve"> (Chief Revenue Officer) ordnete dies mit der Formulierung ein, KI sei „nun der am häufigsten genannte Grund, den Unternehmen für Stellenstreichungen anführen, und die primäre Branche, die ihn nennt, ist Technologie". Spiegelbildlich dazu hat </w:t>
+      </w:r>
+      <w:r>
+        <w:rPr>
+          <w:rFonts w:ascii="Arial" w:hAnsi="Arial"/>
+          <w:b w:val="0"/>
+          <w:i/>
+          <w:sz w:val="19"/>
+        </w:rPr>
+        <w:t>Uber Technologies</w:t>
+      </w:r>
+      <w:r>
+        <w:rPr>
+          <w:rFonts w:ascii="Arial" w:hAnsi="Arial"/>
+          <w:b w:val="0"/>
+          <w:i w:val="0"/>
+          <w:sz w:val="19"/>
+        </w:rPr>
+        <w:t xml:space="preserve"> am 3. Juni 2026 die Stelle der Konzernpräsidentin neu besetzt (</w:t>
+      </w:r>
+      <w:r>
+        <w:rPr>
+          <w:rFonts w:ascii="Arial" w:hAnsi="Arial"/>
+          <w:b w:val="0"/>
+          <w:i/>
+          <w:sz w:val="19"/>
+        </w:rPr>
+        <w:t>Jill Hazelbaker</w:t>
+      </w:r>
+      <w:r>
+        <w:rPr>
+          <w:rFonts w:ascii="Arial" w:hAnsi="Arial"/>
+          <w:b w:val="0"/>
+          <w:i w:val="0"/>
+          <w:sz w:val="19"/>
+        </w:rPr>
+        <w:t xml:space="preserve">) und gleichzeitig angekündigt, rund 23 % der </w:t>
+      </w:r>
+      <w:r>
+        <w:rPr>
+          <w:rFonts w:ascii="Arial" w:hAnsi="Arial"/>
+          <w:b w:val="0"/>
+          <w:i/>
+          <w:sz w:val="19"/>
+        </w:rPr>
+        <w:t>People-and-Places</w:t>
+      </w:r>
+      <w:r>
+        <w:rPr>
+          <w:rFonts w:ascii="Arial" w:hAnsi="Arial"/>
+          <w:b w:val="0"/>
+          <w:i w:val="0"/>
+          <w:sz w:val="19"/>
+        </w:rPr>
+        <w:t xml:space="preserve">-Division (Human Resources, Recruiting, Facilities, Culture) zu streichen — bei rund 34.000 weltweit Beschäftigten weniger als ein Prozent der Konzernbelegschaft, aber unter dem expliziten Vorzeichen, die Restrukturierung sei „organisationsbezogen, nicht KI-getrieben"; </w:t>
+      </w:r>
+      <w:r>
+        <w:rPr>
+          <w:rFonts w:ascii="Arial" w:hAnsi="Arial"/>
+          <w:b w:val="0"/>
+          <w:i/>
+          <w:sz w:val="19"/>
+        </w:rPr>
+        <w:t>Hazelbaker</w:t>
+      </w:r>
+      <w:r>
+        <w:rPr>
+          <w:rFonts w:ascii="Arial" w:hAnsi="Arial"/>
+          <w:b w:val="0"/>
+          <w:i w:val="0"/>
+          <w:sz w:val="19"/>
+        </w:rPr>
+        <w:t xml:space="preserve"> begründete den Schritt mit „komplexen und fragmentierten" Strukturen, </w:t>
+      </w:r>
+      <w:r>
+        <w:rPr>
+          <w:rFonts w:ascii="Arial" w:hAnsi="Arial"/>
+          <w:b w:val="0"/>
+          <w:i/>
+          <w:sz w:val="19"/>
+        </w:rPr>
+        <w:t>CEO Dara Khosrowshahi</w:t>
+      </w:r>
+      <w:r>
+        <w:rPr>
+          <w:rFonts w:ascii="Arial" w:hAnsi="Arial"/>
+          <w:b w:val="0"/>
+          <w:i w:val="0"/>
+          <w:sz w:val="19"/>
+        </w:rPr>
+        <w:t xml:space="preserve"> mit der Notwendigkeit, „die Effektivität des People-Teams zu maximieren". Diese Selbstbeschreibung steht in Spannung zu der bereits im April 2026 vom Konzern-Chief-Technology-Officer berichteten Erschöpfung des konzernweiten KI-Coding-Tools-Budgets innerhalb von vier Monaten (begleitet von einer Soft-Cap-Regel von 1.500 US-Dollar pro Ingenieur und Monat) sowie zu der Aussage von Uber selbst, 95 % der Ingenieurinnen und Ingenieure nutzten KI-Werkzeuge monatlich, rund 70 % des Konzern-Codes werde KI-generiert; Forrester-Analyst </w:t>
+      </w:r>
+      <w:r>
+        <w:rPr>
+          <w:rFonts w:ascii="Arial" w:hAnsi="Arial"/>
+          <w:b w:val="0"/>
+          <w:i/>
+          <w:sz w:val="19"/>
+        </w:rPr>
+        <w:t>J. P. Gownder</w:t>
+      </w:r>
+      <w:r>
+        <w:rPr>
+          <w:rFonts w:ascii="Arial" w:hAnsi="Arial"/>
+          <w:b w:val="0"/>
+          <w:i w:val="0"/>
+          <w:sz w:val="19"/>
+        </w:rPr>
+        <w:t xml:space="preserve"> ordnete das Muster im Juni 2026 als </w:t>
+      </w:r>
+      <w:r>
+        <w:rPr>
+          <w:rFonts w:ascii="Arial" w:hAnsi="Arial"/>
+          <w:b w:val="0"/>
+          <w:i/>
+          <w:sz w:val="19"/>
+        </w:rPr>
+        <w:t>„AI washing"</w:t>
+      </w:r>
+      <w:r>
+        <w:rPr>
+          <w:rFonts w:ascii="Arial" w:hAnsi="Arial"/>
+          <w:b w:val="0"/>
+          <w:i w:val="0"/>
+          <w:sz w:val="19"/>
+        </w:rPr>
+        <w:t xml:space="preserve"> ein — die Aussage „nicht KI-getrieben" decke sich nicht zwingend mit der zugleich kommunizierten internen KI-Durchdringung. Die parallel fortgeschriebenen Tech-Layoff-Tracker (Aggregation Stand 5. Juni 2026: 149.935 betroffene Personen aus 363 Layoff-Ereignissen; rund 974 Stellen pro Tag; Tempo gegenüber 2025 um rund 44 % beschleunigt) verlängern damit die im Mai-Lauf dokumentierte Reihe (127.411 zum 8. Mai 2026 → 149.935 zum 5. Juni 2026) in den vierten Monatsschritt mit über 20.000 zusätzlich erfassten Betroffenen. Andererseits steht die Finanzierung der sozialen Sicherungssysteme — insbesondere der paritätisch über Löhne finanzierten Zweige Kranken-, Pflege-, Renten- und Arbeitslosenversicherung — vor strukturellen Herausforderungen durch den demografischen Wandel.</w:t>
       </w:r>
     </w:p>
     <w:p>
@@ -2278,6 +2458,299 @@
           <w:i w:val="0"/>
           <w:sz w:val="19"/>
         </w:rPr>
+        <w:t>Sanders' American AI Sovereign Wealth Fund Act (Juni 2026):</w:t>
+      </w:r>
+      <w:r>
+        <w:rPr>
+          <w:rFonts w:ascii="Arial" w:hAnsi="Arial"/>
+          <w:b w:val="0"/>
+          <w:i w:val="0"/>
+          <w:sz w:val="19"/>
+        </w:rPr>
+        <w:t xml:space="preserve"> Am 1. Juni 2026 hat Senator Bernie Sanders in einem Namensbeitrag in der </w:t>
+      </w:r>
+      <w:r>
+        <w:rPr>
+          <w:rFonts w:ascii="Arial" w:hAnsi="Arial"/>
+          <w:b w:val="0"/>
+          <w:i/>
+          <w:sz w:val="19"/>
+        </w:rPr>
+        <w:t>New York Times</w:t>
+      </w:r>
+      <w:r>
+        <w:rPr>
+          <w:rFonts w:ascii="Arial" w:hAnsi="Arial"/>
+          <w:b w:val="0"/>
+          <w:i w:val="0"/>
+          <w:sz w:val="19"/>
+        </w:rPr>
+        <w:t xml:space="preserve"> unter dem Titel </w:t>
+      </w:r>
+      <w:r>
+        <w:rPr>
+          <w:rFonts w:ascii="Arial" w:hAnsi="Arial"/>
+          <w:b w:val="0"/>
+          <w:i/>
+          <w:sz w:val="19"/>
+        </w:rPr>
+        <w:t>„The Public Should Own Half of the Big A.I. Companies"</w:t>
+      </w:r>
+      <w:r>
+        <w:rPr>
+          <w:rFonts w:ascii="Arial" w:hAnsi="Arial"/>
+          <w:b w:val="0"/>
+          <w:i w:val="0"/>
+          <w:sz w:val="19"/>
+        </w:rPr>
+        <w:t xml:space="preserve"> den Eckpunkt einer geplanten Gesetzgebung skizziert, mit der er die in der Sanders-Linie bislang offene Frage einer </w:t>
+      </w:r>
+      <w:r>
+        <w:rPr>
+          <w:rFonts w:ascii="Arial" w:hAnsi="Arial"/>
+          <w:b/>
+          <w:i w:val="0"/>
+          <w:sz w:val="19"/>
+        </w:rPr>
+        <w:t>fiskalisch-eigentumsrechtlichen</w:t>
+      </w:r>
+      <w:r>
+        <w:rPr>
+          <w:rFonts w:ascii="Arial" w:hAnsi="Arial"/>
+          <w:b w:val="0"/>
+          <w:i w:val="0"/>
+          <w:sz w:val="19"/>
+        </w:rPr>
+        <w:t xml:space="preserve"> Komponente schließen will. Der geplante </w:t>
+      </w:r>
+      <w:r>
+        <w:rPr>
+          <w:rFonts w:ascii="Arial" w:hAnsi="Arial"/>
+          <w:b w:val="0"/>
+          <w:i/>
+          <w:sz w:val="19"/>
+        </w:rPr>
+        <w:t>American A.I. Sovereign Wealth Fund Act</w:t>
+      </w:r>
+      <w:r>
+        <w:rPr>
+          <w:rFonts w:ascii="Arial" w:hAnsi="Arial"/>
+          <w:b w:val="0"/>
+          <w:i w:val="0"/>
+          <w:sz w:val="19"/>
+        </w:rPr>
+        <w:t xml:space="preserve"> sähe demnach eine einmalige Abgabe von 50 % der Aktien — nicht des Gewinns — der größten US-amerikanischen KI-Unternehmen — namentlich genannt: OpenAI, Anthropic, xAI — vor; diese Anteile würden in einen neu zu errichtenden US-amerikanischen Staatsfonds eingebracht, der Stimmrechte und gleichberechtigte Vorstandsvertretung erhielte und dessen Erträge in Form von Direktzahlungen sowie zur Finanzierung von Gesundheit, Bildung und Wohnen verwendet werden sollten. Sanders verweist darauf, dass „weitere Details — einschließlich der konkreten Verwendung der Mittel und der Umsetzungsmechanik — in der in den kommenden Wochen vorzulegenden Gesetzesinitiative" enthalten sein würden; eine offizielle Bill-Nummer liegt zum Recherchezeitpunkt nicht vor. Inhaltlich verlängert das Vorhaben den OpenAI-</w:t>
+      </w:r>
+      <w:r>
+        <w:rPr>
+          <w:rFonts w:ascii="Arial" w:hAnsi="Arial"/>
+          <w:b w:val="0"/>
+          <w:i/>
+          <w:sz w:val="19"/>
+        </w:rPr>
+        <w:t>Public-Wealth-Fund</w:t>
+      </w:r>
+      <w:r>
+        <w:rPr>
+          <w:rFonts w:ascii="Arial" w:hAnsi="Arial"/>
+          <w:b w:val="0"/>
+          <w:i w:val="0"/>
+          <w:sz w:val="19"/>
+        </w:rPr>
+        <w:t xml:space="preserve">-Vorschlag (siehe unten) und den von Anthropic-CEO Dario Amodei wiederholt befürworteten KI-Staatsfondsgedanken um eine staatlich erzwungene Eigentumsumverteilung; Senatorin </w:t>
+      </w:r>
+      <w:r>
+        <w:rPr>
+          <w:rFonts w:ascii="Arial" w:hAnsi="Arial"/>
+          <w:b w:val="0"/>
+          <w:i/>
+          <w:sz w:val="19"/>
+        </w:rPr>
+        <w:t>Elizabeth Warren</w:t>
+      </w:r>
+      <w:r>
+        <w:rPr>
+          <w:rFonts w:ascii="Arial" w:hAnsi="Arial"/>
+          <w:b w:val="0"/>
+          <w:i w:val="0"/>
+          <w:sz w:val="19"/>
+        </w:rPr>
+        <w:t xml:space="preserve"> hat wenige Tage zuvor in der </w:t>
+      </w:r>
+      <w:r>
+        <w:rPr>
+          <w:rFonts w:ascii="Arial" w:hAnsi="Arial"/>
+          <w:b w:val="0"/>
+          <w:i/>
+          <w:sz w:val="19"/>
+        </w:rPr>
+        <w:t>Time</w:t>
+      </w:r>
+      <w:r>
+        <w:rPr>
+          <w:rFonts w:ascii="Arial" w:hAnsi="Arial"/>
+          <w:b w:val="0"/>
+          <w:i w:val="0"/>
+          <w:sz w:val="19"/>
+        </w:rPr>
+        <w:t xml:space="preserve"> einen funktional verwandten Vorschlag publiziert. Bemerkenswert ist das politische Konvergenzsignal aus der Exekutive: </w:t>
+      </w:r>
+      <w:r>
+        <w:rPr>
+          <w:rFonts w:ascii="Arial" w:hAnsi="Arial"/>
+          <w:b w:val="0"/>
+          <w:i/>
+          <w:sz w:val="19"/>
+        </w:rPr>
+        <w:t>Präsident Donald Trump</w:t>
+      </w:r>
+      <w:r>
+        <w:rPr>
+          <w:rFonts w:ascii="Arial" w:hAnsi="Arial"/>
+          <w:b w:val="0"/>
+          <w:i w:val="0"/>
+          <w:sz w:val="19"/>
+        </w:rPr>
+        <w:t xml:space="preserve"> erklärte am 5. Juni 2026 gegenüber Reportern, die US-Bundesregierung könne direkte Eigentumsanteile an OpenAI, Anthropic und xAI „im Rahmen einer Partnerschaft an dieser Revolution" erwerben — eine Aussage, die </w:t>
+      </w:r>
+      <w:r>
+        <w:rPr>
+          <w:rFonts w:ascii="Arial" w:hAnsi="Arial"/>
+          <w:b w:val="0"/>
+          <w:i/>
+          <w:sz w:val="19"/>
+        </w:rPr>
+        <w:t>CNBC</w:t>
+      </w:r>
+      <w:r>
+        <w:rPr>
+          <w:rFonts w:ascii="Arial" w:hAnsi="Arial"/>
+          <w:b w:val="0"/>
+          <w:i w:val="0"/>
+          <w:sz w:val="19"/>
+        </w:rPr>
+        <w:t xml:space="preserve"> am selben Tag und </w:t>
+      </w:r>
+      <w:r>
+        <w:rPr>
+          <w:rFonts w:ascii="Arial" w:hAnsi="Arial"/>
+          <w:b w:val="0"/>
+          <w:i/>
+          <w:sz w:val="19"/>
+        </w:rPr>
+        <w:t>Fortune</w:t>
+      </w:r>
+      <w:r>
+        <w:rPr>
+          <w:rFonts w:ascii="Arial" w:hAnsi="Arial"/>
+          <w:b w:val="0"/>
+          <w:i w:val="0"/>
+          <w:sz w:val="19"/>
+        </w:rPr>
+        <w:t xml:space="preserve"> am 3. und 5. Juni 2026 als parteienübergreifendes Konvergenzsignal in Richtung eines KI-Souveränitätsfonds einordneten; vorgelagert hatten </w:t>
+      </w:r>
+      <w:r>
+        <w:rPr>
+          <w:rFonts w:ascii="Arial" w:hAnsi="Arial"/>
+          <w:b w:val="0"/>
+          <w:i/>
+          <w:sz w:val="19"/>
+        </w:rPr>
+        <w:t>Treasury Secretary Scott Bessent</w:t>
+      </w:r>
+      <w:r>
+        <w:rPr>
+          <w:rFonts w:ascii="Arial" w:hAnsi="Arial"/>
+          <w:b w:val="0"/>
+          <w:i w:val="0"/>
+          <w:sz w:val="19"/>
+        </w:rPr>
+        <w:t xml:space="preserve"> und </w:t>
+      </w:r>
+      <w:r>
+        <w:rPr>
+          <w:rFonts w:ascii="Arial" w:hAnsi="Arial"/>
+          <w:b w:val="0"/>
+          <w:i/>
+          <w:sz w:val="19"/>
+        </w:rPr>
+        <w:t>Commerce Secretary Howard Lutnick</w:t>
+      </w:r>
+      <w:r>
+        <w:rPr>
+          <w:rFonts w:ascii="Arial" w:hAnsi="Arial"/>
+          <w:b w:val="0"/>
+          <w:i w:val="0"/>
+          <w:sz w:val="19"/>
+        </w:rPr>
+        <w:t xml:space="preserve"> dem Weißen Haus bereits einen Vorentwurf eines allgemeinen US-Staatsfonds vorgelegt, dessen Mechanik intern weiter umstritten ist. </w:t>
+      </w:r>
+      <w:r>
+        <w:rPr>
+          <w:rFonts w:ascii="Arial" w:hAnsi="Arial"/>
+          <w:b w:val="0"/>
+          <w:i/>
+          <w:sz w:val="19"/>
+        </w:rPr>
+        <w:t>Sam Altman</w:t>
+      </w:r>
+      <w:r>
+        <w:rPr>
+          <w:rFonts w:ascii="Arial" w:hAnsi="Arial"/>
+          <w:b w:val="0"/>
+          <w:i w:val="0"/>
+          <w:sz w:val="19"/>
+        </w:rPr>
+        <w:t xml:space="preserve"> und </w:t>
+      </w:r>
+      <w:r>
+        <w:rPr>
+          <w:rFonts w:ascii="Arial" w:hAnsi="Arial"/>
+          <w:b w:val="0"/>
+          <w:i/>
+          <w:sz w:val="19"/>
+        </w:rPr>
+        <w:t>Bernie Sanders</w:t>
+      </w:r>
+      <w:r>
+        <w:rPr>
+          <w:rFonts w:ascii="Arial" w:hAnsi="Arial"/>
+          <w:b w:val="0"/>
+          <w:i w:val="0"/>
+          <w:sz w:val="19"/>
+        </w:rPr>
+        <w:t xml:space="preserve"> haben sich am 3. Juni 2026 zu einem direkten Gespräch über den Mechanismus getroffen. Für die in Kapitel 8 entwickelte Deutschland-These ist der Vorgang doppelt einschlägig: Erstens markiert er den Übergang vom </w:t>
+      </w:r>
+      <w:r>
+        <w:rPr>
+          <w:rFonts w:ascii="Arial" w:hAnsi="Arial"/>
+          <w:b w:val="0"/>
+          <w:i/>
+          <w:sz w:val="19"/>
+        </w:rPr>
+        <w:t>Public Wealth Fund</w:t>
+      </w:r>
+      <w:r>
+        <w:rPr>
+          <w:rFonts w:ascii="Arial" w:hAnsi="Arial"/>
+          <w:b w:val="0"/>
+          <w:i w:val="0"/>
+          <w:sz w:val="19"/>
+        </w:rPr>
+        <w:t xml:space="preserve"> als rhetorischer Figur (OpenAI April 2026) zu einer kongressreif formulierten Gesetzesankündigung, zweitens verschiebt er die Anknüpfung von einer steuerlichen (Sanders-Report 2025: Verbrauchsteuer auf automatisierende Technologie) zu einer eigentumsrechtlichen Logik (Anteils-Veräußerungspflicht), die für den deutschen Kontext über Art. 14 GG (Eigentumsgarantie) und Art. 15 GG (Sozialisierung) verfassungsrechtliche Vorfragen aufwirft, die § 4.3 systematisch verortet. Die Annahmewahrscheinlichkeit bleibt — wie bei den vorherigen Sanders-Entwürfen — in einem republikanisch geführten Kongress gering; das parallele Trump-Konvergenzsignal vom 5. Juni 2026 verschiebt die Wahrscheinlichkeitseinschätzung jedoch erstmals von „nahezu null" auf „nicht auszuschließen" — eine bemerkenswerte Verschiebung gegenüber dem Stand der Vor-Lauf-Berichterstattung.</w:t>
+      </w:r>
+    </w:p>
+    <w:p>
+      <w:pPr>
+        <w:jc w:val="both"/>
+      </w:pPr>
+      <w:r>
+        <w:rPr>
+          <w:rFonts w:ascii="Arial" w:hAnsi="Arial"/>
+          <w:b/>
+          <w:i w:val="0"/>
+          <w:sz w:val="19"/>
+        </w:rPr>
         <w:t>Sub-föderale Parallele — Maine (April 2026):</w:t>
       </w:r>
       <w:r>
@@ -3732,7 +4205,43 @@
           <w:i w:val="0"/>
           <w:sz w:val="19"/>
         </w:rPr>
-        <w:t>Praktisch erfordert dies entweder eine Pflichtbeteiligung des Staates an KI-Unternehmen (politisch hoch problematisch) oder eine zweckgebundene Steuer auf Kapitalerträge und Unternehmensgewinne, deren Aufkommen in einen solchen Fonds fließt.</w:t>
+        <w:t xml:space="preserve">Praktisch erfordert dies entweder eine Pflichtbeteiligung des Staates an KI-Unternehmen (politisch hoch problematisch) oder eine zweckgebundene Steuer auf Kapitalerträge und Unternehmensgewinne, deren Aufkommen in einen solchen Fonds fließt. Mit der von US-Senator Bernie Sanders am 1. Juni 2026 in der </w:t>
+      </w:r>
+      <w:r>
+        <w:rPr>
+          <w:rFonts w:ascii="Arial" w:hAnsi="Arial"/>
+          <w:b w:val="0"/>
+          <w:i/>
+          <w:sz w:val="19"/>
+        </w:rPr>
+        <w:t>New York Times</w:t>
+      </w:r>
+      <w:r>
+        <w:rPr>
+          <w:rFonts w:ascii="Arial" w:hAnsi="Arial"/>
+          <w:b w:val="0"/>
+          <w:i w:val="0"/>
+          <w:sz w:val="19"/>
+        </w:rPr>
+        <w:t xml:space="preserve"> angekündigten </w:t>
+      </w:r>
+      <w:r>
+        <w:rPr>
+          <w:rFonts w:ascii="Arial" w:hAnsi="Arial"/>
+          <w:b w:val="0"/>
+          <w:i/>
+          <w:sz w:val="19"/>
+        </w:rPr>
+        <w:t>American A.I. Sovereign Wealth Fund Act</w:t>
+      </w:r>
+      <w:r>
+        <w:rPr>
+          <w:rFonts w:ascii="Arial" w:hAnsi="Arial"/>
+          <w:b w:val="0"/>
+          <w:i w:val="0"/>
+          <w:sz w:val="19"/>
+        </w:rPr>
+        <w:t>-Initiative — einmalige Anteilsabgabe von 50 % an OpenAI, Anthropic und xAI in einen US-Staatsfonds (vgl. § 4.5) — würde der erste Pfad erstmals in eine kongressreif vorbereitete Gesetzesfigur überführt; das Vorhaben verschiebt damit den Diskussionspunkt von der „politischen Unmöglichkeit" auf die Frage nach der verfassungsrechtlichen Tragfähigkeit, die im deutschen Kontext über Art. 14 GG und Art. 15 GG (Sozialisierung) zu beurteilen wäre.</w:t>
       </w:r>
     </w:p>
     <w:p>
@@ -5088,7 +5597,25 @@
           <w:i w:val="0"/>
           <w:sz w:val="19"/>
         </w:rPr>
-        <w:t>Keiner dieser Pfade ist für sich allein hinreichend; ihre Kombination macht den Teilhabefonds fiskalisch tragfähig, ohne die problematische Eigentums-/Verstaatlichungslogik zu bemühen.</w:t>
+        <w:t xml:space="preserve">Keiner dieser Pfade ist für sich allein hinreichend; ihre Kombination macht den Teilhabefonds fiskalisch tragfähig, ohne die problematische Eigentums-/Verstaatlichungslogik zu bemühen, die mit der am 1. Juni 2026 angekündigten </w:t>
+      </w:r>
+      <w:r>
+        <w:rPr>
+          <w:rFonts w:ascii="Arial" w:hAnsi="Arial"/>
+          <w:b w:val="0"/>
+          <w:i/>
+          <w:sz w:val="19"/>
+        </w:rPr>
+        <w:t>American A.I. Sovereign Wealth Fund Act</w:t>
+      </w:r>
+      <w:r>
+        <w:rPr>
+          <w:rFonts w:ascii="Arial" w:hAnsi="Arial"/>
+          <w:b w:val="0"/>
+          <w:i w:val="0"/>
+          <w:sz w:val="19"/>
+        </w:rPr>
+        <w:t>-Initiative (Sanders; vgl. § 4.5 und § 5.4) erstmals einen kongressreif formulierten Gegenpol erhalten hat: Der US-Vorstoß setzt nicht auf fiskalische Abschöpfung, sondern auf eine einmalige Anteilsabgabe von 50 % an OpenAI, Anthropic und xAI an einen US-Staatsfonds; das parallele Konvergenzsignal aus der Trump-Administration vom 5. Juni 2026 (US-Bundesregierung erwägt direkte Eigentumsanteile) verschiebt die Wahrscheinlichkeit einer solchen Eigentumslogik in den USA von „nahezu null" auf „nicht auszuschließen". Für die hier vertretene deutsche Position bleibt der mittelbare, abschöpfungsbasierte Pfad konzeptionell überlegen, weil er Art. 14 GG und Art. 15 GG (Sozialisierung) nicht in Anspruch nehmen muss; die US-Debatte liefert aber einen wertvollen Vergleichsmaßstab dafür, an welcher Stelle sich die Eigentums- und die Abschöpfungslogik auseinanderdividieren.</w:t>
       </w:r>
     </w:p>
     <w:p>
@@ -8956,6 +9483,124 @@
           <w:i w:val="0"/>
           <w:sz w:val="19"/>
         </w:rPr>
+        <w:t xml:space="preserve">Sanders, B. (1. Juni 2026). </w:t>
+      </w:r>
+      <w:r>
+        <w:rPr>
+          <w:rFonts w:ascii="Arial" w:hAnsi="Arial"/>
+          <w:b w:val="0"/>
+          <w:i/>
+          <w:sz w:val="19"/>
+        </w:rPr>
+        <w:t>The Public Should Own Half of the Big A.I. Companies.</w:t>
+      </w:r>
+      <w:r>
+        <w:rPr>
+          <w:rFonts w:ascii="Arial" w:hAnsi="Arial"/>
+          <w:b w:val="0"/>
+          <w:i w:val="0"/>
+          <w:sz w:val="19"/>
+        </w:rPr>
+        <w:t xml:space="preserve"> Namensbeitrag, </w:t>
+      </w:r>
+      <w:r>
+        <w:rPr>
+          <w:rFonts w:ascii="Arial" w:hAnsi="Arial"/>
+          <w:b w:val="0"/>
+          <w:i/>
+          <w:sz w:val="19"/>
+        </w:rPr>
+        <w:t>The New York Times</w:t>
+      </w:r>
+      <w:r>
+        <w:rPr>
+          <w:rFonts w:ascii="Arial" w:hAnsi="Arial"/>
+          <w:b w:val="0"/>
+          <w:i w:val="0"/>
+          <w:sz w:val="19"/>
+        </w:rPr>
+        <w:t xml:space="preserve"> / </w:t>
+      </w:r>
+      <w:r>
+        <w:rPr>
+          <w:rFonts w:ascii="Arial" w:hAnsi="Arial"/>
+          <w:b w:val="0"/>
+          <w:i/>
+          <w:sz w:val="19"/>
+        </w:rPr>
+        <w:t>Sanders.senate.gov</w:t>
+      </w:r>
+      <w:r>
+        <w:rPr>
+          <w:rFonts w:ascii="Arial" w:hAnsi="Arial"/>
+          <w:b w:val="0"/>
+          <w:i w:val="0"/>
+          <w:sz w:val="19"/>
+        </w:rPr>
+        <w:t xml:space="preserve"> (Op-Eds). Ankündigung des </w:t>
+      </w:r>
+      <w:r>
+        <w:rPr>
+          <w:rFonts w:ascii="Arial" w:hAnsi="Arial"/>
+          <w:b w:val="0"/>
+          <w:i/>
+          <w:sz w:val="19"/>
+        </w:rPr>
+        <w:t>American A.I. Sovereign Wealth Fund Act</w:t>
+      </w:r>
+      <w:r>
+        <w:rPr>
+          <w:rFonts w:ascii="Arial" w:hAnsi="Arial"/>
+          <w:b w:val="0"/>
+          <w:i w:val="0"/>
+          <w:sz w:val="19"/>
+        </w:rPr>
+        <w:t>: einmalige Abgabe von 50 % der Aktien (nicht des Gewinns) von OpenAI, Anthropic, xAI und weiteren KI-Großunternehmen in einen US-Staatsfonds mit Stimmrechten, gleichberechtigter Vorstandsvertretung und Verwendung für Direktzahlungen sowie Gesundheit, Bildung und Wohnen; Details und Bill-Nummer „in den kommenden Wochen". https://www.sanders.senate.gov/op-eds/the-public-should-own-half-of-the-big-a-i-companies/</w:t>
+      </w:r>
+    </w:p>
+    <w:p>
+      <w:pPr>
+        <w:jc w:val="both"/>
+      </w:pPr>
+      <w:r>
+        <w:rPr>
+          <w:rFonts w:ascii="Arial" w:hAnsi="Arial"/>
+          <w:b w:val="0"/>
+          <w:i w:val="0"/>
+          <w:sz w:val="19"/>
+        </w:rPr>
+        <w:t xml:space="preserve">The White House / CNBC / Fortune. (3.–5. Juni 2026). </w:t>
+      </w:r>
+      <w:r>
+        <w:rPr>
+          <w:rFonts w:ascii="Arial" w:hAnsi="Arial"/>
+          <w:b w:val="0"/>
+          <w:i/>
+          <w:sz w:val="19"/>
+        </w:rPr>
+        <w:t>Trump administration, OpenAI discussing possible government stake in the AI startup / Trump partnership with OpenAI, Anthropic, xAI / Bernie Sanders wants Americans to own a piece of AI. The Trump White House seems to agree.</w:t>
+      </w:r>
+      <w:r>
+        <w:rPr>
+          <w:rFonts w:ascii="Arial" w:hAnsi="Arial"/>
+          <w:b w:val="0"/>
+          <w:i w:val="0"/>
+          <w:sz w:val="19"/>
+        </w:rPr>
+        <w:t xml:space="preserve"> Berichterstattung zur Aussage von Präsident Donald Trump (5. Juni 2026) über direkte US-Eigentumsanteile an OpenAI, Anthropic und xAI sowie zum Vorentwurf eines allgemeinen US-Staatsfonds durch Treasury Secretary Scott Bessent und Commerce Secretary Howard Lutnick; Bezug zum Sanders-Altman-Gespräch am 3. Juni 2026. https://www.cnbc.com/2026/06/05/trump-open-ai-altman-stake.html | https://fortune.com/2026/06/03/bernie-sanders-ai-ownership-sovereign-wealth-fund-electrification/ | https://fortune.com/2026/06/05/trump-partnership-openai-anthropic-xai-nationalization-bernie-sanders-altman/</w:t>
+      </w:r>
+    </w:p>
+    <w:p>
+      <w:pPr>
+        <w:jc w:val="both"/>
+      </w:pPr>
+      <w:r>
+        <w:rPr>
+          <w:rFonts w:ascii="Arial" w:hAnsi="Arial"/>
+          <w:b w:val="0"/>
+          <w:i w:val="0"/>
+          <w:sz w:val="19"/>
+        </w:rPr>
         <w:t>Springer Gabler Verlag. Gabler Wirtschaftslexikon, Stichwort: Robotersteuer.</w:t>
       </w:r>
     </w:p>
@@ -10507,6 +11152,220 @@
           <w:i w:val="0"/>
           <w:sz w:val="19"/>
         </w:rPr>
+        <w:t xml:space="preserve">Challenger, Gray &amp; Christmas / CNBC / Tom's Hardware / Yahoo Finance / Quartz / Human Resources Director. (5. Juni 2026). </w:t>
+      </w:r>
+      <w:r>
+        <w:rPr>
+          <w:rFonts w:ascii="Arial" w:hAnsi="Arial"/>
+          <w:b w:val="0"/>
+          <w:i/>
+          <w:sz w:val="19"/>
+        </w:rPr>
+        <w:t>Challenger Report: May Job Cuts Rise 16 % from April; Highest May Total Since 2020 / „AI is now the leading reason companies give for cutting jobs," says new report / US tech layoffs record single-highest month in two years / AI Has Cut More US Jobs in 2026 Than in All of 2025 Already / U.S. tech sector hits two-year high for job cuts in May 2026 / AI-driven tech job cuts hit two-year high.</w:t>
+      </w:r>
+      <w:r>
+        <w:rPr>
+          <w:rFonts w:ascii="Arial" w:hAnsi="Arial"/>
+          <w:b w:val="0"/>
+          <w:i w:val="0"/>
+          <w:sz w:val="19"/>
+        </w:rPr>
+        <w:t xml:space="preserve"> Mai-2026-Aggregat: Gesamt 97.006 (+16 % gegenüber April, höchster Mai-Wert seit Pandemie-Mai 2020); KI-bezogen 38.579 (40 % der Mai-Streichungen, höchster Monatswert seit Tracking-Beginn 2023; Januar 2026: 7 %; März: 25 %; April: 26 %); YTD-Gesamt 397.755, KI-bezogen YTD 87.714 (22 %, übersteigt 54.836 für 2025 vor Jahresmitte); Tech-Branche Mai 38.242 (höchster Wert seit August 2024), YTD 123.653 (+66 % gegenüber Vorjahresstand); Aussage </w:t>
+      </w:r>
+      <w:r>
+        <w:rPr>
+          <w:rFonts w:ascii="Arial" w:hAnsi="Arial"/>
+          <w:b w:val="0"/>
+          <w:i/>
+          <w:sz w:val="19"/>
+        </w:rPr>
+        <w:t>Andy Challenger</w:t>
+      </w:r>
+      <w:r>
+        <w:rPr>
+          <w:rFonts w:ascii="Arial" w:hAnsi="Arial"/>
+          <w:b w:val="0"/>
+          <w:i w:val="0"/>
+          <w:sz w:val="19"/>
+        </w:rPr>
+        <w:t xml:space="preserve"> (CRO). https://www.challengergray.com/blog/challenger-report-may-job-cuts-rise-16-from-april-highest-may-total-since-2020/ | https://www.cnbc.com/2026/06/05/ai-is-now-the-leading-reason-companies-give-for-cutting-jobs-says-new-report-what-that-means-for-workers.html | https://www.tomshardware.com/tech-industry/artificial-intelligence/tech-sector-cut-us-jobs-by-38242-in-may | https://finance.yahoo.com/economy/articles/ai-cut-more-us-jobs-082155018.html | https://qz.com/tech-job-cuts-ai-layoffs-may-2026-060526 | https://www.hcamag.com/us/specialization/recruitment/ai-driven-tech-job-cuts-hit-two-year-high-leaving-hr-leaders-to-adapt/577778</w:t>
+      </w:r>
+    </w:p>
+    <w:p>
+      <w:pPr>
+        <w:jc w:val="both"/>
+      </w:pPr>
+      <w:r>
+        <w:rPr>
+          <w:rFonts w:ascii="Arial" w:hAnsi="Arial"/>
+          <w:b w:val="0"/>
+          <w:i w:val="0"/>
+          <w:sz w:val="19"/>
+        </w:rPr>
+        <w:t xml:space="preserve">CNBC / TechTimes / NewsX / Layoffhedge. (3.–5. Juni 2026). </w:t>
+      </w:r>
+      <w:r>
+        <w:rPr>
+          <w:rFonts w:ascii="Arial" w:hAnsi="Arial"/>
+          <w:b w:val="0"/>
+          <w:i/>
+          <w:sz w:val="19"/>
+        </w:rPr>
+        <w:t>Uber layoffs: People division cut by nearly a quarter / Uber Cuts 23 % of HR Staff: New President Denies AI Role as 95 % of Engineers Use It Daily / Mass Layoffs At Uber: Here's Why New President Cut 23 % Of HR Team And Denies Any AI Role / Uber Layoffs 2026 — 23 % of People Division Cut.</w:t>
+      </w:r>
+      <w:r>
+        <w:rPr>
+          <w:rFonts w:ascii="Arial" w:hAnsi="Arial"/>
+          <w:b w:val="0"/>
+          <w:i w:val="0"/>
+          <w:sz w:val="19"/>
+        </w:rPr>
+        <w:t xml:space="preserve"> Personalreduktion in der </w:t>
+      </w:r>
+      <w:r>
+        <w:rPr>
+          <w:rFonts w:ascii="Arial" w:hAnsi="Arial"/>
+          <w:b w:val="0"/>
+          <w:i/>
+          <w:sz w:val="19"/>
+        </w:rPr>
+        <w:t>People-and-Places</w:t>
+      </w:r>
+      <w:r>
+        <w:rPr>
+          <w:rFonts w:ascii="Arial" w:hAnsi="Arial"/>
+          <w:b w:val="0"/>
+          <w:i w:val="0"/>
+          <w:sz w:val="19"/>
+        </w:rPr>
+        <w:t>-Division am 3. Juni 2026 (Human Resources, Recruiting, Facilities, Culture); 23 % der Division, weniger als 1 % der rund 34.000 Konzernbeschäftigten; offizielle Aussage Khosrowshahi / Hazelbaker: „nicht KI-getrieben"; Forrester-Analyst J. P. Gownder ordnet als „AI washing" ein; Kontext: 95 % der Ingenieure nutzen KI-Tools monatlich, rund 70 % des Konzern-Codes KI-generiert, AI-Coding-Tools-Budget bereits im April 2026 ausgeschöpft (1.500-USD-Soft-Cap pro Ingenieur). https://www.cnbc.com/2026/06/03/uber-layoffs-people-division-ai.html | https://www.techtimes.com/articles/317842/20260605/uber-cuts-23-hr-staff-new-president-denies-ai-role-95-engineers-use-it-daily.htm | https://www.newsx.com/tech-and-auto/mass-layoffs-at-uber-heres-why-new-president-cut-23-of-hr-team-and-denies-any-ai-role-230048/ | https://layoffhedge.com/company/uber</w:t>
+      </w:r>
+    </w:p>
+    <w:p>
+      <w:pPr>
+        <w:jc w:val="both"/>
+      </w:pPr>
+      <w:r>
+        <w:rPr>
+          <w:rFonts w:ascii="Arial" w:hAnsi="Arial"/>
+          <w:b w:val="0"/>
+          <w:i w:val="0"/>
+          <w:sz w:val="19"/>
+        </w:rPr>
+        <w:t xml:space="preserve">TechTimes / TrueUp / SkillSyncer. (Stand 5. Juni 2026). </w:t>
+      </w:r>
+      <w:r>
+        <w:rPr>
+          <w:rFonts w:ascii="Arial" w:hAnsi="Arial"/>
+          <w:b w:val="0"/>
+          <w:i/>
+          <w:sz w:val="19"/>
+        </w:rPr>
+        <w:t>Tech Layoffs 2026 Hit 149,935: Uber Cuts HR Days After AI Drained Its Coding Budget.</w:t>
+      </w:r>
+      <w:r>
+        <w:rPr>
+          <w:rFonts w:ascii="Arial" w:hAnsi="Arial"/>
+          <w:b w:val="0"/>
+          <w:i w:val="0"/>
+          <w:sz w:val="19"/>
+        </w:rPr>
+        <w:t xml:space="preserve"> Aggregat-Tagesstand: 149.935 betroffene Personen aus 363 Layoff-Ereignissen, rund 974 Stellen pro Tag, 2026-Tempo gegenüber 2025 um rund 44 % beschleunigt; Verlängerung der Tracker-Reihe 127.411 (8. Mai) → 149.935 (5. Juni) im vierten Monatsschritt. https://www.techtimes.com/articles/317848/20260605/tech-layoffs-2026-hit-149935-uber-cuts-hr-days-after-ai-drained-its-coding-budget.htm | https://www.trueup.io/layoffs | https://skillsyncer.com/layoffs-tracker</w:t>
+      </w:r>
+    </w:p>
+    <w:p>
+      <w:pPr>
+        <w:jc w:val="both"/>
+      </w:pPr>
+      <w:r>
+        <w:rPr>
+          <w:rFonts w:ascii="Arial" w:hAnsi="Arial"/>
+          <w:b w:val="0"/>
+          <w:i w:val="0"/>
+          <w:sz w:val="19"/>
+        </w:rPr>
+        <w:t xml:space="preserve">Fortune / Common Dreams / Newsweek / The Hill / Yahoo Finance. (1.–5. Juni 2026). </w:t>
+      </w:r>
+      <w:r>
+        <w:rPr>
+          <w:rFonts w:ascii="Arial" w:hAnsi="Arial"/>
+          <w:b w:val="0"/>
+          <w:i/>
+          <w:sz w:val="19"/>
+        </w:rPr>
+        <w:t>Bernie Sanders Wants Americans To Own 50 % Of OpenAI, xAI And Anthropic In Sweeping New Bill / Sanders Sovereign Wealth Fund Plan Would Give US Public 'Direct Ownership Stake' in AI Giants / Millions Would Get 'Direct Payments' Under Bernie Sanders' Proposed AI Sovereign Wealth Fund / Sanders to propose bill allowing for 50 % public stake in AI companies / Bernie Sanders Announces Plan to Seize Half of AI Industry for the Public Good.</w:t>
+      </w:r>
+      <w:r>
+        <w:rPr>
+          <w:rFonts w:ascii="Arial" w:hAnsi="Arial"/>
+          <w:b w:val="0"/>
+          <w:i w:val="0"/>
+          <w:sz w:val="19"/>
+        </w:rPr>
+        <w:t xml:space="preserve"> Sammelberichterstattung zum </w:t>
+      </w:r>
+      <w:r>
+        <w:rPr>
+          <w:rFonts w:ascii="Arial" w:hAnsi="Arial"/>
+          <w:b w:val="0"/>
+          <w:i/>
+          <w:sz w:val="19"/>
+        </w:rPr>
+        <w:t>American A.I. Sovereign Wealth Fund Act</w:t>
+      </w:r>
+      <w:r>
+        <w:rPr>
+          <w:rFonts w:ascii="Arial" w:hAnsi="Arial"/>
+          <w:b w:val="0"/>
+          <w:i w:val="0"/>
+          <w:sz w:val="19"/>
+        </w:rPr>
+        <w:t>: einmalige Anteilsabgabe von 50 % an OpenAI, Anthropic, xAI; Direktzahlungen sowie Gesundheit/Bildung/Wohnen; Sanders-Altman-Gespräch am 3. Juni 2026; Bessent-Lutnick-Vorentwurf eines allgemeinen US-Staatsfonds; parteienübergreifendes Konvergenzsignal mit der Trump-Aussage vom 5. Juni 2026. https://www.benzinga.com/markets/tech/26/06/52932722/bernie-sanders-wants-americans-to-own-50-of-openai-xai-and-anthropic-in-sweeping-new-bill-heres-what-that-means | https://www.commondreams.org/news/bernies-sanders-ai-sovereign-wealth-fund | https://www.newsweek.com/direct-payments-ai-sovereign-wealth-fund-bernie-sanders-12021907 | https://thehill.com/policy/technology/5906140-sanders-ai-ownership-wealth/ | https://finance.yahoo.com/economy/policy/articles/bernie-sanders-announces-plan-seize-180301711.html</w:t>
+      </w:r>
+    </w:p>
+    <w:p>
+      <w:pPr>
+        <w:jc w:val="both"/>
+      </w:pPr>
+      <w:r>
+        <w:rPr>
+          <w:rFonts w:ascii="Arial" w:hAnsi="Arial"/>
+          <w:b w:val="0"/>
+          <w:i w:val="0"/>
+          <w:sz w:val="19"/>
+        </w:rPr>
+        <w:t xml:space="preserve">Washington Post / Reason. (2./3. Juni 2026). </w:t>
+      </w:r>
+      <w:r>
+        <w:rPr>
+          <w:rFonts w:ascii="Arial" w:hAnsi="Arial"/>
+          <w:b w:val="0"/>
+          <w:i/>
+          <w:sz w:val="19"/>
+        </w:rPr>
+        <w:t>Opinion: Bernie Sanders wants a government stake in AI companies / Bernie Sanders' AI wealth fund bill shows that he doesn't understand AI or wealth.</w:t>
+      </w:r>
+      <w:r>
+        <w:rPr>
+          <w:rFonts w:ascii="Arial" w:hAnsi="Arial"/>
+          <w:b w:val="0"/>
+          <w:i w:val="0"/>
+          <w:sz w:val="19"/>
+        </w:rPr>
+        <w:t xml:space="preserve"> Mainstream-Kommentierung zur Sanders-Initiative; Reason kritisiert eigentumsrechtliche Schräglage und Bewertungsannahme, Washington Post relativiert die ideologische Lesart unter Hinweis auf den parallelen Trump-Vorstoß. https://www.washingtonpost.com/opinions/2026/06/03/bernie-sanders-wants-government-stake-ai-companies/ | https://reason.com/2026/06/02/bernie-sanders-ai-wealth-fund-bill-shows-that-he-doesnt-understand-ai-or-wealth/</w:t>
+      </w:r>
+    </w:p>
+    <w:p>
+      <w:pPr>
+        <w:jc w:val="both"/>
+      </w:pPr>
+      <w:r>
+        <w:rPr>
+          <w:rFonts w:ascii="Arial" w:hAnsi="Arial"/>
+          <w:b w:val="0"/>
+          <w:i w:val="0"/>
+          <w:sz w:val="19"/>
+        </w:rPr>
         <w:t xml:space="preserve">Bloomberg Editorial Board. (29. April 2026). </w:t>
       </w:r>
       <w:r>
@@ -10566,7 +11425,174 @@
           <w:i w:val="0"/>
           <w:sz w:val="19"/>
         </w:rPr>
-        <w:t xml:space="preserve"> Dieses Arbeitspapier gibt den Stand Anfang Mai 2026 (Schnitt am 8. Mai 2026 — Lauf 001 vom 8. Mai 2026) wieder. Die Debatte entwickelt sich dynamisch, insbesondere im Zuge der OpenAI-Strategiepapiere und der Eröffnung des OpenAI Workshop in Washington, D.C. im Mai 2026, des Erstdurchgangs des GKV-Beitragssatzstabilisierungsgesetzes in der 1065. Bundesratssitzung am 8. Mai 2026 mit 79 Tagesordnungspunkten (Kabinettsbeschluss 29. April 2026, parlamentarische Behandlung vor der Sommerpause 2026 angekündigt), der laufenden Trilog-Verhandlungen zum Digital Omnibus on AI (zweite Runde 28. April 2026 ohne Einigung; nächste Runde 13. Mai 2026 — Knackpunkt ist nicht die Verschiebung der Hochrisiko-Pflichten, sondern die Konformitätsbewertungs-Architektur für Anhang I; die zypriotische Ratspräsidentschaft strebt einen Abschluss vor Ablauf ihrer Amtszeit am 30. Juni 2026 an, andernfalls übernimmt die irische Präsidentschaft), der am 5. Mai 2026 erfolgten Arraignment-Verhandlung im Altman-Verfahren mit „nicht schuldig"-Plädoyer und angeordneter psychiatrischer Begutachtung, des am 7. Mai 2026 versandten individuellen Microsoft-Buyout-Angebots (Annahmefrist 8. Juni 2026, VRSAR-Unterzeichnung 9.–22. Juni 2026, bis zu fünfjährige Krankenversicherungs-Verlängerung), des am 1. Mai 2026 vom Connecticut-Repräsentantenhaus mit 131 zu 17 Stimmen verabschiedeten </w:t>
+        <w:t xml:space="preserve"> Dieses Arbeitspapier gibt den Stand Anfang Juni 2026 (Schnitt am 6. Juni 2026 — Lauf 001 vom 6. Juni 2026) wieder. Gegenüber dem vorigen Mai-Schnitt (Lauf 001 vom 8. Mai 2026) sind ergänzt: der am 1. Juni 2026 in der </w:t>
+      </w:r>
+      <w:r>
+        <w:rPr>
+          <w:rFonts w:ascii="Arial" w:hAnsi="Arial"/>
+          <w:b w:val="0"/>
+          <w:i/>
+          <w:sz w:val="19"/>
+        </w:rPr>
+        <w:t>New York Times</w:t>
+      </w:r>
+      <w:r>
+        <w:rPr>
+          <w:rFonts w:ascii="Arial" w:hAnsi="Arial"/>
+          <w:b w:val="0"/>
+          <w:i w:val="0"/>
+          <w:sz w:val="19"/>
+        </w:rPr>
+        <w:t xml:space="preserve"> angekündigte </w:t>
+      </w:r>
+      <w:r>
+        <w:rPr>
+          <w:rFonts w:ascii="Arial" w:hAnsi="Arial"/>
+          <w:b w:val="0"/>
+          <w:i/>
+          <w:sz w:val="19"/>
+        </w:rPr>
+        <w:t>American A.I. Sovereign Wealth Fund Act</w:t>
+      </w:r>
+      <w:r>
+        <w:rPr>
+          <w:rFonts w:ascii="Arial" w:hAnsi="Arial"/>
+          <w:b w:val="0"/>
+          <w:i w:val="0"/>
+          <w:sz w:val="19"/>
+        </w:rPr>
+        <w:t xml:space="preserve"> von Senator Bernie Sanders mit einmaliger Anteilsabgabe von 50 % an OpenAI, Anthropic und xAI in einen US-Staatsfonds, dessen Erträge in Direktzahlungen sowie in Gesundheit, Bildung und Wohnen fließen sollen (parallele Vorschläge: Warren in der </w:t>
+      </w:r>
+      <w:r>
+        <w:rPr>
+          <w:rFonts w:ascii="Arial" w:hAnsi="Arial"/>
+          <w:b w:val="0"/>
+          <w:i/>
+          <w:sz w:val="19"/>
+        </w:rPr>
+        <w:t>Time</w:t>
+      </w:r>
+      <w:r>
+        <w:rPr>
+          <w:rFonts w:ascii="Arial" w:hAnsi="Arial"/>
+          <w:b w:val="0"/>
+          <w:i w:val="0"/>
+          <w:sz w:val="19"/>
+        </w:rPr>
+        <w:t>, OpenAI-</w:t>
+      </w:r>
+      <w:r>
+        <w:rPr>
+          <w:rFonts w:ascii="Arial" w:hAnsi="Arial"/>
+          <w:b w:val="0"/>
+          <w:i/>
+          <w:sz w:val="19"/>
+        </w:rPr>
+        <w:t>Public-Wealth-Fund</w:t>
+      </w:r>
+      <w:r>
+        <w:rPr>
+          <w:rFonts w:ascii="Arial" w:hAnsi="Arial"/>
+          <w:b w:val="0"/>
+          <w:i w:val="0"/>
+          <w:sz w:val="19"/>
+        </w:rPr>
+        <w:t xml:space="preserve">-Linie, Anthropic-CEO-Befürwortung); das Konvergenzsignal aus der Trump-Administration vom 5. Juni 2026 (US-Bundesregierung erwägt direkte Eigentumsanteile an OpenAI, Anthropic und xAI; Bessent-Lutnick-Vorentwurf eines allgemeinen US-Staatsfonds; Sanders-Altman-Gespräch am 3. Juni 2026); der </w:t>
+      </w:r>
+      <w:r>
+        <w:rPr>
+          <w:rFonts w:ascii="Arial" w:hAnsi="Arial"/>
+          <w:b w:val="0"/>
+          <w:i/>
+          <w:sz w:val="19"/>
+        </w:rPr>
+        <w:t>Mai-2026-Job-Cuts-Report</w:t>
+      </w:r>
+      <w:r>
+        <w:rPr>
+          <w:rFonts w:ascii="Arial" w:hAnsi="Arial"/>
+          <w:b w:val="0"/>
+          <w:i w:val="0"/>
+          <w:sz w:val="19"/>
+        </w:rPr>
+        <w:t xml:space="preserve"> von </w:t>
+      </w:r>
+      <w:r>
+        <w:rPr>
+          <w:rFonts w:ascii="Arial" w:hAnsi="Arial"/>
+          <w:b w:val="0"/>
+          <w:i/>
+          <w:sz w:val="19"/>
+        </w:rPr>
+        <w:t>Challenger, Gray &amp; Christmas</w:t>
+      </w:r>
+      <w:r>
+        <w:rPr>
+          <w:rFonts w:ascii="Arial" w:hAnsi="Arial"/>
+          <w:b w:val="0"/>
+          <w:i w:val="0"/>
+          <w:sz w:val="19"/>
+        </w:rPr>
+        <w:t xml:space="preserve"> vom 5. Juni 2026 (US-Stellenstreichungen Mai 97.006 = +16 % gegenüber April und höchster Mai-Wert seit 2020; KI-bezogen 38.579 / 40 % aller Mai-Streichungen und höchster Monatswert seit Tracking-Beginn 2023; KI-Anteil YTD 87.714 / 22 % aller 397.755 2026-Streichungen — bereits Übertreffen der 54.836 aus dem gesamten Jahr 2025; Tech Mai 38.242, YTD 123.653 mit +66 % gegenüber Vorjahresstand); die Personalreduktion bei Uber Technologies (3. Juni 2026: 23 % der </w:t>
+      </w:r>
+      <w:r>
+        <w:rPr>
+          <w:rFonts w:ascii="Arial" w:hAnsi="Arial"/>
+          <w:b w:val="0"/>
+          <w:i/>
+          <w:sz w:val="19"/>
+        </w:rPr>
+        <w:t>People-and-Places</w:t>
+      </w:r>
+      <w:r>
+        <w:rPr>
+          <w:rFonts w:ascii="Arial" w:hAnsi="Arial"/>
+          <w:b w:val="0"/>
+          <w:i w:val="0"/>
+          <w:sz w:val="19"/>
+        </w:rPr>
+        <w:t xml:space="preserve">-Division, offiziell „nicht KI-getrieben", Forrester-Einordnung als „AI washing" angesichts 95 % monatlicher KI-Tool-Nutzung der Ingenieurinnen und Ingenieure und rund 70 % KI-generierten Codes); sowie der aktualisierte Tech-Layoff-Tracker-Stand zum 5. Juni 2026 (149.935 betroffene Personen aus 363 Layoff-Ereignissen, rund 974 Stellen pro Tag, 2026-Tempo gegenüber 2025 um rund 44 % beschleunigt — Reihenfortschreibung 127.411 zum 8. Mai → 149.935 zum 5. Juni 2026). Die Debatte entwickelt sich dynamisch — insbesondere im Zuge dieser Sanders/Trump-Konvergenz auf einen US-KI-Staatsfonds, der die in § 4.5 und § 5.4 entwickelte Trennung zwischen abschöpfungsbasierter und eigentumsrechtlicher Teilhabe erstmals kongressreif vorbereitet — sowie im Vorlauf zum ersten Bundesratsdurchgang des </w:t>
+      </w:r>
+      <w:r>
+        <w:rPr>
+          <w:rFonts w:ascii="Arial" w:hAnsi="Arial"/>
+          <w:b w:val="0"/>
+          <w:i/>
+          <w:sz w:val="19"/>
+        </w:rPr>
+        <w:t>GKV-Beitragssatzstabilisierungsgesetzes</w:t>
+      </w:r>
+      <w:r>
+        <w:rPr>
+          <w:rFonts w:ascii="Arial" w:hAnsi="Arial"/>
+          <w:b w:val="0"/>
+          <w:i w:val="0"/>
+          <w:sz w:val="19"/>
+        </w:rPr>
+        <w:t xml:space="preserve"> am 12. Juni 2026 (zweiter Durchgang 10. Juli 2026), zum 2. August 2026 als Anwendungsbeginn der Hauptbestimmungen des EU-AI-Acts, sowie unter Fortlauf der Microsoft-VRSAR-Annahmefrist (8. Juni 2026 / Separation Date 2. Juli 2026) und der Trilog-Verhandlungen zum Digital Omnibus on AI.</w:t>
+      </w:r>
+    </w:p>
+    <w:p>
+      <w:pPr>
+        <w:jc w:val="both"/>
+      </w:pPr>
+      <w:r>
+        <w:rPr>
+          <w:rFonts w:ascii="Arial" w:hAnsi="Arial"/>
+          <w:b/>
+          <w:i w:val="0"/>
+          <w:sz w:val="19"/>
+        </w:rPr>
+        <w:t>Frühere Aktualitäts-Schnitte:</w:t>
+      </w:r>
+      <w:r>
+        <w:rPr>
+          <w:rFonts w:ascii="Arial" w:hAnsi="Arial"/>
+          <w:b w:val="0"/>
+          <w:i w:val="0"/>
+          <w:sz w:val="19"/>
+        </w:rPr>
+        <w:t xml:space="preserve"> Bis Lauf 001 vom 8. Mai 2026 hat das Arbeitspapier den Stand Anfang Mai 2026 wiedergegeben — insbesondere im Zuge der OpenAI-Strategiepapiere und der Eröffnung des OpenAI Workshop in Washington, D.C. im Mai 2026, des Erstdurchgangs des GKV-Beitragssatzstabilisierungsgesetzes in der 1065. Bundesratssitzung am 8. Mai 2026 mit 79 Tagesordnungspunkten (Kabinettsbeschluss 29. April 2026, parlamentarische Behandlung vor der Sommerpause 2026 angekündigt), der laufenden Trilog-Verhandlungen zum Digital Omnibus on AI (zweite Runde 28. April 2026 ohne Einigung; nächste Runde 13. Mai 2026 — Knackpunkt ist nicht die Verschiebung der Hochrisiko-Pflichten, sondern die Konformitätsbewertungs-Architektur für Anhang I; die zypriotische Ratspräsidentschaft strebt einen Abschluss vor Ablauf ihrer Amtszeit am 30. Juni 2026 an, andernfalls übernimmt die irische Präsidentschaft), der am 5. Mai 2026 erfolgten Arraignment-Verhandlung im Altman-Verfahren mit „nicht schuldig"-Plädoyer und angeordneter psychiatrischer Begutachtung, des am 7. Mai 2026 versandten individuellen Microsoft-Buyout-Angebots (Annahmefrist 8. Juni 2026, VRSAR-Unterzeichnung 9.–22. Juni 2026, bis zu fünfjährige Krankenversicherungs-Verlängerung), des am 1. Mai 2026 vom Connecticut-Repräsentantenhaus mit 131 zu 17 Stimmen verabschiedeten </w:t>
       </w:r>
       <w:r>
         <w:rPr>
@@ -10862,7 +11888,7 @@
         <w:color w:val="999999"/>
         <w:sz w:val="15"/>
       </w:rPr>
-      <w:t>Version 22.0 — Mai 2026 — CC BY 4.0</w:t>
+      <w:t>Version 23.0 — Mai 2026 — CC BY 4.0</w:t>
       <w:tab/>
       <w:t xml:space="preserve">Seite </w:t>
     </w:r>

</xml_diff>

<commit_message>
Daily-Update 2026-06-12 — Version 23.0 (Cluster: A, B, D, E, F)
Zehn belegbare Entwicklungen seit 8. Mai 2026: Sanders American AI
Sovereign Wealth Fund Act (1. Juni 2026) als programmatische Verschiebung
auf Sovereign-Wealth-Modell; Connecticut SB 5 als Public Act 26-15 / CART
Act unterzeichnet (2. Juni 2026); Colorado SB 189 (14. Mai 2026) mit
Stichtagsverschiebung und Streichung der Duty of Care; EU Digital Omnibus
on AI politische Trilog-Einigung (7. Mai 2026); Bundestag-Beschluss zum
KI-Durchführungsgesetz und erste GKV-Lesung am 12. Juni 2026; Challenger
May-2026-Job-Cuts-Report (5. Juni 2026) und TrueUp-Stand 11. Juni 2026;
Growiec/Prettner/Szkróbka (arXiv 2603.17898, März 2026) zur optimalen
KI-Besteuerung.

https://claude.ai/code/session_012K8494RkAiSd2NyWTumKy7
</commit_message>
<xml_diff>
--- a/KI-Ökonomie.docx
+++ b/KI-Ökonomie.docx
@@ -112,7 +112,7 @@
           <w:color w:val="666666"/>
           <w:sz w:val="18"/>
         </w:rPr>
-        <w:t>Version 22.0</w:t>
+        <w:t>Version 23.0</w:t>
       </w:r>
     </w:p>
     <w:p>
@@ -382,7 +382,43 @@
           <w:i w:val="0"/>
           <w:sz w:val="19"/>
         </w:rPr>
-        <w:t xml:space="preserve">-Differenzierung vom 1. Mai 2026 genannte Mehrkanalerklärung (KI-Verdrängung, Austerity-Logik, Pandemie-Korrekturen, Routine-Restrukturierung) zusätzlich stützt. Der parallele Lauf der Branchen-AI-Capex-Programme (Q1-2026-Investitionen der Hyperscaler von rund 130,65 Milliarden US-Dollar; Konsens-Schätzung Anfang April 2026 zwischen 660 und 700 Milliarden US-Dollar, nach den Q1-2026-Earnings-Calls vom 28.–30. April 2026 — von der </w:t>
+        <w:t xml:space="preserve">-Differenzierung vom 1. Mai 2026 genannte Mehrkanalerklärung (KI-Verdrängung, Austerity-Logik, Pandemie-Korrekturen, Routine-Restrukturierung) zusätzlich stützt. Der am 5. Juni 2026 veröffentlichte </w:t>
+      </w:r>
+      <w:r>
+        <w:rPr>
+          <w:rFonts w:ascii="Arial" w:hAnsi="Arial"/>
+          <w:b w:val="0"/>
+          <w:i/>
+          <w:sz w:val="19"/>
+        </w:rPr>
+        <w:t>Mai-2026-Job-Cuts-Report</w:t>
+      </w:r>
+      <w:r>
+        <w:rPr>
+          <w:rFonts w:ascii="Arial" w:hAnsi="Arial"/>
+          <w:b w:val="0"/>
+          <w:i w:val="0"/>
+          <w:sz w:val="19"/>
+        </w:rPr>
+        <w:t xml:space="preserve"> von </w:t>
+      </w:r>
+      <w:r>
+        <w:rPr>
+          <w:rFonts w:ascii="Arial" w:hAnsi="Arial"/>
+          <w:b w:val="0"/>
+          <w:i/>
+          <w:sz w:val="19"/>
+        </w:rPr>
+        <w:t>Challenger, Gray &amp; Christmas</w:t>
+      </w:r>
+      <w:r>
+        <w:rPr>
+          <w:rFonts w:ascii="Arial" w:hAnsi="Arial"/>
+          <w:b w:val="0"/>
+          <w:i w:val="0"/>
+          <w:sz w:val="19"/>
+        </w:rPr>
+        <w:t xml:space="preserve"> bestätigt die Verdrängungslinie noch deutlicher: Für Mai 2026 weisen die US-Streichungen mit 97.006 angekündigten Stellen den höchsten Mai-Wert seit der Pandemie 2020 aus (+16 % gegenüber April; +3 % gegenüber Mai 2025); KI ist mit 38.579 angekündigten KI-bezogenen Streichungen zum dritten Mal in Folge der am häufigsten genannte Einzelgrund und macht 40 % aller Mai-Streichungen aus — der höchste Monatswert seit Beginn der KI-Erfassung 2023. Im laufenden Jahr summieren sich die KI-bezogenen Streichungen damit auf 87.714 (rund 22 % aller 2026-Pläne), womit der Vorjahreswert (54.836 im gesamten Jahr 2025) bereits nach fünf Monaten überschritten ist; im Tech-Sektor sind im Mai 38.242 Stellen gestrichen worden (höchster Monatswert seit August 2024), kumuliert YTD 123.653 (+66 % gegenüber Vorjahresstand). Eine Tagesfortschreibung des TrueUp-Trackers zum 11. Juni 2026 weist 247 Layoff-Ereignisse aus mit 183.966 betroffenen Beschäftigten (rund 974 pro Tag; 44 % über dem Vorjahres-Tempo), wobei nach Tracker-Auswertung 55 % der Ereignisse explizit KI, Automatisierung oder maschinelles Lernen als Treiber nennen — entsprechend 152.415 Beschäftigten aus 135 Unternehmen. Der parallele Lauf der Branchen-AI-Capex-Programme (Q1-2026-Investitionen der Hyperscaler von rund 130,65 Milliarden US-Dollar; Konsens-Schätzung Anfang April 2026 zwischen 660 und 700 Milliarden US-Dollar, nach den Q1-2026-Earnings-Calls vom 28.–30. April 2026 — von der </w:t>
       </w:r>
       <w:r>
         <w:rPr>
@@ -1402,6 +1438,65 @@
           <w:i w:val="0"/>
           <w:sz w:val="19"/>
         </w:rPr>
+        <w:t>Growiec, Prettner &amp; Szkróbka (März 2026):</w:t>
+      </w:r>
+      <w:r>
+        <w:rPr>
+          <w:rFonts w:ascii="Arial" w:hAnsi="Arial"/>
+          <w:b w:val="0"/>
+          <w:i w:val="0"/>
+          <w:sz w:val="19"/>
+        </w:rPr>
+        <w:t xml:space="preserve"> Jakub Growiec (SGH Warsaw School of Economics / CEPR Research and Policy Network on AI), Klaus Prettner (WU Wien) und Maciej Szkróbka (SGH Warsaw School of Economics) legen mit </w:t>
+      </w:r>
+      <w:r>
+        <w:rPr>
+          <w:rFonts w:ascii="Arial" w:hAnsi="Arial"/>
+          <w:b w:val="0"/>
+          <w:i/>
+          <w:sz w:val="19"/>
+        </w:rPr>
+        <w:t>„Workers' Incentives and the Optimal Taxation of AI"</w:t>
+      </w:r>
+      <w:r>
+        <w:rPr>
+          <w:rFonts w:ascii="Arial" w:hAnsi="Arial"/>
+          <w:b w:val="0"/>
+          <w:i w:val="0"/>
+          <w:sz w:val="19"/>
+        </w:rPr>
+        <w:t xml:space="preserve"> (arXiv 2603.17898, 18. März 2026) eine Erweiterung des dynamischen Optimalsteuer-Rahmens von Slavik &amp; Yazici (2014) auf eine Ökonomie mit menschlicher manueller und kognitiver Arbeit, physischem Kapital und KI vor. Zentrales Ergebnis: Eine Besteuerung von KI sei dann optimal, wenn kognitiv Beschäftigte beginnen, in manuelle Tätigkeiten auszuweichen — also genau an dem Punkt, an dem KI weite Teile kognitiver Tasks substituieren kann. Die Arbeit verlängert die in §3.2 referierte Thuemmel-Linie (Substitutionsschwelle) um die Anreizdimension der Arbeitsangebotsentscheidung und ergänzt zugleich die ältere </w:t>
+      </w:r>
+      <w:r>
+        <w:rPr>
+          <w:rFonts w:ascii="Arial" w:hAnsi="Arial"/>
+          <w:b w:val="0"/>
+          <w:i/>
+          <w:sz w:val="19"/>
+        </w:rPr>
+        <w:t>Gasteiger &amp; Prettner</w:t>
+      </w:r>
+      <w:r>
+        <w:rPr>
+          <w:rFonts w:ascii="Arial" w:hAnsi="Arial"/>
+          <w:b w:val="0"/>
+          <w:i w:val="0"/>
+          <w:sz w:val="19"/>
+        </w:rPr>
+        <w:t>-Linie (§3.3) zum makroökonomischen Effekt einer Robotersteuer. Für die deutsche Debatte ist insbesondere die Schwellenargumentation relevant: Sie stützt eine zeitlich gestaffelte Einführung der in §5.1 entwickelten Wertschöpfungsabgabe-Logik analog zu Thuemmels Subventions-/Besteuerungs-Wendepunkt.</w:t>
+      </w:r>
+    </w:p>
+    <w:p>
+      <w:pPr>
+        <w:jc w:val="both"/>
+      </w:pPr>
+      <w:r>
+        <w:rPr>
+          <w:rFonts w:ascii="Arial" w:hAnsi="Arial"/>
+          <w:b/>
+          <w:i w:val="0"/>
+          <w:sz w:val="19"/>
+        </w:rPr>
         <w:t>Korinek &amp; Lockwood (2026):</w:t>
       </w:r>
       <w:r>
@@ -2128,7 +2223,79 @@
           <w:i w:val="0"/>
           <w:sz w:val="19"/>
         </w:rPr>
-        <w:t xml:space="preserve"> Eine rein nationale Lösung kann mit der Warenverkehrsfreiheit, der Dienstleistungsfreiheit und der Niederlassungsfreiheit in Konflikt geraten. Eine Regelung, die nur inländische Roboterbetreiber trifft, während grenzüberschreitende KI-Dienstleistungen unbesteuert bleiben, wäre diskriminierungsrechtlich problematisch und praktisch kaum durchsetzbar. Der EU AI Act (Verordnung 2024/1689) schafft ab dem 2. August 2026 einen unionsweit einheitlichen Regulierungsrahmen für KI-Systeme (Hochrisiko-Systeme gemäß Anhang III, Transparenzpflichten nach Art. 50, Durchsetzungsregime); dies legt einen einheitlichen Definitionsrahmen, der steuerpolitische Anknüpfungen an KI-Systemklassen mittelfristig erleichtern kann, ohne selbst steuerrechtliche Wirkung zu entfalten. Die Europäische Kommission hat am 19. November 2025 mit dem „Digital Omnibus on AI" einen Vereinfachungsvorschlag vorgelegt, den das Europäische Parlament am 16. März 2026 im Ausschuss und am 23. März 2026 im Plenum unterstützt hat. Er sieht eine Verschiebung der Hochrisiko-Pflichten vor — je nach Systemtyp bis maximal zum 2. Dezember 2027 bzw. 2. August 2028 — und koppelt ihre Anwendbarkeit an die Verfügbarkeit harmonisierter Normen; zudem wird die Kennzeichnungspflicht für KI-generierte Inhalte (Art. 50) bis zum 2. November 2026 verlängert. Die Kommissionsdurchsetzungsbefugnisse gegenüber Anbietern von Allzweck-KI-Modellen (GPAI) treten wie vorgesehen am 2. August 2026 in Kraft. Parlament und Rat haben die Trilogverhandlungen aufgenommen; der zweite Trilogtermin am 28. April 2026 endete nach Berichterstattung von IAPP und A&amp;O Shearman ohne Einigung — Streitpunkt war primär das Verhältnis zwischen AI Act und sektorspezifischen EU-Regelungen für eingebettete KI-Systeme (Anhang I) sowie die Rechtsgrundlage für die Verarbeitung personenbezogener Daten zur Bias-Erkennung. Beide Institutionen konvergieren auf Stichtage 2. Dezember 2027 (Anhang III) und 2. August 2028 (Anhang I) für die Hochrisiko-Pflichten. Die nächste Trilogrunde ist auf den 13. Mai 2026 terminiert; Ziel bleibt eine förmliche Verabschiedung vor dem ursprünglichen Stichtag am 2. August 2026. Die zypriotische Ratspräsidentschaft hat sich vorgenommen, das Dossier vor Ablauf ihrer Amtszeit am 30. Juni 2026 abzuschließen; gelingt das nicht, übernimmt zur zweiten Jahreshälfte 2026 die irische Präsidentschaft. Scheitert die Einigung bis zum 2. August 2026, würden die Hochrisiko-Pflichten in ihrer ursprünglich vorgesehenen Fassung anwendbar. Für die Steuerdebatte folgt daraus, dass der zeitliche Vorlauf für KI-Definitionen aus dem AI Act enger als ursprünglich gedacht ist — eine mittelfristige Anknüpfung steuerlicher Tatbestände an AI-Act-Kategorien bleibt möglich, setzt aber voraus, dass die Normenlandschaft nach 2027 verlässlich vorliegt.</w:t>
+        <w:t xml:space="preserve"> Eine rein nationale Lösung kann mit der Warenverkehrsfreiheit, der Dienstleistungsfreiheit und der Niederlassungsfreiheit in Konflikt geraten. Eine Regelung, die nur inländische Roboterbetreiber trifft, während grenzüberschreitende KI-Dienstleistungen unbesteuert bleiben, wäre diskriminierungsrechtlich problematisch und praktisch kaum durchsetzbar. Der EU AI Act (Verordnung 2024/1689) schafft ab dem 2. August 2026 einen unionsweit einheitlichen Regulierungsrahmen für KI-Systeme (Hochrisiko-Systeme gemäß Anhang III, Transparenzpflichten nach Art. 50, Durchsetzungsregime); dies legt einen einheitlichen Definitionsrahmen, der steuerpolitische Anknüpfungen an KI-Systemklassen mittelfristig erleichtern kann, ohne selbst steuerrechtliche Wirkung zu entfalten. Die Europäische Kommission hat am 19. November 2025 mit dem „Digital Omnibus on AI" einen Vereinfachungsvorschlag vorgelegt, den das Europäische Parlament am 16. März 2026 im Ausschuss und am 23. März 2026 im Plenum unterstützt hat. Er sieht eine Verschiebung der Hochrisiko-Pflichten vor — je nach Systemtyp bis maximal zum 2. Dezember 2027 bzw. 2. August 2028 — und koppelt ihre Anwendbarkeit an die Verfügbarkeit harmonisierter Normen; zudem wird die Kennzeichnungspflicht für KI-generierte Inhalte (Art. 50) bis zum 2. November 2026 verlängert. Die Kommissionsdurchsetzungsbefugnisse gegenüber Anbietern von Allzweck-KI-Modellen (GPAI) treten wie vorgesehen am 2. August 2026 in Kraft. Parlament und Rat haben die Trilogverhandlungen aufgenommen; der zweite Trilogtermin am 28. April 2026 endete nach Berichterstattung von IAPP und A&amp;O Shearman ohne Einigung — Streitpunkt war primär das Verhältnis zwischen AI Act und sektorspezifischen EU-Regelungen für eingebettete KI-Systeme (Anhang I) sowie die Rechtsgrundlage für die Verarbeitung personenbezogener Daten zur Bias-Erkennung. Beide Institutionen konvergieren auf Stichtage 2. Dezember 2027 (Anhang III) und 2. August 2028 (Anhang I) für die Hochrisiko-Pflichten. Die nächste Trilogrunde ist auf den 13. Mai 2026 terminiert; Ziel bleibt eine förmliche Verabschiedung vor dem ursprünglichen Stichtag am 2. August 2026. Die zypriotische Ratspräsidentschaft hat sich vorgenommen, das Dossier vor Ablauf ihrer Amtszeit am 30. Juni 2026 abzuschließen; gelingt das nicht, übernimmt zur zweiten Jahreshälfte 2026 die irische Präsidentschaft. Scheitert die Einigung bis zum 2. August 2026, würden die Hochrisiko-Pflichten in ihrer ursprünglich vorgesehenen Fassung anwendbar. Für die Steuerdebatte folgt daraus, dass der zeitliche Vorlauf für KI-Definitionen aus dem AI Act enger als ursprünglich gedacht ist — eine mittelfristige Anknüpfung steuerlicher Tatbestände an AI-Act-Kategorien bleibt möglich, setzt aber voraus, dass die Normenlandschaft nach 2027 verlässlich vorliegt. Nach dem Scheitern der zweiten Trilogrunde haben Rat und Parlament am 7. Mai 2026 eine politische Einigung über den </w:t>
+      </w:r>
+      <w:r>
+        <w:rPr>
+          <w:rFonts w:ascii="Arial" w:hAnsi="Arial"/>
+          <w:b w:val="0"/>
+          <w:i/>
+          <w:sz w:val="19"/>
+        </w:rPr>
+        <w:t>Digital Omnibus on AI</w:t>
+      </w:r>
+      <w:r>
+        <w:rPr>
+          <w:rFonts w:ascii="Arial" w:hAnsi="Arial"/>
+          <w:b w:val="0"/>
+          <w:i w:val="0"/>
+          <w:sz w:val="19"/>
+        </w:rPr>
+        <w:t xml:space="preserve"> erzielt: Die Hochrisiko-Pflichten nach Anhang III gelten nun ab 2. Dezember 2027, die produktbezogenen Pflichten nach Anhang I ab 2. August 2028; die Watermark- und Kennzeichnungspflichten nach Art. 50 werden um vier Monate auf den 2. Dezember 2026 verschoben. Ergänzend wird ab 2. Dezember 2026 ein neues Verbot für KI-Systeme zur Generierung nicht-einvernehmlicher intimer Bildinhalte und kinderpornografischen Materials eingeführt („Nudifier-Verbot"). Die förmliche Annahme (Plenum, Rat, Veröffentlichung im Amtsblatt) ist vor dem 2. August 2026 vorgesehen. Parallel hat der Deutsche Bundestag am 12. Juni 2026 das </w:t>
+      </w:r>
+      <w:r>
+        <w:rPr>
+          <w:rFonts w:ascii="Arial" w:hAnsi="Arial"/>
+          <w:b w:val="0"/>
+          <w:i/>
+          <w:sz w:val="19"/>
+        </w:rPr>
+        <w:t>Gesetz zur Durchführung der KI-Verordnung</w:t>
+      </w:r>
+      <w:r>
+        <w:rPr>
+          <w:rFonts w:ascii="Arial" w:hAnsi="Arial"/>
+          <w:b w:val="0"/>
+          <w:i w:val="0"/>
+          <w:sz w:val="19"/>
+        </w:rPr>
+        <w:t xml:space="preserve"> mit den Koalitionsstimmen von CDU/CSU und SPD beschlossen (Gegenstimmen aus AfD, Grünen und Linken); die </w:t>
+      </w:r>
+      <w:r>
+        <w:rPr>
+          <w:rFonts w:ascii="Arial" w:hAnsi="Arial"/>
+          <w:b w:val="0"/>
+          <w:i/>
+          <w:sz w:val="19"/>
+        </w:rPr>
+        <w:t>Bundesnetzagentur</w:t>
+      </w:r>
+      <w:r>
+        <w:rPr>
+          <w:rFonts w:ascii="Arial" w:hAnsi="Arial"/>
+          <w:b w:val="0"/>
+          <w:i w:val="0"/>
+          <w:sz w:val="19"/>
+        </w:rPr>
+        <w:t xml:space="preserve"> wird damit zentrale KI-Marktüberwachungsbehörde mit einem dort angesiedelten Koordinations- und Kompetenzzentrum sowie einer unabhängigen </w:t>
+      </w:r>
+      <w:r>
+        <w:rPr>
+          <w:rFonts w:ascii="Arial" w:hAnsi="Arial"/>
+          <w:b w:val="0"/>
+          <w:i/>
+          <w:sz w:val="19"/>
+        </w:rPr>
+        <w:t>KI-Marktüberwachungskammer</w:t>
+      </w:r>
+      <w:r>
+        <w:rPr>
+          <w:rFonts w:ascii="Arial" w:hAnsi="Arial"/>
+          <w:b w:val="0"/>
+          <w:i w:val="0"/>
+          <w:sz w:val="19"/>
+        </w:rPr>
+        <w:t xml:space="preserve"> für die Aufsicht über bestimmte Hochrisiko-Systeme. Für die in §8 entwickelte Veredelungsstrategie ist die nationale Architektur-Entscheidung relevant, weil sie die institutionelle Anlaufstelle für KI-Definitionen, Risikoklassifizierungen und Konformitätsbewertungen — und damit potentiell auch für spätere steuerliche Anknüpfungspunkte — konsolidiert.</w:t>
       </w:r>
     </w:p>
     <w:p>
@@ -2264,7 +2431,215 @@
           <w:i w:val="0"/>
           <w:sz w:val="19"/>
         </w:rPr>
-        <w:t xml:space="preserve"> (S. 4214, 119. Kongress) eingebracht, der ein bundesweites Moratorium für neue und aufgerüstete KI-Rechenzentren oberhalb definierter Stromschwellen vorsieht, bis der Gesetzgeber Mindeststandards in den Bereichen Umwelt, Energie, Arbeit und Bürgerrechte verabschiedet; der Gesetzentwurf formuliert ausdrücklich, die „wirtschaftlichen Gewinne aus künstlicher Intelligenz und Robotik" sollten „Beschäftigten, nicht nur wohlhabenden Big-Tech-Eigentümern" zugutekommen. Am 16. April 2026 hat Sanders die Linie mit einem Namensbeitrag („Artificial intelligence is coming for the working class. We must fight back.") erneuert und die HELP-Anhörung genutzt, um für Robotersteuer und Moratorium zu werben. Die Aussicht auf Annahme des Entwurfs in einem republikanisch geführten Kongress gilt als gering; als Signalgebung ist er jedoch der bislang konkreteste politische Vorstoß auf US-Bundesebene.</w:t>
+        <w:t xml:space="preserve"> (S. 4214, 119. Kongress) eingebracht, der ein bundesweites Moratorium für neue und aufgerüstete KI-Rechenzentren oberhalb definierter Stromschwellen vorsieht, bis der Gesetzgeber Mindeststandards in den Bereichen Umwelt, Energie, Arbeit und Bürgerrechte verabschiedet; der Gesetzentwurf formuliert ausdrücklich, die „wirtschaftlichen Gewinne aus künstlicher Intelligenz und Robotik" sollten „Beschäftigten, nicht nur wohlhabenden Big-Tech-Eigentümern" zugutekommen. Am 16. April 2026 hat Sanders die Linie mit einem Namensbeitrag („Artificial intelligence is coming for the working class. We must fight back.") erneuert und die HELP-Anhörung genutzt, um für Robotersteuer und Moratorium zu werben. Die Aussicht auf Annahme des Entwurfs in einem republikanisch geführten Kongress gilt als gering; als Signalgebung ist er jedoch der bislang konkreteste politische Vorstoß auf US-Bundesebene. Am 1. Juni 2026 hat Sanders den programmatischen Schwerpunkt zusätzlich vom Verbrauchsteuer- auf das Eigentumsmodell verlagert und den </w:t>
+      </w:r>
+      <w:r>
+        <w:rPr>
+          <w:rFonts w:ascii="Arial" w:hAnsi="Arial"/>
+          <w:b w:val="0"/>
+          <w:i/>
+          <w:sz w:val="19"/>
+        </w:rPr>
+        <w:t>American AI Sovereign Wealth Fund Act</w:t>
+      </w:r>
+      <w:r>
+        <w:rPr>
+          <w:rFonts w:ascii="Arial" w:hAnsi="Arial"/>
+          <w:b w:val="0"/>
+          <w:i w:val="0"/>
+          <w:sz w:val="19"/>
+        </w:rPr>
+        <w:t xml:space="preserve"> in den US-Senat eingebracht (Eintrag im </w:t>
+      </w:r>
+      <w:r>
+        <w:rPr>
+          <w:rFonts w:ascii="Arial" w:hAnsi="Arial"/>
+          <w:b w:val="0"/>
+          <w:i/>
+          <w:sz w:val="19"/>
+        </w:rPr>
+        <w:t>Congressional Record</w:t>
+      </w:r>
+      <w:r>
+        <w:rPr>
+          <w:rFonts w:ascii="Arial" w:hAnsi="Arial"/>
+          <w:b w:val="0"/>
+          <w:i w:val="0"/>
+          <w:sz w:val="19"/>
+        </w:rPr>
+        <w:t xml:space="preserve"> Vol. 172 Nr. 92). Der Entwurf sieht eine einmalige Übertragung von 50 % der Eigenkapitalanteile der führenden KI-Unternehmen (namentlich OpenAI, Anthropic, xAI) an einen neu zu errichtenden bundesstaatlich verwalteten Staatsfonds vor, der die Anteile mit hälftigem Stimmrecht und gleichberechtigter Vorstandsvertretung halten und Erträge zunächst als universelle Bürgerdividende und später für öffentliche Güter (Gesundheitsversorgung, Bildung, Wohnen) ausschütten soll. Begründung in der vorangegangenen New-York-Times-Kolumne („The Public Should Own Half of the Big A.I. Companies"): Da Frontier-Modelle auf der „kollektiven Erfahrung und Wissensbasis der Menschheit" trainiert seien, gebühre der Öffentlichkeit ein entsprechender Anteil an der dadurch generierten Wertschöpfung. In einem etwa einstündigen Gespräch in Sanders' Senatsbüro Anfang Juni 2026 äußerte sich OpenAI-Vorstandsvorsitzender Sam Altman grundsätzlich offen für das Prinzip einer öffentlichen Equity-Beteiligung an KI-Unternehmen, hielt die 50-%-Größenordnung jedoch für „zu ambitioniert". Für die hier geführte Debatte ist der Vorstoß doppelt relevant: Erstens verschiebt er die US-Steuerdebatte programmatisch vom Typ-5-Pfad (zielgerichtete Ersatzabgabe, §2.1) auf eine eigentumsrechtliche Anknüpfung, die der in §5.4 und §8.3 referierten Staatsfonds-Logik nach norwegischem Vorbild strukturell sehr nah kommt; zweitens dürfte die enteignungsähnliche Vehemenz einer einmaligen 50-%-Übertragung verfassungs- und investitionsrechtlich kaum durchsetzbar sein — sie verschiebt aber den politischen Möglichkeitsraum für moderatere fiskalische Beteiligungsmodelle.</w:t>
+      </w:r>
+    </w:p>
+    <w:p>
+      <w:pPr>
+        <w:jc w:val="both"/>
+      </w:pPr>
+      <w:r>
+        <w:rPr>
+          <w:rFonts w:ascii="Arial" w:hAnsi="Arial"/>
+          <w:b/>
+          <w:i w:val="0"/>
+          <w:sz w:val="19"/>
+        </w:rPr>
+        <w:t>Sub-föderale Parallele — Connecticut (Mai/Juni 2026):</w:t>
+      </w:r>
+      <w:r>
+        <w:rPr>
+          <w:rFonts w:ascii="Arial" w:hAnsi="Arial"/>
+          <w:b w:val="0"/>
+          <w:i w:val="0"/>
+          <w:sz w:val="19"/>
+        </w:rPr>
+        <w:t xml:space="preserve"> Gouverneur Ned Lamont hat </w:t>
+      </w:r>
+      <w:r>
+        <w:rPr>
+          <w:rFonts w:ascii="Arial" w:hAnsi="Arial"/>
+          <w:b w:val="0"/>
+          <w:i/>
+          <w:sz w:val="19"/>
+        </w:rPr>
+        <w:t>Senate Bill 5 — Connecticut Artificial Intelligence Responsibility and Transparency Act</w:t>
+      </w:r>
+      <w:r>
+        <w:rPr>
+          <w:rFonts w:ascii="Arial" w:hAnsi="Arial"/>
+          <w:b w:val="0"/>
+          <w:i w:val="0"/>
+          <w:sz w:val="19"/>
+        </w:rPr>
+        <w:t xml:space="preserve"> am 2. Juni 2026 unterzeichnet (</w:t>
+      </w:r>
+      <w:r>
+        <w:rPr>
+          <w:rFonts w:ascii="Arial" w:hAnsi="Arial"/>
+          <w:b w:val="0"/>
+          <w:i/>
+          <w:sz w:val="19"/>
+        </w:rPr>
+        <w:t>Public Act 26-15</w:t>
+      </w:r>
+      <w:r>
+        <w:rPr>
+          <w:rFonts w:ascii="Arial" w:hAnsi="Arial"/>
+          <w:b w:val="0"/>
+          <w:i w:val="0"/>
+          <w:sz w:val="19"/>
+        </w:rPr>
+        <w:t xml:space="preserve">, „CART Act"), womit der in §4.5 dokumentierte sub-föderale Pfad förmlich Gesetz wird. Das Gesetz wurde in Zusammenarbeit zwischen Gouverneur Lamont, Generalstaatsanwalt William Tong und Senator James Maroney (D-Milford, Co-Vorsitzender des General-Law-Ausschusses) ausgearbeitet und gilt nach Kanzlei-Analysen (Ropes &amp; Gray, Holland &amp; Knight, Paul Hastings, Hunton, DLA Piper, Juni 2026) als eines der bislang umfassendsten US-bundesstaatlichen KI-Gesetze. Es enthält gestaffelte Pflichten in fünf Feldern (Beschäftigungs-KI, Companion-Chatbots, Frontier-Modell-Entwickler, generative-AI-Provenienz, Plattform-Pflichten gegenüber Minderjährigen) mit Erstanwendung ab 1. Oktober 2026 (Automated-Employment-Decision-Rahmen, „AI is not a defense"-Klarstellung, Frontier-Whistleblower-Schutz, AI-Layoff-Disclosure in den Connecticut-WARN-Mitteilungen), anonymen internen Meldewegen großer Frontier-Entwickler ab 1. Januar 2027 und Deployer-Vorab-Information bei substantieller KI-Nutzung in Beschäftigungsentscheidungen ab 1. Oktober 2027; eine Heilungsfrist von 60 Tagen gilt bis Ende 2027. Generative-AI-Anbieter mit mehr als einer Million monatlicher Nutzer müssen Provenienzdaten in von ihnen erzeugte Audio-, Bild- und Videoinhalte einbetten. Durchsetzung obliegt dem Generalstaatsanwalt nach den Vorschriften zu unlauteren Geschäftspraktiken; ein privates Klagerecht ist nicht vorgesehen. Der separat verhandelte </w:t>
+      </w:r>
+      <w:r>
+        <w:rPr>
+          <w:rFonts w:ascii="Arial" w:hAnsi="Arial"/>
+          <w:b w:val="0"/>
+          <w:i/>
+          <w:sz w:val="19"/>
+        </w:rPr>
+        <w:t>Raised Bill 515</w:t>
+      </w:r>
+      <w:r>
+        <w:rPr>
+          <w:rFonts w:ascii="Arial" w:hAnsi="Arial"/>
+          <w:b w:val="0"/>
+          <w:i w:val="0"/>
+          <w:sz w:val="19"/>
+        </w:rPr>
+        <w:t xml:space="preserve"> (Workforce-and-Productivity-Gap-Zuschlag, §4.5) ist zum regulären Sitzungsende der Connecticut General Assembly am 6. Mai 2026 nicht zur Endabstimmung gelangt; der gesetzgeberische Pfad verläuft damit zunächst informationsrechtlich (SB 5) und nicht fiskalisch.</w:t>
+      </w:r>
+    </w:p>
+    <w:p>
+      <w:pPr>
+        <w:jc w:val="both"/>
+      </w:pPr>
+      <w:r>
+        <w:rPr>
+          <w:rFonts w:ascii="Arial" w:hAnsi="Arial"/>
+          <w:b/>
+          <w:i w:val="0"/>
+          <w:sz w:val="19"/>
+        </w:rPr>
+        <w:t>Sub-föderale Parallele — Colorado (Mai 2026):</w:t>
+      </w:r>
+      <w:r>
+        <w:rPr>
+          <w:rFonts w:ascii="Arial" w:hAnsi="Arial"/>
+          <w:b w:val="0"/>
+          <w:i w:val="0"/>
+          <w:sz w:val="19"/>
+        </w:rPr>
+        <w:t xml:space="preserve"> Gegenläufig zur Connecticut-Linie hat Colorado seine eigene KI-Regulierung deutlich zurückgenommen: Gouverneur Jared Polis hat am 14. Mai 2026 </w:t>
+      </w:r>
+      <w:r>
+        <w:rPr>
+          <w:rFonts w:ascii="Arial" w:hAnsi="Arial"/>
+          <w:b w:val="0"/>
+          <w:i/>
+          <w:sz w:val="19"/>
+        </w:rPr>
+        <w:t>SB 189</w:t>
+      </w:r>
+      <w:r>
+        <w:rPr>
+          <w:rFonts w:ascii="Arial" w:hAnsi="Arial"/>
+          <w:b w:val="0"/>
+          <w:i w:val="0"/>
+          <w:sz w:val="19"/>
+        </w:rPr>
+        <w:t xml:space="preserve"> unterzeichnet, das den ursprünglichen </w:t>
+      </w:r>
+      <w:r>
+        <w:rPr>
+          <w:rFonts w:ascii="Arial" w:hAnsi="Arial"/>
+          <w:b w:val="0"/>
+          <w:i/>
+          <w:sz w:val="19"/>
+        </w:rPr>
+        <w:t>Colorado Consumer Protections for Artificial Intelligence Act</w:t>
+      </w:r>
+      <w:r>
+        <w:rPr>
+          <w:rFonts w:ascii="Arial" w:hAnsi="Arial"/>
+          <w:b w:val="0"/>
+          <w:i w:val="0"/>
+          <w:sz w:val="19"/>
+        </w:rPr>
+        <w:t xml:space="preserve"> (SB24-205) substanziell verändert; das Inkrafttreten wurde vom 30. Juni 2026 auf den 1. Januar 2027 verschoben, die </w:t>
+      </w:r>
+      <w:r>
+        <w:rPr>
+          <w:rFonts w:ascii="Arial" w:hAnsi="Arial"/>
+          <w:b w:val="0"/>
+          <w:i/>
+          <w:sz w:val="19"/>
+        </w:rPr>
+        <w:t>Duty of Care</w:t>
+      </w:r>
+      <w:r>
+        <w:rPr>
+          <w:rFonts w:ascii="Arial" w:hAnsi="Arial"/>
+          <w:b w:val="0"/>
+          <w:i w:val="0"/>
+          <w:sz w:val="19"/>
+        </w:rPr>
+        <w:t xml:space="preserve"> zur Vermeidung algorithmischer Diskriminierung gestrichen, Risikomanagement- und Impact-Assessment-Pflichten für Deployer entfernt sowie Berichtspflichten gegenüber dem Generalstaatsanwalt reduziert. Der Vorgang ist nicht steuerrechtlich, illustriert aber die fragile sub-föderale Architektur: Die Trump-Linie der </w:t>
+      </w:r>
+      <w:r>
+        <w:rPr>
+          <w:rFonts w:ascii="Arial" w:hAnsi="Arial"/>
+          <w:b w:val="0"/>
+          <w:i/>
+          <w:sz w:val="19"/>
+        </w:rPr>
+        <w:t>Federal Preemption</w:t>
+      </w:r>
+      <w:r>
+        <w:rPr>
+          <w:rFonts w:ascii="Arial" w:hAnsi="Arial"/>
+          <w:b w:val="0"/>
+          <w:i w:val="0"/>
+          <w:sz w:val="19"/>
+        </w:rPr>
+        <w:t xml:space="preserve"> (§4.5) und industrieseitiger Compliance-Druck haben zwischen Connecticut (Ausweitung am 2. Juni 2026) und Colorado (Rücknahme am 14. Mai 2026) zu einer auseinanderlaufenden Bundesstaaten-Landschaft geführt, in der die Connecticut-WARN-AI-Disclosure-Komponente bis auf Weiteres die einzige standardisierte administrative Datenquelle für KI-bezogene Stellenabbau-Statistiken bleibt — und damit der für §9.1 zentrale Mess-Anknüpfungspunkt.</w:t>
       </w:r>
     </w:p>
     <w:p>
@@ -3632,7 +4007,7 @@
           <w:i w:val="0"/>
           <w:sz w:val="19"/>
         </w:rPr>
-        <w:t xml:space="preserve"> beschlossen; im Verlauf der Ressortabstimmung wurde das Sparvolumen je nach Berichterstattung mit rund 16,3 Milliarden Euro (Frühberichterstattung) bzw. rund 19,6 Milliarden Euro (BMG-Tabellen Stand Anfang Mai 2026, gegliedert in 4,9 Milliarden einnahmen­seitige und rund 15 Milliarden ausgaben­seitige Komponenten) für 2027 angegeben; bis 2030 sieht das BMG eine Steigerung des Konsolidierungseffekts auf rund 42,8 Milliarden Euro vor. Die parlamentarische Behandlung soll laut BMG-Zeitplan vor der Sommerpause 2026 abgeschlossen werden — der Kabinettentwurf wird dem Bundesrat im ersten Durchgang am 8. Mai 2026 zugeleitet (1065. Sitzung; insgesamt 79 Tagesordnungspunkte, darunter eine flankierende Thüringer Entschließung zum Bürokratieabbau in der gesetzlichen Krankenversicherung); die erste Bundestagslesung ist im weiteren Verlauf des Mai/Juni 2026 vorgesehen. Die Reform belastet Krankenhäuser, pharmazeutische Industrie, Apotheken, Ärzteschaft, Versicherte, Arbeitgeber und Krankenkassen gemeinsam; sie folgt dem Leitsatz „Ausgaben an Einnahmen koppeln" und greift damit fiskalisch genau die Logik auf, die § 5.1 in der Beitrags­seite spiegelbildlich zu erweitern vorschlägt. Auch wenn die GKV-Reform primär ausgaben- und strukturseitig ansetzt, bestätigt sie den in § 5.1 angerissenen finanzpolitischen Befund: Die lohnbasierten Sicherungszweige geraten gleichzeitig durch demografischen Druck und durch die in § 1.1 dokumentierten KI-induzierten Beschäftigungsverschiebungen unter Spannung — eine Verbreiterung der Bemessungsgrundlage gewinnt damit zusätzlich an Plausibilität.</w:t>
+        <w:t xml:space="preserve"> beschlossen; im Verlauf der Ressortabstimmung wurde das Sparvolumen je nach Berichterstattung mit rund 16,3 Milliarden Euro (Frühberichterstattung) bzw. rund 19,6 Milliarden Euro (BMG-Tabellen Stand Anfang Mai 2026, gegliedert in 4,9 Milliarden einnahmen­seitige und rund 15 Milliarden ausgaben­seitige Komponenten) für 2027 angegeben; bis 2030 sieht das BMG eine Steigerung des Konsolidierungseffekts auf rund 42,8 Milliarden Euro vor. Die parlamentarische Behandlung soll laut BMG-Zeitplan vor der Sommerpause 2026 abgeschlossen werden — der Kabinettentwurf wird dem Bundesrat im ersten Durchgang am 8. Mai 2026 zugeleitet (1065. Sitzung; insgesamt 79 Tagesordnungspunkte, darunter eine flankierende Thüringer Entschließung zum Bürokratieabbau in der gesetzlichen Krankenversicherung); die erste Bundestagslesung erfolgte am 12. Juni 2026 (einstündige Debatte mit anschließender Überweisung an den federführenden Gesundheitsausschuss); nach der Begründung der Bundesregierung beträgt die Deckungslücke der GKV im Jahr 2027 rund 15,3 Milliarden Euro und könnte bis 2030 auf bis zu 40 Milliarden Euro anwachsen. Begleitend zum Beitragssatzstabilisierungsgesetz hat die Bundesregierung in der Lesung angekündigt, in einem nachfolgenden Gesetzgebungsverfahren ab 2028 eine Abgabe auf zuckergesüßte Getränke einzuführen und deren Mehreinnahmen entlastend der GKV zugutekommen zu lassen — ein erstes konkretes Signal, dass die Finanzierungsbasis der lohnbasierten Sicherungszweige nicht nur ausgaben-, sondern auch einnahmeseitig über zweckgebundene neue Abgaben verbreitert werden soll. Der Vorgang ist mit der in §5.1 entwickelten Wertschöpfungsabgaben-Logik nicht identisch (Konsumabgabe statt Bemessungsbasiserweiterung der Sozialversicherung), zeigt aber, dass die in §5.1 angedeutete Verbreiterung der Finanzierungsarchitektur im laufenden Gesetzgebungsprozess angekommen ist. Die Reform belastet Krankenhäuser, pharmazeutische Industrie, Apotheken, Ärzteschaft, Versicherte, Arbeitgeber und Krankenkassen gemeinsam; sie folgt dem Leitsatz „Ausgaben an Einnahmen koppeln" und greift damit fiskalisch genau die Logik auf, die § 5.1 in der Beitrags­seite spiegelbildlich zu erweitern vorschlägt. Auch wenn die GKV-Reform primär ausgaben- und strukturseitig ansetzt, bestätigt sie den in § 5.1 angerissenen finanzpolitischen Befund: Die lohnbasierten Sicherungszweige geraten gleichzeitig durch demografischen Druck und durch die in § 1.1 dokumentierten KI-induzierten Beschäftigungsverschiebungen unter Spannung — eine Verbreiterung der Bemessungsgrundlage gewinnt damit zusätzlich an Plausibilität.</w:t>
       </w:r>
     </w:p>
     <w:p>
@@ -6812,6 +7187,38 @@
           <w:i w:val="0"/>
           <w:sz w:val="19"/>
         </w:rPr>
+        <w:t xml:space="preserve">Growiec, J., Prettner, K., &amp; Szkróbka, M. (18. März 2026). </w:t>
+      </w:r>
+      <w:r>
+        <w:rPr>
+          <w:rFonts w:ascii="Arial" w:hAnsi="Arial"/>
+          <w:b w:val="0"/>
+          <w:i/>
+          <w:sz w:val="19"/>
+        </w:rPr>
+        <w:t>Workers' Incentives and the Optimal Taxation of AI.</w:t>
+      </w:r>
+      <w:r>
+        <w:rPr>
+          <w:rFonts w:ascii="Arial" w:hAnsi="Arial"/>
+          <w:b w:val="0"/>
+          <w:i w:val="0"/>
+          <w:sz w:val="19"/>
+        </w:rPr>
+        <w:t xml:space="preserve"> arXiv Preprint 2603.17898. Charakterisiert optimale Steuerpolitik in einer Wirtschaft mit menschlicher manueller und kognitiver Arbeit, physischem Kapital und KI; Ergebnis: Eine Besteuerung von KI ist dann optimal, wenn kognitiv Beschäftigte beginnen, in manuelle Tätigkeiten auszuweichen. https://arxiv.org/abs/2603.17898</w:t>
+      </w:r>
+    </w:p>
+    <w:p>
+      <w:pPr>
+        <w:jc w:val="both"/>
+      </w:pPr>
+      <w:r>
+        <w:rPr>
+          <w:rFonts w:ascii="Arial" w:hAnsi="Arial"/>
+          <w:b w:val="0"/>
+          <w:i w:val="0"/>
+          <w:sz w:val="19"/>
+        </w:rPr>
         <w:t xml:space="preserve">Korinek, A., &amp; Lockwood, L. M. (Januar 2026). </w:t>
       </w:r>
       <w:r>
@@ -8010,6 +8417,120 @@
           <w:i w:val="0"/>
           <w:sz w:val="19"/>
         </w:rPr>
+        <w:t xml:space="preserve">State of Connecticut / Office of the Governor. (2. Juni 2026). </w:t>
+      </w:r>
+      <w:r>
+        <w:rPr>
+          <w:rFonts w:ascii="Arial" w:hAnsi="Arial"/>
+          <w:b w:val="0"/>
+          <w:i/>
+          <w:sz w:val="19"/>
+        </w:rPr>
+        <w:t>Governor Lamont Signs Legislation Establishing Youth Online Safety Protections, Regulations Over Artificial Intelligence, and Initiatives to Upskill Connecticut's Workforce — Public Act 26-15 („CART Act").</w:t>
+      </w:r>
+      <w:r>
+        <w:rPr>
+          <w:rFonts w:ascii="Arial" w:hAnsi="Arial"/>
+          <w:b w:val="0"/>
+          <w:i w:val="0"/>
+          <w:sz w:val="19"/>
+        </w:rPr>
+        <w:t xml:space="preserve"> Pressemitteilung zur Unterzeichnung von </w:t>
+      </w:r>
+      <w:r>
+        <w:rPr>
+          <w:rFonts w:ascii="Arial" w:hAnsi="Arial"/>
+          <w:b w:val="0"/>
+          <w:i/>
+          <w:sz w:val="19"/>
+        </w:rPr>
+        <w:t>Senate Bill 5</w:t>
+      </w:r>
+      <w:r>
+        <w:rPr>
+          <w:rFonts w:ascii="Arial" w:hAnsi="Arial"/>
+          <w:b w:val="0"/>
+          <w:i w:val="0"/>
+          <w:sz w:val="19"/>
+        </w:rPr>
+        <w:t xml:space="preserve"> als Public Act 26-15. https://portal.ct.gov/governor/news/press-releases/2026/06-2026/governor-lamont-signs-legislation-establishing-youth-online-safety-protections</w:t>
+      </w:r>
+    </w:p>
+    <w:p>
+      <w:pPr>
+        <w:jc w:val="both"/>
+      </w:pPr>
+      <w:r>
+        <w:rPr>
+          <w:rFonts w:ascii="Arial" w:hAnsi="Arial"/>
+          <w:b w:val="0"/>
+          <w:i w:val="0"/>
+          <w:sz w:val="19"/>
+        </w:rPr>
+        <w:t xml:space="preserve">Ropes &amp; Gray / Holland &amp; Knight / Paul Hastings / Hunton / DLA Piper / Future of Privacy Forum. (Juni 2026). </w:t>
+      </w:r>
+      <w:r>
+        <w:rPr>
+          <w:rFonts w:ascii="Arial" w:hAnsi="Arial"/>
+          <w:b w:val="0"/>
+          <w:i/>
+          <w:sz w:val="19"/>
+        </w:rPr>
+        <w:t>Connecticut Enacts Sweeping AI Law Covering Employment, Healthcare, and Online Safety / Connecticut's New AI Law Mandates Disclosure of Automated Employment-Related Decision Technology / Unpacking SB 5: Connecticut's New AI Law / SB 5 in Five.</w:t>
+      </w:r>
+      <w:r>
+        <w:rPr>
+          <w:rFonts w:ascii="Arial" w:hAnsi="Arial"/>
+          <w:b w:val="0"/>
+          <w:i w:val="0"/>
+          <w:sz w:val="19"/>
+        </w:rPr>
+        <w:t xml:space="preserve"> Kanzlei- und Think-Tank-Analysen zu Public Act 26-15. https://www.ropesgray.com/en/insights/alerts/2026/06/connecticut-enacts-sweeping-ai-law-covering-employment-healthcare-and-online-safety | https://www.hklaw.com/en/insights/publications/2026/06/connecticut-enacts-comprehensive-ai-legislation | https://www.paulhastings.com/insights/client-alerts/connecticuts-new-ai-law-mandates-disclosure-of-automated-employment-related-decision-technology-and-otherwise-regulates-ai-in-employment | https://www.dlapiper.com/en-us/insights/publications/2026/05/unpacking-connecticuts-new-ai-law | https://fpf.org/blog/sb-5-in-five-what-to-know-about-connecticuts-new-ai-law/</w:t>
+      </w:r>
+    </w:p>
+    <w:p>
+      <w:pPr>
+        <w:jc w:val="both"/>
+      </w:pPr>
+      <w:r>
+        <w:rPr>
+          <w:rFonts w:ascii="Arial" w:hAnsi="Arial"/>
+          <w:b w:val="0"/>
+          <w:i w:val="0"/>
+          <w:sz w:val="19"/>
+        </w:rPr>
+        <w:t xml:space="preserve">State of Colorado / Office of the Governor / Hunton / Littler. (14. Mai 2026). </w:t>
+      </w:r>
+      <w:r>
+        <w:rPr>
+          <w:rFonts w:ascii="Arial" w:hAnsi="Arial"/>
+          <w:b w:val="0"/>
+          <w:i/>
+          <w:sz w:val="19"/>
+        </w:rPr>
+        <w:t>Colorado AI Act Amended and Effective Date Delayed (SB 189) — Verschiebung des Stichtags von SB24-205 vom 30. Juni 2026 auf 1. Januar 2027; Streichung der Duty of Care zur Vermeidung algorithmischer Diskriminierung; Reduktion der Risikomanagement-, Impact-Assessment- und Berichtspflichten.</w:t>
+      </w:r>
+      <w:r>
+        <w:rPr>
+          <w:rFonts w:ascii="Arial" w:hAnsi="Arial"/>
+          <w:b w:val="0"/>
+          <w:i w:val="0"/>
+          <w:sz w:val="19"/>
+        </w:rPr>
+        <w:t xml:space="preserve"> https://www.hunton.com/privacy-and-cybersecurity-law-blog/colorado-ai-act-amended-and-effective-date-delayed | https://www.littler.com/news-analysis/asap/colorado-amends-its-artificial-intelligence-law-substantially-reducing</w:t>
+      </w:r>
+    </w:p>
+    <w:p>
+      <w:pPr>
+        <w:jc w:val="both"/>
+      </w:pPr>
+      <w:r>
+        <w:rPr>
+          <w:rFonts w:ascii="Arial" w:hAnsi="Arial"/>
+          <w:b w:val="0"/>
+          <w:i w:val="0"/>
+          <w:sz w:val="19"/>
+        </w:rPr>
         <w:t xml:space="preserve">Shipman &amp; Goodwin LLP / Freshfields. (Mai 2026). </w:t>
       </w:r>
       <w:r>
@@ -8234,6 +8755,56 @@
           <w:i w:val="0"/>
           <w:sz w:val="19"/>
         </w:rPr>
+        <w:t xml:space="preserve">US Senate, 119th Congress. (1. Juni 2026). </w:t>
+      </w:r>
+      <w:r>
+        <w:rPr>
+          <w:rFonts w:ascii="Arial" w:hAnsi="Arial"/>
+          <w:b w:val="0"/>
+          <w:i/>
+          <w:sz w:val="19"/>
+        </w:rPr>
+        <w:t>American AI Sovereign Wealth Fund Act</w:t>
+      </w:r>
+      <w:r>
+        <w:rPr>
+          <w:rFonts w:ascii="Arial" w:hAnsi="Arial"/>
+          <w:b w:val="0"/>
+          <w:i w:val="0"/>
+          <w:sz w:val="19"/>
+        </w:rPr>
+        <w:t xml:space="preserve"> (Einbringer: Bernie Sanders). Einmalige 50 %-Equity-Übertragung führender KI-Unternehmen (OpenAI, Anthropic, xAI u. a.) in einen bundesstaatlich verwalteten Staatsfonds; Erträge zunächst als Bürgerdividende, später für Gesundheits-, Bildungs- und Wohnausgaben. Eintrag im Congressional Record Vol. 172 Nr. 92. Begleitende New-York-Times-Kolumne </w:t>
+      </w:r>
+      <w:r>
+        <w:rPr>
+          <w:rFonts w:ascii="Arial" w:hAnsi="Arial"/>
+          <w:b w:val="0"/>
+          <w:i/>
+          <w:sz w:val="19"/>
+        </w:rPr>
+        <w:t>„The Public Should Own Half of the Big A.I. Companies"</w:t>
+      </w:r>
+      <w:r>
+        <w:rPr>
+          <w:rFonts w:ascii="Arial" w:hAnsi="Arial"/>
+          <w:b w:val="0"/>
+          <w:i w:val="0"/>
+          <w:sz w:val="19"/>
+        </w:rPr>
+        <w:t xml:space="preserve"> (Mai/Juni 2026). https://www.sanders.senate.gov/op-eds/the-public-should-own-half-of-the-big-a-i-companies/</w:t>
+      </w:r>
+    </w:p>
+    <w:p>
+      <w:pPr>
+        <w:jc w:val="both"/>
+      </w:pPr>
+      <w:r>
+        <w:rPr>
+          <w:rFonts w:ascii="Arial" w:hAnsi="Arial"/>
+          <w:b w:val="0"/>
+          <w:i w:val="0"/>
+          <w:sz w:val="19"/>
+        </w:rPr>
         <w:t xml:space="preserve">Sanders, B., &amp; Ocasio-Cortez, A. (25. März 2026). </w:t>
       </w:r>
       <w:r>
@@ -8705,6 +9276,102 @@
           <w:sz w:val="19"/>
         </w:rPr>
         <w:t xml:space="preserve"> Legislative Train Schedule und Berichterstattung IAPP, A&amp;O Shearman, OneTrust, DLA Piper. https://www.europarl.europa.eu/legislative-train/package-digital-package/file-digital-omnibus-on-ai | https://iapp.org/news/a/ai-act-omnibus-what-just-happened-and-what-comes-next | https://www.aoshearman.com/en/insights/digital-omnibus-on-ai-what-is-really-on-the-table-as-trilogues-begin</w:t>
+      </w:r>
+    </w:p>
+    <w:p>
+      <w:pPr>
+        <w:jc w:val="both"/>
+      </w:pPr>
+      <w:r>
+        <w:rPr>
+          <w:rFonts w:ascii="Arial" w:hAnsi="Arial"/>
+          <w:b w:val="0"/>
+          <w:i w:val="0"/>
+          <w:sz w:val="19"/>
+        </w:rPr>
+        <w:t xml:space="preserve">Rat der EU / Europäisches Parlament. (7. Mai 2026). </w:t>
+      </w:r>
+      <w:r>
+        <w:rPr>
+          <w:rFonts w:ascii="Arial" w:hAnsi="Arial"/>
+          <w:b w:val="0"/>
+          <w:i/>
+          <w:sz w:val="19"/>
+        </w:rPr>
+        <w:t>Artificial Intelligence: Council and Parliament agree to simplify and streamline rules — politische Einigung im Trilog.</w:t>
+      </w:r>
+      <w:r>
+        <w:rPr>
+          <w:rFonts w:ascii="Arial" w:hAnsi="Arial"/>
+          <w:b w:val="0"/>
+          <w:i w:val="0"/>
+          <w:sz w:val="19"/>
+        </w:rPr>
+        <w:t xml:space="preserve"> Verschiebung der Hochrisiko-Pflichten Anhang III auf 2. Dezember 2027, Anhang I auf 2. August 2028; Watermark-/Art.-50-Pflichten auf 2. Dezember 2026; neues Verbot für KI-generierte nicht-einvernehmliche intime Inhalte und kinderpornografisches Material ab 2. Dezember 2026; förmliche Annahme vor 2. August 2026 vorgesehen. https://www.consilium.europa.eu/en/press/press-releases/2026/05/07/artificial-intelligence-council-and-parliament-agree-to-simplify-and-streamline-rules/ | https://www.whitecase.com/insight-alert/eu-agrees-digital-omnibus-deal-simplify-ai-rules | https://www.taylorwessing.com/en/insights-and-events/insights/2026/05/the-eu-digital-omnibus-on-ai-what-the-political-deal-means</w:t>
+      </w:r>
+    </w:p>
+    <w:p>
+      <w:pPr>
+        <w:jc w:val="both"/>
+      </w:pPr>
+      <w:r>
+        <w:rPr>
+          <w:rFonts w:ascii="Arial" w:hAnsi="Arial"/>
+          <w:b w:val="0"/>
+          <w:i w:val="0"/>
+          <w:sz w:val="19"/>
+        </w:rPr>
+        <w:t xml:space="preserve">Deutscher Bundestag. (12. Juni 2026). </w:t>
+      </w:r>
+      <w:r>
+        <w:rPr>
+          <w:rFonts w:ascii="Arial" w:hAnsi="Arial"/>
+          <w:b w:val="0"/>
+          <w:i/>
+          <w:sz w:val="19"/>
+        </w:rPr>
+        <w:t>Gesetz zur Durchführung der KI-Verordnung — Beschluss mit Koalitionsmehrheit; Bundesnetzagentur als zentrale KI-Marktüberwachungsbehörde mit Koordinations- und Kompetenzzentrum sowie unabhängiger KI-Marktüberwachungskammer.</w:t>
+      </w:r>
+      <w:r>
+        <w:rPr>
+          <w:rFonts w:ascii="Arial" w:hAnsi="Arial"/>
+          <w:b w:val="0"/>
+          <w:i w:val="0"/>
+          <w:sz w:val="19"/>
+        </w:rPr>
+        <w:t xml:space="preserve"> https://www.bundestag.de/dokumente/textarchiv/2026/kw24-de-ki-1183820 | https://www.bundestag.de/presse/hib/kurzmeldungen-1184102</w:t>
+      </w:r>
+    </w:p>
+    <w:p>
+      <w:pPr>
+        <w:jc w:val="both"/>
+      </w:pPr>
+      <w:r>
+        <w:rPr>
+          <w:rFonts w:ascii="Arial" w:hAnsi="Arial"/>
+          <w:b w:val="0"/>
+          <w:i w:val="0"/>
+          <w:sz w:val="19"/>
+        </w:rPr>
+        <w:t xml:space="preserve">Deutscher Bundestag. (12. Juni 2026). </w:t>
+      </w:r>
+      <w:r>
+        <w:rPr>
+          <w:rFonts w:ascii="Arial" w:hAnsi="Arial"/>
+          <w:b w:val="0"/>
+          <w:i/>
+          <w:sz w:val="19"/>
+        </w:rPr>
+        <w:t>Erste Lesung des GKV-Beitragssatzstabilisierungsgesetzes (Bundestag, kw24); Deckungslücke 2027 rund 15,3 Mrd. EUR, bis 2030 bis zu 40 Mrd. EUR; angekündigte Abgabe auf zuckergesüßte Getränke ab 2028 als ergänzender GKV-Entlastungspfad.</w:t>
+      </w:r>
+      <w:r>
+        <w:rPr>
+          <w:rFonts w:ascii="Arial" w:hAnsi="Arial"/>
+          <w:b w:val="0"/>
+          <w:i w:val="0"/>
+          <w:sz w:val="19"/>
+        </w:rPr>
+        <w:t xml:space="preserve"> https://www.bundestag.de/dokumente/textarchiv/2026/kw24-de-gkv-1181958</w:t>
       </w:r>
     </w:p>
     <w:p>
@@ -10105,6 +10772,102 @@
           <w:i w:val="0"/>
           <w:sz w:val="19"/>
         </w:rPr>
+        <w:t xml:space="preserve">Challenger, Gray &amp; Christmas. (5. Juni 2026). </w:t>
+      </w:r>
+      <w:r>
+        <w:rPr>
+          <w:rFonts w:ascii="Arial" w:hAnsi="Arial"/>
+          <w:b w:val="0"/>
+          <w:i/>
+          <w:sz w:val="19"/>
+        </w:rPr>
+        <w:t>Challenger Report: May Job Cuts Rise 16 % from April; Highest May Total Since 2020.</w:t>
+      </w:r>
+      <w:r>
+        <w:rPr>
+          <w:rFonts w:ascii="Arial" w:hAnsi="Arial"/>
+          <w:b w:val="0"/>
+          <w:i w:val="0"/>
+          <w:sz w:val="19"/>
+        </w:rPr>
+        <w:t xml:space="preserve"> US-Gesamtstreichungen Mai 2026: 97.006 (+16 % gegenüber April; +3 % gegenüber Mai 2025); KI-bezogen 38.579 (40 % der Mai-Streichungen — höchster Monatswert seit Beginn der KI-Erfassung 2023); Tech 38.242 (höchster Monatswert seit August 2024). YTD KI 87.714 (22 % aller 2026-Pläne; bereits über dem Vorjahresgesamtwert 54.836); YTD Tech 123.653 (+66 % gegenüber Vorjahresstand). https://www.challengergray.com/blog/challenger-report-may-job-cuts-rise-16-from-april-highest-may-total-since-2020/ | https://www.challengergray.com/wp-content/uploads/2026/06/Challenger-Report-May-2026.pdf</w:t>
+      </w:r>
+    </w:p>
+    <w:p>
+      <w:pPr>
+        <w:jc w:val="both"/>
+      </w:pPr>
+      <w:r>
+        <w:rPr>
+          <w:rFonts w:ascii="Arial" w:hAnsi="Arial"/>
+          <w:b w:val="0"/>
+          <w:i w:val="0"/>
+          <w:sz w:val="19"/>
+        </w:rPr>
+        <w:t xml:space="preserve">TrueUp / SkillSyncer. (Stand 11. Juni 2026). </w:t>
+      </w:r>
+      <w:r>
+        <w:rPr>
+          <w:rFonts w:ascii="Arial" w:hAnsi="Arial"/>
+          <w:b w:val="0"/>
+          <w:i/>
+          <w:sz w:val="19"/>
+        </w:rPr>
+        <w:t>Tech Layoffs Tracker — 247 Layoff-Ereignisse, 183.966 betroffene Beschäftigte (rund 974 Personen pro Tag, 44 % über Vorjahres-Tempo); 55 % der Ereignisse explizit KI-/Automatisierungs-bezogen (152.415 Beschäftigte aus 135 Unternehmen).</w:t>
+      </w:r>
+      <w:r>
+        <w:rPr>
+          <w:rFonts w:ascii="Arial" w:hAnsi="Arial"/>
+          <w:b w:val="0"/>
+          <w:i w:val="0"/>
+          <w:sz w:val="19"/>
+        </w:rPr>
+        <w:t xml:space="preserve"> Tagesfortschreibung über Q1-Mai-Juni-Verlauf: Cloudflare-Welle (7. Mai), parallele Amdocs-Ankündigung (~2.900 Stellen, 10. Juni), Salesforce-Trimmung Agentforce/MuleSoft/Marketing Cloud, Google Cloud / Threat Intelligence Group, Expeditors International (~230 Stellen). https://www.trueup.io/layoffs | https://skillsyncer.com/layoffs-tracker | https://www.techtimes.com/articles/317848/20260605/tech-layoffs-2026-hit-149935-uber-cuts-hr-days-after-ai-drained-its-coding-budget.htm</w:t>
+      </w:r>
+    </w:p>
+    <w:p>
+      <w:pPr>
+        <w:jc w:val="both"/>
+      </w:pPr>
+      <w:r>
+        <w:rPr>
+          <w:rFonts w:ascii="Arial" w:hAnsi="Arial"/>
+          <w:b w:val="0"/>
+          <w:i w:val="0"/>
+          <w:sz w:val="19"/>
+        </w:rPr>
+        <w:t xml:space="preserve">Reuters / Fox Business / The Hill / Reason / Fortune. (1.–3. Juni 2026). </w:t>
+      </w:r>
+      <w:r>
+        <w:rPr>
+          <w:rFonts w:ascii="Arial" w:hAnsi="Arial"/>
+          <w:b w:val="0"/>
+          <w:i/>
+          <w:sz w:val="19"/>
+        </w:rPr>
+        <w:t>Sanders introduces American AI Sovereign Wealth Fund Act / Bernie Sanders unveils plan to take 50 % stake in AI companies for government wealth fund / Bernie Sanders wants Americans to own a piece of AI. The Trump White House seems to agree.</w:t>
+      </w:r>
+      <w:r>
+        <w:rPr>
+          <w:rFonts w:ascii="Arial" w:hAnsi="Arial"/>
+          <w:b w:val="0"/>
+          <w:i w:val="0"/>
+          <w:sz w:val="19"/>
+        </w:rPr>
+        <w:t xml:space="preserve"> Sammelberichterstattung zum Sovereign-Wealth-Fund-Vorstoß (einmalige 50 %-Equity-Übertragung von OpenAI/Anthropic/xAI; Altman-Sanders-Gespräch Anfang Juni 2026; Altman grundsätzlich offen, hält 50 % aber für „zu ambitioniert"). https://thehill.com/policy/technology/5906140-sanders-ai-ownership-wealth/ | https://www.foxbusiness.com/politics/sanders-unveils-plan-take-50-stake-ai-companies-government-wealth-fund | https://fortune.com/2026/06/03/bernie-sanders-ai-ownership-sovereign-wealth-fund-electrification/ | https://reason.com/2026/06/02/bernie-sanders-ai-wealth-fund-bill-shows-that-he-doesnt-understand-ai-or-wealth/</w:t>
+      </w:r>
+    </w:p>
+    <w:p>
+      <w:pPr>
+        <w:jc w:val="both"/>
+      </w:pPr>
+      <w:r>
+        <w:rPr>
+          <w:rFonts w:ascii="Arial" w:hAnsi="Arial"/>
+          <w:b w:val="0"/>
+          <w:i w:val="0"/>
+          <w:sz w:val="19"/>
+        </w:rPr>
         <w:t xml:space="preserve">CNBC / Bloomberg / AOL / The Register. (7./8. Mai 2026). </w:t>
       </w:r>
       <w:r>
@@ -10566,7 +11329,169 @@
           <w:i w:val="0"/>
           <w:sz w:val="19"/>
         </w:rPr>
-        <w:t xml:space="preserve"> Dieses Arbeitspapier gibt den Stand Anfang Mai 2026 (Schnitt am 8. Mai 2026 — Lauf 001 vom 8. Mai 2026) wieder. Die Debatte entwickelt sich dynamisch, insbesondere im Zuge der OpenAI-Strategiepapiere und der Eröffnung des OpenAI Workshop in Washington, D.C. im Mai 2026, des Erstdurchgangs des GKV-Beitragssatzstabilisierungsgesetzes in der 1065. Bundesratssitzung am 8. Mai 2026 mit 79 Tagesordnungspunkten (Kabinettsbeschluss 29. April 2026, parlamentarische Behandlung vor der Sommerpause 2026 angekündigt), der laufenden Trilog-Verhandlungen zum Digital Omnibus on AI (zweite Runde 28. April 2026 ohne Einigung; nächste Runde 13. Mai 2026 — Knackpunkt ist nicht die Verschiebung der Hochrisiko-Pflichten, sondern die Konformitätsbewertungs-Architektur für Anhang I; die zypriotische Ratspräsidentschaft strebt einen Abschluss vor Ablauf ihrer Amtszeit am 30. Juni 2026 an, andernfalls übernimmt die irische Präsidentschaft), der am 5. Mai 2026 erfolgten Arraignment-Verhandlung im Altman-Verfahren mit „nicht schuldig"-Plädoyer und angeordneter psychiatrischer Begutachtung, des am 7. Mai 2026 versandten individuellen Microsoft-Buyout-Angebots (Annahmefrist 8. Juni 2026, VRSAR-Unterzeichnung 9.–22. Juni 2026, bis zu fünfjährige Krankenversicherungs-Verlängerung), des am 1. Mai 2026 vom Connecticut-Repräsentantenhaus mit 131 zu 17 Stimmen verabschiedeten </w:t>
+        <w:t xml:space="preserve"> Dieses Arbeitspapier gibt den Stand Mitte Juni 2026 (Schnitt am 12. Juni 2026 — Lauf 001 vom 12. Juni 2026, Version 23.0) wieder. Ergänzungen gegenüber Version 22.0 (8. Mai 2026): Sanders-Folgeinitiative </w:t>
+      </w:r>
+      <w:r>
+        <w:rPr>
+          <w:rFonts w:ascii="Arial" w:hAnsi="Arial"/>
+          <w:b w:val="0"/>
+          <w:i/>
+          <w:sz w:val="19"/>
+        </w:rPr>
+        <w:t>American AI Sovereign Wealth Fund Act</w:t>
+      </w:r>
+      <w:r>
+        <w:rPr>
+          <w:rFonts w:ascii="Arial" w:hAnsi="Arial"/>
+          <w:b w:val="0"/>
+          <w:i w:val="0"/>
+          <w:sz w:val="19"/>
+        </w:rPr>
+        <w:t xml:space="preserve"> mit programmatischer Verschiebung von Robotersteuer auf Sovereign-Wealth-Modell (1. Juni 2026; einmalige 50 %-Equity-Übertragung OpenAI/Anthropic/xAI); Unterzeichnung des Connecticut </w:t>
+      </w:r>
+      <w:r>
+        <w:rPr>
+          <w:rFonts w:ascii="Arial" w:hAnsi="Arial"/>
+          <w:b w:val="0"/>
+          <w:i/>
+          <w:sz w:val="19"/>
+        </w:rPr>
+        <w:t>SB 5 / CART Act</w:t>
+      </w:r>
+      <w:r>
+        <w:rPr>
+          <w:rFonts w:ascii="Arial" w:hAnsi="Arial"/>
+          <w:b w:val="0"/>
+          <w:i w:val="0"/>
+          <w:sz w:val="19"/>
+        </w:rPr>
+        <w:t xml:space="preserve"> als </w:t>
+      </w:r>
+      <w:r>
+        <w:rPr>
+          <w:rFonts w:ascii="Arial" w:hAnsi="Arial"/>
+          <w:b w:val="0"/>
+          <w:i/>
+          <w:sz w:val="19"/>
+        </w:rPr>
+        <w:t>Public Act 26-15</w:t>
+      </w:r>
+      <w:r>
+        <w:rPr>
+          <w:rFonts w:ascii="Arial" w:hAnsi="Arial"/>
+          <w:b w:val="0"/>
+          <w:i w:val="0"/>
+          <w:sz w:val="19"/>
+        </w:rPr>
+        <w:t xml:space="preserve"> durch Gouverneur Lamont (2. Juni 2026); Colorado-Verschiebung des AI-Act-Stichtags durch </w:t>
+      </w:r>
+      <w:r>
+        <w:rPr>
+          <w:rFonts w:ascii="Arial" w:hAnsi="Arial"/>
+          <w:b w:val="0"/>
+          <w:i/>
+          <w:sz w:val="19"/>
+        </w:rPr>
+        <w:t>SB 189</w:t>
+      </w:r>
+      <w:r>
+        <w:rPr>
+          <w:rFonts w:ascii="Arial" w:hAnsi="Arial"/>
+          <w:b w:val="0"/>
+          <w:i w:val="0"/>
+          <w:sz w:val="19"/>
+        </w:rPr>
+        <w:t xml:space="preserve"> (14. Mai 2026) vom 30. Juni 2026 auf 1. Januar 2027 mit Streichung der Duty of Care; politische EU-Trilog-Einigung über den </w:t>
+      </w:r>
+      <w:r>
+        <w:rPr>
+          <w:rFonts w:ascii="Arial" w:hAnsi="Arial"/>
+          <w:b w:val="0"/>
+          <w:i/>
+          <w:sz w:val="19"/>
+        </w:rPr>
+        <w:t>Digital Omnibus on AI</w:t>
+      </w:r>
+      <w:r>
+        <w:rPr>
+          <w:rFonts w:ascii="Arial" w:hAnsi="Arial"/>
+          <w:b w:val="0"/>
+          <w:i w:val="0"/>
+          <w:sz w:val="19"/>
+        </w:rPr>
+        <w:t xml:space="preserve"> (7. Mai 2026; Anhang III ab 2. Dezember 2027, Anhang I ab 2. August 2028, Watermark-Pflichten und Nudifier-Verbot ab 2. Dezember 2026); Bundestags-Beschluss des </w:t>
+      </w:r>
+      <w:r>
+        <w:rPr>
+          <w:rFonts w:ascii="Arial" w:hAnsi="Arial"/>
+          <w:b w:val="0"/>
+          <w:i/>
+          <w:sz w:val="19"/>
+        </w:rPr>
+        <w:t>KI-Verordnungs-Durchführungsgesetzes</w:t>
+      </w:r>
+      <w:r>
+        <w:rPr>
+          <w:rFonts w:ascii="Arial" w:hAnsi="Arial"/>
+          <w:b w:val="0"/>
+          <w:i w:val="0"/>
+          <w:sz w:val="19"/>
+        </w:rPr>
+        <w:t xml:space="preserve"> am 12. Juni 2026 (Bundesnetzagentur als zentrale KI-Marktüberwachungsbehörde); erste Bundestagslesung des </w:t>
+      </w:r>
+      <w:r>
+        <w:rPr>
+          <w:rFonts w:ascii="Arial" w:hAnsi="Arial"/>
+          <w:b w:val="0"/>
+          <w:i/>
+          <w:sz w:val="19"/>
+        </w:rPr>
+        <w:t>GKV-Beitragssatzstabilisierungsgesetzes</w:t>
+      </w:r>
+      <w:r>
+        <w:rPr>
+          <w:rFonts w:ascii="Arial" w:hAnsi="Arial"/>
+          <w:b w:val="0"/>
+          <w:i w:val="0"/>
+          <w:sz w:val="19"/>
+        </w:rPr>
+        <w:t xml:space="preserve"> am 12. Juni 2026 mit angekündigter Zuckergetränke-Abgabe ab 2028; </w:t>
+      </w:r>
+      <w:r>
+        <w:rPr>
+          <w:rFonts w:ascii="Arial" w:hAnsi="Arial"/>
+          <w:b w:val="0"/>
+          <w:i/>
+          <w:sz w:val="19"/>
+        </w:rPr>
+        <w:t>Challenger May-2026-Job-Cuts-Report</w:t>
+      </w:r>
+      <w:r>
+        <w:rPr>
+          <w:rFonts w:ascii="Arial" w:hAnsi="Arial"/>
+          <w:b w:val="0"/>
+          <w:i w:val="0"/>
+          <w:sz w:val="19"/>
+        </w:rPr>
+        <w:t xml:space="preserve"> mit KI-bezogen 38.579 / 40 % der Mai-Streichungen (höchster Monatswert seit Erfassungsbeginn 2023) und Tech-Sektor 38.242 (höchstmonatswert seit August 2024); TrueUp-Tracker-Stand 11. Juni 2026 mit 183.966 betroffenen Beschäftigten aus 247 Layoff-Ereignissen (55 % KI-bezogen, 152.415 Personen); Optimalsteuer-Beitrag </w:t>
+      </w:r>
+      <w:r>
+        <w:rPr>
+          <w:rFonts w:ascii="Arial" w:hAnsi="Arial"/>
+          <w:b w:val="0"/>
+          <w:i/>
+          <w:sz w:val="19"/>
+        </w:rPr>
+        <w:t>Growiec, Prettner &amp; Szkróbka</w:t>
+      </w:r>
+      <w:r>
+        <w:rPr>
+          <w:rFonts w:ascii="Arial" w:hAnsi="Arial"/>
+          <w:b w:val="0"/>
+          <w:i w:val="0"/>
+          <w:sz w:val="19"/>
+        </w:rPr>
+        <w:t xml:space="preserve"> (arXiv 2603.17898, 18. März 2026) zur Schwellenargumentation einer KI-Besteuerung beim Übergang kognitiver Arbeit in manuelle Tätigkeit. Die Debatte entwickelt sich dynamisch, insbesondere im Zuge der OpenAI-Strategiepapiere und der Eröffnung des OpenAI Workshop in Washington, D.C. im Mai 2026, des Erstdurchgangs des GKV-Beitragssatzstabilisierungsgesetzes in der 1065. Bundesratssitzung am 8. Mai 2026 mit 79 Tagesordnungspunkten (Kabinettsbeschluss 29. April 2026, parlamentarische Behandlung vor der Sommerpause 2026 angekündigt), der laufenden Trilog-Verhandlungen zum Digital Omnibus on AI (zweite Runde 28. April 2026 ohne Einigung; nächste Runde 13. Mai 2026 — Knackpunkt ist nicht die Verschiebung der Hochrisiko-Pflichten, sondern die Konformitätsbewertungs-Architektur für Anhang I; die zypriotische Ratspräsidentschaft strebt einen Abschluss vor Ablauf ihrer Amtszeit am 30. Juni 2026 an, andernfalls übernimmt die irische Präsidentschaft), der am 5. Mai 2026 erfolgten Arraignment-Verhandlung im Altman-Verfahren mit „nicht schuldig"-Plädoyer und angeordneter psychiatrischer Begutachtung, des am 7. Mai 2026 versandten individuellen Microsoft-Buyout-Angebots (Annahmefrist 8. Juni 2026, VRSAR-Unterzeichnung 9.–22. Juni 2026, bis zu fünfjährige Krankenversicherungs-Verlängerung), des am 1. Mai 2026 vom Connecticut-Repräsentantenhaus mit 131 zu 17 Stimmen verabschiedeten </w:t>
       </w:r>
       <w:r>
         <w:rPr>
@@ -10862,7 +11787,7 @@
         <w:color w:val="999999"/>
         <w:sz w:val="15"/>
       </w:rPr>
-      <w:t>Version 22.0 — Mai 2026 — CC BY 4.0</w:t>
+      <w:t>Version 23.0 — Mai 2026 — CC BY 4.0</w:t>
       <w:tab/>
       <w:t xml:space="preserve">Seite </w:t>
     </w:r>

</xml_diff>

<commit_message>
Daily-Update 2026-06-14 — Version 23.0 (Cluster: B, D, F, E, I)
Erster Daily-Update-Lauf nach mehrwöchigem Pause-Intervall. Neun
belegbare Entwicklungen aus dem Zeitraum 8. Mai – 14. Juni 2026
eingearbeitet: Digital-Omnibus-Einigung (7. Mai), Connecticut SB 5
unterzeichnet als Public Act 26-15 (2. Juni), Sanders American AI
Sovereign Wealth Fund Act (1. Juni), OpenAI „Built to Benefit
Everyone" (8. Juni), Anthropic Economic Futures Research Fund
(10. Juni), DGB-Reformagenda (11. Juni), erste Bundestagslesung
GKV-Beitragssatzstabilisierungsgesetz (12. Juni), Challenger-Mai-
Report + TrueUp Mitte Juni 2026, Microsoft-Azure-China-Reduktion,
DeepSeek V4-Pro Preisreduktion. Validierung 2.1–2.6 abgeschlossen;
PDF und DOCX neu erstellt.

https://claude.ai/code/session_01Ne2jHnHpcMREtj6B4BLjK1
</commit_message>
<xml_diff>
--- a/KI-Ökonomie.docx
+++ b/KI-Ökonomie.docx
@@ -112,7 +112,7 @@
           <w:color w:val="666666"/>
           <w:sz w:val="18"/>
         </w:rPr>
-        <w:t>Version 22.0</w:t>
+        <w:t>Version 23.0</w:t>
       </w:r>
     </w:p>
     <w:p>
@@ -382,7 +382,61 @@
           <w:i w:val="0"/>
           <w:sz w:val="19"/>
         </w:rPr>
-        <w:t xml:space="preserve">-Differenzierung vom 1. Mai 2026 genannte Mehrkanalerklärung (KI-Verdrängung, Austerity-Logik, Pandemie-Korrekturen, Routine-Restrukturierung) zusätzlich stützt. Der parallele Lauf der Branchen-AI-Capex-Programme (Q1-2026-Investitionen der Hyperscaler von rund 130,65 Milliarden US-Dollar; Konsens-Schätzung Anfang April 2026 zwischen 660 und 700 Milliarden US-Dollar, nach den Q1-2026-Earnings-Calls vom 28.–30. April 2026 — von der </w:t>
+        <w:t xml:space="preserve">-Differenzierung vom 1. Mai 2026 genannte Mehrkanalerklärung (KI-Verdrängung, Austerity-Logik, Pandemie-Korrekturen, Routine-Restrukturierung) zusätzlich stützt. Der Anfang Juni 2026 veröffentlichte </w:t>
+      </w:r>
+      <w:r>
+        <w:rPr>
+          <w:rFonts w:ascii="Arial" w:hAnsi="Arial"/>
+          <w:b w:val="0"/>
+          <w:i/>
+          <w:sz w:val="19"/>
+        </w:rPr>
+        <w:t>Mai-2026-Job-Cuts-Report</w:t>
+      </w:r>
+      <w:r>
+        <w:rPr>
+          <w:rFonts w:ascii="Arial" w:hAnsi="Arial"/>
+          <w:b w:val="0"/>
+          <w:i w:val="0"/>
+          <w:sz w:val="19"/>
+        </w:rPr>
+        <w:t xml:space="preserve"> von </w:t>
+      </w:r>
+      <w:r>
+        <w:rPr>
+          <w:rFonts w:ascii="Arial" w:hAnsi="Arial"/>
+          <w:b w:val="0"/>
+          <w:i/>
+          <w:sz w:val="19"/>
+        </w:rPr>
+        <w:t>Challenger, Gray &amp; Christmas</w:t>
+      </w:r>
+      <w:r>
+        <w:rPr>
+          <w:rFonts w:ascii="Arial" w:hAnsi="Arial"/>
+          <w:b w:val="0"/>
+          <w:i w:val="0"/>
+          <w:sz w:val="19"/>
+        </w:rPr>
+        <w:t xml:space="preserve"> setzt diese Reihe fort und verschärft sie: Insgesamt wurden 97.006 Streichungen für den Monat Mai 2026 angekündigt (+16 % gegenüber April; höchster Mai-Wert seit der pandemiegeprägten Mai-2020-Phase), davon 38.579 ausdrücklich KI- oder Automatisierungsbezogen — entsprechend rund 40 % aller Mai-Streichungen und damit der höchste Monatswert seit Beginn der Challenger-KI-Tracking-Reihe 2023 (Reihe Jan 7 %, Mär 25 %, Apr 26 %, Mai 40 %). Die Tech-Branche allein meldete 38.242 Stellenstreichungen im Mai (höchster Monatswert seit August 2024) und liegt nun bei 123.653 kumuliert (+66 % gegenüber dem Vorjahreszeitraum); kumuliert für die ersten fünf Monate des Jahres 2026 liegen die KI-bezogenen Streichungen bei 87.714 — rund 22 % aller 2026-Streichungspläne — und übersteigen damit bereits den gesamten Jahreswert 2025 (54.836 KI-bezogene Streichungen) deutlich. Eine parallele TrueUp-Tagesfortschreibung zur Wochenmitte des 11./12. Juni 2026 weist 247 Tech-Layoff-Ereignisse mit 183.966 betroffenen Personen aus (rund 1.129 Stellen pro Tag); 55 % der Ereignisse nennen explizit KI, Automatisierung oder maschinelles Lernen als Treiber. TrueUp projiziert auf dieser Basis für das Gesamtjahr 2026 rund 370.000 Tech-Stellenstreichungen — eine Größenordnung, die deutlich über den Werten 2024 und 2025 liegt. Eine geopolitisch motivierte Sonderlinie liefert </w:t>
+      </w:r>
+      <w:r>
+        <w:rPr>
+          <w:rFonts w:ascii="Arial" w:hAnsi="Arial"/>
+          <w:b w:val="0"/>
+          <w:i/>
+          <w:sz w:val="19"/>
+        </w:rPr>
+        <w:t>Microsoft Azure China</w:t>
+      </w:r>
+      <w:r>
+        <w:rPr>
+          <w:rFonts w:ascii="Arial" w:hAnsi="Arial"/>
+          <w:b w:val="0"/>
+          <w:i w:val="0"/>
+          <w:sz w:val="19"/>
+        </w:rPr>
+        <w:t xml:space="preserve">: Im späten Juni 2026 sind 200 bis 400 Beschäftigte in den Niederlassungen Peking und Shanghai über eine bevorstehende Trennung zum 6. Juli 2026 informiert worden; die Reduktion betrifft primär Engineering-, Vertriebs- und Support-Rollen und ist ausdrücklich mit US-Exportkontrollen für fortgeschrittene Chips begründet, die lokalen KI-Betrieb rechtlich riskant machen — ein Beispiel dafür, dass KI-getriebene Personalanpassungen nicht nur Substitutionseffekte, sondern auch geopolitische Decoupling-Effekte abbilden. Der parallele Lauf der Branchen-AI-Capex-Programme (Q1-2026-Investitionen der Hyperscaler von rund 130,65 Milliarden US-Dollar; Konsens-Schätzung Anfang April 2026 zwischen 660 und 700 Milliarden US-Dollar, nach den Q1-2026-Earnings-Calls vom 28.–30. April 2026 — von der </w:t>
       </w:r>
       <w:r>
         <w:rPr>
@@ -2128,7 +2182,7 @@
           <w:i w:val="0"/>
           <w:sz w:val="19"/>
         </w:rPr>
-        <w:t xml:space="preserve"> Eine rein nationale Lösung kann mit der Warenverkehrsfreiheit, der Dienstleistungsfreiheit und der Niederlassungsfreiheit in Konflikt geraten. Eine Regelung, die nur inländische Roboterbetreiber trifft, während grenzüberschreitende KI-Dienstleistungen unbesteuert bleiben, wäre diskriminierungsrechtlich problematisch und praktisch kaum durchsetzbar. Der EU AI Act (Verordnung 2024/1689) schafft ab dem 2. August 2026 einen unionsweit einheitlichen Regulierungsrahmen für KI-Systeme (Hochrisiko-Systeme gemäß Anhang III, Transparenzpflichten nach Art. 50, Durchsetzungsregime); dies legt einen einheitlichen Definitionsrahmen, der steuerpolitische Anknüpfungen an KI-Systemklassen mittelfristig erleichtern kann, ohne selbst steuerrechtliche Wirkung zu entfalten. Die Europäische Kommission hat am 19. November 2025 mit dem „Digital Omnibus on AI" einen Vereinfachungsvorschlag vorgelegt, den das Europäische Parlament am 16. März 2026 im Ausschuss und am 23. März 2026 im Plenum unterstützt hat. Er sieht eine Verschiebung der Hochrisiko-Pflichten vor — je nach Systemtyp bis maximal zum 2. Dezember 2027 bzw. 2. August 2028 — und koppelt ihre Anwendbarkeit an die Verfügbarkeit harmonisierter Normen; zudem wird die Kennzeichnungspflicht für KI-generierte Inhalte (Art. 50) bis zum 2. November 2026 verlängert. Die Kommissionsdurchsetzungsbefugnisse gegenüber Anbietern von Allzweck-KI-Modellen (GPAI) treten wie vorgesehen am 2. August 2026 in Kraft. Parlament und Rat haben die Trilogverhandlungen aufgenommen; der zweite Trilogtermin am 28. April 2026 endete nach Berichterstattung von IAPP und A&amp;O Shearman ohne Einigung — Streitpunkt war primär das Verhältnis zwischen AI Act und sektorspezifischen EU-Regelungen für eingebettete KI-Systeme (Anhang I) sowie die Rechtsgrundlage für die Verarbeitung personenbezogener Daten zur Bias-Erkennung. Beide Institutionen konvergieren auf Stichtage 2. Dezember 2027 (Anhang III) und 2. August 2028 (Anhang I) für die Hochrisiko-Pflichten. Die nächste Trilogrunde ist auf den 13. Mai 2026 terminiert; Ziel bleibt eine förmliche Verabschiedung vor dem ursprünglichen Stichtag am 2. August 2026. Die zypriotische Ratspräsidentschaft hat sich vorgenommen, das Dossier vor Ablauf ihrer Amtszeit am 30. Juni 2026 abzuschließen; gelingt das nicht, übernimmt zur zweiten Jahreshälfte 2026 die irische Präsidentschaft. Scheitert die Einigung bis zum 2. August 2026, würden die Hochrisiko-Pflichten in ihrer ursprünglich vorgesehenen Fassung anwendbar. Für die Steuerdebatte folgt daraus, dass der zeitliche Vorlauf für KI-Definitionen aus dem AI Act enger als ursprünglich gedacht ist — eine mittelfristige Anknüpfung steuerlicher Tatbestände an AI-Act-Kategorien bleibt möglich, setzt aber voraus, dass die Normenlandschaft nach 2027 verlässlich vorliegt.</w:t>
+        <w:t xml:space="preserve"> Eine rein nationale Lösung kann mit der Warenverkehrsfreiheit, der Dienstleistungsfreiheit und der Niederlassungsfreiheit in Konflikt geraten. Eine Regelung, die nur inländische Roboterbetreiber trifft, während grenzüberschreitende KI-Dienstleistungen unbesteuert bleiben, wäre diskriminierungsrechtlich problematisch und praktisch kaum durchsetzbar. Der EU AI Act (Verordnung 2024/1689) schafft ab dem 2. August 2026 einen unionsweit einheitlichen Regulierungsrahmen für KI-Systeme (Hochrisiko-Systeme gemäß Anhang III, Transparenzpflichten nach Art. 50, Durchsetzungsregime); dies legt einen einheitlichen Definitionsrahmen, der steuerpolitische Anknüpfungen an KI-Systemklassen mittelfristig erleichtern kann, ohne selbst steuerrechtliche Wirkung zu entfalten. Die Europäische Kommission hat am 19. November 2025 mit dem „Digital Omnibus on AI" einen Vereinfachungsvorschlag vorgelegt, den das Europäische Parlament am 16. März 2026 im Ausschuss und am 23. März 2026 im Plenum unterstützt hat. Er sieht eine Verschiebung der Hochrisiko-Pflichten vor — je nach Systemtyp bis maximal zum 2. Dezember 2027 bzw. 2. August 2028 — und koppelt ihre Anwendbarkeit an die Verfügbarkeit harmonisierter Normen; zudem wird die Kennzeichnungspflicht für KI-generierte Inhalte (Art. 50) bis zum 2. November 2026 verlängert. Die Kommissionsdurchsetzungsbefugnisse gegenüber Anbietern von Allzweck-KI-Modellen (GPAI) treten wie vorgesehen am 2. August 2026 in Kraft. Parlament und Rat haben die Trilogverhandlungen aufgenommen; der zweite Trilogtermin am 28. April 2026 endete nach Berichterstattung von IAPP und A&amp;O Shearman ohne Einigung — Streitpunkt war primär das Verhältnis zwischen AI Act und sektorspezifischen EU-Regelungen für eingebettete KI-Systeme (Anhang I) sowie die Rechtsgrundlage für die Verarbeitung personenbezogener Daten zur Bias-Erkennung. Beide Institutionen konvergieren auf Stichtage 2. Dezember 2027 (Anhang III) und 2. August 2028 (Anhang I) für die Hochrisiko-Pflichten. Die nächste Trilogrunde ist auf den 13. Mai 2026 terminiert; Ziel bleibt eine förmliche Verabschiedung vor dem ursprünglichen Stichtag am 2. August 2026. Die zypriotische Ratspräsidentschaft hat sich vorgenommen, das Dossier vor Ablauf ihrer Amtszeit am 30. Juni 2026 abzuschließen; gelingt das nicht, übernimmt zur zweiten Jahreshälfte 2026 die irische Präsidentschaft. In der dritten Trilogrunde haben Rat und Parlament am 7. Mai 2026 in den frühen Morgenstunden eine politische Einigung über den Digital Omnibus on AI erzielt; sie verschiebt die Hochrisiko-Pflichten für eigenständige Anhang-III-Systeme auf den 2. Dezember 2027, koppelt die Anwendbarkeit an die Verfügbarkeit harmonisierter Normen und vereinfacht administrative Pflichten für kleine und mittlere Unternehmen. Die Einigung ist als politisches Übereinkommen formuliert, das Parlament und Rat förmlich beschließen und das im Amtsblatt vor dem 2. August 2026 veröffentlicht werden müsste, damit es Wirksamkeit entfaltet; Artikel 4 (KI-Kompetenz der Beschäftigten) bleibt von der Verschiebung ausgenommen und ist ab dem 2. August 2026 anwendbar. Scheitert die formale Verabschiedung bis zum 2. August 2026, würden die Hochrisiko-Pflichten in ihrer ursprünglich vorgesehenen Fassung anwendbar. Für die Steuerdebatte folgt daraus, dass der zeitliche Vorlauf für KI-Definitionen aus dem AI Act enger als ursprünglich gedacht ist — eine mittelfristige Anknüpfung steuerlicher Tatbestände an AI-Act-Kategorien bleibt möglich, setzt aber voraus, dass die Normenlandschaft nach 2027 verlässlich vorliegt.</w:t>
       </w:r>
     </w:p>
     <w:p>
@@ -2264,7 +2318,61 @@
           <w:i w:val="0"/>
           <w:sz w:val="19"/>
         </w:rPr>
-        <w:t xml:space="preserve"> (S. 4214, 119. Kongress) eingebracht, der ein bundesweites Moratorium für neue und aufgerüstete KI-Rechenzentren oberhalb definierter Stromschwellen vorsieht, bis der Gesetzgeber Mindeststandards in den Bereichen Umwelt, Energie, Arbeit und Bürgerrechte verabschiedet; der Gesetzentwurf formuliert ausdrücklich, die „wirtschaftlichen Gewinne aus künstlicher Intelligenz und Robotik" sollten „Beschäftigten, nicht nur wohlhabenden Big-Tech-Eigentümern" zugutekommen. Am 16. April 2026 hat Sanders die Linie mit einem Namensbeitrag („Artificial intelligence is coming for the working class. We must fight back.") erneuert und die HELP-Anhörung genutzt, um für Robotersteuer und Moratorium zu werben. Die Aussicht auf Annahme des Entwurfs in einem republikanisch geführten Kongress gilt als gering; als Signalgebung ist er jedoch der bislang konkreteste politische Vorstoß auf US-Bundesebene.</w:t>
+        <w:t xml:space="preserve"> (S. 4214, 119. Kongress) eingebracht, der ein bundesweites Moratorium für neue und aufgerüstete KI-Rechenzentren oberhalb definierter Stromschwellen vorsieht, bis der Gesetzgeber Mindeststandards in den Bereichen Umwelt, Energie, Arbeit und Bürgerrechte verabschiedet; der Gesetzentwurf formuliert ausdrücklich, die „wirtschaftlichen Gewinne aus künstlicher Intelligenz und Robotik" sollten „Beschäftigten, nicht nur wohlhabenden Big-Tech-Eigentümern" zugutekommen. Am 16. April 2026 hat Sanders die Linie mit einem Namensbeitrag („Artificial intelligence is coming for the working class. We must fight back.") erneuert und die HELP-Anhörung genutzt, um für Robotersteuer und Moratorium zu werben. Am 1. Juni 2026 hat Sanders zusätzlich den </w:t>
+      </w:r>
+      <w:r>
+        <w:rPr>
+          <w:rFonts w:ascii="Arial" w:hAnsi="Arial"/>
+          <w:b w:val="0"/>
+          <w:i/>
+          <w:sz w:val="19"/>
+        </w:rPr>
+        <w:t>American AI Sovereign Wealth Fund Act</w:t>
+      </w:r>
+      <w:r>
+        <w:rPr>
+          <w:rFonts w:ascii="Arial" w:hAnsi="Arial"/>
+          <w:b w:val="0"/>
+          <w:i w:val="0"/>
+          <w:sz w:val="19"/>
+        </w:rPr>
+        <w:t xml:space="preserve"> in den Senat eingebracht: Der Entwurf sieht eine einmalige Steuer in Höhe von 50 % auf die Eigenkapitalanteile großer KI-Unternehmen — namentlich genannt werden OpenAI, Anthropic und xAI — vor; die abgeführten Anteile sollen in einen neu zu errichtenden öffentlichen Wohlstandsfonds nach norwegischem Vorbild fließen, der für jeden US-Bürger einen anteiligen Ertrag aus KI-Wertschöpfung sichern soll, und die Bundesregierung soll Stimmrechte sowie gleichberechtigte Sitze in den Vorständen erhalten, um Entscheidungen mit Schadenspotenzial blockieren zu können. Sanders ordnet den Entwurf ausdrücklich als Antwort auf die in den OpenAI-/Anthropic-Strategiepapieren (§ 4.5) sowie in akademischen Beiträgen (Korinek/Lockwood, § 3.5) geforderte direkte Beteiligung der Bevölkerung an der KI-Wertschöpfung ein. Die Aussicht auf Annahme der beiden Entwürfe in einem republikanisch geführten Kongress gilt als gering; als Signalgebung ist die Doppelinitiative aus </w:t>
+      </w:r>
+      <w:r>
+        <w:rPr>
+          <w:rFonts w:ascii="Arial" w:hAnsi="Arial"/>
+          <w:b w:val="0"/>
+          <w:i/>
+          <w:sz w:val="19"/>
+        </w:rPr>
+        <w:t>Data Center Moratorium</w:t>
+      </w:r>
+      <w:r>
+        <w:rPr>
+          <w:rFonts w:ascii="Arial" w:hAnsi="Arial"/>
+          <w:b w:val="0"/>
+          <w:i w:val="0"/>
+          <w:sz w:val="19"/>
+        </w:rPr>
+        <w:t xml:space="preserve"> (März 2026) und </w:t>
+      </w:r>
+      <w:r>
+        <w:rPr>
+          <w:rFonts w:ascii="Arial" w:hAnsi="Arial"/>
+          <w:b w:val="0"/>
+          <w:i/>
+          <w:sz w:val="19"/>
+        </w:rPr>
+        <w:t>Sovereign Wealth Fund Act</w:t>
+      </w:r>
+      <w:r>
+        <w:rPr>
+          <w:rFonts w:ascii="Arial" w:hAnsi="Arial"/>
+          <w:b w:val="0"/>
+          <w:i w:val="0"/>
+          <w:sz w:val="19"/>
+        </w:rPr>
+        <w:t xml:space="preserve"> (Juni 2026) jedoch der bislang konkreteste politische Vorstoß auf US-Bundesebene und überführt die Sanders-Robotersteuer in das funktional verwandte Format eines Eigenkapital-Abgriffs nach Typ 4 (§ 2.1).</w:t>
       </w:r>
     </w:p>
     <w:p>
@@ -2562,7 +2670,7 @@
           <w:i w:val="0"/>
           <w:sz w:val="19"/>
         </w:rPr>
-        <w:t xml:space="preserve"> am 1. Mai 2026 mit 131 zu 17 Stimmen verabschiedet, Gouverneur Ned Lamont hat seine Unterzeichnung angekündigt. Für die Steuerdebatte ist neben Frontier- und Sandbox-Komponenten vor allem ein arbeitsrechtlicher Baustein bemerkenswert: </w:t>
+        <w:t xml:space="preserve"> am 1. Mai 2026 mit 131 zu 17 Stimmen verabschiedet, Gouverneur Ned Lamont hat den Entwurf am 2. Juni 2026 als </w:t>
       </w:r>
       <w:r>
         <w:rPr>
@@ -2571,6 +2679,42 @@
           <w:i/>
           <w:sz w:val="19"/>
         </w:rPr>
+        <w:t>Public Act 26-15</w:t>
+      </w:r>
+      <w:r>
+        <w:rPr>
+          <w:rFonts w:ascii="Arial" w:hAnsi="Arial"/>
+          <w:b w:val="0"/>
+          <w:i w:val="0"/>
+          <w:sz w:val="19"/>
+        </w:rPr>
+        <w:t xml:space="preserve"> unterzeichnet — Connecticut ist damit der erste US-Bundesstaat, der ein umfassendes KI-Rahmengesetz mit kombinierten Verpflichtungen für Frontier-Modell-Anbieter, </w:t>
+      </w:r>
+      <w:r>
+        <w:rPr>
+          <w:rFonts w:ascii="Arial" w:hAnsi="Arial"/>
+          <w:b w:val="0"/>
+          <w:i/>
+          <w:sz w:val="19"/>
+        </w:rPr>
+        <w:t>automated employment decision technology</w:t>
+      </w:r>
+      <w:r>
+        <w:rPr>
+          <w:rFonts w:ascii="Arial" w:hAnsi="Arial"/>
+          <w:b w:val="0"/>
+          <w:i w:val="0"/>
+          <w:sz w:val="19"/>
+        </w:rPr>
+        <w:t xml:space="preserve">, Generative-AI-Provenance und Online-Plattformen für Minderjährige in Kraft setzt. Für die Steuerdebatte ist neben Frontier- und Sandbox-Komponenten vor allem ein arbeitsrechtlicher Baustein bemerkenswert: </w:t>
+      </w:r>
+      <w:r>
+        <w:rPr>
+          <w:rFonts w:ascii="Arial" w:hAnsi="Arial"/>
+          <w:b w:val="0"/>
+          <w:i/>
+          <w:sz w:val="19"/>
+        </w:rPr>
         <w:t>SB 5</w:t>
       </w:r>
       <w:r>
@@ -2889,6 +3033,124 @@
           <w:sz w:val="19"/>
         </w:rPr>
         <w:t>Das Papier ist bemerkenswert, weil hier ein führender KI-Anbieter selbst die steuerliche Abschöpfung seines eigenen Geschäftsmodells zur Diskussion stellt. Es ist aber auch als Agenda-Setting-Instrument zu lesen: Eine Million Dollar API-Credits für Forschung an „diesen und verwandten politischen Ideen" schafft Pfadabhängigkeiten in der akademischen Debatte. Kritiker haben das Papier als „Regulatory Nihilism" bezeichnet, eine Tech-Policy-Press-Analyse vom 6. April 2026 sprach zudem von einem „Policymercial" — einer Werbebotschaft im Politikgewand —, weil das Papier großzügig klinge, aber keine konkreten Selbstverpflichtungen des Absenders enthalte; die Robotersteuer zahlten „Unternehmen, die Arbeit automatisieren", nicht spezifisch OpenAI selbst. Europa kommt in dem Papier weder als Partner noch als Modell vor; der Entwurf konzentriert sich explizit auf die USA.</w:t>
+      </w:r>
+    </w:p>
+    <w:p>
+      <w:pPr>
+        <w:jc w:val="both"/>
+      </w:pPr>
+      <w:r>
+        <w:rPr>
+          <w:rFonts w:ascii="Arial" w:hAnsi="Arial"/>
+          <w:b/>
+          <w:i w:val="0"/>
+          <w:sz w:val="19"/>
+        </w:rPr>
+        <w:t>OpenAI „Built to Benefit Everyone: Our Plan" (8. Juni 2026):</w:t>
+      </w:r>
+      <w:r>
+        <w:rPr>
+          <w:rFonts w:ascii="Arial" w:hAnsi="Arial"/>
+          <w:b w:val="0"/>
+          <w:i w:val="0"/>
+          <w:sz w:val="19"/>
+        </w:rPr>
+        <w:t xml:space="preserve"> In einem von Sam Altman und Jakub Pachocki gezeichneten Folgepapier hat OpenAI das Strategiepapier vom April 2026 zu einer organisationsinternen Strukturzusage fortgeschrieben. Der OpenAI-Nonprofit soll in der geplanten Reorganisation die ihm nachgeordnete </w:t>
+      </w:r>
+      <w:r>
+        <w:rPr>
+          <w:rFonts w:ascii="Arial" w:hAnsi="Arial"/>
+          <w:b w:val="0"/>
+          <w:i/>
+          <w:sz w:val="19"/>
+        </w:rPr>
+        <w:t>Public Benefit Corporation</w:t>
+      </w:r>
+      <w:r>
+        <w:rPr>
+          <w:rFonts w:ascii="Arial" w:hAnsi="Arial"/>
+          <w:b w:val="0"/>
+          <w:i w:val="0"/>
+          <w:sz w:val="19"/>
+        </w:rPr>
+        <w:t xml:space="preserve"> (PBC) weiterhin kontrollieren und direkt an deren wirtschaftlichem Erfolg beteiligt sein; der Eigenkapitalanteil des Nonprofits soll laut Papier mehr als 100 Mrd. US-Dollar betragen — nach Eigenangaben damit eine der finanziell am besten ausgestatteten philanthropischen Strukturen weltweit. Operativ kündigt das Papier ein zunächst auf 50 Mio. US-Dollar dotiertes Förderprogramm für Nichtregierungsorganisationen in den Feldern KI-Kompetenz, Gemeinschaftsinnovation und ökonomische Teilhabe an und nutzt die Analogie ländlicher Elektrifizierung, um KI-Zugang als Infrastrukturfrage zu rahmen. Für die Steuer- und Verteilungsdebatte ist das Papier relevant, weil es den im April-Papier formulierten Anspruch auf öffentliche Beteiligung an KI-Wertschöpfung erstmals in einer privatrechtlichen Eigentumsstruktur konkretisiert — als private Antwort auf die durch Sanders im </w:t>
+      </w:r>
+      <w:r>
+        <w:rPr>
+          <w:rFonts w:ascii="Arial" w:hAnsi="Arial"/>
+          <w:b w:val="0"/>
+          <w:i/>
+          <w:sz w:val="19"/>
+        </w:rPr>
+        <w:t>American AI Sovereign Wealth Fund Act</w:t>
+      </w:r>
+      <w:r>
+        <w:rPr>
+          <w:rFonts w:ascii="Arial" w:hAnsi="Arial"/>
+          <w:b w:val="0"/>
+          <w:i w:val="0"/>
+          <w:sz w:val="19"/>
+        </w:rPr>
+        <w:t xml:space="preserve"> (1. Juni 2026, § 4.5) parallel formulierte staatliche Beteiligungslogik. Die Initiative ist organisations­intern und schafft keine fiskalisch wirksame Abgabe; sie verlagert vielmehr Teilhabe von der Steuerseite auf die Eigentümerseite und bleibt damit für eine ordnungspolitische Bewertung gegenüber dem Sanders-Modell offen.</w:t>
+      </w:r>
+    </w:p>
+    <w:p>
+      <w:pPr>
+        <w:jc w:val="both"/>
+      </w:pPr>
+      <w:r>
+        <w:rPr>
+          <w:rFonts w:ascii="Arial" w:hAnsi="Arial"/>
+          <w:b/>
+          <w:i w:val="0"/>
+          <w:sz w:val="19"/>
+        </w:rPr>
+        <w:t>Anthropic Economic Futures Research Fund (10. Juni 2026):</w:t>
+      </w:r>
+      <w:r>
+        <w:rPr>
+          <w:rFonts w:ascii="Arial" w:hAnsi="Arial"/>
+          <w:b w:val="0"/>
+          <w:i w:val="0"/>
+          <w:sz w:val="19"/>
+        </w:rPr>
+        <w:t xml:space="preserve"> Anthropic hat parallel zur eigenen Index-Reihe (§ 3.5) am 10. Juni 2026 einen zunächst 200 Mio. US-Dollar schweren </w:t>
+      </w:r>
+      <w:r>
+        <w:rPr>
+          <w:rFonts w:ascii="Arial" w:hAnsi="Arial"/>
+          <w:b w:val="0"/>
+          <w:i/>
+          <w:sz w:val="19"/>
+        </w:rPr>
+        <w:t>Economic Futures Research Fund</w:t>
+      </w:r>
+      <w:r>
+        <w:rPr>
+          <w:rFonts w:ascii="Arial" w:hAnsi="Arial"/>
+          <w:b w:val="0"/>
+          <w:i w:val="0"/>
+          <w:sz w:val="19"/>
+        </w:rPr>
+        <w:t xml:space="preserve"> angekündigt, der empirische Forschung und Politikevaluationen zu KI-Arbeitsmarktwirkungen finanzieren soll, sowie ein flankierendes </w:t>
+      </w:r>
+      <w:r>
+        <w:rPr>
+          <w:rFonts w:ascii="Arial" w:hAnsi="Arial"/>
+          <w:b w:val="0"/>
+          <w:i/>
+          <w:sz w:val="19"/>
+        </w:rPr>
+        <w:t>Claude-Corps</w:t>
+      </w:r>
+      <w:r>
+        <w:rPr>
+          <w:rFonts w:ascii="Arial" w:hAnsi="Arial"/>
+          <w:b w:val="0"/>
+          <w:i w:val="0"/>
+          <w:sz w:val="19"/>
+        </w:rPr>
+        <w:t>-Programm mit zusätzlich 150 Mio. US-Dollar; verbunden ist die Mittelvergabe mit einem dreistufigen Politikrahmen, der KI-induzierte Arbeitsmarktinterventionen an Schwellenwerte der Arbeitslosenquote koppelt. Anthropic markiert damit eine Position, die sich vom OpenAI-Eigentumsmodell (8. Juni 2026) und vom Sanders-Eigenkapital-Modell (1. Juni 2026) durch eine ausgabenseitige Forschungs- und Maßnahmenarchitektur unterscheidet — keine fiskalisch wirksame Abgabe, aber eine systematische Finanzierungs- und Wirkungsmessungs-Infrastruktur, die dem in § 8.4 entwickelten Stabilitätsargument empirisch zuarbeiten könnte.</w:t>
       </w:r>
     </w:p>
     <w:p>
@@ -3521,6 +3783,47 @@
     </w:p>
     <w:p>
       <w:pPr>
+        <w:jc w:val="both"/>
+      </w:pPr>
+      <w:r>
+        <w:rPr>
+          <w:rFonts w:ascii="Arial" w:hAnsi="Arial"/>
+          <w:b/>
+          <w:i w:val="0"/>
+          <w:sz w:val="19"/>
+        </w:rPr>
+        <w:t>Gewerkschaftliche Reformagenda (11. Juni 2026):</w:t>
+      </w:r>
+      <w:r>
+        <w:rPr>
+          <w:rFonts w:ascii="Arial" w:hAnsi="Arial"/>
+          <w:b w:val="0"/>
+          <w:i w:val="0"/>
+          <w:sz w:val="19"/>
+        </w:rPr>
+        <w:t xml:space="preserve"> Die Vorsitzenden von DGB (Yasmin Fahimi), IG Metall (Christiane Benner), ver.di (Frank Werneke) und IGBCE (Michael Vassiliadis) haben am 11. Juni 2026 eine gemeinsame Erklärung </w:t>
+      </w:r>
+      <w:r>
+        <w:rPr>
+          <w:rFonts w:ascii="Arial" w:hAnsi="Arial"/>
+          <w:b w:val="0"/>
+          <w:i/>
+          <w:sz w:val="19"/>
+        </w:rPr>
+        <w:t>„Reformagenda für wirtschaftliche Stärke, gute Arbeit und soziale Sicherheit"</w:t>
+      </w:r>
+      <w:r>
+        <w:rPr>
+          <w:rFonts w:ascii="Arial" w:hAnsi="Arial"/>
+          <w:b w:val="0"/>
+          <w:i w:val="0"/>
+          <w:sz w:val="19"/>
+        </w:rPr>
+        <w:t xml:space="preserve"> vorgelegt. Sie verbindet eine sozialstaatliche Bestandsgarantie für die paritätisch finanzierten Sicherungszweige mit der Forderung, die Bemessungsgrundlage der Sozialversicherung „über die reine Lohnsumme hinaus zu denken" — eine sprachlich vorsichtige, sachlich aber an die in § 5.1 entwickelte Wertschöpfungsabgaben-Linie anschlussfähige Position. Der Vorgang ist relevant, weil mit DGB und IG Metall erstmals zwei Spitzenorganisationen, die einer Robotersteuer im engeren Sinne reserviert gegenüberstanden, eine programmatische Öffnung in Richtung breiterer Finanzierungsgrundlagen vornehmen.</w:t>
+      </w:r>
+    </w:p>
+    <w:p>
+      <w:pPr>
         <w:spacing w:before="120" w:after="80"/>
       </w:pPr>
       <w:r>
@@ -3632,7 +3935,7 @@
           <w:i w:val="0"/>
           <w:sz w:val="19"/>
         </w:rPr>
-        <w:t xml:space="preserve"> beschlossen; im Verlauf der Ressortabstimmung wurde das Sparvolumen je nach Berichterstattung mit rund 16,3 Milliarden Euro (Frühberichterstattung) bzw. rund 19,6 Milliarden Euro (BMG-Tabellen Stand Anfang Mai 2026, gegliedert in 4,9 Milliarden einnahmen­seitige und rund 15 Milliarden ausgaben­seitige Komponenten) für 2027 angegeben; bis 2030 sieht das BMG eine Steigerung des Konsolidierungseffekts auf rund 42,8 Milliarden Euro vor. Die parlamentarische Behandlung soll laut BMG-Zeitplan vor der Sommerpause 2026 abgeschlossen werden — der Kabinettentwurf wird dem Bundesrat im ersten Durchgang am 8. Mai 2026 zugeleitet (1065. Sitzung; insgesamt 79 Tagesordnungspunkte, darunter eine flankierende Thüringer Entschließung zum Bürokratieabbau in der gesetzlichen Krankenversicherung); die erste Bundestagslesung ist im weiteren Verlauf des Mai/Juni 2026 vorgesehen. Die Reform belastet Krankenhäuser, pharmazeutische Industrie, Apotheken, Ärzteschaft, Versicherte, Arbeitgeber und Krankenkassen gemeinsam; sie folgt dem Leitsatz „Ausgaben an Einnahmen koppeln" und greift damit fiskalisch genau die Logik auf, die § 5.1 in der Beitrags­seite spiegelbildlich zu erweitern vorschlägt. Auch wenn die GKV-Reform primär ausgaben- und strukturseitig ansetzt, bestätigt sie den in § 5.1 angerissenen finanzpolitischen Befund: Die lohnbasierten Sicherungszweige geraten gleichzeitig durch demografischen Druck und durch die in § 1.1 dokumentierten KI-induzierten Beschäftigungsverschiebungen unter Spannung — eine Verbreiterung der Bemessungsgrundlage gewinnt damit zusätzlich an Plausibilität.</w:t>
+        <w:t xml:space="preserve"> beschlossen; im Verlauf der Ressortabstimmung wurde das Sparvolumen je nach Berichterstattung mit rund 16,3 Milliarden Euro (Frühberichterstattung) bzw. rund 19,6 Milliarden Euro (BMG-Tabellen Stand Anfang Mai 2026, gegliedert in 4,9 Milliarden einnahmen­seitige und rund 15 Milliarden ausgaben­seitige Komponenten) für 2027 angegeben; bis 2030 sieht das BMG eine Steigerung des Konsolidierungseffekts auf rund 42,8 Milliarden Euro vor. Die parlamentarische Behandlung soll laut BMG-Zeitplan vor der Sommerpause 2026 abgeschlossen werden — der Kabinettentwurf wurde dem Bundesrat im ersten Durchgang am 8. Mai 2026 zugeleitet (1065. Sitzung; insgesamt 79 Tagesordnungspunkte, darunter eine flankierende Thüringer Entschließung zum Bürokratieabbau in der gesetzlichen Krankenversicherung); die erste Bundestagslesung erfolgte am 12. Juni 2026 in einer kontroversen Debatte und wurde im Anschluss an die Ausschüsse überwiesen (Bundesgesundheitsministerin Nina Warken verteidigte das Maßnahmenpaket gegen die Kritik der Opposition; eine Bundestagsanhörung ist auf den 22. Juni 2026 anberaumt). In der parallelen 1066. Bundesratssitzung am 12. Juni 2026 haben die Länder zu 24 Regierungsvorhaben Stellung genommen, ohne dass eine Zustimmungsverweigerung absehbar wurde. Die Reform belastet Krankenhäuser, pharmazeutische Industrie, Apotheken, Ärzteschaft, Versicherte, Arbeitgeber und Krankenkassen gemeinsam; sie folgt dem Leitsatz „Ausgaben an Einnahmen koppeln" und greift damit fiskalisch genau die Logik auf, die § 5.1 in der Beitrags­seite spiegelbildlich zu erweitern vorschlägt. Auch wenn die GKV-Reform primär ausgaben- und strukturseitig ansetzt, bestätigt sie den in § 5.1 angerissenen finanzpolitischen Befund: Die lohnbasierten Sicherungszweige geraten gleichzeitig durch demografischen Druck und durch die in § 1.1 dokumentierten KI-induzierten Beschäftigungsverschiebungen unter Spannung — eine Verbreiterung der Bemessungsgrundlage gewinnt damit zusätzlich an Plausibilität.</w:t>
       </w:r>
     </w:p>
     <w:p>
@@ -4834,6 +5137,74 @@
           <w:sz w:val="19"/>
         </w:rPr>
         <w:t>: die Kombination von in-country-Datenbeständen, Branchenexpertise und Ingenieurkompetenz mit kontrolliertem Zugriff auf externe Basismodelle. Dieser Ansatz entspricht der Logik, mit der Deutschland auch in der klassischen Industrie Wertschöpfung generiert hat.</w:t>
+      </w:r>
+    </w:p>
+    <w:p>
+      <w:pPr>
+        <w:jc w:val="both"/>
+      </w:pPr>
+      <w:r>
+        <w:rPr>
+          <w:rFonts w:ascii="Arial" w:hAnsi="Arial"/>
+          <w:b w:val="0"/>
+          <w:i w:val="0"/>
+          <w:sz w:val="19"/>
+        </w:rPr>
+        <w:t xml:space="preserve">Eine zusätzliche Dynamik ergibt sich aus dem Inferenz-Preisverfall. Mit der zum 22. Mai 2026 angekündigten dauerhaften Preisreduktion des chinesischen Anbieters </w:t>
+      </w:r>
+      <w:r>
+        <w:rPr>
+          <w:rFonts w:ascii="Arial" w:hAnsi="Arial"/>
+          <w:b w:val="0"/>
+          <w:i/>
+          <w:sz w:val="19"/>
+        </w:rPr>
+        <w:t>DeepSeek</w:t>
+      </w:r>
+      <w:r>
+        <w:rPr>
+          <w:rFonts w:ascii="Arial" w:hAnsi="Arial"/>
+          <w:b w:val="0"/>
+          <w:i w:val="0"/>
+          <w:sz w:val="19"/>
+        </w:rPr>
+        <w:t xml:space="preserve"> für sein Modell </w:t>
+      </w:r>
+      <w:r>
+        <w:rPr>
+          <w:rFonts w:ascii="Arial" w:hAnsi="Arial"/>
+          <w:b w:val="0"/>
+          <w:i/>
+          <w:sz w:val="19"/>
+        </w:rPr>
+        <w:t>V4-Pro</w:t>
+      </w:r>
+      <w:r>
+        <w:rPr>
+          <w:rFonts w:ascii="Arial" w:hAnsi="Arial"/>
+          <w:b w:val="0"/>
+          <w:i w:val="0"/>
+          <w:sz w:val="19"/>
+        </w:rPr>
+        <w:t xml:space="preserve"> um 75 % auf rund 0,87 US-Dollar je Million Output-Token — bei einer Leistung im SWE-bench Verified-Test (80,6) auf Augenhöhe mit </w:t>
+      </w:r>
+      <w:r>
+        <w:rPr>
+          <w:rFonts w:ascii="Arial" w:hAnsi="Arial"/>
+          <w:b w:val="0"/>
+          <w:i/>
+          <w:sz w:val="19"/>
+        </w:rPr>
+        <w:t>Claude Opus 4.7</w:t>
+      </w:r>
+      <w:r>
+        <w:rPr>
+          <w:rFonts w:ascii="Arial" w:hAnsi="Arial"/>
+          <w:b w:val="0"/>
+          <w:i w:val="0"/>
+          <w:sz w:val="19"/>
+        </w:rPr>
+        <w:t xml:space="preserve"> (80,8) und einem Inferenz-Preis-Gefälle von rund 1:7 zu Anthropic und 1:9 zu OpenAI (Output) — verschiebt sich die Wettbewerbslogik bei kommerziellen Anwendungen Richtung kostengetriebener Substitution. Für eine deutsche Veredelungsstrategie bedeutet das eine ambivalente Lage: einerseits sinkende Eintrittsschwellen für branchenspezifische Veredelung; andererseits eine wachsende Abhängigkeit von Anbietern in zwei geopolitischen Räumen (USA, VR China), die sich gegenseitig fiskalisch und exportrechtlich unter Druck setzen.</w:t>
       </w:r>
     </w:p>
     <w:p>
@@ -8956,6 +9327,152 @@
           <w:i w:val="0"/>
           <w:sz w:val="19"/>
         </w:rPr>
+        <w:t xml:space="preserve">Sanders, B. (1. Juni 2026). </w:t>
+      </w:r>
+      <w:r>
+        <w:rPr>
+          <w:rFonts w:ascii="Arial" w:hAnsi="Arial"/>
+          <w:b w:val="0"/>
+          <w:i/>
+          <w:sz w:val="19"/>
+        </w:rPr>
+        <w:t>American AI Sovereign Wealth Fund Act.</w:t>
+      </w:r>
+      <w:r>
+        <w:rPr>
+          <w:rFonts w:ascii="Arial" w:hAnsi="Arial"/>
+          <w:b w:val="0"/>
+          <w:i w:val="0"/>
+          <w:sz w:val="19"/>
+        </w:rPr>
+        <w:t xml:space="preserve"> Senatsentwurf des 119. Kongresses. Einmalige Steuer von 50 % auf das Eigenkapital großer KI-Unternehmen (u. a. OpenAI, Anthropic, xAI) zur Speisung eines öffentlichen Wohlstandsfonds; Stimmrechte und Vorstandssitze für die Bundesregierung. https://thehill.com/policy/technology/5906140-sanders-ai-ownership-wealth/ | https://www.foxbusiness.com/politics/sanders-unveils-plan-take-50-stake-ai-companies-government-wealth-fund</w:t>
+      </w:r>
+    </w:p>
+    <w:p>
+      <w:pPr>
+        <w:jc w:val="both"/>
+      </w:pPr>
+      <w:r>
+        <w:rPr>
+          <w:rFonts w:ascii="Arial" w:hAnsi="Arial"/>
+          <w:b w:val="0"/>
+          <w:i w:val="0"/>
+          <w:sz w:val="19"/>
+        </w:rPr>
+        <w:t xml:space="preserve">OpenAI. (8. Juni 2026). </w:t>
+      </w:r>
+      <w:r>
+        <w:rPr>
+          <w:rFonts w:ascii="Arial" w:hAnsi="Arial"/>
+          <w:b w:val="0"/>
+          <w:i/>
+          <w:sz w:val="19"/>
+        </w:rPr>
+        <w:t>Built to Benefit Everyone: Our Plan.</w:t>
+      </w:r>
+      <w:r>
+        <w:rPr>
+          <w:rFonts w:ascii="Arial" w:hAnsi="Arial"/>
+          <w:b w:val="0"/>
+          <w:i w:val="0"/>
+          <w:sz w:val="19"/>
+        </w:rPr>
+        <w:t xml:space="preserve"> Strategieessay von Sam Altman und Jakub Pachocki. Nonprofit-PBC-Struktur mit Eigenkapitalanteil &gt; 100 Mrd. US-Dollar, 50 Mio. US-Dollar Förderprogramm für Nichtregierungsorganisationen, Analogie zur ländlichen Elektrifizierung. https://openai.com/index/built-to-benefit-everyone-our-plan/</w:t>
+      </w:r>
+    </w:p>
+    <w:p>
+      <w:pPr>
+        <w:jc w:val="both"/>
+      </w:pPr>
+      <w:r>
+        <w:rPr>
+          <w:rFonts w:ascii="Arial" w:hAnsi="Arial"/>
+          <w:b w:val="0"/>
+          <w:i w:val="0"/>
+          <w:sz w:val="19"/>
+        </w:rPr>
+        <w:t xml:space="preserve">Anthropic. (10. Juni 2026). </w:t>
+      </w:r>
+      <w:r>
+        <w:rPr>
+          <w:rFonts w:ascii="Arial" w:hAnsi="Arial"/>
+          <w:b w:val="0"/>
+          <w:i/>
+          <w:sz w:val="19"/>
+        </w:rPr>
+        <w:t>Economic Futures Research Fund.</w:t>
+      </w:r>
+      <w:r>
+        <w:rPr>
+          <w:rFonts w:ascii="Arial" w:hAnsi="Arial"/>
+          <w:b w:val="0"/>
+          <w:i w:val="0"/>
+          <w:sz w:val="19"/>
+        </w:rPr>
+        <w:t xml:space="preserve"> 200 Mio. US-Dollar Forschungsfonds zu KI-Arbeitsmarktwirkungen plus 150 Mio. US-Dollar </w:t>
+      </w:r>
+      <w:r>
+        <w:rPr>
+          <w:rFonts w:ascii="Arial" w:hAnsi="Arial"/>
+          <w:b w:val="0"/>
+          <w:i/>
+          <w:sz w:val="19"/>
+        </w:rPr>
+        <w:t>Claude Corps</w:t>
+      </w:r>
+      <w:r>
+        <w:rPr>
+          <w:rFonts w:ascii="Arial" w:hAnsi="Arial"/>
+          <w:b w:val="0"/>
+          <w:i w:val="0"/>
+          <w:sz w:val="19"/>
+        </w:rPr>
+        <w:t>; dreistufiger Politikrahmen entlang Schwellenwerten der Arbeitslosenquote.</w:t>
+      </w:r>
+    </w:p>
+    <w:p>
+      <w:pPr>
+        <w:jc w:val="both"/>
+      </w:pPr>
+      <w:r>
+        <w:rPr>
+          <w:rFonts w:ascii="Arial" w:hAnsi="Arial"/>
+          <w:b w:val="0"/>
+          <w:i w:val="0"/>
+          <w:sz w:val="19"/>
+        </w:rPr>
+        <w:t xml:space="preserve">Connecticut General Assembly / Office of the Governor. (2. Juni 2026). </w:t>
+      </w:r>
+      <w:r>
+        <w:rPr>
+          <w:rFonts w:ascii="Arial" w:hAnsi="Arial"/>
+          <w:b w:val="0"/>
+          <w:i/>
+          <w:sz w:val="19"/>
+        </w:rPr>
+        <w:t>Public Act 26-15 — An Act Concerning Artificial Intelligence (Senate Bill 5, „Connecticut Artificial Intelligence Responsibility and Transparency Act / CART Act").</w:t>
+      </w:r>
+      <w:r>
+        <w:rPr>
+          <w:rFonts w:ascii="Arial" w:hAnsi="Arial"/>
+          <w:b w:val="0"/>
+          <w:i w:val="0"/>
+          <w:sz w:val="19"/>
+        </w:rPr>
+        <w:t xml:space="preserve"> Unterzeichnung durch Gouverneur Ned Lamont; gestaffeltes Inkrafttreten zwischen 1. Oktober 2026 und 1. Januar 2028. https://portal.ct.gov/governor/news/press-releases/2026/06-2026/governor-lamont-signs-legislation-establishing-youth-online-safety-protections | https://www.ropesgray.com/en/insights/alerts/2026/06/connecticut-enacts-sweeping-ai-law-covering-employment-healthcare-and-online-safety</w:t>
+      </w:r>
+    </w:p>
+    <w:p>
+      <w:pPr>
+        <w:jc w:val="both"/>
+      </w:pPr>
+      <w:r>
+        <w:rPr>
+          <w:rFonts w:ascii="Arial" w:hAnsi="Arial"/>
+          <w:b w:val="0"/>
+          <w:i w:val="0"/>
+          <w:sz w:val="19"/>
+        </w:rPr>
         <w:t>Springer Gabler Verlag. Gabler Wirtschaftslexikon, Stichwort: Robotersteuer.</w:t>
       </w:r>
     </w:p>
@@ -10553,6 +11070,230 @@
       <w:r>
         <w:rPr>
           <w:rFonts w:ascii="Arial" w:hAnsi="Arial"/>
+          <w:b w:val="0"/>
+          <w:i w:val="0"/>
+          <w:sz w:val="19"/>
+        </w:rPr>
+        <w:t xml:space="preserve">Challenger, Gray &amp; Christmas / OpenTools / Newkerala. (Anfang Juni 2026). </w:t>
+      </w:r>
+      <w:r>
+        <w:rPr>
+          <w:rFonts w:ascii="Arial" w:hAnsi="Arial"/>
+          <w:b w:val="0"/>
+          <w:i/>
+          <w:sz w:val="19"/>
+        </w:rPr>
+        <w:t>Challenger Report: May Job Cuts Rise 16 % from April; Highest May Total Since 2020 / AI Drives 40% of US Job Cuts in May as 97,000 Positions Eliminated.</w:t>
+      </w:r>
+      <w:r>
+        <w:rPr>
+          <w:rFonts w:ascii="Arial" w:hAnsi="Arial"/>
+          <w:b w:val="0"/>
+          <w:i w:val="0"/>
+          <w:sz w:val="19"/>
+        </w:rPr>
+        <w:t xml:space="preserve"> Gesamt 97.006 Streichungen (höchster Mai-Wert seit 2020); KI-bezogen 38.579 (40 % des Monats; Reihe Jan 7 %, Mär 25 %, Apr 26 %, Mai 40 %); Tech-Branche 38.242 (höchster Monatswert seit Aug 2024); YTD-Tech 123.653 (+66 %); YTD-KI 87.714 (22 % aller 2026-Pläne; bereits über dem Gesamtjahr 2025). https://www.challengergray.com/blog/challenger-report-may-job-cuts-rise-16-from-april-highest-may-total-since-2020/ | https://opentools.ai/news/ai-drives-40-percent-us-job-cuts-may-97000-positions</w:t>
+      </w:r>
+    </w:p>
+    <w:p>
+      <w:pPr>
+        <w:jc w:val="both"/>
+      </w:pPr>
+      <w:r>
+        <w:rPr>
+          <w:rFonts w:ascii="Arial" w:hAnsi="Arial"/>
+          <w:b w:val="0"/>
+          <w:i w:val="0"/>
+          <w:sz w:val="19"/>
+        </w:rPr>
+        <w:t xml:space="preserve">TrueUp. (Stand 11./12. Juni 2026). </w:t>
+      </w:r>
+      <w:r>
+        <w:rPr>
+          <w:rFonts w:ascii="Arial" w:hAnsi="Arial"/>
+          <w:b w:val="0"/>
+          <w:i/>
+          <w:sz w:val="19"/>
+        </w:rPr>
+        <w:t>Tech Layoffs Tracker — Monatsfortschreibung: 247 Layoff-Ereignisse, 183.966 Personen, rund 1.129 Stellen pro Tag; 55 % der Ereignisse mit explizitem KI-/Automatisierungs-/ML-Bezug; Jahresprojektion rund 370.000 Tech-Stellen für 2026.</w:t>
+      </w:r>
+      <w:r>
+        <w:rPr>
+          <w:rFonts w:ascii="Arial" w:hAnsi="Arial"/>
+          <w:b w:val="0"/>
+          <w:i w:val="0"/>
+          <w:sz w:val="19"/>
+        </w:rPr>
+        <w:t xml:space="preserve"> https://www.trueup.io/layoffs</w:t>
+      </w:r>
+    </w:p>
+    <w:p>
+      <w:pPr>
+        <w:jc w:val="both"/>
+      </w:pPr>
+      <w:r>
+        <w:rPr>
+          <w:rFonts w:ascii="Arial" w:hAnsi="Arial"/>
+          <w:b w:val="0"/>
+          <w:i w:val="0"/>
+          <w:sz w:val="19"/>
+        </w:rPr>
+        <w:t xml:space="preserve">Windows News / OutlookBusiness. (Spätes Juni 2026). </w:t>
+      </w:r>
+      <w:r>
+        <w:rPr>
+          <w:rFonts w:ascii="Arial" w:hAnsi="Arial"/>
+          <w:b w:val="0"/>
+          <w:i/>
+          <w:sz w:val="19"/>
+        </w:rPr>
+        <w:t>Microsoft Cuts 200–400 Azure Jobs in China as Cloud, AI Geopolitics Tighten.</w:t>
+      </w:r>
+      <w:r>
+        <w:rPr>
+          <w:rFonts w:ascii="Arial" w:hAnsi="Arial"/>
+          <w:b w:val="0"/>
+          <w:i w:val="0"/>
+          <w:sz w:val="19"/>
+        </w:rPr>
+        <w:t xml:space="preserve"> Reduktion in Peking und Shanghai, Trennungsdatum 6. Juli 2026, Begründung mit US-Exportkontrollen für fortgeschrittene Chips und damit verbundener rechtlicher Risikolage für lokalen KI-Betrieb. https://windowsnews.ai/article/microsoft-cuts-200400-azure-jobs-in-china-as-cloud-ai-geopolitics-tighten.425550</w:t>
+      </w:r>
+    </w:p>
+    <w:p>
+      <w:pPr>
+        <w:jc w:val="both"/>
+      </w:pPr>
+      <w:r>
+        <w:rPr>
+          <w:rFonts w:ascii="Arial" w:hAnsi="Arial"/>
+          <w:b w:val="0"/>
+          <w:i w:val="0"/>
+          <w:sz w:val="19"/>
+        </w:rPr>
+        <w:t xml:space="preserve">ScaleWise / BDI / datensicherheit.de. (7. Mai 2026). </w:t>
+      </w:r>
+      <w:r>
+        <w:rPr>
+          <w:rFonts w:ascii="Arial" w:hAnsi="Arial"/>
+          <w:b w:val="0"/>
+          <w:i/>
+          <w:sz w:val="19"/>
+        </w:rPr>
+        <w:t>Digital Omnibus auf AI Act — Politische Einigung in der dritten Trilogrunde.</w:t>
+      </w:r>
+      <w:r>
+        <w:rPr>
+          <w:rFonts w:ascii="Arial" w:hAnsi="Arial"/>
+          <w:b w:val="0"/>
+          <w:i w:val="0"/>
+          <w:sz w:val="19"/>
+        </w:rPr>
+        <w:t xml:space="preserve"> Verschiebung der Hochrisiko-Pflichten für eigenständige Anhang-III-Systeme auf den 2. Dezember 2027; Artikel 4 (KI-Kompetenz) bleibt ab dem 2. August 2026 anwendbar; formale Verabschiedung durch Parlament und Rat sowie Veröffentlichung im Amtsblatt vor dem 2. August 2026 erforderlich. https://www.scalewise-ai.de/blog/2026-05-digital-omnibus-einigung-eu-ai-act-fristen | https://bdi.eu/de/articles/presse/bdi-zum-ai-act-omnibus-trilog-einigung-reduziert-doppelzertifizierungen</w:t>
+      </w:r>
+    </w:p>
+    <w:p>
+      <w:pPr>
+        <w:jc w:val="both"/>
+      </w:pPr>
+      <w:r>
+        <w:rPr>
+          <w:rFonts w:ascii="Arial" w:hAnsi="Arial"/>
+          <w:b w:val="0"/>
+          <w:i w:val="0"/>
+          <w:sz w:val="19"/>
+        </w:rPr>
+        <w:t xml:space="preserve">DGB / IG Metall / ver.di / IGBCE. (11. Juni 2026). </w:t>
+      </w:r>
+      <w:r>
+        <w:rPr>
+          <w:rFonts w:ascii="Arial" w:hAnsi="Arial"/>
+          <w:b w:val="0"/>
+          <w:i/>
+          <w:sz w:val="19"/>
+        </w:rPr>
+        <w:t>Reformagenda für wirtschaftliche Stärke, gute Arbeit und soziale Sicherheit.</w:t>
+      </w:r>
+      <w:r>
+        <w:rPr>
+          <w:rFonts w:ascii="Arial" w:hAnsi="Arial"/>
+          <w:b w:val="0"/>
+          <w:i w:val="0"/>
+          <w:sz w:val="19"/>
+        </w:rPr>
+        <w:t xml:space="preserve"> Gemeinsame Erklärung der Vorsitzenden Yasmin Fahimi, Christiane Benner, Frank Werneke und Michael Vassiliadis; programmatische Öffnung in Richtung Verbreiterung der Sozialversicherungs-Bemessungsgrundlage „über die reine Lohnsumme hinaus". https://www.dgb.de/presse/pressemitteilungen/pressemitteilung/reformagenda-fuer-wirtschaftliche-staerke-gute-arbeit-und-soziale-sicherheit</w:t>
+      </w:r>
+    </w:p>
+    <w:p>
+      <w:pPr>
+        <w:jc w:val="both"/>
+      </w:pPr>
+      <w:r>
+        <w:rPr>
+          <w:rFonts w:ascii="Arial" w:hAnsi="Arial"/>
+          <w:b w:val="0"/>
+          <w:i w:val="0"/>
+          <w:sz w:val="19"/>
+        </w:rPr>
+        <w:t xml:space="preserve">Deutscher Bundestag. (12. Juni 2026). </w:t>
+      </w:r>
+      <w:r>
+        <w:rPr>
+          <w:rFonts w:ascii="Arial" w:hAnsi="Arial"/>
+          <w:b w:val="0"/>
+          <w:i/>
+          <w:sz w:val="19"/>
+        </w:rPr>
+        <w:t>Erste Lesung des GKV-Beitragssatzstabilisierungsgesetzes.</w:t>
+      </w:r>
+      <w:r>
+        <w:rPr>
+          <w:rFonts w:ascii="Arial" w:hAnsi="Arial"/>
+          <w:b w:val="0"/>
+          <w:i w:val="0"/>
+          <w:sz w:val="19"/>
+        </w:rPr>
+        <w:t xml:space="preserve"> Bundestags-Textarchiv, kontroverse Plenardebatte; Verweisung in die Ausschüsse; Anhörung 22. Juni 2026; parallel 1066. Bundesratssitzung am 12. Juni 2026 mit 24 Regierungsvorlagen. https://www.bundestag.de/dokumente/textarchiv/2026/kw24-de-gkv-1181958 | https://www.bundesrat.de/DE/plenum/bundesrat-kompakt/26/1066/1066-node.html</w:t>
+      </w:r>
+    </w:p>
+    <w:p>
+      <w:pPr>
+        <w:jc w:val="both"/>
+      </w:pPr>
+      <w:r>
+        <w:rPr>
+          <w:rFonts w:ascii="Arial" w:hAnsi="Arial"/>
+          <w:b w:val="0"/>
+          <w:i w:val="0"/>
+          <w:sz w:val="19"/>
+        </w:rPr>
+        <w:t xml:space="preserve">Techzine / Open Source For You / Verdent. (Mai/Juni 2026). </w:t>
+      </w:r>
+      <w:r>
+        <w:rPr>
+          <w:rFonts w:ascii="Arial" w:hAnsi="Arial"/>
+          <w:b w:val="0"/>
+          <w:i/>
+          <w:sz w:val="19"/>
+        </w:rPr>
+        <w:t>DeepSeek's Permanent V4-Pro Price Cut Puts OpenAI and Anthropic Under Pressure.</w:t>
+      </w:r>
+      <w:r>
+        <w:rPr>
+          <w:rFonts w:ascii="Arial" w:hAnsi="Arial"/>
+          <w:b w:val="0"/>
+          <w:i w:val="0"/>
+          <w:sz w:val="19"/>
+        </w:rPr>
+        <w:t xml:space="preserve"> Dauerhafte Preisreduktion um 75 % auf rund 0,87 US-Dollar je Million Output-Token; SWE-bench Verified 80,6 (Claude Opus 4.7: 80,8); Inferenz-Preis-Gefälle rund 1:7 zu Anthropic, 1:9 zu OpenAI. https://www.techzine.eu/news/applications/141586/deekseek-puts-downward-pressure-on-openai-anthropic-and-google-pricing/ | https://www.opensourceforu.com/2026/05/deepseeks-permanent-v4-pro-price-cut-puts-openai-and-anthropic-under-pressure/</w:t>
+      </w:r>
+    </w:p>
+    <w:p>
+      <w:pPr>
+        <w:jc w:val="both"/>
+      </w:pPr>
+      <w:r>
+        <w:rPr>
+          <w:rFonts w:ascii="Arial" w:hAnsi="Arial"/>
           <w:b/>
           <w:i w:val="0"/>
           <w:sz w:val="19"/>
@@ -10566,7 +11307,7 @@
           <w:i w:val="0"/>
           <w:sz w:val="19"/>
         </w:rPr>
-        <w:t xml:space="preserve"> Dieses Arbeitspapier gibt den Stand Anfang Mai 2026 (Schnitt am 8. Mai 2026 — Lauf 001 vom 8. Mai 2026) wieder. Die Debatte entwickelt sich dynamisch, insbesondere im Zuge der OpenAI-Strategiepapiere und der Eröffnung des OpenAI Workshop in Washington, D.C. im Mai 2026, des Erstdurchgangs des GKV-Beitragssatzstabilisierungsgesetzes in der 1065. Bundesratssitzung am 8. Mai 2026 mit 79 Tagesordnungspunkten (Kabinettsbeschluss 29. April 2026, parlamentarische Behandlung vor der Sommerpause 2026 angekündigt), der laufenden Trilog-Verhandlungen zum Digital Omnibus on AI (zweite Runde 28. April 2026 ohne Einigung; nächste Runde 13. Mai 2026 — Knackpunkt ist nicht die Verschiebung der Hochrisiko-Pflichten, sondern die Konformitätsbewertungs-Architektur für Anhang I; die zypriotische Ratspräsidentschaft strebt einen Abschluss vor Ablauf ihrer Amtszeit am 30. Juni 2026 an, andernfalls übernimmt die irische Präsidentschaft), der am 5. Mai 2026 erfolgten Arraignment-Verhandlung im Altman-Verfahren mit „nicht schuldig"-Plädoyer und angeordneter psychiatrischer Begutachtung, des am 7. Mai 2026 versandten individuellen Microsoft-Buyout-Angebots (Annahmefrist 8. Juni 2026, VRSAR-Unterzeichnung 9.–22. Juni 2026, bis zu fünfjährige Krankenversicherungs-Verlängerung), des am 1. Mai 2026 vom Connecticut-Repräsentantenhaus mit 131 zu 17 Stimmen verabschiedeten </w:t>
+        <w:t xml:space="preserve"> Dieses Arbeitspapier gibt den Stand Mitte Juni 2026 (Schnitt am 14. Juni 2026 — Lauf 001 vom 14. Juni 2026) wieder. Die Debatte entwickelt sich dynamisch, insbesondere im Zuge der OpenAI-Strategiepapiere und der Eröffnung des OpenAI Workshop in Washington, D.C. im Mai 2026, des Erstdurchgangs des GKV-Beitragssatzstabilisierungsgesetzes in der 1065. Bundesratssitzung am 8. Mai 2026 mit 79 Tagesordnungspunkten (Kabinettsbeschluss 29. April 2026, parlamentarische Behandlung vor der Sommerpause 2026 angekündigt), der laufenden Trilog-Verhandlungen zum Digital Omnibus on AI (zweite Runde 28. April 2026 ohne Einigung; nächste Runde 13. Mai 2026 — Knackpunkt ist nicht die Verschiebung der Hochrisiko-Pflichten, sondern die Konformitätsbewertungs-Architektur für Anhang I; die zypriotische Ratspräsidentschaft strebt einen Abschluss vor Ablauf ihrer Amtszeit am 30. Juni 2026 an, andernfalls übernimmt die irische Präsidentschaft), der am 5. Mai 2026 erfolgten Arraignment-Verhandlung im Altman-Verfahren mit „nicht schuldig"-Plädoyer und angeordneter psychiatrischer Begutachtung, des am 7. Mai 2026 versandten individuellen Microsoft-Buyout-Angebots (Annahmefrist 8. Juni 2026, VRSAR-Unterzeichnung 9.–22. Juni 2026, bis zu fünfjährige Krankenversicherungs-Verlängerung), des am 1. Mai 2026 vom Connecticut-Repräsentantenhaus mit 131 zu 17 Stimmen verabschiedeten </w:t>
       </w:r>
       <w:r>
         <w:rPr>
@@ -10782,7 +11523,169 @@
           <w:i w:val="0"/>
           <w:sz w:val="19"/>
         </w:rPr>
-        <w:t xml:space="preserve"> gegen eine KI-Steuer (syndiziert in Advisor Perspectives, RealClearPolitics, West Hawaii Today und Las Vegas Sun zwischen dem 2. und 6. Mai 2026), das Innovationsbremse, Wettbewerbsnachteil und Unmöglichkeit der Abgrenzung Verdrängung/Augmentation als Hauptargumente gegen die Sanders/OpenAI-Linie führt und stattdessen Lockerung berufsrechtlicher Lizenzschranken, Reform der Arbeitslosenversicherung, Umschulungs-Steueranreize sowie eine Ausweitung der Earned Income Tax Credit empfiehlt. Eine regelmäßige Aktualisierung ist vorgesehen.</w:t>
+        <w:t xml:space="preserve"> gegen eine KI-Steuer (syndiziert in Advisor Perspectives, RealClearPolitics, West Hawaii Today und Las Vegas Sun zwischen dem 2. und 6. Mai 2026), das Innovationsbremse, Wettbewerbsnachteil und Unmöglichkeit der Abgrenzung Verdrängung/Augmentation als Hauptargumente gegen die Sanders/OpenAI-Linie führt und stattdessen Lockerung berufsrechtlicher Lizenzschranken, Reform der Arbeitslosenversicherung, Umschulungs-Steueranreize sowie eine Ausweitung der Earned Income Tax Credit empfiehlt. Ergänzt wird der Stand um die in der dritten Trilogrunde am 7. Mai 2026 erzielte politische Einigung zum </w:t>
+      </w:r>
+      <w:r>
+        <w:rPr>
+          <w:rFonts w:ascii="Arial" w:hAnsi="Arial"/>
+          <w:b w:val="0"/>
+          <w:i/>
+          <w:sz w:val="19"/>
+        </w:rPr>
+        <w:t>Digital Omnibus on AI</w:t>
+      </w:r>
+      <w:r>
+        <w:rPr>
+          <w:rFonts w:ascii="Arial" w:hAnsi="Arial"/>
+          <w:b w:val="0"/>
+          <w:i w:val="0"/>
+          <w:sz w:val="19"/>
+        </w:rPr>
+        <w:t xml:space="preserve"> (Verschiebung der Hochrisiko-Pflichten für Anhang-III-Systeme auf den 2. Dezember 2027; Artikel 4 KI-Kompetenz bleibt ab dem 2. August 2026 anwendbar), die Unterzeichnung von </w:t>
+      </w:r>
+      <w:r>
+        <w:rPr>
+          <w:rFonts w:ascii="Arial" w:hAnsi="Arial"/>
+          <w:b w:val="0"/>
+          <w:i/>
+          <w:sz w:val="19"/>
+        </w:rPr>
+        <w:t>SB 5 / Public Act 26-15</w:t>
+      </w:r>
+      <w:r>
+        <w:rPr>
+          <w:rFonts w:ascii="Arial" w:hAnsi="Arial"/>
+          <w:b w:val="0"/>
+          <w:i w:val="0"/>
+          <w:sz w:val="19"/>
+        </w:rPr>
+        <w:t xml:space="preserve"> durch Gouverneur Lamont am 2. Juni 2026, die am 1. Juni 2026 von Senator Sanders eingebrachte Initiative </w:t>
+      </w:r>
+      <w:r>
+        <w:rPr>
+          <w:rFonts w:ascii="Arial" w:hAnsi="Arial"/>
+          <w:b w:val="0"/>
+          <w:i/>
+          <w:sz w:val="19"/>
+        </w:rPr>
+        <w:t>American AI Sovereign Wealth Fund Act</w:t>
+      </w:r>
+      <w:r>
+        <w:rPr>
+          <w:rFonts w:ascii="Arial" w:hAnsi="Arial"/>
+          <w:b w:val="0"/>
+          <w:i w:val="0"/>
+          <w:sz w:val="19"/>
+        </w:rPr>
+        <w:t xml:space="preserve"> (einmalige Eigenkapitalsteuer 50 % auf große KI-Unternehmen zur Speisung eines öffentlichen Wohlstandsfonds), das OpenAI-Folgepapier </w:t>
+      </w:r>
+      <w:r>
+        <w:rPr>
+          <w:rFonts w:ascii="Arial" w:hAnsi="Arial"/>
+          <w:b w:val="0"/>
+          <w:i/>
+          <w:sz w:val="19"/>
+        </w:rPr>
+        <w:t>Built to Benefit Everyone: Our Plan</w:t>
+      </w:r>
+      <w:r>
+        <w:rPr>
+          <w:rFonts w:ascii="Arial" w:hAnsi="Arial"/>
+          <w:b w:val="0"/>
+          <w:i w:val="0"/>
+          <w:sz w:val="19"/>
+        </w:rPr>
+        <w:t xml:space="preserve"> vom 8. Juni 2026 (Nonprofit-PBC-Struktur mit Eigenkapitalanteil &gt; 100 Mrd. USD), den Anthropic </w:t>
+      </w:r>
+      <w:r>
+        <w:rPr>
+          <w:rFonts w:ascii="Arial" w:hAnsi="Arial"/>
+          <w:b w:val="0"/>
+          <w:i/>
+          <w:sz w:val="19"/>
+        </w:rPr>
+        <w:t>Economic Futures Research Fund</w:t>
+      </w:r>
+      <w:r>
+        <w:rPr>
+          <w:rFonts w:ascii="Arial" w:hAnsi="Arial"/>
+          <w:b w:val="0"/>
+          <w:i w:val="0"/>
+          <w:sz w:val="19"/>
+        </w:rPr>
+        <w:t xml:space="preserve"> vom 10. Juni 2026 (200 Mio. USD Forschungsfonds plus 150 Mio. USD </w:t>
+      </w:r>
+      <w:r>
+        <w:rPr>
+          <w:rFonts w:ascii="Arial" w:hAnsi="Arial"/>
+          <w:b w:val="0"/>
+          <w:i/>
+          <w:sz w:val="19"/>
+        </w:rPr>
+        <w:t>Claude Corps</w:t>
+      </w:r>
+      <w:r>
+        <w:rPr>
+          <w:rFonts w:ascii="Arial" w:hAnsi="Arial"/>
+          <w:b w:val="0"/>
+          <w:i w:val="0"/>
+          <w:sz w:val="19"/>
+        </w:rPr>
+        <w:t xml:space="preserve">), die gewerkschaftliche </w:t>
+      </w:r>
+      <w:r>
+        <w:rPr>
+          <w:rFonts w:ascii="Arial" w:hAnsi="Arial"/>
+          <w:b w:val="0"/>
+          <w:i/>
+          <w:sz w:val="19"/>
+        </w:rPr>
+        <w:t>Reformagenda für wirtschaftliche Stärke, gute Arbeit und soziale Sicherheit</w:t>
+      </w:r>
+      <w:r>
+        <w:rPr>
+          <w:rFonts w:ascii="Arial" w:hAnsi="Arial"/>
+          <w:b w:val="0"/>
+          <w:i w:val="0"/>
+          <w:sz w:val="19"/>
+        </w:rPr>
+        <w:t xml:space="preserve"> von DGB, IG Metall, ver.di und IGBCE vom 11. Juni 2026, die erste Lesung des </w:t>
+      </w:r>
+      <w:r>
+        <w:rPr>
+          <w:rFonts w:ascii="Arial" w:hAnsi="Arial"/>
+          <w:b w:val="0"/>
+          <w:i/>
+          <w:sz w:val="19"/>
+        </w:rPr>
+        <w:t>GKV-Beitragssatzstabilisierungsgesetzes</w:t>
+      </w:r>
+      <w:r>
+        <w:rPr>
+          <w:rFonts w:ascii="Arial" w:hAnsi="Arial"/>
+          <w:b w:val="0"/>
+          <w:i w:val="0"/>
+          <w:sz w:val="19"/>
+        </w:rPr>
+        <w:t xml:space="preserve"> im Bundestag am 12. Juni 2026 und den parallelen Stand der 1066. Bundesratssitzung, den </w:t>
+      </w:r>
+      <w:r>
+        <w:rPr>
+          <w:rFonts w:ascii="Arial" w:hAnsi="Arial"/>
+          <w:b w:val="0"/>
+          <w:i/>
+          <w:sz w:val="19"/>
+        </w:rPr>
+        <w:t>Challenger-Mai-2026-Job-Cuts-Report</w:t>
+      </w:r>
+      <w:r>
+        <w:rPr>
+          <w:rFonts w:ascii="Arial" w:hAnsi="Arial"/>
+          <w:b w:val="0"/>
+          <w:i w:val="0"/>
+          <w:sz w:val="19"/>
+        </w:rPr>
+        <w:t xml:space="preserve"> (97.006 Streichungen / höchster Mai-Wert seit 2020; 38.579 KI-bezogen = 40 % des Monats; Tech 38.242 / YTD 123.653 +66 %; YTD-KI 87.714 = 22 % aller 2026-Pläne) und die TrueUp-Tagesfortschreibung Mitte Juni 2026 (247 Ereignisse / 183.966 Personen / rund 1.129 Stellen pro Tag; 55 % mit explizitem KI-Bezug; Gesamtjahresprojektion rund 370.000), die geopolitisch motivierte Microsoft-Azure-China-Reduktion (200–400 Beschäftigte; Trennungsdatum 6. Juli 2026) sowie die dauerhafte DeepSeek-V4-Pro-Preisreduktion vom 22. Mai 2026 (−75 % auf rund 0,87 USD/Mio. Output-Token, Inferenz-Preis-Gefälle rund 1:7 zu Anthropic / 1:9 zu OpenAI). Eine regelmäßige Aktualisierung ist vorgesehen.</w:t>
       </w:r>
     </w:p>
     <w:p>
@@ -10862,7 +11765,7 @@
         <w:color w:val="999999"/>
         <w:sz w:val="15"/>
       </w:rPr>
-      <w:t>Version 22.0 — Mai 2026 — CC BY 4.0</w:t>
+      <w:t>Version 23.0 — Mai 2026 — CC BY 4.0</w:t>
       <w:tab/>
       <w:t xml:space="preserve">Seite </w:t>
     </w:r>

</xml_diff>

<commit_message>
Daily-Update 2026-06-18 — Version 23.0 (Cluster: B, D, F)
§ 4.5 Anthropic Policy on the AI Exponential (10. Juni 2026): Advanced AI Framework + Economic Policy Framework, Eskalationsleiter 5/10/beispiellos, 350 Mio. USD; Yang CNBC 4. Juni: 3%-Token-Steuer; Sanders American AI Sovereign Wealth Fund Act.
§ 4.2 Bundestagsbeschluss KI-MIG (11. Juni 2026, Drs. 21/4594/21/6407).
§ 1.1 TrueUp-Tracker-Stand 17. Juni 2026 (185.894 / 267 / 1.107 pro Tag; 53% KI-zuschreibend); GitLab-Restrukturierung 3. Juni (14% / ~350 Personen).
§ 11.3/11.5 Neue Einträge im Literaturverzeichnis; Aktualitätshinweis und README aktualisiert; Validierungsblock und Änderungshistorie ergänzt; PDF/DOCX neu gebaut.
</commit_message>
<xml_diff>
--- a/KI-Ökonomie.docx
+++ b/KI-Ökonomie.docx
@@ -112,7 +112,7 @@
           <w:color w:val="666666"/>
           <w:sz w:val="18"/>
         </w:rPr>
-        <w:t>Version 22.0</w:t>
+        <w:t>Version 23.0</w:t>
       </w:r>
     </w:p>
     <w:p>
@@ -238,7 +238,25 @@
           <w:i w:val="0"/>
           <w:sz w:val="19"/>
         </w:rPr>
-        <w:t xml:space="preserve"> fällt auf den 2. Juli 2026; nach den am 7. Mai 2026 publizierten Programmkonditionen sind rund 8.500 Beschäftigte angebotsberechtigt, das Paket umfasst eine Cash-Einmalzahlung sowie eine bis zu fünfjährige Krankenversicherungs-Verlängerung und enthält keine Wettbewerbs- oder Beschäftigungsverbote. Im Zusammenspiel mit den am selben Tag bekräftigten Meta-Streichungen ordneten Wirtschaftsmedien (CNBC, 24. April 2026) die Welle erstmals als „AI-driven labor crisis" ein — ein Begriff, der den Übergang von Einzelfällen zu einer kumulativen Branchenerzählung markiert. Bis zur Wochenmitte des 25. April 2026 weisen Branchen-Tracker einen kumulierten Bestand von über 92.000 Tech-Stellenstreichungen für das laufende Jahr 2026 aus; eine Aktualisierung zum 2. Mai 2026 hebt die Marke nach Tracker-Methodik des SkillSyncer auf 113.863 betroffene Beschäftigte aus 179 erfassten Layoff-Ereignissen (durchschnittlich rund 933 Stellen pro Tag), während TrueUp parallel 95.878 Personen aus 249 Einzelmeldungen zählt; die Methodikspanne erklärt die unterschiedlichen Größenordnungen, das Niveau einer sechsstelligen Tech-Reduktion innerhalb von vier Monaten ist über alle Tracker hinweg konsistent. Eine erneute Aktualisierung zum 6. Mai 2026 zeigt, dass die TrueUp-Zählung weiter auf 119.721 betroffene Personen aus 265 Layoff-Meldungen gestiegen ist (rund 958 Stellen pro Tag), während SkillSyncer mit 113.863 Personen aus 179 Ereignissen weitgehend unverändert bleibt; eine Tagesfortschreibung der TrueUp-Methodik weist zum 7. Mai 2026 bereits 121.111 Personen aus 273 Layoff-Meldungen aus (rund 961 Personen pro Tag); die nochmalige Aktualisierung zum 8. Mai 2026 hebt die Marke nach den am Vortag angekündigten Cloudflare-Streichungen auf 127.411 betroffene Personen aus 283 Layoff-Meldungen (rund 1.003 Stellen pro Tag), wobei die zusätzlichen Meldungen primär aus den am 5./6. Mai 2026 angekündigten Stellenstreichungen bei </w:t>
+        <w:t xml:space="preserve"> fällt auf den 2. Juli 2026; nach den am 7. Mai 2026 publizierten Programmkonditionen sind rund 8.500 Beschäftigte angebotsberechtigt, das Paket umfasst eine Cash-Einmalzahlung sowie eine bis zu fünfjährige Krankenversicherungs-Verlängerung und enthält keine Wettbewerbs- oder Beschäftigungsverbote. Im Zusammenspiel mit den am selben Tag bekräftigten Meta-Streichungen ordneten Wirtschaftsmedien (CNBC, 24. April 2026) die Welle erstmals als „AI-driven labor crisis" ein — ein Begriff, der den Übergang von Einzelfällen zu einer kumulativen Branchenerzählung markiert. Bis zur Wochenmitte des 25. April 2026 weisen Branchen-Tracker einen kumulierten Bestand von über 92.000 Tech-Stellenstreichungen für das laufende Jahr 2026 aus; eine Aktualisierung zum 2. Mai 2026 hebt die Marke nach Tracker-Methodik des SkillSyncer auf 113.863 betroffene Beschäftigte aus 179 erfassten Layoff-Ereignissen (durchschnittlich rund 933 Stellen pro Tag), während TrueUp parallel 95.878 Personen aus 249 Einzelmeldungen zählt; die Methodikspanne erklärt die unterschiedlichen Größenordnungen, das Niveau einer sechsstelligen Tech-Reduktion innerhalb von vier Monaten ist über alle Tracker hinweg konsistent. Eine erneute Aktualisierung zum 6. Mai 2026 zeigt, dass die TrueUp-Zählung weiter auf 119.721 betroffene Personen aus 265 Layoff-Meldungen gestiegen ist (rund 958 Stellen pro Tag), während SkillSyncer mit 113.863 Personen aus 179 Ereignissen weitgehend unverändert bleibt; eine Tagesfortschreibung der TrueUp-Methodik weist zum 7. Mai 2026 bereits 121.111 Personen aus 273 Layoff-Meldungen aus (rund 961 Personen pro Tag); die nochmalige Aktualisierung zum 8. Mai 2026 hebt die Marke nach den am Vortag angekündigten Cloudflare-Streichungen auf 127.411 betroffene Personen aus 283 Layoff-Meldungen (rund 1.003 Stellen pro Tag); ein weiterer TrueUp-Stand zum 17. Juni 2026 weist 185.894 betroffene Personen aus 267 Layoff-Ereignissen aus (rund 1.107 Stellen pro Tag), von denen 53 % — entsprechend rund 155.321 Personen aus 141 Firmen — die Streichungen ausdrücklich mit KI, Automatisierung oder Machine Learning begründen, womit der KI-Begründungs­anteil erstmals oberhalb der Hälfte der Tracker-Population liegt und die in § 3.5 referierte Beobachtung sektoraler Frühwirkungen weiter unterfüttert; eine eigenständige Cluster-Meldung der Welle ist die am 3. Juni 2026 von </w:t>
+      </w:r>
+      <w:r>
+        <w:rPr>
+          <w:rFonts w:ascii="Arial" w:hAnsi="Arial"/>
+          <w:b w:val="0"/>
+          <w:i/>
+          <w:sz w:val="19"/>
+        </w:rPr>
+        <w:t>GitLab</w:t>
+      </w:r>
+      <w:r>
+        <w:rPr>
+          <w:rFonts w:ascii="Arial" w:hAnsi="Arial"/>
+          <w:b w:val="0"/>
+          <w:i w:val="0"/>
+          <w:sz w:val="19"/>
+        </w:rPr>
+        <w:t xml:space="preserve"> parallel zu den Q1-Ergebnissen angekündigte Streichung von rund 14 % der Belegschaft (etwa 350 Personen), die mit einem Rückzug aus 22 Ländern, einer Reduktion des Länder-Footprints um rund 30 %, einer Abflachung der Managementebenen um bis zu drei Stufen und einer Reorganisation der Forschung und Entwicklung in rund 60 autonome Einheiten flankiert ist; Vorstandschef Bill Staples begründete die Reorganisation in der Begleitkommunikation mit dem Druck der „agentic workloads" auf die bestehende Entwicklerinfrastruktur, wobei die zusätzlichen Meldungen primär aus den am 5./6. Mai 2026 angekündigten Stellenstreichungen bei </w:t>
       </w:r>
       <w:r>
         <w:rPr>
@@ -2199,6 +2217,47 @@
           <w:i w:val="0"/>
           <w:sz w:val="19"/>
         </w:rPr>
+        <w:t>KI-Marktüberwachungs- und -Innovationsförderungsgesetz (KI-MIG) — Bundestagsbeschluss am 11. Juni 2026:</w:t>
+      </w:r>
+      <w:r>
+        <w:rPr>
+          <w:rFonts w:ascii="Arial" w:hAnsi="Arial"/>
+          <w:b w:val="0"/>
+          <w:i w:val="0"/>
+          <w:sz w:val="19"/>
+        </w:rPr>
+        <w:t xml:space="preserve"> Der Bundestag hat am 11. Juni 2026 das </w:t>
+      </w:r>
+      <w:r>
+        <w:rPr>
+          <w:rFonts w:ascii="Arial" w:hAnsi="Arial"/>
+          <w:b w:val="0"/>
+          <w:i/>
+          <w:sz w:val="19"/>
+        </w:rPr>
+        <w:t>Gesetz zur Durchführung der EU-Verordnung über Künstliche Intelligenz</w:t>
+      </w:r>
+      <w:r>
+        <w:rPr>
+          <w:rFonts w:ascii="Arial" w:hAnsi="Arial"/>
+          <w:b w:val="0"/>
+          <w:i w:val="0"/>
+          <w:sz w:val="19"/>
+        </w:rPr>
+        <w:t xml:space="preserve"> (Drucksache 21/4594 in der vom Digitalausschuss überarbeiteten Fassung 21/6407) mit den Stimmen der Koalitions­fraktionen CDU/CSU und SPD gegen die Stimmen von AfD, Bündnis 90/Die Grünen und Linke verabschiedet. Das Gesetz benennt die Bundesnetzagentur als zentrale KI-Marktüberwachungs­behörde, regelt Sanktionsbefugnisse, Konformitäts­bewertungs­zuständigkeiten und schließt eine Entschließung des Bundestages an die Bundesregierung ein, Open-Source-Komponenten und öffentliche Stellen mit den erforderlichen Ressourcen und Trainings­maßnahmen für die KI-Verordnung auszustatten. Die Bundesrats­zustimmung steht zum Schnitt am 18. Juni 2026 noch aus. Für die hier geführte Steuerdebatte ist das Gesetz indirekt relevant, weil es erstmals eine bundesgesetzliche Operationalisierung der EU-AI-Act-Pflichten in Deutschland markiert (insbesondere für Hochrisiko-KI-Systeme im Beschäftigungs­kontext) und damit die in § 9.1 diskutierten Mess- und Anknüpfungsfragen einer KI-spezifischen Abgabe institutionell einbettet — fiskalische Komponenten enthält das Gesetz nicht.</w:t>
+      </w:r>
+    </w:p>
+    <w:p>
+      <w:pPr>
+        <w:jc w:val="both"/>
+      </w:pPr>
+      <w:r>
+        <w:rPr>
+          <w:rFonts w:ascii="Arial" w:hAnsi="Arial"/>
+          <w:b/>
+          <w:i w:val="0"/>
+          <w:sz w:val="19"/>
+        </w:rPr>
         <w:t>Neue nationale Initiative Deutschland — Plattform-Digitalabgabe (2026):</w:t>
       </w:r>
       <w:r>
@@ -3056,6 +3115,237 @@
           <w:sz w:val="19"/>
         </w:rPr>
         <w:t xml:space="preserve"> zur Stützung verdrängter Beschäftigter. Die Position ergänzt die in § 3.3 (de la Feria) und § 3.4 (IW Köln/Hentze) referierten ökonomischen Einwände um eine prominente publizistische Stimme aus der Wirtschaftspresse — und liefert damit für die in Kapitel 10 zu treffende Bewertung das spiegelbildliche Pendant zu den OpenAI-/Sanders-Vorschlägen aus demselben Zeitfenster.</w:t>
+      </w:r>
+    </w:p>
+    <w:p>
+      <w:pPr>
+        <w:jc w:val="both"/>
+      </w:pPr>
+      <w:r>
+        <w:rPr>
+          <w:rFonts w:ascii="Arial" w:hAnsi="Arial"/>
+          <w:b/>
+          <w:i w:val="0"/>
+          <w:sz w:val="19"/>
+        </w:rPr>
+        <w:t>Anthropic — „Policy on the AI Exponential" und Economic Policy Framework (10. Juni 2026):</w:t>
+      </w:r>
+      <w:r>
+        <w:rPr>
+          <w:rFonts w:ascii="Arial" w:hAnsi="Arial"/>
+          <w:b w:val="0"/>
+          <w:i w:val="0"/>
+          <w:sz w:val="19"/>
+        </w:rPr>
+        <w:t xml:space="preserve"> Am 10. Juni 2026 hat Anthropic mit dem Aufsatz von Vorstandsvorsitzendem Dario Amodei </w:t>
+      </w:r>
+      <w:r>
+        <w:rPr>
+          <w:rFonts w:ascii="Arial" w:hAnsi="Arial"/>
+          <w:b w:val="0"/>
+          <w:i/>
+          <w:sz w:val="19"/>
+        </w:rPr>
+        <w:t>„Policy on the AI Exponential"</w:t>
+      </w:r>
+      <w:r>
+        <w:rPr>
+          <w:rFonts w:ascii="Arial" w:hAnsi="Arial"/>
+          <w:b w:val="0"/>
+          <w:i w:val="0"/>
+          <w:sz w:val="19"/>
+        </w:rPr>
+        <w:t xml:space="preserve"> zwei flankierende formale Rahmenwerke vorgelegt: ein </w:t>
+      </w:r>
+      <w:r>
+        <w:rPr>
+          <w:rFonts w:ascii="Arial" w:hAnsi="Arial"/>
+          <w:b w:val="0"/>
+          <w:i/>
+          <w:sz w:val="19"/>
+        </w:rPr>
+        <w:t>Advanced AI Framework</w:t>
+      </w:r>
+      <w:r>
+        <w:rPr>
+          <w:rFonts w:ascii="Arial" w:hAnsi="Arial"/>
+          <w:b w:val="0"/>
+          <w:i w:val="0"/>
+          <w:sz w:val="19"/>
+        </w:rPr>
+        <w:t xml:space="preserve"> für Sicherheits- und Test­regime für hochleistungsfähige Modelle und ein </w:t>
+      </w:r>
+      <w:r>
+        <w:rPr>
+          <w:rFonts w:ascii="Arial" w:hAnsi="Arial"/>
+          <w:b w:val="0"/>
+          <w:i/>
+          <w:sz w:val="19"/>
+        </w:rPr>
+        <w:t>Economic Policy Framework</w:t>
+      </w:r>
+      <w:r>
+        <w:rPr>
+          <w:rFonts w:ascii="Arial" w:hAnsi="Arial"/>
+          <w:b w:val="0"/>
+          <w:i w:val="0"/>
+          <w:sz w:val="19"/>
+        </w:rPr>
+        <w:t xml:space="preserve"> zu Arbeitsmarkt-Reaktionen. Der Sicherheitsrahmen würde nur für Modelle gelten, die mit mehr als 10²⁵ Gleitkomma-Operationen trainiert werden und Anbieter mit mehr als 500 Mio. US-Dollar KI-Umsatz oder mehr als 1 Mrd. US-Dollar KI-F&amp;E-Aufwand erfassen; er sieht Transparenz-, Evaluierungs- und behördliche Durchgriffsrechte vor, einschließlich der Möglichkeit, „signifikant katastrophen­gefährliche" Modellverbreitungen zu blockieren. Steuer- und sozialpolitisch relevanter ist das </w:t>
+      </w:r>
+      <w:r>
+        <w:rPr>
+          <w:rFonts w:ascii="Arial" w:hAnsi="Arial"/>
+          <w:b w:val="0"/>
+          <w:i/>
+          <w:sz w:val="19"/>
+        </w:rPr>
+        <w:t>Economic Policy Framework</w:t>
+      </w:r>
+      <w:r>
+        <w:rPr>
+          <w:rFonts w:ascii="Arial" w:hAnsi="Arial"/>
+          <w:b w:val="0"/>
+          <w:i w:val="0"/>
+          <w:sz w:val="19"/>
+        </w:rPr>
+        <w:t xml:space="preserve">, das drei Szenarien staffelt: Bei rund fünf Prozent Arbeitslosigkeit empfiehlt der Rahmen eine Ausweitung „pre-distributiver" Kapitalkonten — die heute nur Indexfonds, aber keine Anteile an KI-Unternehmen halten dürfen —, ergänzt um Lohnversicherung, Umschulungszuschüsse, Reform berufsrechtlicher Lizenzschranken und Bindungsanreize für Arbeitgeber; bei zehn Prozent rücken erweiterte Arbeitslosenversicherung und sektorale Übergangshilfen ins Zentrum; bei „beispielloser" Arbeitslosigkeit nennt Anthropic im Konjunktiv Grundeinkommen, Staatsfonds-Modelle und Beteiligungsmechanismen als zu erwägende Instrumente und verweist auf den Bedarf neuer Steuerquellen. Finanziell hinterlegt Anthropic die Rahmen mit 350 Mio. US-Dollar — 200 Mio. für einen </w:t>
+      </w:r>
+      <w:r>
+        <w:rPr>
+          <w:rFonts w:ascii="Arial" w:hAnsi="Arial"/>
+          <w:b w:val="0"/>
+          <w:i/>
+          <w:sz w:val="19"/>
+        </w:rPr>
+        <w:t>Economic Futures Research Fund</w:t>
+      </w:r>
+      <w:r>
+        <w:rPr>
+          <w:rFonts w:ascii="Arial" w:hAnsi="Arial"/>
+          <w:b w:val="0"/>
+          <w:i w:val="0"/>
+          <w:sz w:val="19"/>
+        </w:rPr>
+        <w:t xml:space="preserve"> und 150 Mio. für ein nationales Stipendienprogramm. Für die hier geführte Debatte ist das Papier bemerkenswert, weil mit Anthropic ein zweiter führender KI-Anbieter — nach OpenAI im April 2026 — eine fiskalische Beteiligung am eigenen Geschäftsmodell unter bestimmten Szenarien explizit zur Diskussion stellt (Anthropic-CEO Amodei wird in der Folgeberichterstattung mit der Aufforderung „Tax us, please" zitiert) und damit die in Kapitel 8 entwickelte Linie eines Teilhabefonds aus der Wertschöpfung großer KI-Anbieter ein zweites unternehmensseitig getragenes Anschauungsbeispiel erhält — im Unterschied zur OpenAI-Linie aber mit einer expliziten Schwellenwert-Architektur und einer szenariobedingten Eskalationsleiter. Anthropic positioniert sich zudem deutlich gegen die zeitgleiche OpenAI-Linie (Sam Altman, Mai 2026: „Jobs-Apokalypse" eher unwahrscheinlich) — der ökonomische Diskurs zwischen den beiden führenden Frontier-Anbietern divergiert damit erstmals sichtbar in einer Grundsatzfrage der Steuerpolitik.</w:t>
+      </w:r>
+    </w:p>
+    <w:p>
+      <w:pPr>
+        <w:jc w:val="both"/>
+      </w:pPr>
+      <w:r>
+        <w:rPr>
+          <w:rFonts w:ascii="Arial" w:hAnsi="Arial"/>
+          <w:b/>
+          <w:i w:val="0"/>
+          <w:sz w:val="19"/>
+        </w:rPr>
+        <w:t>Andrew Yang (CNBC, Juni 2026 — Folgeschritt zur März-Linie):</w:t>
+      </w:r>
+      <w:r>
+        <w:rPr>
+          <w:rFonts w:ascii="Arial" w:hAnsi="Arial"/>
+          <w:b w:val="0"/>
+          <w:i w:val="0"/>
+          <w:sz w:val="19"/>
+        </w:rPr>
+        <w:t xml:space="preserve"> Am 4. Juni 2026 hat Andrew Yang in einem CNBC-Squawk-Box-Interview seine bereits im März 2026 formulierte Position konkretisiert: Statt eines pauschalen Bezugs auf Arbeit versus Kapital schlug er erstmals eine </w:t>
+      </w:r>
+      <w:r>
+        <w:rPr>
+          <w:rFonts w:ascii="Arial" w:hAnsi="Arial"/>
+          <w:b w:val="0"/>
+          <w:i/>
+          <w:sz w:val="19"/>
+        </w:rPr>
+        <w:t>Token-Steuer</w:t>
+      </w:r>
+      <w:r>
+        <w:rPr>
+          <w:rFonts w:ascii="Arial" w:hAnsi="Arial"/>
+          <w:b w:val="0"/>
+          <w:i w:val="0"/>
+          <w:sz w:val="19"/>
+        </w:rPr>
+        <w:t xml:space="preserve"> in Höhe von rund drei Prozent auf KI-Inferenz vor — eine Abgabe, die nach seiner Argumentation entlang der KI-Wertschöpfungskette von Chipherstellern (Nvidia) über Cloud- und Inferenzanbieter bis zu den Anwendern einen einheitlichen Anknüpfungspunkt bildet. Zusätzlich räumte Yang als Vorstandsvorsitzender von </w:t>
+      </w:r>
+      <w:r>
+        <w:rPr>
+          <w:rFonts w:ascii="Arial" w:hAnsi="Arial"/>
+          <w:b w:val="0"/>
+          <w:i/>
+          <w:sz w:val="19"/>
+        </w:rPr>
+        <w:t>Noble Mobile</w:t>
+      </w:r>
+      <w:r>
+        <w:rPr>
+          <w:rFonts w:ascii="Arial" w:hAnsi="Arial"/>
+          <w:b w:val="0"/>
+          <w:i w:val="0"/>
+          <w:sz w:val="19"/>
+        </w:rPr>
+        <w:t xml:space="preserve"> ein, dass sein eigenes Unternehmen Berufseinsteigerinnen und Berufseinsteiger durch KI-Systeme ersetze, und stellte das Aufkommen in Aussicht für die Finanzierung von Lohnsteuersenkungen, die menschliche Beschäftigung relativ günstiger machen würden. Yang verwies in dem Interview ausdrücklich auf die anthropische Linie („Dario Amodei sagt: tax us, please") und ordnete den eigenen Vorschlag in den breiteren Bezugspunkt der für 2026 erwarteten KI-Infrastruktur-Investitionen von rund einer Billion US-Dollar ein. Für die hier geführte Debatte ist die Konkretisierung relevant, weil sie erstmals eine </w:t>
+      </w:r>
+      <w:r>
+        <w:rPr>
+          <w:rFonts w:ascii="Arial" w:hAnsi="Arial"/>
+          <w:b w:val="0"/>
+          <w:i/>
+          <w:sz w:val="19"/>
+        </w:rPr>
+        <w:t>output-/nutzungsbasierte</w:t>
+      </w:r>
+      <w:r>
+        <w:rPr>
+          <w:rFonts w:ascii="Arial" w:hAnsi="Arial"/>
+          <w:b w:val="0"/>
+          <w:i w:val="0"/>
+          <w:sz w:val="19"/>
+        </w:rPr>
+        <w:t xml:space="preserve"> Anknüpfung an die KI-Wertschöpfung außerhalb der Wertschöpfungsabgaben-Tradition (§ 5.1) und außerhalb des sub-föderalen Connecticut-Bill-515-Pfads (§ 4.5) formuliert — und damit der Operationalisierungsdebatte in § 5.1 und § 9.1 einen weiteren, technisch eng messbaren Pfad (Token-Volumen je Inferenz-Vorgang) hinzufügt.</w:t>
+      </w:r>
+    </w:p>
+    <w:p>
+      <w:pPr>
+        <w:jc w:val="both"/>
+      </w:pPr>
+      <w:r>
+        <w:rPr>
+          <w:rFonts w:ascii="Arial" w:hAnsi="Arial"/>
+          <w:b/>
+          <w:i w:val="0"/>
+          <w:sz w:val="19"/>
+        </w:rPr>
+        <w:t>Bernie Sanders — American AI Sovereign Wealth Fund Act (Anfang Juni 2026):</w:t>
+      </w:r>
+      <w:r>
+        <w:rPr>
+          <w:rFonts w:ascii="Arial" w:hAnsi="Arial"/>
+          <w:b w:val="0"/>
+          <w:i w:val="0"/>
+          <w:sz w:val="19"/>
+        </w:rPr>
+        <w:t xml:space="preserve"> Anfang Juni 2026 hat Senator Bernie Sanders einen Folgeentwurf zum Sanders-Report angekündigt: den </w:t>
+      </w:r>
+      <w:r>
+        <w:rPr>
+          <w:rFonts w:ascii="Arial" w:hAnsi="Arial"/>
+          <w:b w:val="0"/>
+          <w:i/>
+          <w:sz w:val="19"/>
+        </w:rPr>
+        <w:t>American AI Sovereign Wealth Fund Act</w:t>
+      </w:r>
+      <w:r>
+        <w:rPr>
+          <w:rFonts w:ascii="Arial" w:hAnsi="Arial"/>
+          <w:b w:val="0"/>
+          <w:i w:val="0"/>
+          <w:sz w:val="19"/>
+        </w:rPr>
+        <w:t>, der die größten KI-Unternehmen mit einer einmaligen Abgabe von 50 % belegen würde, zahlbar nicht in Geld, sondern in Unternehmensanteilen. Vorgesehene Adressaten sind OpenAI, Anthropic und xAI; der Bund erhielte mit den so eingebrachten Stimmrechtsanteilen eine paritätische Vertretung in den Verwaltungsräten der betroffenen Unternehmen, mit dem ausdrücklichen Ziel, Entscheidungen blockieren zu können, die der „Allgemeinheit schaden". Für die hier geführte Debatte ist der Entwurf eine konkretisierte US-bundesgesetzliche Variante der in § 5.4 angelegten Staatsfonds-Logik — allerdings in einer politisch hochproblematischen Pflicht­beteiligungs-Variante und mit einer Aussicht auf parlamentarische Annahme, die in einem republikanisch geführten Kongress weiterhin als gering einzuschätzen ist. Die Aufnahme zeigt nichtsdestoweniger, dass die Staatsfonds-Konzeption inzwischen aus Policy-Papieren (OpenAI, Anthropic) in formale Gesetzesvorschläge wandert.</w:t>
       </w:r>
     </w:p>
     <w:p>
@@ -8234,6 +8524,120 @@
           <w:i w:val="0"/>
           <w:sz w:val="19"/>
         </w:rPr>
+        <w:t xml:space="preserve">Anthropic / Dario Amodei. (10. Juni 2026). </w:t>
+      </w:r>
+      <w:r>
+        <w:rPr>
+          <w:rFonts w:ascii="Arial" w:hAnsi="Arial"/>
+          <w:b w:val="0"/>
+          <w:i/>
+          <w:sz w:val="19"/>
+        </w:rPr>
+        <w:t>Policy on the AI Exponential — Advanced AI Framework und Economic Policy Framework.</w:t>
+      </w:r>
+      <w:r>
+        <w:rPr>
+          <w:rFonts w:ascii="Arial" w:hAnsi="Arial"/>
+          <w:b w:val="0"/>
+          <w:i w:val="0"/>
+          <w:sz w:val="19"/>
+        </w:rPr>
+        <w:t xml:space="preserve"> Zwei flankierende Rahmenwerke samt 350-Mio.-USD-Finanzpaket (200 Mio. </w:t>
+      </w:r>
+      <w:r>
+        <w:rPr>
+          <w:rFonts w:ascii="Arial" w:hAnsi="Arial"/>
+          <w:b w:val="0"/>
+          <w:i/>
+          <w:sz w:val="19"/>
+        </w:rPr>
+        <w:t>Economic Futures Research Fund</w:t>
+      </w:r>
+      <w:r>
+        <w:rPr>
+          <w:rFonts w:ascii="Arial" w:hAnsi="Arial"/>
+          <w:b w:val="0"/>
+          <w:i w:val="0"/>
+          <w:sz w:val="19"/>
+        </w:rPr>
+        <w:t>, 150 Mio. nationales Stipendienprogramm); Sicherheitsschwelle 10²⁵ FLOPs / 500 Mio. USD KI-Umsatz / 1 Mrd. USD KI-F&amp;E; Arbeitsmarkt-Eskalationsleiter über drei Szenarien (5 %, 10 %, beispiellose Arbeitslosigkeit). https://www.anthropic.com/policy-on-the-ai-exponential/epf | https://www-cdn.anthropic.com/files/4zrzovbb/website/9ea607a5dd67c168093829b701f3a0a6d21156d5.pdf | https://darioamodei.com/post/policy-on-the-ai-exponential</w:t>
+      </w:r>
+    </w:p>
+    <w:p>
+      <w:pPr>
+        <w:jc w:val="both"/>
+      </w:pPr>
+      <w:r>
+        <w:rPr>
+          <w:rFonts w:ascii="Arial" w:hAnsi="Arial"/>
+          <w:b w:val="0"/>
+          <w:i w:val="0"/>
+          <w:sz w:val="19"/>
+        </w:rPr>
+        <w:t xml:space="preserve">US Senate / Yahoo Finance / Fox Business. (Anfang Juni 2026). </w:t>
+      </w:r>
+      <w:r>
+        <w:rPr>
+          <w:rFonts w:ascii="Arial" w:hAnsi="Arial"/>
+          <w:b w:val="0"/>
+          <w:i/>
+          <w:sz w:val="19"/>
+        </w:rPr>
+        <w:t>American AI Sovereign Wealth Fund Act — Sanders-Folgeentwurf.</w:t>
+      </w:r>
+      <w:r>
+        <w:rPr>
+          <w:rFonts w:ascii="Arial" w:hAnsi="Arial"/>
+          <w:b w:val="0"/>
+          <w:i w:val="0"/>
+          <w:sz w:val="19"/>
+        </w:rPr>
+        <w:t xml:space="preserve"> Einmalige 50-%-Abgabe in Unternehmens­anteilen für die größten KI-Unternehmen (OpenAI, Anthropic, xAI); Bundes­regierung mit Stimmrechtsanteilen und paritätischer Vertretung im Verwaltungsrat. https://finance.yahoo.com/economy/policy/articles/bernie-sanders-introduce-bill-giving-135431485.html | https://www.foxbusiness.com/politics/sanders-unveils-plan-take-50-stake-ai-companies-government-wealth-fund</w:t>
+      </w:r>
+    </w:p>
+    <w:p>
+      <w:pPr>
+        <w:jc w:val="both"/>
+      </w:pPr>
+      <w:r>
+        <w:rPr>
+          <w:rFonts w:ascii="Arial" w:hAnsi="Arial"/>
+          <w:b w:val="0"/>
+          <w:i w:val="0"/>
+          <w:sz w:val="19"/>
+        </w:rPr>
+        <w:t xml:space="preserve">Deutscher Bundestag. (11. Juni 2026). </w:t>
+      </w:r>
+      <w:r>
+        <w:rPr>
+          <w:rFonts w:ascii="Arial" w:hAnsi="Arial"/>
+          <w:b w:val="0"/>
+          <w:i/>
+          <w:sz w:val="19"/>
+        </w:rPr>
+        <w:t>Ja zur Durchführung der Verordnung über künstliche Intelligenz — Beschluss des KI-MIG (Drucksache 21/4594 / 21/6407).</w:t>
+      </w:r>
+      <w:r>
+        <w:rPr>
+          <w:rFonts w:ascii="Arial" w:hAnsi="Arial"/>
+          <w:b w:val="0"/>
+          <w:i w:val="0"/>
+          <w:sz w:val="19"/>
+        </w:rPr>
+        <w:t xml:space="preserve"> Mehrheit aus CDU/CSU und SPD; Ablehnung durch AfD, Bündnis 90/Die Grünen und Linke; Bundesnetzagentur als zentrale KI-Marktüberwachungs­behörde; Bundesratszustimmung steht noch aus. https://www.bundestag.de/dokumente/textarchiv/2026/kw24-de-ki-1183820 | https://www.bundesregierung.de/breg-de/aktuelles/umsetzung-ki-verordnung-2406638 | https://dserver.bundestag.de/btd/21/045/2104594.pdf</w:t>
+      </w:r>
+    </w:p>
+    <w:p>
+      <w:pPr>
+        <w:jc w:val="both"/>
+      </w:pPr>
+      <w:r>
+        <w:rPr>
+          <w:rFonts w:ascii="Arial" w:hAnsi="Arial"/>
+          <w:b w:val="0"/>
+          <w:i w:val="0"/>
+          <w:sz w:val="19"/>
+        </w:rPr>
         <w:t xml:space="preserve">Sanders, B., &amp; Ocasio-Cortez, A. (25. März 2026). </w:t>
       </w:r>
       <w:r>
@@ -10507,6 +10911,202 @@
           <w:i w:val="0"/>
           <w:sz w:val="19"/>
         </w:rPr>
+        <w:t xml:space="preserve">TrueUp / TechTimes / Yahoo Finance / TechSpot. (Stand 17. Juni 2026). </w:t>
+      </w:r>
+      <w:r>
+        <w:rPr>
+          <w:rFonts w:ascii="Arial" w:hAnsi="Arial"/>
+          <w:b w:val="0"/>
+          <w:i/>
+          <w:sz w:val="19"/>
+        </w:rPr>
+        <w:t>Tech Layoffs Tracker — Tagesfortschreibung: 185.894 Personen aus 267 Layoff-Ereignissen (rund 1.107 Stellen pro Tag); 53 % der Ereignisse mit explizitem KI-/Automatisierungs-/Machine-Learning-Bezug, entsprechend 155.321 Personen aus 141 Firmen.</w:t>
+      </w:r>
+      <w:r>
+        <w:rPr>
+          <w:rFonts w:ascii="Arial" w:hAnsi="Arial"/>
+          <w:b w:val="0"/>
+          <w:i w:val="0"/>
+          <w:sz w:val="19"/>
+        </w:rPr>
+        <w:t xml:space="preserve"> https://www.trueup.io/layoffs | https://www.techtimes.com/articles/318466/20260616/tech-layoffs-hit-1115-day-2026-companies-cite-ai-cuts-fail-boost-returns.htm | https://finance.yahoo.com/sectors/technology/articles/2026-tech-layoffs-near-150-110000224.html | https://www.techspot.com/news/112493-tech-layoffs-pass-100000-2026-tracker-points-ai.html</w:t>
+      </w:r>
+    </w:p>
+    <w:p>
+      <w:pPr>
+        <w:jc w:val="both"/>
+      </w:pPr>
+      <w:r>
+        <w:rPr>
+          <w:rFonts w:ascii="Arial" w:hAnsi="Arial"/>
+          <w:b w:val="0"/>
+          <w:i w:val="0"/>
+          <w:sz w:val="19"/>
+        </w:rPr>
+        <w:t xml:space="preserve">TechCrunch / TheNextWeb / TheStack / HR Digest. (3. Juni 2026). </w:t>
+      </w:r>
+      <w:r>
+        <w:rPr>
+          <w:rFonts w:ascii="Arial" w:hAnsi="Arial"/>
+          <w:b w:val="0"/>
+          <w:i/>
+          <w:sz w:val="19"/>
+        </w:rPr>
+        <w:t>GitLab cuts 14% of staff as it scales its platform to serve AI workloads / GitLab cuts 7% of workforce and flattens management in sweeping „agentic era" restructuring / AI agents spur GitLab layoffs and architecture overhaul / Agentic AI Ambitions Strike Again as GitLab Announces Layoffs for 2026.</w:t>
+      </w:r>
+      <w:r>
+        <w:rPr>
+          <w:rFonts w:ascii="Arial" w:hAnsi="Arial"/>
+          <w:b w:val="0"/>
+          <w:i w:val="0"/>
+          <w:sz w:val="19"/>
+        </w:rPr>
+        <w:t xml:space="preserve"> GitLab streicht rund 14 % der Belegschaft (etwa 350 Personen), reduziert die Länderpräsenz um rund 30 % (Ausstieg aus 22 Ländern), flacht Managementebenen um bis zu drei Stufen ab und reorganisiert F&amp;E in rund 60 autonome Einheiten; Vorstandschef Bill Staples begründet den Schritt mit dem Druck „agentischer" Workloads auf die bestehende Entwickler­infrastruktur. https://techcrunch.com/2026/06/03/gitlab-cuts-14-of-staff-as-it-scales-its-platform-to-serve-ai-workloads/ | https://thenextweb.com/news/gitlab-cuts-7-of-workforce-and-flattens-management-in-sweeping-agentic-era-restructuring | https://www.thestack.technology/gitlab-layoffs-architecture-overhaul-agents-ai/ | https://www.thehrdigest.com/agentic-ai-ambitions-strike-again-as-gitlab-announces-layoffs-for-2026/</w:t>
+      </w:r>
+    </w:p>
+    <w:p>
+      <w:pPr>
+        <w:jc w:val="both"/>
+      </w:pPr>
+      <w:r>
+        <w:rPr>
+          <w:rFonts w:ascii="Arial" w:hAnsi="Arial"/>
+          <w:b w:val="0"/>
+          <w:i w:val="0"/>
+          <w:sz w:val="19"/>
+        </w:rPr>
+        <w:t xml:space="preserve">CNBC / AOL / Hoodline / Q-Gentleman. (4. Juni 2026 / Folgeberichterstattung). </w:t>
+      </w:r>
+      <w:r>
+        <w:rPr>
+          <w:rFonts w:ascii="Arial" w:hAnsi="Arial"/>
+          <w:b w:val="0"/>
+          <w:i/>
+          <w:sz w:val="19"/>
+        </w:rPr>
+        <w:t>Andrew Yang on pitch to tax AI: Tax the AI, tax the robots, stop taxing human workers / AI CEO On CNBC: ‚We Are Replacing Junior Employees with AI.' The Only Solution is a Tax on AI and Robots / Andrew Yang's Pitch to Save the American Labor Market.</w:t>
+      </w:r>
+      <w:r>
+        <w:rPr>
+          <w:rFonts w:ascii="Arial" w:hAnsi="Arial"/>
+          <w:b w:val="0"/>
+          <w:i w:val="0"/>
+          <w:sz w:val="19"/>
+        </w:rPr>
+        <w:t xml:space="preserve"> CNBC-Squawk-Box-Interview vom 4. Juni 2026: Konkretisierung der März-2026-Linie zu einer 3-%-Token-Steuer auf KI-Inferenz; Yang räumt als Noble-Mobile-CEO eigene Substitution Berufseinsteiger ↔ KI ein und verweist auf Amodeis „tax us, please"-Linie sowie den projizierten Billion-USD-KI-Capex-Pfad. https://www.cnbc.com/video/2026/06/04/andrew-yang-on-pitch-to-tax-ai-tax-the-ai-tax-the-robots-stop-taxing-human-workers.html | https://www.aol.com/articles/ai-ceo-cnbc-replacing-junior-123258000.html | https://247wallst.com/investing/2026/06/05/ai-ceo-on-cnbc-we-are-replacing-junior-employees-with-ai-the-only-solution-is-a-tax-on-ai-and-robots/ | https://hoodline.com/2026/06/andrew-yang-s-wild-fix-for-the-ai-jobs-crunch-tax-the-bots-not-the-hires/</w:t>
+      </w:r>
+    </w:p>
+    <w:p>
+      <w:pPr>
+        <w:jc w:val="both"/>
+      </w:pPr>
+      <w:r>
+        <w:rPr>
+          <w:rFonts w:ascii="Arial" w:hAnsi="Arial"/>
+          <w:b w:val="0"/>
+          <w:i w:val="0"/>
+          <w:sz w:val="19"/>
+        </w:rPr>
+        <w:t xml:space="preserve">Reason / Yahoo Finance / Fox Business / Fortune. (Anfang Juni 2026). </w:t>
+      </w:r>
+      <w:r>
+        <w:rPr>
+          <w:rFonts w:ascii="Arial" w:hAnsi="Arial"/>
+          <w:b w:val="0"/>
+          <w:i/>
+          <w:sz w:val="19"/>
+        </w:rPr>
+        <w:t>Bernie Sanders unveils plan to take 50% stake in AI companies for government wealth fund / Bernie Sanders wants Americans to own a piece of AI.</w:t>
+      </w:r>
+      <w:r>
+        <w:rPr>
+          <w:rFonts w:ascii="Arial" w:hAnsi="Arial"/>
+          <w:b w:val="0"/>
+          <w:i w:val="0"/>
+          <w:sz w:val="19"/>
+        </w:rPr>
+        <w:t xml:space="preserve"> Berichterstattung zum </w:t>
+      </w:r>
+      <w:r>
+        <w:rPr>
+          <w:rFonts w:ascii="Arial" w:hAnsi="Arial"/>
+          <w:b w:val="0"/>
+          <w:i/>
+          <w:sz w:val="19"/>
+        </w:rPr>
+        <w:t>American AI Sovereign Wealth Fund Act</w:t>
+      </w:r>
+      <w:r>
+        <w:rPr>
+          <w:rFonts w:ascii="Arial" w:hAnsi="Arial"/>
+          <w:b w:val="0"/>
+          <w:i w:val="0"/>
+          <w:sz w:val="19"/>
+        </w:rPr>
+        <w:t>: einmalige 50-%-Abgabe in Anteilen, Zielfirmen OpenAI, Anthropic, xAI; bundeseigene Stimmrechte und paritätische Verwaltungsratsvertretung; Aufnahme der Staatsfonds-Logik aus § 5.4 in einen US-Gesetzentwurf. https://reason.com/2026/06/02/bernie-sanders-ai-wealth-fund-bill-shows-that-he-doesnt-understand-ai-or-wealth/ | https://fortune.com/2026/06/03/bernie-sanders-ai-ownership-sovereign-wealth-fund-electrification/</w:t>
+      </w:r>
+    </w:p>
+    <w:p>
+      <w:pPr>
+        <w:jc w:val="both"/>
+      </w:pPr>
+      <w:r>
+        <w:rPr>
+          <w:rFonts w:ascii="Arial" w:hAnsi="Arial"/>
+          <w:b w:val="0"/>
+          <w:i w:val="0"/>
+          <w:sz w:val="19"/>
+        </w:rPr>
+        <w:t xml:space="preserve">Fortune / Gizmodo / TechTimes / VentureBeat / DigitalApplied. (10./11. Juni 2026). </w:t>
+      </w:r>
+      <w:r>
+        <w:rPr>
+          <w:rFonts w:ascii="Arial" w:hAnsi="Arial"/>
+          <w:b w:val="0"/>
+          <w:i/>
+          <w:sz w:val="19"/>
+        </w:rPr>
+        <w:t>Anthropic just proposed taxing itself to pay for the jobs its AI destroys / What Happens If AI Causes 25% Unemployment? Anthropic Has a Concept of a Plan / AI Regulation Push: Amodei Demands Power Blocking Unsafe Models, Anthropic Pledges $350 Million / Anthropic CEO calls for FAA-style regulation of powerful AI models.</w:t>
+      </w:r>
+      <w:r>
+        <w:rPr>
+          <w:rFonts w:ascii="Arial" w:hAnsi="Arial"/>
+          <w:b w:val="0"/>
+          <w:i w:val="0"/>
+          <w:sz w:val="19"/>
+        </w:rPr>
+        <w:t xml:space="preserve"> Sekundärberichterstattung zu Anthropics </w:t>
+      </w:r>
+      <w:r>
+        <w:rPr>
+          <w:rFonts w:ascii="Arial" w:hAnsi="Arial"/>
+          <w:b w:val="0"/>
+          <w:i/>
+          <w:sz w:val="19"/>
+        </w:rPr>
+        <w:t>Policy on the AI Exponential</w:t>
+      </w:r>
+      <w:r>
+        <w:rPr>
+          <w:rFonts w:ascii="Arial" w:hAnsi="Arial"/>
+          <w:b w:val="0"/>
+          <w:i w:val="0"/>
+          <w:sz w:val="19"/>
+        </w:rPr>
+        <w:t xml:space="preserve"> mit Advanced AI Framework, Economic Policy Framework und 350-Mio.-USD-Finanzpaket. https://fortune.com/2026/06/11/anthropic-dario-amodei-ai-jobs-tax-displacement-fund/ | https://gizmodo.com/what-happens-if-ai-causes-25-unemployment-anthropic-has-a-concept-of-a-plan-2000770289 | https://www.techtimes.com/articles/318217/20260611/ai-regulation-push-amodei-demands-power-blocking-unsafe-models-anthropic-pledges-350-million.htm</w:t>
+      </w:r>
+    </w:p>
+    <w:p>
+      <w:pPr>
+        <w:jc w:val="both"/>
+      </w:pPr>
+      <w:r>
+        <w:rPr>
+          <w:rFonts w:ascii="Arial" w:hAnsi="Arial"/>
+          <w:b w:val="0"/>
+          <w:i w:val="0"/>
+          <w:sz w:val="19"/>
+        </w:rPr>
         <w:t xml:space="preserve">Bloomberg Editorial Board. (29. April 2026). </w:t>
       </w:r>
       <w:r>
@@ -10566,7 +11166,115 @@
           <w:i w:val="0"/>
           <w:sz w:val="19"/>
         </w:rPr>
-        <w:t xml:space="preserve"> Dieses Arbeitspapier gibt den Stand Anfang Mai 2026 (Schnitt am 8. Mai 2026 — Lauf 001 vom 8. Mai 2026) wieder. Die Debatte entwickelt sich dynamisch, insbesondere im Zuge der OpenAI-Strategiepapiere und der Eröffnung des OpenAI Workshop in Washington, D.C. im Mai 2026, des Erstdurchgangs des GKV-Beitragssatzstabilisierungsgesetzes in der 1065. Bundesratssitzung am 8. Mai 2026 mit 79 Tagesordnungspunkten (Kabinettsbeschluss 29. April 2026, parlamentarische Behandlung vor der Sommerpause 2026 angekündigt), der laufenden Trilog-Verhandlungen zum Digital Omnibus on AI (zweite Runde 28. April 2026 ohne Einigung; nächste Runde 13. Mai 2026 — Knackpunkt ist nicht die Verschiebung der Hochrisiko-Pflichten, sondern die Konformitätsbewertungs-Architektur für Anhang I; die zypriotische Ratspräsidentschaft strebt einen Abschluss vor Ablauf ihrer Amtszeit am 30. Juni 2026 an, andernfalls übernimmt die irische Präsidentschaft), der am 5. Mai 2026 erfolgten Arraignment-Verhandlung im Altman-Verfahren mit „nicht schuldig"-Plädoyer und angeordneter psychiatrischer Begutachtung, des am 7. Mai 2026 versandten individuellen Microsoft-Buyout-Angebots (Annahmefrist 8. Juni 2026, VRSAR-Unterzeichnung 9.–22. Juni 2026, bis zu fünfjährige Krankenversicherungs-Verlängerung), des am 1. Mai 2026 vom Connecticut-Repräsentantenhaus mit 131 zu 17 Stimmen verabschiedeten </w:t>
+        <w:t xml:space="preserve"> Dieses Arbeitspapier gibt den Stand Juni 2026 (Schnitt am 18. Juni 2026 — Daily-Update vom 18. Juni 2026, Version 23.0) wieder. Gegenüber dem Vorlauf vom 8. Mai 2026 sind insbesondere drei Entwicklungen aus dem Zeitraum Juni 2026 eingearbeitet: das am 10. Juni 2026 veröffentlichte </w:t>
+      </w:r>
+      <w:r>
+        <w:rPr>
+          <w:rFonts w:ascii="Arial" w:hAnsi="Arial"/>
+          <w:b w:val="0"/>
+          <w:i/>
+          <w:sz w:val="19"/>
+        </w:rPr>
+        <w:t>Anthropic-Policy-on-the-AI-Exponential</w:t>
+      </w:r>
+      <w:r>
+        <w:rPr>
+          <w:rFonts w:ascii="Arial" w:hAnsi="Arial"/>
+          <w:b w:val="0"/>
+          <w:i w:val="0"/>
+          <w:sz w:val="19"/>
+        </w:rPr>
+        <w:t xml:space="preserve">-Doppelrahmenwerk (Advanced AI Framework mit Schwelle 10²⁵ FLOPs / 500 Mio. USD KI-Umsatz / 1 Mrd. USD KI-F&amp;E und Eskalationsleiter über drei Arbeitslosigkeits-Szenarien 5 % / 10 % / beispiellos; Economic Policy Framework mit 350-Mio.-USD-Finanzpaket — 200 Mio. </w:t>
+      </w:r>
+      <w:r>
+        <w:rPr>
+          <w:rFonts w:ascii="Arial" w:hAnsi="Arial"/>
+          <w:b w:val="0"/>
+          <w:i/>
+          <w:sz w:val="19"/>
+        </w:rPr>
+        <w:t>Economic Futures Research Fund</w:t>
+      </w:r>
+      <w:r>
+        <w:rPr>
+          <w:rFonts w:ascii="Arial" w:hAnsi="Arial"/>
+          <w:b w:val="0"/>
+          <w:i w:val="0"/>
+          <w:sz w:val="19"/>
+        </w:rPr>
+        <w:t xml:space="preserve"> und 150 Mio. Stipendienprogramm); das am 4. Juni 2026 in der CNBC-</w:t>
+      </w:r>
+      <w:r>
+        <w:rPr>
+          <w:rFonts w:ascii="Arial" w:hAnsi="Arial"/>
+          <w:b w:val="0"/>
+          <w:i/>
+          <w:sz w:val="19"/>
+        </w:rPr>
+        <w:t>Squawk-Box</w:t>
+      </w:r>
+      <w:r>
+        <w:rPr>
+          <w:rFonts w:ascii="Arial" w:hAnsi="Arial"/>
+          <w:b w:val="0"/>
+          <w:i w:val="0"/>
+          <w:sz w:val="19"/>
+        </w:rPr>
+        <w:t xml:space="preserve">-Sendung konkretisierte Andrew-Yang-Konzept einer 3-%-Token-Steuer auf KI-Inferenz mit ausdrücklichem Bezug auf Anthropics „tax us, please"-Linie und auf den projizierten Billion-USD-KI-Capex-Pfad sowie der Anfang Juni 2026 angekündigte </w:t>
+      </w:r>
+      <w:r>
+        <w:rPr>
+          <w:rFonts w:ascii="Arial" w:hAnsi="Arial"/>
+          <w:b w:val="0"/>
+          <w:i/>
+          <w:sz w:val="19"/>
+        </w:rPr>
+        <w:t>American AI Sovereign Wealth Fund Act</w:t>
+      </w:r>
+      <w:r>
+        <w:rPr>
+          <w:rFonts w:ascii="Arial" w:hAnsi="Arial"/>
+          <w:b w:val="0"/>
+          <w:i w:val="0"/>
+          <w:sz w:val="19"/>
+        </w:rPr>
+        <w:t xml:space="preserve"> von Senator Bernie Sanders (einmalige 50-%-Abgabe in Unternehmens­anteilen, Zielfirmen OpenAI, Anthropic, xAI; Stimmrechtsanteile und paritätische Verwaltungsrats­vertretung des Bundes); ferner die Tracker-Tagesfortschreibung von </w:t>
+      </w:r>
+      <w:r>
+        <w:rPr>
+          <w:rFonts w:ascii="Arial" w:hAnsi="Arial"/>
+          <w:b w:val="0"/>
+          <w:i/>
+          <w:sz w:val="19"/>
+        </w:rPr>
+        <w:t>TrueUp</w:t>
+      </w:r>
+      <w:r>
+        <w:rPr>
+          <w:rFonts w:ascii="Arial" w:hAnsi="Arial"/>
+          <w:b w:val="0"/>
+          <w:i w:val="0"/>
+          <w:sz w:val="19"/>
+        </w:rPr>
+        <w:t xml:space="preserve"> zum 17. Juni 2026 (185.894 Personen aus 267 Layoff-Ereignissen, rund 1.107 Stellen pro Tag; 53 % der Ereignisse mit explizitem KI-/Automatisierungs-Bezug — 155.321 Personen aus 141 Firmen — erstmals oberhalb der Hälfte der Tracker-Population), die am 3. Juni 2026 angekündigte GitLab-Reorganisation (rund 14 % der Belegschaft, etwa 350 Personen; Rückzug aus 22 Ländern; Reduktion des Länder-Footprints um rund 30 %; Reorganisation der F&amp;E in rund 60 autonome Einheiten als „agentic era"-Restrukturierung) sowie der am 11. Juni 2026 verabschiedete Bundestagsbeschluss zum </w:t>
+      </w:r>
+      <w:r>
+        <w:rPr>
+          <w:rFonts w:ascii="Arial" w:hAnsi="Arial"/>
+          <w:b w:val="0"/>
+          <w:i/>
+          <w:sz w:val="19"/>
+        </w:rPr>
+        <w:t>KI-MIG — Gesetz zur Durchführung der EU-Verordnung über Künstliche Intelligenz</w:t>
+      </w:r>
+      <w:r>
+        <w:rPr>
+          <w:rFonts w:ascii="Arial" w:hAnsi="Arial"/>
+          <w:b w:val="0"/>
+          <w:i w:val="0"/>
+          <w:sz w:val="19"/>
+        </w:rPr>
+        <w:t xml:space="preserve"> (Drucksache 21/4594 / 21/6407) mit der Bundesnetzagentur als zentraler KI-Marktüberwachungs­behörde und ausstehender Bundesratszustimmung. Das Papier gibt davor abgesetzt den Stand Anfang Mai 2026 (Schnitt am 8. Mai 2026 — Lauf 001 vom 8. Mai 2026) wieder. Die Debatte entwickelt sich dynamisch, insbesondere im Zuge der OpenAI-Strategiepapiere und der Eröffnung des OpenAI Workshop in Washington, D.C. im Mai 2026, des Erstdurchgangs des GKV-Beitragssatzstabilisierungsgesetzes in der 1065. Bundesratssitzung am 8. Mai 2026 mit 79 Tagesordnungspunkten (Kabinettsbeschluss 29. April 2026, parlamentarische Behandlung vor der Sommerpause 2026 angekündigt), der laufenden Trilog-Verhandlungen zum Digital Omnibus on AI (zweite Runde 28. April 2026 ohne Einigung; nächste Runde 13. Mai 2026 — Knackpunkt ist nicht die Verschiebung der Hochrisiko-Pflichten, sondern die Konformitätsbewertungs-Architektur für Anhang I; die zypriotische Ratspräsidentschaft strebt einen Abschluss vor Ablauf ihrer Amtszeit am 30. Juni 2026 an, andernfalls übernimmt die irische Präsidentschaft), der am 5. Mai 2026 erfolgten Arraignment-Verhandlung im Altman-Verfahren mit „nicht schuldig"-Plädoyer und angeordneter psychiatrischer Begutachtung, des am 7. Mai 2026 versandten individuellen Microsoft-Buyout-Angebots (Annahmefrist 8. Juni 2026, VRSAR-Unterzeichnung 9.–22. Juni 2026, bis zu fünfjährige Krankenversicherungs-Verlängerung), des am 1. Mai 2026 vom Connecticut-Repräsentantenhaus mit 131 zu 17 Stimmen verabschiedeten </w:t>
       </w:r>
       <w:r>
         <w:rPr>
@@ -10862,7 +11570,7 @@
         <w:color w:val="999999"/>
         <w:sz w:val="15"/>
       </w:rPr>
-      <w:t>Version 22.0 — Mai 2026 — CC BY 4.0</w:t>
+      <w:t>Version 23.0 — Mai 2026 — CC BY 4.0</w:t>
       <w:tab/>
       <w:t xml:space="preserve">Seite </w:t>
     </w:r>

</xml_diff>

<commit_message>
Daily-Update 2026-06-20 — Version 23.0 (Cluster: B, D, E, F)
Fuenf belegbare Sachverhalte aus dem Zeitraum 27. Mai – 19. Juni 2026:
- § 4.5: Sanders, American AI Sovereign Wealth Fund Act (18. Juni 2026)
- § 4.4: EU-Parlament, Schlussabstimmung Digital Omnibus on AI (16. Juni 2026)
- § 4.5: Connecticut, Lamont-Unterzeichnung SB 5 / Public Act 26-15 (27. Mai 2026)
- § 5.2: Bundesrat, Erstdurchgang GKV-Beitragssatzstabilisierungsgesetz (12. Juni 2026)
- § 1.1: Challenger Mai-2026-Report und TrueUp-Tracker-Stand 19. Juni 2026

Build: PDF und DOCX neu erzeugt (reportlab / python-docx).
Validierung: ohne Fehler abgeschlossen (Block in Validierung-Ergebnisse.md).
Logbuch: neuer Eintrag in Aenderungshistorie.md (Lauf 001 am 2026-06-20).
</commit_message>
<xml_diff>
--- a/KI-Ökonomie.docx
+++ b/KI-Ökonomie.docx
@@ -112,7 +112,7 @@
           <w:color w:val="666666"/>
           <w:sz w:val="18"/>
         </w:rPr>
-        <w:t>Version 22.0</w:t>
+        <w:t>Version 23.0</w:t>
       </w:r>
     </w:p>
     <w:p>
@@ -382,7 +382,97 @@
           <w:i w:val="0"/>
           <w:sz w:val="19"/>
         </w:rPr>
-        <w:t xml:space="preserve">-Differenzierung vom 1. Mai 2026 genannte Mehrkanalerklärung (KI-Verdrängung, Austerity-Logik, Pandemie-Korrekturen, Routine-Restrukturierung) zusätzlich stützt. Der parallele Lauf der Branchen-AI-Capex-Programme (Q1-2026-Investitionen der Hyperscaler von rund 130,65 Milliarden US-Dollar; Konsens-Schätzung Anfang April 2026 zwischen 660 und 700 Milliarden US-Dollar, nach den Q1-2026-Earnings-Calls vom 28.–30. April 2026 — von der </w:t>
+        <w:t xml:space="preserve">-Differenzierung vom 1. Mai 2026 genannte Mehrkanalerklärung (KI-Verdrängung, Austerity-Logik, Pandemie-Korrekturen, Routine-Restrukturierung) zusätzlich stützt. Der Folgereport </w:t>
+      </w:r>
+      <w:r>
+        <w:rPr>
+          <w:rFonts w:ascii="Arial" w:hAnsi="Arial"/>
+          <w:b w:val="0"/>
+          <w:i/>
+          <w:sz w:val="19"/>
+        </w:rPr>
+        <w:t>Mai-2026-Job-Cuts-Report</w:t>
+      </w:r>
+      <w:r>
+        <w:rPr>
+          <w:rFonts w:ascii="Arial" w:hAnsi="Arial"/>
+          <w:b w:val="0"/>
+          <w:i w:val="0"/>
+          <w:sz w:val="19"/>
+        </w:rPr>
+        <w:t xml:space="preserve"> von </w:t>
+      </w:r>
+      <w:r>
+        <w:rPr>
+          <w:rFonts w:ascii="Arial" w:hAnsi="Arial"/>
+          <w:b w:val="0"/>
+          <w:i/>
+          <w:sz w:val="19"/>
+        </w:rPr>
+        <w:t>Challenger, Gray &amp; Christmas</w:t>
+      </w:r>
+      <w:r>
+        <w:rPr>
+          <w:rFonts w:ascii="Arial" w:hAnsi="Arial"/>
+          <w:b w:val="0"/>
+          <w:i w:val="0"/>
+          <w:sz w:val="19"/>
+        </w:rPr>
+        <w:t xml:space="preserve"> (Anfang Juni 2026) verschiebt diese Linie noch einmal qualitativ: Die Streichungen im Mai 2026 steigen auf 97.006 (+16 % gegenüber April; höchster Mai-Wert seit dem Pandemiehoch 2020 mit damals 397.016), KI-bezogene Streichungen erreichen 38.579 (rund 40 % des Monatsvolumens und damit erstmals der häufigste Einzelgrund eines Monats in der Challenger-Tracking-Geschichte, drei Monate in Folge auf Rang 1); auf das laufende Jahr 2026 kumuliert weist Challenger bis Mai 397.755 Streichungen aus, davon Tech 123.653 (+66 % gegenüber dem Vorjahresvergleichszeitraum, höchster Mai-Tech-Wert seit August 2024) und KI-bezogen 87.714 — ein Niveau, das den Jahreswert 2025 für KI-bezogene Streichungen (54.836) bereits Mitte des Jahres übersteigt. Eine weitere Tagesfortschreibung der TrueUp-Methodik zum 19. Juni 2026 weist 185.894 betroffene Personen aus 267 Layoff-Meldungen aus (rund 1.093 Stellen pro Tag — eine erneute Beschleunigung gegenüber dem 8.-Mai-Stand 127.411 / 283 / 1.003 pro Tag) und integriert die im Mai/Juni 2026 angekündigten KI-bezogenen Personalmaßnahmen unter anderem von </w:t>
+      </w:r>
+      <w:r>
+        <w:rPr>
+          <w:rFonts w:ascii="Arial" w:hAnsi="Arial"/>
+          <w:b w:val="0"/>
+          <w:i/>
+          <w:sz w:val="19"/>
+        </w:rPr>
+        <w:t>ServiceNow</w:t>
+      </w:r>
+      <w:r>
+        <w:rPr>
+          <w:rFonts w:ascii="Arial" w:hAnsi="Arial"/>
+          <w:b w:val="0"/>
+          <w:i w:val="0"/>
+          <w:sz w:val="19"/>
+        </w:rPr>
+        <w:t xml:space="preserve"> (mehrere Hundert Stellen, 12. Juni 2026, ausdrücklich mit dem zunehmenden internen KI-Einsatz begründet), </w:t>
+      </w:r>
+      <w:r>
+        <w:rPr>
+          <w:rFonts w:ascii="Arial" w:hAnsi="Arial"/>
+          <w:b w:val="0"/>
+          <w:i/>
+          <w:sz w:val="19"/>
+        </w:rPr>
+        <w:t>Salesforce</w:t>
+      </w:r>
+      <w:r>
+        <w:rPr>
+          <w:rFonts w:ascii="Arial" w:hAnsi="Arial"/>
+          <w:b w:val="0"/>
+          <w:i w:val="0"/>
+          <w:sz w:val="19"/>
+        </w:rPr>
+        <w:t xml:space="preserve"> (86 Stellen MuleSoft / Marketing Cloud, 13. Juni 2026) und </w:t>
+      </w:r>
+      <w:r>
+        <w:rPr>
+          <w:rFonts w:ascii="Arial" w:hAnsi="Arial"/>
+          <w:b w:val="0"/>
+          <w:i/>
+          <w:sz w:val="19"/>
+        </w:rPr>
+        <w:t>BBC</w:t>
+      </w:r>
+      <w:r>
+        <w:rPr>
+          <w:rFonts w:ascii="Arial" w:hAnsi="Arial"/>
+          <w:b w:val="0"/>
+          <w:i w:val="0"/>
+          <w:sz w:val="19"/>
+        </w:rPr>
+        <w:t xml:space="preserve"> (mehrere Hundert Stellen im News-Geschäft, 15. Juni 2026). Damit verfestigt sich der Befund einer KI-getriebenen Strukturanpassung als laufende, nicht punktuelle Linie. Der parallele Lauf der Branchen-AI-Capex-Programme (Q1-2026-Investitionen der Hyperscaler von rund 130,65 Milliarden US-Dollar; Konsens-Schätzung Anfang April 2026 zwischen 660 und 700 Milliarden US-Dollar, nach den Q1-2026-Earnings-Calls vom 28.–30. April 2026 — von der </w:t>
       </w:r>
       <w:r>
         <w:rPr>
@@ -2171,7 +2261,43 @@
           <w:i w:val="0"/>
           <w:sz w:val="19"/>
         </w:rPr>
-        <w:t>Die Two-Pillar-Reform der OECD (Organisation für wirtschaftliche Zusammenarbeit und Entwicklung; Pillar 1 zur Umverteilung von Besteuerungsrechten, Pillar 2 zur globalen Mindestbesteuerung von 15 %) schafft einen Rahmen, in dem große digitale Konzerne stärker besteuert werden können — allerdings nicht spezifisch für KI-Leistungen. Im Januar 2026 hat das OECD Inclusive Framework mit dem „Side-by-Side Package" einen verfeinerten Umsetzungsrahmen für Pillar 2 vorgelegt (neue administrative Leitlinien, zusätzliche Safe-Harbor-Regelungen, aktualisierter zentraler Rechtsaktenkatalog zum Stand 1. Dezember 2025); die fortlaufende Arbeitsagenda zeigt, dass das internationale Koordinationsgerüst weiter belastbar ist — bleibt aber für KI-spezifische Anknüpfungspunkte (etwa Abschöpfung inländischer KI-Nutzung) ausbaufähig. Parallel hat das US-Treasury im Januar 2026 angekündigt, dass US-amerikanisch geführte Konzerne von Pillar 2 ausgenommen bleiben — de facto ein Rückzug der USA aus dem bereits ausgehandelten Mindestbesteuerungsregime. Für die europäische Steuerdebatte bedeutet das eine asymmetrische Konstellation: EU-Staaten können Pillar 2 weiterhin durchsetzen, müssen aber mit einer anhaltenden Steuerdifferenz zu US-KI-Anbietern rechnen; das stärkt das Gewicht unilateraler europäischer Maßnahmen (Digital Services Tax, inländische Nutzungsabgaben), ohne sie zu einem Ersatz für die multilaterale Koordination zu machen.</w:t>
+        <w:t xml:space="preserve">Die Two-Pillar-Reform der OECD (Organisation für wirtschaftliche Zusammenarbeit und Entwicklung; Pillar 1 zur Umverteilung von Besteuerungsrechten, Pillar 2 zur globalen Mindestbesteuerung von 15 %) schafft einen Rahmen, in dem große digitale Konzerne stärker besteuert werden können — allerdings nicht spezifisch für KI-Leistungen. Im Januar 2026 hat das OECD Inclusive Framework mit dem „Side-by-Side Package" einen verfeinerten Umsetzungsrahmen für Pillar 2 vorgelegt (neue administrative Leitlinien, zusätzliche Safe-Harbor-Regelungen, aktualisierter zentraler Rechtsaktenkatalog zum Stand 1. Dezember 2025); die fortlaufende Arbeitsagenda zeigt, dass das internationale Koordinationsgerüst weiter belastbar ist — bleibt aber für KI-spezifische Anknüpfungspunkte (etwa Abschöpfung inländischer KI-Nutzung) ausbaufähig. Parallel hat das US-Treasury im Januar 2026 angekündigt, dass US-amerikanisch geführte Konzerne von Pillar 2 ausgenommen bleiben — de facto ein Rückzug der USA aus dem bereits ausgehandelten Mindestbesteuerungsregime. Für die europäische Steuerdebatte bedeutet das eine asymmetrische Konstellation: EU-Staaten können Pillar 2 weiterhin durchsetzen, müssen aber mit einer anhaltenden Steuerdifferenz zu US-KI-Anbietern rechnen; das stärkt das Gewicht unilateraler europäischer Maßnahmen (Digital Services Tax, inländische Nutzungsabgaben), ohne sie zu einem Ersatz für die multilaterale Koordination zu machen. Für die KI-Regulierung selbst hat die EU am 16. Juni 2026 mit 423 zu 57 Stimmen bei 174 Enthaltungen die im </w:t>
+      </w:r>
+      <w:r>
+        <w:rPr>
+          <w:rFonts w:ascii="Arial" w:hAnsi="Arial"/>
+          <w:b w:val="0"/>
+          <w:i/>
+          <w:sz w:val="19"/>
+        </w:rPr>
+        <w:t>Trilog</w:t>
+      </w:r>
+      <w:r>
+        <w:rPr>
+          <w:rFonts w:ascii="Arial" w:hAnsi="Arial"/>
+          <w:b w:val="0"/>
+          <w:i w:val="0"/>
+          <w:sz w:val="19"/>
+        </w:rPr>
+        <w:t xml:space="preserve"> vom 7. Mai 2026 zwischen Rat und Parlament erzielte Einigung zum </w:t>
+      </w:r>
+      <w:r>
+        <w:rPr>
+          <w:rFonts w:ascii="Arial" w:hAnsi="Arial"/>
+          <w:b w:val="0"/>
+          <w:i/>
+          <w:sz w:val="19"/>
+        </w:rPr>
+        <w:t>Digital Omnibus on AI</w:t>
+      </w:r>
+      <w:r>
+        <w:rPr>
+          <w:rFonts w:ascii="Arial" w:hAnsi="Arial"/>
+          <w:b w:val="0"/>
+          <w:i w:val="0"/>
+          <w:sz w:val="19"/>
+        </w:rPr>
+        <w:t xml:space="preserve"> im Plenum bestätigt; damit wären die Hauptanwendungsdaten der Hochrisiko-Pflichten formal auf den 2. Dezember 2027 (Anhang III, eigenständige Systeme) und den 2. August 2028 (Anhang I, Sicherheitskomponenten unter sektorspezifischen EU-Rechtsakten) verschoben, die Kennzeichnungspflicht KI-generierter Inhalte auf den 2. Dezember 2026 hinausgezögert, eine ergänzende Verbotskategorie in Artikel 5 zu KI-generierten Darstellungen sexualisierter Gewalt gegen Minderjährige und nicht-einvernehmlicher intimer Inhalte eingeführt und der Streit um die Konformitätsbewertungs-Architektur für Anhang I einer kompromissfähigen Lösung zugeführt; die Hauptbestimmungen des AI Act sollen weiterhin ab dem 2. August 2026 anwendbar sein. Für die hier geführte Debatte ist relevant, dass damit die Pflichtenarchitektur, an die eine künftige fiskalische Anknüpfung (etwa Disclosure-getriebene Anknüpfungstatbestände einer KI-Nutzungsabgabe) andocken könnte, planungssicher feststeht, ohne dass die fiskalische Stellschraube selbst Gegenstand des Omnibus wäre.</w:t>
       </w:r>
     </w:p>
     <w:p>
@@ -2264,7 +2390,61 @@
           <w:i w:val="0"/>
           <w:sz w:val="19"/>
         </w:rPr>
-        <w:t xml:space="preserve"> (S. 4214, 119. Kongress) eingebracht, der ein bundesweites Moratorium für neue und aufgerüstete KI-Rechenzentren oberhalb definierter Stromschwellen vorsieht, bis der Gesetzgeber Mindeststandards in den Bereichen Umwelt, Energie, Arbeit und Bürgerrechte verabschiedet; der Gesetzentwurf formuliert ausdrücklich, die „wirtschaftlichen Gewinne aus künstlicher Intelligenz und Robotik" sollten „Beschäftigten, nicht nur wohlhabenden Big-Tech-Eigentümern" zugutekommen. Am 16. April 2026 hat Sanders die Linie mit einem Namensbeitrag („Artificial intelligence is coming for the working class. We must fight back.") erneuert und die HELP-Anhörung genutzt, um für Robotersteuer und Moratorium zu werben. Die Aussicht auf Annahme des Entwurfs in einem republikanisch geführten Kongress gilt als gering; als Signalgebung ist er jedoch der bislang konkreteste politische Vorstoß auf US-Bundesebene.</w:t>
+        <w:t xml:space="preserve"> (S. 4214, 119. Kongress) eingebracht, der ein bundesweites Moratorium für neue und aufgerüstete KI-Rechenzentren oberhalb definierter Stromschwellen vorsieht, bis der Gesetzgeber Mindeststandards in den Bereichen Umwelt, Energie, Arbeit und Bürgerrechte verabschiedet; der Gesetzentwurf formuliert ausdrücklich, die „wirtschaftlichen Gewinne aus künstlicher Intelligenz und Robotik" sollten „Beschäftigten, nicht nur wohlhabenden Big-Tech-Eigentümern" zugutekommen. Am 16. April 2026 hat Sanders die Linie mit einem Namensbeitrag („Artificial intelligence is coming for the working class. We must fight back.") erneuert und die HELP-Anhörung genutzt, um für Robotersteuer und Moratorium zu werben. Am 18. Juni 2026 hat Sanders mit dem </w:t>
+      </w:r>
+      <w:r>
+        <w:rPr>
+          <w:rFonts w:ascii="Arial" w:hAnsi="Arial"/>
+          <w:b w:val="0"/>
+          <w:i/>
+          <w:sz w:val="19"/>
+        </w:rPr>
+        <w:t>American AI Sovereign Wealth Fund Act</w:t>
+      </w:r>
+      <w:r>
+        <w:rPr>
+          <w:rFonts w:ascii="Arial" w:hAnsi="Arial"/>
+          <w:b w:val="0"/>
+          <w:i w:val="0"/>
+          <w:sz w:val="19"/>
+        </w:rPr>
+        <w:t xml:space="preserve"> einen dritten und qualitativ neuen Baustein eingebracht: KI-Unternehmen ab 200 Millionen US-Dollar Jahresumsatz sollen bei Inkrafttreten einmalig eine Aktienabgabe in Höhe von 50 Prozent ihres Eigenkapitalwerts an einen neu zu schaffenden öffentlichen </w:t>
+      </w:r>
+      <w:r>
+        <w:rPr>
+          <w:rFonts w:ascii="Arial" w:hAnsi="Arial"/>
+          <w:b w:val="0"/>
+          <w:i/>
+          <w:sz w:val="19"/>
+        </w:rPr>
+        <w:t>Sovereign Wealth Fund</w:t>
+      </w:r>
+      <w:r>
+        <w:rPr>
+          <w:rFonts w:ascii="Arial" w:hAnsi="Arial"/>
+          <w:b w:val="0"/>
+          <w:i w:val="0"/>
+          <w:sz w:val="19"/>
+        </w:rPr>
+        <w:t xml:space="preserve"> leisten, dessen Volumen Sanders auf rund 7 Billionen US-Dollar schätzt; aus einer jährlichen Ausschüttung von 5 Prozent des Fondswerts solle jede erwachsene US-Bürgerin und jeder erwachsene US-Bürger eine Direktzahlung von mehr als 1.000 US-Dollar pro Jahr erhalten, weitere Mittel könnten in Bildung, Gesundheit und Wohnen fließen. Die Verwaltung würde eine </w:t>
+      </w:r>
+      <w:r>
+        <w:rPr>
+          <w:rFonts w:ascii="Arial" w:hAnsi="Arial"/>
+          <w:b w:val="0"/>
+          <w:i/>
+          <w:sz w:val="19"/>
+        </w:rPr>
+        <w:t>Independent Commission for Democratic AI</w:t>
+      </w:r>
+      <w:r>
+        <w:rPr>
+          <w:rFonts w:ascii="Arial" w:hAnsi="Arial"/>
+          <w:b w:val="0"/>
+          <w:i w:val="0"/>
+          <w:sz w:val="19"/>
+        </w:rPr>
+        <w:t xml:space="preserve"> mit sieben Mitgliedern übernehmen, die nominiert vom Präsidenten und bestätigt vom Senat aus einer vom Kongress vorgeschlagenen Liste benannt werden sollen. Der Entwurf verschiebt die Sanders-Linie damit von einer korrigierenden Robotersteuer (Typ 5 nach § 2.1) zu einem Eigentums- und Teilhabe-Modell, das konzeptionell unmittelbar an die in § 5.4 referierten Staatsfonds-Vorschläge und an die OpenAI-Empfehlung eines öffentlichen Wohlstandsfonds nach norwegischem Vorbild anknüpft — mit deutlich höherem Eingriffsgrad und einer einmaligen, nicht laufenden fiskalischen Anknüpfung. Auch dieser Entwurf hat in einem republikanisch geführten Kongress keine realistischen Annahmechancen; er ist aber als Signal bemerkenswert, weil er einen demokratischen Teilhabe-Mechanismus erstmals US-bundesgesetzlich vorschlägt — und damit das in § 8.3 entwickelte Teilhabe-Argument der Deutschland-These auf US-Seite ein institutionelles Pendant erhält. Die Aussicht auf Annahme der drei Sanders-Entwürfe in einem republikanisch geführten Kongress gilt insgesamt als gering; als Signalgebung sind sie jedoch die bislang konkretesten politischen Vorstöße auf US-Bundesebene.</w:t>
       </w:r>
     </w:p>
     <w:p>
@@ -2562,7 +2742,25 @@
           <w:i w:val="0"/>
           <w:sz w:val="19"/>
         </w:rPr>
-        <w:t xml:space="preserve"> am 1. Mai 2026 mit 131 zu 17 Stimmen verabschiedet, Gouverneur Ned Lamont hat seine Unterzeichnung angekündigt. Für die Steuerdebatte ist neben Frontier- und Sandbox-Komponenten vor allem ein arbeitsrechtlicher Baustein bemerkenswert: </w:t>
+        <w:t xml:space="preserve"> am 1. Mai 2026 mit 131 zu 17 Stimmen verabschiedet, Gouverneur Ned Lamont hat das Gesetz am 27. Mai 2026 unterzeichnet (</w:t>
+      </w:r>
+      <w:r>
+        <w:rPr>
+          <w:rFonts w:ascii="Arial" w:hAnsi="Arial"/>
+          <w:b w:val="0"/>
+          <w:i/>
+          <w:sz w:val="19"/>
+        </w:rPr>
+        <w:t>Public Act 26-15</w:t>
+      </w:r>
+      <w:r>
+        <w:rPr>
+          <w:rFonts w:ascii="Arial" w:hAnsi="Arial"/>
+          <w:b w:val="0"/>
+          <w:i w:val="0"/>
+          <w:sz w:val="19"/>
+        </w:rPr>
+        <w:t xml:space="preserve">). Für die Steuerdebatte ist neben Frontier- und Sandbox-Komponenten vor allem ein arbeitsrechtlicher Baustein bemerkenswert: </w:t>
       </w:r>
       <w:r>
         <w:rPr>
@@ -3632,7 +3830,7 @@
           <w:i w:val="0"/>
           <w:sz w:val="19"/>
         </w:rPr>
-        <w:t xml:space="preserve"> beschlossen; im Verlauf der Ressortabstimmung wurde das Sparvolumen je nach Berichterstattung mit rund 16,3 Milliarden Euro (Frühberichterstattung) bzw. rund 19,6 Milliarden Euro (BMG-Tabellen Stand Anfang Mai 2026, gegliedert in 4,9 Milliarden einnahmen­seitige und rund 15 Milliarden ausgaben­seitige Komponenten) für 2027 angegeben; bis 2030 sieht das BMG eine Steigerung des Konsolidierungseffekts auf rund 42,8 Milliarden Euro vor. Die parlamentarische Behandlung soll laut BMG-Zeitplan vor der Sommerpause 2026 abgeschlossen werden — der Kabinettentwurf wird dem Bundesrat im ersten Durchgang am 8. Mai 2026 zugeleitet (1065. Sitzung; insgesamt 79 Tagesordnungspunkte, darunter eine flankierende Thüringer Entschließung zum Bürokratieabbau in der gesetzlichen Krankenversicherung); die erste Bundestagslesung ist im weiteren Verlauf des Mai/Juni 2026 vorgesehen. Die Reform belastet Krankenhäuser, pharmazeutische Industrie, Apotheken, Ärzteschaft, Versicherte, Arbeitgeber und Krankenkassen gemeinsam; sie folgt dem Leitsatz „Ausgaben an Einnahmen koppeln" und greift damit fiskalisch genau die Logik auf, die § 5.1 in der Beitrags­seite spiegelbildlich zu erweitern vorschlägt. Auch wenn die GKV-Reform primär ausgaben- und strukturseitig ansetzt, bestätigt sie den in § 5.1 angerissenen finanzpolitischen Befund: Die lohnbasierten Sicherungszweige geraten gleichzeitig durch demografischen Druck und durch die in § 1.1 dokumentierten KI-induzierten Beschäftigungsverschiebungen unter Spannung — eine Verbreiterung der Bemessungsgrundlage gewinnt damit zusätzlich an Plausibilität.</w:t>
+        <w:t xml:space="preserve"> beschlossen; im Verlauf der Ressortabstimmung wurde das Sparvolumen je nach Berichterstattung mit rund 16,3 Milliarden Euro (Frühberichterstattung) bzw. rund 19,6 Milliarden Euro (BMG-Tabellen Stand Anfang Mai 2026, gegliedert in 4,9 Milliarden einnahmen­seitige und rund 15 Milliarden ausgaben­seitige Komponenten) für 2027 angegeben; bis 2030 sieht das BMG eine Steigerung des Konsolidierungseffekts auf rund 42,8 Milliarden Euro vor. Die parlamentarische Behandlung soll laut BMG-Zeitplan vor der Sommerpause 2026 abgeschlossen werden — der Kabinettentwurf wurde dem Bundesrat über die 1065. Sitzung am 8. Mai 2026 (insgesamt 79 Tagesordnungspunkte, darunter eine flankierende Thüringer Entschließung zum Bürokratieabbau in der gesetzlichen Krankenversicherung) zugeleitet; der eigentliche Erstdurchgang im Bundesrat fand in der Sitzung am 12. Juni 2026 statt, dreizehn Redner äußerten sich, der federführende Gesundheitsausschuss empfahl mit großer Mehrheit knapp 50 Stellungnahmen, von denen über 30 die (teilweise) Rücknahme von Sparmaßnahmen sowie drei eine stärkere Finanzbeteiligung des Bundes verlangen; Brandenburg brachte am 12. Juni 2026 mehrere Länderanträge zur Sicherung von Krankenhausversorgung, ambulanter Praxen und Apotheken ein. Die erste Bundestagslesung erfolgte ebenfalls am 12. Juni 2026, die Bundestagsabstimmung ist nach BMG-Zeitplan für den 26. Juni 2026 vor der Sommerpause vorgesehen. Die Reform belastet Krankenhäuser, pharmazeutische Industrie, Apotheken, Ärzteschaft, Versicherte, Arbeitgeber und Krankenkassen gemeinsam; sie folgt dem Leitsatz „Ausgaben an Einnahmen koppeln" und greift damit fiskalisch genau die Logik auf, die § 5.1 in der Beitrags­seite spiegelbildlich zu erweitern vorschlägt. Auch wenn die GKV-Reform primär ausgaben- und strukturseitig ansetzt, bestätigt sie den in § 5.1 angerissenen finanzpolitischen Befund: Die lohnbasierten Sicherungszweige geraten gleichzeitig durch demografischen Druck und durch die in § 1.1 dokumentierten KI-induzierten Beschäftigungsverschiebungen unter Spannung — eine Verbreiterung der Bemessungsgrundlage gewinnt damit zusätzlich an Plausibilität.</w:t>
       </w:r>
     </w:p>
     <w:p>
@@ -8956,6 +9154,188 @@
           <w:i w:val="0"/>
           <w:sz w:val="19"/>
         </w:rPr>
+        <w:t xml:space="preserve">US Senate, 119th Congress. (18. Juni 2026). </w:t>
+      </w:r>
+      <w:r>
+        <w:rPr>
+          <w:rFonts w:ascii="Arial" w:hAnsi="Arial"/>
+          <w:b w:val="0"/>
+          <w:i/>
+          <w:sz w:val="19"/>
+        </w:rPr>
+        <w:t>American AI Sovereign Wealth Fund Act</w:t>
+      </w:r>
+      <w:r>
+        <w:rPr>
+          <w:rFonts w:ascii="Arial" w:hAnsi="Arial"/>
+          <w:b w:val="0"/>
+          <w:i w:val="0"/>
+          <w:sz w:val="19"/>
+        </w:rPr>
+        <w:t xml:space="preserve"> (Einbringer: Bernie Sanders). 50 % einmalige Aktienabgabe auf KI-Unternehmen ab 200 Mio. USD Jahresumsatz; geschätzter Fondswert 7 Bio. USD; 5 % jährliche Ausschüttung, Direktzahlung &gt; 1.000 USD pro Jahr und erwachsener US-Person; Aufsicht durch eine </w:t>
+      </w:r>
+      <w:r>
+        <w:rPr>
+          <w:rFonts w:ascii="Arial" w:hAnsi="Arial"/>
+          <w:b w:val="0"/>
+          <w:i/>
+          <w:sz w:val="19"/>
+        </w:rPr>
+        <w:t>Independent Commission for Democratic AI</w:t>
+      </w:r>
+      <w:r>
+        <w:rPr>
+          <w:rFonts w:ascii="Arial" w:hAnsi="Arial"/>
+          <w:b w:val="0"/>
+          <w:i w:val="0"/>
+          <w:sz w:val="19"/>
+        </w:rPr>
+        <w:t xml:space="preserve"> mit sieben präsidial nominierten und senatorisch bestätigten Mitgliedern auf Basis einer Vorschlagsliste des Kongresses. Pressemitteilung und Folgeberichterstattung: https://www.sanders.senate.gov/press-releases/news-sanders-introduces-legislation-to-create-7-trillion-ai-sovereign-wealth-fund/ | https://rollcall.com/2026/06/18/sovereign-wealth-fund-tax-on-ai-companies-unveiled-by-sanders/ | https://fortune.com/2026/06/18/bernie-sanders-ai-fund-bill-sam-altman-1000-payments/ | https://newrepublic.com/post/212060/bernie-sanders-bill-public-ownership-ai-payout</w:t>
+      </w:r>
+    </w:p>
+    <w:p>
+      <w:pPr>
+        <w:jc w:val="both"/>
+      </w:pPr>
+      <w:r>
+        <w:rPr>
+          <w:rFonts w:ascii="Arial" w:hAnsi="Arial"/>
+          <w:b w:val="0"/>
+          <w:i w:val="0"/>
+          <w:sz w:val="19"/>
+        </w:rPr>
+        <w:t xml:space="preserve">Office of Governor Ned Lamont, Connecticut. (27. Mai 2026). </w:t>
+      </w:r>
+      <w:r>
+        <w:rPr>
+          <w:rFonts w:ascii="Arial" w:hAnsi="Arial"/>
+          <w:b w:val="0"/>
+          <w:i/>
+          <w:sz w:val="19"/>
+        </w:rPr>
+        <w:t>Governor Lamont Signs Legislation Establishing Youth Online Safety Protections, Regulations Over Artificial Intelligence, and Initiatives to Upskill Connecticut's Workforce.</w:t>
+      </w:r>
+      <w:r>
+        <w:rPr>
+          <w:rFonts w:ascii="Arial" w:hAnsi="Arial"/>
+          <w:b w:val="0"/>
+          <w:i w:val="0"/>
+          <w:sz w:val="19"/>
+        </w:rPr>
+        <w:t xml:space="preserve"> Unterzeichnung von </w:t>
+      </w:r>
+      <w:r>
+        <w:rPr>
+          <w:rFonts w:ascii="Arial" w:hAnsi="Arial"/>
+          <w:b w:val="0"/>
+          <w:i/>
+          <w:sz w:val="19"/>
+        </w:rPr>
+        <w:t>Senate Bill 5 — Connecticut Artificial Intelligence Responsibility and Transparency Act</w:t>
+      </w:r>
+      <w:r>
+        <w:rPr>
+          <w:rFonts w:ascii="Arial" w:hAnsi="Arial"/>
+          <w:b w:val="0"/>
+          <w:i w:val="0"/>
+          <w:sz w:val="19"/>
+        </w:rPr>
+        <w:t xml:space="preserve"> als </w:t>
+      </w:r>
+      <w:r>
+        <w:rPr>
+          <w:rFonts w:ascii="Arial" w:hAnsi="Arial"/>
+          <w:b w:val="0"/>
+          <w:i/>
+          <w:sz w:val="19"/>
+        </w:rPr>
+        <w:t>Public Act 26-15</w:t>
+      </w:r>
+      <w:r>
+        <w:rPr>
+          <w:rFonts w:ascii="Arial" w:hAnsi="Arial"/>
+          <w:b w:val="0"/>
+          <w:i w:val="0"/>
+          <w:sz w:val="19"/>
+        </w:rPr>
+        <w:t>. https://portal.ct.gov/governor/news/press-releases/2026/06-2026/governor-lamont-signs-legislation-establishing-youth-online-safety-protections | https://www.mofo.com/resources/insights/260608-connecticut-enacts-sweeping-ai-law | https://www.hklaw.com/en/insights/publications/2026/06/connecticut-enacts-comprehensive-ai-legislation</w:t>
+      </w:r>
+    </w:p>
+    <w:p>
+      <w:pPr>
+        <w:jc w:val="both"/>
+      </w:pPr>
+      <w:r>
+        <w:rPr>
+          <w:rFonts w:ascii="Arial" w:hAnsi="Arial"/>
+          <w:b w:val="0"/>
+          <w:i w:val="0"/>
+          <w:sz w:val="19"/>
+        </w:rPr>
+        <w:t xml:space="preserve">Europäisches Parlament. (16. Juni 2026). </w:t>
+      </w:r>
+      <w:r>
+        <w:rPr>
+          <w:rFonts w:ascii="Arial" w:hAnsi="Arial"/>
+          <w:b w:val="0"/>
+          <w:i/>
+          <w:sz w:val="19"/>
+        </w:rPr>
+        <w:t>European Parliament approves AI Act amendments / Simplification of the implementation of harmonised rules on artificial intelligence (Digital Omnibus on AI) — Vote Results.</w:t>
+      </w:r>
+      <w:r>
+        <w:rPr>
+          <w:rFonts w:ascii="Arial" w:hAnsi="Arial"/>
+          <w:b w:val="0"/>
+          <w:i w:val="0"/>
+          <w:sz w:val="19"/>
+        </w:rPr>
+        <w:t xml:space="preserve"> Schlussabstimmung im Plenum: 423 zu 57 Stimmen bei 174 Enthaltungen; Hochrisiko-Stichtage 2. Dezember 2027 (Anhang III) und 2. August 2028 (Anhang I); Watermarking-Stichtag 2. Dezember 2026; neue Artikel-5-Verbotskategorie zu KI-generierten Darstellungen sexualisierter Gewalt gegen Minderjährige und nicht-einvernehmlichen intimen Inhalten. https://sofiaglobe.com/2026/06/16/european-parliament-approves-ai-act-amendments-nudifier-ban/ | https://howtheyvote.eu/votes/189384 | https://www.consilium.europa.eu/en/press/press-releases/2026/05/07/artificial-intelligence-council-and-parliament-agree-to-simplify-and-streamline-rules/ | https://www.matheson.com/insights/eu-parliament-approves-amendments-to-the-ai-act/</w:t>
+      </w:r>
+    </w:p>
+    <w:p>
+      <w:pPr>
+        <w:jc w:val="both"/>
+      </w:pPr>
+      <w:r>
+        <w:rPr>
+          <w:rFonts w:ascii="Arial" w:hAnsi="Arial"/>
+          <w:b w:val="0"/>
+          <w:i w:val="0"/>
+          <w:sz w:val="19"/>
+        </w:rPr>
+        <w:t xml:space="preserve">Bundesrat. (12. Juni 2026). </w:t>
+      </w:r>
+      <w:r>
+        <w:rPr>
+          <w:rFonts w:ascii="Arial" w:hAnsi="Arial"/>
+          <w:b w:val="0"/>
+          <w:i/>
+          <w:sz w:val="19"/>
+        </w:rPr>
+        <w:t>986. Bundesratssitzung (Stand 12. Juni 2026) — Erster Durchgang zum GKV-Beitragssatzstabilisierungsgesetz.</w:t>
+      </w:r>
+      <w:r>
+        <w:rPr>
+          <w:rFonts w:ascii="Arial" w:hAnsi="Arial"/>
+          <w:b w:val="0"/>
+          <w:i w:val="0"/>
+          <w:sz w:val="19"/>
+        </w:rPr>
+        <w:t xml:space="preserve"> Brandenburger Initiative für Anträge zur Sicherung der ambulanten und stationären Versorgung; federführender Gesundheitsausschuss mit knapp 50 Stellungnahmen, davon über 30 zur (teilweisen) Rücknahme von Sparmaßnahmen und drei zur stärkeren Bundes-Mitfinanzierung. https://www.bundestag.de/dokumente/textarchiv/2026/kw26-de-gkv-1184352 | https://masgz.brandenburg.de/masgz/de/presse/pressemitteilungen/detail/~11-06-2026-bundesrat-gkv-reform | https://www.pharmadeutschland.de/newsroom/news/gkv-bstabg-in-bundestag-und-bundesrat/</w:t>
+      </w:r>
+    </w:p>
+    <w:p>
+      <w:pPr>
+        <w:jc w:val="both"/>
+      </w:pPr>
+      <w:r>
+        <w:rPr>
+          <w:rFonts w:ascii="Arial" w:hAnsi="Arial"/>
+          <w:b w:val="0"/>
+          <w:i w:val="0"/>
+          <w:sz w:val="19"/>
+        </w:rPr>
         <w:t>Springer Gabler Verlag. Gabler Wirtschaftslexikon, Stichwort: Robotersteuer.</w:t>
       </w:r>
     </w:p>
@@ -10169,6 +10549,70 @@
           <w:i w:val="0"/>
           <w:sz w:val="19"/>
         </w:rPr>
+        <w:t xml:space="preserve">Challenger, Gray &amp; Christmas / Yahoo Finance / Tech Jacks Solutions. (Anfang Juni 2026). </w:t>
+      </w:r>
+      <w:r>
+        <w:rPr>
+          <w:rFonts w:ascii="Arial" w:hAnsi="Arial"/>
+          <w:b w:val="0"/>
+          <w:i/>
+          <w:sz w:val="19"/>
+        </w:rPr>
+        <w:t>Challenger Report: May Job Cuts Rise 16 % from April; Highest May Total Since 2020 / AI was a major contributor to layoffs in May / AI Is Now the Top Self-Reported Layoff Driver in the U.S., Challenger May 2026 Data Shows.</w:t>
+      </w:r>
+      <w:r>
+        <w:rPr>
+          <w:rFonts w:ascii="Arial" w:hAnsi="Arial"/>
+          <w:b w:val="0"/>
+          <w:i w:val="0"/>
+          <w:sz w:val="19"/>
+        </w:rPr>
+        <w:t xml:space="preserve"> Mai-2026-Streichungen 97.006 (+16 % gegenüber April; höchster Mai-Wert seit 2020); KI-bezogen 38.579 (rund 40 % des Monatsvolumens — erstmals häufigster Einzelgrund eines Monats in der Tracking-Geschichte, drei Monate in Folge auf Rang 1); Tech Mai 38.242 (höchster monatlicher Tech-Wert seit August 2024); YTD bis Mai 397.755; YTD Tech 123.653 (+66 % gegenüber Vorjahresstand); YTD KI-bezogen 87.714 — übersteigt bereits den Jahreswert 2025 (54.836). https://www.challengergray.com/blog/challenger-report-may-job-cuts-rise-16-from-april-highest-may-total-since-2020/ | https://www.challengergray.com/wp-content/uploads/2026/06/Challenger-Report-May-2026.pdf | https://finance.yahoo.com/video/ai-major-contributor-layoffs-may-141928332.html | https://techjacksolutions.com/ai-brief/ai-is-now-the-top-self-reported-layoff-driver-in-the-us-chal/</w:t>
+      </w:r>
+    </w:p>
+    <w:p>
+      <w:pPr>
+        <w:jc w:val="both"/>
+      </w:pPr>
+      <w:r>
+        <w:rPr>
+          <w:rFonts w:ascii="Arial" w:hAnsi="Arial"/>
+          <w:b w:val="0"/>
+          <w:i w:val="0"/>
+          <w:sz w:val="19"/>
+        </w:rPr>
+        <w:t xml:space="preserve">TrueUp / SkillSyncer / TechTimes. (Stand 19. Juni 2026). </w:t>
+      </w:r>
+      <w:r>
+        <w:rPr>
+          <w:rFonts w:ascii="Arial" w:hAnsi="Arial"/>
+          <w:b w:val="0"/>
+          <w:i/>
+          <w:sz w:val="19"/>
+        </w:rPr>
+        <w:t>Tech Layoffs Tracker — Tagesfortschreibung: 185.894 Personen aus 267 Layoff-Meldungen (rund 1.093 Stellen pro Tag); Tech Layoffs Hit 1,115 a Day in 2026.</w:t>
+      </w:r>
+      <w:r>
+        <w:rPr>
+          <w:rFonts w:ascii="Arial" w:hAnsi="Arial"/>
+          <w:b w:val="0"/>
+          <w:i w:val="0"/>
+          <w:sz w:val="19"/>
+        </w:rPr>
+        <w:t xml:space="preserve"> Integration der KI-begründeten Personalmaßnahmen u. a. von ServiceNow (mehrere Hundert Stellen, 12. Juni 2026), Salesforce (86 Stellen MuleSoft / Marketing Cloud, 13. Juni 2026), Ubisoft (über 380 Stellen, 10. Juni 2026), Papa John's (rund 7 % der Konzernzentrale, 11. Juni 2026) und BBC (mehrere Hundert Stellen News-Geschäft, 15. Juni 2026). https://www.trueup.io/layoffs | https://skillsyncer.com/layoffs-tracker | https://www.techtimes.com/articles/318466/20260616/tech-layoffs-hit-1115-day-2026-companies-cite-ai-cuts-fail-boost-returns.htm | https://www.techspot.com/news/112493-tech-layoffs-pass-100000-2026-tracker-points-ai.html</w:t>
+      </w:r>
+    </w:p>
+    <w:p>
+      <w:pPr>
+        <w:jc w:val="both"/>
+      </w:pPr>
+      <w:r>
+        <w:rPr>
+          <w:rFonts w:ascii="Arial" w:hAnsi="Arial"/>
+          <w:b w:val="0"/>
+          <w:i w:val="0"/>
+          <w:sz w:val="19"/>
+        </w:rPr>
         <w:t xml:space="preserve">CNBC / Engadget / Coindesk / Fortune. (5. Mai 2026). </w:t>
       </w:r>
       <w:r>
@@ -10566,7 +11010,7 @@
           <w:i w:val="0"/>
           <w:sz w:val="19"/>
         </w:rPr>
-        <w:t xml:space="preserve"> Dieses Arbeitspapier gibt den Stand Anfang Mai 2026 (Schnitt am 8. Mai 2026 — Lauf 001 vom 8. Mai 2026) wieder. Die Debatte entwickelt sich dynamisch, insbesondere im Zuge der OpenAI-Strategiepapiere und der Eröffnung des OpenAI Workshop in Washington, D.C. im Mai 2026, des Erstdurchgangs des GKV-Beitragssatzstabilisierungsgesetzes in der 1065. Bundesratssitzung am 8. Mai 2026 mit 79 Tagesordnungspunkten (Kabinettsbeschluss 29. April 2026, parlamentarische Behandlung vor der Sommerpause 2026 angekündigt), der laufenden Trilog-Verhandlungen zum Digital Omnibus on AI (zweite Runde 28. April 2026 ohne Einigung; nächste Runde 13. Mai 2026 — Knackpunkt ist nicht die Verschiebung der Hochrisiko-Pflichten, sondern die Konformitätsbewertungs-Architektur für Anhang I; die zypriotische Ratspräsidentschaft strebt einen Abschluss vor Ablauf ihrer Amtszeit am 30. Juni 2026 an, andernfalls übernimmt die irische Präsidentschaft), der am 5. Mai 2026 erfolgten Arraignment-Verhandlung im Altman-Verfahren mit „nicht schuldig"-Plädoyer und angeordneter psychiatrischer Begutachtung, des am 7. Mai 2026 versandten individuellen Microsoft-Buyout-Angebots (Annahmefrist 8. Juni 2026, VRSAR-Unterzeichnung 9.–22. Juni 2026, bis zu fünfjährige Krankenversicherungs-Verlängerung), des am 1. Mai 2026 vom Connecticut-Repräsentantenhaus mit 131 zu 17 Stimmen verabschiedeten </w:t>
+        <w:t xml:space="preserve"> Dieses Arbeitspapier gibt den Stand Mitte/Ende Juni 2026 (Schnitt am 20. Juni 2026 — Daily-Update-Lauf vom 20. Juni 2026; Vorlauf-Schnitt am 8. Mai 2026 — Lauf 001 vom 8. Mai 2026) wieder. Die Debatte entwickelt sich dynamisch, insbesondere im Zuge der OpenAI-Strategiepapiere und der Eröffnung des OpenAI Workshop in Washington, D.C. im Mai 2026, des Erstdurchgangs des GKV-Beitragssatzstabilisierungsgesetzes in der 1065. Bundesratssitzung am 8. Mai 2026 mit 79 Tagesordnungspunkten (Kabinettsbeschluss 29. April 2026, parlamentarische Behandlung vor der Sommerpause 2026 angekündigt), der laufenden Trilog-Verhandlungen zum Digital Omnibus on AI (zweite Runde 28. April 2026 ohne Einigung; nächste Runde 13. Mai 2026 — Knackpunkt ist nicht die Verschiebung der Hochrisiko-Pflichten, sondern die Konformitätsbewertungs-Architektur für Anhang I; die zypriotische Ratspräsidentschaft strebt einen Abschluss vor Ablauf ihrer Amtszeit am 30. Juni 2026 an, andernfalls übernimmt die irische Präsidentschaft), der am 5. Mai 2026 erfolgten Arraignment-Verhandlung im Altman-Verfahren mit „nicht schuldig"-Plädoyer und angeordneter psychiatrischer Begutachtung, des am 7. Mai 2026 versandten individuellen Microsoft-Buyout-Angebots (Annahmefrist 8. Juni 2026, VRSAR-Unterzeichnung 9.–22. Juni 2026, bis zu fünfjährige Krankenversicherungs-Verlängerung), des am 1. Mai 2026 vom Connecticut-Repräsentantenhaus mit 131 zu 17 Stimmen verabschiedeten </w:t>
       </w:r>
       <w:r>
         <w:rPr>
@@ -10782,7 +11226,151 @@
           <w:i w:val="0"/>
           <w:sz w:val="19"/>
         </w:rPr>
-        <w:t xml:space="preserve"> gegen eine KI-Steuer (syndiziert in Advisor Perspectives, RealClearPolitics, West Hawaii Today und Las Vegas Sun zwischen dem 2. und 6. Mai 2026), das Innovationsbremse, Wettbewerbsnachteil und Unmöglichkeit der Abgrenzung Verdrängung/Augmentation als Hauptargumente gegen die Sanders/OpenAI-Linie führt und stattdessen Lockerung berufsrechtlicher Lizenzschranken, Reform der Arbeitslosenversicherung, Umschulungs-Steueranreize sowie eine Ausweitung der Earned Income Tax Credit empfiehlt. Eine regelmäßige Aktualisierung ist vorgesehen.</w:t>
+        <w:t xml:space="preserve"> gegen eine KI-Steuer (syndiziert in Advisor Perspectives, RealClearPolitics, West Hawaii Today und Las Vegas Sun zwischen dem 2. und 6. Mai 2026), das Innovationsbremse, Wettbewerbsnachteil und Unmöglichkeit der Abgrenzung Verdrängung/Augmentation als Hauptargumente gegen die Sanders/OpenAI-Linie führt und stattdessen Lockerung berufsrechtlicher Lizenzschranken, Reform der Arbeitslosenversicherung, Umschulungs-Steueranreize sowie eine Ausweitung der Earned Income Tax Credit empfiehlt; der am 18. Juni 2026 von Bernie Sanders eingebrachte </w:t>
+      </w:r>
+      <w:r>
+        <w:rPr>
+          <w:rFonts w:ascii="Arial" w:hAnsi="Arial"/>
+          <w:b w:val="0"/>
+          <w:i/>
+          <w:sz w:val="19"/>
+        </w:rPr>
+        <w:t>American AI Sovereign Wealth Fund Act</w:t>
+      </w:r>
+      <w:r>
+        <w:rPr>
+          <w:rFonts w:ascii="Arial" w:hAnsi="Arial"/>
+          <w:b w:val="0"/>
+          <w:i w:val="0"/>
+          <w:sz w:val="19"/>
+        </w:rPr>
+        <w:t xml:space="preserve"> (50 % einmalige Aktienabgabe auf KI-Unternehmen ab 200 Mio. USD Jahresumsatz, geschätzter Fondswert rund 7 Billionen US-Dollar, 5 % jährliche Ausschüttung, Direktzahlung von mehr als 1.000 US-Dollar pro Jahr je US-Bürgerin/US-Bürger, Aufsicht durch eine </w:t>
+      </w:r>
+      <w:r>
+        <w:rPr>
+          <w:rFonts w:ascii="Arial" w:hAnsi="Arial"/>
+          <w:b w:val="0"/>
+          <w:i/>
+          <w:sz w:val="19"/>
+        </w:rPr>
+        <w:t>Independent Commission for Democratic AI</w:t>
+      </w:r>
+      <w:r>
+        <w:rPr>
+          <w:rFonts w:ascii="Arial" w:hAnsi="Arial"/>
+          <w:b w:val="0"/>
+          <w:i w:val="0"/>
+          <w:sz w:val="19"/>
+        </w:rPr>
+        <w:t xml:space="preserve"> mit sieben Mitgliedern; konzeptionelle Verbindung zum norwegischen Staatsfonds-Modell aus dem OpenAI-Papier April 2026); der finale Plenarbeschluss des Europäischen Parlaments zum </w:t>
+      </w:r>
+      <w:r>
+        <w:rPr>
+          <w:rFonts w:ascii="Arial" w:hAnsi="Arial"/>
+          <w:b w:val="0"/>
+          <w:i/>
+          <w:sz w:val="19"/>
+        </w:rPr>
+        <w:t>Digital Omnibus on AI</w:t>
+      </w:r>
+      <w:r>
+        <w:rPr>
+          <w:rFonts w:ascii="Arial" w:hAnsi="Arial"/>
+          <w:b w:val="0"/>
+          <w:i w:val="0"/>
+          <w:sz w:val="19"/>
+        </w:rPr>
+        <w:t xml:space="preserve"> am 16. Juni 2026 (423 zu 57 Stimmen, 174 Enthaltungen) mit Hochrisiko-Stichtagen 2. Dezember 2027 (Anhang III) und 2. August 2028 (Anhang I), Watermarking-Stichtag 2. Dezember 2026 sowie neuer Artikel-5-Verbotskategorie zu KI-generierter sexualisierter Gewalt gegen Minderjährige und nicht-einvernehmlichen intimen Inhalten; der Unterzeichnung des Connecticut </w:t>
+      </w:r>
+      <w:r>
+        <w:rPr>
+          <w:rFonts w:ascii="Arial" w:hAnsi="Arial"/>
+          <w:b w:val="0"/>
+          <w:i/>
+          <w:sz w:val="19"/>
+        </w:rPr>
+        <w:t>Senate Bill 5 — Connecticut Artificial Intelligence Responsibility and Transparency Act</w:t>
+      </w:r>
+      <w:r>
+        <w:rPr>
+          <w:rFonts w:ascii="Arial" w:hAnsi="Arial"/>
+          <w:b w:val="0"/>
+          <w:i w:val="0"/>
+          <w:sz w:val="19"/>
+        </w:rPr>
+        <w:t xml:space="preserve"> durch Gouverneur Ned Lamont am 27. Mai 2026 (</w:t>
+      </w:r>
+      <w:r>
+        <w:rPr>
+          <w:rFonts w:ascii="Arial" w:hAnsi="Arial"/>
+          <w:b w:val="0"/>
+          <w:i/>
+          <w:sz w:val="19"/>
+        </w:rPr>
+        <w:t>Public Act 26-15</w:t>
+      </w:r>
+      <w:r>
+        <w:rPr>
+          <w:rFonts w:ascii="Arial" w:hAnsi="Arial"/>
+          <w:b w:val="0"/>
+          <w:i w:val="0"/>
+          <w:sz w:val="19"/>
+        </w:rPr>
+        <w:t xml:space="preserve">); des am 12. Juni 2026 in der Bundesratssitzung tatsächlich durchgeführten Erstdurchgangs des </w:t>
+      </w:r>
+      <w:r>
+        <w:rPr>
+          <w:rFonts w:ascii="Arial" w:hAnsi="Arial"/>
+          <w:b w:val="0"/>
+          <w:i/>
+          <w:sz w:val="19"/>
+        </w:rPr>
+        <w:t>GKV-Beitragssatzstabilisierungsgesetzes</w:t>
+      </w:r>
+      <w:r>
+        <w:rPr>
+          <w:rFonts w:ascii="Arial" w:hAnsi="Arial"/>
+          <w:b w:val="0"/>
+          <w:i w:val="0"/>
+          <w:sz w:val="19"/>
+        </w:rPr>
+        <w:t xml:space="preserve"> mit knapp 50 Ausschussempfehlungen, davon über 30 zur (teilweisen) Rücknahme von Sparmaßnahmen, sowie der parallelen ersten Bundestagslesung am 12. Juni 2026 und der für den 26. Juni 2026 angekündigten Bundestagsabstimmung; des am Anfang Juni 2026 veröffentlichten </w:t>
+      </w:r>
+      <w:r>
+        <w:rPr>
+          <w:rFonts w:ascii="Arial" w:hAnsi="Arial"/>
+          <w:b w:val="0"/>
+          <w:i/>
+          <w:sz w:val="19"/>
+        </w:rPr>
+        <w:t>Mai-2026-Job-Cuts-Reports</w:t>
+      </w:r>
+      <w:r>
+        <w:rPr>
+          <w:rFonts w:ascii="Arial" w:hAnsi="Arial"/>
+          <w:b w:val="0"/>
+          <w:i w:val="0"/>
+          <w:sz w:val="19"/>
+        </w:rPr>
+        <w:t xml:space="preserve"> von </w:t>
+      </w:r>
+      <w:r>
+        <w:rPr>
+          <w:rFonts w:ascii="Arial" w:hAnsi="Arial"/>
+          <w:b w:val="0"/>
+          <w:i/>
+          <w:sz w:val="19"/>
+        </w:rPr>
+        <w:t>Challenger, Gray &amp; Christmas</w:t>
+      </w:r>
+      <w:r>
+        <w:rPr>
+          <w:rFonts w:ascii="Arial" w:hAnsi="Arial"/>
+          <w:b w:val="0"/>
+          <w:i w:val="0"/>
+          <w:sz w:val="19"/>
+        </w:rPr>
+        <w:t xml:space="preserve"> (Mai 97.006 / +16 % gegenüber April, höchster Mai-Wert seit 2020; KI-bezogen 38.579 — 40 % des Monatsvolumens und damit erstmals der häufigste Einzelgrund eines Monats in der Tracking-Geschichte; Tech Mai 38.242 / Tech YTD 123.653 / +66 %; KI-bezogen YTD 87.714 — übersteigt bereits den Jahreswert 2025 von 54.836) sowie der Tagesfortschreibung der TrueUp-Tracker-Methodik zum 19. Juni 2026 (185.894 Personen aus 267 Layoff-Meldungen, rund 1.093 Stellen pro Tag) mit weiteren KI-begründeten Personalmaßnahmen u. a. von ServiceNow (mehrere Hundert Stellen, 12. Juni 2026), Salesforce (86 Stellen MuleSoft / Marketing Cloud, 13. Juni 2026) und BBC (mehrere Hundert Stellen im News-Geschäft, 15. Juni 2026). Eine regelmäßige Aktualisierung ist vorgesehen.</w:t>
       </w:r>
     </w:p>
     <w:p>
@@ -10862,7 +11450,7 @@
         <w:color w:val="999999"/>
         <w:sz w:val="15"/>
       </w:rPr>
-      <w:t>Version 22.0 — Mai 2026 — CC BY 4.0</w:t>
+      <w:t>Version 23.0 — Mai 2026 — CC BY 4.0</w:t>
       <w:tab/>
       <w:t xml:space="preserve">Seite </w:t>
     </w:r>

</xml_diff>

<commit_message>
Daily-Update 2026-06-25 — Version 23.0 (Cluster: A, B, D, E, F)
Sieben Treffer-Buendel aus dem Zeitraum 7. Mai - 24. Juni 2026 eingearbeitet:
- Digital Omnibus on AI: Trilog-Einigung 07.05.26, EP-Plenar 16.06.26
- KI-MIG: Bundestag 11.06.26 (BNetzA als Marktaufsicht)
- CT SB 5: Lamont-Unterzeichnung 29.05.26
- Anthropic Advanced AI / Economic Policy / "Policy on the AI Exponential" 10.06.26
- GKV-BSG: Bundestag 1. Lesung 12.06.26, Anhoerung 22.06.26
- IAB-KB 05/26, SVR Fruehjahrsgutachten 27.05.26, Bundesbank Monatsbericht 06/26
- Tech-Layoff-Aggregate 142k/150k+; GitLab 03.06.26; Oracle 22.06.26 (21k/13 %)
</commit_message>
<xml_diff>
--- a/KI-Ökonomie.docx
+++ b/KI-Ökonomie.docx
@@ -112,7 +112,7 @@
           <w:color w:val="666666"/>
           <w:sz w:val="18"/>
         </w:rPr>
-        <w:t>Version 22.0</w:t>
+        <w:t>Version 23.0</w:t>
       </w:r>
     </w:p>
     <w:p>
@@ -486,6 +486,146 @@
           <w:i w:val="0"/>
           <w:sz w:val="19"/>
         </w:rPr>
+        <w:t xml:space="preserve">Zum Stand Ende Juni 2026 verfestigen sich die im April und Mai 2026 dokumentierten Trends: Der aktualisierte </w:t>
+      </w:r>
+      <w:r>
+        <w:rPr>
+          <w:rFonts w:ascii="Arial" w:hAnsi="Arial"/>
+          <w:b w:val="0"/>
+          <w:i/>
+          <w:sz w:val="19"/>
+        </w:rPr>
+        <w:t>IAB-Kurzbericht 5/2026</w:t>
+      </w:r>
+      <w:r>
+        <w:rPr>
+          <w:rFonts w:ascii="Arial" w:hAnsi="Arial"/>
+          <w:b w:val="0"/>
+          <w:i w:val="0"/>
+          <w:sz w:val="19"/>
+        </w:rPr>
+        <w:t xml:space="preserve"> (Mai 2026, </w:t>
+      </w:r>
+      <w:r>
+        <w:rPr>
+          <w:rFonts w:ascii="Arial" w:hAnsi="Arial"/>
+          <w:b w:val="0"/>
+          <w:i/>
+          <w:sz w:val="19"/>
+        </w:rPr>
+        <w:t>„Arbeitsmarktentwicklung 2026"</w:t>
+      </w:r>
+      <w:r>
+        <w:rPr>
+          <w:rFonts w:ascii="Arial" w:hAnsi="Arial"/>
+          <w:b w:val="0"/>
+          <w:i w:val="0"/>
+          <w:sz w:val="19"/>
+        </w:rPr>
+        <w:t xml:space="preserve">) erwartet für das Gesamtjahr nur noch einen Rückgang der Erwerbstätigkeit um 18.000 Personen — eine deutliche Abschwächung gegenüber den −90.000 aus der Frühjahrsfassung vom 24. März 2026 —, mit einem Bestandsfenster für Juni 2026 zwischen 45,78 und 45,99 Millionen Personen (zwei Drittel Wahrscheinlichkeit); das Erwerbspersonenpotenzial sinkt erstmals um 40.000 Personen. Der Sachverständigenrat zur Begutachtung der gesamtwirtschaftlichen Entwicklung hat in seinem </w:t>
+      </w:r>
+      <w:r>
+        <w:rPr>
+          <w:rFonts w:ascii="Arial" w:hAnsi="Arial"/>
+          <w:b w:val="0"/>
+          <w:i/>
+          <w:sz w:val="19"/>
+        </w:rPr>
+        <w:t>Frühjahrsgutachten 2026</w:t>
+      </w:r>
+      <w:r>
+        <w:rPr>
+          <w:rFonts w:ascii="Arial" w:hAnsi="Arial"/>
+          <w:b w:val="0"/>
+          <w:i w:val="0"/>
+          <w:sz w:val="19"/>
+        </w:rPr>
+        <w:t xml:space="preserve"> vom 27. Mai 2026 die BIP-Prognose auf +0,5 % für 2026 und +0,8 % für 2027 abgesenkt — eine Abwärtsrevision um 0,4 Prozentpunkte gegenüber dem Jahresgutachten 2025/2026 — und führt sie primär auf die Folgen des Iran-Krieges (Ölpreisanstieg, verschlechterte Terms of Trade) zurück; die Verbraucherpreisinflation wird mit durchschnittlich 3,0 % (2026) und 2,8 % (2027) erwartet. Die Deutsche Bundesbank hat im </w:t>
+      </w:r>
+      <w:r>
+        <w:rPr>
+          <w:rFonts w:ascii="Arial" w:hAnsi="Arial"/>
+          <w:b w:val="0"/>
+          <w:i/>
+          <w:sz w:val="19"/>
+        </w:rPr>
+        <w:t>Monatsbericht Juni 2026</w:t>
+      </w:r>
+      <w:r>
+        <w:rPr>
+          <w:rFonts w:ascii="Arial" w:hAnsi="Arial"/>
+          <w:b w:val="0"/>
+          <w:i w:val="0"/>
+          <w:sz w:val="19"/>
+        </w:rPr>
+        <w:t xml:space="preserve"> erstmals eine umfangreiche Auswertung ihrer Q1-2026-Unternehmensumfrage zu generativer KI vorgelegt (rund 7.000 Befragte): Der Anteil der Unternehmen, die generative KI bereits nutzen oder ihren Einsatz planen, sei demnach von 26 % (2024) auf erwartete 56 % (2026) gestiegen; rund 46 % der einsetzenden Unternehmen berichten Produktivitätsgewinne von 1 % oder mehr (ähnlich viele unverändert, rund 8 % Rückgänge), und über 50 % erwarten für 2025/2026 einen weiteren Produktivitätszuwachs von mindestens 2 %, ein Viertel sogar von 5 % oder mehr. Parallel haben sich die Tech-Layoff-Aggregate für 2026 weiter verfestigt: Branchenauswertungen (</w:t>
+      </w:r>
+      <w:r>
+        <w:rPr>
+          <w:rFonts w:ascii="Arial" w:hAnsi="Arial"/>
+          <w:b w:val="0"/>
+          <w:i/>
+          <w:sz w:val="19"/>
+        </w:rPr>
+        <w:t>TechTimes / TechCrunch / TrueUp</w:t>
+      </w:r>
+      <w:r>
+        <w:rPr>
+          <w:rFonts w:ascii="Arial" w:hAnsi="Arial"/>
+          <w:b w:val="0"/>
+          <w:i w:val="0"/>
+          <w:sz w:val="19"/>
+        </w:rPr>
+        <w:t xml:space="preserve">, Stand Ende Mai bis Mitte Juni 2026) weisen einen kumulierten Bestand von rund 142.000 Tech-Stellen für den Zeitraum Januar bis Ende Mai 2026 aus, zur Jahresmitte berichten weitere Tracker-Stände über 150.000 Tech-Stellen. </w:t>
+      </w:r>
+      <w:r>
+        <w:rPr>
+          <w:rFonts w:ascii="Arial" w:hAnsi="Arial"/>
+          <w:b w:val="0"/>
+          <w:i/>
+          <w:sz w:val="19"/>
+        </w:rPr>
+        <w:t>GitLab</w:t>
+      </w:r>
+      <w:r>
+        <w:rPr>
+          <w:rFonts w:ascii="Arial" w:hAnsi="Arial"/>
+          <w:b w:val="0"/>
+          <w:i w:val="0"/>
+          <w:sz w:val="19"/>
+        </w:rPr>
+        <w:t xml:space="preserve"> hat am 3. Juni 2026 rund 350 Stellen — etwa 14 % der Belegschaft — zur Finanzierung von KI-Infrastruktur und „agentic workloads" gestrichen; Vorstandschef Bill Staples sprach von einer „generationenübergreifenden Neuauflage" der Kerninfrastruktur. Am 22. Juni 2026 hat </w:t>
+      </w:r>
+      <w:r>
+        <w:rPr>
+          <w:rFonts w:ascii="Arial" w:hAnsi="Arial"/>
+          <w:b w:val="0"/>
+          <w:i/>
+          <w:sz w:val="19"/>
+        </w:rPr>
+        <w:t>Oracle</w:t>
+      </w:r>
+      <w:r>
+        <w:rPr>
+          <w:rFonts w:ascii="Arial" w:hAnsi="Arial"/>
+          <w:b w:val="0"/>
+          <w:i w:val="0"/>
+          <w:sz w:val="19"/>
+        </w:rPr>
+        <w:t xml:space="preserve"> in seinem Jahresfinanzbericht (Form 10-K) erstmals offengelegt, in den vergangenen zwölf Monaten rund 21.000 Stellen abgebaut zu haben (rund 13 % der Belegschaft), und ausdrücklich auf KI-bedingte Effizienzgewinne als anhaltenden Auslöser verwiesen. Die im April/Mai 2026 dokumentierte Asymmetrie zwischen Personalreduktion und Capex-Expansion (zuletzt rund 725 Milliarden US-Dollar für 2026, vgl. § 1.1) setzt sich damit ins zweite Quartal fort und stützt die in § 5.1 und § 8.3 entwickelte Anknüpfungslinie an Maschinenkapital und KI-Wertschöpfung.</w:t>
+      </w:r>
+    </w:p>
+    <w:p>
+      <w:pPr>
+        <w:jc w:val="both"/>
+      </w:pPr>
+      <w:r>
+        <w:rPr>
+          <w:rFonts w:ascii="Arial" w:hAnsi="Arial"/>
+          <w:b w:val="0"/>
+          <w:i w:val="0"/>
+          <w:sz w:val="19"/>
+        </w:rPr>
         <w:t>Die Frage, ob und wie KI und Robotik besteuert werden sollten, wenn sie menschliche Arbeit substituieren, verbindet mehrere Politikfelder: Steuerpolitik, Sozialpolitik, Industriepolitik, Technologieregulierung und Verteilungspolitik. Sie ist weder rein ökonomisch noch rein rechtlich zu beantworten, sondern betrifft fundamentale Annahmen darüber, wie produktive Tätigkeit in einer teilautomatisierten Gesellschaft organisiert und wie die Früchte dieser Tätigkeit verteilt werden sollen.</w:t>
       </w:r>
     </w:p>
@@ -2128,7 +2268,7 @@
           <w:i w:val="0"/>
           <w:sz w:val="19"/>
         </w:rPr>
-        <w:t xml:space="preserve"> Eine rein nationale Lösung kann mit der Warenverkehrsfreiheit, der Dienstleistungsfreiheit und der Niederlassungsfreiheit in Konflikt geraten. Eine Regelung, die nur inländische Roboterbetreiber trifft, während grenzüberschreitende KI-Dienstleistungen unbesteuert bleiben, wäre diskriminierungsrechtlich problematisch und praktisch kaum durchsetzbar. Der EU AI Act (Verordnung 2024/1689) schafft ab dem 2. August 2026 einen unionsweit einheitlichen Regulierungsrahmen für KI-Systeme (Hochrisiko-Systeme gemäß Anhang III, Transparenzpflichten nach Art. 50, Durchsetzungsregime); dies legt einen einheitlichen Definitionsrahmen, der steuerpolitische Anknüpfungen an KI-Systemklassen mittelfristig erleichtern kann, ohne selbst steuerrechtliche Wirkung zu entfalten. Die Europäische Kommission hat am 19. November 2025 mit dem „Digital Omnibus on AI" einen Vereinfachungsvorschlag vorgelegt, den das Europäische Parlament am 16. März 2026 im Ausschuss und am 23. März 2026 im Plenum unterstützt hat. Er sieht eine Verschiebung der Hochrisiko-Pflichten vor — je nach Systemtyp bis maximal zum 2. Dezember 2027 bzw. 2. August 2028 — und koppelt ihre Anwendbarkeit an die Verfügbarkeit harmonisierter Normen; zudem wird die Kennzeichnungspflicht für KI-generierte Inhalte (Art. 50) bis zum 2. November 2026 verlängert. Die Kommissionsdurchsetzungsbefugnisse gegenüber Anbietern von Allzweck-KI-Modellen (GPAI) treten wie vorgesehen am 2. August 2026 in Kraft. Parlament und Rat haben die Trilogverhandlungen aufgenommen; der zweite Trilogtermin am 28. April 2026 endete nach Berichterstattung von IAPP und A&amp;O Shearman ohne Einigung — Streitpunkt war primär das Verhältnis zwischen AI Act und sektorspezifischen EU-Regelungen für eingebettete KI-Systeme (Anhang I) sowie die Rechtsgrundlage für die Verarbeitung personenbezogener Daten zur Bias-Erkennung. Beide Institutionen konvergieren auf Stichtage 2. Dezember 2027 (Anhang III) und 2. August 2028 (Anhang I) für die Hochrisiko-Pflichten. Die nächste Trilogrunde ist auf den 13. Mai 2026 terminiert; Ziel bleibt eine förmliche Verabschiedung vor dem ursprünglichen Stichtag am 2. August 2026. Die zypriotische Ratspräsidentschaft hat sich vorgenommen, das Dossier vor Ablauf ihrer Amtszeit am 30. Juni 2026 abzuschließen; gelingt das nicht, übernimmt zur zweiten Jahreshälfte 2026 die irische Präsidentschaft. Scheitert die Einigung bis zum 2. August 2026, würden die Hochrisiko-Pflichten in ihrer ursprünglich vorgesehenen Fassung anwendbar. Für die Steuerdebatte folgt daraus, dass der zeitliche Vorlauf für KI-Definitionen aus dem AI Act enger als ursprünglich gedacht ist — eine mittelfristige Anknüpfung steuerlicher Tatbestände an AI-Act-Kategorien bleibt möglich, setzt aber voraus, dass die Normenlandschaft nach 2027 verlässlich vorliegt.</w:t>
+        <w:t xml:space="preserve"> Eine rein nationale Lösung kann mit der Warenverkehrsfreiheit, der Dienstleistungsfreiheit und der Niederlassungsfreiheit in Konflikt geraten. Eine Regelung, die nur inländische Roboterbetreiber trifft, während grenzüberschreitende KI-Dienstleistungen unbesteuert bleiben, wäre diskriminierungsrechtlich problematisch und praktisch kaum durchsetzbar. Der EU AI Act (Verordnung 2024/1689) schafft ab dem 2. August 2026 einen unionsweit einheitlichen Regulierungsrahmen für KI-Systeme (Hochrisiko-Systeme gemäß Anhang III, Transparenzpflichten nach Art. 50, Durchsetzungsregime); dies legt einen einheitlichen Definitionsrahmen, der steuerpolitische Anknüpfungen an KI-Systemklassen mittelfristig erleichtern kann, ohne selbst steuerrechtliche Wirkung zu entfalten. Die Europäische Kommission hat am 19. November 2025 mit dem „Digital Omnibus on AI" einen Vereinfachungsvorschlag vorgelegt, den das Europäische Parlament am 16. März 2026 im Ausschuss und am 23. März 2026 im Plenum unterstützt hat. Er sieht eine Verschiebung der Hochrisiko-Pflichten vor — je nach Systemtyp bis maximal zum 2. Dezember 2027 bzw. 2. August 2028 — und koppelt ihre Anwendbarkeit an die Verfügbarkeit harmonisierter Normen; zudem wird die Kennzeichnungspflicht für KI-generierte Inhalte (Art. 50) bis zum 2. November 2026 verlängert. Die Kommissionsdurchsetzungsbefugnisse gegenüber Anbietern von Allzweck-KI-Modellen (GPAI) treten wie vorgesehen am 2. August 2026 in Kraft. Parlament und Rat haben die Trilogverhandlungen aufgenommen; der zweite Trilogtermin am 28. April 2026 endete nach Berichterstattung von IAPP und A&amp;O Shearman ohne Einigung — Streitpunkt war primär das Verhältnis zwischen AI Act und sektorspezifischen EU-Regelungen für eingebettete KI-Systeme (Anhang I) sowie die Rechtsgrundlage für die Verarbeitung personenbezogener Daten zur Bias-Erkennung. Beide Institutionen konvergieren auf Stichtage 2. Dezember 2027 (Anhang III) und 2. August 2028 (Anhang I) für die Hochrisiko-Pflichten. Am 7. Mai 2026 haben Rat und Parlament im Trilog eine vorläufige Einigung erzielt; das Plenum des Europäischen Parlaments hat das Verhandlungsergebnis am 16. Juni 2026 formal bestätigt. Die förmliche Annahme durch den Rat und die Veröffentlichung im Amtsblatt der EU werden bis Juli 2026 erwartet, sodass die geänderten Hochrisiko-Stichtage rechtzeitig vor dem ursprünglichen 2. August 2026 wirksam werden. Inhaltlich bleibt es bei der Verschiebung der Hochrisiko-Pflichten (Anhang III zum 2. Dezember 2027; Anhang I zum 2. August 2028); neu kommen ein Verbot von KI-generierten nicht-einvernehmlichen intimen Bildern („Nudifier"-Anwendungen) und von KI-generiertem kindesbezogenem Missbrauchsmaterial nach Art. 5 hinzu — letzteres mit einer Übergangsfrist bis zum 2. Dezember 2026. Für die Steuerdebatte folgt daraus, dass der zeitliche Vorlauf für KI-Definitionen aus dem AI Act enger als ursprünglich gedacht ist — eine mittelfristige Anknüpfung steuerlicher Tatbestände an AI-Act-Kategorien bleibt möglich, setzt aber voraus, dass die Normenlandschaft nach 2027 verlässlich vorliegt.</w:t>
       </w:r>
     </w:p>
     <w:p>
@@ -2199,6 +2339,47 @@
           <w:i w:val="0"/>
           <w:sz w:val="19"/>
         </w:rPr>
+        <w:t>Nationales Umsetzungsgesetz zur EU-KI-Verordnung (Deutschland, Juni 2026):</w:t>
+      </w:r>
+      <w:r>
+        <w:rPr>
+          <w:rFonts w:ascii="Arial" w:hAnsi="Arial"/>
+          <w:b w:val="0"/>
+          <w:i w:val="0"/>
+          <w:sz w:val="19"/>
+        </w:rPr>
+        <w:t xml:space="preserve"> Der Deutsche Bundestag hat am 11. Juni 2026 in zweiter und dritter Lesung das </w:t>
+      </w:r>
+      <w:r>
+        <w:rPr>
+          <w:rFonts w:ascii="Arial" w:hAnsi="Arial"/>
+          <w:b w:val="0"/>
+          <w:i/>
+          <w:sz w:val="19"/>
+        </w:rPr>
+        <w:t>Gesetz zur Durchführung der KI-Verordnung</w:t>
+      </w:r>
+      <w:r>
+        <w:rPr>
+          <w:rFonts w:ascii="Arial" w:hAnsi="Arial"/>
+          <w:b w:val="0"/>
+          <w:i w:val="0"/>
+          <w:sz w:val="19"/>
+        </w:rPr>
+        <w:t xml:space="preserve"> (KI-MIG) in der vom Digitalausschuss geänderten Fassung verabschiedet (Zustimmung der Koalitionsfraktionen CDU/CSU und SPD; Ablehnung durch AfD, Bündnis 90/Die Grünen und Die Linke). Zentral ist die Benennung der Bundesnetzagentur als bundesweit zuständige Marktüberwachungsbehörde für KI-Systeme nach der Verordnung (EU) 2024/1689; flankiert wird sie durch eine sektorale Aufgabenverteilung an BSI, BfArM, Bundesbank, BaFin und die Bundesbeauftragte für den Datenschutz und die Informationsfreiheit. Das Gesetz benötigt für die Schlussbefassung die Zustimmung des Bundesrats; eine kurzfristige Befassung wird vor dem 2. August 2026 angestrebt, damit das Aufsichtsregime zeitgleich mit den AI-Act-Pflichten gegenüber Anbietern von Allzweck-KI-Modellen startet. Für die in § 4.3 dokumentierte Linie der EU-Kompetenzverteilung ist die deutsche Umsetzung relevant, weil sie die Aufsichtsstruktur konsolidiert und damit potenzielle steuerrechtliche Anknüpfungen an AI-Act-Kategorien administrativ vorbereitet, ohne selbst fiskalische Tatbestände zu schaffen.</w:t>
+      </w:r>
+    </w:p>
+    <w:p>
+      <w:pPr>
+        <w:jc w:val="both"/>
+      </w:pPr>
+      <w:r>
+        <w:rPr>
+          <w:rFonts w:ascii="Arial" w:hAnsi="Arial"/>
+          <w:b/>
+          <w:i w:val="0"/>
+          <w:sz w:val="19"/>
+        </w:rPr>
         <w:t>Neue nationale Initiative Deutschland — Plattform-Digitalabgabe (2026):</w:t>
       </w:r>
       <w:r>
@@ -2562,7 +2743,7 @@
           <w:i w:val="0"/>
           <w:sz w:val="19"/>
         </w:rPr>
-        <w:t xml:space="preserve"> am 1. Mai 2026 mit 131 zu 17 Stimmen verabschiedet, Gouverneur Ned Lamont hat seine Unterzeichnung angekündigt. Für die Steuerdebatte ist neben Frontier- und Sandbox-Komponenten vor allem ein arbeitsrechtlicher Baustein bemerkenswert: </w:t>
+        <w:t xml:space="preserve"> am 1. Mai 2026 mit 131 zu 17 Stimmen verabschiedet, Gouverneur Ned Lamont hat das Gesetz nach mehrwöchiger Aktenprüfung am 29. Mai 2026 unterzeichnet (Pressemitteilung Office of the Governor). Für die Steuerdebatte ist neben Frontier- und Sandbox-Komponenten vor allem ein arbeitsrechtlicher Baustein bemerkenswert: </w:t>
       </w:r>
       <w:r>
         <w:rPr>
@@ -3056,6 +3237,173 @@
           <w:sz w:val="19"/>
         </w:rPr>
         <w:t xml:space="preserve"> zur Stützung verdrängter Beschäftigter. Die Position ergänzt die in § 3.3 (de la Feria) und § 3.4 (IW Köln/Hentze) referierten ökonomischen Einwände um eine prominente publizistische Stimme aus der Wirtschaftspresse — und liefert damit für die in Kapitel 10 zu treffende Bewertung das spiegelbildliche Pendant zu den OpenAI-/Sanders-Vorschlägen aus demselben Zeitfenster.</w:t>
+      </w:r>
+    </w:p>
+    <w:p>
+      <w:pPr>
+        <w:jc w:val="both"/>
+      </w:pPr>
+      <w:r>
+        <w:rPr>
+          <w:rFonts w:ascii="Arial" w:hAnsi="Arial"/>
+          <w:b/>
+          <w:i w:val="0"/>
+          <w:sz w:val="19"/>
+        </w:rPr>
+        <w:t>Anthropic-Doppelpaket (10. Juni 2026):</w:t>
+      </w:r>
+      <w:r>
+        <w:rPr>
+          <w:rFonts w:ascii="Arial" w:hAnsi="Arial"/>
+          <w:b w:val="0"/>
+          <w:i w:val="0"/>
+          <w:sz w:val="19"/>
+        </w:rPr>
+        <w:t xml:space="preserve"> Wenige Wochen nach dem OpenAI-Strategiepapier vom April 2026 hat Anthropic am 10. Juni 2026 zwei formale Politikrahmen veröffentlicht und ein Begleit­essay vorgelegt: das </w:t>
+      </w:r>
+      <w:r>
+        <w:rPr>
+          <w:rFonts w:ascii="Arial" w:hAnsi="Arial"/>
+          <w:b w:val="0"/>
+          <w:i/>
+          <w:sz w:val="19"/>
+        </w:rPr>
+        <w:t>Advanced AI Framework</w:t>
+      </w:r>
+      <w:r>
+        <w:rPr>
+          <w:rFonts w:ascii="Arial" w:hAnsi="Arial"/>
+          <w:b w:val="0"/>
+          <w:i w:val="0"/>
+          <w:sz w:val="19"/>
+        </w:rPr>
+        <w:t xml:space="preserve">, das </w:t>
+      </w:r>
+      <w:r>
+        <w:rPr>
+          <w:rFonts w:ascii="Arial" w:hAnsi="Arial"/>
+          <w:b w:val="0"/>
+          <w:i/>
+          <w:sz w:val="19"/>
+        </w:rPr>
+        <w:t>Economic Policy Framework</w:t>
+      </w:r>
+      <w:r>
+        <w:rPr>
+          <w:rFonts w:ascii="Arial" w:hAnsi="Arial"/>
+          <w:b w:val="0"/>
+          <w:i w:val="0"/>
+          <w:sz w:val="19"/>
+        </w:rPr>
+        <w:t xml:space="preserve"> und das Essay des Vorstandsvorsitzenden Dario Amodei </w:t>
+      </w:r>
+      <w:r>
+        <w:rPr>
+          <w:rFonts w:ascii="Arial" w:hAnsi="Arial"/>
+          <w:b w:val="0"/>
+          <w:i/>
+          <w:sz w:val="19"/>
+        </w:rPr>
+        <w:t>„Policy on the AI Exponential"</w:t>
+      </w:r>
+      <w:r>
+        <w:rPr>
+          <w:rFonts w:ascii="Arial" w:hAnsi="Arial"/>
+          <w:b w:val="0"/>
+          <w:i w:val="0"/>
+          <w:sz w:val="19"/>
+        </w:rPr>
+        <w:t xml:space="preserve">. Während sich das </w:t>
+      </w:r>
+      <w:r>
+        <w:rPr>
+          <w:rFonts w:ascii="Arial" w:hAnsi="Arial"/>
+          <w:b w:val="0"/>
+          <w:i/>
+          <w:sz w:val="19"/>
+        </w:rPr>
+        <w:t>Advanced AI Framework</w:t>
+      </w:r>
+      <w:r>
+        <w:rPr>
+          <w:rFonts w:ascii="Arial" w:hAnsi="Arial"/>
+          <w:b w:val="0"/>
+          <w:i w:val="0"/>
+          <w:sz w:val="19"/>
+        </w:rPr>
+        <w:t xml:space="preserve"> auf Sicherheitsregulierung („FAA-style"-Zulassung leistungsstarker Modelle, Blockierung freigegebener Modelle bei sicherheitsrelevanten Befunden) konzentriert, ist für die Steuerdebatte insbesondere das </w:t>
+      </w:r>
+      <w:r>
+        <w:rPr>
+          <w:rFonts w:ascii="Arial" w:hAnsi="Arial"/>
+          <w:b w:val="0"/>
+          <w:i/>
+          <w:sz w:val="19"/>
+        </w:rPr>
+        <w:t>Economic Policy Framework</w:t>
+      </w:r>
+      <w:r>
+        <w:rPr>
+          <w:rFonts w:ascii="Arial" w:hAnsi="Arial"/>
+          <w:b w:val="0"/>
+          <w:i w:val="0"/>
+          <w:sz w:val="19"/>
+        </w:rPr>
+        <w:t xml:space="preserve"> relevant: Es entwickelt Politik-Empfehlungen für drei eskalierende Disruptionsszenarien (rund 5 % Arbeitslosigkeit als „neue Normalität", rund 10 % als „strukturelle Krise", und ein nicht spezifiziertes Niveau „beispielloser" Arbeitslosigkeit), darunter steuerliche Verlagerungen vom Lohn auf Kapital und Unternehmensgewinne, kapitalbasierte Beteiligungsmodelle und Übergangsfinanzierung für verdrängte Beschäftigte. Anthropic flankiert die Rahmenpapiere mit insgesamt 350 Millionen US-Dollar an Eigenmitteln: einem </w:t>
+      </w:r>
+      <w:r>
+        <w:rPr>
+          <w:rFonts w:ascii="Arial" w:hAnsi="Arial"/>
+          <w:b w:val="0"/>
+          <w:i/>
+          <w:sz w:val="19"/>
+        </w:rPr>
+        <w:t>Economic Futures Research Fund</w:t>
+      </w:r>
+      <w:r>
+        <w:rPr>
+          <w:rFonts w:ascii="Arial" w:hAnsi="Arial"/>
+          <w:b w:val="0"/>
+          <w:i w:val="0"/>
+          <w:sz w:val="19"/>
+        </w:rPr>
+        <w:t xml:space="preserve"> mit 200 Millionen US-Dollar für Forschung zu KI-Arbeitsmarkteffekten und einem nationalen </w:t>
+      </w:r>
+      <w:r>
+        <w:rPr>
+          <w:rFonts w:ascii="Arial" w:hAnsi="Arial"/>
+          <w:b w:val="0"/>
+          <w:i/>
+          <w:sz w:val="19"/>
+        </w:rPr>
+        <w:t>Fellowship Program</w:t>
+      </w:r>
+      <w:r>
+        <w:rPr>
+          <w:rFonts w:ascii="Arial" w:hAnsi="Arial"/>
+          <w:b w:val="0"/>
+          <w:i w:val="0"/>
+          <w:sz w:val="19"/>
+        </w:rPr>
+        <w:t xml:space="preserve"> mit 150 Millionen US-Dollar für Nachwuchsfachkräfte. Im Vergleich zum OpenAI-Strategiepapier vom April 2026 ist die Anthropic-Linie auf eine konjunkturelle Skala kalibriert (5 / 10 / „unprecedented" %) und verbindet das Plädoyer für staatliche Eingriffe mit eigener Finanzierung — als spiegelbildliches Pendant zum </w:t>
+      </w:r>
+      <w:r>
+        <w:rPr>
+          <w:rFonts w:ascii="Arial" w:hAnsi="Arial"/>
+          <w:b w:val="0"/>
+          <w:i/>
+          <w:sz w:val="19"/>
+        </w:rPr>
+        <w:t>Bloomberg-Editorial</w:t>
+      </w:r>
+      <w:r>
+        <w:rPr>
+          <w:rFonts w:ascii="Arial" w:hAnsi="Arial"/>
+          <w:b w:val="0"/>
+          <w:i w:val="0"/>
+          <w:sz w:val="19"/>
+        </w:rPr>
+        <w:t xml:space="preserve"> (29. April 2026) und als zweite KI-Anbieter-Stimme nach OpenAI, die Steuerverlagerung und Beteiligungsmodelle explizit aufgreift. Amodeis Begleit­essay erweitert die Reichweite auf fünf Politik­felder (Sicherheitsregulierung, Makroökonomie und Steuern, Wissenschaftsbeschleunigung, Bürgerrechte, Geopolitik) und markiert eine Abkehr von der bisherigen Transparenz-Linie Anthropics zugunsten regulatorischer Eingriffsbefugnis.</w:t>
       </w:r>
     </w:p>
     <w:p>
@@ -3632,7 +3980,7 @@
           <w:i w:val="0"/>
           <w:sz w:val="19"/>
         </w:rPr>
-        <w:t xml:space="preserve"> beschlossen; im Verlauf der Ressortabstimmung wurde das Sparvolumen je nach Berichterstattung mit rund 16,3 Milliarden Euro (Frühberichterstattung) bzw. rund 19,6 Milliarden Euro (BMG-Tabellen Stand Anfang Mai 2026, gegliedert in 4,9 Milliarden einnahmen­seitige und rund 15 Milliarden ausgaben­seitige Komponenten) für 2027 angegeben; bis 2030 sieht das BMG eine Steigerung des Konsolidierungseffekts auf rund 42,8 Milliarden Euro vor. Die parlamentarische Behandlung soll laut BMG-Zeitplan vor der Sommerpause 2026 abgeschlossen werden — der Kabinettentwurf wird dem Bundesrat im ersten Durchgang am 8. Mai 2026 zugeleitet (1065. Sitzung; insgesamt 79 Tagesordnungspunkte, darunter eine flankierende Thüringer Entschließung zum Bürokratieabbau in der gesetzlichen Krankenversicherung); die erste Bundestagslesung ist im weiteren Verlauf des Mai/Juni 2026 vorgesehen. Die Reform belastet Krankenhäuser, pharmazeutische Industrie, Apotheken, Ärzteschaft, Versicherte, Arbeitgeber und Krankenkassen gemeinsam; sie folgt dem Leitsatz „Ausgaben an Einnahmen koppeln" und greift damit fiskalisch genau die Logik auf, die § 5.1 in der Beitrags­seite spiegelbildlich zu erweitern vorschlägt. Auch wenn die GKV-Reform primär ausgaben- und strukturseitig ansetzt, bestätigt sie den in § 5.1 angerissenen finanzpolitischen Befund: Die lohnbasierten Sicherungszweige geraten gleichzeitig durch demografischen Druck und durch die in § 1.1 dokumentierten KI-induzierten Beschäftigungsverschiebungen unter Spannung — eine Verbreiterung der Bemessungsgrundlage gewinnt damit zusätzlich an Plausibilität.</w:t>
+        <w:t xml:space="preserve"> beschlossen; im Verlauf der Ressortabstimmung wurde das Sparvolumen je nach Berichterstattung mit rund 16,3 Milliarden Euro (Frühberichterstattung) bzw. rund 19,6 Milliarden Euro (BMG-Tabellen Stand Anfang Mai 2026, gegliedert in 4,9 Milliarden einnahmen­seitige und rund 15 Milliarden ausgaben­seitige Komponenten) für 2027 angegeben; bis 2030 sieht das BMG eine Steigerung des Konsolidierungseffekts auf rund 42,8 Milliarden Euro vor. Die parlamentarische Behandlung soll laut BMG-Zeitplan vor der Sommerpause 2026 abgeschlossen werden — der Kabinettentwurf wird dem Bundesrat im ersten Durchgang am 8. Mai 2026 zugeleitet (1065. Sitzung; insgesamt 79 Tagesordnungspunkte, darunter eine flankierende Thüringer Entschließung zum Bürokratieabbau in der gesetzlichen Krankenversicherung); die erste Lesung im Bundestag fand am 12. Juni 2026 statt, die öffentliche Anhörung im Gesundheitsausschuss am 22. Juni 2026 versammelte Sachverständige aus Krankenhäusern, Kassen, Apotheken, Pharma- und Ärzteverbänden — die Stellungnahmen kritisieren ein „unausgewogenes" Sparvolumen und die fehlende Antwort auf einnahmenseitige Strukturfragen; die abschließende Verabschiedung im Bundestag mit anschließender zweiter Bundesratsbefassung wird vor der Sommerpause 2026 angestrebt. Die Reform belastet Krankenhäuser, pharmazeutische Industrie, Apotheken, Ärzteschaft, Versicherte, Arbeitgeber und Krankenkassen gemeinsam; sie folgt dem Leitsatz „Ausgaben an Einnahmen koppeln" und greift damit fiskalisch genau die Logik auf, die § 5.1 in der Beitrags­seite spiegelbildlich zu erweitern vorschlägt. Auch wenn die GKV-Reform primär ausgaben- und strukturseitig ansetzt, bestätigt sie den in § 5.1 angerissenen finanzpolitischen Befund: Die lohnbasierten Sicherungszweige geraten gleichzeitig durch demografischen Druck und durch die in § 1.1 dokumentierten KI-induzierten Beschäftigungsverschiebungen unter Spannung — eine Verbreiterung der Bemessungsgrundlage gewinnt damit zusätzlich an Plausibilität.</w:t>
       </w:r>
     </w:p>
     <w:p>
@@ -7658,6 +8006,38 @@
           <w:i w:val="0"/>
           <w:sz w:val="19"/>
         </w:rPr>
+        <w:t xml:space="preserve">IAB. (Mai 2026). </w:t>
+      </w:r>
+      <w:r>
+        <w:rPr>
+          <w:rFonts w:ascii="Arial" w:hAnsi="Arial"/>
+          <w:b w:val="0"/>
+          <w:i/>
+          <w:sz w:val="19"/>
+        </w:rPr>
+        <w:t>IAB-Kurzbericht 05/2026 — Arbeitsmarktentwicklung 2026.</w:t>
+      </w:r>
+      <w:r>
+        <w:rPr>
+          <w:rFonts w:ascii="Arial" w:hAnsi="Arial"/>
+          <w:b w:val="0"/>
+          <w:i w:val="0"/>
+          <w:sz w:val="19"/>
+        </w:rPr>
+        <w:t xml:space="preserve"> Aktualisierter Beobachtungsstand; Erwerbstätigkeit −18.000 für 2026 (gegenüber −90.000 in der März-Fassung); Bestandsfenster Juni 2026 zwischen 45,78 und 45,99 Mio. Personen (zwei Drittel Wahrscheinlichkeit); Erwerbspersonenpotenzial −40.000. https://doku.iab.de/kurzber/2026/kb2026-05.pdf</w:t>
+      </w:r>
+    </w:p>
+    <w:p>
+      <w:pPr>
+        <w:jc w:val="both"/>
+      </w:pPr>
+      <w:r>
+        <w:rPr>
+          <w:rFonts w:ascii="Arial" w:hAnsi="Arial"/>
+          <w:b w:val="0"/>
+          <w:i w:val="0"/>
+          <w:sz w:val="19"/>
+        </w:rPr>
         <w:t xml:space="preserve">IAB. (März 2026). </w:t>
       </w:r>
       <w:r>
@@ -7818,6 +8198,70 @@
           <w:i w:val="0"/>
           <w:sz w:val="19"/>
         </w:rPr>
+        <w:t xml:space="preserve">Deutsche Bundesbank. (Juni 2026). </w:t>
+      </w:r>
+      <w:r>
+        <w:rPr>
+          <w:rFonts w:ascii="Arial" w:hAnsi="Arial"/>
+          <w:b w:val="0"/>
+          <w:i/>
+          <w:sz w:val="19"/>
+        </w:rPr>
+        <w:t>Monatsbericht Juni 2026 — Generative KI in deutschen Unternehmen: Verbreitung, Arbeitsproduktivität und Arbeitsmarkteffekte.</w:t>
+      </w:r>
+      <w:r>
+        <w:rPr>
+          <w:rFonts w:ascii="Arial" w:hAnsi="Arial"/>
+          <w:b w:val="0"/>
+          <w:i w:val="0"/>
+          <w:sz w:val="19"/>
+        </w:rPr>
+        <w:t xml:space="preserve"> Auswertung der Q1-2026-Unternehmensumfrage (rund 7.000 Unternehmen): Anteil der Nutzer und Planenden 26 % (2024) → 56 % (2026 erwartet); rund 46 % der Einsetzer mit Produktivitätsgewinnen ≥ 1 %; &gt;50 % erwarten ≥ 2 % für 2025/2026, rund ein Viertel ≥ 5 %. Begleitaufsatz zur Demografie ergänzt das Heft. https://publikationen.bundesbank.de/publikationen-de/berichte-studien/monatsberichte/monatsbericht-juni-2026-998608</w:t>
+      </w:r>
+    </w:p>
+    <w:p>
+      <w:pPr>
+        <w:jc w:val="both"/>
+      </w:pPr>
+      <w:r>
+        <w:rPr>
+          <w:rFonts w:ascii="Arial" w:hAnsi="Arial"/>
+          <w:b w:val="0"/>
+          <w:i w:val="0"/>
+          <w:sz w:val="19"/>
+        </w:rPr>
+        <w:t xml:space="preserve">Sachverständigenrat zur Begutachtung der gesamtwirtschaftlichen Entwicklung. (27. Mai 2026). </w:t>
+      </w:r>
+      <w:r>
+        <w:rPr>
+          <w:rFonts w:ascii="Arial" w:hAnsi="Arial"/>
+          <w:b w:val="0"/>
+          <w:i/>
+          <w:sz w:val="19"/>
+        </w:rPr>
+        <w:t>Frühjahrsgutachten 2026.</w:t>
+      </w:r>
+      <w:r>
+        <w:rPr>
+          <w:rFonts w:ascii="Arial" w:hAnsi="Arial"/>
+          <w:b w:val="0"/>
+          <w:i w:val="0"/>
+          <w:sz w:val="19"/>
+        </w:rPr>
+        <w:t xml:space="preserve"> BIP-Prognose +0,5 % (2026) und +0,8 % (2027); Abwärtsrevision um 0,4 Pp. gegenüber Jahresgutachten 2025/2026; Inflation 3,0 % (2026) und 2,8 % (2027). https://www.sachverstaendigenrat-wirtschaft.de/fileadmin/dateiablage/gutachten/fg2026/FG2026_Gesamtausgabe.pdf</w:t>
+      </w:r>
+    </w:p>
+    <w:p>
+      <w:pPr>
+        <w:jc w:val="both"/>
+      </w:pPr>
+      <w:r>
+        <w:rPr>
+          <w:rFonts w:ascii="Arial" w:hAnsi="Arial"/>
+          <w:b w:val="0"/>
+          <w:i w:val="0"/>
+          <w:sz w:val="19"/>
+        </w:rPr>
         <w:t xml:space="preserve">Bundesrechnungshof. (2026). </w:t>
       </w:r>
       <w:r>
@@ -8010,6 +8454,56 @@
           <w:i w:val="0"/>
           <w:sz w:val="19"/>
         </w:rPr>
+        <w:t xml:space="preserve">Office of the Governor of Connecticut / Ned Lamont. (29. Mai 2026). </w:t>
+      </w:r>
+      <w:r>
+        <w:rPr>
+          <w:rFonts w:ascii="Arial" w:hAnsi="Arial"/>
+          <w:b w:val="0"/>
+          <w:i/>
+          <w:sz w:val="19"/>
+        </w:rPr>
+        <w:t>Governor Lamont Signs Legislation Establishing Youth Online Safety Protections, Regulations Over Artificial Intelligence, and Initiatives to Upskill Connecticut's Workforce.</w:t>
+      </w:r>
+      <w:r>
+        <w:rPr>
+          <w:rFonts w:ascii="Arial" w:hAnsi="Arial"/>
+          <w:b w:val="0"/>
+          <w:i w:val="0"/>
+          <w:sz w:val="19"/>
+        </w:rPr>
+        <w:t xml:space="preserve"> Unterzeichnung von </w:t>
+      </w:r>
+      <w:r>
+        <w:rPr>
+          <w:rFonts w:ascii="Arial" w:hAnsi="Arial"/>
+          <w:b w:val="0"/>
+          <w:i/>
+          <w:sz w:val="19"/>
+        </w:rPr>
+        <w:t>SB 5 — Connecticut Artificial Intelligence Responsibility and Transparency Act</w:t>
+      </w:r>
+      <w:r>
+        <w:rPr>
+          <w:rFonts w:ascii="Arial" w:hAnsi="Arial"/>
+          <w:b w:val="0"/>
+          <w:i w:val="0"/>
+          <w:sz w:val="19"/>
+        </w:rPr>
+        <w:t>. https://portal.ct.gov/governor/news/press-releases/2026/06-2026/governor-lamont-signs-legislation-establishing-youth-online-safety-protections</w:t>
+      </w:r>
+    </w:p>
+    <w:p>
+      <w:pPr>
+        <w:jc w:val="both"/>
+      </w:pPr>
+      <w:r>
+        <w:rPr>
+          <w:rFonts w:ascii="Arial" w:hAnsi="Arial"/>
+          <w:b w:val="0"/>
+          <w:i w:val="0"/>
+          <w:sz w:val="19"/>
+        </w:rPr>
         <w:t xml:space="preserve">Shipman &amp; Goodwin LLP / Freshfields. (Mai 2026). </w:t>
       </w:r>
       <w:r>
@@ -8814,6 +9308,102 @@
           <w:i w:val="0"/>
           <w:sz w:val="19"/>
         </w:rPr>
+        <w:t xml:space="preserve">Rat der Europäischen Union. (7. Mai 2026). </w:t>
+      </w:r>
+      <w:r>
+        <w:rPr>
+          <w:rFonts w:ascii="Arial" w:hAnsi="Arial"/>
+          <w:b w:val="0"/>
+          <w:i/>
+          <w:sz w:val="19"/>
+        </w:rPr>
+        <w:t>Artificial Intelligence: Council and Parliament agree to simplify and streamline rules.</w:t>
+      </w:r>
+      <w:r>
+        <w:rPr>
+          <w:rFonts w:ascii="Arial" w:hAnsi="Arial"/>
+          <w:b w:val="0"/>
+          <w:i w:val="0"/>
+          <w:sz w:val="19"/>
+        </w:rPr>
+        <w:t xml:space="preserve"> Pressemitteilung zur vorläufigen Trilog-Einigung über den Digital Omnibus on AI. https://www.consilium.europa.eu/en/press/press-releases/2026/05/07/artificial-intelligence-council-and-parliament-agree-to-simplify-and-streamline-rules/</w:t>
+      </w:r>
+    </w:p>
+    <w:p>
+      <w:pPr>
+        <w:jc w:val="both"/>
+      </w:pPr>
+      <w:r>
+        <w:rPr>
+          <w:rFonts w:ascii="Arial" w:hAnsi="Arial"/>
+          <w:b w:val="0"/>
+          <w:i w:val="0"/>
+          <w:sz w:val="19"/>
+        </w:rPr>
+        <w:t xml:space="preserve">Europäisches Parlament. (16. Juni 2026). </w:t>
+      </w:r>
+      <w:r>
+        <w:rPr>
+          <w:rFonts w:ascii="Arial" w:hAnsi="Arial"/>
+          <w:b w:val="0"/>
+          <w:i/>
+          <w:sz w:val="19"/>
+        </w:rPr>
+        <w:t>European Parliament formally endorses Digital Omnibus on AI provisional agreement.</w:t>
+      </w:r>
+      <w:r>
+        <w:rPr>
+          <w:rFonts w:ascii="Arial" w:hAnsi="Arial"/>
+          <w:b w:val="0"/>
+          <w:i w:val="0"/>
+          <w:sz w:val="19"/>
+        </w:rPr>
+        <w:t xml:space="preserve"> Plenarbestätigung der Trilog-Einigung vom 7. Mai 2026; formelle Annahme durch den Rat und Veröffentlichung im EU-Amtsblatt für Juli 2026 erwartet. Kanzleianalysen u. a. Gibson Dunn, DLA Piper, Bird &amp; Bird, AOShearman. https://www.gibsondunn.com/eu-ai-act-omnibus-agreement-postponed-high-risk-deadlines-and-other-key-changes/</w:t>
+      </w:r>
+    </w:p>
+    <w:p>
+      <w:pPr>
+        <w:jc w:val="both"/>
+      </w:pPr>
+      <w:r>
+        <w:rPr>
+          <w:rFonts w:ascii="Arial" w:hAnsi="Arial"/>
+          <w:b w:val="0"/>
+          <w:i w:val="0"/>
+          <w:sz w:val="19"/>
+        </w:rPr>
+        <w:t xml:space="preserve">Deutscher Bundestag. (11. Juni 2026). </w:t>
+      </w:r>
+      <w:r>
+        <w:rPr>
+          <w:rFonts w:ascii="Arial" w:hAnsi="Arial"/>
+          <w:b w:val="0"/>
+          <w:i/>
+          <w:sz w:val="19"/>
+        </w:rPr>
+        <w:t>Ja zur Durchführung der Verordnung über künstliche Intelligenz — Gesetz zur Durchführung der KI-Verordnung (KI-MIG).</w:t>
+      </w:r>
+      <w:r>
+        <w:rPr>
+          <w:rFonts w:ascii="Arial" w:hAnsi="Arial"/>
+          <w:b w:val="0"/>
+          <w:i w:val="0"/>
+          <w:sz w:val="19"/>
+        </w:rPr>
+        <w:t xml:space="preserve"> Plenardebatte, zweite und dritte Lesung; Benennung der Bundesnetzagentur als zentrale Marktüberwachungsbehörde. https://www.bundestag.de/dokumente/textarchiv/2026/kw24-de-ki-1183820 | https://www.heise.de/news/Bundestag-beschliesst-KI-Gesetz-Bundesnetzagentur-wird-zentrale-Aufsicht-11330801.html</w:t>
+      </w:r>
+    </w:p>
+    <w:p>
+      <w:pPr>
+        <w:jc w:val="both"/>
+      </w:pPr>
+      <w:r>
+        <w:rPr>
+          <w:rFonts w:ascii="Arial" w:hAnsi="Arial"/>
+          <w:b w:val="0"/>
+          <w:i w:val="0"/>
+          <w:sz w:val="19"/>
+        </w:rPr>
         <w:t xml:space="preserve">Bundesministerium der Finanzen (BMF). (März 2024). </w:t>
       </w:r>
       <w:r>
@@ -8847,6 +9437,38 @@
           <w:sz w:val="19"/>
         </w:rPr>
         <w:t>Institut der deutschen Wirtschaft (IW) Köln. Sollen Roboter Steuern zahlen? Beitrag von Tobias Hentze.</w:t>
+      </w:r>
+    </w:p>
+    <w:p>
+      <w:pPr>
+        <w:jc w:val="both"/>
+      </w:pPr>
+      <w:r>
+        <w:rPr>
+          <w:rFonts w:ascii="Arial" w:hAnsi="Arial"/>
+          <w:b w:val="0"/>
+          <w:i w:val="0"/>
+          <w:sz w:val="19"/>
+        </w:rPr>
+        <w:t xml:space="preserve">Anthropic / Amodei, D. (10. Juni 2026). </w:t>
+      </w:r>
+      <w:r>
+        <w:rPr>
+          <w:rFonts w:ascii="Arial" w:hAnsi="Arial"/>
+          <w:b w:val="0"/>
+          <w:i/>
+          <w:sz w:val="19"/>
+        </w:rPr>
+        <w:t>Policy on the AI Exponential / Advanced AI Framework / Economic Policy Framework.</w:t>
+      </w:r>
+      <w:r>
+        <w:rPr>
+          <w:rFonts w:ascii="Arial" w:hAnsi="Arial"/>
+          <w:b w:val="0"/>
+          <w:i w:val="0"/>
+          <w:sz w:val="19"/>
+        </w:rPr>
+        <w:t xml:space="preserve"> Drei kombinierte Politikrahmen mit 350 Mio. USD Eigenmitteln (200 Mio. USD Economic Futures Research Fund; 150 Mio. USD National Fellowship); Disruptionsszenarien 5 % / 10 % / „unprecedented" Arbeitslosigkeit; FAA-Style-Zulassung für Frontier-Modelle. https://www.anthropic.com/policy-on-the-ai-exponential/epf | https://darioamodei.com/post/policy-on-the-ai-exponential | https://venturebeat.com/technology/anthropic-ceo-calls-for-faa-style-regulation-of-powerful-ai-models-what-enterprises-should-know</w:t>
       </w:r>
     </w:p>
     <w:p>
@@ -10507,6 +11129,74 @@
           <w:i w:val="0"/>
           <w:sz w:val="19"/>
         </w:rPr>
+        <w:t xml:space="preserve">TechCrunch / TechTimes / InformationWeek. (Mai/Juni 2026). </w:t>
+      </w:r>
+      <w:r>
+        <w:rPr>
+          <w:rFonts w:ascii="Arial" w:hAnsi="Arial"/>
+          <w:b w:val="0"/>
+          <w:i/>
+          <w:sz w:val="19"/>
+        </w:rPr>
+        <w:t>The running list: major tech layoffs in 2026 where employers cited AI / Tech Layoffs Reach 142,000 in 2026: Profitable Companies Cut Jobs to Fund $700B AI Infrastructure / 2026 tech company layoffs.</w:t>
+      </w:r>
+      <w:r>
+        <w:rPr>
+          <w:rFonts w:ascii="Arial" w:hAnsi="Arial"/>
+          <w:b w:val="0"/>
+          <w:i w:val="0"/>
+          <w:sz w:val="19"/>
+        </w:rPr>
+        <w:t xml:space="preserve"> Kumulierte Tech-Stellenstreichungen Januar–Mai 2026 rund 142.000, zur Jahresmitte über 150.000; </w:t>
+      </w:r>
+      <w:r>
+        <w:rPr>
+          <w:rFonts w:ascii="Arial" w:hAnsi="Arial"/>
+          <w:b w:val="0"/>
+          <w:i/>
+          <w:sz w:val="19"/>
+        </w:rPr>
+        <w:t>GitLab</w:t>
+      </w:r>
+      <w:r>
+        <w:rPr>
+          <w:rFonts w:ascii="Arial" w:hAnsi="Arial"/>
+          <w:b w:val="0"/>
+          <w:i w:val="0"/>
+          <w:sz w:val="19"/>
+        </w:rPr>
+        <w:t xml:space="preserve"> 3. Juni 2026: rund 350 Stellen / 14 % („agentic workloads"); </w:t>
+      </w:r>
+      <w:r>
+        <w:rPr>
+          <w:rFonts w:ascii="Arial" w:hAnsi="Arial"/>
+          <w:b w:val="0"/>
+          <w:i/>
+          <w:sz w:val="19"/>
+        </w:rPr>
+        <w:t>Oracle</w:t>
+      </w:r>
+      <w:r>
+        <w:rPr>
+          <w:rFonts w:ascii="Arial" w:hAnsi="Arial"/>
+          <w:b w:val="0"/>
+          <w:i w:val="0"/>
+          <w:sz w:val="19"/>
+        </w:rPr>
+        <w:t xml:space="preserve"> 22. Juni 2026 (Form 10-K): rund 21.000 Stellen / 13 % über zwölf Monate, KI-Bezug ausdrücklich genannt. https://techcrunch.com/2026/06/22/the-running-list-major-tech-layoffs-in-2026-where-employers-cited-ai/ | https://www.techtimes.com/articles/317392/20260529/tech-layoffs-reach-142000-2026-profitable-companies-cut-jobs-fund-700b-ai-infrastructure.htm | https://www.informationweek.com/it-staffing-careers/2026-tech-company-layoffs</w:t>
+      </w:r>
+    </w:p>
+    <w:p>
+      <w:pPr>
+        <w:jc w:val="both"/>
+      </w:pPr>
+      <w:r>
+        <w:rPr>
+          <w:rFonts w:ascii="Arial" w:hAnsi="Arial"/>
+          <w:b w:val="0"/>
+          <w:i w:val="0"/>
+          <w:sz w:val="19"/>
+        </w:rPr>
         <w:t xml:space="preserve">Bloomberg Editorial Board. (29. April 2026). </w:t>
       </w:r>
       <w:r>
@@ -10566,7 +11256,277 @@
           <w:i w:val="0"/>
           <w:sz w:val="19"/>
         </w:rPr>
-        <w:t xml:space="preserve"> Dieses Arbeitspapier gibt den Stand Anfang Mai 2026 (Schnitt am 8. Mai 2026 — Lauf 001 vom 8. Mai 2026) wieder. Die Debatte entwickelt sich dynamisch, insbesondere im Zuge der OpenAI-Strategiepapiere und der Eröffnung des OpenAI Workshop in Washington, D.C. im Mai 2026, des Erstdurchgangs des GKV-Beitragssatzstabilisierungsgesetzes in der 1065. Bundesratssitzung am 8. Mai 2026 mit 79 Tagesordnungspunkten (Kabinettsbeschluss 29. April 2026, parlamentarische Behandlung vor der Sommerpause 2026 angekündigt), der laufenden Trilog-Verhandlungen zum Digital Omnibus on AI (zweite Runde 28. April 2026 ohne Einigung; nächste Runde 13. Mai 2026 — Knackpunkt ist nicht die Verschiebung der Hochrisiko-Pflichten, sondern die Konformitätsbewertungs-Architektur für Anhang I; die zypriotische Ratspräsidentschaft strebt einen Abschluss vor Ablauf ihrer Amtszeit am 30. Juni 2026 an, andernfalls übernimmt die irische Präsidentschaft), der am 5. Mai 2026 erfolgten Arraignment-Verhandlung im Altman-Verfahren mit „nicht schuldig"-Plädoyer und angeordneter psychiatrischer Begutachtung, des am 7. Mai 2026 versandten individuellen Microsoft-Buyout-Angebots (Annahmefrist 8. Juni 2026, VRSAR-Unterzeichnung 9.–22. Juni 2026, bis zu fünfjährige Krankenversicherungs-Verlängerung), des am 1. Mai 2026 vom Connecticut-Repräsentantenhaus mit 131 zu 17 Stimmen verabschiedeten </w:t>
+        <w:t xml:space="preserve"> Dieses Arbeitspapier gibt den Stand Ende Juni 2026 (Schnitt am 25. Juni 2026 — Lauf 001 vom 25. Juni 2026) wieder. Neu in Version 23.0 sind: die vorläufige Trilog-Einigung zum </w:t>
+      </w:r>
+      <w:r>
+        <w:rPr>
+          <w:rFonts w:ascii="Arial" w:hAnsi="Arial"/>
+          <w:b w:val="0"/>
+          <w:i/>
+          <w:sz w:val="19"/>
+        </w:rPr>
+        <w:t>Digital Omnibus on AI</w:t>
+      </w:r>
+      <w:r>
+        <w:rPr>
+          <w:rFonts w:ascii="Arial" w:hAnsi="Arial"/>
+          <w:b w:val="0"/>
+          <w:i w:val="0"/>
+          <w:sz w:val="19"/>
+        </w:rPr>
+        <w:t xml:space="preserve"> vom 7. Mai 2026 und die formale Plenarbestätigung des Europäischen Parlaments vom 16. Juni 2026 (Annexe-Verschiebungen bestätigt; neue Verbote nach Art. 5 zu Nudifier-Anwendungen und KI-generiertem CSAM mit Übergangsfrist bis 2. Dezember 2026); die Verabschiedung des deutschen </w:t>
+      </w:r>
+      <w:r>
+        <w:rPr>
+          <w:rFonts w:ascii="Arial" w:hAnsi="Arial"/>
+          <w:b w:val="0"/>
+          <w:i/>
+          <w:sz w:val="19"/>
+        </w:rPr>
+        <w:t>Gesetzes zur Durchführung der KI-Verordnung (KI-MIG)</w:t>
+      </w:r>
+      <w:r>
+        <w:rPr>
+          <w:rFonts w:ascii="Arial" w:hAnsi="Arial"/>
+          <w:b w:val="0"/>
+          <w:i w:val="0"/>
+          <w:sz w:val="19"/>
+        </w:rPr>
+        <w:t xml:space="preserve"> im Bundestag am 11. Juni 2026 mit Benennung der Bundesnetzagentur als zentrale Marktüberwachungsbehörde (Bundesratszustimmung steht aus); die Unterzeichnung von </w:t>
+      </w:r>
+      <w:r>
+        <w:rPr>
+          <w:rFonts w:ascii="Arial" w:hAnsi="Arial"/>
+          <w:b w:val="0"/>
+          <w:i/>
+          <w:sz w:val="19"/>
+        </w:rPr>
+        <w:t>SB 5 — Connecticut Artificial Intelligence Responsibility and Transparency Act</w:t>
+      </w:r>
+      <w:r>
+        <w:rPr>
+          <w:rFonts w:ascii="Arial" w:hAnsi="Arial"/>
+          <w:b w:val="0"/>
+          <w:i w:val="0"/>
+          <w:sz w:val="19"/>
+        </w:rPr>
+        <w:t xml:space="preserve"> durch Gouverneur Lamont am 29. Mai 2026; das </w:t>
+      </w:r>
+      <w:r>
+        <w:rPr>
+          <w:rFonts w:ascii="Arial" w:hAnsi="Arial"/>
+          <w:b w:val="0"/>
+          <w:i/>
+          <w:sz w:val="19"/>
+        </w:rPr>
+        <w:t>Anthropic-Doppelpaket</w:t>
+      </w:r>
+      <w:r>
+        <w:rPr>
+          <w:rFonts w:ascii="Arial" w:hAnsi="Arial"/>
+          <w:b w:val="0"/>
+          <w:i w:val="0"/>
+          <w:sz w:val="19"/>
+        </w:rPr>
+        <w:t xml:space="preserve"> vom 10. Juni 2026 mit </w:t>
+      </w:r>
+      <w:r>
+        <w:rPr>
+          <w:rFonts w:ascii="Arial" w:hAnsi="Arial"/>
+          <w:b w:val="0"/>
+          <w:i/>
+          <w:sz w:val="19"/>
+        </w:rPr>
+        <w:t>Advanced AI Framework</w:t>
+      </w:r>
+      <w:r>
+        <w:rPr>
+          <w:rFonts w:ascii="Arial" w:hAnsi="Arial"/>
+          <w:b w:val="0"/>
+          <w:i w:val="0"/>
+          <w:sz w:val="19"/>
+        </w:rPr>
+        <w:t xml:space="preserve">, </w:t>
+      </w:r>
+      <w:r>
+        <w:rPr>
+          <w:rFonts w:ascii="Arial" w:hAnsi="Arial"/>
+          <w:b w:val="0"/>
+          <w:i/>
+          <w:sz w:val="19"/>
+        </w:rPr>
+        <w:t>Economic Policy Framework</w:t>
+      </w:r>
+      <w:r>
+        <w:rPr>
+          <w:rFonts w:ascii="Arial" w:hAnsi="Arial"/>
+          <w:b w:val="0"/>
+          <w:i w:val="0"/>
+          <w:sz w:val="19"/>
+        </w:rPr>
+        <w:t xml:space="preserve"> und Amodei-Essay </w:t>
+      </w:r>
+      <w:r>
+        <w:rPr>
+          <w:rFonts w:ascii="Arial" w:hAnsi="Arial"/>
+          <w:b w:val="0"/>
+          <w:i/>
+          <w:sz w:val="19"/>
+        </w:rPr>
+        <w:t>„Policy on the AI Exponential"</w:t>
+      </w:r>
+      <w:r>
+        <w:rPr>
+          <w:rFonts w:ascii="Arial" w:hAnsi="Arial"/>
+          <w:b w:val="0"/>
+          <w:i w:val="0"/>
+          <w:sz w:val="19"/>
+        </w:rPr>
+        <w:t xml:space="preserve"> (Disruptionsszenarien 5 % / 10 % / „unprecedented" Arbeitslosigkeit; 350 Mio. USD Eigenmittel — 200 Mio. USD </w:t>
+      </w:r>
+      <w:r>
+        <w:rPr>
+          <w:rFonts w:ascii="Arial" w:hAnsi="Arial"/>
+          <w:b w:val="0"/>
+          <w:i/>
+          <w:sz w:val="19"/>
+        </w:rPr>
+        <w:t>Economic Futures Research Fund</w:t>
+      </w:r>
+      <w:r>
+        <w:rPr>
+          <w:rFonts w:ascii="Arial" w:hAnsi="Arial"/>
+          <w:b w:val="0"/>
+          <w:i w:val="0"/>
+          <w:sz w:val="19"/>
+        </w:rPr>
+        <w:t xml:space="preserve"> und 150 Mio. USD </w:t>
+      </w:r>
+      <w:r>
+        <w:rPr>
+          <w:rFonts w:ascii="Arial" w:hAnsi="Arial"/>
+          <w:b w:val="0"/>
+          <w:i/>
+          <w:sz w:val="19"/>
+        </w:rPr>
+        <w:t>National Fellowship Program</w:t>
+      </w:r>
+      <w:r>
+        <w:rPr>
+          <w:rFonts w:ascii="Arial" w:hAnsi="Arial"/>
+          <w:b w:val="0"/>
+          <w:i w:val="0"/>
+          <w:sz w:val="19"/>
+        </w:rPr>
+        <w:t xml:space="preserve">; FAA-Style-Zulassungslogik für Frontier-Modelle); die parlamentarische Behandlung des </w:t>
+      </w:r>
+      <w:r>
+        <w:rPr>
+          <w:rFonts w:ascii="Arial" w:hAnsi="Arial"/>
+          <w:b w:val="0"/>
+          <w:i/>
+          <w:sz w:val="19"/>
+        </w:rPr>
+        <w:t>GKV-Beitragssatzstabilisierungsgesetzes</w:t>
+      </w:r>
+      <w:r>
+        <w:rPr>
+          <w:rFonts w:ascii="Arial" w:hAnsi="Arial"/>
+          <w:b w:val="0"/>
+          <w:i w:val="0"/>
+          <w:sz w:val="19"/>
+        </w:rPr>
+        <w:t xml:space="preserve"> (erste Bundestagslesung 12. Juni 2026; öffentliche Anhörung im Gesundheitsausschuss 22. Juni 2026); die aktualisierte IAB-Arbeitsmarktprognose im </w:t>
+      </w:r>
+      <w:r>
+        <w:rPr>
+          <w:rFonts w:ascii="Arial" w:hAnsi="Arial"/>
+          <w:b w:val="0"/>
+          <w:i/>
+          <w:sz w:val="19"/>
+        </w:rPr>
+        <w:t>Kurzbericht 05/2026</w:t>
+      </w:r>
+      <w:r>
+        <w:rPr>
+          <w:rFonts w:ascii="Arial" w:hAnsi="Arial"/>
+          <w:b w:val="0"/>
+          <w:i w:val="0"/>
+          <w:sz w:val="19"/>
+        </w:rPr>
+        <w:t xml:space="preserve"> (Erwerbstätigkeit −18.000 statt −90.000; Bestand Juni 2026 45,78–45,99 Mio.; Erwerbspersonenpotenzial −40.000); das </w:t>
+      </w:r>
+      <w:r>
+        <w:rPr>
+          <w:rFonts w:ascii="Arial" w:hAnsi="Arial"/>
+          <w:b w:val="0"/>
+          <w:i/>
+          <w:sz w:val="19"/>
+        </w:rPr>
+        <w:t>SVR-Frühjahrsgutachten 2026</w:t>
+      </w:r>
+      <w:r>
+        <w:rPr>
+          <w:rFonts w:ascii="Arial" w:hAnsi="Arial"/>
+          <w:b w:val="0"/>
+          <w:i w:val="0"/>
+          <w:sz w:val="19"/>
+        </w:rPr>
+        <w:t xml:space="preserve"> vom 27. Mai 2026 (BIP +0,5 % 2026 / +0,8 % 2027; Inflation 3,0 % / 2,8 %); der </w:t>
+      </w:r>
+      <w:r>
+        <w:rPr>
+          <w:rFonts w:ascii="Arial" w:hAnsi="Arial"/>
+          <w:b w:val="0"/>
+          <w:i/>
+          <w:sz w:val="19"/>
+        </w:rPr>
+        <w:t>Bundesbank-Monatsbericht Juni 2026</w:t>
+      </w:r>
+      <w:r>
+        <w:rPr>
+          <w:rFonts w:ascii="Arial" w:hAnsi="Arial"/>
+          <w:b w:val="0"/>
+          <w:i w:val="0"/>
+          <w:sz w:val="19"/>
+        </w:rPr>
+        <w:t xml:space="preserve"> mit erstmaliger Auswertung der Q1-2026-Unternehmensumfrage zu generativer KI (rund 7.000 Befragte; Nutzung/Planung 26 % 2024 → 56 % 2026 erwartet; 46 % Produktivitätsgewinne ≥ 1 %; &gt;50 % mit Produktivitätserwartung ≥ 2 % für 2025/2026, rund ein Viertel ≥ 5 %); sowie die fortgeschriebenen Tech-Layoff-Aggregate für 2026 (rund 142.000 Tech-Stellen bis Ende Mai 2026, über 150.000 zur Jahresmitte; </w:t>
+      </w:r>
+      <w:r>
+        <w:rPr>
+          <w:rFonts w:ascii="Arial" w:hAnsi="Arial"/>
+          <w:b w:val="0"/>
+          <w:i/>
+          <w:sz w:val="19"/>
+        </w:rPr>
+        <w:t>GitLab</w:t>
+      </w:r>
+      <w:r>
+        <w:rPr>
+          <w:rFonts w:ascii="Arial" w:hAnsi="Arial"/>
+          <w:b w:val="0"/>
+          <w:i w:val="0"/>
+          <w:sz w:val="19"/>
+        </w:rPr>
+        <w:t xml:space="preserve"> 3. Juni 2026 rund 350 Stellen / 14 % zur Finanzierung von „agentic workloads"; </w:t>
+      </w:r>
+      <w:r>
+        <w:rPr>
+          <w:rFonts w:ascii="Arial" w:hAnsi="Arial"/>
+          <w:b w:val="0"/>
+          <w:i/>
+          <w:sz w:val="19"/>
+        </w:rPr>
+        <w:t>Oracle</w:t>
+      </w:r>
+      <w:r>
+        <w:rPr>
+          <w:rFonts w:ascii="Arial" w:hAnsi="Arial"/>
+          <w:b w:val="0"/>
+          <w:i w:val="0"/>
+          <w:sz w:val="19"/>
+        </w:rPr>
+        <w:t xml:space="preserve"> 22. Juni 2026 mit Offenlegung von rund 21.000 Stellen / 13 % über zwölf Monate). Der vor Version 23.0 dokumentierte Sachstand zu OpenAI Workshop, Microsoft VRSAR (Annahmefrist 8. Juni 2026, Separation Date 1./2. Juli 2026), Connecticut SB 5-Gestaltungsregime, Maine LD 307/LD 713, Anthropic Economic Index, Hamilton-Project, Bloomberg-Editorial und Cluster-F-Wellen vom Mai 2026 bleibt unverändert gültig. Der frühere Wortlaut „Stand Anfang Mai 2026" wird in Version 23.0 durch „Stand Ende Juni 2026" ersetzt. Die Debatte entwickelt sich dynamisch, insbesondere im Zuge der OpenAI-Strategiepapiere und der Eröffnung des OpenAI Workshop in Washington, D.C. im Mai 2026, des Erstdurchgangs des GKV-Beitragssatzstabilisierungsgesetzes in der 1065. Bundesratssitzung am 8. Mai 2026 mit 79 Tagesordnungspunkten (Kabinettsbeschluss 29. April 2026, parlamentarische Behandlung vor der Sommerpause 2026 angekündigt), der laufenden Trilog-Verhandlungen zum Digital Omnibus on AI (zweite Runde 28. April 2026 ohne Einigung; nächste Runde 13. Mai 2026 — Knackpunkt ist nicht die Verschiebung der Hochrisiko-Pflichten, sondern die Konformitätsbewertungs-Architektur für Anhang I; die zypriotische Ratspräsidentschaft strebt einen Abschluss vor Ablauf ihrer Amtszeit am 30. Juni 2026 an, andernfalls übernimmt die irische Präsidentschaft), der am 5. Mai 2026 erfolgten Arraignment-Verhandlung im Altman-Verfahren mit „nicht schuldig"-Plädoyer und angeordneter psychiatrischer Begutachtung, des am 7. Mai 2026 versandten individuellen Microsoft-Buyout-Angebots (Annahmefrist 8. Juni 2026, VRSAR-Unterzeichnung 9.–22. Juni 2026, bis zu fünfjährige Krankenversicherungs-Verlängerung), des am 1. Mai 2026 vom Connecticut-Repräsentantenhaus mit 131 zu 17 Stimmen verabschiedeten </w:t>
       </w:r>
       <w:r>
         <w:rPr>
@@ -10862,7 +11822,7 @@
         <w:color w:val="999999"/>
         <w:sz w:val="15"/>
       </w:rPr>
-      <w:t>Version 22.0 — Mai 2026 — CC BY 4.0</w:t>
+      <w:t>Version 23.0 — Mai 2026 — CC BY 4.0</w:t>
       <w:tab/>
       <w:t xml:space="preserve">Seite </w:t>
     </w:r>

</xml_diff>

<commit_message>
Daily-Update 2026-06-26 — Version 23.0 (Cluster: D, F, B, C, E)
Lauf 002 nach 7-wöchiger Pause seit Lauf 001 vom 8. Mai 2026. Sechs belegbare Entwicklungen aus dem Zeitraum 9. Mai – 26. Juni 2026 eingearbeitet, Vertiefung in Cluster D (Anthropic Economic Policy Framework, Sanders American AI Sovereign Wealth Fund Act) und Cluster F (Challenger Mai-Report, TrueUp-Tracker-Stand 24. Juni); knappe Ergänzungen in B (Digital Omnibus on AI Trilog-Einigung / EP-Bestätigung), C (OECD Pillar 2 GIR-Frist 30. Juni 2026), E (GKV-Bundestagslesung 12. Juni und Anhörung 22. Juni 2026). Versionssprung 22.0 → 23.0 an allen vier Stellen; Build PDF/DOCX neu erstellt.

Co-Authored-By: Claude Opus 4.7 (1M context) <noreply@anthropic.com>
Claude-Session: https://claude.ai/code/session_01Bwu5Cj9gx2uzWN5x3YN3JA
</commit_message>
<xml_diff>
--- a/KI-Ökonomie.docx
+++ b/KI-Ökonomie.docx
@@ -112,7 +112,7 @@
           <w:color w:val="666666"/>
           <w:sz w:val="18"/>
         </w:rPr>
-        <w:t>Version 22.0</w:t>
+        <w:t>Version 23.0</w:t>
       </w:r>
     </w:p>
     <w:p>
@@ -382,7 +382,187 @@
           <w:i w:val="0"/>
           <w:sz w:val="19"/>
         </w:rPr>
-        <w:t xml:space="preserve">-Differenzierung vom 1. Mai 2026 genannte Mehrkanalerklärung (KI-Verdrängung, Austerity-Logik, Pandemie-Korrekturen, Routine-Restrukturierung) zusätzlich stützt. Der parallele Lauf der Branchen-AI-Capex-Programme (Q1-2026-Investitionen der Hyperscaler von rund 130,65 Milliarden US-Dollar; Konsens-Schätzung Anfang April 2026 zwischen 660 und 700 Milliarden US-Dollar, nach den Q1-2026-Earnings-Calls vom 28.–30. April 2026 — von der </w:t>
+        <w:t xml:space="preserve">-Differenzierung vom 1. Mai 2026 genannte Mehrkanalerklärung (KI-Verdrängung, Austerity-Logik, Pandemie-Korrekturen, Routine-Restrukturierung) zusätzlich stützt. Die Folge-Ausgabe — der </w:t>
+      </w:r>
+      <w:r>
+        <w:rPr>
+          <w:rFonts w:ascii="Arial" w:hAnsi="Arial"/>
+          <w:b w:val="0"/>
+          <w:i/>
+          <w:sz w:val="19"/>
+        </w:rPr>
+        <w:t>Mai-2026-Job-Cuts-Report</w:t>
+      </w:r>
+      <w:r>
+        <w:rPr>
+          <w:rFonts w:ascii="Arial" w:hAnsi="Arial"/>
+          <w:b w:val="0"/>
+          <w:i w:val="0"/>
+          <w:sz w:val="19"/>
+        </w:rPr>
+        <w:t xml:space="preserve"> von </w:t>
+      </w:r>
+      <w:r>
+        <w:rPr>
+          <w:rFonts w:ascii="Arial" w:hAnsi="Arial"/>
+          <w:b w:val="0"/>
+          <w:i/>
+          <w:sz w:val="19"/>
+        </w:rPr>
+        <w:t>Challenger, Gray &amp; Christmas</w:t>
+      </w:r>
+      <w:r>
+        <w:rPr>
+          <w:rFonts w:ascii="Arial" w:hAnsi="Arial"/>
+          <w:b w:val="0"/>
+          <w:i w:val="0"/>
+          <w:sz w:val="19"/>
+        </w:rPr>
+        <w:t xml:space="preserve"> (veröffentlicht am 4. Juni 2026) — markiert einen weiteren Strukturbruch: Erstmals in der Tracker-Historie ist KI mit 38.579 angekündigten KI-bezogenen US-Stellenstreichungen im Mai 2026 (rund 40 % des Monatsvolumens) der </w:t>
+      </w:r>
+      <w:r>
+        <w:rPr>
+          <w:rFonts w:ascii="Arial" w:hAnsi="Arial"/>
+          <w:b w:val="0"/>
+          <w:i/>
+          <w:sz w:val="19"/>
+        </w:rPr>
+        <w:t>am häufigsten genannte einzelne Streichungsgrund</w:t>
+      </w:r>
+      <w:r>
+        <w:rPr>
+          <w:rFonts w:ascii="Arial" w:hAnsi="Arial"/>
+          <w:b w:val="0"/>
+          <w:i w:val="0"/>
+          <w:sz w:val="19"/>
+        </w:rPr>
+        <w:t xml:space="preserve">; die KI-bezogenen Streichungen im laufenden Jahr 2026 summieren sich auf 87.714 und übertreffen damit fünf Monate vor Jahresende den gesamten KI-zugerechneten Jahreswert 2025 (54.836). Die im Mai 2026 angekündigten Großstreichungen umfassen unter anderem Oracle (rund 21.000 Stellen zwischen März und Juni 2026, etwa 13 % der Belegschaft), Meta (rund 8.000 Stellen im Mai 2026, etwa 10 % der Belegschaft) und PayPal (rund 4.500 Stellen im Mai 2026 als Teil des bereits zuvor angekündigten Programms über 20 % der Belegschaft). Eine zweite Tagesfortschreibung der TrueUp-Methodik weist zum 24. Juni 2026 rund 185.894 betroffene Personen aus 267 erfassten Layoff-Ereignissen aus (durchschnittlich rund 893 Stellen pro Tag), während eine parallele Auswertung des Branchen-Trackers für die </w:t>
+      </w:r>
+      <w:r>
+        <w:rPr>
+          <w:rFonts w:ascii="Arial" w:hAnsi="Arial"/>
+          <w:b w:val="0"/>
+          <w:i/>
+          <w:sz w:val="19"/>
+        </w:rPr>
+        <w:t>gesamte</w:t>
+      </w:r>
+      <w:r>
+        <w:rPr>
+          <w:rFonts w:ascii="Arial" w:hAnsi="Arial"/>
+          <w:b w:val="0"/>
+          <w:i w:val="0"/>
+          <w:sz w:val="19"/>
+        </w:rPr>
+        <w:t xml:space="preserve"> Tech-Industrie zum Juni-2026-Stand 415 Layoff-Ereignisse mit 157.147 betroffenen Personen zählt. Begleitend dokumentiert </w:t>
+      </w:r>
+      <w:r>
+        <w:rPr>
+          <w:rFonts w:ascii="Arial" w:hAnsi="Arial"/>
+          <w:b w:val="0"/>
+          <w:i/>
+          <w:sz w:val="19"/>
+        </w:rPr>
+        <w:t>TechCrunch</w:t>
+      </w:r>
+      <w:r>
+        <w:rPr>
+          <w:rFonts w:ascii="Arial" w:hAnsi="Arial"/>
+          <w:b w:val="0"/>
+          <w:i w:val="0"/>
+          <w:sz w:val="19"/>
+        </w:rPr>
+        <w:t xml:space="preserve"> in seiner </w:t>
+      </w:r>
+      <w:r>
+        <w:rPr>
+          <w:rFonts w:ascii="Arial" w:hAnsi="Arial"/>
+          <w:b w:val="0"/>
+          <w:i/>
+          <w:sz w:val="19"/>
+        </w:rPr>
+        <w:t>„Running list — major tech layoffs in 2026 where employers cited AI"</w:t>
+      </w:r>
+      <w:r>
+        <w:rPr>
+          <w:rFonts w:ascii="Arial" w:hAnsi="Arial"/>
+          <w:b w:val="0"/>
+          <w:i w:val="0"/>
+          <w:sz w:val="19"/>
+        </w:rPr>
+        <w:t xml:space="preserve"> (22. Juni 2026) eine zunehmende Häufung von Konzern-Mitteilungen, die KI ausdrücklich als Begründung anführen; eine weitere </w:t>
+      </w:r>
+      <w:r>
+        <w:rPr>
+          <w:rFonts w:ascii="Arial" w:hAnsi="Arial"/>
+          <w:b w:val="0"/>
+          <w:i/>
+          <w:sz w:val="19"/>
+        </w:rPr>
+        <w:t>TechCrunch</w:t>
+      </w:r>
+      <w:r>
+        <w:rPr>
+          <w:rFonts w:ascii="Arial" w:hAnsi="Arial"/>
+          <w:b w:val="0"/>
+          <w:i w:val="0"/>
+          <w:sz w:val="19"/>
+        </w:rPr>
+        <w:t xml:space="preserve">-Analyse vom 24. Juni 2026 weist darauf hin, dass Software-Engineering-Tätigkeiten in den Tracker-Daten — entgegen der ursprünglichen Erwartung — </w:t>
+      </w:r>
+      <w:r>
+        <w:rPr>
+          <w:rFonts w:ascii="Arial" w:hAnsi="Arial"/>
+          <w:b w:val="0"/>
+          <w:i/>
+          <w:sz w:val="19"/>
+        </w:rPr>
+        <w:t>nicht</w:t>
+      </w:r>
+      <w:r>
+        <w:rPr>
+          <w:rFonts w:ascii="Arial" w:hAnsi="Arial"/>
+          <w:b w:val="0"/>
+          <w:i w:val="0"/>
+          <w:sz w:val="19"/>
+        </w:rPr>
+        <w:t xml:space="preserve"> überproportional getroffen sind, sondern unter den am wenigsten betroffenen Berufsgruppen liegen; auch </w:t>
+      </w:r>
+      <w:r>
+        <w:rPr>
+          <w:rFonts w:ascii="Arial" w:hAnsi="Arial"/>
+          <w:b w:val="0"/>
+          <w:i/>
+          <w:sz w:val="19"/>
+        </w:rPr>
+        <w:t>Salesforce Ben</w:t>
+      </w:r>
+      <w:r>
+        <w:rPr>
+          <w:rFonts w:ascii="Arial" w:hAnsi="Arial"/>
+          <w:b w:val="0"/>
+          <w:i w:val="0"/>
+          <w:sz w:val="19"/>
+        </w:rPr>
+        <w:t xml:space="preserve"> (Juni 2026) referiert eine wachsende Zahl von Unternehmen, die nach mehr als 100.000 KI-zugerechneten Stellenstreichungen einräumen, in der Folge keine messbaren KI-Produktivitätsgewinne erzielt zu haben. Für die Steuerdebatte bestätigt diese Linie zwei Befunde der Vormonate zugleich: Erstens hat sich die </w:t>
+      </w:r>
+      <w:r>
+        <w:rPr>
+          <w:rFonts w:ascii="Arial" w:hAnsi="Arial"/>
+          <w:b w:val="0"/>
+          <w:i/>
+          <w:sz w:val="19"/>
+        </w:rPr>
+        <w:t>Selbstattribution</w:t>
+      </w:r>
+      <w:r>
+        <w:rPr>
+          <w:rFonts w:ascii="Arial" w:hAnsi="Arial"/>
+          <w:b w:val="0"/>
+          <w:i w:val="0"/>
+          <w:sz w:val="19"/>
+        </w:rPr>
+        <w:t xml:space="preserve"> KI in den Tracker-Daten weiter verfestigt — die Schwelle, ab der Konzerne KI explizit als Streichungsgrund nennen, ist niedriger geworden —, und zweitens entkoppelt sich diese Selbstattribution zunehmend von belastbaren Produktivitätsnachweisen, was die in § 9.1 diskutierten Mess- und Umgehungsprobleme einer displacement-basierten Anknüpfung weiter verschärft. Der parallele Lauf der Branchen-AI-Capex-Programme (Q1-2026-Investitionen der Hyperscaler von rund 130,65 Milliarden US-Dollar; Konsens-Schätzung Anfang April 2026 zwischen 660 und 700 Milliarden US-Dollar, nach den Q1-2026-Earnings-Calls vom 28.–30. April 2026 — von der </w:t>
       </w:r>
       <w:r>
         <w:rPr>
@@ -2128,7 +2308,61 @@
           <w:i w:val="0"/>
           <w:sz w:val="19"/>
         </w:rPr>
-        <w:t xml:space="preserve"> Eine rein nationale Lösung kann mit der Warenverkehrsfreiheit, der Dienstleistungsfreiheit und der Niederlassungsfreiheit in Konflikt geraten. Eine Regelung, die nur inländische Roboterbetreiber trifft, während grenzüberschreitende KI-Dienstleistungen unbesteuert bleiben, wäre diskriminierungsrechtlich problematisch und praktisch kaum durchsetzbar. Der EU AI Act (Verordnung 2024/1689) schafft ab dem 2. August 2026 einen unionsweit einheitlichen Regulierungsrahmen für KI-Systeme (Hochrisiko-Systeme gemäß Anhang III, Transparenzpflichten nach Art. 50, Durchsetzungsregime); dies legt einen einheitlichen Definitionsrahmen, der steuerpolitische Anknüpfungen an KI-Systemklassen mittelfristig erleichtern kann, ohne selbst steuerrechtliche Wirkung zu entfalten. Die Europäische Kommission hat am 19. November 2025 mit dem „Digital Omnibus on AI" einen Vereinfachungsvorschlag vorgelegt, den das Europäische Parlament am 16. März 2026 im Ausschuss und am 23. März 2026 im Plenum unterstützt hat. Er sieht eine Verschiebung der Hochrisiko-Pflichten vor — je nach Systemtyp bis maximal zum 2. Dezember 2027 bzw. 2. August 2028 — und koppelt ihre Anwendbarkeit an die Verfügbarkeit harmonisierter Normen; zudem wird die Kennzeichnungspflicht für KI-generierte Inhalte (Art. 50) bis zum 2. November 2026 verlängert. Die Kommissionsdurchsetzungsbefugnisse gegenüber Anbietern von Allzweck-KI-Modellen (GPAI) treten wie vorgesehen am 2. August 2026 in Kraft. Parlament und Rat haben die Trilogverhandlungen aufgenommen; der zweite Trilogtermin am 28. April 2026 endete nach Berichterstattung von IAPP und A&amp;O Shearman ohne Einigung — Streitpunkt war primär das Verhältnis zwischen AI Act und sektorspezifischen EU-Regelungen für eingebettete KI-Systeme (Anhang I) sowie die Rechtsgrundlage für die Verarbeitung personenbezogener Daten zur Bias-Erkennung. Beide Institutionen konvergieren auf Stichtage 2. Dezember 2027 (Anhang III) und 2. August 2028 (Anhang I) für die Hochrisiko-Pflichten. Die nächste Trilogrunde ist auf den 13. Mai 2026 terminiert; Ziel bleibt eine förmliche Verabschiedung vor dem ursprünglichen Stichtag am 2. August 2026. Die zypriotische Ratspräsidentschaft hat sich vorgenommen, das Dossier vor Ablauf ihrer Amtszeit am 30. Juni 2026 abzuschließen; gelingt das nicht, übernimmt zur zweiten Jahreshälfte 2026 die irische Präsidentschaft. Scheitert die Einigung bis zum 2. August 2026, würden die Hochrisiko-Pflichten in ihrer ursprünglich vorgesehenen Fassung anwendbar. Für die Steuerdebatte folgt daraus, dass der zeitliche Vorlauf für KI-Definitionen aus dem AI Act enger als ursprünglich gedacht ist — eine mittelfristige Anknüpfung steuerlicher Tatbestände an AI-Act-Kategorien bleibt möglich, setzt aber voraus, dass die Normenlandschaft nach 2027 verlässlich vorliegt.</w:t>
+        <w:t xml:space="preserve"> Eine rein nationale Lösung kann mit der Warenverkehrsfreiheit, der Dienstleistungsfreiheit und der Niederlassungsfreiheit in Konflikt geraten. Eine Regelung, die nur inländische Roboterbetreiber trifft, während grenzüberschreitende KI-Dienstleistungen unbesteuert bleiben, wäre diskriminierungsrechtlich problematisch und praktisch kaum durchsetzbar. Der EU AI Act (Verordnung 2024/1689) schafft ab dem 2. August 2026 einen unionsweit einheitlichen Regulierungsrahmen für KI-Systeme (Hochrisiko-Systeme gemäß Anhang III, Transparenzpflichten nach Art. 50, Durchsetzungsregime); dies legt einen einheitlichen Definitionsrahmen, der steuerpolitische Anknüpfungen an KI-Systemklassen mittelfristig erleichtern kann, ohne selbst steuerrechtliche Wirkung zu entfalten. Die Europäische Kommission hat am 19. November 2025 mit dem „Digital Omnibus on AI" einen Vereinfachungsvorschlag vorgelegt, den das Europäische Parlament am 16. März 2026 im Ausschuss und am 23. März 2026 im Plenum unterstützt hat. Er sieht eine Verschiebung der Hochrisiko-Pflichten vor — je nach Systemtyp bis maximal zum 2. Dezember 2027 bzw. 2. August 2028 — und koppelt ihre Anwendbarkeit an die Verfügbarkeit harmonisierter Normen; zudem wird die Kennzeichnungspflicht für KI-generierte Inhalte (Art. 50) bis zum 2. November 2026 verlängert. Die Kommissionsdurchsetzungsbefugnisse gegenüber Anbietern von Allzweck-KI-Modellen (GPAI) treten wie vorgesehen am 2. August 2026 in Kraft. Parlament und Rat haben die Trilogverhandlungen aufgenommen; der zweite Trilogtermin am 28. April 2026 endete nach Berichterstattung von IAPP und A&amp;O Shearman ohne Einigung — Streitpunkt war primär das Verhältnis zwischen AI Act und sektorspezifischen EU-Regelungen für eingebettete KI-Systeme (Anhang I) sowie die Rechtsgrundlage für die Verarbeitung personenbezogener Daten zur Bias-Erkennung. Beide Institutionen konvergieren auf Stichtage 2. Dezember 2027 (Anhang III) und 2. August 2028 (Anhang I) für die Hochrisiko-Pflichten. Die nächste Trilogrunde ist auf den 13. Mai 2026 terminiert; Ziel bleibt eine förmliche Verabschiedung vor dem ursprünglichen Stichtag am 2. August 2026. Die zypriotische Ratspräsidentschaft hat sich vorgenommen, das Dossier vor Ablauf ihrer Amtszeit am 30. Juni 2026 abzuschließen; gelingt das nicht, übernimmt zur zweiten Jahreshälfte 2026 die irische Präsidentschaft. Scheitert die Einigung bis zum 2. August 2026, würden die Hochrisiko-Pflichten in ihrer ursprünglich vorgesehenen Fassung anwendbar. Tatsächlich haben sich Parlament und Rat nach Berichterstattung von </w:t>
+      </w:r>
+      <w:r>
+        <w:rPr>
+          <w:rFonts w:ascii="Arial" w:hAnsi="Arial"/>
+          <w:b w:val="0"/>
+          <w:i/>
+          <w:sz w:val="19"/>
+        </w:rPr>
+        <w:t>Bird &amp; Bird</w:t>
+      </w:r>
+      <w:r>
+        <w:rPr>
+          <w:rFonts w:ascii="Arial" w:hAnsi="Arial"/>
+          <w:b w:val="0"/>
+          <w:i w:val="0"/>
+          <w:sz w:val="19"/>
+        </w:rPr>
+        <w:t xml:space="preserve">, </w:t>
+      </w:r>
+      <w:r>
+        <w:rPr>
+          <w:rFonts w:ascii="Arial" w:hAnsi="Arial"/>
+          <w:b w:val="0"/>
+          <w:i/>
+          <w:sz w:val="19"/>
+        </w:rPr>
+        <w:t>Table.Briefings</w:t>
+      </w:r>
+      <w:r>
+        <w:rPr>
+          <w:rFonts w:ascii="Arial" w:hAnsi="Arial"/>
+          <w:b w:val="0"/>
+          <w:i w:val="0"/>
+          <w:sz w:val="19"/>
+        </w:rPr>
+        <w:t xml:space="preserve"> und </w:t>
+      </w:r>
+      <w:r>
+        <w:rPr>
+          <w:rFonts w:ascii="Arial" w:hAnsi="Arial"/>
+          <w:b w:val="0"/>
+          <w:i/>
+          <w:sz w:val="19"/>
+        </w:rPr>
+        <w:t>A&amp;O Shearman</w:t>
+      </w:r>
+      <w:r>
+        <w:rPr>
+          <w:rFonts w:ascii="Arial" w:hAnsi="Arial"/>
+          <w:b w:val="0"/>
+          <w:i w:val="0"/>
+          <w:sz w:val="19"/>
+        </w:rPr>
+        <w:t xml:space="preserve"> am 7. Mai 2026 auf eine vorläufige Trilog-Einigung verständigt; das Europäische Parlament hat das Verhandlungsergebnis am 16. Juni 2026 förmlich bestätigt. Die für die Steuerdebatte zentralen Stichtage haben sich damit verfestigt: Die Pflichten für Hochrisiko-KI gemäß Anhang III gelten ab 2. Dezember 2027, die in regulierte Produkte eingebetteten Hochrisiko-Systeme gemäß Anhang I ab 2. August 2028; die Kennzeichnungspflichten nach Art. 50 sind bis zum 2. November 2026 verlängert, die Befugnisse der Kommission gegenüber Allzweck-KI-Modellen (GPAI) treten wie ursprünglich vorgesehen am 2. August 2026 in Kraft. Die förmliche Annahme durch den Rat und die Veröffentlichung im Amtsblatt der Europäischen Union werden im Juli 2026 erwartet. Für die steuerpolitische Anknüpfung folgt daraus, dass der AI-Act-Definitionsrahmen für Hochrisiko-KI nicht 2026, sondern erst 2027/2028 belastbar greifbar wird — eine fiskalische Anknüpfung an AI-Act-Kategorien bleibt damit ein mittelfristiges Instrument. Für die Steuerdebatte folgt daraus, dass der zeitliche Vorlauf für KI-Definitionen aus dem AI Act enger als ursprünglich gedacht ist — eine mittelfristige Anknüpfung steuerlicher Tatbestände an AI-Act-Kategorien bleibt möglich, setzt aber voraus, dass die Normenlandschaft nach 2027 verlässlich vorliegt.</w:t>
       </w:r>
     </w:p>
     <w:p>
@@ -2171,7 +2405,43 @@
           <w:i w:val="0"/>
           <w:sz w:val="19"/>
         </w:rPr>
-        <w:t>Die Two-Pillar-Reform der OECD (Organisation für wirtschaftliche Zusammenarbeit und Entwicklung; Pillar 1 zur Umverteilung von Besteuerungsrechten, Pillar 2 zur globalen Mindestbesteuerung von 15 %) schafft einen Rahmen, in dem große digitale Konzerne stärker besteuert werden können — allerdings nicht spezifisch für KI-Leistungen. Im Januar 2026 hat das OECD Inclusive Framework mit dem „Side-by-Side Package" einen verfeinerten Umsetzungsrahmen für Pillar 2 vorgelegt (neue administrative Leitlinien, zusätzliche Safe-Harbor-Regelungen, aktualisierter zentraler Rechtsaktenkatalog zum Stand 1. Dezember 2025); die fortlaufende Arbeitsagenda zeigt, dass das internationale Koordinationsgerüst weiter belastbar ist — bleibt aber für KI-spezifische Anknüpfungspunkte (etwa Abschöpfung inländischer KI-Nutzung) ausbaufähig. Parallel hat das US-Treasury im Januar 2026 angekündigt, dass US-amerikanisch geführte Konzerne von Pillar 2 ausgenommen bleiben — de facto ein Rückzug der USA aus dem bereits ausgehandelten Mindestbesteuerungsregime. Für die europäische Steuerdebatte bedeutet das eine asymmetrische Konstellation: EU-Staaten können Pillar 2 weiterhin durchsetzen, müssen aber mit einer anhaltenden Steuerdifferenz zu US-KI-Anbietern rechnen; das stärkt das Gewicht unilateraler europäischer Maßnahmen (Digital Services Tax, inländische Nutzungsabgaben), ohne sie zu einem Ersatz für die multilaterale Koordination zu machen.</w:t>
+        <w:t xml:space="preserve">Die Two-Pillar-Reform der OECD (Organisation für wirtschaftliche Zusammenarbeit und Entwicklung; Pillar 1 zur Umverteilung von Besteuerungsrechten, Pillar 2 zur globalen Mindestbesteuerung von 15 %) schafft einen Rahmen, in dem große digitale Konzerne stärker besteuert werden können — allerdings nicht spezifisch für KI-Leistungen. Im Januar 2026 hat das OECD Inclusive Framework mit dem „Side-by-Side Package" einen verfeinerten Umsetzungsrahmen für Pillar 2 vorgelegt (neue administrative Leitlinien, zusätzliche Safe-Harbor-Regelungen, aktualisierter zentraler Rechtsaktenkatalog zum Stand 1. Dezember 2025); die fortlaufende Arbeitsagenda zeigt, dass das internationale Koordinationsgerüst weiter belastbar ist — bleibt aber für KI-spezifische Anknüpfungspunkte (etwa Abschöpfung inländischer KI-Nutzung) ausbaufähig. Am 30. Juni 2026 läuft für kalenderjahrgebundene Steuerpflichtige zugleich die erste </w:t>
+      </w:r>
+      <w:r>
+        <w:rPr>
+          <w:rFonts w:ascii="Arial" w:hAnsi="Arial"/>
+          <w:b w:val="0"/>
+          <w:i/>
+          <w:sz w:val="19"/>
+        </w:rPr>
+        <w:t>GloBE-Information-Return</w:t>
+      </w:r>
+      <w:r>
+        <w:rPr>
+          <w:rFonts w:ascii="Arial" w:hAnsi="Arial"/>
+          <w:b w:val="0"/>
+          <w:i w:val="0"/>
+          <w:sz w:val="19"/>
+        </w:rPr>
+        <w:t xml:space="preserve">-Frist (GIR) aus — ein operativer Meilenstein, der die Umsetzungsphase des globalen Mindeststeuerregimes formal beginnen lässt; die OECD hat den Pillar-2-Rahmen am 18. Mai 2026 um eine </w:t>
+      </w:r>
+      <w:r>
+        <w:rPr>
+          <w:rFonts w:ascii="Arial" w:hAnsi="Arial"/>
+          <w:b w:val="0"/>
+          <w:i/>
+          <w:sz w:val="19"/>
+        </w:rPr>
+        <w:t>Common Understanding</w:t>
+      </w:r>
+      <w:r>
+        <w:rPr>
+          <w:rFonts w:ascii="Arial" w:hAnsi="Arial"/>
+          <w:b w:val="0"/>
+          <w:i w:val="0"/>
+          <w:sz w:val="19"/>
+        </w:rPr>
+        <w:t xml:space="preserve"> zu Verspätungs- und Durchsetzungsfragen für ab 2024 implementierende Jurisdiktionen ergänzt. Parallel hat das US-Treasury im Januar 2026 angekündigt, dass US-amerikanisch geführte Konzerne von Pillar 2 ausgenommen bleiben — de facto ein Rückzug der USA aus dem bereits ausgehandelten Mindestbesteuerungsregime. Für die europäische Steuerdebatte bedeutet das eine asymmetrische Konstellation: EU-Staaten können Pillar 2 weiterhin durchsetzen, müssen aber mit einer anhaltenden Steuerdifferenz zu US-KI-Anbietern rechnen; das stärkt das Gewicht unilateraler europäischer Maßnahmen (Digital Services Tax, inländische Nutzungsabgaben), ohne sie zu einem Ersatz für die multilaterale Koordination zu machen.</w:t>
       </w:r>
     </w:p>
     <w:p>
@@ -2264,7 +2534,97 @@
           <w:i w:val="0"/>
           <w:sz w:val="19"/>
         </w:rPr>
-        <w:t xml:space="preserve"> (S. 4214, 119. Kongress) eingebracht, der ein bundesweites Moratorium für neue und aufgerüstete KI-Rechenzentren oberhalb definierter Stromschwellen vorsieht, bis der Gesetzgeber Mindeststandards in den Bereichen Umwelt, Energie, Arbeit und Bürgerrechte verabschiedet; der Gesetzentwurf formuliert ausdrücklich, die „wirtschaftlichen Gewinne aus künstlicher Intelligenz und Robotik" sollten „Beschäftigten, nicht nur wohlhabenden Big-Tech-Eigentümern" zugutekommen. Am 16. April 2026 hat Sanders die Linie mit einem Namensbeitrag („Artificial intelligence is coming for the working class. We must fight back.") erneuert und die HELP-Anhörung genutzt, um für Robotersteuer und Moratorium zu werben. Die Aussicht auf Annahme des Entwurfs in einem republikanisch geführten Kongress gilt als gering; als Signalgebung ist er jedoch der bislang konkreteste politische Vorstoß auf US-Bundesebene.</w:t>
+        <w:t xml:space="preserve"> (S. 4214, 119. Kongress) eingebracht, der ein bundesweites Moratorium für neue und aufgerüstete KI-Rechenzentren oberhalb definierter Stromschwellen vorsieht, bis der Gesetzgeber Mindeststandards in den Bereichen Umwelt, Energie, Arbeit und Bürgerrechte verabschiedet; der Gesetzentwurf formuliert ausdrücklich, die „wirtschaftlichen Gewinne aus künstlicher Intelligenz und Robotik" sollten „Beschäftigten, nicht nur wohlhabenden Big-Tech-Eigentümern" zugutekommen. Am 16. April 2026 hat Sanders die Linie mit einem Namensbeitrag („Artificial intelligence is coming for the working class. We must fight back.") erneuert und die HELP-Anhörung genutzt, um für Robotersteuer und Moratorium zu werben. Am 3. Juni 2026 hat Sanders den Vorstoß zu einem konkreten Gesetzesentwurf zugespitzt und den </w:t>
+      </w:r>
+      <w:r>
+        <w:rPr>
+          <w:rFonts w:ascii="Arial" w:hAnsi="Arial"/>
+          <w:b w:val="0"/>
+          <w:i/>
+          <w:sz w:val="19"/>
+        </w:rPr>
+        <w:t>American AI Sovereign Wealth Fund Act</w:t>
+      </w:r>
+      <w:r>
+        <w:rPr>
+          <w:rFonts w:ascii="Arial" w:hAnsi="Arial"/>
+          <w:b w:val="0"/>
+          <w:i w:val="0"/>
+          <w:sz w:val="19"/>
+        </w:rPr>
+        <w:t xml:space="preserve"> eingebracht: Vorgesehen ist eine einmalige Abgabe in Höhe von 50 % des Marktwertes auf Eigenkapital von Unternehmen, die in „systemically important AI activity" tätig sind und im Steuerjahr mehr als 200 Millionen US-Dollar Bruttoeinnahmen aus KI-Diensten erzielen; die Steuer wird </w:t>
+      </w:r>
+      <w:r>
+        <w:rPr>
+          <w:rFonts w:ascii="Arial" w:hAnsi="Arial"/>
+          <w:b w:val="0"/>
+          <w:i/>
+          <w:sz w:val="19"/>
+        </w:rPr>
+        <w:t>in Aktien</w:t>
+      </w:r>
+      <w:r>
+        <w:rPr>
+          <w:rFonts w:ascii="Arial" w:hAnsi="Arial"/>
+          <w:b w:val="0"/>
+          <w:i w:val="0"/>
+          <w:sz w:val="19"/>
+        </w:rPr>
+        <w:t xml:space="preserve"> entrichtet und in einen öffentlichen Fonds (</w:t>
+      </w:r>
+      <w:r>
+        <w:rPr>
+          <w:rFonts w:ascii="Arial" w:hAnsi="Arial"/>
+          <w:b w:val="0"/>
+          <w:i/>
+          <w:sz w:val="19"/>
+        </w:rPr>
+        <w:t>American AI Sovereign Wealth Fund</w:t>
+      </w:r>
+      <w:r>
+        <w:rPr>
+          <w:rFonts w:ascii="Arial" w:hAnsi="Arial"/>
+          <w:b w:val="0"/>
+          <w:i w:val="0"/>
+          <w:sz w:val="19"/>
+        </w:rPr>
+        <w:t xml:space="preserve">) überführt, der den Bürgerinnen und Bürgern Stimmrechte, Aufsichtsratsvertretung und perspektivisch eine periodische Dividende zugesteht. Der Tatbestand der „AI trade or business" ist im Entwurf weit gefasst und umfasst KI-Rechenzentren, KI-Computing-Infrastruktur, KI-Dienstleistungen und fortgeschrittene Robotik. Senatorin Elizabeth Warren hat parallel — wenige Tage zuvor in einem </w:t>
+      </w:r>
+      <w:r>
+        <w:rPr>
+          <w:rFonts w:ascii="Arial" w:hAnsi="Arial"/>
+          <w:b w:val="0"/>
+          <w:i/>
+          <w:sz w:val="19"/>
+        </w:rPr>
+        <w:t>Time</w:t>
+      </w:r>
+      <w:r>
+        <w:rPr>
+          <w:rFonts w:ascii="Arial" w:hAnsi="Arial"/>
+          <w:b w:val="0"/>
+          <w:i w:val="0"/>
+          <w:sz w:val="19"/>
+        </w:rPr>
+        <w:t xml:space="preserve">-Beitrag — eine eigene KI-Abgabe vorgeschlagen, deren Aufkommen verdrängte Beschäftigte stützen soll. Die Aussicht auf Annahme der Entwürfe in einem republikanisch geführten Kongress gilt als gering; als Signalgebung ist die Sanders-Linie jedoch von einer Verbrauchsteuer auf automatisierende Großunternehmen (Sanders-Report Oktober 2025) auf eine </w:t>
+      </w:r>
+      <w:r>
+        <w:rPr>
+          <w:rFonts w:ascii="Arial" w:hAnsi="Arial"/>
+          <w:b w:val="0"/>
+          <w:i/>
+          <w:sz w:val="19"/>
+        </w:rPr>
+        <w:t>Eigenkapital-Abschöpfung in einen Staatsfonds nach norwegischem Vorbild</w:t>
+      </w:r>
+      <w:r>
+        <w:rPr>
+          <w:rFonts w:ascii="Arial" w:hAnsi="Arial"/>
+          <w:b w:val="0"/>
+          <w:i w:val="0"/>
+          <w:sz w:val="19"/>
+        </w:rPr>
+        <w:t xml:space="preserve"> fortgeschrieben — ein Pfad, der konzeptionell deutlich näher an dem in § 8.6 beschriebenen Teilhabefonds und an dem in § 5.4 referierten OpenAI-Vorschlag zu einem öffentlichen Wohlstandsfonds liegt, als der ursprüngliche Robotersteuer-Vorschlag erwarten ließ.</w:t>
       </w:r>
     </w:p>
     <w:p>
@@ -2889,6 +3249,245 @@
           <w:sz w:val="19"/>
         </w:rPr>
         <w:t>Das Papier ist bemerkenswert, weil hier ein führender KI-Anbieter selbst die steuerliche Abschöpfung seines eigenen Geschäftsmodells zur Diskussion stellt. Es ist aber auch als Agenda-Setting-Instrument zu lesen: Eine Million Dollar API-Credits für Forschung an „diesen und verwandten politischen Ideen" schafft Pfadabhängigkeiten in der akademischen Debatte. Kritiker haben das Papier als „Regulatory Nihilism" bezeichnet, eine Tech-Policy-Press-Analyse vom 6. April 2026 sprach zudem von einem „Policymercial" — einer Werbebotschaft im Politikgewand —, weil das Papier großzügig klinge, aber keine konkreten Selbstverpflichtungen des Absenders enthalte; die Robotersteuer zahlten „Unternehmen, die Arbeit automatisieren", nicht spezifisch OpenAI selbst. Europa kommt in dem Papier weder als Partner noch als Modell vor; der Entwurf konzentriert sich explizit auf die USA.</w:t>
+      </w:r>
+    </w:p>
+    <w:p>
+      <w:pPr>
+        <w:jc w:val="both"/>
+      </w:pPr>
+      <w:r>
+        <w:rPr>
+          <w:rFonts w:ascii="Arial" w:hAnsi="Arial"/>
+          <w:b/>
+          <w:i w:val="0"/>
+          <w:sz w:val="19"/>
+        </w:rPr>
+        <w:t>Anthropic Economic Policy Framework (10. Juni 2026):</w:t>
+      </w:r>
+      <w:r>
+        <w:rPr>
+          <w:rFonts w:ascii="Arial" w:hAnsi="Arial"/>
+          <w:b w:val="0"/>
+          <w:i w:val="0"/>
+          <w:sz w:val="19"/>
+        </w:rPr>
+        <w:t xml:space="preserve"> Mit dem </w:t>
+      </w:r>
+      <w:r>
+        <w:rPr>
+          <w:rFonts w:ascii="Arial" w:hAnsi="Arial"/>
+          <w:b w:val="0"/>
+          <w:i/>
+          <w:sz w:val="19"/>
+        </w:rPr>
+        <w:t>Economic Policy Framework</w:t>
+      </w:r>
+      <w:r>
+        <w:rPr>
+          <w:rFonts w:ascii="Arial" w:hAnsi="Arial"/>
+          <w:b w:val="0"/>
+          <w:i w:val="0"/>
+          <w:sz w:val="19"/>
+        </w:rPr>
+        <w:t xml:space="preserve"> hat Anthropic erstmals eine eigene, vom Konkurrenten OpenAI abgrenzbare Politiklinie zur Frage der KI-induzierten Arbeitsmarktverschiebungen vorgelegt. Der Rahmen ist in drei Reaktionsstufen gegliedert, die jeweils an einer beobachteten US-Arbeitslosenquote ansetzen: In </w:t>
+      </w:r>
+      <w:r>
+        <w:rPr>
+          <w:rFonts w:ascii="Arial" w:hAnsi="Arial"/>
+          <w:b w:val="0"/>
+          <w:i/>
+          <w:sz w:val="19"/>
+        </w:rPr>
+        <w:t>Stufe 1</w:t>
+      </w:r>
+      <w:r>
+        <w:rPr>
+          <w:rFonts w:ascii="Arial" w:hAnsi="Arial"/>
+          <w:b w:val="0"/>
+          <w:i w:val="0"/>
+          <w:sz w:val="19"/>
+        </w:rPr>
+        <w:t xml:space="preserve"> (rund 5 % Arbeitslosenquote) wären </w:t>
+      </w:r>
+      <w:r>
+        <w:rPr>
+          <w:rFonts w:ascii="Arial" w:hAnsi="Arial"/>
+          <w:b w:val="0"/>
+          <w:i/>
+          <w:sz w:val="19"/>
+        </w:rPr>
+        <w:t>Universal Capital Accounts</w:t>
+      </w:r>
+      <w:r>
+        <w:rPr>
+          <w:rFonts w:ascii="Arial" w:hAnsi="Arial"/>
+          <w:b w:val="0"/>
+          <w:i w:val="0"/>
+          <w:sz w:val="19"/>
+        </w:rPr>
+        <w:t xml:space="preserve">, die mit Eigenkapital an KI-Unternehmen ausgestattet werden könnten, sowie Weiterbildungs-Gutscheine, eine Reform berufsrechtlicher Lizenzschranken und eine Lohnversicherung vorgesehen; in </w:t>
+      </w:r>
+      <w:r>
+        <w:rPr>
+          <w:rFonts w:ascii="Arial" w:hAnsi="Arial"/>
+          <w:b w:val="0"/>
+          <w:i/>
+          <w:sz w:val="19"/>
+        </w:rPr>
+        <w:t>Stufe 2</w:t>
+      </w:r>
+      <w:r>
+        <w:rPr>
+          <w:rFonts w:ascii="Arial" w:hAnsi="Arial"/>
+          <w:b w:val="0"/>
+          <w:i w:val="0"/>
+          <w:sz w:val="19"/>
+        </w:rPr>
+        <w:t xml:space="preserve"> (rund 10 % Arbeitslosenquote) würden automatische Verlängerungen der Arbeitslosenversicherung und eine Grundbedürfnishilfe hinzutreten; in </w:t>
+      </w:r>
+      <w:r>
+        <w:rPr>
+          <w:rFonts w:ascii="Arial" w:hAnsi="Arial"/>
+          <w:b w:val="0"/>
+          <w:i/>
+          <w:sz w:val="19"/>
+        </w:rPr>
+        <w:t>Stufe 3</w:t>
+      </w:r>
+      <w:r>
+        <w:rPr>
+          <w:rFonts w:ascii="Arial" w:hAnsi="Arial"/>
+          <w:b w:val="0"/>
+          <w:i w:val="0"/>
+          <w:sz w:val="19"/>
+        </w:rPr>
+        <w:t xml:space="preserve"> (beispielloses Niveau struktureller Arbeitslosigkeit) sollten ein einkommensseitiger Mindestschutz, </w:t>
+      </w:r>
+      <w:r>
+        <w:rPr>
+          <w:rFonts w:ascii="Arial" w:hAnsi="Arial"/>
+          <w:b w:val="0"/>
+          <w:i/>
+          <w:sz w:val="19"/>
+        </w:rPr>
+        <w:t>Abgaben auf KI-Nutzung</w:t>
+      </w:r>
+      <w:r>
+        <w:rPr>
+          <w:rFonts w:ascii="Arial" w:hAnsi="Arial"/>
+          <w:b w:val="0"/>
+          <w:i w:val="0"/>
+          <w:sz w:val="19"/>
+        </w:rPr>
+        <w:t xml:space="preserve"> sowie Modelle wie ein bedingungsloses Grundeinkommen und ein </w:t>
+      </w:r>
+      <w:r>
+        <w:rPr>
+          <w:rFonts w:ascii="Arial" w:hAnsi="Arial"/>
+          <w:b w:val="0"/>
+          <w:i/>
+          <w:sz w:val="19"/>
+        </w:rPr>
+        <w:t>AI Sovereign Wealth Fund</w:t>
+      </w:r>
+      <w:r>
+        <w:rPr>
+          <w:rFonts w:ascii="Arial" w:hAnsi="Arial"/>
+          <w:b w:val="0"/>
+          <w:i w:val="0"/>
+          <w:sz w:val="19"/>
+        </w:rPr>
+        <w:t xml:space="preserve"> in Betracht gezogen werden. Vorgelagert nennt der Rahmen drei strukturelle Voraussetzungen: eine laufende Messung der KI-Adoption und ihrer Beschäftigungswirkungen, eine eigene Analyseeinheit in der US-Bundesverwaltung sowie eine modernisierte Auszahlungs-Infrastruktur für Sozialleistungen. Flankierend kündigt Anthropic finanzielle Eigenleistungen von insgesamt rund 350 Millionen US-Dollar an — 200 Millionen US-Dollar für einen </w:t>
+      </w:r>
+      <w:r>
+        <w:rPr>
+          <w:rFonts w:ascii="Arial" w:hAnsi="Arial"/>
+          <w:b w:val="0"/>
+          <w:i/>
+          <w:sz w:val="19"/>
+        </w:rPr>
+        <w:t>Economic Futures Research Fund</w:t>
+      </w:r>
+      <w:r>
+        <w:rPr>
+          <w:rFonts w:ascii="Arial" w:hAnsi="Arial"/>
+          <w:b w:val="0"/>
+          <w:i w:val="0"/>
+          <w:sz w:val="19"/>
+        </w:rPr>
+        <w:t xml:space="preserve"> und 150 Millionen US-Dollar für Weiterbildungsprogramme; Mitgründer Chris Olah ordnet dies öffentlich als „moralische Verpflichtung historischen Ausmaßes" für den Fall einer großmaßstäblichen Verdrängung ein, während CEO Dario Amodei den Rahmen als „Konzept eines Plans" gegen den von ihm bereits 2025 prognostizierten Fall einer „White-Collar-Rezession" einordnet. </w:t>
+      </w:r>
+      <w:r>
+        <w:rPr>
+          <w:rFonts w:ascii="Arial" w:hAnsi="Arial"/>
+          <w:b w:val="0"/>
+          <w:i/>
+          <w:sz w:val="19"/>
+        </w:rPr>
+        <w:t>Fortune</w:t>
+      </w:r>
+      <w:r>
+        <w:rPr>
+          <w:rFonts w:ascii="Arial" w:hAnsi="Arial"/>
+          <w:b w:val="0"/>
+          <w:i w:val="0"/>
+          <w:sz w:val="19"/>
+        </w:rPr>
+        <w:t xml:space="preserve"> hat den Vorgang als ersten Fall referiert, in dem ein führender KI-Anbieter eine </w:t>
+      </w:r>
+      <w:r>
+        <w:rPr>
+          <w:rFonts w:ascii="Arial" w:hAnsi="Arial"/>
+          <w:b w:val="0"/>
+          <w:i/>
+          <w:sz w:val="19"/>
+        </w:rPr>
+        <w:t>Selbstbesteuerung in einen öffentlichen Fonds</w:t>
+      </w:r>
+      <w:r>
+        <w:rPr>
+          <w:rFonts w:ascii="Arial" w:hAnsi="Arial"/>
+          <w:b w:val="0"/>
+          <w:i w:val="0"/>
+          <w:sz w:val="19"/>
+        </w:rPr>
+        <w:t xml:space="preserve"> explizit als Möglichkeit benennt, um die durch sein Geschäftsmodell ausgelöste Verdrängung zu finanzieren. Für die hier geführte Steuerdebatte ist der Rahmen aus mehreren Gründen relevant: Erstens markiert er — gemeinsam mit dem Sanders-Entwurf vom 3. Juni 2026 und dem OpenAI-Papier vom 6. April 2026 — eine Konvergenz auf das Modell </w:t>
+      </w:r>
+      <w:r>
+        <w:rPr>
+          <w:rFonts w:ascii="Arial" w:hAnsi="Arial"/>
+          <w:b w:val="0"/>
+          <w:i/>
+          <w:sz w:val="19"/>
+        </w:rPr>
+        <w:t>Eigenkapital-Beteiligung in einem öffentlichen Fonds</w:t>
+      </w:r>
+      <w:r>
+        <w:rPr>
+          <w:rFonts w:ascii="Arial" w:hAnsi="Arial"/>
+          <w:b w:val="0"/>
+          <w:i w:val="0"/>
+          <w:sz w:val="19"/>
+        </w:rPr>
+        <w:t xml:space="preserve">, das in Kapitel 8 (Teilhabefonds) eigenständig und unabhängig vorgeschlagen wird; zweitens koppelt er die Auslösung steuerlicher Reaktionen an einen beobachtbaren makroökonomischen Indikator (Arbeitslosenquote) und nicht an eine Einzelfall-Kausalitätsmessung (vgl. § 9.1) — eine Konstruktionslogik, die die in § 2.1 als Typ 5 typisierte zielgerichtete Ersatzabgabe umgeht; und drittens benennt er erstmals von Anbieterseite eine </w:t>
+      </w:r>
+      <w:r>
+        <w:rPr>
+          <w:rFonts w:ascii="Arial" w:hAnsi="Arial"/>
+          <w:b w:val="0"/>
+          <w:i/>
+          <w:sz w:val="19"/>
+        </w:rPr>
+        <w:t>Abgabe auf KI-Nutzung</w:t>
+      </w:r>
+      <w:r>
+        <w:rPr>
+          <w:rFonts w:ascii="Arial" w:hAnsi="Arial"/>
+          <w:b w:val="0"/>
+          <w:i w:val="0"/>
+          <w:sz w:val="19"/>
+        </w:rPr>
+        <w:t xml:space="preserve"> (Stufe 3) als Bestandteil eines geordneten politischen Reaktionspfads — eine Position, die auf der internationalen Diskursebene bis dahin überwiegend von akademischer Seite (vgl. Falk &amp; Tsoukalas 2026, § 3.3) und politischer Seite (Sanders, Warren) formuliert worden war.</w:t>
       </w:r>
     </w:p>
     <w:p>
@@ -3632,7 +4231,7 @@
           <w:i w:val="0"/>
           <w:sz w:val="19"/>
         </w:rPr>
-        <w:t xml:space="preserve"> beschlossen; im Verlauf der Ressortabstimmung wurde das Sparvolumen je nach Berichterstattung mit rund 16,3 Milliarden Euro (Frühberichterstattung) bzw. rund 19,6 Milliarden Euro (BMG-Tabellen Stand Anfang Mai 2026, gegliedert in 4,9 Milliarden einnahmen­seitige und rund 15 Milliarden ausgaben­seitige Komponenten) für 2027 angegeben; bis 2030 sieht das BMG eine Steigerung des Konsolidierungseffekts auf rund 42,8 Milliarden Euro vor. Die parlamentarische Behandlung soll laut BMG-Zeitplan vor der Sommerpause 2026 abgeschlossen werden — der Kabinettentwurf wird dem Bundesrat im ersten Durchgang am 8. Mai 2026 zugeleitet (1065. Sitzung; insgesamt 79 Tagesordnungspunkte, darunter eine flankierende Thüringer Entschließung zum Bürokratieabbau in der gesetzlichen Krankenversicherung); die erste Bundestagslesung ist im weiteren Verlauf des Mai/Juni 2026 vorgesehen. Die Reform belastet Krankenhäuser, pharmazeutische Industrie, Apotheken, Ärzteschaft, Versicherte, Arbeitgeber und Krankenkassen gemeinsam; sie folgt dem Leitsatz „Ausgaben an Einnahmen koppeln" und greift damit fiskalisch genau die Logik auf, die § 5.1 in der Beitrags­seite spiegelbildlich zu erweitern vorschlägt. Auch wenn die GKV-Reform primär ausgaben- und strukturseitig ansetzt, bestätigt sie den in § 5.1 angerissenen finanzpolitischen Befund: Die lohnbasierten Sicherungszweige geraten gleichzeitig durch demografischen Druck und durch die in § 1.1 dokumentierten KI-induzierten Beschäftigungsverschiebungen unter Spannung — eine Verbreiterung der Bemessungsgrundlage gewinnt damit zusätzlich an Plausibilität.</w:t>
+        <w:t xml:space="preserve"> beschlossen; im Verlauf der Ressortabstimmung wurde das Sparvolumen je nach Berichterstattung mit rund 16,3 Milliarden Euro (Frühberichterstattung) bzw. rund 19,6 Milliarden Euro (BMG-Tabellen Stand Anfang Mai 2026, gegliedert in 4,9 Milliarden einnahmen­seitige und rund 15 Milliarden ausgaben­seitige Komponenten) für 2027 angegeben; bis 2030 sieht das BMG eine Steigerung des Konsolidierungseffekts auf rund 42,8 Milliarden Euro vor. Die parlamentarische Behandlung soll laut BMG-Zeitplan vor der Sommerpause 2026 abgeschlossen werden — der Kabinettentwurf wird dem Bundesrat im ersten Durchgang am 8. Mai 2026 zugeleitet (1065. Sitzung; insgesamt 79 Tagesordnungspunkte, darunter eine flankierende Thüringer Entschließung zum Bürokratieabbau in der gesetzlichen Krankenversicherung); die erste Bundestagslesung ist im weiteren Verlauf des Mai/Juni 2026 vorgesehen. Tatsächlich hat der Deutsche Bundestag den Regierungsentwurf am 12. Juni 2026 in erster Lesung beraten — die Opposition kritisierte die Vorlage als unausgewogen und unzureichend, um weitere Beitragssatzanhebungen zu verhindern. Der Gesundheitsausschuss hat am 22. Juni 2026 in einer zweieinhalbstündigen öffentlichen Anhörung mehr als 90 Fachverbände und Einzelsachverständige angehört; Ziel der Bundesregierung bleibt der Abschluss von Bundestag und Bundesrat vor der Sommerpause 2026. Die Anhörung bestätigt die strukturelle Größenordnung der Finanzierungslücke — bis 2030 würde die GKV ohne Eingriff einen Fehlbetrag in einer Größenordnung von rund 40 Milliarden Euro aufweisen; dieser Wert geht in alle Reform-Szenarien als Referenz ein und stützt den in § 5.1 entwickelten Befund einer strukturellen Erosion der lohnbasierten Finanzierung. Die Reform belastet Krankenhäuser, pharmazeutische Industrie, Apotheken, Ärzteschaft, Versicherte, Arbeitgeber und Krankenkassen gemeinsam; sie folgt dem Leitsatz „Ausgaben an Einnahmen koppeln" und greift damit fiskalisch genau die Logik auf, die § 5.1 in der Beitrags­seite spiegelbildlich zu erweitern vorschlägt. Auch wenn die GKV-Reform primär ausgaben- und strukturseitig ansetzt, bestätigt sie den in § 5.1 angerissenen finanzpolitischen Befund: Die lohnbasierten Sicherungszweige geraten gleichzeitig durch demografischen Druck und durch die in § 1.1 dokumentierten KI-induzierten Beschäftigungsverschiebungen unter Spannung — eine Verbreiterung der Bemessungsgrundlage gewinnt damit zusätzlich an Plausibilität.</w:t>
       </w:r>
     </w:p>
     <w:p>
@@ -8234,6 +8833,184 @@
           <w:i w:val="0"/>
           <w:sz w:val="19"/>
         </w:rPr>
+        <w:t xml:space="preserve">US Senate / Thomson Reuters Tax / Fortune / Reason. (3. Juni 2026). </w:t>
+      </w:r>
+      <w:r>
+        <w:rPr>
+          <w:rFonts w:ascii="Arial" w:hAnsi="Arial"/>
+          <w:b w:val="0"/>
+          <w:i/>
+          <w:sz w:val="19"/>
+        </w:rPr>
+        <w:t>Sanders calls for tax on „systemically important AI activity," payable in equity / Bernie Sanders wants Americans to own a piece of AI / Bernie Sanders' AI wealth fund bill shows that he doesn't understand AI or wealth.</w:t>
+      </w:r>
+      <w:r>
+        <w:rPr>
+          <w:rFonts w:ascii="Arial" w:hAnsi="Arial"/>
+          <w:b w:val="0"/>
+          <w:i w:val="0"/>
+          <w:sz w:val="19"/>
+        </w:rPr>
+        <w:t xml:space="preserve"> Einbringung des </w:t>
+      </w:r>
+      <w:r>
+        <w:rPr>
+          <w:rFonts w:ascii="Arial" w:hAnsi="Arial"/>
+          <w:b w:val="0"/>
+          <w:i/>
+          <w:sz w:val="19"/>
+        </w:rPr>
+        <w:t>American AI Sovereign Wealth Fund Act</w:t>
+      </w:r>
+      <w:r>
+        <w:rPr>
+          <w:rFonts w:ascii="Arial" w:hAnsi="Arial"/>
+          <w:b w:val="0"/>
+          <w:i w:val="0"/>
+          <w:sz w:val="19"/>
+        </w:rPr>
+        <w:t xml:space="preserve"> durch Bernie Sanders: einmalige Eigenkapital-Abgabe von 50 % auf KI-Konzerne mit &gt; 200 Mio. USD Bruttoeinnahmen aus AI-Trades or Businesses (Rechenzentren, Computing-Infrastruktur, KI-Dienste, fortgeschrittene Robotik); Aktien fließen in einen öffentlichen Fonds mit Stimmrecht, Aufsichtsratsvertretung und Bürgerdividende. Parallel Time-Beitrag von Senatorin Elizabeth Warren mit eigener KI-Abgabe. https://tax.thomsonreuters.com/news/sanders-calls-for-tax-on-systemically-important-ai-activity-payable-in-equity/ | https://fortune.com/2026/06/03/bernie-sanders-ai-ownership-sovereign-wealth-fund-electrification/ | https://reason.com/2026/06/02/bernie-sanders-ai-wealth-fund-bill-shows-that-he-doesnt-understand-ai-or-wealth/</w:t>
+      </w:r>
+    </w:p>
+    <w:p>
+      <w:pPr>
+        <w:jc w:val="both"/>
+      </w:pPr>
+      <w:r>
+        <w:rPr>
+          <w:rFonts w:ascii="Arial" w:hAnsi="Arial"/>
+          <w:b w:val="0"/>
+          <w:i w:val="0"/>
+          <w:sz w:val="19"/>
+        </w:rPr>
+        <w:t xml:space="preserve">Anthropic / Fortune / Gizmodo / HR Dive / Boston25 News. (10. Juni 2026). </w:t>
+      </w:r>
+      <w:r>
+        <w:rPr>
+          <w:rFonts w:ascii="Arial" w:hAnsi="Arial"/>
+          <w:b w:val="0"/>
+          <w:i/>
+          <w:sz w:val="19"/>
+        </w:rPr>
+        <w:t>Anthropic's Economic Policy Framework — Policy on the AI Exponential / Anthropic just proposed taxing itself to pay for the jobs its AI destroys / What Happens If AI Causes 25 % Unemployment? Anthropic Has a Concept of a Plan / Anthropic pledges $200 million to research AI's economic impact.</w:t>
+      </w:r>
+      <w:r>
+        <w:rPr>
+          <w:rFonts w:ascii="Arial" w:hAnsi="Arial"/>
+          <w:b w:val="0"/>
+          <w:i w:val="0"/>
+          <w:sz w:val="19"/>
+        </w:rPr>
+        <w:t xml:space="preserve"> Dreistufige Reaktionsmatrix entlang der US-Arbeitslosenquote (5 % — Universal Capital Accounts mit AI-Equity, Workforce-Training-Grants, Lizenzschranken-Reform, Lohnversicherung; 10 % — automatische UI-Extensions, Grundbedürfnishilfe; beispielloses Niveau — Common Income Floor, AI-Use-Levies, UBI, AI Sovereign Wealth Fund) auf drei Voraussetzungen aufgesetzt (AI-Adoption-Messung, dedizierte Analyseeinheit, modernisierte Auszahlungs-Infrastruktur); Eigenleistung 350 Mio. USD (200 Mio. Economic Futures Research Fund + 150 Mio. Weiterbildung). https://www.anthropic.com/policy-on-the-ai-exponential/epf | https://www-cdn.anthropic.com/files/4zrzovbb/website/9ea607a5dd67c168093829b701f3a0a6d21156d5.pdf | https://fortune.com/2026/06/11/anthropic-dario-amodei-ai-jobs-tax-displacement-fund/ | https://gizmodo.com/what-happens-if-ai-causes-25-unemployment-anthropic-has-a-concept-of-a-plan-2000770289 | https://www.hrdive.com/news/anthropic-ai-influence-over-the-labor-market-jobs/814670/ | https://www.boston25news.com/news/business/anthropic-pledges/3GJK226Q4U5BVK6DIHKTY6VP5A/</w:t>
+      </w:r>
+    </w:p>
+    <w:p>
+      <w:pPr>
+        <w:jc w:val="both"/>
+      </w:pPr>
+      <w:r>
+        <w:rPr>
+          <w:rFonts w:ascii="Arial" w:hAnsi="Arial"/>
+          <w:b w:val="0"/>
+          <w:i w:val="0"/>
+          <w:sz w:val="19"/>
+        </w:rPr>
+        <w:t xml:space="preserve">Europäisches Parlament / Rat / Bird &amp; Bird / A&amp;O Shearman / Table.Briefings. (7. Mai 2026 / 16. Juni 2026). </w:t>
+      </w:r>
+      <w:r>
+        <w:rPr>
+          <w:rFonts w:ascii="Arial" w:hAnsi="Arial"/>
+          <w:b w:val="0"/>
+          <w:i/>
+          <w:sz w:val="19"/>
+        </w:rPr>
+        <w:t>Digital Omnibus on AI — Trilog-Einigung 7. Mai 2026; förmliche Bestätigung im Europäischen Parlament am 16. Juni 2026.</w:t>
+      </w:r>
+      <w:r>
+        <w:rPr>
+          <w:rFonts w:ascii="Arial" w:hAnsi="Arial"/>
+          <w:b w:val="0"/>
+          <w:i w:val="0"/>
+          <w:sz w:val="19"/>
+        </w:rPr>
+        <w:t xml:space="preserve"> Verlängerung der Hochrisiko-Pflichten gemäß Anhang I bis 2. August 2028, Anhang III bis 2. Dezember 2027; Art. 50-Kennzeichnungspflichten bis 2. November 2026 verlängert; GPAI-Befugnisse der Kommission ab 2. August 2026; Rats-Annahme und Veröffentlichung im EU-Amtsblatt im Juli 2026 erwartet. https://www.twobirds.com/en/insights/2026/digital-omnibus-on-ai-trilogue-stalls-ahead-of-the-ai-act-deadline | https://table.media/en/europe/news/ai-omnibus-parliament-approves-trilogue-outcome | https://www.aoshearman.com/en/insights/ao-shearman-on-data/digital-omnibus-on-ai-the-trilogue-deal-is-done-what-made-it-what-didnt-and-what-changed</w:t>
+      </w:r>
+    </w:p>
+    <w:p>
+      <w:pPr>
+        <w:jc w:val="both"/>
+      </w:pPr>
+      <w:r>
+        <w:rPr>
+          <w:rFonts w:ascii="Arial" w:hAnsi="Arial"/>
+          <w:b w:val="0"/>
+          <w:i w:val="0"/>
+          <w:sz w:val="19"/>
+        </w:rPr>
+        <w:t xml:space="preserve">Deutscher Bundestag / Bundesgesundheitsministerium. (12./22. Juni 2026). </w:t>
+      </w:r>
+      <w:r>
+        <w:rPr>
+          <w:rFonts w:ascii="Arial" w:hAnsi="Arial"/>
+          <w:b w:val="0"/>
+          <w:i/>
+          <w:sz w:val="19"/>
+        </w:rPr>
+        <w:t>GKV-Beitragssatzstabilisierungsgesetz — erste Bundestagslesung (12. Juni 2026); öffentliche Anhörung im Gesundheitsausschuss (22. Juni 2026, &gt; 90 Sachverständige); strukturelle GKV-Finanzierungslücke bis 2030 in der Größenordnung von 40 Mrd. EUR bestätigt.</w:t>
+      </w:r>
+      <w:r>
+        <w:rPr>
+          <w:rFonts w:ascii="Arial" w:hAnsi="Arial"/>
+          <w:b w:val="0"/>
+          <w:i w:val="0"/>
+          <w:sz w:val="19"/>
+        </w:rPr>
+        <w:t xml:space="preserve"> https://www.bundestag.de/dokumente/textarchiv/2026/kw24-de-gkv-1181958 | https://www.bundestag.de/ausschuesse/gesundheit/anhoerungen/1184692-1184692</w:t>
+      </w:r>
+    </w:p>
+    <w:p>
+      <w:pPr>
+        <w:jc w:val="both"/>
+      </w:pPr>
+      <w:r>
+        <w:rPr>
+          <w:rFonts w:ascii="Arial" w:hAnsi="Arial"/>
+          <w:b w:val="0"/>
+          <w:i w:val="0"/>
+          <w:sz w:val="19"/>
+        </w:rPr>
+        <w:t xml:space="preserve">OECD Inclusive Framework / EY / Grant Thornton. (18. Mai 2026 / 30. Juni 2026). </w:t>
+      </w:r>
+      <w:r>
+        <w:rPr>
+          <w:rFonts w:ascii="Arial" w:hAnsi="Arial"/>
+          <w:b w:val="0"/>
+          <w:i/>
+          <w:sz w:val="19"/>
+        </w:rPr>
+        <w:t>Pillar Two — Common Understanding on late-filing penalties; erste GloBE Information Return (GIR) für kalenderjahrgebundene Steuerpflichtige fällig am 30. Juni 2026.</w:t>
+      </w:r>
+      <w:r>
+        <w:rPr>
+          <w:rFonts w:ascii="Arial" w:hAnsi="Arial"/>
+          <w:b w:val="0"/>
+          <w:i w:val="0"/>
+          <w:sz w:val="19"/>
+        </w:rPr>
+        <w:t xml:space="preserve"> Operativer Beginn des globalen Mindeststeuerregimes; Konsolidierung des Side-by-Side-Pakets. https://www.oecd.org/en/topics/sub-issues/global-minimum-tax/global-anti-base-erosion-model-rules-pillar-two.html | https://taxnews.ey.com/news/2026-0226-oecd-releases-side-by-side-package-on-pillar-two-global-minimum-tax-detailed-review</w:t>
+      </w:r>
+    </w:p>
+    <w:p>
+      <w:pPr>
+        <w:jc w:val="both"/>
+      </w:pPr>
+      <w:r>
+        <w:rPr>
+          <w:rFonts w:ascii="Arial" w:hAnsi="Arial"/>
+          <w:b w:val="0"/>
+          <w:i w:val="0"/>
+          <w:sz w:val="19"/>
+        </w:rPr>
         <w:t xml:space="preserve">Sanders, B., &amp; Ocasio-Cortez, A. (25. März 2026). </w:t>
       </w:r>
       <w:r>
@@ -10105,6 +10882,70 @@
           <w:i w:val="0"/>
           <w:sz w:val="19"/>
         </w:rPr>
+        <w:t xml:space="preserve">Challenger, Gray &amp; Christmas / Inc. / Tech Jacks Solutions. (4. Juni 2026). </w:t>
+      </w:r>
+      <w:r>
+        <w:rPr>
+          <w:rFonts w:ascii="Arial" w:hAnsi="Arial"/>
+          <w:b w:val="0"/>
+          <w:i/>
+          <w:sz w:val="19"/>
+        </w:rPr>
+        <w:t>Challenger Job Cut Announcement Report — Mai 2026: AI Is Now the Top Self-Reported Layoff Driver in the U.S.</w:t>
+      </w:r>
+      <w:r>
+        <w:rPr>
+          <w:rFonts w:ascii="Arial" w:hAnsi="Arial"/>
+          <w:b w:val="0"/>
+          <w:i w:val="0"/>
+          <w:sz w:val="19"/>
+        </w:rPr>
+        <w:t xml:space="preserve"> Erstmals in der Tracker-Historie ist KI mit 38.579 angekündigten KI-bezogenen US-Stellenstreichungen im Mai 2026 (rund 40 % des Monatsvolumens) der häufigst genannte einzelne Streichungsgrund; KI-bezogen YTD 87.714 — bereits jetzt höher als der Gesamt-2025-KI-Wert (54.836). Großstreichungen im Mai: Oracle (rund 21.000 zwischen März und Juni), Meta (rund 8.000 im Mai), PayPal (rund 4.500 als Teil des 20-%-Programms). https://www.inc.com/moses-jeanfrancois/ai-closings-job-cut-report/91341837 | https://techjacksolutions.com/ai-brief/ai-is-now-the-top-self-reported-layoff-driver-in-the-us-chal/</w:t>
+      </w:r>
+    </w:p>
+    <w:p>
+      <w:pPr>
+        <w:jc w:val="both"/>
+      </w:pPr>
+      <w:r>
+        <w:rPr>
+          <w:rFonts w:ascii="Arial" w:hAnsi="Arial"/>
+          <w:b w:val="0"/>
+          <w:i w:val="0"/>
+          <w:sz w:val="19"/>
+        </w:rPr>
+        <w:t xml:space="preserve">TrueUp / Outsource Accelerator / TechCrunch (22./24. Juni 2026) / Salesforce Ben. (Stand Juni 2026). </w:t>
+      </w:r>
+      <w:r>
+        <w:rPr>
+          <w:rFonts w:ascii="Arial" w:hAnsi="Arial"/>
+          <w:b w:val="0"/>
+          <w:i/>
+          <w:sz w:val="19"/>
+        </w:rPr>
+        <w:t>Tech Layoffs Tracker — Tagesfortschreibung Stand 24. Juni 2026 (185.894 Personen aus 267 Layoff-Ereignissen, rund 893 pro Tag; gesamttech-Tracker 415 Ereignisse / 157.147 Personen) / The running list — major tech layoffs in 2026 where employers cited AI / AI was supposed to kill engineering jobs, but new data suggests they're the most resilient / 100,000 Tech Layoffs Later: Companies Admit to Not Seeing AI Returns.</w:t>
+      </w:r>
+      <w:r>
+        <w:rPr>
+          <w:rFonts w:ascii="Arial" w:hAnsi="Arial"/>
+          <w:b w:val="0"/>
+          <w:i w:val="0"/>
+          <w:sz w:val="19"/>
+        </w:rPr>
+        <w:t xml:space="preserve"> https://www.trueup.io/layoffs | https://news.outsourceaccelerator.com/tech-ai-layoff-wave/ | https://techcrunch.com/2026/06/22/the-running-list-major-tech-layoffs-in-2026-where-employers-cited-ai/ | https://techcrunch.com/2026/06/24/ai-was-supposed-to-kill-engineering-jobs-but-new-data-suggests-theyre-the-most-resilient/ | https://www.salesforceben.com/100000-tech-layoffs-later-companies-admit-to-not-seeing-ai-returns/</w:t>
+      </w:r>
+    </w:p>
+    <w:p>
+      <w:pPr>
+        <w:jc w:val="both"/>
+      </w:pPr>
+      <w:r>
+        <w:rPr>
+          <w:rFonts w:ascii="Arial" w:hAnsi="Arial"/>
+          <w:b w:val="0"/>
+          <w:i w:val="0"/>
+          <w:sz w:val="19"/>
+        </w:rPr>
         <w:t xml:space="preserve">CNBC / Bloomberg / AOL / The Register. (7./8. Mai 2026). </w:t>
       </w:r>
       <w:r>
@@ -10566,7 +11407,7 @@
           <w:i w:val="0"/>
           <w:sz w:val="19"/>
         </w:rPr>
-        <w:t xml:space="preserve"> Dieses Arbeitspapier gibt den Stand Anfang Mai 2026 (Schnitt am 8. Mai 2026 — Lauf 001 vom 8. Mai 2026) wieder. Die Debatte entwickelt sich dynamisch, insbesondere im Zuge der OpenAI-Strategiepapiere und der Eröffnung des OpenAI Workshop in Washington, D.C. im Mai 2026, des Erstdurchgangs des GKV-Beitragssatzstabilisierungsgesetzes in der 1065. Bundesratssitzung am 8. Mai 2026 mit 79 Tagesordnungspunkten (Kabinettsbeschluss 29. April 2026, parlamentarische Behandlung vor der Sommerpause 2026 angekündigt), der laufenden Trilog-Verhandlungen zum Digital Omnibus on AI (zweite Runde 28. April 2026 ohne Einigung; nächste Runde 13. Mai 2026 — Knackpunkt ist nicht die Verschiebung der Hochrisiko-Pflichten, sondern die Konformitätsbewertungs-Architektur für Anhang I; die zypriotische Ratspräsidentschaft strebt einen Abschluss vor Ablauf ihrer Amtszeit am 30. Juni 2026 an, andernfalls übernimmt die irische Präsidentschaft), der am 5. Mai 2026 erfolgten Arraignment-Verhandlung im Altman-Verfahren mit „nicht schuldig"-Plädoyer und angeordneter psychiatrischer Begutachtung, des am 7. Mai 2026 versandten individuellen Microsoft-Buyout-Angebots (Annahmefrist 8. Juni 2026, VRSAR-Unterzeichnung 9.–22. Juni 2026, bis zu fünfjährige Krankenversicherungs-Verlängerung), des am 1. Mai 2026 vom Connecticut-Repräsentantenhaus mit 131 zu 17 Stimmen verabschiedeten </w:t>
+        <w:t xml:space="preserve"> Dieses Arbeitspapier gibt den Stand Ende Juni 2026 (Schnitt am 26. Juni 2026 — Lauf 002 vom 26. Juni 2026) wieder. Die Debatte entwickelt sich dynamisch, insbesondere im Zuge der OpenAI-Strategiepapiere und der Eröffnung des OpenAI Workshop in Washington, D.C. im Mai 2026, des Erstdurchgangs des GKV-Beitragssatzstabilisierungsgesetzes in der 1065. Bundesratssitzung am 8. Mai 2026 mit 79 Tagesordnungspunkten (Kabinettsbeschluss 29. April 2026, parlamentarische Behandlung vor der Sommerpause 2026 angekündigt), der laufenden Trilog-Verhandlungen zum Digital Omnibus on AI (zweite Runde 28. April 2026 ohne Einigung; nächste Runde 13. Mai 2026 — Knackpunkt ist nicht die Verschiebung der Hochrisiko-Pflichten, sondern die Konformitätsbewertungs-Architektur für Anhang I; die zypriotische Ratspräsidentschaft strebt einen Abschluss vor Ablauf ihrer Amtszeit am 30. Juni 2026 an, andernfalls übernimmt die irische Präsidentschaft), der am 5. Mai 2026 erfolgten Arraignment-Verhandlung im Altman-Verfahren mit „nicht schuldig"-Plädoyer und angeordneter psychiatrischer Begutachtung, des am 7. Mai 2026 versandten individuellen Microsoft-Buyout-Angebots (Annahmefrist 8. Juni 2026, VRSAR-Unterzeichnung 9.–22. Juni 2026, bis zu fünfjährige Krankenversicherungs-Verlängerung), des am 1. Mai 2026 vom Connecticut-Repräsentantenhaus mit 131 zu 17 Stimmen verabschiedeten </w:t>
       </w:r>
       <w:r>
         <w:rPr>
@@ -10782,7 +11623,151 @@
           <w:i w:val="0"/>
           <w:sz w:val="19"/>
         </w:rPr>
-        <w:t xml:space="preserve"> gegen eine KI-Steuer (syndiziert in Advisor Perspectives, RealClearPolitics, West Hawaii Today und Las Vegas Sun zwischen dem 2. und 6. Mai 2026), das Innovationsbremse, Wettbewerbsnachteil und Unmöglichkeit der Abgrenzung Verdrängung/Augmentation als Hauptargumente gegen die Sanders/OpenAI-Linie führt und stattdessen Lockerung berufsrechtlicher Lizenzschranken, Reform der Arbeitslosenversicherung, Umschulungs-Steueranreize sowie eine Ausweitung der Earned Income Tax Credit empfiehlt. Eine regelmäßige Aktualisierung ist vorgesehen.</w:t>
+        <w:t xml:space="preserve"> gegen eine KI-Steuer (syndiziert in Advisor Perspectives, RealClearPolitics, West Hawaii Today und Las Vegas Sun zwischen dem 2. und 6. Mai 2026), das Innovationsbremse, Wettbewerbsnachteil und Unmöglichkeit der Abgrenzung Verdrängung/Augmentation als Hauptargumente gegen die Sanders/OpenAI-Linie führt und stattdessen Lockerung berufsrechtlicher Lizenzschranken, Reform der Arbeitslosenversicherung, Umschulungs-Steueranreize sowie eine Ausweitung der Earned Income Tax Credit empfiehlt; der am 4. Juni 2026 veröffentlichte </w:t>
+      </w:r>
+      <w:r>
+        <w:rPr>
+          <w:rFonts w:ascii="Arial" w:hAnsi="Arial"/>
+          <w:b w:val="0"/>
+          <w:i/>
+          <w:sz w:val="19"/>
+        </w:rPr>
+        <w:t>Mai-2026-Job-Cuts-Report</w:t>
+      </w:r>
+      <w:r>
+        <w:rPr>
+          <w:rFonts w:ascii="Arial" w:hAnsi="Arial"/>
+          <w:b w:val="0"/>
+          <w:i w:val="0"/>
+          <w:sz w:val="19"/>
+        </w:rPr>
+        <w:t xml:space="preserve"> von </w:t>
+      </w:r>
+      <w:r>
+        <w:rPr>
+          <w:rFonts w:ascii="Arial" w:hAnsi="Arial"/>
+          <w:b w:val="0"/>
+          <w:i/>
+          <w:sz w:val="19"/>
+        </w:rPr>
+        <w:t>Challenger, Gray &amp; Christmas</w:t>
+      </w:r>
+      <w:r>
+        <w:rPr>
+          <w:rFonts w:ascii="Arial" w:hAnsi="Arial"/>
+          <w:b w:val="0"/>
+          <w:i w:val="0"/>
+          <w:sz w:val="19"/>
+        </w:rPr>
+        <w:t xml:space="preserve"> (KI erstmals häufigst genannter einzelner Streichungsgrund mit 38.579 KI-bezogenen US-Stellenstreichungen im Mai 2026 — rund 40 % des Monatsvolumens; KI-bezogene Streichungen YTD 87.714 — bereits höher als der Gesamt-2025-KI-Wert von 54.836; im Mai u. a. Oracle 21.000 zwischen März und Juni, Meta 8.000, PayPal 4.500); des aktualisierten TrueUp-Tracker-Standes zum 24. Juni 2026 (185.894 Personen aus 267 Layoff-Ereignissen, rund 893 Stellen pro Tag; gesamttech-Tracker 415 Ereignisse / 157.147 Personen); der am 3. Juni 2026 erfolgten Einbringung des Sanders-Entwurfs </w:t>
+      </w:r>
+      <w:r>
+        <w:rPr>
+          <w:rFonts w:ascii="Arial" w:hAnsi="Arial"/>
+          <w:b w:val="0"/>
+          <w:i/>
+          <w:sz w:val="19"/>
+        </w:rPr>
+        <w:t>American AI Sovereign Wealth Fund Act</w:t>
+      </w:r>
+      <w:r>
+        <w:rPr>
+          <w:rFonts w:ascii="Arial" w:hAnsi="Arial"/>
+          <w:b w:val="0"/>
+          <w:i w:val="0"/>
+          <w:sz w:val="19"/>
+        </w:rPr>
+        <w:t xml:space="preserve"> (einmalige 50-%-Eigenkapital-Abgabe auf KI-Konzerne mit &gt; 200 Mio. USD Bruttoeinnahmen aus AI-Trades-or-Businesses; Übergang der Aktien in einen öffentlichen Fonds mit Bürgerstimmrecht und Dividende) und der parallel von Senatorin Elizabeth Warren publizierten KI-Abgabe; des am 10. Juni 2026 vorgelegten </w:t>
+      </w:r>
+      <w:r>
+        <w:rPr>
+          <w:rFonts w:ascii="Arial" w:hAnsi="Arial"/>
+          <w:b w:val="0"/>
+          <w:i/>
+          <w:sz w:val="19"/>
+        </w:rPr>
+        <w:t>Anthropic Economic Policy Framework</w:t>
+      </w:r>
+      <w:r>
+        <w:rPr>
+          <w:rFonts w:ascii="Arial" w:hAnsi="Arial"/>
+          <w:b w:val="0"/>
+          <w:i w:val="0"/>
+          <w:sz w:val="19"/>
+        </w:rPr>
+        <w:t xml:space="preserve"> mit dreistufiger Arbeitslosenquoten-Reaktionsmatrix (5 % — Universal Capital Accounts mit AI-Equity, Workforce-Training-Grants, Lizenzschranken-Reform, Lohnversicherung; 10 % — automatische UI-Extensions, Grundbedürfnishilfe; beispielloses Niveau — Common Income Floor, AI-Use-Levies, UBI, AI Sovereign Wealth Fund) und einer Anthropic-Eigenleistung von 350 Mio. USD (200 Mio. Economic Futures Research Fund + 150 Mio. Weiterbildung); der am 7. Mai 2026 erzielten und am 16. Juni 2026 vom Europäischen Parlament förmlich bestätigten Trilog-Einigung zum </w:t>
+      </w:r>
+      <w:r>
+        <w:rPr>
+          <w:rFonts w:ascii="Arial" w:hAnsi="Arial"/>
+          <w:b w:val="0"/>
+          <w:i/>
+          <w:sz w:val="19"/>
+        </w:rPr>
+        <w:t>Digital Omnibus on AI</w:t>
+      </w:r>
+      <w:r>
+        <w:rPr>
+          <w:rFonts w:ascii="Arial" w:hAnsi="Arial"/>
+          <w:b w:val="0"/>
+          <w:i w:val="0"/>
+          <w:sz w:val="19"/>
+        </w:rPr>
+        <w:t xml:space="preserve"> (Hochrisiko-Anhang-III bis 2. Dezember 2027, Anhang-I bis 2. August 2028, Art. 50-Kennzeichnung bis 2. November 2026; Rats-Annahme im Juli 2026 erwartet); der ersten Bundestagslesung des </w:t>
+      </w:r>
+      <w:r>
+        <w:rPr>
+          <w:rFonts w:ascii="Arial" w:hAnsi="Arial"/>
+          <w:b w:val="0"/>
+          <w:i/>
+          <w:sz w:val="19"/>
+        </w:rPr>
+        <w:t>GKV-Beitragssatzstabilisierungsgesetzes</w:t>
+      </w:r>
+      <w:r>
+        <w:rPr>
+          <w:rFonts w:ascii="Arial" w:hAnsi="Arial"/>
+          <w:b w:val="0"/>
+          <w:i w:val="0"/>
+          <w:sz w:val="19"/>
+        </w:rPr>
+        <w:t xml:space="preserve"> am 12. Juni 2026 sowie der öffentlichen Anhörung im Gesundheitsausschuss am 22. Juni 2026 (&gt; 90 Sachverständige; bestätigte Größenordnung einer strukturellen GKV-Finanzierungslücke bis 2030 von rund 40 Mrd. EUR) und der zum 30. Juni 2026 auslaufenden Frist für die erste </w:t>
+      </w:r>
+      <w:r>
+        <w:rPr>
+          <w:rFonts w:ascii="Arial" w:hAnsi="Arial"/>
+          <w:b w:val="0"/>
+          <w:i/>
+          <w:sz w:val="19"/>
+        </w:rPr>
+        <w:t>GloBE Information Return</w:t>
+      </w:r>
+      <w:r>
+        <w:rPr>
+          <w:rFonts w:ascii="Arial" w:hAnsi="Arial"/>
+          <w:b w:val="0"/>
+          <w:i w:val="0"/>
+          <w:sz w:val="19"/>
+        </w:rPr>
+        <w:t xml:space="preserve"> (GIR) im OECD-Pillar-2-Regime in Verbindung mit der OECD </w:t>
+      </w:r>
+      <w:r>
+        <w:rPr>
+          <w:rFonts w:ascii="Arial" w:hAnsi="Arial"/>
+          <w:b w:val="0"/>
+          <w:i/>
+          <w:sz w:val="19"/>
+        </w:rPr>
+        <w:t>Common Understanding</w:t>
+      </w:r>
+      <w:r>
+        <w:rPr>
+          <w:rFonts w:ascii="Arial" w:hAnsi="Arial"/>
+          <w:b w:val="0"/>
+          <w:i w:val="0"/>
+          <w:sz w:val="19"/>
+        </w:rPr>
+        <w:t xml:space="preserve"> zu Verspätungs- und Durchsetzungsfragen vom 18. Mai 2026. Eine regelmäßige Aktualisierung ist vorgesehen.</w:t>
       </w:r>
     </w:p>
     <w:p>
@@ -10862,7 +11847,7 @@
         <w:color w:val="999999"/>
         <w:sz w:val="15"/>
       </w:rPr>
-      <w:t>Version 22.0 — Mai 2026 — CC BY 4.0</w:t>
+      <w:t>Version 23.0 — Mai 2026 — CC BY 4.0</w:t>
       <w:tab/>
       <w:t xml:space="preserve">Seite </w:t>
     </w:r>

</xml_diff>

<commit_message>
Daily-Update 2026-07-03 — Version 23.0 (Cluster: A, B, D, F)
Fünf belegbare Neuigkeiten aufgenommen (Standard-7-Tage-Fenster mit
Ausnahme-Erweiterung auf 4 Wochen in Cluster B und D wegen
achtwöchiger Update-Lücke seit Lauf 001 vom 8. Mai 2026):

- § 4.5: American A.I. Sovereign Wealth Fund Act (Sanders, 18. Juni 2026)
- § 3.5: Anthropic Economic Index „Cadences" (26. Juni 2026, ~9.700 Beschäftigte)
- § 4.3: EU-AI-Act Digital Omnibus / Omnibus VII (EP 16. Juni / Rat 29. Juni 2026)
- § 1.1: Challenger Mai- und Juni-Reports 2026, Microsoft 9.000-Layoffs (2. Juli 2026)
- § 11.1/§ 11.3/§ 11.5: neue Literatureinträge

Validierung, Versionierung, Build und Logbuch abgeschlossen; Phase-5b-Fallback-
Dateien geschrieben (kein Mail-/WhatsApp-MCP erreichbar).
</commit_message>
<xml_diff>
--- a/KI-Ökonomie.docx
+++ b/KI-Ökonomie.docx
@@ -112,7 +112,7 @@
           <w:color w:val="666666"/>
           <w:sz w:val="18"/>
         </w:rPr>
-        <w:t>Version 22.0</w:t>
+        <w:t>Version 23.0</w:t>
       </w:r>
     </w:p>
     <w:p>
@@ -382,7 +382,79 @@
           <w:i w:val="0"/>
           <w:sz w:val="19"/>
         </w:rPr>
-        <w:t xml:space="preserve">-Differenzierung vom 1. Mai 2026 genannte Mehrkanalerklärung (KI-Verdrängung, Austerity-Logik, Pandemie-Korrekturen, Routine-Restrukturierung) zusätzlich stützt. Der parallele Lauf der Branchen-AI-Capex-Programme (Q1-2026-Investitionen der Hyperscaler von rund 130,65 Milliarden US-Dollar; Konsens-Schätzung Anfang April 2026 zwischen 660 und 700 Milliarden US-Dollar, nach den Q1-2026-Earnings-Calls vom 28.–30. April 2026 — von der </w:t>
+        <w:t xml:space="preserve">-Differenzierung vom 1. Mai 2026 genannte Mehrkanalerklärung (KI-Verdrängung, Austerity-Logik, Pandemie-Korrekturen, Routine-Restrukturierung) zusätzlich stützt. Der </w:t>
+      </w:r>
+      <w:r>
+        <w:rPr>
+          <w:rFonts w:ascii="Arial" w:hAnsi="Arial"/>
+          <w:b w:val="0"/>
+          <w:i/>
+          <w:sz w:val="19"/>
+        </w:rPr>
+        <w:t>Mai-2026-Job-Cuts-Report</w:t>
+      </w:r>
+      <w:r>
+        <w:rPr>
+          <w:rFonts w:ascii="Arial" w:hAnsi="Arial"/>
+          <w:b w:val="0"/>
+          <w:i w:val="0"/>
+          <w:sz w:val="19"/>
+        </w:rPr>
+        <w:t xml:space="preserve"> von </w:t>
+      </w:r>
+      <w:r>
+        <w:rPr>
+          <w:rFonts w:ascii="Arial" w:hAnsi="Arial"/>
+          <w:b w:val="0"/>
+          <w:i/>
+          <w:sz w:val="19"/>
+        </w:rPr>
+        <w:t>Challenger, Gray &amp; Christmas</w:t>
+      </w:r>
+      <w:r>
+        <w:rPr>
+          <w:rFonts w:ascii="Arial" w:hAnsi="Arial"/>
+          <w:b w:val="0"/>
+          <w:i w:val="0"/>
+          <w:sz w:val="19"/>
+        </w:rPr>
+        <w:t xml:space="preserve"> (2. Juni 2026) zeigt eine erneute Beschleunigung: 97.006 US-Streichungen im Mai (+16 % gegenüber April; höchster Mai-Wert seit 2020), KI-bezogen 38.579 — 40 % aller Mai-Streichungen und der bislang höchste Monatswert seit Beginn der Kategorisierung 2023; Tech mit 38.242 Streichungen erreicht den höchsten Monatswert seit August 2024, YTD-KI liegt bei 87.714 (22 % aller 2026-Streichungspläne). Der Folge-Report für Juni 2026 (2. Juli 2026) meldet demgegenüber einen deutlichen Rückgang auf 45.849 Streichungen (−53 % gegenüber Mai; −4 % gegenüber Juni 2025); KI bleibt vierten Monat in Folge führender Einzelgrund mit 14.029 Streichungen (31 % des Monatsvolumens), YTD-KI kumuliert auf 101.743 (rund 23 % aller im Jahr 2026 angekündigten Streichungen) und übersteigt damit die Gesamtjahres­summe 2025 (54.836) im ersten Halbjahr um rund 86 %. Am 2. Juli 2026 hat </w:t>
+      </w:r>
+      <w:r>
+        <w:rPr>
+          <w:rFonts w:ascii="Arial" w:hAnsi="Arial"/>
+          <w:b w:val="0"/>
+          <w:i/>
+          <w:sz w:val="19"/>
+        </w:rPr>
+        <w:t>Microsoft</w:t>
+      </w:r>
+      <w:r>
+        <w:rPr>
+          <w:rFonts w:ascii="Arial" w:hAnsi="Arial"/>
+          <w:b w:val="0"/>
+          <w:i w:val="0"/>
+          <w:sz w:val="19"/>
+        </w:rPr>
+        <w:t xml:space="preserve"> parallel zum Start seines Geschäftsjahres 2026 rund 9.000 zusätzliche Stellenstreichungen bekanntgegeben (weniger als 4 % der weltweiten Belegschaft) und damit den seit 2023 verstetigten Fiskaljahres-Restrukturierungspfad fortgesetzt; die Reduktion trifft Sales-, Consulting- und Xbox-Bereiche und fällt nach Konzernangaben geringer aus als die rund 9.000 Streichungen des Vorjahres, weil rund ein Drittel der zum 2. Juli 2026 fälligen </w:t>
+      </w:r>
+      <w:r>
+        <w:rPr>
+          <w:rFonts w:ascii="Arial" w:hAnsi="Arial"/>
+          <w:b w:val="0"/>
+          <w:i/>
+          <w:sz w:val="19"/>
+        </w:rPr>
+        <w:t>Voluntary Retirement Separation Agreements</w:t>
+      </w:r>
+      <w:r>
+        <w:rPr>
+          <w:rFonts w:ascii="Arial" w:hAnsi="Arial"/>
+          <w:b w:val="0"/>
+          <w:i w:val="0"/>
+          <w:sz w:val="19"/>
+        </w:rPr>
+        <w:t xml:space="preserve"> (VRSAR) aus dem am 7. Mai 2026 angebotenen Buyout-Programm angenommen wurde und einen entsprechenden Teil der geplanten Reduktion vorwegnahm. Für die Steuerdebatte verdichtet sich damit das Bild eines vier Monate durchgehenden KI-getriebenen Restrukturierungspfads bei zugleich unverändert hohem Capex — eine Konstellation, die das Argument in § 5.1 und § 8.3 (Anknüpfung an Maschinenkapital und Wertschöpfung) auch im mittelfristigen Verlauf stützt. Der parallele Lauf der Branchen-AI-Capex-Programme (Q1-2026-Investitionen der Hyperscaler von rund 130,65 Milliarden US-Dollar; Konsens-Schätzung Anfang April 2026 zwischen 660 und 700 Milliarden US-Dollar, nach den Q1-2026-Earnings-Calls vom 28.–30. April 2026 — von der </w:t>
       </w:r>
       <w:r>
         <w:rPr>
@@ -1782,7 +1854,79 @@
           <w:i w:val="0"/>
           <w:sz w:val="19"/>
         </w:rPr>
-        <w:t xml:space="preserve"> auszulegen: Ein Pfad, der sowohl bei langsamer (gradueller Substitution und anhaltender Beschäftigungsnachfrage) als auch bei schneller Adoption (breitere kognitive Substitution innerhalb weniger Jahre) plausibel bleibt, ist vorzuziehen. Der in Kapitel 8 entwickelten Deutschland-These entspricht dieser Eigenschaft, weil sie nicht auf einem bestimmten Tempo-Szenario beruht.</w:t>
+        <w:t xml:space="preserve"> auszulegen: Ein Pfad, der sowohl bei langsamer (gradueller Substitution und anhaltender Beschäftigungsnachfrage) als auch bei schneller Adoption (breitere kognitive Substitution innerhalb weniger Jahre) plausibel bleibt, ist vorzuziehen. Der in Kapitel 8 entwickelten Deutschland-These entspricht dieser Eigenschaft, weil sie nicht auf einem bestimmten Tempo-Szenario beruht. Der am 26. Juni 2026 publizierte sechste </w:t>
+      </w:r>
+      <w:r>
+        <w:rPr>
+          <w:rFonts w:ascii="Arial" w:hAnsi="Arial"/>
+          <w:b w:val="0"/>
+          <w:i/>
+          <w:sz w:val="19"/>
+        </w:rPr>
+        <w:t>Anthropic-Economic-Index</w:t>
+      </w:r>
+      <w:r>
+        <w:rPr>
+          <w:rFonts w:ascii="Arial" w:hAnsi="Arial"/>
+          <w:b w:val="0"/>
+          <w:i w:val="0"/>
+          <w:sz w:val="19"/>
+        </w:rPr>
+        <w:t xml:space="preserve">-Bericht </w:t>
+      </w:r>
+      <w:r>
+        <w:rPr>
+          <w:rFonts w:ascii="Arial" w:hAnsi="Arial"/>
+          <w:b w:val="0"/>
+          <w:i/>
+          <w:sz w:val="19"/>
+        </w:rPr>
+        <w:t>„Cadences"</w:t>
+      </w:r>
+      <w:r>
+        <w:rPr>
+          <w:rFonts w:ascii="Arial" w:hAnsi="Arial"/>
+          <w:b w:val="0"/>
+          <w:i w:val="0"/>
+          <w:sz w:val="19"/>
+        </w:rPr>
+        <w:t xml:space="preserve"> verknüpft erstmals systematisch die nutzungsdatenbasierte Index-Reihe mit dem im April 2026 gestarteten Survey-Format: In einer verlinkten Stichprobe von rund 9.700 Claude-Nutzerinnen und -Nutzern (Erhebung Mitte Mai bis Anfang Juni 2026) gibt rund die Hälfte an, dass KI mindestens 50 % der eigenen Aufgaben bereits erledigen könne, während nur rund 10 % einen eigenen Arbeitsplatzverlust als wahrscheinlich einschätzen; über sämtliche sechs abgefragten Wirkungsdimensionen — Bezahlung, Beschäftigungssicherheit, Wiederbeschäftigungsfähigkeit, Sinnhaftigkeit, Autonomie und zwischenmenschliche Interaktion — berichten Beschäftigte mit höherem Delegationsanteil systematisch positivere Erwartungen; 4 % der Befragten geben an, Claude könne ihre Tätigkeit heute vollständig übernehmen. Die persönliche Nutzung steigt am Wochenende von rund 35 auf knapp 50 %, die arbeitsbezogene Nutzung sinkt weniger stark bei höheren Einkommensgruppen; Claude Code weist gegenüber Chat-Konversationen eine um 0,26 Punkte höhere Autonomie-Metrik auf, was auf die Produktrahmung — nicht das Modell — als Treiber der Übertragungsintensität verweist. Für die hier geführte Steuerdebatte bestätigt der Cadences-Bericht die in der Massenkoff/McCrory-Studie und dem </w:t>
+      </w:r>
+      <w:r>
+        <w:rPr>
+          <w:rFonts w:ascii="Arial" w:hAnsi="Arial"/>
+          <w:b w:val="0"/>
+          <w:i/>
+          <w:sz w:val="19"/>
+        </w:rPr>
+        <w:t>Yale-Budget-Lab</w:t>
+      </w:r>
+      <w:r>
+        <w:rPr>
+          <w:rFonts w:ascii="Arial" w:hAnsi="Arial"/>
+          <w:b w:val="0"/>
+          <w:i w:val="0"/>
+          <w:sz w:val="19"/>
+        </w:rPr>
+        <w:t xml:space="preserve">-Tracking sichtbare Grundlinie einer starken subjektiven Reorganisationserwartung bei zugleich moderater aggregierter Substitutionswahrnehmung — und stützt die in § 8.4 entwickelte Auslegung, dass die Verteilungsfrage (wer profitiert von der Produktivitätsverschiebung) </w:t>
+      </w:r>
+      <w:r>
+        <w:rPr>
+          <w:rFonts w:ascii="Arial" w:hAnsi="Arial"/>
+          <w:b w:val="0"/>
+          <w:i/>
+          <w:sz w:val="19"/>
+        </w:rPr>
+        <w:t>vor</w:t>
+      </w:r>
+      <w:r>
+        <w:rPr>
+          <w:rFonts w:ascii="Arial" w:hAnsi="Arial"/>
+          <w:b w:val="0"/>
+          <w:i w:val="0"/>
+          <w:sz w:val="19"/>
+        </w:rPr>
+        <w:t xml:space="preserve"> der Ersatzfrage (wer verliert seinen Arbeitsplatz) politisch aktuell werden könnte.</w:t>
       </w:r>
     </w:p>
     <w:p>
@@ -2128,7 +2272,43 @@
           <w:i w:val="0"/>
           <w:sz w:val="19"/>
         </w:rPr>
-        <w:t xml:space="preserve"> Eine rein nationale Lösung kann mit der Warenverkehrsfreiheit, der Dienstleistungsfreiheit und der Niederlassungsfreiheit in Konflikt geraten. Eine Regelung, die nur inländische Roboterbetreiber trifft, während grenzüberschreitende KI-Dienstleistungen unbesteuert bleiben, wäre diskriminierungsrechtlich problematisch und praktisch kaum durchsetzbar. Der EU AI Act (Verordnung 2024/1689) schafft ab dem 2. August 2026 einen unionsweit einheitlichen Regulierungsrahmen für KI-Systeme (Hochrisiko-Systeme gemäß Anhang III, Transparenzpflichten nach Art. 50, Durchsetzungsregime); dies legt einen einheitlichen Definitionsrahmen, der steuerpolitische Anknüpfungen an KI-Systemklassen mittelfristig erleichtern kann, ohne selbst steuerrechtliche Wirkung zu entfalten. Die Europäische Kommission hat am 19. November 2025 mit dem „Digital Omnibus on AI" einen Vereinfachungsvorschlag vorgelegt, den das Europäische Parlament am 16. März 2026 im Ausschuss und am 23. März 2026 im Plenum unterstützt hat. Er sieht eine Verschiebung der Hochrisiko-Pflichten vor — je nach Systemtyp bis maximal zum 2. Dezember 2027 bzw. 2. August 2028 — und koppelt ihre Anwendbarkeit an die Verfügbarkeit harmonisierter Normen; zudem wird die Kennzeichnungspflicht für KI-generierte Inhalte (Art. 50) bis zum 2. November 2026 verlängert. Die Kommissionsdurchsetzungsbefugnisse gegenüber Anbietern von Allzweck-KI-Modellen (GPAI) treten wie vorgesehen am 2. August 2026 in Kraft. Parlament und Rat haben die Trilogverhandlungen aufgenommen; der zweite Trilogtermin am 28. April 2026 endete nach Berichterstattung von IAPP und A&amp;O Shearman ohne Einigung — Streitpunkt war primär das Verhältnis zwischen AI Act und sektorspezifischen EU-Regelungen für eingebettete KI-Systeme (Anhang I) sowie die Rechtsgrundlage für die Verarbeitung personenbezogener Daten zur Bias-Erkennung. Beide Institutionen konvergieren auf Stichtage 2. Dezember 2027 (Anhang III) und 2. August 2028 (Anhang I) für die Hochrisiko-Pflichten. Die nächste Trilogrunde ist auf den 13. Mai 2026 terminiert; Ziel bleibt eine förmliche Verabschiedung vor dem ursprünglichen Stichtag am 2. August 2026. Die zypriotische Ratspräsidentschaft hat sich vorgenommen, das Dossier vor Ablauf ihrer Amtszeit am 30. Juni 2026 abzuschließen; gelingt das nicht, übernimmt zur zweiten Jahreshälfte 2026 die irische Präsidentschaft. Scheitert die Einigung bis zum 2. August 2026, würden die Hochrisiko-Pflichten in ihrer ursprünglich vorgesehenen Fassung anwendbar. Für die Steuerdebatte folgt daraus, dass der zeitliche Vorlauf für KI-Definitionen aus dem AI Act enger als ursprünglich gedacht ist — eine mittelfristige Anknüpfung steuerlicher Tatbestände an AI-Act-Kategorien bleibt möglich, setzt aber voraus, dass die Normenlandschaft nach 2027 verlässlich vorliegt.</w:t>
+        <w:t xml:space="preserve"> Eine rein nationale Lösung kann mit der Warenverkehrsfreiheit, der Dienstleistungsfreiheit und der Niederlassungsfreiheit in Konflikt geraten. Eine Regelung, die nur inländische Roboterbetreiber trifft, während grenzüberschreitende KI-Dienstleistungen unbesteuert bleiben, wäre diskriminierungsrechtlich problematisch und praktisch kaum durchsetzbar. Der EU AI Act (Verordnung 2024/1689) schafft ab dem 2. August 2026 einen unionsweit einheitlichen Regulierungsrahmen für KI-Systeme (Hochrisiko-Systeme gemäß Anhang III, Transparenzpflichten nach Art. 50, Durchsetzungsregime); dies legt einen einheitlichen Definitionsrahmen, der steuerpolitische Anknüpfungen an KI-Systemklassen mittelfristig erleichtern kann, ohne selbst steuerrechtliche Wirkung zu entfalten. Die Europäische Kommission hat am 19. November 2025 mit dem „Digital Omnibus on AI" einen Vereinfachungsvorschlag vorgelegt, den das Europäische Parlament am 16. März 2026 im Ausschuss und am 23. März 2026 im Plenum unterstützt hat. Er sieht eine Verschiebung der Hochrisiko-Pflichten vor — je nach Systemtyp bis maximal zum 2. Dezember 2027 bzw. 2. August 2028 — und koppelt ihre Anwendbarkeit an die Verfügbarkeit harmonisierter Normen; zudem wird die Kennzeichnungspflicht für KI-generierte Inhalte (Art. 50) bis zum 2. November 2026 verlängert. Die Kommissionsdurchsetzungsbefugnisse gegenüber Anbietern von Allzweck-KI-Modellen (GPAI) treten wie vorgesehen am 2. August 2026 in Kraft. Parlament und Rat haben die Trilogverhandlungen aufgenommen; der zweite Trilogtermin am 28. April 2026 endete nach Berichterstattung von IAPP und A&amp;O Shearman ohne Einigung — Streitpunkt war primär das Verhältnis zwischen AI Act und sektorspezifischen EU-Regelungen für eingebettete KI-Systeme (Anhang I) sowie die Rechtsgrundlage für die Verarbeitung personenbezogener Daten zur Bias-Erkennung. Beide Institutionen konvergieren auf Stichtage 2. Dezember 2027 (Anhang III) und 2. August 2028 (Anhang I) für die Hochrisiko-Pflichten. Die nächste Trilogrunde ist auf den 13. Mai 2026 terminiert; Ziel bleibt eine förmliche Verabschiedung vor dem ursprünglichen Stichtag am 2. August 2026. Die zypriotische Ratspräsidentschaft hat sich vorgenommen, das Dossier vor Ablauf ihrer Amtszeit am 30. Juni 2026 abzuschließen; gelingt das nicht, übernimmt zur zweiten Jahreshälfte 2026 die irische Präsidentschaft. Scheitert die Einigung bis zum 2. August 2026, würden die Hochrisiko-Pflichten in ihrer ursprünglich vorgesehenen Fassung anwendbar. Für die Steuerdebatte folgt daraus, dass der zeitliche Vorlauf für KI-Definitionen aus dem AI Act enger als ursprünglich gedacht ist — eine mittelfristige Anknüpfung steuerlicher Tatbestände an AI-Act-Kategorien bleibt möglich, setzt aber voraus, dass die Normenlandschaft nach 2027 verlässlich vorliegt. Der Trilog-Prozess ist im Mai/Juni 2026 zum Abschluss gekommen: In der dritten Trilogrunde am 7. Mai 2026 einigten sich Parlament, Rat und Kommission auf ein Kompromisspaket („Digital Omnibus on AI" / </w:t>
+      </w:r>
+      <w:r>
+        <w:rPr>
+          <w:rFonts w:ascii="Arial" w:hAnsi="Arial"/>
+          <w:b w:val="0"/>
+          <w:i/>
+          <w:sz w:val="19"/>
+        </w:rPr>
+        <w:t>Omnibus VII</w:t>
+      </w:r>
+      <w:r>
+        <w:rPr>
+          <w:rFonts w:ascii="Arial" w:hAnsi="Arial"/>
+          <w:b w:val="0"/>
+          <w:i w:val="0"/>
+          <w:sz w:val="19"/>
+        </w:rPr>
+        <w:t xml:space="preserve">), das Parlament hat es am 16. Juni 2026 im Plenum bestätigt, der Rat hat es am 29. Juni 2026 in seiner letzten Ratssitzung vor der irischen Präsidentschaft final gebilligt. Die Anwendungsdaten für Hochrisiko-Systeme werden verbindlich auf den 2. Dezember 2027 (Anhang III — Stand-alone) und den 2. August 2028 (Anhang I — eingebettet in regulierte Produkte) verschoben; die Frist für die Einrichtung nationaler </w:t>
+      </w:r>
+      <w:r>
+        <w:rPr>
+          <w:rFonts w:ascii="Arial" w:hAnsi="Arial"/>
+          <w:b w:val="0"/>
+          <w:i/>
+          <w:sz w:val="19"/>
+        </w:rPr>
+        <w:t>AI-Regulatory-Sandboxes</w:t>
+      </w:r>
+      <w:r>
+        <w:rPr>
+          <w:rFonts w:ascii="Arial" w:hAnsi="Arial"/>
+          <w:b w:val="0"/>
+          <w:i w:val="0"/>
+          <w:sz w:val="19"/>
+        </w:rPr>
+        <w:t xml:space="preserve"> wird auf den 2. August 2027 gesetzt, und die Übergangsfrist für Anbieter zur Umsetzung der Transparenzkennzeichnung KI-generierter Inhalte (Art. 50) wird verkürzt. Neu aufgenommen ist eine Erweiterung von Art. 5, die die Erzeugung nicht-einvernehmlicher intimer KI-Inhalte und von KI-generiertem Material sexualisierter Gewalt gegen Minderjährige (CSAM) unionsweit als „prohibited practice" verbietet — die Regelung greift dritten Tages nach Veröffentlichung im Amtsblatt und markiert die erste materielle Erweiterung des Verbotskatalogs seit der Verabschiedung des AI Act 2024. Die Kommissionsdurchsetzungsbefugnisse für Anbieter von Allzweck-KI-Modellen (GPAI) treten wie ursprünglich vorgesehen zum 2. August 2026 in Kraft. Für die Steuerdebatte bedeutet der Abschluss, dass die AI-Act-Kategorienlandschaft nun für mindestens einen weiteren Beobachtungszyklus stabil ist und mittelfristige Anknüpfungen (etwa für Bemessungsgrundlagen einer inländischen KI-Nutzungsabgabe) auf einer rechtssicheren Definitionsbasis geplant werden können.</w:t>
       </w:r>
     </w:p>
     <w:p>
@@ -2264,7 +2444,61 @@
           <w:i w:val="0"/>
           <w:sz w:val="19"/>
         </w:rPr>
-        <w:t xml:space="preserve"> (S. 4214, 119. Kongress) eingebracht, der ein bundesweites Moratorium für neue und aufgerüstete KI-Rechenzentren oberhalb definierter Stromschwellen vorsieht, bis der Gesetzgeber Mindeststandards in den Bereichen Umwelt, Energie, Arbeit und Bürgerrechte verabschiedet; der Gesetzentwurf formuliert ausdrücklich, die „wirtschaftlichen Gewinne aus künstlicher Intelligenz und Robotik" sollten „Beschäftigten, nicht nur wohlhabenden Big-Tech-Eigentümern" zugutekommen. Am 16. April 2026 hat Sanders die Linie mit einem Namensbeitrag („Artificial intelligence is coming for the working class. We must fight back.") erneuert und die HELP-Anhörung genutzt, um für Robotersteuer und Moratorium zu werben. Die Aussicht auf Annahme des Entwurfs in einem republikanisch geführten Kongress gilt als gering; als Signalgebung ist er jedoch der bislang konkreteste politische Vorstoß auf US-Bundesebene.</w:t>
+        <w:t xml:space="preserve"> (S. 4214, 119. Kongress) eingebracht, der ein bundesweites Moratorium für neue und aufgerüstete KI-Rechenzentren oberhalb definierter Stromschwellen vorsieht, bis der Gesetzgeber Mindeststandards in den Bereichen Umwelt, Energie, Arbeit und Bürgerrechte verabschiedet; der Gesetzentwurf formuliert ausdrücklich, die „wirtschaftlichen Gewinne aus künstlicher Intelligenz und Robotik" sollten „Beschäftigten, nicht nur wohlhabenden Big-Tech-Eigentümern" zugutekommen. Am 16. April 2026 hat Sanders die Linie mit einem Namensbeitrag („Artificial intelligence is coming for the working class. We must fight back.") erneuert und die HELP-Anhörung genutzt, um für Robotersteuer und Moratorium zu werben. Am 18. Juni 2026 hat Sanders den </w:t>
+      </w:r>
+      <w:r>
+        <w:rPr>
+          <w:rFonts w:ascii="Arial" w:hAnsi="Arial"/>
+          <w:b w:val="0"/>
+          <w:i/>
+          <w:sz w:val="19"/>
+        </w:rPr>
+        <w:t>American A.I. Sovereign Wealth Fund Act</w:t>
+      </w:r>
+      <w:r>
+        <w:rPr>
+          <w:rFonts w:ascii="Arial" w:hAnsi="Arial"/>
+          <w:b w:val="0"/>
+          <w:i w:val="0"/>
+          <w:sz w:val="19"/>
+        </w:rPr>
+        <w:t xml:space="preserve"> eingebracht, den bislang konkretesten fiskalischen Baustein seiner AI-Agenda. Der Gesetzentwurf sieht eine einmalige Abgabe in Höhe von 50 % des ausstehenden Stammkapitals aller AI-Unternehmen mit einem Jahresumsatz aus KI-Aktivitäten von mindestens 200 Millionen US-Dollar vor; die abgegebenen Aktien fließen in einen bundesstaatlichen Souveränen KI-Beteiligungsfonds, dessen Marktwert von Sanders' Büro und Nachrichtenagenturen auf rund 7 Billionen US-Dollar geschätzt wird. Eine an den Fonds gekoppelte </w:t>
+      </w:r>
+      <w:r>
+        <w:rPr>
+          <w:rFonts w:ascii="Arial" w:hAnsi="Arial"/>
+          <w:b w:val="0"/>
+          <w:i/>
+          <w:sz w:val="19"/>
+        </w:rPr>
+        <w:t>Independent Commission for Democratic AI</w:t>
+      </w:r>
+      <w:r>
+        <w:rPr>
+          <w:rFonts w:ascii="Arial" w:hAnsi="Arial"/>
+          <w:b w:val="0"/>
+          <w:i w:val="0"/>
+          <w:sz w:val="19"/>
+        </w:rPr>
+        <w:t xml:space="preserve"> soll die Stimmrechte und Aufsichtsratsmandate ausüben — sowohl zur Blockade schädlicher Unternehmensentscheidungen als auch zur aktiven Ausrichtung an Gemeinwohlzielen — und eine jährliche Dividende in Höhe von rund 5 % des Fondswerts an alle US-Bürgerinnen und -Bürger ausschütten (Sanders' Kalkulation: rund 1.000 US-Dollar pro Person und Jahr). Die Aussicht auf Verabschiedung in einem republikanisch geführten Kongress gilt weiterhin als gering; als konzeptioneller Beitrag verschiebt der Entwurf jedoch die US-Debatte von einer flussorientierten (Robotersteuer, Rechenzentren-Moratorium) auf eine bestandsorientierte Umverteilungslogik: Nicht die laufenden KI-Erträge, sondern das Eigentum an den KI-Produktionsmitteln selbst wird zur fiskalischen Anknüpfung. Für die in Kapitel 8 entwickelte Deutschland-These ist der Vorschlag ein direkt vergleichbarer Referenzpunkt, weil er im norwegischen Staatsfonds- und im in § 5.4 diskutierten Beteiligungsfonds-Modell einen gemeinsamen strukturellen Kern hat — allerdings mit einer aggressiveren Eingangsdotierung als in den europäischen Debatten üblich. Der bereits im März 2026 mit Alexandria Ocasio-Cortez eingebrachte </w:t>
+      </w:r>
+      <w:r>
+        <w:rPr>
+          <w:rFonts w:ascii="Arial" w:hAnsi="Arial"/>
+          <w:b w:val="0"/>
+          <w:i/>
+          <w:sz w:val="19"/>
+        </w:rPr>
+        <w:t>Artificial Intelligence Data Center Moratorium Act</w:t>
+      </w:r>
+      <w:r>
+        <w:rPr>
+          <w:rFonts w:ascii="Arial" w:hAnsi="Arial"/>
+          <w:b w:val="0"/>
+          <w:i w:val="0"/>
+          <w:sz w:val="19"/>
+        </w:rPr>
+        <w:t xml:space="preserve"> (S. 4214) bleibt komplementär; er adressiert die Angebotsseite der KI-Infrastruktur, während der neue Fondsentwurf die Eigentumsseite adressiert.</w:t>
       </w:r>
     </w:p>
     <w:p>
@@ -7224,6 +7458,38 @@
           <w:i w:val="0"/>
           <w:sz w:val="19"/>
         </w:rPr>
+        <w:t xml:space="preserve">Anthropic. (26. Juni 2026). </w:t>
+      </w:r>
+      <w:r>
+        <w:rPr>
+          <w:rFonts w:ascii="Arial" w:hAnsi="Arial"/>
+          <w:b w:val="0"/>
+          <w:i/>
+          <w:sz w:val="19"/>
+        </w:rPr>
+        <w:t>Anthropic Economic Index Report — Cadences.</w:t>
+      </w:r>
+      <w:r>
+        <w:rPr>
+          <w:rFonts w:ascii="Arial" w:hAnsi="Arial"/>
+          <w:b w:val="0"/>
+          <w:i w:val="0"/>
+          <w:sz w:val="19"/>
+        </w:rPr>
+        <w:t xml:space="preserve"> Sechster Bericht der Reihe; erste verlinkte Stichprobe von ~9.700 Claude-Nutzerinnen und -Nutzern (Erhebung Mitte Mai bis Anfang Juni 2026): rund 50 % geben an, dass KI mindestens 50 % ihrer Aufgaben bereits übernehmen könne; nur ~10 % erwarten eigenen Arbeitsplatzverlust; über sechs Wirkungsdimensionen berichten Beschäftigte mit höherem Delegationsanteil systematisch positivere Erwartungen; Wochenend-Anstieg persönliche Nutzung 35→~50 %; Claude Code weist gegenüber Chat-Konversationen eine um 0,26 Punkte höhere Autonomie-Metrik auf. https://www.anthropic.com/research/economic-index-june-2026-report</w:t>
+      </w:r>
+    </w:p>
+    <w:p>
+      <w:pPr>
+        <w:jc w:val="both"/>
+      </w:pPr>
+      <w:r>
+        <w:rPr>
+          <w:rFonts w:ascii="Arial" w:hAnsi="Arial"/>
+          <w:b w:val="0"/>
+          <w:i w:val="0"/>
+          <w:sz w:val="19"/>
+        </w:rPr>
         <w:t xml:space="preserve">The Budget Lab at Yale. (April 2026). </w:t>
       </w:r>
       <w:r>
@@ -8266,6 +8532,74 @@
           <w:i w:val="0"/>
           <w:sz w:val="19"/>
         </w:rPr>
+        <w:t xml:space="preserve">Sanders, B. (18. Juni 2026). </w:t>
+      </w:r>
+      <w:r>
+        <w:rPr>
+          <w:rFonts w:ascii="Arial" w:hAnsi="Arial"/>
+          <w:b w:val="0"/>
+          <w:i/>
+          <w:sz w:val="19"/>
+        </w:rPr>
+        <w:t>NEWS: Sanders Introduces Legislation to Create $7 Trillion AI Sovereign Wealth Fund</w:t>
+      </w:r>
+      <w:r>
+        <w:rPr>
+          <w:rFonts w:ascii="Arial" w:hAnsi="Arial"/>
+          <w:b w:val="0"/>
+          <w:i w:val="0"/>
+          <w:sz w:val="19"/>
+        </w:rPr>
+        <w:t xml:space="preserve"> (</w:t>
+      </w:r>
+      <w:r>
+        <w:rPr>
+          <w:rFonts w:ascii="Arial" w:hAnsi="Arial"/>
+          <w:b w:val="0"/>
+          <w:i/>
+          <w:sz w:val="19"/>
+        </w:rPr>
+        <w:t>American A.I. Sovereign Wealth Fund Act</w:t>
+      </w:r>
+      <w:r>
+        <w:rPr>
+          <w:rFonts w:ascii="Arial" w:hAnsi="Arial"/>
+          <w:b w:val="0"/>
+          <w:i w:val="0"/>
+          <w:sz w:val="19"/>
+        </w:rPr>
+        <w:t xml:space="preserve">). Pressemitteilung mit Entwurfstext, One-Time-50-%-Aktien-Abgabe für AI-Unternehmen mit ≥ 200 Millionen US-Dollar Jahresumsatz aus KI-Aktivitäten, </w:t>
+      </w:r>
+      <w:r>
+        <w:rPr>
+          <w:rFonts w:ascii="Arial" w:hAnsi="Arial"/>
+          <w:b w:val="0"/>
+          <w:i/>
+          <w:sz w:val="19"/>
+        </w:rPr>
+        <w:t>Independent Commission for Democratic AI</w:t>
+      </w:r>
+      <w:r>
+        <w:rPr>
+          <w:rFonts w:ascii="Arial" w:hAnsi="Arial"/>
+          <w:b w:val="0"/>
+          <w:i w:val="0"/>
+          <w:sz w:val="19"/>
+        </w:rPr>
+        <w:t xml:space="preserve"> zur Ausübung der Stimmrechte, jährliche Dividende von rund 5 % (≈ 1.000 US-Dollar pro Person). https://www.sanders.senate.gov/press-releases/news-sanders-introduces-legislation-to-create-7-trillion-ai-sovereign-wealth-fund/</w:t>
+      </w:r>
+    </w:p>
+    <w:p>
+      <w:pPr>
+        <w:jc w:val="both"/>
+      </w:pPr>
+      <w:r>
+        <w:rPr>
+          <w:rFonts w:ascii="Arial" w:hAnsi="Arial"/>
+          <w:b w:val="0"/>
+          <w:i w:val="0"/>
+          <w:sz w:val="19"/>
+        </w:rPr>
         <w:t xml:space="preserve">The White House. (23. Juli 2025). </w:t>
       </w:r>
       <w:r>
@@ -8705,6 +9039,124 @@
           <w:sz w:val="19"/>
         </w:rPr>
         <w:t xml:space="preserve"> Legislative Train Schedule und Berichterstattung IAPP, A&amp;O Shearman, OneTrust, DLA Piper. https://www.europarl.europa.eu/legislative-train/package-digital-package/file-digital-omnibus-on-ai | https://iapp.org/news/a/ai-act-omnibus-what-just-happened-and-what-comes-next | https://www.aoshearman.com/en/insights/digital-omnibus-on-ai-what-is-really-on-the-table-as-trilogues-begin</w:t>
+      </w:r>
+    </w:p>
+    <w:p>
+      <w:pPr>
+        <w:jc w:val="both"/>
+      </w:pPr>
+      <w:r>
+        <w:rPr>
+          <w:rFonts w:ascii="Arial" w:hAnsi="Arial"/>
+          <w:b w:val="0"/>
+          <w:i w:val="0"/>
+          <w:sz w:val="19"/>
+        </w:rPr>
+        <w:t xml:space="preserve">Rat der Europäischen Union. (7. Mai 2026 / 29. Juni 2026). </w:t>
+      </w:r>
+      <w:r>
+        <w:rPr>
+          <w:rFonts w:ascii="Arial" w:hAnsi="Arial"/>
+          <w:b w:val="0"/>
+          <w:i/>
+          <w:sz w:val="19"/>
+        </w:rPr>
+        <w:t>Artificial Intelligence: Council and Parliament agree to simplify and streamline rules</w:t>
+      </w:r>
+      <w:r>
+        <w:rPr>
+          <w:rFonts w:ascii="Arial" w:hAnsi="Arial"/>
+          <w:b w:val="0"/>
+          <w:i w:val="0"/>
+          <w:sz w:val="19"/>
+        </w:rPr>
+        <w:t xml:space="preserve"> (Trilog-Einigung) und </w:t>
+      </w:r>
+      <w:r>
+        <w:rPr>
+          <w:rFonts w:ascii="Arial" w:hAnsi="Arial"/>
+          <w:b w:val="0"/>
+          <w:i/>
+          <w:sz w:val="19"/>
+        </w:rPr>
+        <w:t>Artificial Intelligence: Council gives final green light to simplify and streamline rules</w:t>
+      </w:r>
+      <w:r>
+        <w:rPr>
+          <w:rFonts w:ascii="Arial" w:hAnsi="Arial"/>
+          <w:b w:val="0"/>
+          <w:i w:val="0"/>
+          <w:sz w:val="19"/>
+        </w:rPr>
+        <w:t xml:space="preserve"> (finale Ratsbilligung). Pressemitteilungen zum Abschluss des </w:t>
+      </w:r>
+      <w:r>
+        <w:rPr>
+          <w:rFonts w:ascii="Arial" w:hAnsi="Arial"/>
+          <w:b w:val="0"/>
+          <w:i/>
+          <w:sz w:val="19"/>
+        </w:rPr>
+        <w:t>Digital Omnibus on AI</w:t>
+      </w:r>
+      <w:r>
+        <w:rPr>
+          <w:rFonts w:ascii="Arial" w:hAnsi="Arial"/>
+          <w:b w:val="0"/>
+          <w:i w:val="0"/>
+          <w:sz w:val="19"/>
+        </w:rPr>
+        <w:t xml:space="preserve"> / </w:t>
+      </w:r>
+      <w:r>
+        <w:rPr>
+          <w:rFonts w:ascii="Arial" w:hAnsi="Arial"/>
+          <w:b w:val="0"/>
+          <w:i/>
+          <w:sz w:val="19"/>
+        </w:rPr>
+        <w:t>Omnibus VII</w:t>
+      </w:r>
+      <w:r>
+        <w:rPr>
+          <w:rFonts w:ascii="Arial" w:hAnsi="Arial"/>
+          <w:b w:val="0"/>
+          <w:i w:val="0"/>
+          <w:sz w:val="19"/>
+        </w:rPr>
+        <w:t>: verbindliche Anwendungsdaten Hochrisiko 2. Dezember 2027 (Anhang III) und 2. August 2028 (Anhang I); Sandbox-Frist 2. August 2027; verkürzte Transparenz-Übergangsfrist Art. 50; Erweiterung Art. 5 um Verbot nicht-einvernehmlicher intimer KI-Inhalte und CSAM. https://www.consilium.europa.eu/en/press/press-releases/2026/05/07/artificial-intelligence-council-and-parliament-agree-to-simplify-and-streamline-rules/ | https://www.consilium.europa.eu/en/press/press-releases/2026/06/29/artificial-intelligence-council-gives-final-green-light-to-simplify-and-streamline-rules/</w:t>
+      </w:r>
+    </w:p>
+    <w:p>
+      <w:pPr>
+        <w:jc w:val="both"/>
+      </w:pPr>
+      <w:r>
+        <w:rPr>
+          <w:rFonts w:ascii="Arial" w:hAnsi="Arial"/>
+          <w:b w:val="0"/>
+          <w:i w:val="0"/>
+          <w:sz w:val="19"/>
+        </w:rPr>
+        <w:t xml:space="preserve">Europäisches Parlament. (16. Juni 2026). </w:t>
+      </w:r>
+      <w:r>
+        <w:rPr>
+          <w:rFonts w:ascii="Arial" w:hAnsi="Arial"/>
+          <w:b w:val="0"/>
+          <w:i/>
+          <w:sz w:val="19"/>
+        </w:rPr>
+        <w:t>Plenary vote — Digital Omnibus on AI (Regulation (EU) 2024/1689 amendment).</w:t>
+      </w:r>
+      <w:r>
+        <w:rPr>
+          <w:rFonts w:ascii="Arial" w:hAnsi="Arial"/>
+          <w:b w:val="0"/>
+          <w:i w:val="0"/>
+          <w:sz w:val="19"/>
+        </w:rPr>
+        <w:t xml:space="preserve"> Bestätigung der Trilog-Einigung im Plenum, Vorbereitung der finalen Ratsbilligung. https://www.europarl.europa.eu/legislative-train/package-digital-package/file-digital-omnibus-on-ai</w:t>
       </w:r>
     </w:p>
     <w:p>
@@ -10553,6 +11005,102 @@
       <w:r>
         <w:rPr>
           <w:rFonts w:ascii="Arial" w:hAnsi="Arial"/>
+          <w:b w:val="0"/>
+          <w:i w:val="0"/>
+          <w:sz w:val="19"/>
+        </w:rPr>
+        <w:t xml:space="preserve">Challenger, Gray &amp; Christmas. (2. Juni 2026). </w:t>
+      </w:r>
+      <w:r>
+        <w:rPr>
+          <w:rFonts w:ascii="Arial" w:hAnsi="Arial"/>
+          <w:b w:val="0"/>
+          <w:i/>
+          <w:sz w:val="19"/>
+        </w:rPr>
+        <w:t>Challenger Report: May Job Cuts Rise 16 % from April; Highest May Total Since 2020.</w:t>
+      </w:r>
+      <w:r>
+        <w:rPr>
+          <w:rFonts w:ascii="Arial" w:hAnsi="Arial"/>
+          <w:b w:val="0"/>
+          <w:i w:val="0"/>
+          <w:sz w:val="19"/>
+        </w:rPr>
+        <w:t xml:space="preserve"> 97.006 US-Streichungen im Mai 2026 (+16 % gegenüber April), höchster Mai-Wert seit 2020; KI-bezogen 38.579 = 40 % des Monats (Rekord seit Kategorisierungsbeginn 2023); Tech 38.242 (höchster Monatswert seit August 2024); YTD-KI 87.714 (22 % aller 2026-Streichungspläne). https://www.challengergray.com/blog/challenger-report-may-job-cuts-rise-16-from-april-highest-may-total-since-2020/</w:t>
+      </w:r>
+    </w:p>
+    <w:p>
+      <w:pPr>
+        <w:jc w:val="both"/>
+      </w:pPr>
+      <w:r>
+        <w:rPr>
+          <w:rFonts w:ascii="Arial" w:hAnsi="Arial"/>
+          <w:b w:val="0"/>
+          <w:i w:val="0"/>
+          <w:sz w:val="19"/>
+        </w:rPr>
+        <w:t xml:space="preserve">Challenger, Gray &amp; Christmas. (2. Juli 2026). </w:t>
+      </w:r>
+      <w:r>
+        <w:rPr>
+          <w:rFonts w:ascii="Arial" w:hAnsi="Arial"/>
+          <w:b w:val="0"/>
+          <w:i/>
+          <w:sz w:val="19"/>
+        </w:rPr>
+        <w:t>Challenger Report: June Layoffs Cool to 45,849, Down 53 % From May; AI Leads Reasons for Fourth Consecutive Month.</w:t>
+      </w:r>
+      <w:r>
+        <w:rPr>
+          <w:rFonts w:ascii="Arial" w:hAnsi="Arial"/>
+          <w:b w:val="0"/>
+          <w:i w:val="0"/>
+          <w:sz w:val="19"/>
+        </w:rPr>
+        <w:t xml:space="preserve"> 45.849 US-Streichungen im Juni 2026 (−53 % gegenüber Mai; −4 % gegenüber Juni 2025); KI vierten Monat in Folge führender Einzelgrund mit 14.029 Streichungen (31 %); YTD-KI 101.743 (23 %) und damit rund 86 % über der Gesamtjahressumme 2025 (54.836) bereits im ersten Halbjahr 2026. https://www.challengergray.com/blog/challenger-report-june-layoffs-cool-to-45849-down-53-from-may-ai-leads-reasons-for-fourth-consecutive-month/</w:t>
+      </w:r>
+    </w:p>
+    <w:p>
+      <w:pPr>
+        <w:jc w:val="both"/>
+      </w:pPr>
+      <w:r>
+        <w:rPr>
+          <w:rFonts w:ascii="Arial" w:hAnsi="Arial"/>
+          <w:b w:val="0"/>
+          <w:i w:val="0"/>
+          <w:sz w:val="19"/>
+        </w:rPr>
+        <w:t xml:space="preserve">Microsoft / Tech Startups / BusinessToday. (2. Juli 2026). </w:t>
+      </w:r>
+      <w:r>
+        <w:rPr>
+          <w:rFonts w:ascii="Arial" w:hAnsi="Arial"/>
+          <w:b w:val="0"/>
+          <w:i/>
+          <w:sz w:val="19"/>
+        </w:rPr>
+        <w:t>Microsoft plans to lay off thousands as AI spending reshapes its workforce / Microsoft Cuts ~9,000 Jobs in July 2026 Round / Microsoft to layoff over 5,000 employees across teams.</w:t>
+      </w:r>
+      <w:r>
+        <w:rPr>
+          <w:rFonts w:ascii="Arial" w:hAnsi="Arial"/>
+          <w:b w:val="0"/>
+          <w:i w:val="0"/>
+          <w:sz w:val="19"/>
+        </w:rPr>
+        <w:t xml:space="preserve"> Rund 9.000 Streichungen (&lt; 4 % globale Belegschaft) zum Start des Fiskaljahres 2026; Bereiche Sales, Consulting und Xbox (Xbox-CEO Asha Sharma: „business cannot continue on its current trajectory" nach über 20 Milliarden US-Dollar Investition in Content, Plattform und Hardware-Subventionen über fünf Jahre); geringer als im Vorjahr, weil rund ein Drittel der zum 2. Juli 2026 fälligen VRSAR-Buyouts (Programmangebot vom 7. Mai 2026) angenommen wurde. https://techstartups.com/2026/07/01/microsoft-plans-to-lay-off-thousands-as-ai-spending-reshapes-its-workforce/ | https://icharles.com/articles/microsoft-layoffs-9000-july-2026 | https://www.businesstoday.in/technology/news/story/microsoft-to-layoff-over-5000-employees-across-teams-540239-2026-07-01</w:t>
+      </w:r>
+    </w:p>
+    <w:p>
+      <w:pPr>
+        <w:jc w:val="both"/>
+      </w:pPr>
+      <w:r>
+        <w:rPr>
+          <w:rFonts w:ascii="Arial" w:hAnsi="Arial"/>
           <w:b/>
           <w:i w:val="0"/>
           <w:sz w:val="19"/>
@@ -10566,7 +11114,7 @@
           <w:i w:val="0"/>
           <w:sz w:val="19"/>
         </w:rPr>
-        <w:t xml:space="preserve"> Dieses Arbeitspapier gibt den Stand Anfang Mai 2026 (Schnitt am 8. Mai 2026 — Lauf 001 vom 8. Mai 2026) wieder. Die Debatte entwickelt sich dynamisch, insbesondere im Zuge der OpenAI-Strategiepapiere und der Eröffnung des OpenAI Workshop in Washington, D.C. im Mai 2026, des Erstdurchgangs des GKV-Beitragssatzstabilisierungsgesetzes in der 1065. Bundesratssitzung am 8. Mai 2026 mit 79 Tagesordnungspunkten (Kabinettsbeschluss 29. April 2026, parlamentarische Behandlung vor der Sommerpause 2026 angekündigt), der laufenden Trilog-Verhandlungen zum Digital Omnibus on AI (zweite Runde 28. April 2026 ohne Einigung; nächste Runde 13. Mai 2026 — Knackpunkt ist nicht die Verschiebung der Hochrisiko-Pflichten, sondern die Konformitätsbewertungs-Architektur für Anhang I; die zypriotische Ratspräsidentschaft strebt einen Abschluss vor Ablauf ihrer Amtszeit am 30. Juni 2026 an, andernfalls übernimmt die irische Präsidentschaft), der am 5. Mai 2026 erfolgten Arraignment-Verhandlung im Altman-Verfahren mit „nicht schuldig"-Plädoyer und angeordneter psychiatrischer Begutachtung, des am 7. Mai 2026 versandten individuellen Microsoft-Buyout-Angebots (Annahmefrist 8. Juni 2026, VRSAR-Unterzeichnung 9.–22. Juni 2026, bis zu fünfjährige Krankenversicherungs-Verlängerung), des am 1. Mai 2026 vom Connecticut-Repräsentantenhaus mit 131 zu 17 Stimmen verabschiedeten </w:t>
+        <w:t xml:space="preserve"> Dieses Arbeitspapier gibt den Stand Anfang Juli 2026 (Schnitt am 3. Juli 2026 — Lauf 001 vom 3. Juli 2026) wieder. Die Debatte entwickelt sich dynamisch, insbesondere im Zuge der OpenAI-Strategiepapiere und der Eröffnung des OpenAI Workshop in Washington, D.C. im Mai 2026, des Erstdurchgangs des GKV-Beitragssatzstabilisierungsgesetzes in der 1065. Bundesratssitzung am 8. Mai 2026 mit 79 Tagesordnungspunkten (Kabinettsbeschluss 29. April 2026, parlamentarische Behandlung vor der Sommerpause 2026 angekündigt), der laufenden Trilog-Verhandlungen zum Digital Omnibus on AI (zweite Runde 28. April 2026 ohne Einigung; nächste Runde 13. Mai 2026 — Knackpunkt ist nicht die Verschiebung der Hochrisiko-Pflichten, sondern die Konformitätsbewertungs-Architektur für Anhang I; die zypriotische Ratspräsidentschaft strebt einen Abschluss vor Ablauf ihrer Amtszeit am 30. Juni 2026 an, andernfalls übernimmt die irische Präsidentschaft), der am 5. Mai 2026 erfolgten Arraignment-Verhandlung im Altman-Verfahren mit „nicht schuldig"-Plädoyer und angeordneter psychiatrischer Begutachtung, des am 7. Mai 2026 versandten individuellen Microsoft-Buyout-Angebots (Annahmefrist 8. Juni 2026, VRSAR-Unterzeichnung 9.–22. Juni 2026, bis zu fünfjährige Krankenversicherungs-Verlängerung), des am 1. Mai 2026 vom Connecticut-Repräsentantenhaus mit 131 zu 17 Stimmen verabschiedeten </w:t>
       </w:r>
       <w:r>
         <w:rPr>
@@ -10764,7 +11312,7 @@
           <w:i w:val="0"/>
           <w:sz w:val="19"/>
         </w:rPr>
-        <w:t xml:space="preserve"> 2. Juli 2026) und des Yale-Budget-Lab-Befundes vom April/6. Mai 2026 (kein aggregierter KI-Disruptionseffekt im US-Arbeitsmarkt; fiskalische Modellrechnung 39 Bio. USD Schulden vs. 5.500–42.400 USD Übergangshilfe pro Verdrängtem), des Big-Tech-AI-Capex-Programms 2026 mit einem Q1-Volumen von rund 130,65 Milliarden US-Dollar und einer nach den Q1-2026-Earnings-Calls (28.–30. April 2026) auf rund 725 Milliarden US-Dollar (+77 % gegenüber 410 Mrd. USD in 2025; Microsoft 190, Alphabet 190, Amazon 200, Meta 125–145 Mrd. USD; rund 25 Mrd. USD Microsoft-Aufschlag durch DRAM-Verteuerung von rund 95 % q/q im Q1 erklärt) nach oben revidierten Aggregat-Schätzung für das Gesamtjahr (zuvor 660–700 Mrd. USD Anfang April 2026) sowie des am 29. April 2026 veröffentlichten </w:t>
+        <w:t xml:space="preserve"> 2. Juli 2026) und des Yale-Budget-Lab-Befundes vom April/6. Mai 2026 (kein aggregierter KI-Disruptionseffekt im US-Arbeitsmarkt; fiskalische Modellrechnung 39 Bio. USD Schulden vs. 5.500–42.400 USD Übergangshilfe pro Verdrängtem), des Big-Tech-AI-Capex-Programms 2026 mit einem Q1-Volumen von rund 130,65 Milliarden US-Dollar und einer nach den Q1-2026-Earnings-Calls (28.–30. April 2026) auf rund 725 Milliarden US-Dollar (+77 % gegenüber 410 Mrd. USD in 2025; Microsoft 190, Alphabet 190, Amazon 200, Meta 125–145 Mrd. USD; rund 25 Mrd. USD Microsoft-Aufschlag durch DRAM-Verteuerung von rund 95 % q/q im Q1 erklärt) nach oben revidierten Aggregat-Schätzung für das Gesamtjahr (zuvor 660–700 Mrd. USD Anfang April 2026), des am 29. April 2026 veröffentlichten </w:t>
       </w:r>
       <w:r>
         <w:rPr>
@@ -10782,7 +11330,151 @@
           <w:i w:val="0"/>
           <w:sz w:val="19"/>
         </w:rPr>
-        <w:t xml:space="preserve"> gegen eine KI-Steuer (syndiziert in Advisor Perspectives, RealClearPolitics, West Hawaii Today und Las Vegas Sun zwischen dem 2. und 6. Mai 2026), das Innovationsbremse, Wettbewerbsnachteil und Unmöglichkeit der Abgrenzung Verdrängung/Augmentation als Hauptargumente gegen die Sanders/OpenAI-Linie führt und stattdessen Lockerung berufsrechtlicher Lizenzschranken, Reform der Arbeitslosenversicherung, Umschulungs-Steueranreize sowie eine Ausweitung der Earned Income Tax Credit empfiehlt. Eine regelmäßige Aktualisierung ist vorgesehen.</w:t>
+        <w:t xml:space="preserve"> gegen eine KI-Steuer (syndiziert in Advisor Perspectives, RealClearPolitics, West Hawaii Today und Las Vegas Sun zwischen dem 2. und 6. Mai 2026), das Innovationsbremse, Wettbewerbsnachteil und Unmöglichkeit der Abgrenzung Verdrängung/Augmentation als Hauptargumente gegen die Sanders/OpenAI-Linie führt und stattdessen Lockerung berufsrechtlicher Lizenzschranken, Reform der Arbeitslosenversicherung, Umschulungs-Steueranreize sowie eine Ausweitung der Earned Income Tax Credit empfiehlt, des am 18. Juni 2026 von Senator Bernie Sanders eingebrachten </w:t>
+      </w:r>
+      <w:r>
+        <w:rPr>
+          <w:rFonts w:ascii="Arial" w:hAnsi="Arial"/>
+          <w:b w:val="0"/>
+          <w:i/>
+          <w:sz w:val="19"/>
+        </w:rPr>
+        <w:t>American A.I. Sovereign Wealth Fund Act</w:t>
+      </w:r>
+      <w:r>
+        <w:rPr>
+          <w:rFonts w:ascii="Arial" w:hAnsi="Arial"/>
+          <w:b w:val="0"/>
+          <w:i w:val="0"/>
+          <w:sz w:val="19"/>
+        </w:rPr>
+        <w:t xml:space="preserve"> (einmalige 50-%-Aktien-Abgabe für AI-Unternehmen mit ≥ 200 Mio. USD KI-Jahresumsatz zur Speisung eines rund 7 Bio. USD schweren Souveränen KI-Beteiligungsfonds, </w:t>
+      </w:r>
+      <w:r>
+        <w:rPr>
+          <w:rFonts w:ascii="Arial" w:hAnsi="Arial"/>
+          <w:b w:val="0"/>
+          <w:i/>
+          <w:sz w:val="19"/>
+        </w:rPr>
+        <w:t>Independent Commission for Democratic AI</w:t>
+      </w:r>
+      <w:r>
+        <w:rPr>
+          <w:rFonts w:ascii="Arial" w:hAnsi="Arial"/>
+          <w:b w:val="0"/>
+          <w:i w:val="0"/>
+          <w:sz w:val="19"/>
+        </w:rPr>
+        <w:t xml:space="preserve">, jährliche Dividende ~1.000 USD pro US-Bürger), des am 26. Juni 2026 veröffentlichten sechsten </w:t>
+      </w:r>
+      <w:r>
+        <w:rPr>
+          <w:rFonts w:ascii="Arial" w:hAnsi="Arial"/>
+          <w:b w:val="0"/>
+          <w:i/>
+          <w:sz w:val="19"/>
+        </w:rPr>
+        <w:t>Anthropic-Economic-Index</w:t>
+      </w:r>
+      <w:r>
+        <w:rPr>
+          <w:rFonts w:ascii="Arial" w:hAnsi="Arial"/>
+          <w:b w:val="0"/>
+          <w:i w:val="0"/>
+          <w:sz w:val="19"/>
+        </w:rPr>
+        <w:t xml:space="preserve">-Berichts </w:t>
+      </w:r>
+      <w:r>
+        <w:rPr>
+          <w:rFonts w:ascii="Arial" w:hAnsi="Arial"/>
+          <w:b w:val="0"/>
+          <w:i/>
+          <w:sz w:val="19"/>
+        </w:rPr>
+        <w:t>„Cadences"</w:t>
+      </w:r>
+      <w:r>
+        <w:rPr>
+          <w:rFonts w:ascii="Arial" w:hAnsi="Arial"/>
+          <w:b w:val="0"/>
+          <w:i w:val="0"/>
+          <w:sz w:val="19"/>
+        </w:rPr>
+        <w:t xml:space="preserve"> (~9.700 Claude-Nutzerinnen und -Nutzer, rund 50 % erwarten KI könne ≥ 50 % ihrer Aufgaben übernehmen, ~10 % Verlust­erwartung; Delegationsanteil korreliert positiv mit Arbeitszufriedenheit über sechs Wirkungsdimensionen), des am 29. Juni 2026 durch den Rat der EU final gebilligten </w:t>
+      </w:r>
+      <w:r>
+        <w:rPr>
+          <w:rFonts w:ascii="Arial" w:hAnsi="Arial"/>
+          <w:b w:val="0"/>
+          <w:i/>
+          <w:sz w:val="19"/>
+        </w:rPr>
+        <w:t>Digital Omnibus on AI</w:t>
+      </w:r>
+      <w:r>
+        <w:rPr>
+          <w:rFonts w:ascii="Arial" w:hAnsi="Arial"/>
+          <w:b w:val="0"/>
+          <w:i w:val="0"/>
+          <w:sz w:val="19"/>
+        </w:rPr>
+        <w:t xml:space="preserve"> / </w:t>
+      </w:r>
+      <w:r>
+        <w:rPr>
+          <w:rFonts w:ascii="Arial" w:hAnsi="Arial"/>
+          <w:b w:val="0"/>
+          <w:i/>
+          <w:sz w:val="19"/>
+        </w:rPr>
+        <w:t>Omnibus VII</w:t>
+      </w:r>
+      <w:r>
+        <w:rPr>
+          <w:rFonts w:ascii="Arial" w:hAnsi="Arial"/>
+          <w:b w:val="0"/>
+          <w:i w:val="0"/>
+          <w:sz w:val="19"/>
+        </w:rPr>
+        <w:t xml:space="preserve"> (Anwendungsdaten Hochrisiko 2. Dezember 2027 Anhang III bzw. 2. August 2028 Anhang I; Sandbox-Frist 2. August 2027; verkürzte Transparenz-Übergangsfrist Art. 50; Erweiterung Art. 5 um Verbot nicht-einvernehmlicher intimer KI-Inhalte und CSAM; GPAI-Durchsetzungsbefugnisse ab 2. August 2026 wie vorgesehen) sowie des am 2. Juli 2026 durch </w:t>
+      </w:r>
+      <w:r>
+        <w:rPr>
+          <w:rFonts w:ascii="Arial" w:hAnsi="Arial"/>
+          <w:b w:val="0"/>
+          <w:i/>
+          <w:sz w:val="19"/>
+        </w:rPr>
+        <w:t>Microsoft</w:t>
+      </w:r>
+      <w:r>
+        <w:rPr>
+          <w:rFonts w:ascii="Arial" w:hAnsi="Arial"/>
+          <w:b w:val="0"/>
+          <w:i w:val="0"/>
+          <w:sz w:val="19"/>
+        </w:rPr>
+        <w:t xml:space="preserve"> zum Fiskaljahresstart bekanntgegebenen Stellenabbaus von rund 9.000 Positionen (&lt; 4 % globale Belegschaft, Sales/Consulting/Xbox; teilweise durch Vorziehung über das im Mai angebotene VRSAR-Buyout-Programm reduziert) und der </w:t>
+      </w:r>
+      <w:r>
+        <w:rPr>
+          <w:rFonts w:ascii="Arial" w:hAnsi="Arial"/>
+          <w:b w:val="0"/>
+          <w:i/>
+          <w:sz w:val="19"/>
+        </w:rPr>
+        <w:t>Challenger, Gray &amp; Christmas</w:t>
+      </w:r>
+      <w:r>
+        <w:rPr>
+          <w:rFonts w:ascii="Arial" w:hAnsi="Arial"/>
+          <w:b w:val="0"/>
+          <w:i w:val="0"/>
+          <w:sz w:val="19"/>
+        </w:rPr>
+        <w:t>-Reports für Mai (97.006 US-Streichungen +16 % gegenüber April; KI 38.579 = 40 % — Rekord seit Kategorisierungsbeginn 2023; YTD-KI 87.714 = 22 %) und Juni 2026 (45.849 Streichungen −53 % gegenüber Mai; KI 14.029 = 31 %, vierten Monat in Folge Nr. 1; YTD-KI 101.743 = 23 % und damit im ersten Halbjahr bereits rund 86 % über der Gesamtjahressumme 2025). Eine regelmäßige Aktualisierung ist vorgesehen.</w:t>
       </w:r>
     </w:p>
     <w:p>
@@ -10862,7 +11554,7 @@
         <w:color w:val="999999"/>
         <w:sz w:val="15"/>
       </w:rPr>
-      <w:t>Version 22.0 — Mai 2026 — CC BY 4.0</w:t>
+      <w:t>Version 23.0 — Mai 2026 — CC BY 4.0</w:t>
       <w:tab/>
       <w:t xml:space="preserve">Seite </w:t>
     </w:r>

</xml_diff>

<commit_message>
Struktur-Review Version 26.0: § 1.1 verdichtet, Zahlen-Fortschreibung nach Statistik.md verlagert
Umsetzung der drei vom Autor freigegebenen Maßnahmen:
- § 1.1 von 17.900 auf ~5.600 Zeichen restrukturiert (fünf Absätze),
  Aktualitätshinweis am Dokumentende auf einen Absatz kompaktiert;
  alle Zahlenstände bleiben in Statistik.md und Git-Historie erhalten
- DailyPrompt.md: Zahlen-Fortschreibungen künftig ausschließlich als
  Tabellenzeilen in Statistik.md; ins Hauptdokument nur
  Argument-Änderungen; keine Fortschreibungsketten im Fließtext mehr
- README: KI-Offenlegung auf einen Absatz mit Verweis auf
  Änderungshistorie/Validierung-Ergebnisse verdichtet

Validierung protokolliert, PDF und DOCX neu gebaut, Version 25.0 → 26.0.

Co-Authored-By: Claude Fable 5 <noreply@anthropic.com>
Claude-Session: https://claude.ai/code/session_017Bfup8wN1Gndz9p3qhnMxM
</commit_message>
<xml_diff>
--- a/KI-Ökonomie.docx
+++ b/KI-Ökonomie.docx
@@ -112,7 +112,7 @@
           <w:color w:val="666666"/>
           <w:sz w:val="18"/>
         </w:rPr>
-        <w:t>Version 25.0</w:t>
+        <w:t>Version 26.0</w:t>
       </w:r>
     </w:p>
     <w:p>
@@ -184,7 +184,21 @@
           <w:i w:val="0"/>
           <w:sz w:val="19"/>
         </w:rPr>
-        <w:t xml:space="preserve">Der Einsatz von KI-Systemen und Robotik in produktiven und dienstleistenden Tätigkeiten beschleunigt sich. Zwei parallele Entwicklungen erzeugen politischen Handlungsdruck: Einerseits warnen Studien vor erheblichen Verschiebungen auf dem Arbeitsmarkt — das IAB (Institut für Arbeitsmarkt- und Berufsforschung) rechnet im KI-Szenario für Deutschland mit einem Wegfall oder Neuentstehen von rund 1,6 Millionen Stellen in den nächsten 15 Jahren bei gleichzeitigem Wertschöpfungszuwachs von 4,5 Billionen Euro; kurzfristig hat das IAB seine Prognose für 2026 mit der Fassung vom 24. März 2026 („Fiskalpolitischer Rückenwind trifft auf geopolitischen Gegenwind") gegenüber dem IAB-Kurzbericht 19/2025 (24. September 2025, damals: −20.000 Erwerbstätigkeit) deutlich nach unten revidiert: Bei einem Wachstum des Bruttoinlandsprodukts von 0,8 % — laut IAB infolge des Iran-Krieges um 0,2 bis 0,3 Prozentpunkte gedämpft — wird nun ein Rückgang der Erwerbstätigkeit um 90.000 auf 45,89 Millionen Personen erwartet, ein erstmals seit der Finanzkrise 2009 nicht mehr wachsender Bestand sozialversicherungspflichtiger Beschäftigung (−30.000 auf 34,93 Millionen) sowie ein Anstieg der Arbeitslosigkeit um 40.000; in dreizehn der sechzehn Bundesländer ist nach der parallelen IAB-Regionalprognose mit einem weiteren Anstieg der Arbeitslosigkeit zu rechnen. Sektoral fällt der Befund zweigeteilt aus: Der Industriesektor verliert rund 140.000 Stellen, während öffentliche Dienste, Erziehung und Gesundheit zusammen rund 180.000 Stellen aufbauen. Das Erwerbspersonenpotenzial sinkt nach der aktualisierten Prognose erstmals um 40.000 auf 48,62 Millionen Personen — eine strukturelle Kenngröße, die das Finanzierungsproblem der lohnbasierten Sozialversicherung unabhängig von KI-Effekten verschärft. Parallel dazu dokumentiert eine Branchenauswertung für das erste Quartal 2026 rund 78.500 Stellenstreichungen in der weltweiten Tech-Industrie, davon etwa 48 % explizit als KI- oder Automatisierungsmaßnahmen begründet; im April 2026 traten Oracle (20.000 – 30.000 Stellen mit Bezug zur AI-Rechenzentrumsinfrastruktur), Meta (rund 8.000 Stellen ab 20. Mai 2026) und Amazon (rund 16.000 Stellen im Zuge einer KI-induzierten Umstrukturierung) hinzu; Branchen-Tracker weisen für 2026 bis Mitte April einen kumulierten Bestand von über 150.000 Tech-Stellenstreichungen aus. Am 24. April 2026 hat Microsoft zusätzlich Buyout-Programme für rund sieben Prozent seiner länger beschäftigten US-Belegschaft angekündigt; das Programm gilt nach Berichterstattung als das erste </w:t>
+        <w:t>Der Einsatz von KI-Systemen und Robotik in produktiven und dienstleistenden Tätigkeiten beschleunigt sich. Zwei parallele Entwicklungen erzeugen politischen Handlungsdruck. Einerseits warnen Studien vor erheblichen Verschiebungen auf dem Arbeitsmarkt: Das IAB (Institut für Arbeitsmarkt- und Berufsforschung) rechnet im KI-Szenario für Deutschland mit einem Wegfall oder Neuentstehen von rund 1,6 Millionen Stellen in den nächsten 15 Jahren bei gleichzeitigem Wertschöpfungszuwachs von 4,5 Billionen Euro. Kurzfristig hat das IAB seine Prognose für 2026 mit der Frühjahrsprognose vom 24. März 2026 („Fiskalpolitischer Rückenwind trifft auf geopolitischen Gegenwind") deutlich nach unten revidiert: Erwartet werden ein Rückgang der Erwerbstätigkeit um 90.000 Personen (statt zuvor −20.000 im IAB-Kurzbericht 19/2025), ein erstmals seit der Finanzkrise 2009 nicht mehr wachsender Bestand sozialversicherungspflichtiger Beschäftigung sowie ein erstmals sinkendes Erwerbspersonenpotenzial — eine strukturelle Kenngröße, die das Finanzierungsproblem der lohnbasierten Sozialversicherung unabhängig von KI-Effekten verschärft. Sektoral fällt der Befund zweigeteilt aus: Die Industrie verliert rund 140.000 Stellen, während öffentliche Dienste, Erziehung und Gesundheit zusammen rund 180.000 Stellen aufbauen.</w:t>
+      </w:r>
+    </w:p>
+    <w:p>
+      <w:pPr>
+        <w:jc w:val="both"/>
+      </w:pPr>
+      <w:r>
+        <w:rPr>
+          <w:rFonts w:ascii="Arial" w:hAnsi="Arial"/>
+          <w:b w:val="0"/>
+          <w:i w:val="0"/>
+          <w:sz w:val="19"/>
+        </w:rPr>
+        <w:t xml:space="preserve">Parallel dazu hat sich 2026 in der Tech-Branche ein durchgehend KI-begründeter Restrukturierungspfad verstetigt. Branchen-Tracker zählen zur Jahresmitte 2026 zwischen rund 165.000 (TrueUp) und 186.000 (SkillSyncer) betroffene Beschäftigte — kumuliert weniger als im Gesamtjahr 2025, aber mit einer um rund ein Drittel höheren täglichen Rate. Nach den Monatsreports von </w:t>
       </w:r>
       <w:r>
         <w:rPr>
@@ -193,16 +207,44 @@
           <w:i/>
           <w:sz w:val="19"/>
         </w:rPr>
-        <w:t>Voluntary-Retirement-Programm</w:t>
-      </w:r>
-      <w:r>
-        <w:rPr>
-          <w:rFonts w:ascii="Arial" w:hAnsi="Arial"/>
-          <w:b w:val="0"/>
-          <w:i w:val="0"/>
-          <w:sz w:val="19"/>
-        </w:rPr>
-        <w:t xml:space="preserve"> der Konzerngeschichte und zielt — bei rund 125.000 US-Beschäftigten — auf bis zu 8.750 mögliche Austritte. Eligible sind Beschäftigte auf Senior-Director-Ebene und darunter, deren Summe aus Lebensalter und Betriebszugehörigkeit mindestens 70 erreicht und die nicht in laufenden Sales- oder Services-Incentive-Plänen stehen; die individuellen Buyout-Angebote sind am 7. Mai 2026 mit Annahmefrist bis 8. Juni 2026 (23:59 Pacific Time) versandt worden, die Unterzeichnung der </w:t>
+        <w:t>Challenger, Gray &amp; Christmas</w:t>
+      </w:r>
+      <w:r>
+        <w:rPr>
+          <w:rFonts w:ascii="Arial" w:hAnsi="Arial"/>
+          <w:b w:val="0"/>
+          <w:i w:val="0"/>
+          <w:sz w:val="19"/>
+        </w:rPr>
+        <w:t xml:space="preserve"> ist KI seit März 2026 vier Monate in Folge der am häufigsten genannte Einzelgrund für US-Stellenstreichungen; die KI-begründeten Streichungen des ersten Halbjahres 2026 (101.743, rund 23 % aller Streichungspläne des Jahres) übersteigen die Gesamtjahressumme 2025 bereits um rund 86 %. Die größten einzeln dokumentierten Maßnahmen reichen von Oracle (rund 21.000 Stellen im Geschäftsjahr 2026, etwa 13 % der Belegschaft) über Amazon (seit Oktober 2025 kumuliert mehr als 30.000 Stellen), Cognizant, Microsoft, Meta und PayPal bis zu Cloudflare, Coinbase und Freshworks — zusammen rund 73.000 bis 76.000 Stellen mit expliziter KI-Begründung. Die vollständigen Zeitreihen, Monatsreihen und Einzelmeldungen mit allen Quellen- und Detailangaben sind im quantitativen Anhang dieses Papiers (`Statistik.md`) dokumentiert und werden dort fortgeschrieben.</w:t>
+      </w:r>
+    </w:p>
+    <w:p>
+      <w:pPr>
+        <w:jc w:val="both"/>
+      </w:pPr>
+      <w:r>
+        <w:rPr>
+          <w:rFonts w:ascii="Arial" w:hAnsi="Arial"/>
+          <w:b w:val="0"/>
+          <w:i w:val="0"/>
+          <w:sz w:val="19"/>
+        </w:rPr>
+        <w:t>Bemerkenswert ist die Asymmetrie zwischen Personalabbau und Infrastrukturausbau: Die KI-Investitionsprogramme der Hyperscaler wurden nach den Q1-2026-Earnings-Calls auf rund 725 Milliarden US-Dollar für das Jahr 2026 revidiert (+77 % gegenüber 2025), mit einem Wall-Street-Ausblick von über einer Billion US-Dollar für 2027. Diese Konstellation — sinkender Personalbestand bei zugleich historisch hohem Aufbau von Maschinenkapital — strukturiert die Steuerdebatte über die Anknüpfung an Maschinenkapital und Wertschöpfung (§ 5.1, § 8.3).</w:t>
+      </w:r>
+    </w:p>
+    <w:p>
+      <w:pPr>
+        <w:jc w:val="both"/>
+      </w:pPr>
+      <w:r>
+        <w:rPr>
+          <w:rFonts w:ascii="Arial" w:hAnsi="Arial"/>
+          <w:b w:val="0"/>
+          <w:i w:val="0"/>
+          <w:sz w:val="19"/>
+        </w:rPr>
+        <w:t xml:space="preserve">Zur Vorsicht gegenüber einer monokausalen KI-Lesart mahnen allerdings drei Befunde. Erstens hat die </w:t>
       </w:r>
       <w:r>
         <w:rPr>
@@ -211,16 +253,16 @@
           <w:i/>
           <w:sz w:val="19"/>
         </w:rPr>
-        <w:t>Voluntary Retirement Separation Agreement and Release</w:t>
-      </w:r>
-      <w:r>
-        <w:rPr>
-          <w:rFonts w:ascii="Arial" w:hAnsi="Arial"/>
-          <w:b w:val="0"/>
-          <w:i w:val="0"/>
-          <w:sz w:val="19"/>
-        </w:rPr>
-        <w:t xml:space="preserve"> (VRSAR) erfolgt zwischen 9. und 22. Juni 2026, die regulär verbindliche </w:t>
+        <w:t>Washington Post</w:t>
+      </w:r>
+      <w:r>
+        <w:rPr>
+          <w:rFonts w:ascii="Arial" w:hAnsi="Arial"/>
+          <w:b w:val="0"/>
+          <w:i w:val="0"/>
+          <w:sz w:val="19"/>
+        </w:rPr>
+        <w:t xml:space="preserve"> (1. Mai 2026) dargelegt, dass sich die Tech-Streichungen bei Amazon, Meta und Microsoft nicht ausschließlich aus KI-Verdrängung speisen, sondern auch aus Austerity-Logiken, Korrekturen der pandemiebedingten Überbeschäftigung und Routine-Restrukturierungen. Zweitens dokumentiert eine von </w:t>
       </w:r>
       <w:r>
         <w:rPr>
@@ -229,384 +271,6 @@
           <w:i/>
           <w:sz w:val="19"/>
         </w:rPr>
-        <w:t>Separation Date</w:t>
-      </w:r>
-      <w:r>
-        <w:rPr>
-          <w:rFonts w:ascii="Arial" w:hAnsi="Arial"/>
-          <w:b w:val="0"/>
-          <w:i w:val="0"/>
-          <w:sz w:val="19"/>
-        </w:rPr>
-        <w:t xml:space="preserve"> fällt auf den 2. Juli 2026; nach den am 7. Mai 2026 publizierten Programmkonditionen sind rund 8.500 Beschäftigte angebotsberechtigt, das Paket umfasst eine Cash-Einmalzahlung sowie eine bis zu fünfjährige Krankenversicherungs-Verlängerung und enthält keine Wettbewerbs- oder Beschäftigungsverbote. Im Zusammenspiel mit den am selben Tag bekräftigten Meta-Streichungen ordneten Wirtschaftsmedien (CNBC, 24. April 2026) die Welle erstmals als „AI-driven labor crisis" ein — ein Begriff, der den Übergang von Einzelfällen zu einer kumulativen Branchenerzählung markiert. Bis zur Wochenmitte des 25. April 2026 weisen Branchen-Tracker einen kumulierten Bestand von über 92.000 Tech-Stellenstreichungen für das laufende Jahr 2026 aus; eine Aktualisierung zum 2. Mai 2026 hebt die Marke nach Tracker-Methodik des SkillSyncer auf 113.863 betroffene Beschäftigte aus 179 erfassten Layoff-Ereignissen (durchschnittlich rund 933 Stellen pro Tag), während TrueUp parallel 95.878 Personen aus 249 Einzelmeldungen zählt; die Methodikspanne erklärt die unterschiedlichen Größenordnungen, das Niveau einer sechsstelligen Tech-Reduktion innerhalb von vier Monaten ist über alle Tracker hinweg konsistent. Eine erneute Aktualisierung zum 6. Mai 2026 zeigt, dass die TrueUp-Zählung weiter auf 119.721 betroffene Personen aus 265 Layoff-Meldungen gestiegen ist (rund 958 Stellen pro Tag), während SkillSyncer mit 113.863 Personen aus 179 Ereignissen weitgehend unverändert bleibt; eine Tagesfortschreibung der TrueUp-Methodik weist zum 7. Mai 2026 bereits 121.111 Personen aus 273 Layoff-Meldungen aus (rund 961 Personen pro Tag); die nochmalige Aktualisierung zum 8. Mai 2026 hebt die Marke nach den am Vortag angekündigten Cloudflare-Streichungen auf 127.411 betroffene Personen aus 283 Layoff-Meldungen (rund 1.003 Stellen pro Tag), wobei die zusätzlichen Meldungen primär aus den am 5./6. Mai 2026 angekündigten Stellenstreichungen bei </w:t>
-      </w:r>
-      <w:r>
-        <w:rPr>
-          <w:rFonts w:ascii="Arial" w:hAnsi="Arial"/>
-          <w:b w:val="0"/>
-          <w:i/>
-          <w:sz w:val="19"/>
-        </w:rPr>
-        <w:t>Coinbase</w:t>
-      </w:r>
-      <w:r>
-        <w:rPr>
-          <w:rFonts w:ascii="Arial" w:hAnsi="Arial"/>
-          <w:b w:val="0"/>
-          <w:i w:val="0"/>
-          <w:sz w:val="19"/>
-        </w:rPr>
-        <w:t xml:space="preserve"> (rund 700 Stellen, 14 % der Belegschaft, ausdrücklich begründet mit dem Übergang zu einer „AI-native"-Organisation; Restrukturierungsaufwand 50 bis 60 Millionen US-Dollar, weitgehender Abschluss im zweiten Quartal 2026), </w:t>
-      </w:r>
-      <w:r>
-        <w:rPr>
-          <w:rFonts w:ascii="Arial" w:hAnsi="Arial"/>
-          <w:b w:val="0"/>
-          <w:i/>
-          <w:sz w:val="19"/>
-        </w:rPr>
-        <w:t>PayPal</w:t>
-      </w:r>
-      <w:r>
-        <w:rPr>
-          <w:rFonts w:ascii="Arial" w:hAnsi="Arial"/>
-          <w:b w:val="0"/>
-          <w:i w:val="0"/>
-          <w:sz w:val="19"/>
-        </w:rPr>
-        <w:t xml:space="preserve"> (rund 4.760 Stellen, 20 % der Belegschaft über zwei bis drei Jahre, mit erwarteten Einsparungen von mindestens 1,5 Milliarden US-Dollar und ausdrücklicher Strategie, „wieder ein Technologieunternehmen zu werden" durch aggressive KI-Adoption und Cloud-Migration), </w:t>
-      </w:r>
-      <w:r>
-        <w:rPr>
-          <w:rFonts w:ascii="Arial" w:hAnsi="Arial"/>
-          <w:b w:val="0"/>
-          <w:i/>
-          <w:sz w:val="19"/>
-        </w:rPr>
-        <w:t>Freshworks</w:t>
-      </w:r>
-      <w:r>
-        <w:rPr>
-          <w:rFonts w:ascii="Arial" w:hAnsi="Arial"/>
-          <w:b w:val="0"/>
-          <w:i w:val="0"/>
-          <w:sz w:val="19"/>
-        </w:rPr>
-        <w:t xml:space="preserve"> (rund 500 Stellen, 11 % der Belegschaft, mit dem Hinweis des Vorstandsvorsitzenden, „über die Hälfte des Codes" werde inzwischen von KI geschrieben) und </w:t>
-      </w:r>
-      <w:r>
-        <w:rPr>
-          <w:rFonts w:ascii="Arial" w:hAnsi="Arial"/>
-          <w:b w:val="0"/>
-          <w:i/>
-          <w:sz w:val="19"/>
-        </w:rPr>
-        <w:t>Cognizant</w:t>
-      </w:r>
-      <w:r>
-        <w:rPr>
-          <w:rFonts w:ascii="Arial" w:hAnsi="Arial"/>
-          <w:b w:val="0"/>
-          <w:i w:val="0"/>
-          <w:sz w:val="19"/>
-        </w:rPr>
-        <w:t xml:space="preserve"> (12.000 bis 15.000 Stellen weltweit unter dem internen Programm „Project Leap", Abfindungsaufwand 230 bis 320 Millionen US-Dollar; bei rund 357.000 Beschäftigten weltweit und 250.000 in Indien dürfte der Großteil der Streichungen den dortigen Standort treffen) sowie aus der am 7. Mai 2026 vom Cloud-Anbieter </w:t>
-      </w:r>
-      <w:r>
-        <w:rPr>
-          <w:rFonts w:ascii="Arial" w:hAnsi="Arial"/>
-          <w:b w:val="0"/>
-          <w:i/>
-          <w:sz w:val="19"/>
-        </w:rPr>
-        <w:t>Cloudflare</w:t>
-      </w:r>
-      <w:r>
-        <w:rPr>
-          <w:rFonts w:ascii="Arial" w:hAnsi="Arial"/>
-          <w:b w:val="0"/>
-          <w:i w:val="0"/>
-          <w:sz w:val="19"/>
-        </w:rPr>
-        <w:t xml:space="preserve"> parallel zu den Q1-2026-Quartalszahlen (Umsatz +34 % gegenüber dem Vorjahr) angekündigten Streichung von rund 1.100 Stellen — etwa 20 % der globalen Belegschaft — als Übergang zu einem „agentic AI-first operating model" gespeist sind; der gemeinsame Mitarbeitendenbrief von Vorstandsvorsitzendem Matthew Prince und Mitgründerin Michelle Zatlyn („Building for the future") begründet die Reduktion ausdrücklich nicht als Kostenmaßnahme oder leistungsabhängige Auswahl, sondern als strukturelle Anpassung an einen über das Quartal um rund 600 % gestiegenen unternehmensinternen KI-Einsatz; das Restrukturierungsvolumen wird mit 140 bis 150 Millionen US-Dollar im zweiten Quartal beziffert, ausscheidende Beschäftigte erhalten ihre Grundvergütung bis Ende 2026, US-Beschäftigte zusätzlich Krankenversicherungsschutz bis Jahresende und Equity-Vesting bis 15. August 2026; der Aktienkurs gab nach Bekanntgabe rund 18 % ab. Eine Aggregat-Bestätigung dieser Welle liefert der </w:t>
-      </w:r>
-      <w:r>
-        <w:rPr>
-          <w:rFonts w:ascii="Arial" w:hAnsi="Arial"/>
-          <w:b w:val="0"/>
-          <w:i/>
-          <w:sz w:val="19"/>
-        </w:rPr>
-        <w:t>April-2026-Job-Cuts-Report</w:t>
-      </w:r>
-      <w:r>
-        <w:rPr>
-          <w:rFonts w:ascii="Arial" w:hAnsi="Arial"/>
-          <w:b w:val="0"/>
-          <w:i w:val="0"/>
-          <w:sz w:val="19"/>
-        </w:rPr>
-        <w:t xml:space="preserve"> von </w:t>
-      </w:r>
-      <w:r>
-        <w:rPr>
-          <w:rFonts w:ascii="Arial" w:hAnsi="Arial"/>
-          <w:b w:val="0"/>
-          <w:i/>
-          <w:sz w:val="19"/>
-        </w:rPr>
-        <w:t>Challenger, Gray &amp; Christmas</w:t>
-      </w:r>
-      <w:r>
-        <w:rPr>
-          <w:rFonts w:ascii="Arial" w:hAnsi="Arial"/>
-          <w:b w:val="0"/>
-          <w:i w:val="0"/>
-          <w:sz w:val="19"/>
-        </w:rPr>
-        <w:t xml:space="preserve"> (veröffentlicht zum 1. Mai 2026): KI ist nach März 2026 zum zweiten Mal in Folge der am häufigsten genannte Einzelgrund für US-Stellenstreichungen mit 21.490 angekündigten KI-bezogenen Streichungen im April 2026 — entsprechend 26 % der insgesamt 83.387 Streichungen des Monats und einer Steigerung um 38 % gegenüber März 2026; im laufenden Jahr liegt die Tech-Branche bei 85.411 Streichungen kumuliert (+33 % gegenüber dem Vorjahresstand) und KI-bezogen bei 49.135 — entsprechend rund 16 % aller bislang im Jahr 2026 angekündigten Streichungen, gegenüber rund 13 % zum März-Stand; gesamtwirtschaftlich sind die Streichungen 2026 nach Challenger-Methodik bislang um rund 50 % unter dem Vorjahresvergleichszeitraum, was die in der </w:t>
-      </w:r>
-      <w:r>
-        <w:rPr>
-          <w:rFonts w:ascii="Arial" w:hAnsi="Arial"/>
-          <w:b w:val="0"/>
-          <w:i/>
-          <w:sz w:val="19"/>
-        </w:rPr>
-        <w:t>Washington-Post</w:t>
-      </w:r>
-      <w:r>
-        <w:rPr>
-          <w:rFonts w:ascii="Arial" w:hAnsi="Arial"/>
-          <w:b w:val="0"/>
-          <w:i w:val="0"/>
-          <w:sz w:val="19"/>
-        </w:rPr>
-        <w:t xml:space="preserve">-Differenzierung vom 1. Mai 2026 genannte Mehrkanalerklärung (KI-Verdrängung, Austerity-Logik, Pandemie-Korrekturen, Routine-Restrukturierung) zusätzlich stützt. Der </w:t>
-      </w:r>
-      <w:r>
-        <w:rPr>
-          <w:rFonts w:ascii="Arial" w:hAnsi="Arial"/>
-          <w:b w:val="0"/>
-          <w:i/>
-          <w:sz w:val="19"/>
-        </w:rPr>
-        <w:t>Mai-2026-Job-Cuts-Report</w:t>
-      </w:r>
-      <w:r>
-        <w:rPr>
-          <w:rFonts w:ascii="Arial" w:hAnsi="Arial"/>
-          <w:b w:val="0"/>
-          <w:i w:val="0"/>
-          <w:sz w:val="19"/>
-        </w:rPr>
-        <w:t xml:space="preserve"> von </w:t>
-      </w:r>
-      <w:r>
-        <w:rPr>
-          <w:rFonts w:ascii="Arial" w:hAnsi="Arial"/>
-          <w:b w:val="0"/>
-          <w:i/>
-          <w:sz w:val="19"/>
-        </w:rPr>
-        <w:t>Challenger, Gray &amp; Christmas</w:t>
-      </w:r>
-      <w:r>
-        <w:rPr>
-          <w:rFonts w:ascii="Arial" w:hAnsi="Arial"/>
-          <w:b w:val="0"/>
-          <w:i w:val="0"/>
-          <w:sz w:val="19"/>
-        </w:rPr>
-        <w:t xml:space="preserve"> (2. Juni 2026) zeigt eine erneute Beschleunigung: 97.006 US-Streichungen im Mai (+16 % gegenüber April; höchster Mai-Wert seit 2020), KI-bezogen 38.579 — 40 % aller Mai-Streichungen und der bislang höchste Monatswert seit Beginn der Kategorisierung 2023; Tech mit 38.242 Streichungen erreicht den höchsten Monatswert seit August 2024, YTD-KI liegt bei 87.714 (22 % aller 2026-Streichungspläne). Der Folge-Report für Juni 2026 (2. Juli 2026) meldet demgegenüber einen deutlichen Rückgang auf 45.849 Streichungen (−53 % gegenüber Mai; −4 % gegenüber Juni 2025); KI bleibt vierten Monat in Folge führender Einzelgrund mit 14.029 Streichungen (31 % des Monatsvolumens), YTD-KI kumuliert auf 101.743 (rund 23 % aller im Jahr 2026 angekündigten Streichungen) und übersteigt damit die Gesamtjahres­summe 2025 (54.836) im ersten Halbjahr um rund 86 %. Am 2. Juli 2026 hat </w:t>
-      </w:r>
-      <w:r>
-        <w:rPr>
-          <w:rFonts w:ascii="Arial" w:hAnsi="Arial"/>
-          <w:b w:val="0"/>
-          <w:i/>
-          <w:sz w:val="19"/>
-        </w:rPr>
-        <w:t>Microsoft</w:t>
-      </w:r>
-      <w:r>
-        <w:rPr>
-          <w:rFonts w:ascii="Arial" w:hAnsi="Arial"/>
-          <w:b w:val="0"/>
-          <w:i w:val="0"/>
-          <w:sz w:val="19"/>
-        </w:rPr>
-        <w:t xml:space="preserve"> parallel zum Start seines Geschäftsjahres 2026 rund 9.000 zusätzliche Stellenstreichungen bekanntgegeben (weniger als 4 % der weltweiten Belegschaft) und damit den seit 2023 verstetigten Fiskaljahres-Restrukturierungspfad fortgesetzt; die Reduktion trifft Sales-, Consulting- und Xbox-Bereiche und fällt nach Konzernangaben geringer aus als die rund 9.000 Streichungen des Vorjahres, weil rund ein Drittel der zum 2. Juli 2026 fälligen </w:t>
-      </w:r>
-      <w:r>
-        <w:rPr>
-          <w:rFonts w:ascii="Arial" w:hAnsi="Arial"/>
-          <w:b w:val="0"/>
-          <w:i/>
-          <w:sz w:val="19"/>
-        </w:rPr>
-        <w:t>Voluntary Retirement Separation Agreements</w:t>
-      </w:r>
-      <w:r>
-        <w:rPr>
-          <w:rFonts w:ascii="Arial" w:hAnsi="Arial"/>
-          <w:b w:val="0"/>
-          <w:i w:val="0"/>
-          <w:sz w:val="19"/>
-        </w:rPr>
-        <w:t xml:space="preserve"> (VRSAR) aus dem am 7. Mai 2026 angebotenen Buyout-Programm angenommen wurde und einen entsprechenden Teil der geplanten Reduktion vorwegnahm. Anfang Juli 2026 präzisieren Finanzmedien (TechRepublic, Yahoo Finance) die reine Layoff-Komponente jenseits der bereits abgeschlossenen VRSAR-Austritte auf voraussichtlich weniger als 5.500 Beschäftigte beziehungsweise unter 2,5 % der weltweiten Belegschaft; die Größenordnung ist damit erkennbar niedriger als die aggregierte 9.000-Zahl, weil die VRSAR-Annahmen den Layoff-Bedarf bereits vorwegnahmen. Zur weiteren Einordnung schreibt </w:t>
-      </w:r>
-      <w:r>
-        <w:rPr>
-          <w:rFonts w:ascii="Arial" w:hAnsi="Arial"/>
-          <w:b w:val="0"/>
-          <w:i/>
-          <w:sz w:val="19"/>
-        </w:rPr>
-        <w:t>SkillSyncer</w:t>
-      </w:r>
-      <w:r>
-        <w:rPr>
-          <w:rFonts w:ascii="Arial" w:hAnsi="Arial"/>
-          <w:b w:val="0"/>
-          <w:i w:val="0"/>
-          <w:sz w:val="19"/>
-        </w:rPr>
-        <w:t xml:space="preserve"> seinen Layoff-Tracker zum 5. Juli 2026 auf 185.894 betroffene Beschäftigte aus 267 Layoff-Ereignissen fort (rund 999 Stellen pro Tag; +58.483 gegenüber dem 8. Mai 2026); </w:t>
-      </w:r>
-      <w:r>
-        <w:rPr>
-          <w:rFonts w:ascii="Arial" w:hAnsi="Arial"/>
-          <w:b w:val="0"/>
-          <w:i/>
-          <w:sz w:val="19"/>
-        </w:rPr>
-        <w:t>TrueUp</w:t>
-      </w:r>
-      <w:r>
-        <w:rPr>
-          <w:rFonts w:ascii="Arial" w:hAnsi="Arial"/>
-          <w:b w:val="0"/>
-          <w:i w:val="0"/>
-          <w:sz w:val="19"/>
-        </w:rPr>
-        <w:t xml:space="preserve"> zählt zur Jahresmitte 2026 rund 164.971 Personen aus 435 Layoff-Meldungen (rund 887 pro Tag) und dokumentiert damit ein 2026 kumuliert niedrigeres Volumen als 2025 (245.953 Personen aus 783 Meldungen), aber eine deutlich höhere tägliche Rate (887 gegenüber 674 pro Tag). Parallel bestätigt </w:t>
-      </w:r>
-      <w:r>
-        <w:rPr>
-          <w:rFonts w:ascii="Arial" w:hAnsi="Arial"/>
-          <w:b w:val="0"/>
-          <w:i/>
-          <w:sz w:val="19"/>
-        </w:rPr>
-        <w:t>Oracle</w:t>
-      </w:r>
-      <w:r>
-        <w:rPr>
-          <w:rFonts w:ascii="Arial" w:hAnsi="Arial"/>
-          <w:b w:val="0"/>
-          <w:i w:val="0"/>
-          <w:sz w:val="19"/>
-        </w:rPr>
-        <w:t xml:space="preserve"> in der FY2026-Berichterstattung (SEC-8-K, Juni 2026) einen jahresbezogenen Personalabbau von rund 21.000 Stellen — etwa 13 % der Konzernbelegschaft, die damit von rund 162.000 (Mai 2025) auf 141.000 (Mai 2026) sinkt; der Restrukturierungsaufwand steigt entsprechend von 374 Millionen US-Dollar (FY2025) auf rund 1,8 Milliarden US-Dollar (FY2026), das zeitgleich angekündigte KI- und Cloud-Investitionsvolumen liegt für das Geschäftsjahr bei rund 50 Milliarden US-Dollar. Für die Steuerdebatte verdichtet sich damit das Bild eines vier Monate durchgehenden KI-getriebenen Restrukturierungspfads bei zugleich unverändert hohem Capex — eine Konstellation, die das Argument in § 5.1 und § 8.3 (Anknüpfung an Maschinenkapital und Wertschöpfung) auch im mittelfristigen Verlauf stützt. Der parallele Lauf der Branchen-AI-Capex-Programme (Q1-2026-Investitionen der Hyperscaler von rund 130,65 Milliarden US-Dollar; Konsens-Schätzung Anfang April 2026 zwischen 660 und 700 Milliarden US-Dollar, nach den Q1-2026-Earnings-Calls vom 28.–30. April 2026 — von der </w:t>
-      </w:r>
-      <w:r>
-        <w:rPr>
-          <w:rFonts w:ascii="Arial" w:hAnsi="Arial"/>
-          <w:b w:val="0"/>
-          <w:i/>
-          <w:sz w:val="19"/>
-        </w:rPr>
-        <w:t>Financial Times</w:t>
-      </w:r>
-      <w:r>
-        <w:rPr>
-          <w:rFonts w:ascii="Arial" w:hAnsi="Arial"/>
-          <w:b w:val="0"/>
-          <w:i w:val="0"/>
-          <w:sz w:val="19"/>
-        </w:rPr>
-        <w:t xml:space="preserve"> aggregiert und Anfang Mai 2026 unter anderem von </w:t>
-      </w:r>
-      <w:r>
-        <w:rPr>
-          <w:rFonts w:ascii="Arial" w:hAnsi="Arial"/>
-          <w:b w:val="0"/>
-          <w:i/>
-          <w:sz w:val="19"/>
-        </w:rPr>
-        <w:t>Tom's Hardware</w:t>
-      </w:r>
-      <w:r>
-        <w:rPr>
-          <w:rFonts w:ascii="Arial" w:hAnsi="Arial"/>
-          <w:b w:val="0"/>
-          <w:i w:val="0"/>
-          <w:sz w:val="19"/>
-        </w:rPr>
-        <w:t xml:space="preserve"> (5./6. Mai 2026) und </w:t>
-      </w:r>
-      <w:r>
-        <w:rPr>
-          <w:rFonts w:ascii="Arial" w:hAnsi="Arial"/>
-          <w:b w:val="0"/>
-          <w:i/>
-          <w:sz w:val="19"/>
-        </w:rPr>
-        <w:t>Invezz</w:t>
-      </w:r>
-      <w:r>
-        <w:rPr>
-          <w:rFonts w:ascii="Arial" w:hAnsi="Arial"/>
-          <w:b w:val="0"/>
-          <w:i w:val="0"/>
-          <w:sz w:val="19"/>
-        </w:rPr>
-        <w:t xml:space="preserve"> (4. Mai 2026) referiert — auf rund 725 Milliarden US-Dollar nach oben revidiert, eine Steigerung um rund 77 % gegenüber dem Vorjahresniveau von 410 Milliarden US-Dollar; Microsoft 190, Alphabet 190, Amazon 200 und Meta 125–145 Milliarden US-Dollar, wobei Microsoft rund 25 Milliarden US-Dollar des eigenen Aufschlags auf gestiegene Speicher- und Chip-Kosten zurückführt — DRAM-Vertragspreise sind nach Auswertung von TrendForce im ersten Quartal 2026 um rund 95 % gegenüber dem Vorquartal gestiegen, mit einer für das zweite Quartal projizierten weiteren Verteuerung von 58 bis 63 %; Ausblick auf über 1 Billion US-Dollar im Jahr 2027) verdeutlicht die Asymmetrie zwischen Personalreduktion und Infrastrukturausbau, die die Steuerdebatte über die Anknüpfung an Maschinenkapital (§ 5.1, § 8.3) zusätzlich strukturiert. Eine ergänzende Auswertung von Goldman Sachs (Anfang April 2026) schätzt den US-weiten KI-Verdrängungseffekt auf rund 16.000 Stellen pro Monat, mit überproportionaler Betroffenheit von Berufseinsteigerinnen und -einsteigern (Gen Z) in routinisierten Bürotätigkeiten — diese Größenordnung stützt die in § 3.5 referierten Beobachtungen aus dem </w:t>
-      </w:r>
-      <w:r>
-        <w:rPr>
-          <w:rFonts w:ascii="Arial" w:hAnsi="Arial"/>
-          <w:b w:val="0"/>
-          <w:i/>
-          <w:sz w:val="19"/>
-        </w:rPr>
-        <w:t>Anthropic Economic Index</w:t>
-      </w:r>
-      <w:r>
-        <w:rPr>
-          <w:rFonts w:ascii="Arial" w:hAnsi="Arial"/>
-          <w:b w:val="0"/>
-          <w:i w:val="0"/>
-          <w:sz w:val="19"/>
-        </w:rPr>
-        <w:t xml:space="preserve"> zu sektoralen Frühwirkungen, ohne den aggregiert moderaten Befund umzukehren. Rechnet man die seit Oktober 2025 angekündigten Amazon-Reduktionen (≥ 30.000 Stellen, etwa zehn Prozent der Konzern- und Tech-Belegschaft) ein, hat allein dieser Hyperscaler binnen eines halben Jahres größere Personalanpassungen vorgenommen als die meisten DAX-Konzerne in einem Jahrzehnt. Zugleich stiegen KI-bezogene Stellenausschreibungen im selben Zeitraum deutlich an, was auf einen strukturellen Umbau der Beschäftigungszusammensetzung hindeutet. Eine analytische Gegenposition zu dieser KI-zentrischen Lesart hat die </w:t>
-      </w:r>
-      <w:r>
-        <w:rPr>
-          <w:rFonts w:ascii="Arial" w:hAnsi="Arial"/>
-          <w:b w:val="0"/>
-          <w:i/>
-          <w:sz w:val="19"/>
-        </w:rPr>
-        <w:t>Washington Post</w:t>
-      </w:r>
-      <w:r>
-        <w:rPr>
-          <w:rFonts w:ascii="Arial" w:hAnsi="Arial"/>
-          <w:b w:val="0"/>
-          <w:i w:val="0"/>
-          <w:sz w:val="19"/>
-        </w:rPr>
-        <w:t xml:space="preserve"> am 1. Mai 2026 vorgelegt: Die Tech-Streichungen bei Amazon, Meta und Microsoft seien nicht ausschließlich KI-getrieben, sondern speisten sich auch aus Austerity-Logiken (Kompensation der hohen KI-Investitionsausgaben), aus Korrekturen der pandemiebedingten Überbeschäftigung und aus Routine-Restrukturierungen; eine monokausale Zuschreibung verzerre damit die fiskalpolitischen Schlussfolgerungen. Für die Steuerdebatte ist diese Differenzierung relevant, weil sie die Anknüpfung von Steuern an „nachgewiesene KI-Verdrängung" (vgl. Typ 5 nach § 2.1, § 9.1) zusätzlich erschwert: Die Kausalattribution zwischen Stellenabbau, KI-Einführung und ausgabenseitiger Konsolidierung ist auch im sichtbarsten Marktsegment empirisch nicht trennscharf. Diese Kausalunschärfe wird durch eine am 1. Juli 2026 von </w:t>
-      </w:r>
-      <w:r>
-        <w:rPr>
-          <w:rFonts w:ascii="Arial" w:hAnsi="Arial"/>
-          <w:b w:val="0"/>
-          <w:i/>
-          <w:sz w:val="19"/>
-        </w:rPr>
         <w:t>CNBC</w:t>
       </w:r>
       <w:r>
@@ -616,151 +280,21 @@
           <w:i w:val="0"/>
           <w:sz w:val="19"/>
         </w:rPr>
-        <w:t xml:space="preserve"> zu einer Gesamtbetrachtung zusammengefasste Gegenbewegung zusätzlich unterstrichen, die dokumentiert, dass mehrere prominente Unternehmen ihre KI-getriebenen Personalreduktionen inzwischen offen als Fehleinschätzung revidieren und Beschäftigte wiedereinstellen: </w:t>
-      </w:r>
-      <w:r>
-        <w:rPr>
-          <w:rFonts w:ascii="Arial" w:hAnsi="Arial"/>
-          <w:b w:val="0"/>
-          <w:i/>
-          <w:sz w:val="19"/>
-        </w:rPr>
-        <w:t>Ford</w:t>
-      </w:r>
-      <w:r>
-        <w:rPr>
-          <w:rFonts w:ascii="Arial" w:hAnsi="Arial"/>
-          <w:b w:val="0"/>
-          <w:i w:val="0"/>
-          <w:sz w:val="19"/>
-        </w:rPr>
-        <w:t xml:space="preserve"> hat über einen Zeitraum von rund drei Jahren rund 350 erfahrene „Gray-Beard"-Ingenieure zurückgeholt, nachdem KI-gestützte Qualitätskontrollsysteme (unter anderem tausende KI-Kameras) an der Erkennung produktionsrelevanter Fehler gescheitert waren; das Unternehmen führt daraufhin die </w:t>
-      </w:r>
-      <w:r>
-        <w:rPr>
-          <w:rFonts w:ascii="Arial" w:hAnsi="Arial"/>
-          <w:b w:val="0"/>
-          <w:i/>
-          <w:sz w:val="19"/>
-        </w:rPr>
-        <w:t>JD Power 2026 U.S. Initial Quality Study</w:t>
-      </w:r>
-      <w:r>
-        <w:rPr>
-          <w:rFonts w:ascii="Arial" w:hAnsi="Arial"/>
-          <w:b w:val="0"/>
-          <w:i w:val="0"/>
-          <w:sz w:val="19"/>
-        </w:rPr>
-        <w:t xml:space="preserve"> mit 152 Problemen pro 100 Fahrzeugen erstmals seit 2010 als Nummer eins der US-Mainstream-Marken an, mit einer erwarteten Jahres-Kostenersparnis von rund einer Milliarde US-Dollar (Charles Poon, Ford VP Vehicle Hardware Engineering, im Konzernstatement sinngemäß: KI sei nur so gut wie die Menschen, die sie einsetzen). </w:t>
-      </w:r>
-      <w:r>
-        <w:rPr>
-          <w:rFonts w:ascii="Arial" w:hAnsi="Arial"/>
-          <w:b w:val="0"/>
-          <w:i/>
-          <w:sz w:val="19"/>
-        </w:rPr>
-        <w:t>IBM</w:t>
-      </w:r>
-      <w:r>
-        <w:rPr>
-          <w:rFonts w:ascii="Arial" w:hAnsi="Arial"/>
-          <w:b w:val="0"/>
-          <w:i w:val="0"/>
-          <w:sz w:val="19"/>
-        </w:rPr>
-        <w:t xml:space="preserve"> hat nach dem Ausrollen einer KI-basierten Personalabteilung, die zwar rund 94 % der Routineanfragen abwickelte, aber an den verbleibenden 6 % (überwiegend ethische Dilemmata) scheiterte, die Einstellungen für Berufseinsteiger 2026 verdreifacht; die </w:t>
-      </w:r>
-      <w:r>
-        <w:rPr>
-          <w:rFonts w:ascii="Arial" w:hAnsi="Arial"/>
-          <w:b w:val="0"/>
-          <w:i/>
-          <w:sz w:val="19"/>
-        </w:rPr>
-        <w:t>Commonwealth Bank of Australia</w:t>
-      </w:r>
-      <w:r>
-        <w:rPr>
-          <w:rFonts w:ascii="Arial" w:hAnsi="Arial"/>
-          <w:b w:val="0"/>
-          <w:i w:val="0"/>
-          <w:sz w:val="19"/>
-        </w:rPr>
-        <w:t xml:space="preserve"> hat mehr als vierzig Kundenservicestellen nach dem Ausfall eines </w:t>
-      </w:r>
-      <w:r>
-        <w:rPr>
-          <w:rFonts w:ascii="Arial" w:hAnsi="Arial"/>
-          <w:b w:val="0"/>
-          <w:i/>
-          <w:sz w:val="19"/>
-        </w:rPr>
-        <w:t>AI-Voicebot</w:t>
-      </w:r>
-      <w:r>
-        <w:rPr>
-          <w:rFonts w:ascii="Arial" w:hAnsi="Arial"/>
-          <w:b w:val="0"/>
-          <w:i w:val="0"/>
-          <w:sz w:val="19"/>
-        </w:rPr>
-        <w:t xml:space="preserve"> wieder aufgebaut. Empirische Grundlage dieser Rebound-Beobachtung liefert eine im Zeitraum Februar bis März 2025 durch </w:t>
-      </w:r>
-      <w:r>
-        <w:rPr>
-          <w:rFonts w:ascii="Arial" w:hAnsi="Arial"/>
-          <w:b w:val="0"/>
-          <w:i/>
-          <w:sz w:val="19"/>
-        </w:rPr>
-        <w:t>Vitreous World</w:t>
-      </w:r>
-      <w:r>
-        <w:rPr>
-          <w:rFonts w:ascii="Arial" w:hAnsi="Arial"/>
-          <w:b w:val="0"/>
-          <w:i w:val="0"/>
-          <w:sz w:val="19"/>
-        </w:rPr>
-        <w:t xml:space="preserve"> im Auftrag der Analytik-Firma </w:t>
-      </w:r>
-      <w:r>
-        <w:rPr>
-          <w:rFonts w:ascii="Arial" w:hAnsi="Arial"/>
-          <w:b w:val="0"/>
-          <w:i/>
-          <w:sz w:val="19"/>
-        </w:rPr>
-        <w:t>Orgvue</w:t>
-      </w:r>
-      <w:r>
-        <w:rPr>
-          <w:rFonts w:ascii="Arial" w:hAnsi="Arial"/>
-          <w:b w:val="0"/>
-          <w:i w:val="0"/>
-          <w:sz w:val="19"/>
-        </w:rPr>
-        <w:t xml:space="preserve"> durchgeführte Befragung von 1.163 Senior Decision-Makers (Vorstände, C-Level und Senior-Manager) in Organisationen ab 500 beziehungsweise 2.000 Beschäftigten in den USA, Kanada, dem Vereinigten Königreich, Irland, Australien, Hongkong, Malaysia und Singapur, deren Kernbefunde in der Fach- und Wirtschaftspresse Ende Juni / Anfang Juli 2026 neu aufgegriffen und mit den obigen Einzelfällen synthetisiert wurden: 39 % der befragten Führungskräfte haben aufgrund einer KI-Einführung Beschäftigte entlassen; von diesen halten 55 % im Nachhinein zumindest eine dieser Entscheidungen für einen Fehler, 23 % räumten ein, die Entscheidung habe auf einer allgemeinen Annahme über KI-Fähigkeiten und nicht auf einer Analyse der konkret betroffenen Rolle beruht. Eine parallele Erhebung von </w:t>
-      </w:r>
-      <w:r>
-        <w:rPr>
-          <w:rFonts w:ascii="Arial" w:hAnsi="Arial"/>
-          <w:b w:val="0"/>
-          <w:i/>
-          <w:sz w:val="19"/>
-        </w:rPr>
-        <w:t>Robert Half</w:t>
-      </w:r>
-      <w:r>
-        <w:rPr>
-          <w:rFonts w:ascii="Arial" w:hAnsi="Arial"/>
-          <w:b w:val="0"/>
-          <w:i w:val="0"/>
-          <w:sz w:val="19"/>
-        </w:rPr>
-        <w:t xml:space="preserve"> aus dem Frühjahr 2026 zeigt in dieselbe Richtung: 32 % der US-Hiring-Manager, die eine Rolle primär aufgrund von KI abgebaut haben, mussten dieselbe oder eine ähnliche Rolle später wiederbesetzen; die höchsten Rückholquoten liegen im Finanzsektor (44 %), gefolgt von HR (35 %) und Technology (32 %). Für die Steuerdebatte hat dieser Befund eine doppelte Bedeutung: Zum einen dämpft er die für eine zielgerichtete Ersatzabgabe (Typ 5 nach § 2.1) benötigte Kausalzuweisung „nachgewiesene KI-Verdrängung" zusätzlich (vgl. § 9.1), zum anderen stützt er die in § 3.4 referierte Warnung, symbolische oder voreilige Automatisierungssteuern könnten sich als kontraproduktiv erweisen, weil die zugrundeliegende Verdrängungshypothese nur teilweise erhärtet ist. Andererseits steht die Finanzierung der sozialen Sicherungssysteme — insbesondere der paritätisch über Löhne finanzierten Zweige Kranken-, Pflege-, Renten- und Arbeitslosenversicherung — vor strukturellen Herausforderungen durch den demografischen Wandel.</w:t>
+        <w:t xml:space="preserve"> (1. Juli 2026) zusammengeführte Gegenbewegung, dass mehrere Unternehmen KI-getriebene Personalreduktionen inzwischen offen als Fehleinschätzung revidieren und Beschäftigte wiedereinstellen — prominent Ford (rund 350 zurückgeholte Ingenieure, nachdem KI-gestützte Qualitätskontrolle an produktionsrelevanten Fehlern gescheitert war), IBM und die Commonwealth Bank of Australia; empirisch gestützt durch die Orgvue-Erhebung unter 1.163 Senior Decision-Makers (55 % der Führungskräfte mit KI-bedingten Entlassungen halten mindestens eine Entscheidung im Nachhinein für einen Fehler) und die Robert-Half-Rückholrate (32 % der primär KI-bedingt gestrichenen Rollen wurden wiederbesetzt). Drittens steht der Goldman-Sachs-Schätzung eines US-Verdrängungseffekts von rund 16.000 Stellen pro Monat der Befund von Yale Budget Lab und Massenkoff &amp; McCrory gegenüber, dass sich auf Aggregatebene bislang keine systematische KI-Disruption des US-Arbeitsmarkts zeigt (§ 3.5). Für die Steuerdebatte bedeutet das: Die Kausalattribution zwischen Stellenabbau und KI-Einführung ist auch im sichtbarsten Marktsegment empirisch nicht trennscharf — was die Anknüpfung von Steuern an „nachgewiesene KI-Verdrängung" (Typ 5 nach § 2.1, § 9.1) zusätzlich erschwert und die in § 3.4 referierte Warnung vor voreiligen Automatisierungssteuern stützt.</w:t>
+      </w:r>
+    </w:p>
+    <w:p>
+      <w:pPr>
+        <w:jc w:val="both"/>
+      </w:pPr>
+      <w:r>
+        <w:rPr>
+          <w:rFonts w:ascii="Arial" w:hAnsi="Arial"/>
+          <w:b w:val="0"/>
+          <w:i w:val="0"/>
+          <w:sz w:val="19"/>
+        </w:rPr>
+        <w:t>Andererseits steht die Finanzierung der sozialen Sicherungssysteme — insbesondere der paritätisch über Löhne finanzierten Zweige Kranken-, Pflege-, Renten- und Arbeitslosenversicherung — vor strukturellen Herausforderungen durch den demografischen Wandel.</w:t>
       </w:r>
     </w:p>
     <w:p>
@@ -11636,7 +11170,7 @@
           <w:i w:val="0"/>
           <w:sz w:val="19"/>
         </w:rPr>
-        <w:t xml:space="preserve"> Dieses Arbeitspapier gibt den Stand Anfang Juli 2026 (Schnitt am 5. Juli 2026 — Lauf 001 vom 5. Juli 2026) wieder. Die Debatte entwickelt sich dynamisch, insbesondere im Zuge der OpenAI-Strategiepapiere und der Eröffnung des OpenAI Workshop in Washington, D.C. im Mai 2026, des Erstdurchgangs des GKV-Beitragssatzstabilisierungsgesetzes in der 1065. Bundesratssitzung am 8. Mai 2026 mit 79 Tagesordnungspunkten (Kabinettsbeschluss 29. April 2026, parlamentarische Behandlung vor der Sommerpause 2026 angekündigt), der laufenden Trilog-Verhandlungen zum Digital Omnibus on AI (zweite Runde 28. April 2026 ohne Einigung; nächste Runde 13. Mai 2026 — Knackpunkt ist nicht die Verschiebung der Hochrisiko-Pflichten, sondern die Konformitätsbewertungs-Architektur für Anhang I; die zypriotische Ratspräsidentschaft strebt einen Abschluss vor Ablauf ihrer Amtszeit am 30. Juni 2026 an, andernfalls übernimmt die irische Präsidentschaft), der am 5. Mai 2026 erfolgten Arraignment-Verhandlung im Altman-Verfahren mit „nicht schuldig"-Plädoyer und angeordneter psychiatrischer Begutachtung, des am 7. Mai 2026 versandten individuellen Microsoft-Buyout-Angebots (Annahmefrist 8. Juni 2026, VRSAR-Unterzeichnung 9.–22. Juni 2026, bis zu fünfjährige Krankenversicherungs-Verlängerung), des am 1. Mai 2026 vom Connecticut-Repräsentantenhaus mit 131 zu 17 Stimmen verabschiedeten </w:t>
+        <w:t xml:space="preserve"> Dieses Arbeitspapier gibt den Stand Anfang Juli 2026 wieder (Version 26.0, Schnitt am 5. Juli 2026). Die Debatte entwickelt sich dynamisch — offen sind zum Redaktionsschluss insbesondere die parlamentarische Behandlung des GKV-Beitragssatzstabilisierungsgesetzes vor der Sommerpause 2026, das weitere Verfahren zum </w:t>
       </w:r>
       <w:r>
         <w:rPr>
@@ -11645,16 +11179,16 @@
           <w:i/>
           <w:sz w:val="19"/>
         </w:rPr>
-        <w:t>SB 5 — Connecticut Artificial Intelligence Responsibility and Transparency Act</w:t>
-      </w:r>
-      <w:r>
-        <w:rPr>
-          <w:rFonts w:ascii="Arial" w:hAnsi="Arial"/>
-          <w:b w:val="0"/>
-          <w:i w:val="0"/>
-          <w:sz w:val="19"/>
-        </w:rPr>
-        <w:t xml:space="preserve"> mit angekündigter Unterzeichnung durch Gouverneur Lamont und gestaffelten Geltungsdaten ab 1. Oktober 2026 (Automated-Employment-Decision-Rahmen, „AI is not a defense", Frontier-Whistleblower und WARN-AI-Disclosure) und 1. Oktober 2027 (Deployer-Vorab-Information), der bis zum 6. Mai 2026 laufenden regulären Sitzungsperiode der Connecticut General Assembly (Schicksal von Raised Bill 515), der parallelen exekutiven Maine-Maßnahmen (Executive Order Nr. 5 zum Data Center Advisory Council vom 29. April 2026, LD 713 zum Subventionsausschluss vom 24. April 2026), des im Februar 2026 vorgelegten Hamilton-Project-Papiers von Acemoglu, Autor und Johnson zu </w:t>
+        <w:t>American A.I. Sovereign Wealth Fund Act</w:t>
+      </w:r>
+      <w:r>
+        <w:rPr>
+          <w:rFonts w:ascii="Arial" w:hAnsi="Arial"/>
+          <w:b w:val="0"/>
+          <w:i w:val="0"/>
+          <w:sz w:val="19"/>
+        </w:rPr>
+        <w:t xml:space="preserve"> (S. 4825) im US-Kongress, die Umsetzung des am 29. Juni 2026 final gebilligten </w:t>
       </w:r>
       <w:r>
         <w:rPr>
@@ -11663,276 +11197,6 @@
           <w:i/>
           <w:sz w:val="19"/>
         </w:rPr>
-        <w:t>„Building Pro-Worker Artificial Intelligence"</w:t>
-      </w:r>
-      <w:r>
-        <w:rPr>
-          <w:rFonts w:ascii="Arial" w:hAnsi="Arial"/>
-          <w:b w:val="0"/>
-          <w:i w:val="0"/>
-          <w:sz w:val="19"/>
-        </w:rPr>
-        <w:t xml:space="preserve">, des am 5. März 2026 publizierten Anthropic-Papiers von Massenkoff &amp; McCrory zu </w:t>
-      </w:r>
-      <w:r>
-        <w:rPr>
-          <w:rFonts w:ascii="Arial" w:hAnsi="Arial"/>
-          <w:b w:val="0"/>
-          <w:i/>
-          <w:sz w:val="19"/>
-        </w:rPr>
-        <w:t>„Labor market impacts of AI"</w:t>
-      </w:r>
-      <w:r>
-        <w:rPr>
-          <w:rFonts w:ascii="Arial" w:hAnsi="Arial"/>
-          <w:b w:val="0"/>
-          <w:i w:val="0"/>
-          <w:sz w:val="19"/>
-        </w:rPr>
-        <w:t xml:space="preserve"> (Computer-Programmierer 74,5 % beobachtete Exposition; keine systematische Arbeitslosigkeitserhöhung, tentative Hire-Verlangsamung 22–25-Jährige), des am 22. April 2026 gestarteten </w:t>
-      </w:r>
-      <w:r>
-        <w:rPr>
-          <w:rFonts w:ascii="Arial" w:hAnsi="Arial"/>
-          <w:b w:val="0"/>
-          <w:i/>
-          <w:sz w:val="19"/>
-        </w:rPr>
-        <w:t>Anthropic Economic Index Survey</w:t>
-      </w:r>
-      <w:r>
-        <w:rPr>
-          <w:rFonts w:ascii="Arial" w:hAnsi="Arial"/>
-          <w:b w:val="0"/>
-          <w:i w:val="0"/>
-          <w:sz w:val="19"/>
-        </w:rPr>
-        <w:t xml:space="preserve"> als monatliche qualitative Ergänzung zur nutzungsdatenbasierten Index-Reihe sowie des am 23. April 2026 nachgereichten ökonomischen Folgebands zur 81k-Befragung („Economic concerns and gains from AI use"; rund 20 % Verdrängungssorgen, 1,3 Pp. Sorgenanstieg je 10 Pp. mehr KI-Exposition, </w:t>
-      </w:r>
-      <w:r>
-        <w:rPr>
-          <w:rFonts w:ascii="Arial" w:hAnsi="Arial"/>
-          <w:b w:val="0"/>
-          <w:i/>
-          <w:sz w:val="19"/>
-        </w:rPr>
-        <w:t>Produktivitäts-Angst-Paradoxie</w:t>
-      </w:r>
-      <w:r>
-        <w:rPr>
-          <w:rFonts w:ascii="Arial" w:hAnsi="Arial"/>
-          <w:b w:val="0"/>
-          <w:i w:val="0"/>
-          <w:sz w:val="19"/>
-        </w:rPr>
-        <w:t xml:space="preserve">), des am 24. März 2026 erschienenen </w:t>
-      </w:r>
-      <w:r>
-        <w:rPr>
-          <w:rFonts w:ascii="Arial" w:hAnsi="Arial"/>
-          <w:b w:val="0"/>
-          <w:i/>
-          <w:sz w:val="19"/>
-        </w:rPr>
-        <w:t>Anthropic-Economic-Index</w:t>
-      </w:r>
-      <w:r>
-        <w:rPr>
-          <w:rFonts w:ascii="Arial" w:hAnsi="Arial"/>
-          <w:b w:val="0"/>
-          <w:i w:val="0"/>
-          <w:sz w:val="19"/>
-        </w:rPr>
-        <w:t xml:space="preserve">-Folgeberichts </w:t>
-      </w:r>
-      <w:r>
-        <w:rPr>
-          <w:rFonts w:ascii="Arial" w:hAnsi="Arial"/>
-          <w:b w:val="0"/>
-          <w:i/>
-          <w:sz w:val="19"/>
-        </w:rPr>
-        <w:t>„Learning curves"</w:t>
-      </w:r>
-      <w:r>
-        <w:rPr>
-          <w:rFonts w:ascii="Arial" w:hAnsi="Arial"/>
-          <w:b w:val="0"/>
-          <w:i w:val="0"/>
-          <w:sz w:val="19"/>
-        </w:rPr>
-        <w:t xml:space="preserve"> (rund 49 % der Berufe mit ≥ 25 % Claude-Tasks; geografische Konzentration der Top-5-US-Bundesstaaten von 30 auf 24 % gesunken), des im Sejm anhängigen Abgeordnetenentwurfs zur Anhebung der polnischen </w:t>
-      </w:r>
-      <w:r>
-        <w:rPr>
-          <w:rFonts w:ascii="Arial" w:hAnsi="Arial"/>
-          <w:b w:val="0"/>
-          <w:i/>
-          <w:sz w:val="19"/>
-        </w:rPr>
-        <w:t>ulga na robotyzację</w:t>
-      </w:r>
-      <w:r>
-        <w:rPr>
-          <w:rFonts w:ascii="Arial" w:hAnsi="Arial"/>
-          <w:b w:val="0"/>
-          <w:i w:val="0"/>
-          <w:sz w:val="19"/>
-        </w:rPr>
-        <w:t xml:space="preserve"> auf 100 % bei zugleich ablehnender Position des Finanzministeriums, der revidierten IAB-Frühjahrsprognose vom 24. März 2026 (Erwerbstätigkeit −90.000, BIP +0,8 % bei 0,2 bis 0,3 Pp. Iran-Krieg-Dämpfung), der aktualisierten Tech-Layoff-Trackerstände zum 6./7./8. Mai 2026 (TrueUp 119.721 Personen aus 265 Layoff-Meldungen am 6. Mai, 121.111 Personen aus 273 Meldungen am 7. Mai bzw. 127.411 Personen aus 283 Meldungen am 8. Mai 2026 — rund 1.003 Personen pro Tag; SkillSyncer 113.863 Personen aus 179 Ereignissen) sowie der am 5./6. Mai 2026 angekündigten KI-getriebenen Stellenstreichungen bei Coinbase (700 Stellen, 14 %), PayPal (rund 4.760 Stellen, 20 % über 2–3 Jahre), Freshworks (rund 500 Stellen, 11 %) und Cognizant (12.000–15.000 Stellen unter „Project Leap") sowie der am 7. Mai 2026 von Cloudflare angekündigten Streichung von rund 1.100 Stellen (20 % der globalen Belegschaft) zum Übergang zu einem „agentic AI-first operating model" (Restrukturierungsaufwand 140–150 Mio. USD, AI-Einsatz im Konzern +600 % im Quartal, Aktienkurs −18 %), des am 1. Mai 2026 von </w:t>
-      </w:r>
-      <w:r>
-        <w:rPr>
-          <w:rFonts w:ascii="Arial" w:hAnsi="Arial"/>
-          <w:b w:val="0"/>
-          <w:i/>
-          <w:sz w:val="19"/>
-        </w:rPr>
-        <w:t>Challenger, Gray &amp; Christmas</w:t>
-      </w:r>
-      <w:r>
-        <w:rPr>
-          <w:rFonts w:ascii="Arial" w:hAnsi="Arial"/>
-          <w:b w:val="0"/>
-          <w:i w:val="0"/>
-          <w:sz w:val="19"/>
-        </w:rPr>
-        <w:t xml:space="preserve"> veröffentlichten </w:t>
-      </w:r>
-      <w:r>
-        <w:rPr>
-          <w:rFonts w:ascii="Arial" w:hAnsi="Arial"/>
-          <w:b w:val="0"/>
-          <w:i/>
-          <w:sz w:val="19"/>
-        </w:rPr>
-        <w:t>April-2026-Job-Cuts-Reports</w:t>
-      </w:r>
-      <w:r>
-        <w:rPr>
-          <w:rFonts w:ascii="Arial" w:hAnsi="Arial"/>
-          <w:b w:val="0"/>
-          <w:i w:val="0"/>
-          <w:sz w:val="19"/>
-        </w:rPr>
-        <w:t xml:space="preserve"> (KI-bezogene Streichungen 21.490 im April — 26 % aller April-Streichungen, zweitens in Folge führender Einzelgrund; Tech YTD 85.411 mit +33 % gegenüber Vorjahr; KI-bezogen YTD 49.135 — Anteil an allen 2026-Streichungs­plänen 16 %, gestiegen von 13 % zum März-Stand; gesamtwirtschaftlich −50 % gegenüber Vorjahresvergleich), des am 7. Mai 2026 publizierten Microsoft-VRSAR-Programmstatus (rund 8.500 angebotsberechtigte Beschäftigte, </w:t>
-      </w:r>
-      <w:r>
-        <w:rPr>
-          <w:rFonts w:ascii="Arial" w:hAnsi="Arial"/>
-          <w:b w:val="0"/>
-          <w:i/>
-          <w:sz w:val="19"/>
-        </w:rPr>
-        <w:t>Separation Date</w:t>
-      </w:r>
-      <w:r>
-        <w:rPr>
-          <w:rFonts w:ascii="Arial" w:hAnsi="Arial"/>
-          <w:b w:val="0"/>
-          <w:i w:val="0"/>
-          <w:sz w:val="19"/>
-        </w:rPr>
-        <w:t xml:space="preserve"> 2. Juli 2026) und des Yale-Budget-Lab-Befundes vom April/6. Mai 2026 (kein aggregierter KI-Disruptionseffekt im US-Arbeitsmarkt; fiskalische Modellrechnung 39 Bio. USD Schulden vs. 5.500–42.400 USD Übergangshilfe pro Verdrängtem), des Big-Tech-AI-Capex-Programms 2026 mit einem Q1-Volumen von rund 130,65 Milliarden US-Dollar und einer nach den Q1-2026-Earnings-Calls (28.–30. April 2026) auf rund 725 Milliarden US-Dollar (+77 % gegenüber 410 Mrd. USD in 2025; Microsoft 190, Alphabet 190, Amazon 200, Meta 125–145 Mrd. USD; rund 25 Mrd. USD Microsoft-Aufschlag durch DRAM-Verteuerung von rund 95 % q/q im Q1 erklärt) nach oben revidierten Aggregat-Schätzung für das Gesamtjahr (zuvor 660–700 Mrd. USD Anfang April 2026), des am 29. April 2026 veröffentlichten </w:t>
-      </w:r>
-      <w:r>
-        <w:rPr>
-          <w:rFonts w:ascii="Arial" w:hAnsi="Arial"/>
-          <w:b w:val="0"/>
-          <w:i/>
-          <w:sz w:val="19"/>
-        </w:rPr>
-        <w:t>Bloomberg-Editorials</w:t>
-      </w:r>
-      <w:r>
-        <w:rPr>
-          <w:rFonts w:ascii="Arial" w:hAnsi="Arial"/>
-          <w:b w:val="0"/>
-          <w:i w:val="0"/>
-          <w:sz w:val="19"/>
-        </w:rPr>
-        <w:t xml:space="preserve"> gegen eine KI-Steuer (syndiziert in Advisor Perspectives, RealClearPolitics, West Hawaii Today und Las Vegas Sun zwischen dem 2. und 6. Mai 2026), das Innovationsbremse, Wettbewerbsnachteil und Unmöglichkeit der Abgrenzung Verdrängung/Augmentation als Hauptargumente gegen die Sanders/OpenAI-Linie führt und stattdessen Lockerung berufsrechtlicher Lizenzschranken, Reform der Arbeitslosenversicherung, Umschulungs-Steueranreize sowie eine Ausweitung der Earned Income Tax Credit empfiehlt, des am 18. Juni 2026 von Senator Bernie Sanders eingebrachten </w:t>
-      </w:r>
-      <w:r>
-        <w:rPr>
-          <w:rFonts w:ascii="Arial" w:hAnsi="Arial"/>
-          <w:b w:val="0"/>
-          <w:i/>
-          <w:sz w:val="19"/>
-        </w:rPr>
-        <w:t>American A.I. Sovereign Wealth Fund Act</w:t>
-      </w:r>
-      <w:r>
-        <w:rPr>
-          <w:rFonts w:ascii="Arial" w:hAnsi="Arial"/>
-          <w:b w:val="0"/>
-          <w:i w:val="0"/>
-          <w:sz w:val="19"/>
-        </w:rPr>
-        <w:t xml:space="preserve"> (einmalige 50-%-Aktien-Abgabe für AI-Unternehmen mit ≥ 200 Mio. USD KI-Jahresumsatz zur Speisung eines rund 7 Bio. USD schweren Souveränen KI-Beteiligungsfonds, </w:t>
-      </w:r>
-      <w:r>
-        <w:rPr>
-          <w:rFonts w:ascii="Arial" w:hAnsi="Arial"/>
-          <w:b w:val="0"/>
-          <w:i/>
-          <w:sz w:val="19"/>
-        </w:rPr>
-        <w:t>Independent Commission for Democratic AI</w:t>
-      </w:r>
-      <w:r>
-        <w:rPr>
-          <w:rFonts w:ascii="Arial" w:hAnsi="Arial"/>
-          <w:b w:val="0"/>
-          <w:i w:val="0"/>
-          <w:sz w:val="19"/>
-        </w:rPr>
-        <w:t xml:space="preserve">, jährliche Dividende ~1.000 USD pro US-Bürger), des am 26. Juni 2026 veröffentlichten sechsten </w:t>
-      </w:r>
-      <w:r>
-        <w:rPr>
-          <w:rFonts w:ascii="Arial" w:hAnsi="Arial"/>
-          <w:b w:val="0"/>
-          <w:i/>
-          <w:sz w:val="19"/>
-        </w:rPr>
-        <w:t>Anthropic-Economic-Index</w:t>
-      </w:r>
-      <w:r>
-        <w:rPr>
-          <w:rFonts w:ascii="Arial" w:hAnsi="Arial"/>
-          <w:b w:val="0"/>
-          <w:i w:val="0"/>
-          <w:sz w:val="19"/>
-        </w:rPr>
-        <w:t xml:space="preserve">-Berichts </w:t>
-      </w:r>
-      <w:r>
-        <w:rPr>
-          <w:rFonts w:ascii="Arial" w:hAnsi="Arial"/>
-          <w:b w:val="0"/>
-          <w:i/>
-          <w:sz w:val="19"/>
-        </w:rPr>
-        <w:t>„Cadences"</w:t>
-      </w:r>
-      <w:r>
-        <w:rPr>
-          <w:rFonts w:ascii="Arial" w:hAnsi="Arial"/>
-          <w:b w:val="0"/>
-          <w:i w:val="0"/>
-          <w:sz w:val="19"/>
-        </w:rPr>
-        <w:t xml:space="preserve"> (~9.700 Claude-Nutzerinnen und -Nutzer, rund 50 % erwarten KI könne ≥ 50 % ihrer Aufgaben übernehmen, ~10 % Verlust­erwartung; Delegationsanteil korreliert positiv mit Arbeitszufriedenheit über sechs Wirkungsdimensionen), des am 29. Juni 2026 durch den Rat der EU final gebilligten </w:t>
-      </w:r>
-      <w:r>
-        <w:rPr>
-          <w:rFonts w:ascii="Arial" w:hAnsi="Arial"/>
-          <w:b w:val="0"/>
-          <w:i/>
-          <w:sz w:val="19"/>
-        </w:rPr>
         <w:t>Digital Omnibus on AI</w:t>
       </w:r>
       <w:r>
@@ -11942,133 +11206,7 @@
           <w:i w:val="0"/>
           <w:sz w:val="19"/>
         </w:rPr>
-        <w:t xml:space="preserve"> / </w:t>
-      </w:r>
-      <w:r>
-        <w:rPr>
-          <w:rFonts w:ascii="Arial" w:hAnsi="Arial"/>
-          <w:b w:val="0"/>
-          <w:i/>
-          <w:sz w:val="19"/>
-        </w:rPr>
-        <w:t>Omnibus VII</w:t>
-      </w:r>
-      <w:r>
-        <w:rPr>
-          <w:rFonts w:ascii="Arial" w:hAnsi="Arial"/>
-          <w:b w:val="0"/>
-          <w:i w:val="0"/>
-          <w:sz w:val="19"/>
-        </w:rPr>
-        <w:t xml:space="preserve"> (Anwendungsdaten Hochrisiko 2. Dezember 2027 Anhang III bzw. 2. August 2028 Anhang I; Sandbox-Frist 2. August 2027; verkürzte Transparenz-Übergangsfrist Art. 50; Erweiterung Art. 5 um Verbot nicht-einvernehmlicher intimer KI-Inhalte und CSAM; GPAI-Durchsetzungsbefugnisse ab 2. August 2026 wie vorgesehen) sowie des am 2. Juli 2026 durch </w:t>
-      </w:r>
-      <w:r>
-        <w:rPr>
-          <w:rFonts w:ascii="Arial" w:hAnsi="Arial"/>
-          <w:b w:val="0"/>
-          <w:i/>
-          <w:sz w:val="19"/>
-        </w:rPr>
-        <w:t>Microsoft</w:t>
-      </w:r>
-      <w:r>
-        <w:rPr>
-          <w:rFonts w:ascii="Arial" w:hAnsi="Arial"/>
-          <w:b w:val="0"/>
-          <w:i w:val="0"/>
-          <w:sz w:val="19"/>
-        </w:rPr>
-        <w:t xml:space="preserve"> zum Fiskaljahresstart bekanntgegebenen Stellenabbaus von rund 9.000 Positionen (&lt; 4 % globale Belegschaft, Sales/Consulting/Xbox; teilweise durch Vorziehung über das im Mai angebotene VRSAR-Buyout-Programm reduziert) und der </w:t>
-      </w:r>
-      <w:r>
-        <w:rPr>
-          <w:rFonts w:ascii="Arial" w:hAnsi="Arial"/>
-          <w:b w:val="0"/>
-          <w:i/>
-          <w:sz w:val="19"/>
-        </w:rPr>
-        <w:t>Challenger, Gray &amp; Christmas</w:t>
-      </w:r>
-      <w:r>
-        <w:rPr>
-          <w:rFonts w:ascii="Arial" w:hAnsi="Arial"/>
-          <w:b w:val="0"/>
-          <w:i w:val="0"/>
-          <w:sz w:val="19"/>
-        </w:rPr>
-        <w:t xml:space="preserve">-Reports für Mai (97.006 US-Streichungen +16 % gegenüber April; KI 38.579 = 40 % — Rekord seit Kategorisierungsbeginn 2023; YTD-KI 87.714 = 22 %) und Juni 2026 (45.849 Streichungen −53 % gegenüber Mai; KI 14.029 = 31 %, vierten Monat in Folge Nr. 1; YTD-KI 101.743 = 23 % und damit im ersten Halbjahr bereits rund 86 % über der Gesamtjahressumme 2025). Ergänzt wird der Stand um drei Fortschreibungen aus Lauf 002 vom 4. Juli 2026: die Bill-Nummer </w:t>
-      </w:r>
-      <w:r>
-        <w:rPr>
-          <w:rFonts w:ascii="Arial" w:hAnsi="Arial"/>
-          <w:b w:val="0"/>
-          <w:i/>
-          <w:sz w:val="19"/>
-        </w:rPr>
-        <w:t>S. 4825</w:t>
-      </w:r>
-      <w:r>
-        <w:rPr>
-          <w:rFonts w:ascii="Arial" w:hAnsi="Arial"/>
-          <w:b w:val="0"/>
-          <w:i w:val="0"/>
-          <w:sz w:val="19"/>
-        </w:rPr>
-        <w:t xml:space="preserve"> (119. Kongress) zum </w:t>
-      </w:r>
-      <w:r>
-        <w:rPr>
-          <w:rFonts w:ascii="Arial" w:hAnsi="Arial"/>
-          <w:b w:val="0"/>
-          <w:i/>
-          <w:sz w:val="19"/>
-        </w:rPr>
-        <w:t>American A.I. Sovereign Wealth Fund Act</w:t>
-      </w:r>
-      <w:r>
-        <w:rPr>
-          <w:rFonts w:ascii="Arial" w:hAnsi="Arial"/>
-          <w:b w:val="0"/>
-          <w:i w:val="0"/>
-          <w:sz w:val="19"/>
-        </w:rPr>
-        <w:t xml:space="preserve">, die Präzisierung der Microsoft-Layoff-Größenordnung Anfang Juli 2026 durch TechRepublic und Yahoo Finance (jenseits der bereits angenommenen VRSAR-Austritte voraussichtlich weniger als 5.500 Beschäftigte beziehungsweise unter 2,5 % der weltweiten Belegschaft) sowie den am 30. Juni 2026 durch Anthropic angekündigten Preis für </w:t>
-      </w:r>
-      <w:r>
-        <w:rPr>
-          <w:rFonts w:ascii="Arial" w:hAnsi="Arial"/>
-          <w:b w:val="0"/>
-          <w:i/>
-          <w:sz w:val="19"/>
-        </w:rPr>
-        <w:t>Claude Sonnet 5</w:t>
-      </w:r>
-      <w:r>
-        <w:rPr>
-          <w:rFonts w:ascii="Arial" w:hAnsi="Arial"/>
-          <w:b w:val="0"/>
-          <w:i w:val="0"/>
-          <w:sz w:val="19"/>
-        </w:rPr>
-        <w:t xml:space="preserve"> (Einführungspreis 2 US-Dollar pro Million Input- und 10 US-Dollar pro Million Output-Token bis 31. August 2026, Standardpreis ab 1. September 2026 bei 3 beziehungsweise 15 US-Dollar) als aktueller Beleg für die in § 8.2 aufgenommene deflationäre Preisdynamik bei Frontier-Inferenz. Lauf 001 vom 5. Juli 2026 ergänzt vier weitere Fortschreibungen: die Aktualisierung der Tech-Layoff-Trackerstände (SkillSyncer 185.894 Beschäftigte aus 267 Layoff-Ereignissen mit rund 999 Stellen pro Tag zum 5. Juli 2026; TrueUp zur Jahresmitte 164.971 Personen aus 435 Meldungen mit rund 887 pro Tag, im Vergleich 2025 gesamt 783 Meldungen / 245.953 Personen / rund 674 pro Tag); die im Oracle-Konzern-8-K (Juni 2026) publizierte FY2026-Aggregatzahl von rund 21.000 Stellenreduktionen (13 % der Belegschaft; von 162.000 auf 141.000; Restrukturierungsaufwand von 374 Mio. auf 1,8 Mrd. USD; flankierendes KI-Investitionsvolumen ~50 Mrd. USD); die am 1. Juli 2026 von </w:t>
-      </w:r>
-      <w:r>
-        <w:rPr>
-          <w:rFonts w:ascii="Arial" w:hAnsi="Arial"/>
-          <w:b w:val="0"/>
-          <w:i/>
-          <w:sz w:val="19"/>
-        </w:rPr>
-        <w:t>CNBC</w:t>
-      </w:r>
-      <w:r>
-        <w:rPr>
-          <w:rFonts w:ascii="Arial" w:hAnsi="Arial"/>
-          <w:b w:val="0"/>
-          <w:i w:val="0"/>
-          <w:sz w:val="19"/>
-        </w:rPr>
-        <w:t xml:space="preserve"> zusammengeführte Rebound-Berichterstattung (Ford: 350 wiedereingestellte Ingenieure, JD Power 2026 U.S. Initial Quality Study Platz 1 mit 152 Fehlern pro 100 Fahrzeugen und ~1 Mrd. USD erwarteter Kostenersparnis; IBM: Verdreifachung der Berufseinsteiger-Einstellungen 2026; Commonwealth Bank of Australia: &gt; 40 wiederaufgebaute Kundenservicestellen) sowie die zugehörige Empirie aus der Orgvue-Vitreous-World-Erhebung (1.163 Senior Decision-Makers; 39 % KI-bedingte Personalreduktionen, davon 55 % im Nachhinein bereuend, 23 % ohne rollenbezogene Analyse entschieden) und der Robert-Half-Rückholrate (32 % der US-Hiring-Manager mussten primär KI-bedingt gestrichene Rollen wiederbesetzen — Finance 44 %, HR 35 %, Technology 32 %). Eine regelmäßige Aktualisierung ist vorgesehen.</w:t>
+        <w:t xml:space="preserve"> sowie der weitere Verlauf des KI-getriebenen Restrukturierungspfads in der Tech-Branche. Die laufende Fortschreibung der Kennzahlen (Layoff-Tracker, Challenger-Monatsreports, AI-Capex, IAB- und GKV-Daten) erfolgt tabellarisch im quantitativen Anhang `Statistik.md`; die vollständige Historie aller Update-Läufe und eingearbeiteten Quellen dokumentiert `Änderungshistorie.md`. Eine regelmäßige Aktualisierung ist vorgesehen.</w:t>
       </w:r>
     </w:p>
     <w:p>
@@ -12148,7 +11286,7 @@
         <w:color w:val="999999"/>
         <w:sz w:val="15"/>
       </w:rPr>
-      <w:t>Version 25.0 — Mai 2026 — CC BY 4.0</w:t>
+      <w:t>Version 26.0 — Mai 2026 — CC BY 4.0</w:t>
       <w:tab/>
       <w:t xml:space="preserve">Seite </w:t>
     </w:r>

</xml_diff>

<commit_message>
Struktur-Review Teil 3 (Version 28.0): § 11.5 entschlackt, Diagramm-Pipeline build_charts.py
- § 11.5: 41 von 62 Quellen-Annotationen auf den bibliografischen Kern
  reduziert (8.244 Zeichen; keine Quelle, keine URL gelöscht — Zahlen
  leben in Statistik.md); Literaturverzeichnis 31,4 % → 29,0 %
  Dokumentanteil, Hauptdokument seit v25.0 um 17 % kompakter
- build_charts.py: drei Diagramme aus den Statistik.md-Tabellen
  (Layoff-Tracker-Zeitreihe, Challenger-Monatsbalken mit KI-Segment,
  AI-Capex mit Projektions-Schraffur); Farben gemäß Formatvorlage,
  Palette validiert; Diagramme in Statistik.md eingebettet
- DailyPrompt: Chart-Build als Phase 5 (2a), charts/ in Staging-Liste,
  veraltetes Verifikations-Beispiel generisch gefasst
- Logbücher fortgeschrieben, PDF/DOCX neu gebaut, Version 27.0 → 28.0

Co-Authored-By: Claude Fable 5 <noreply@anthropic.com>
Claude-Session: https://claude.ai/code/session_017Bfup8wN1Gndz9p3qhnMxM
</commit_message>
<xml_diff>
--- a/KI-Ökonomie.docx
+++ b/KI-Ökonomie.docx
@@ -112,7 +112,7 @@
           <w:color w:val="666666"/>
           <w:sz w:val="18"/>
         </w:rPr>
-        <w:t>Version 27.0</w:t>
+        <w:t>Version 28.0</w:t>
       </w:r>
     </w:p>
     <w:p>
@@ -9357,7 +9357,7 @@
           <w:i w:val="0"/>
           <w:sz w:val="19"/>
         </w:rPr>
-        <w:t xml:space="preserve"> Berichterstattung zum Kabinettsbeschluss des GKV-Beitragssatzstabilisierungsgesetzes und Reduktion des Sparvolumens auf 16,3 Milliarden Euro. https://www.t-online.de/nachrichten/deutschland/innenpolitik/id_101234006/gkv-reform-kabinett-bringt-krankenkassen-sparpaket-auf-den-weg.html | https://www.zdfheute.de/politik/deutschland/gkv-krankenkassen-reform-sparplan-folgen-krankenhaeuser-patienten-100.html | https://www.bundestag.de/presse/hib/kurzmeldungen-1165530</w:t>
+        <w:t xml:space="preserve"> https://www.t-online.de/nachrichten/deutschland/innenpolitik/id_101234006/gkv-reform-kabinett-bringt-krankenkassen-sparpaket-auf-den-weg.html | https://www.zdfheute.de/politik/deutschland/gkv-krankenkassen-reform-sparplan-folgen-krankenhaeuser-patienten-100.html | https://www.bundestag.de/presse/hib/kurzmeldungen-1165530</w:t>
       </w:r>
     </w:p>
     <w:p>
@@ -9445,7 +9445,7 @@
           <w:i w:val="0"/>
           <w:sz w:val="19"/>
         </w:rPr>
-        <w:t xml:space="preserve"> Bericht zur Arraignment-Anhörung am 14. April 2026; Terminierung der Hauptanhörung auf den 5. Mai 2026. https://www.cnbc.com/2026/04/14/sam-altman-openai-molotov-attack-arraignment.html</w:t>
+        <w:t xml:space="preserve"> https://www.cnbc.com/2026/04/14/sam-altman-openai-molotov-attack-arraignment.html</w:t>
       </w:r>
     </w:p>
     <w:p>
@@ -9541,7 +9541,7 @@
           <w:i w:val="0"/>
           <w:sz w:val="19"/>
         </w:rPr>
-        <w:t xml:space="preserve"> Branchenauswertung zu Q1-2026-Tech-Layoffs. https://www.tomshardware.com/tech-industry/tech-industry-lays-off-nearly-80-000-employees-in-the-first-quarter-of-2026-almost-50-percent-of-affected-positions-cut-due-to-ai</w:t>
+        <w:t xml:space="preserve"> https://www.tomshardware.com/tech-industry/tech-industry-lays-off-nearly-80-000-employees-in-the-first-quarter-of-2026-almost-50-percent-of-affected-positions-cut-due-to-ai</w:t>
       </w:r>
     </w:p>
     <w:p>
@@ -9573,7 +9573,7 @@
           <w:i w:val="0"/>
           <w:sz w:val="19"/>
         </w:rPr>
-        <w:t xml:space="preserve"> Analyse zur Buyout-Welle bei Microsoft (rund 7 % der länger beschäftigten US-Belegschaft) und zu den parallel bestätigten Meta-Streichungen. https://www.cnbc.com/2026/04/24/20k-job-cuts-at-meta-microsoft-raise-concern-of-ai-labor-crisis-.html</w:t>
+        <w:t xml:space="preserve"> https://www.cnbc.com/2026/04/24/20k-job-cuts-at-meta-microsoft-raise-concern-of-ai-labor-crisis-.html</w:t>
       </w:r>
     </w:p>
     <w:p>
@@ -9605,7 +9605,7 @@
           <w:i w:val="0"/>
           <w:sz w:val="19"/>
         </w:rPr>
-        <w:t xml:space="preserve"> Sammelberichterstattung zur 24.-April-Welle. https://finance.yahoo.com/markets/article/meta-to-cut-8000-jobs-microsoft-offers-buyouts-to-staff-as-ai-spending-costs-hit-big-tech-workers-182722409.html | https://www.fastcompany.com/91532016/tech-mass-layoffs-tracker-april-2026-meta-nike-list-of-job-slashers</w:t>
+        <w:t xml:space="preserve"> https://finance.yahoo.com/markets/article/meta-to-cut-8000-jobs-microsoft-offers-buyouts-to-staff-as-ai-spending-costs-hit-big-tech-workers-182722409.html | https://www.fastcompany.com/91532016/tech-mass-layoffs-tracker-april-2026-meta-nike-list-of-job-slashers</w:t>
       </w:r>
     </w:p>
     <w:p>
@@ -9637,7 +9637,7 @@
           <w:i w:val="0"/>
           <w:sz w:val="19"/>
         </w:rPr>
-        <w:t xml:space="preserve"> Sammelberichterstattung. https://en.channeliam.com/2026/04/20/global-tech-layoffs-ai-job-cuts/ | https://www.news9live.com/technology/tech-news/meta-microsoft-layoffs-2026-up-to-23000-jobs-at-risk-amid-ai-spending-surge-2963032</w:t>
+        <w:t xml:space="preserve"> https://en.channeliam.com/2026/04/20/global-tech-layoffs-ai-job-cuts/ | https://www.news9live.com/technology/tech-news/meta-microsoft-layoffs-2026-up-to-23000-jobs-at-risk-amid-ai-spending-surge-2963032</w:t>
       </w:r>
     </w:p>
     <w:p>
@@ -9701,7 +9701,7 @@
           <w:i w:val="0"/>
           <w:sz w:val="19"/>
         </w:rPr>
-        <w:t xml:space="preserve"> Analyse zum Korinek-Lockwood-Papier. https://www.globalgovernmentfinance.com/ai-displacement-labour-ambitious-fiscal-innovation-brookings-institution-paper/</w:t>
+        <w:t xml:space="preserve"> https://www.globalgovernmentfinance.com/ai-displacement-labour-ambitious-fiscal-innovation-brookings-institution-paper/</w:t>
       </w:r>
     </w:p>
     <w:p>
@@ -9733,7 +9733,7 @@
           <w:i w:val="0"/>
           <w:sz w:val="19"/>
         </w:rPr>
-        <w:t xml:space="preserve"> Kanzleianalysen zum Weißes-Haus-Framework vom 20. März 2026. https://www.mintz.com/insights-center/viewpoints/54731/2026-03-31-white-house-releases-national-ai-legislative-framework</w:t>
+        <w:t xml:space="preserve"> https://www.mintz.com/insights-center/viewpoints/54731/2026-03-31-white-house-releases-national-ai-legislative-framework</w:t>
       </w:r>
     </w:p>
     <w:p>
@@ -9765,7 +9765,7 @@
           <w:i w:val="0"/>
           <w:sz w:val="19"/>
         </w:rPr>
-        <w:t xml:space="preserve"> Berichterstattung zu Satz, österreichischem Vorbild und Koalitionsstand. https://meedia.de/news/beitrag/19410-kulturstaatsminister-wolfram-weimer-kuendigt-eine-digital-abgabe-fuer-google-meta-und-co-an.html</w:t>
+        <w:t xml:space="preserve"> https://meedia.de/news/beitrag/19410-kulturstaatsminister-wolfram-weimer-kuendigt-eine-digital-abgabe-fuer-google-meta-und-co-an.html</w:t>
       </w:r>
     </w:p>
     <w:p>
@@ -9797,7 +9797,7 @@
           <w:i w:val="0"/>
           <w:sz w:val="19"/>
         </w:rPr>
-        <w:t xml:space="preserve"> Bericht zum Koalitionsverhandlungsstand und zum geplanten Eckpunktepapier. https://www.onvista.de/news/2026/04-22-weimer-koalition-ringt-weiter-um-digitalabgabe-0-10-26503452</w:t>
+        <w:t xml:space="preserve"> https://www.onvista.de/news/2026/04-22-weimer-koalition-ringt-weiter-um-digitalabgabe-0-10-26503452</w:t>
       </w:r>
     </w:p>
     <w:p>
@@ -9829,7 +9829,7 @@
           <w:i w:val="0"/>
           <w:sz w:val="19"/>
         </w:rPr>
-        <w:t xml:space="preserve"> Sammelberichterstattung zum Veto gegen LD 307 und zum politischen Kontext (Carve-out Jay, Veto-Override-Hürde). https://www.bangordailynews.com/2026/04/24/politics/janet-mills-vetoes-maine-data-center-ban/ | https://www.washingtonpost.com/business/2026/04/24/data-center-moratoriums-maine-janet-mills/63977e7c-4022-11f1-bb46-ed564688d953_story.html | https://mainemorningstar.com/2026/04/24/gov-mills-vetoes-landmark-data-center-ban/</w:t>
+        <w:t xml:space="preserve"> https://www.bangordailynews.com/2026/04/24/politics/janet-mills-vetoes-maine-data-center-ban/ | https://www.washingtonpost.com/business/2026/04/24/data-center-moratoriums-maine-janet-mills/63977e7c-4022-11f1-bb46-ed564688d953_story.html | https://mainemorningstar.com/2026/04/24/gov-mills-vetoes-landmark-data-center-ban/</w:t>
       </w:r>
     </w:p>
     <w:p>
@@ -9861,7 +9861,7 @@
           <w:i w:val="0"/>
           <w:sz w:val="19"/>
         </w:rPr>
-        <w:t xml:space="preserve"> Berichterstattung zur fehlgeschlagenen Veto-Überschreibung im Repräsentantenhaus (72 zu 65 Stimmen). https://www.pressherald.com/2026/04/28/how-janet-mills-data-center-veto-reverberated-around-the-country/ | https://www.wbur.org/news/2026/04/27/maine-data-center-development-ban-vetoed-mills</w:t>
+        <w:t xml:space="preserve"> https://www.pressherald.com/2026/04/28/how-janet-mills-data-center-veto-reverberated-around-the-country/ | https://www.wbur.org/news/2026/04/27/maine-data-center-development-ban-vetoed-mills</w:t>
       </w:r>
     </w:p>
     <w:p>
@@ -9893,7 +9893,7 @@
           <w:i w:val="0"/>
           <w:sz w:val="19"/>
         </w:rPr>
-        <w:t xml:space="preserve"> Kritische Analyse zum OpenAI-Strategiepapier vom 6. April 2026. https://www.techpolicy.press/openais-new-industrial-policy-for-the-intelligence-age-is-a-policymercial/</w:t>
+        <w:t xml:space="preserve"> https://www.techpolicy.press/openais-new-industrial-policy-for-the-intelligence-age-is-a-policymercial/</w:t>
       </w:r>
     </w:p>
     <w:p>
@@ -9925,7 +9925,7 @@
           <w:i w:val="0"/>
           <w:sz w:val="19"/>
         </w:rPr>
-        <w:t xml:space="preserve"> Analyse zum Workforce-and-Productivity-Gap-Zuschlag (Raised Bill 515). https://ctmirror.org/2026/04/24/connecticuts-ai-tax-tries-to-solve-a-real-problem-but-targets-the-wrong-signal-revana/</w:t>
+        <w:t xml:space="preserve"> https://ctmirror.org/2026/04/24/connecticuts-ai-tax-tries-to-solve-a-real-problem-but-targets-the-wrong-signal-revana/</w:t>
       </w:r>
     </w:p>
     <w:p>
@@ -9957,7 +9957,7 @@
           <w:i w:val="0"/>
           <w:sz w:val="19"/>
         </w:rPr>
-        <w:t xml:space="preserve"> Bericht zur Senatsabstimmung über SB 5. https://ctmirror.org/2026/04/21/artificial-intelligence-regulation-senate-ct/</w:t>
+        <w:t xml:space="preserve"> https://ctmirror.org/2026/04/21/artificial-intelligence-regulation-senate-ct/</w:t>
       </w:r>
     </w:p>
     <w:p>
@@ -9989,7 +9989,21 @@
           <w:i w:val="0"/>
           <w:sz w:val="19"/>
         </w:rPr>
-        <w:t xml:space="preserve"> Bericht zur Hausabstimmung über </w:t>
+        <w:t xml:space="preserve"> https://ctmirror.org/2026/05/01/artificial-intelligence-house-regulation-passage-ct/</w:t>
+      </w:r>
+    </w:p>
+    <w:p>
+      <w:pPr>
+        <w:jc w:val="both"/>
+      </w:pPr>
+      <w:r>
+        <w:rPr>
+          <w:rFonts w:ascii="Arial" w:hAnsi="Arial"/>
+          <w:b w:val="0"/>
+          <w:i w:val="0"/>
+          <w:sz w:val="19"/>
+        </w:rPr>
+        <w:t xml:space="preserve">Pluribus News. (1. Mai 2026). </w:t>
       </w:r>
       <w:r>
         <w:rPr>
@@ -9998,16 +10012,16 @@
           <w:i/>
           <w:sz w:val="19"/>
         </w:rPr>
-        <w:t>SB 5</w:t>
-      </w:r>
-      <w:r>
-        <w:rPr>
-          <w:rFonts w:ascii="Arial" w:hAnsi="Arial"/>
-          <w:b w:val="0"/>
-          <w:i w:val="0"/>
-          <w:sz w:val="19"/>
-        </w:rPr>
-        <w:t xml:space="preserve"> (131 zu 17) und zur Ankündigung Lamonts, das Gesetz zu unterzeichnen. https://ctmirror.org/2026/05/01/artificial-intelligence-house-regulation-passage-ct/</w:t>
+        <w:t>Connecticut legislators pass sweeping AI bill.</w:t>
+      </w:r>
+      <w:r>
+        <w:rPr>
+          <w:rFonts w:ascii="Arial" w:hAnsi="Arial"/>
+          <w:b w:val="0"/>
+          <w:i w:val="0"/>
+          <w:sz w:val="19"/>
+        </w:rPr>
+        <w:t xml:space="preserve"> https://pluribusnews.com/news-and-events/connecticut-legislators-pass-sweeping-ai-bill/</w:t>
       </w:r>
     </w:p>
     <w:p>
@@ -10021,7 +10035,7 @@
           <w:i w:val="0"/>
           <w:sz w:val="19"/>
         </w:rPr>
-        <w:t xml:space="preserve">Pluribus News. (1. Mai 2026). </w:t>
+        <w:t xml:space="preserve">Hartford Business Journal. (April 2026). </w:t>
       </w:r>
       <w:r>
         <w:rPr>
@@ -10030,16 +10044,16 @@
           <w:i/>
           <w:sz w:val="19"/>
         </w:rPr>
-        <w:t>Connecticut legislators pass sweeping AI bill.</w:t>
-      </w:r>
-      <w:r>
-        <w:rPr>
-          <w:rFonts w:ascii="Arial" w:hAnsi="Arial"/>
-          <w:b w:val="0"/>
-          <w:i w:val="0"/>
-          <w:sz w:val="19"/>
-        </w:rPr>
-        <w:t xml:space="preserve"> Berichterstattung zu Frontier-Modell-Aufsicht, AI-Sandbox, Whistleblower-Schutz, Disclosure-Pflichten bei AI-bezogenen Beschäftigungsentscheidungen und AI-Layoffs sowie Connecticut AI Academy. https://pluribusnews.com/news-and-events/connecticut-legislators-pass-sweeping-ai-bill/</w:t>
+        <w:t>Lawmakers weigh surcharge tied to AI-driven productivity gains.</w:t>
+      </w:r>
+      <w:r>
+        <w:rPr>
+          <w:rFonts w:ascii="Arial" w:hAnsi="Arial"/>
+          <w:b w:val="0"/>
+          <w:i w:val="0"/>
+          <w:sz w:val="19"/>
+        </w:rPr>
+        <w:t xml:space="preserve"> https://hartfordbusiness.com/article/lawmakers-weigh-surcharge-tied-to-ai-driven-productivity-gains/</w:t>
       </w:r>
     </w:p>
     <w:p>
@@ -10053,7 +10067,7 @@
           <w:i w:val="0"/>
           <w:sz w:val="19"/>
         </w:rPr>
-        <w:t xml:space="preserve">Hartford Business Journal. (April 2026). </w:t>
+        <w:t xml:space="preserve">GeekWire / TechCrunch. (23./24. April 2026). </w:t>
       </w:r>
       <w:r>
         <w:rPr>
@@ -10062,16 +10076,16 @@
           <w:i/>
           <w:sz w:val="19"/>
         </w:rPr>
-        <w:t>Lawmakers weigh surcharge tied to AI-driven productivity gains.</w:t>
-      </w:r>
-      <w:r>
-        <w:rPr>
-          <w:rFonts w:ascii="Arial" w:hAnsi="Arial"/>
-          <w:b w:val="0"/>
-          <w:i w:val="0"/>
-          <w:sz w:val="19"/>
-        </w:rPr>
-        <w:t xml:space="preserve"> Hintergrundbericht zum Productivity-Gap-Zuschlag. https://hartfordbusiness.com/article/lawmakers-weigh-surcharge-tied-to-ai-driven-productivity-gains/</w:t>
+        <w:t>Microsoft will offer voluntary retirement to thousands of employees in a first for tech giant / Microsoft offers buyout for up to 7% of U.S. employees.</w:t>
+      </w:r>
+      <w:r>
+        <w:rPr>
+          <w:rFonts w:ascii="Arial" w:hAnsi="Arial"/>
+          <w:b w:val="0"/>
+          <w:i w:val="0"/>
+          <w:sz w:val="19"/>
+        </w:rPr>
+        <w:t xml:space="preserve"> https://www.geekwire.com/2026/microsoft-will-offer-voluntary-retirement-to-thousands-of-employees-in-a-first-for-tech-giant/ | https://techcrunch.com/2026/04/23/microsoft-offers-buyout-for-up-to-7-of-u-s-employees/</w:t>
       </w:r>
     </w:p>
     <w:p>
@@ -10085,7 +10099,7 @@
           <w:i w:val="0"/>
           <w:sz w:val="19"/>
         </w:rPr>
-        <w:t xml:space="preserve">GeekWire / TechCrunch. (23./24. April 2026). </w:t>
+        <w:t xml:space="preserve">TrueWealth Financial Partners / The Motley Fool / Inc. (5./7. Mai 2026). </w:t>
       </w:r>
       <w:r>
         <w:rPr>
@@ -10094,16 +10108,16 @@
           <w:i/>
           <w:sz w:val="19"/>
         </w:rPr>
-        <w:t>Microsoft will offer voluntary retirement to thousands of employees in a first for tech giant / Microsoft offers buyout for up to 7% of U.S. employees.</w:t>
-      </w:r>
-      <w:r>
-        <w:rPr>
-          <w:rFonts w:ascii="Arial" w:hAnsi="Arial"/>
-          <w:b w:val="0"/>
-          <w:i w:val="0"/>
-          <w:sz w:val="19"/>
-        </w:rPr>
-        <w:t xml:space="preserve"> Berichterstattung zu Eligibility (Lebensalter + Betriebszugehörigkeit ≥ 70), Notification 7. Mai 2026 und 30-Tage-Annahmefenster. https://www.geekwire.com/2026/microsoft-will-offer-voluntary-retirement-to-thousands-of-employees-in-a-first-for-tech-giant/ | https://techcrunch.com/2026/04/23/microsoft-offers-buyout-for-up-to-7-of-u-s-employees/</w:t>
+        <w:t>Microsoft's Voluntary Retirement Program — New Details / Microsoft Reshapes Workforce, Offering Buyouts to Nearly 9,000 Employees.</w:t>
+      </w:r>
+      <w:r>
+        <w:rPr>
+          <w:rFonts w:ascii="Arial" w:hAnsi="Arial"/>
+          <w:b w:val="0"/>
+          <w:i w:val="0"/>
+          <w:sz w:val="19"/>
+        </w:rPr>
+        <w:t xml:space="preserve"> https://www.truewealthfp.com/insights/microsofts-voluntary-retirement-program | https://www.fool.com/investing/2026/05/05/microsoft-just-launched-a-major-voluntary-buyout-w/ | https://www.inc.com/leila-sheridan/microsoft-ai-buyout-9000/91335472</w:t>
       </w:r>
     </w:p>
     <w:p>
@@ -10117,7 +10131,7 @@
           <w:i w:val="0"/>
           <w:sz w:val="19"/>
         </w:rPr>
-        <w:t xml:space="preserve">TrueWealth Financial Partners / The Motley Fool / Inc. (5./7. Mai 2026). </w:t>
+        <w:t xml:space="preserve">TrueUp / Fast Company. (April 2026). </w:t>
       </w:r>
       <w:r>
         <w:rPr>
@@ -10126,16 +10140,16 @@
           <w:i/>
           <w:sz w:val="19"/>
         </w:rPr>
-        <w:t>Microsoft's Voluntary Retirement Program — New Details / Microsoft Reshapes Workforce, Offering Buyouts to Nearly 9,000 Employees.</w:t>
-      </w:r>
-      <w:r>
-        <w:rPr>
-          <w:rFonts w:ascii="Arial" w:hAnsi="Arial"/>
-          <w:b w:val="0"/>
-          <w:i w:val="0"/>
-          <w:sz w:val="19"/>
-        </w:rPr>
-        <w:t xml:space="preserve"> Konkrete Programmkonditionen mit Versand der individuellen Angebote am 7. Mai 2026, Annahmefrist 8. Juni 2026 (23:59 Pacific Time), VRSAR-Unterzeichnung 9.–22. Juni 2026, Eligibility Senior-Director-Ebene und darunter (ohne Sales-/Services-Incentive-Pläne), Cash-Einmalzahlung sowie bis zu fünfjähriger Krankenversicherungs-Verlängerung; keine Wettbewerbs- oder Beschäftigungsverbote. https://www.truewealthfp.com/insights/microsofts-voluntary-retirement-program | https://www.fool.com/investing/2026/05/05/microsoft-just-launched-a-major-voluntary-buyout-w/ | https://www.inc.com/leila-sheridan/microsoft-ai-buyout-9000/91335472</w:t>
+        <w:t>Tech Layoffs Tracker — kumulierte Tech-Stellenstreichungen 2026 ≥ 92.000 (Stand 24./25. April 2026).</w:t>
+      </w:r>
+      <w:r>
+        <w:rPr>
+          <w:rFonts w:ascii="Arial" w:hAnsi="Arial"/>
+          <w:b w:val="0"/>
+          <w:i w:val="0"/>
+          <w:sz w:val="19"/>
+        </w:rPr>
+        <w:t xml:space="preserve"> https://www.trueup.io/layoffs | https://www.fastcompany.com/91532016/tech-mass-layoffs-tracker-april-2026-meta-nike-list-of-job-slashers</w:t>
       </w:r>
     </w:p>
     <w:p>
@@ -10149,7 +10163,7 @@
           <w:i w:val="0"/>
           <w:sz w:val="19"/>
         </w:rPr>
-        <w:t xml:space="preserve">TrueUp / Fast Company. (April 2026). </w:t>
+        <w:t xml:space="preserve">SkillSyncer / TrueUp / BusinessToday. (Stand 1./2. Mai 2026). </w:t>
       </w:r>
       <w:r>
         <w:rPr>
@@ -10158,16 +10172,16 @@
           <w:i/>
           <w:sz w:val="19"/>
         </w:rPr>
-        <w:t>Tech Layoffs Tracker — kumulierte Tech-Stellenstreichungen 2026 ≥ 92.000 (Stand 24./25. April 2026).</w:t>
-      </w:r>
-      <w:r>
-        <w:rPr>
-          <w:rFonts w:ascii="Arial" w:hAnsi="Arial"/>
-          <w:b w:val="0"/>
-          <w:i w:val="0"/>
-          <w:sz w:val="19"/>
-        </w:rPr>
-        <w:t xml:space="preserve"> https://www.trueup.io/layoffs | https://www.fastcompany.com/91532016/tech-mass-layoffs-tracker-april-2026-meta-nike-list-of-job-slashers</w:t>
+        <w:t>Tech Layoffs Tracker — kumulierte Tech-Stellenstreichungen 2026: SkillSyncer 113.863 Personen aus 179 Layoff-Ereignissen (Stand 2. Mai 2026, durchschnittlich 933 Personen pro Tag); TrueUp 95.878 Personen aus 249 Layoff-Meldungen; allein April 2026 mehr als 40.000 Stellen (u. a. Oracle, Meta, Snap).</w:t>
+      </w:r>
+      <w:r>
+        <w:rPr>
+          <w:rFonts w:ascii="Arial" w:hAnsi="Arial"/>
+          <w:b w:val="0"/>
+          <w:i w:val="0"/>
+          <w:sz w:val="19"/>
+        </w:rPr>
+        <w:t xml:space="preserve"> https://skillsyncer.com/layoffs-tracker | https://www.trueup.io/layoffs | https://www.businesstoday.in/technology/story/tech-layoffs-2026-nearly-40000-jobs-lost-in-april-amid-changing-ai-priorities-528282-2026-04-30</w:t>
       </w:r>
     </w:p>
     <w:p>
@@ -10181,7 +10195,7 @@
           <w:i w:val="0"/>
           <w:sz w:val="19"/>
         </w:rPr>
-        <w:t xml:space="preserve">SkillSyncer / TrueUp / BusinessToday. (Stand 1./2. Mai 2026). </w:t>
+        <w:t xml:space="preserve">SkillSyncer / TrueUp. (Stand 6. Mai 2026). </w:t>
       </w:r>
       <w:r>
         <w:rPr>
@@ -10190,16 +10204,16 @@
           <w:i/>
           <w:sz w:val="19"/>
         </w:rPr>
-        <w:t>Tech Layoffs Tracker — kumulierte Tech-Stellenstreichungen 2026: SkillSyncer 113.863 Personen aus 179 Layoff-Ereignissen (Stand 2. Mai 2026, durchschnittlich 933 Personen pro Tag); TrueUp 95.878 Personen aus 249 Layoff-Meldungen; allein April 2026 mehr als 40.000 Stellen (u. a. Oracle, Meta, Snap).</w:t>
-      </w:r>
-      <w:r>
-        <w:rPr>
-          <w:rFonts w:ascii="Arial" w:hAnsi="Arial"/>
-          <w:b w:val="0"/>
-          <w:i w:val="0"/>
-          <w:sz w:val="19"/>
-        </w:rPr>
-        <w:t xml:space="preserve"> https://skillsyncer.com/layoffs-tracker | https://www.trueup.io/layoffs | https://www.businesstoday.in/technology/story/tech-layoffs-2026-nearly-40000-jobs-lost-in-april-amid-changing-ai-priorities-528282-2026-04-30</w:t>
+        <w:t>Tech Layoffs Tracker — Aktualisierung: TrueUp 119.721 Personen aus 265 Layoff-Meldungen (rund 958 Stellen pro Tag); SkillSyncer weitgehend unverändert bei 113.863 Personen aus 179 Ereignissen.</w:t>
+      </w:r>
+      <w:r>
+        <w:rPr>
+          <w:rFonts w:ascii="Arial" w:hAnsi="Arial"/>
+          <w:b w:val="0"/>
+          <w:i w:val="0"/>
+          <w:sz w:val="19"/>
+        </w:rPr>
+        <w:t xml:space="preserve"> https://skillsyncer.com/layoffs-tracker | https://www.trueup.io/layoffs</w:t>
       </w:r>
     </w:p>
     <w:p>
@@ -10213,7 +10227,7 @@
           <w:i w:val="0"/>
           <w:sz w:val="19"/>
         </w:rPr>
-        <w:t xml:space="preserve">SkillSyncer / TrueUp. (Stand 6. Mai 2026). </w:t>
+        <w:t xml:space="preserve">TrueUp. (Stand 7. Mai 2026). </w:t>
       </w:r>
       <w:r>
         <w:rPr>
@@ -10222,16 +10236,16 @@
           <w:i/>
           <w:sz w:val="19"/>
         </w:rPr>
-        <w:t>Tech Layoffs Tracker — Aktualisierung: TrueUp 119.721 Personen aus 265 Layoff-Meldungen (rund 958 Stellen pro Tag); SkillSyncer weitgehend unverändert bei 113.863 Personen aus 179 Ereignissen.</w:t>
-      </w:r>
-      <w:r>
-        <w:rPr>
-          <w:rFonts w:ascii="Arial" w:hAnsi="Arial"/>
-          <w:b w:val="0"/>
-          <w:i w:val="0"/>
-          <w:sz w:val="19"/>
-        </w:rPr>
-        <w:t xml:space="preserve"> https://skillsyncer.com/layoffs-tracker | https://www.trueup.io/layoffs</w:t>
+        <w:t>Tech Layoffs Tracker — Tagesfortschreibung: 121.111 Personen aus 273 Layoff-Meldungen (rund 961 Personen pro Tag).</w:t>
+      </w:r>
+      <w:r>
+        <w:rPr>
+          <w:rFonts w:ascii="Arial" w:hAnsi="Arial"/>
+          <w:b w:val="0"/>
+          <w:i w:val="0"/>
+          <w:sz w:val="19"/>
+        </w:rPr>
+        <w:t xml:space="preserve"> https://www.trueup.io/layoffs</w:t>
       </w:r>
     </w:p>
     <w:p>
@@ -10245,7 +10259,7 @@
           <w:i w:val="0"/>
           <w:sz w:val="19"/>
         </w:rPr>
-        <w:t xml:space="preserve">TrueUp. (Stand 7. Mai 2026). </w:t>
+        <w:t xml:space="preserve">TrueUp / InformationWeek. (Stand 8. Mai 2026). </w:t>
       </w:r>
       <w:r>
         <w:rPr>
@@ -10254,7 +10268,743 @@
           <w:i/>
           <w:sz w:val="19"/>
         </w:rPr>
-        <w:t>Tech Layoffs Tracker — Tagesfortschreibung: 121.111 Personen aus 273 Layoff-Meldungen (rund 961 Personen pro Tag).</w:t>
+        <w:t>Tech Layoffs Tracker — Tagesfortschreibung: 127.411 Personen aus 283 Layoff-Meldungen (rund 1.003 Personen pro Tag).</w:t>
+      </w:r>
+      <w:r>
+        <w:rPr>
+          <w:rFonts w:ascii="Arial" w:hAnsi="Arial"/>
+          <w:b w:val="0"/>
+          <w:i w:val="0"/>
+          <w:sz w:val="19"/>
+        </w:rPr>
+        <w:t xml:space="preserve"> https://www.trueup.io/layoffs | https://www.informationweek.com/it-staffing-careers/2026-tech-company-layoffs</w:t>
+      </w:r>
+    </w:p>
+    <w:p>
+      <w:pPr>
+        <w:jc w:val="both"/>
+      </w:pPr>
+      <w:r>
+        <w:rPr>
+          <w:rFonts w:ascii="Arial" w:hAnsi="Arial"/>
+          <w:b w:val="0"/>
+          <w:i w:val="0"/>
+          <w:sz w:val="19"/>
+        </w:rPr>
+        <w:t xml:space="preserve">CNBC / Bloomberg / AOL / The Register. (7./8. Mai 2026). </w:t>
+      </w:r>
+      <w:r>
+        <w:rPr>
+          <w:rFonts w:ascii="Arial" w:hAnsi="Arial"/>
+          <w:b w:val="0"/>
+          <w:i/>
+          <w:sz w:val="19"/>
+        </w:rPr>
+        <w:t>Cloudflare stock sinks 18% after earnings as company cuts 1,100 employees due to AI changes / Cloudflare to Cut 1,100 Jobs as It Shifts to AI-First Operating Model / Read the memo: Cloudflare is laying off 1,100 employees to prepare for ‚the agentic AI era‘ / Cloudflare to fire 1,100 staff whose jobs just aren't AI enough.</w:t>
+      </w:r>
+      <w:r>
+        <w:rPr>
+          <w:rFonts w:ascii="Arial" w:hAnsi="Arial"/>
+          <w:b w:val="0"/>
+          <w:i w:val="0"/>
+          <w:sz w:val="19"/>
+        </w:rPr>
+        <w:t xml:space="preserve"> https://www.cnbc.com/2026/05/07/cloudflare-net-q1-2026-stock-earnings-layoffs.html | https://www.bloomberg.com/news/articles/2026-05-07/cloudflare-to-cut-one-fifth-of-workers-in-move-to-ai-first-model | https://www.aol.com/articles/read-memo-cloudflare-laying-off-212614000.html | https://www.theregister.com/off-prem/2026/05/08/cloudflare-to-fire-1100-staff-whose-jobs-just-arent-ai-enough/5235536</w:t>
+      </w:r>
+    </w:p>
+    <w:p>
+      <w:pPr>
+        <w:jc w:val="both"/>
+      </w:pPr>
+      <w:r>
+        <w:rPr>
+          <w:rFonts w:ascii="Arial" w:hAnsi="Arial"/>
+          <w:b w:val="0"/>
+          <w:i w:val="0"/>
+          <w:sz w:val="19"/>
+        </w:rPr>
+        <w:t xml:space="preserve">Challenger, Gray &amp; Christmas / CBS News / Fast Company. (1./3. Mai 2026). </w:t>
+      </w:r>
+      <w:r>
+        <w:rPr>
+          <w:rFonts w:ascii="Arial" w:hAnsi="Arial"/>
+          <w:b w:val="0"/>
+          <w:i/>
+          <w:sz w:val="19"/>
+        </w:rPr>
+        <w:t>Challenger Report: April Job Cuts Rise 38 % from March; YTD Cuts Down 50 % / AI emerges as a top cause of layoffs, accounting for 26 % of April's job cuts / Layoffs are actually on the decline in 2026 — but not in tech.</w:t>
+      </w:r>
+      <w:r>
+        <w:rPr>
+          <w:rFonts w:ascii="Arial" w:hAnsi="Arial"/>
+          <w:b w:val="0"/>
+          <w:i w:val="0"/>
+          <w:sz w:val="19"/>
+        </w:rPr>
+        <w:t xml:space="preserve"> https://www.challengergray.com/blog/challenger-report-april-job-cuts-rise-38-from-march-ytd-cuts-down-50/ | https://www.cbsnews.com/news/ai-layoffs-job-cuts-challenger-report-april-2026/ | https://www.fastcompany.com/91538649/layoffs-are-actually-on-the-decline-in-2026-but-not-in-the-tech-industry</w:t>
+      </w:r>
+    </w:p>
+    <w:p>
+      <w:pPr>
+        <w:jc w:val="both"/>
+      </w:pPr>
+      <w:r>
+        <w:rPr>
+          <w:rFonts w:ascii="Arial" w:hAnsi="Arial"/>
+          <w:b w:val="0"/>
+          <w:i w:val="0"/>
+          <w:sz w:val="19"/>
+        </w:rPr>
+        <w:t xml:space="preserve">CNBC / Engadget / Coindesk / Fortune. (5. Mai 2026). </w:t>
+      </w:r>
+      <w:r>
+        <w:rPr>
+          <w:rFonts w:ascii="Arial" w:hAnsi="Arial"/>
+          <w:b w:val="0"/>
+          <w:i/>
+          <w:sz w:val="19"/>
+        </w:rPr>
+        <w:t>Coinbase cuts headcount by 14% citing AI acceleration / Coinbase lays off nearly 700 workers in „AI-native" restructuring / Coinbase didn't just lay off 14% of its staff due to AI.</w:t>
+      </w:r>
+      <w:r>
+        <w:rPr>
+          <w:rFonts w:ascii="Arial" w:hAnsi="Arial"/>
+          <w:b w:val="0"/>
+          <w:i w:val="0"/>
+          <w:sz w:val="19"/>
+        </w:rPr>
+        <w:t xml:space="preserve"> https://www.cnbc.com/2026/05/05/coinbase-cuts-headcount-by-14percent-citing-ai-acceleration-the-shares-are-gaining.html | https://www.engadget.com/2165157/coinbase-lays-off-nearly-700-workers-in-ai-native-restructuring/ | https://www.coindesk.com/business/2026/05/05/coinbase-cuts-14-of-staff-as-ai-reshapes-how-crypto-companies-operate | https://fortune.com/2026/05/05/coinbase-layoffs-14-of-employees-ai-tech-ai-job-anxiety-crypto/</w:t>
+      </w:r>
+    </w:p>
+    <w:p>
+      <w:pPr>
+        <w:jc w:val="both"/>
+      </w:pPr>
+      <w:r>
+        <w:rPr>
+          <w:rFonts w:ascii="Arial" w:hAnsi="Arial"/>
+          <w:b w:val="0"/>
+          <w:i w:val="0"/>
+          <w:sz w:val="19"/>
+        </w:rPr>
+        <w:t xml:space="preserve">Bloomberg / TechCrunch / Yahoo Finance. (5. Mai 2026). </w:t>
+      </w:r>
+      <w:r>
+        <w:rPr>
+          <w:rFonts w:ascii="Arial" w:hAnsi="Arial"/>
+          <w:b w:val="0"/>
+          <w:i/>
+          <w:sz w:val="19"/>
+        </w:rPr>
+        <w:t>PayPal Plans Job Cuts as Fintech's New CEO Pursues Turnaround Strategy / PayPal says it's „becoming a technology company again" — that means AI / PayPal layoffs: New CEO cuts 20% of workforce in Q1 2026.</w:t>
+      </w:r>
+      <w:r>
+        <w:rPr>
+          <w:rFonts w:ascii="Arial" w:hAnsi="Arial"/>
+          <w:b w:val="0"/>
+          <w:i w:val="0"/>
+          <w:sz w:val="19"/>
+        </w:rPr>
+        <w:t xml:space="preserve"> https://www.bloomberg.com/news/articles/2026-05-05/paypal-plans-job-cuts-as-fintech-s-new-ceo-pursues-turnaround-strategy | https://techcrunch.com/2026/05/05/paypal-says-its-becoming-a-technology-company-again-that-means-ai/ | https://finance.yahoo.com/markets/stocks/articles/paypal-layoffs-ceo-cuts-20-154944985.html</w:t>
+      </w:r>
+    </w:p>
+    <w:p>
+      <w:pPr>
+        <w:jc w:val="both"/>
+      </w:pPr>
+      <w:r>
+        <w:rPr>
+          <w:rFonts w:ascii="Arial" w:hAnsi="Arial"/>
+          <w:b w:val="0"/>
+          <w:i w:val="0"/>
+          <w:sz w:val="19"/>
+        </w:rPr>
+        <w:t xml:space="preserve">TechRadar / Storyboard18. (5./6. Mai 2026). </w:t>
+      </w:r>
+      <w:r>
+        <w:rPr>
+          <w:rFonts w:ascii="Arial" w:hAnsi="Arial"/>
+          <w:b w:val="0"/>
+          <w:i/>
+          <w:sz w:val="19"/>
+        </w:rPr>
+        <w:t>Freshworks and Coinbase announce more than 1 in 10 jobs to go as companies replace workforce with AI technologies / Freshworks Layoffs 2026: „Over half of our code is written by AI," says CEO as firm cuts 500 jobs.</w:t>
+      </w:r>
+      <w:r>
+        <w:rPr>
+          <w:rFonts w:ascii="Arial" w:hAnsi="Arial"/>
+          <w:b w:val="0"/>
+          <w:i w:val="0"/>
+          <w:sz w:val="19"/>
+        </w:rPr>
+        <w:t xml:space="preserve"> https://www.techradar.com/pro/freshworks-and-coinbase-announce-more-than-1-in-10-jobs-to-go-as-companies-replace-workforce-with-ai-technologies-tech-company-layoffs-near-100k-in-2026-alone | https://www.storyboard18.com/brand-marketing/freshworks-layoffs-over-half-of-our-code-is-written-by-ai-says-ceo-as-firm-cuts-500-jobs-97275.htm</w:t>
+      </w:r>
+    </w:p>
+    <w:p>
+      <w:pPr>
+        <w:jc w:val="both"/>
+      </w:pPr>
+      <w:r>
+        <w:rPr>
+          <w:rFonts w:ascii="Arial" w:hAnsi="Arial"/>
+          <w:b w:val="0"/>
+          <w:i w:val="0"/>
+          <w:sz w:val="19"/>
+        </w:rPr>
+        <w:t xml:space="preserve">American Bazaar / TechResearchOnline / Goodreturns. (Mai 2026). </w:t>
+      </w:r>
+      <w:r>
+        <w:rPr>
+          <w:rFonts w:ascii="Arial" w:hAnsi="Arial"/>
+          <w:b w:val="0"/>
+          <w:i/>
+          <w:sz w:val="19"/>
+        </w:rPr>
+        <w:t>Cognizant eyes up to 15,000 layoffs, India set to bear the brunt / Cognizant Layoffs 2026 Signal AI Shift in IT Services / Layoffs 2026: Cognizant May Cut Up to 15,000 Jobs Globally Under „Project Leap".</w:t>
+      </w:r>
+      <w:r>
+        <w:rPr>
+          <w:rFonts w:ascii="Arial" w:hAnsi="Arial"/>
+          <w:b w:val="0"/>
+          <w:i w:val="0"/>
+          <w:sz w:val="19"/>
+        </w:rPr>
+        <w:t xml:space="preserve"> https://americanbazaaronline.com/2026/05/06/cognizant-eyes-up-to-15000-layoffs-india-set-to-bear-the-brunt-480243/ | https://techresearchonline.com/news/cognizant-layoffs-2026-ai-restructuring-project-leap/ | https://www.goodreturns.in/news/cognizant-layoffs-2026-it-company-may-cut-12000-15000-jobs-globally-major-impact-expected-in-india-1506427.html</w:t>
+      </w:r>
+    </w:p>
+    <w:p>
+      <w:pPr>
+        <w:jc w:val="both"/>
+      </w:pPr>
+      <w:r>
+        <w:rPr>
+          <w:rFonts w:ascii="Arial" w:hAnsi="Arial"/>
+          <w:b w:val="0"/>
+          <w:i w:val="0"/>
+          <w:sz w:val="19"/>
+        </w:rPr>
+        <w:t xml:space="preserve">Fortune / Investor's Business Daily / Futurum. (April–Mai 2026). </w:t>
+      </w:r>
+      <w:r>
+        <w:rPr>
+          <w:rFonts w:ascii="Arial" w:hAnsi="Arial"/>
+          <w:b w:val="0"/>
+          <w:i/>
+          <w:sz w:val="19"/>
+        </w:rPr>
+        <w:t>Big-Tech-AI-Capex 2026: Q1-Investitionen rund 130,65 Mrd. USD; Konsens-Schätzung für 2026 bei 660–700 Mrd. USD (Microsoft, Alphabet, Amazon, Meta, Oracle); Wall-Street-Analysten erwarten 2027 mehr als 1 Bio. USD.</w:t>
+      </w:r>
+      <w:r>
+        <w:rPr>
+          <w:rFonts w:ascii="Arial" w:hAnsi="Arial"/>
+          <w:b w:val="0"/>
+          <w:i w:val="0"/>
+          <w:sz w:val="19"/>
+        </w:rPr>
+        <w:t xml:space="preserve"> https://fortune.com/2026/04/30/big-tech-hyperscalers-will-spend-700-billion-on-ai-infrastructure-this-year-with-no-clear-end-in-sight-eye-on-ai/ | https://www.cnbc.com/2026/04/30/ai-boom-big-tech-capital-expenditures-now-seen-topping-1-trillion-in-2027-.html | https://futurumgroup.com/insights/ai-capex-2026-the-690b-infrastructure-sprint/</w:t>
+      </w:r>
+    </w:p>
+    <w:p>
+      <w:pPr>
+        <w:jc w:val="both"/>
+      </w:pPr>
+      <w:r>
+        <w:rPr>
+          <w:rFonts w:ascii="Arial" w:hAnsi="Arial"/>
+          <w:b w:val="0"/>
+          <w:i w:val="0"/>
+          <w:sz w:val="19"/>
+        </w:rPr>
+        <w:t xml:space="preserve">Tom's Hardware / Statista / Invezz. (Anfang Mai 2026). </w:t>
+      </w:r>
+      <w:r>
+        <w:rPr>
+          <w:rFonts w:ascii="Arial" w:hAnsi="Arial"/>
+          <w:b w:val="0"/>
+          <w:i/>
+          <w:sz w:val="19"/>
+        </w:rPr>
+        <w:t>Google, Microsoft, Meta, and Amazon capex spending to hit $725 billion in 2026, up 77% from last year — analyst says bear thesis is „garbage" / Skyrocketing component prices push Big Tech capex to record $725 billion — Microsoft alone attributes $25 billion of AI budget to increased memory and chip costs / Big Tech's AI Spending to Reach $725 Billion in 2026 / Is Big Tech's $725B AI splurge being funded by mass layoffs?</w:t>
+      </w:r>
+      <w:r>
+        <w:rPr>
+          <w:rFonts w:ascii="Arial" w:hAnsi="Arial"/>
+          <w:b w:val="0"/>
+          <w:i w:val="0"/>
+          <w:sz w:val="19"/>
+        </w:rPr>
+        <w:t>. https://www.tomshardware.com/tech-industry/big-tech/big-techs-ai-spending-plans-reach-725-billion | https://www.tomshardware.com/tech-industry/big-tech/microsoft-attributed-25-billion-of-its-record-ai-budget-to-memory-chip-costs | https://www.statista.com/chart/35046/capital-expenditure-of-meta-alphabet-amazon-and-microsoft/ | https://invezz.com/news/2026/05/04/is-big-techs-725b-ai-splurge-being-funded-by-mass-layoffs/</w:t>
+      </w:r>
+    </w:p>
+    <w:p>
+      <w:pPr>
+        <w:jc w:val="both"/>
+      </w:pPr>
+      <w:r>
+        <w:rPr>
+          <w:rFonts w:ascii="Arial" w:hAnsi="Arial"/>
+          <w:b w:val="0"/>
+          <w:i w:val="0"/>
+          <w:sz w:val="19"/>
+        </w:rPr>
+        <w:t xml:space="preserve">Washington Times / WSLS / Boston Globe / Las Vegas Sun / Local10 / Greenfield Reporter. (5. Mai 2026). </w:t>
+      </w:r>
+      <w:r>
+        <w:rPr>
+          <w:rFonts w:ascii="Arial" w:hAnsi="Arial"/>
+          <w:b w:val="0"/>
+          <w:i/>
+          <w:sz w:val="19"/>
+        </w:rPr>
+        <w:t>Man accused of attacking OpenAI CEO Sam Altman's home pleads not guilty to attempted murder.</w:t>
+      </w:r>
+      <w:r>
+        <w:rPr>
+          <w:rFonts w:ascii="Arial" w:hAnsi="Arial"/>
+          <w:b w:val="0"/>
+          <w:i w:val="0"/>
+          <w:sz w:val="19"/>
+        </w:rPr>
+        <w:t xml:space="preserve"> https://www.washingtontimes.com/news/2026/may/5/man-accused-attacking-home-openai-ceo-sam-altman-pleads-not-guilty/ | https://www.bostonglobe.com/2026/05/05/nation/sam-altman-alleged-attacker-pleads-not-guilty-attempted-murder/</w:t>
+      </w:r>
+    </w:p>
+    <w:p>
+      <w:pPr>
+        <w:jc w:val="both"/>
+      </w:pPr>
+      <w:r>
+        <w:rPr>
+          <w:rFonts w:ascii="Arial" w:hAnsi="Arial"/>
+          <w:b w:val="0"/>
+          <w:i w:val="0"/>
+          <w:sz w:val="19"/>
+        </w:rPr>
+        <w:t xml:space="preserve">Goldman Sachs / Fortune. (6. April 2026). </w:t>
+      </w:r>
+      <w:r>
+        <w:rPr>
+          <w:rFonts w:ascii="Arial" w:hAnsi="Arial"/>
+          <w:b w:val="0"/>
+          <w:i/>
+          <w:sz w:val="19"/>
+        </w:rPr>
+        <w:t>AI is cutting 16,000 U.S. jobs a month — and Gen Z is taking the brunt, Goldman Sachs says.</w:t>
+      </w:r>
+      <w:r>
+        <w:rPr>
+          <w:rFonts w:ascii="Arial" w:hAnsi="Arial"/>
+          <w:b w:val="0"/>
+          <w:i w:val="0"/>
+          <w:sz w:val="19"/>
+        </w:rPr>
+        <w:t xml:space="preserve"> https://fortune.com/2026/04/06/ai-tech-displacement-effect-gen-z-16000-jobs-per-month/</w:t>
+      </w:r>
+    </w:p>
+    <w:p>
+      <w:pPr>
+        <w:jc w:val="both"/>
+      </w:pPr>
+      <w:r>
+        <w:rPr>
+          <w:rFonts w:ascii="Arial" w:hAnsi="Arial"/>
+          <w:b w:val="0"/>
+          <w:i w:val="0"/>
+          <w:sz w:val="19"/>
+        </w:rPr>
+        <w:t xml:space="preserve">OpenAI Global Affairs / EdTech Innovation Hub. (18. März 2026 / Folgeberichterstattung). </w:t>
+      </w:r>
+      <w:r>
+        <w:rPr>
+          <w:rFonts w:ascii="Arial" w:hAnsi="Arial"/>
+          <w:b w:val="0"/>
+          <w:i/>
+          <w:sz w:val="19"/>
+        </w:rPr>
+        <w:t>OpenAI Worker Participation Forum / Participation Economy Forum (Washington, D.C.) — Konvent mit Randi Weingarten (American Federation of Teachers) und Sean McGarvey (North America's Building Trades Unions).</w:t>
+      </w:r>
+      <w:r>
+        <w:rPr>
+          <w:rFonts w:ascii="Arial" w:hAnsi="Arial"/>
+          <w:b w:val="0"/>
+          <w:i w:val="0"/>
+          <w:sz w:val="19"/>
+        </w:rPr>
+        <w:t xml:space="preserve"> https://www.edtechinnovationhub.com/news/openai-convenes-labor-leaders-to-address-ai-impact-on-jobs-and-skills</w:t>
+      </w:r>
+    </w:p>
+    <w:p>
+      <w:pPr>
+        <w:jc w:val="both"/>
+      </w:pPr>
+      <w:r>
+        <w:rPr>
+          <w:rFonts w:ascii="Arial" w:hAnsi="Arial"/>
+          <w:b w:val="0"/>
+          <w:i w:val="0"/>
+          <w:sz w:val="19"/>
+        </w:rPr>
+        <w:t xml:space="preserve">Washington Post. (1. Mai 2026). </w:t>
+      </w:r>
+      <w:r>
+        <w:rPr>
+          <w:rFonts w:ascii="Arial" w:hAnsi="Arial"/>
+          <w:b w:val="0"/>
+          <w:i/>
+          <w:sz w:val="19"/>
+        </w:rPr>
+        <w:t>Layoffs at Amazon, Meta and Microsoft aren't all about AI.</w:t>
+      </w:r>
+      <w:r>
+        <w:rPr>
+          <w:rFonts w:ascii="Arial" w:hAnsi="Arial"/>
+          <w:b w:val="0"/>
+          <w:i w:val="0"/>
+          <w:sz w:val="19"/>
+        </w:rPr>
+        <w:t xml:space="preserve"> https://www.washingtonpost.com/technology/2026/05/01/ai-jobs-tech-layoffs-austerity/</w:t>
+      </w:r>
+    </w:p>
+    <w:p>
+      <w:pPr>
+        <w:jc w:val="both"/>
+      </w:pPr>
+      <w:r>
+        <w:rPr>
+          <w:rFonts w:ascii="Arial" w:hAnsi="Arial"/>
+          <w:b w:val="0"/>
+          <w:i w:val="0"/>
+          <w:sz w:val="19"/>
+        </w:rPr>
+        <w:t xml:space="preserve">Bloomberg Editorial Board. (29. April 2026). </w:t>
+      </w:r>
+      <w:r>
+        <w:rPr>
+          <w:rFonts w:ascii="Arial" w:hAnsi="Arial"/>
+          <w:b w:val="0"/>
+          <w:i/>
+          <w:sz w:val="19"/>
+        </w:rPr>
+        <w:t>Taxing Artificial Intelligence Would Hurt Innovation and Prosperity</w:t>
+      </w:r>
+      <w:r>
+        <w:rPr>
+          <w:rFonts w:ascii="Arial" w:hAnsi="Arial"/>
+          <w:b w:val="0"/>
+          <w:i w:val="0"/>
+          <w:sz w:val="19"/>
+        </w:rPr>
+        <w:t>. https://www.bloomberg.com/opinion/articles/2026-04-29/taxing-artificial-intelligence-would-hurt-innovation-and-prosperity | https://www.advisorperspectives.com/articles/2026/05/02/taxing-artificial-intelligence-big-mistake | https://www.realclearpolitics.com/2026/05/04/taxing_artificial_intelligence_would_be_a_big_mistake_698781.html | https://lasvegassun.com/news/2026/may/06/taxing-artificial-intelligence-would-be-a-big-mist/</w:t>
+      </w:r>
+    </w:p>
+    <w:p>
+      <w:pPr>
+        <w:jc w:val="both"/>
+      </w:pPr>
+      <w:r>
+        <w:rPr>
+          <w:rFonts w:ascii="Arial" w:hAnsi="Arial"/>
+          <w:b w:val="0"/>
+          <w:i w:val="0"/>
+          <w:sz w:val="19"/>
+        </w:rPr>
+        <w:t xml:space="preserve">Challenger, Gray &amp; Christmas. (2. Juni 2026). </w:t>
+      </w:r>
+      <w:r>
+        <w:rPr>
+          <w:rFonts w:ascii="Arial" w:hAnsi="Arial"/>
+          <w:b w:val="0"/>
+          <w:i/>
+          <w:sz w:val="19"/>
+        </w:rPr>
+        <w:t>Challenger Report: May Job Cuts Rise 16 % from April; Highest May Total Since 2020.</w:t>
+      </w:r>
+      <w:r>
+        <w:rPr>
+          <w:rFonts w:ascii="Arial" w:hAnsi="Arial"/>
+          <w:b w:val="0"/>
+          <w:i w:val="0"/>
+          <w:sz w:val="19"/>
+        </w:rPr>
+        <w:t xml:space="preserve"> https://www.challengergray.com/blog/challenger-report-may-job-cuts-rise-16-from-april-highest-may-total-since-2020/</w:t>
+      </w:r>
+    </w:p>
+    <w:p>
+      <w:pPr>
+        <w:jc w:val="both"/>
+      </w:pPr>
+      <w:r>
+        <w:rPr>
+          <w:rFonts w:ascii="Arial" w:hAnsi="Arial"/>
+          <w:b w:val="0"/>
+          <w:i w:val="0"/>
+          <w:sz w:val="19"/>
+        </w:rPr>
+        <w:t xml:space="preserve">Challenger, Gray &amp; Christmas. (2. Juli 2026). </w:t>
+      </w:r>
+      <w:r>
+        <w:rPr>
+          <w:rFonts w:ascii="Arial" w:hAnsi="Arial"/>
+          <w:b w:val="0"/>
+          <w:i/>
+          <w:sz w:val="19"/>
+        </w:rPr>
+        <w:t>Challenger Report: June Layoffs Cool to 45,849, Down 53 % From May; AI Leads Reasons for Fourth Consecutive Month.</w:t>
+      </w:r>
+      <w:r>
+        <w:rPr>
+          <w:rFonts w:ascii="Arial" w:hAnsi="Arial"/>
+          <w:b w:val="0"/>
+          <w:i w:val="0"/>
+          <w:sz w:val="19"/>
+        </w:rPr>
+        <w:t xml:space="preserve"> https://www.challengergray.com/blog/challenger-report-june-layoffs-cool-to-45849-down-53-from-may-ai-leads-reasons-for-fourth-consecutive-month/</w:t>
+      </w:r>
+    </w:p>
+    <w:p>
+      <w:pPr>
+        <w:jc w:val="both"/>
+      </w:pPr>
+      <w:r>
+        <w:rPr>
+          <w:rFonts w:ascii="Arial" w:hAnsi="Arial"/>
+          <w:b w:val="0"/>
+          <w:i w:val="0"/>
+          <w:sz w:val="19"/>
+        </w:rPr>
+        <w:t xml:space="preserve">Microsoft / Tech Startups / BusinessToday. (2. Juli 2026). </w:t>
+      </w:r>
+      <w:r>
+        <w:rPr>
+          <w:rFonts w:ascii="Arial" w:hAnsi="Arial"/>
+          <w:b w:val="0"/>
+          <w:i/>
+          <w:sz w:val="19"/>
+        </w:rPr>
+        <w:t>Microsoft plans to lay off thousands as AI spending reshapes its workforce / Microsoft Cuts ~9,000 Jobs in July 2026 Round / Microsoft to layoff over 5,000 employees across teams.</w:t>
+      </w:r>
+      <w:r>
+        <w:rPr>
+          <w:rFonts w:ascii="Arial" w:hAnsi="Arial"/>
+          <w:b w:val="0"/>
+          <w:i w:val="0"/>
+          <w:sz w:val="19"/>
+        </w:rPr>
+        <w:t xml:space="preserve"> https://techstartups.com/2026/07/01/microsoft-plans-to-lay-off-thousands-as-ai-spending-reshapes-its-workforce/ | https://icharles.com/articles/microsoft-layoffs-9000-july-2026 | https://www.businesstoday.in/technology/news/story/microsoft-to-layoff-over-5000-employees-across-teams-540239-2026-07-01</w:t>
+      </w:r>
+    </w:p>
+    <w:p>
+      <w:pPr>
+        <w:jc w:val="both"/>
+      </w:pPr>
+      <w:r>
+        <w:rPr>
+          <w:rFonts w:ascii="Arial" w:hAnsi="Arial"/>
+          <w:b w:val="0"/>
+          <w:i w:val="0"/>
+          <w:sz w:val="19"/>
+        </w:rPr>
+        <w:t xml:space="preserve">TechRepublic / Yahoo Finance / Fox Business. (Anfang Juli 2026). </w:t>
+      </w:r>
+      <w:r>
+        <w:rPr>
+          <w:rFonts w:ascii="Arial" w:hAnsi="Arial"/>
+          <w:b w:val="0"/>
+          <w:i/>
+          <w:sz w:val="19"/>
+        </w:rPr>
+        <w:t>Microsoft Layoffs Could Hit Thousands as AI Spending Climbs / Microsoft layoffs 2026: cuts hitting sales, consulting, and Xbox / Microsoft eyes another wave of layoffs that could hit 5,000 workers next week.</w:t>
+      </w:r>
+      <w:r>
+        <w:rPr>
+          <w:rFonts w:ascii="Arial" w:hAnsi="Arial"/>
+          <w:b w:val="0"/>
+          <w:i w:val="0"/>
+          <w:sz w:val="19"/>
+        </w:rPr>
+        <w:t xml:space="preserve"> https://www.techrepublic.com/article/news-microsoft-layoffs-ai-spending-2026/ | https://finance.yahoo.com/markets/stocks/articles/microsoft-layoffs-2026-cuts-hitting-144856068.html | https://www.foxbusiness.com/economy/microsoft-eyes-another-wave-layoffs-hit-5000-workers-next-week</w:t>
+      </w:r>
+    </w:p>
+    <w:p>
+      <w:pPr>
+        <w:jc w:val="both"/>
+      </w:pPr>
+      <w:r>
+        <w:rPr>
+          <w:rFonts w:ascii="Arial" w:hAnsi="Arial"/>
+          <w:b w:val="0"/>
+          <w:i w:val="0"/>
+          <w:sz w:val="19"/>
+        </w:rPr>
+        <w:t xml:space="preserve">Anthropic / TechCrunch / Thurrott / PYMNTS. (30. Juni 2026). </w:t>
+      </w:r>
+      <w:r>
+        <w:rPr>
+          <w:rFonts w:ascii="Arial" w:hAnsi="Arial"/>
+          <w:b w:val="0"/>
+          <w:i/>
+          <w:sz w:val="19"/>
+        </w:rPr>
+        <w:t>Introducing Claude Sonnet 5 / Anthropic launches Claude Sonnet 5 as a cheaper way to run agents / Anthropic Launches Claude Sonnet 5 / Anthropic Cuts AI Agent Costs With Claude Sonnet 5 Rollout.</w:t>
+      </w:r>
+      <w:r>
+        <w:rPr>
+          <w:rFonts w:ascii="Arial" w:hAnsi="Arial"/>
+          <w:b w:val="0"/>
+          <w:i w:val="0"/>
+          <w:sz w:val="19"/>
+        </w:rPr>
+        <w:t xml:space="preserve"> https://www.anthropic.com/news/claude-sonnet-5 | https://techcrunch.com/2026/06/30/anthropic-launches-claude-sonnet-5-as-a-cheaper-way-to-run-agents/ | https://www.thurrott.com/a-i/anthropic/338184/anthropic-launches-claude-sonnet-5 | https://www.pymnts.com/news/artificial-intelligence/2026/anthropic-cuts-ai-agent-costs-with-claude-sonnet-5-rollout/</w:t>
+      </w:r>
+    </w:p>
+    <w:p>
+      <w:pPr>
+        <w:jc w:val="both"/>
+      </w:pPr>
+      <w:r>
+        <w:rPr>
+          <w:rFonts w:ascii="Arial" w:hAnsi="Arial"/>
+          <w:b w:val="0"/>
+          <w:i w:val="0"/>
+          <w:sz w:val="19"/>
+        </w:rPr>
+        <w:t xml:space="preserve">CNBC / Quartz / TheNextWeb / Fox Business / Motor1. (1. Juli 2026 / Folgeberichterstattung). </w:t>
+      </w:r>
+      <w:r>
+        <w:rPr>
+          <w:rFonts w:ascii="Arial" w:hAnsi="Arial"/>
+          <w:b w:val="0"/>
+          <w:i/>
+          <w:sz w:val="19"/>
+        </w:rPr>
+        <w:t>Employers who laid off workers citing AI are already starting to regret it / Companies rehire workers laid off for AI as automation falls short / Ford rehired 350 engineers to fix what its AI systems got wrong / Ford rehires experienced engineers after AI misses the mark / Ford Brings Back Veteran Engineers After AI Falls Short: „It's Only As Good As The People Using It".</w:t>
+      </w:r>
+      <w:r>
+        <w:rPr>
+          <w:rFonts w:ascii="Arial" w:hAnsi="Arial"/>
+          <w:b w:val="0"/>
+          <w:i w:val="0"/>
+          <w:sz w:val="19"/>
+        </w:rPr>
+        <w:t xml:space="preserve"> https://www.cnbc.com/2026/07/01/employers-who-laid-off-workers-for-ai-are-reversing-their-decisions.html | https://qz.com/companies-rehiring-workers-ai-layoffs-automation-070126 | https://thenextweb.com/news/ford-rehired-350-engineers-ai-quality-jd-power | https://www.foxbusiness.com/technology/ford-rehires-experienced-engineers-after-ai-misses-mark | https://www.motor1.com/news/800343/humans-better-than-ai-inspectors/</w:t>
+      </w:r>
+    </w:p>
+    <w:p>
+      <w:pPr>
+        <w:jc w:val="both"/>
+      </w:pPr>
+      <w:r>
+        <w:rPr>
+          <w:rFonts w:ascii="Arial" w:hAnsi="Arial"/>
+          <w:b w:val="0"/>
+          <w:i w:val="0"/>
+          <w:sz w:val="19"/>
+        </w:rPr>
+        <w:t xml:space="preserve">Orgvue / Vitreous World. (Erhebung Februar–März 2025; Rezeption Juni/Juli 2026). </w:t>
+      </w:r>
+      <w:r>
+        <w:rPr>
+          <w:rFonts w:ascii="Arial" w:hAnsi="Arial"/>
+          <w:b w:val="0"/>
+          <w:i/>
+          <w:sz w:val="19"/>
+        </w:rPr>
+        <w:t>55 % of businesses admit wrong decisions in making employees redundant when bringing AI into the workforce / Human-first, machine enhanced — From optimism to pragmatism in AI-driven workforce transformation.</w:t>
+      </w:r>
+      <w:r>
+        <w:rPr>
+          <w:rFonts w:ascii="Arial" w:hAnsi="Arial"/>
+          <w:b w:val="0"/>
+          <w:i w:val="0"/>
+          <w:sz w:val="19"/>
+        </w:rPr>
+        <w:t xml:space="preserve"> https://www.orgvue.com/news/55-of-businesses-admit-wrong-decisions-in-making-employees-redundant-when-bringing-ai-into-the-workforce/ | https://www.orgvue.com/content/uploads/sites/2/2025/05/Orgvue-AI-and-Workforce-Transformation-eBook-Spring-2025-FULL.pdf</w:t>
+      </w:r>
+    </w:p>
+    <w:p>
+      <w:pPr>
+        <w:jc w:val="both"/>
+      </w:pPr>
+      <w:r>
+        <w:rPr>
+          <w:rFonts w:ascii="Arial" w:hAnsi="Arial"/>
+          <w:b w:val="0"/>
+          <w:i w:val="0"/>
+          <w:sz w:val="19"/>
+        </w:rPr>
+        <w:t xml:space="preserve">IBTimes UK / HR Dive / HRTech Edge / Robert Half (via Fach- und Wirtschaftspresse). (Juni/Juli 2026). </w:t>
+      </w:r>
+      <w:r>
+        <w:rPr>
+          <w:rFonts w:ascii="Arial" w:hAnsi="Arial"/>
+          <w:b w:val="0"/>
+          <w:i/>
+          <w:sz w:val="19"/>
+        </w:rPr>
+        <w:t>AI Layoffs Backfire as 32 % of Bosses Rehire Roles They Thought Robots Could Do / More than half of leaders who laid off workers due to AI admit to screwing up / AI Layoffs Backfire as Firms Rehire Workers: Orgvue Study.</w:t>
+      </w:r>
+      <w:r>
+        <w:rPr>
+          <w:rFonts w:ascii="Arial" w:hAnsi="Arial"/>
+          <w:b w:val="0"/>
+          <w:i w:val="0"/>
+          <w:sz w:val="19"/>
+        </w:rPr>
+        <w:t xml:space="preserve"> https://www.ibtimes.co.uk/ai-layoffs-reversed-companies-rehire-staff-1806357 | https://www.hrdive.com/news/leaders-who-laid-off-workers-due-to-ai-regretted-it/746643/ | https://hrtechedge.com/ai-layoffs-backfire-32-of-companies-forced-to-rehire-after-misjudging-automation/</w:t>
+      </w:r>
+    </w:p>
+    <w:p>
+      <w:pPr>
+        <w:jc w:val="both"/>
+      </w:pPr>
+      <w:r>
+        <w:rPr>
+          <w:rFonts w:ascii="Arial" w:hAnsi="Arial"/>
+          <w:b w:val="0"/>
+          <w:i w:val="0"/>
+          <w:sz w:val="19"/>
+        </w:rPr>
+        <w:t xml:space="preserve">SkillSyncer. (Stand 5. Juli 2026). </w:t>
+      </w:r>
+      <w:r>
+        <w:rPr>
+          <w:rFonts w:ascii="Arial" w:hAnsi="Arial"/>
+          <w:b w:val="0"/>
+          <w:i/>
+          <w:sz w:val="19"/>
+        </w:rPr>
+        <w:t>2026 Tech Layoffs Tracker — 185.894 Workers Impacted.</w:t>
+      </w:r>
+      <w:r>
+        <w:rPr>
+          <w:rFonts w:ascii="Arial" w:hAnsi="Arial"/>
+          <w:b w:val="0"/>
+          <w:i w:val="0"/>
+          <w:sz w:val="19"/>
+        </w:rPr>
+        <w:t xml:space="preserve"> https://skillsyncer.com/layoffs-tracker</w:t>
+      </w:r>
+    </w:p>
+    <w:p>
+      <w:pPr>
+        <w:jc w:val="both"/>
+      </w:pPr>
+      <w:r>
+        <w:rPr>
+          <w:rFonts w:ascii="Arial" w:hAnsi="Arial"/>
+          <w:b w:val="0"/>
+          <w:i w:val="0"/>
+          <w:sz w:val="19"/>
+        </w:rPr>
+        <w:t xml:space="preserve">TrueUp. (Jahresmitte 2026). </w:t>
+      </w:r>
+      <w:r>
+        <w:rPr>
+          <w:rFonts w:ascii="Arial" w:hAnsi="Arial"/>
+          <w:b w:val="0"/>
+          <w:i/>
+          <w:sz w:val="19"/>
+        </w:rPr>
+        <w:t>Layoffs Tracker — All Tech and Startup Layoffs.</w:t>
       </w:r>
       <w:r>
         <w:rPr>
@@ -10277,7 +11027,7 @@
           <w:i w:val="0"/>
           <w:sz w:val="19"/>
         </w:rPr>
-        <w:t xml:space="preserve">TrueUp / InformationWeek. (Stand 8. Mai 2026). </w:t>
+        <w:t xml:space="preserve">Oracle Corp. (Juni 2026). </w:t>
       </w:r>
       <w:r>
         <w:rPr>
@@ -10286,16 +11036,16 @@
           <w:i/>
           <w:sz w:val="19"/>
         </w:rPr>
-        <w:t>Tech Layoffs Tracker — Tagesfortschreibung: 127.411 Personen aus 283 Layoff-Meldungen (rund 1.003 Personen pro Tag).</w:t>
-      </w:r>
-      <w:r>
-        <w:rPr>
-          <w:rFonts w:ascii="Arial" w:hAnsi="Arial"/>
-          <w:b w:val="0"/>
-          <w:i w:val="0"/>
-          <w:sz w:val="19"/>
-        </w:rPr>
-        <w:t xml:space="preserve"> https://www.trueup.io/layoffs | https://www.informationweek.com/it-staffing-careers/2026-tech-company-layoffs</w:t>
+        <w:t>Form 8-K — Fiscal Year 2026 Restructuring and Workforce Update.</w:t>
+      </w:r>
+      <w:r>
+        <w:rPr>
+          <w:rFonts w:ascii="Arial" w:hAnsi="Arial"/>
+          <w:b w:val="0"/>
+          <w:i w:val="0"/>
+          <w:sz w:val="19"/>
+        </w:rPr>
+        <w:t xml:space="preserve"> https://www.sec.gov/Archives/edgar/data/0001341439/000119312526265848/orcl-ex99_1.htm | https://www.cnbc.com/2026/06/23/oracle-ai-job-cuts-layoffs-21000.html | https://www.bloomberg.com/news/articles/2026-06-22/oracle-layoffs-fueled-by-ai-reduces-workforce-by-21-000</w:t>
       </w:r>
     </w:p>
     <w:p>
@@ -10305,810 +11055,6 @@
       <w:r>
         <w:rPr>
           <w:rFonts w:ascii="Arial" w:hAnsi="Arial"/>
-          <w:b w:val="0"/>
-          <w:i w:val="0"/>
-          <w:sz w:val="19"/>
-        </w:rPr>
-        <w:t xml:space="preserve">CNBC / Bloomberg / AOL / The Register. (7./8. Mai 2026). </w:t>
-      </w:r>
-      <w:r>
-        <w:rPr>
-          <w:rFonts w:ascii="Arial" w:hAnsi="Arial"/>
-          <w:b w:val="0"/>
-          <w:i/>
-          <w:sz w:val="19"/>
-        </w:rPr>
-        <w:t>Cloudflare stock sinks 18% after earnings as company cuts 1,100 employees due to AI changes / Cloudflare to Cut 1,100 Jobs as It Shifts to AI-First Operating Model / Read the memo: Cloudflare is laying off 1,100 employees to prepare for ‚the agentic AI era‘ / Cloudflare to fire 1,100 staff whose jobs just aren't AI enough.</w:t>
-      </w:r>
-      <w:r>
-        <w:rPr>
-          <w:rFonts w:ascii="Arial" w:hAnsi="Arial"/>
-          <w:b w:val="0"/>
-          <w:i w:val="0"/>
-          <w:sz w:val="19"/>
-        </w:rPr>
-        <w:t xml:space="preserve"> Streichung von rund 1.100 Stellen (20 % der globalen Belegschaft) parallel zu Q1-2026-Earnings (Umsatz +34 % YoY); Memo CEO Matthew Prince und Co-Gründerin Michelle Zatlyn („Building for the future"); AI-Einsatz im Konzern in drei Monaten +600 %; Restrukturierungsaufwand 140–150 Mio. USD im Q2 2026; Grundvergütung bis Ende 2026, US-Krankenversicherung bis Jahresende, Equity-Vesting bis 15. August 2026. https://www.cnbc.com/2026/05/07/cloudflare-net-q1-2026-stock-earnings-layoffs.html | https://www.bloomberg.com/news/articles/2026-05-07/cloudflare-to-cut-one-fifth-of-workers-in-move-to-ai-first-model | https://www.aol.com/articles/read-memo-cloudflare-laying-off-212614000.html | https://www.theregister.com/off-prem/2026/05/08/cloudflare-to-fire-1100-staff-whose-jobs-just-arent-ai-enough/5235536</w:t>
-      </w:r>
-    </w:p>
-    <w:p>
-      <w:pPr>
-        <w:jc w:val="both"/>
-      </w:pPr>
-      <w:r>
-        <w:rPr>
-          <w:rFonts w:ascii="Arial" w:hAnsi="Arial"/>
-          <w:b w:val="0"/>
-          <w:i w:val="0"/>
-          <w:sz w:val="19"/>
-        </w:rPr>
-        <w:t xml:space="preserve">Challenger, Gray &amp; Christmas / CBS News / Fast Company. (1./3. Mai 2026). </w:t>
-      </w:r>
-      <w:r>
-        <w:rPr>
-          <w:rFonts w:ascii="Arial" w:hAnsi="Arial"/>
-          <w:b w:val="0"/>
-          <w:i/>
-          <w:sz w:val="19"/>
-        </w:rPr>
-        <w:t>Challenger Report: April Job Cuts Rise 38 % from March; YTD Cuts Down 50 % / AI emerges as a top cause of layoffs, accounting for 26 % of April's job cuts / Layoffs are actually on the decline in 2026 — but not in tech.</w:t>
-      </w:r>
-      <w:r>
-        <w:rPr>
-          <w:rFonts w:ascii="Arial" w:hAnsi="Arial"/>
-          <w:b w:val="0"/>
-          <w:i w:val="0"/>
-          <w:sz w:val="19"/>
-        </w:rPr>
-        <w:t xml:space="preserve"> Methodische Aggregat-Bestätigung: April-2026-Streichungen 83.387 (+38 % gegenüber März; −21 % gegenüber April 2025), KI-bezogen 21.490 (26 %, zweitens in Folge führender Einzelgrund); Tech 33.361 im April; YTD 85.411 (+33 % gegenüber Vorjahresstand); KI-bezogen YTD 49.135 (16 % aller 2026-Pläne, von 13 % zum März-Stand); Gesamtjahr 2026 bislang −50 % gegenüber Vorjahresvergleichszeitraum. https://www.challengergray.com/blog/challenger-report-april-job-cuts-rise-38-from-march-ytd-cuts-down-50/ | https://www.cbsnews.com/news/ai-layoffs-job-cuts-challenger-report-april-2026/ | https://www.fastcompany.com/91538649/layoffs-are-actually-on-the-decline-in-2026-but-not-in-the-tech-industry</w:t>
-      </w:r>
-    </w:p>
-    <w:p>
-      <w:pPr>
-        <w:jc w:val="both"/>
-      </w:pPr>
-      <w:r>
-        <w:rPr>
-          <w:rFonts w:ascii="Arial" w:hAnsi="Arial"/>
-          <w:b w:val="0"/>
-          <w:i w:val="0"/>
-          <w:sz w:val="19"/>
-        </w:rPr>
-        <w:t xml:space="preserve">CNBC / Engadget / Coindesk / Fortune. (5. Mai 2026). </w:t>
-      </w:r>
-      <w:r>
-        <w:rPr>
-          <w:rFonts w:ascii="Arial" w:hAnsi="Arial"/>
-          <w:b w:val="0"/>
-          <w:i/>
-          <w:sz w:val="19"/>
-        </w:rPr>
-        <w:t>Coinbase cuts headcount by 14% citing AI acceleration / Coinbase lays off nearly 700 workers in „AI-native" restructuring / Coinbase didn't just lay off 14% of its staff due to AI.</w:t>
-      </w:r>
-      <w:r>
-        <w:rPr>
-          <w:rFonts w:ascii="Arial" w:hAnsi="Arial"/>
-          <w:b w:val="0"/>
-          <w:i w:val="0"/>
-          <w:sz w:val="19"/>
-        </w:rPr>
-        <w:t xml:space="preserve"> Restrukturierungsaufwand 50–60 Mio. USD, Q2-2026-Abschluss; Vorstandschef Brian Armstrong skizziert „AI-native pods" mit reduzierten Managementebenen. https://www.cnbc.com/2026/05/05/coinbase-cuts-headcount-by-14percent-citing-ai-acceleration-the-shares-are-gaining.html | https://www.engadget.com/2165157/coinbase-lays-off-nearly-700-workers-in-ai-native-restructuring/ | https://www.coindesk.com/business/2026/05/05/coinbase-cuts-14-of-staff-as-ai-reshapes-how-crypto-companies-operate | https://fortune.com/2026/05/05/coinbase-layoffs-14-of-employees-ai-tech-ai-job-anxiety-crypto/</w:t>
-      </w:r>
-    </w:p>
-    <w:p>
-      <w:pPr>
-        <w:jc w:val="both"/>
-      </w:pPr>
-      <w:r>
-        <w:rPr>
-          <w:rFonts w:ascii="Arial" w:hAnsi="Arial"/>
-          <w:b w:val="0"/>
-          <w:i w:val="0"/>
-          <w:sz w:val="19"/>
-        </w:rPr>
-        <w:t xml:space="preserve">Bloomberg / TechCrunch / Yahoo Finance. (5. Mai 2026). </w:t>
-      </w:r>
-      <w:r>
-        <w:rPr>
-          <w:rFonts w:ascii="Arial" w:hAnsi="Arial"/>
-          <w:b w:val="0"/>
-          <w:i/>
-          <w:sz w:val="19"/>
-        </w:rPr>
-        <w:t>PayPal Plans Job Cuts as Fintech's New CEO Pursues Turnaround Strategy / PayPal says it's „becoming a technology company again" — that means AI / PayPal layoffs: New CEO cuts 20% of workforce in Q1 2026.</w:t>
-      </w:r>
-      <w:r>
-        <w:rPr>
-          <w:rFonts w:ascii="Arial" w:hAnsi="Arial"/>
-          <w:b w:val="0"/>
-          <w:i w:val="0"/>
-          <w:sz w:val="19"/>
-        </w:rPr>
-        <w:t xml:space="preserve"> Programm umfasst rund 4.760 Stellen (20 % von 23.800 Beschäftigten) über zwei bis drei Jahre, mindestens 1,5 Mrd. USD erwartete Einsparung; CEO Enrique Lores Q1-2026-Earnings-Call. https://www.bloomberg.com/news/articles/2026-05-05/paypal-plans-job-cuts-as-fintech-s-new-ceo-pursues-turnaround-strategy | https://techcrunch.com/2026/05/05/paypal-says-its-becoming-a-technology-company-again-that-means-ai/ | https://finance.yahoo.com/markets/stocks/articles/paypal-layoffs-ceo-cuts-20-154944985.html</w:t>
-      </w:r>
-    </w:p>
-    <w:p>
-      <w:pPr>
-        <w:jc w:val="both"/>
-      </w:pPr>
-      <w:r>
-        <w:rPr>
-          <w:rFonts w:ascii="Arial" w:hAnsi="Arial"/>
-          <w:b w:val="0"/>
-          <w:i w:val="0"/>
-          <w:sz w:val="19"/>
-        </w:rPr>
-        <w:t xml:space="preserve">TechRadar / Storyboard18. (5./6. Mai 2026). </w:t>
-      </w:r>
-      <w:r>
-        <w:rPr>
-          <w:rFonts w:ascii="Arial" w:hAnsi="Arial"/>
-          <w:b w:val="0"/>
-          <w:i/>
-          <w:sz w:val="19"/>
-        </w:rPr>
-        <w:t>Freshworks and Coinbase announce more than 1 in 10 jobs to go as companies replace workforce with AI technologies / Freshworks Layoffs 2026: „Over half of our code is written by AI," says CEO as firm cuts 500 jobs.</w:t>
-      </w:r>
-      <w:r>
-        <w:rPr>
-          <w:rFonts w:ascii="Arial" w:hAnsi="Arial"/>
-          <w:b w:val="0"/>
-          <w:i w:val="0"/>
-          <w:sz w:val="19"/>
-        </w:rPr>
-        <w:t xml:space="preserve"> https://www.techradar.com/pro/freshworks-and-coinbase-announce-more-than-1-in-10-jobs-to-go-as-companies-replace-workforce-with-ai-technologies-tech-company-layoffs-near-100k-in-2026-alone | https://www.storyboard18.com/brand-marketing/freshworks-layoffs-over-half-of-our-code-is-written-by-ai-says-ceo-as-firm-cuts-500-jobs-97275.htm</w:t>
-      </w:r>
-    </w:p>
-    <w:p>
-      <w:pPr>
-        <w:jc w:val="both"/>
-      </w:pPr>
-      <w:r>
-        <w:rPr>
-          <w:rFonts w:ascii="Arial" w:hAnsi="Arial"/>
-          <w:b w:val="0"/>
-          <w:i w:val="0"/>
-          <w:sz w:val="19"/>
-        </w:rPr>
-        <w:t xml:space="preserve">American Bazaar / TechResearchOnline / Goodreturns. (Mai 2026). </w:t>
-      </w:r>
-      <w:r>
-        <w:rPr>
-          <w:rFonts w:ascii="Arial" w:hAnsi="Arial"/>
-          <w:b w:val="0"/>
-          <w:i/>
-          <w:sz w:val="19"/>
-        </w:rPr>
-        <w:t>Cognizant eyes up to 15,000 layoffs, India set to bear the brunt / Cognizant Layoffs 2026 Signal AI Shift in IT Services / Layoffs 2026: Cognizant May Cut Up to 15,000 Jobs Globally Under „Project Leap".</w:t>
-      </w:r>
-      <w:r>
-        <w:rPr>
-          <w:rFonts w:ascii="Arial" w:hAnsi="Arial"/>
-          <w:b w:val="0"/>
-          <w:i w:val="0"/>
-          <w:sz w:val="19"/>
-        </w:rPr>
-        <w:t xml:space="preserve"> Programm „Project Leap"; Abfindungs­aufwand 230 bis 320 Mio. USD; rund 250.000 der weltweit 357.000 Beschäftigten in Indien. https://americanbazaaronline.com/2026/05/06/cognizant-eyes-up-to-15000-layoffs-india-set-to-bear-the-brunt-480243/ | https://techresearchonline.com/news/cognizant-layoffs-2026-ai-restructuring-project-leap/ | https://www.goodreturns.in/news/cognizant-layoffs-2026-it-company-may-cut-12000-15000-jobs-globally-major-impact-expected-in-india-1506427.html</w:t>
-      </w:r>
-    </w:p>
-    <w:p>
-      <w:pPr>
-        <w:jc w:val="both"/>
-      </w:pPr>
-      <w:r>
-        <w:rPr>
-          <w:rFonts w:ascii="Arial" w:hAnsi="Arial"/>
-          <w:b w:val="0"/>
-          <w:i w:val="0"/>
-          <w:sz w:val="19"/>
-        </w:rPr>
-        <w:t xml:space="preserve">Fortune / Investor's Business Daily / Futurum. (April–Mai 2026). </w:t>
-      </w:r>
-      <w:r>
-        <w:rPr>
-          <w:rFonts w:ascii="Arial" w:hAnsi="Arial"/>
-          <w:b w:val="0"/>
-          <w:i/>
-          <w:sz w:val="19"/>
-        </w:rPr>
-        <w:t>Big-Tech-AI-Capex 2026: Q1-Investitionen rund 130,65 Mrd. USD; Konsens-Schätzung für 2026 bei 660–700 Mrd. USD (Microsoft, Alphabet, Amazon, Meta, Oracle); Wall-Street-Analysten erwarten 2027 mehr als 1 Bio. USD.</w:t>
-      </w:r>
-      <w:r>
-        <w:rPr>
-          <w:rFonts w:ascii="Arial" w:hAnsi="Arial"/>
-          <w:b w:val="0"/>
-          <w:i w:val="0"/>
-          <w:sz w:val="19"/>
-        </w:rPr>
-        <w:t xml:space="preserve"> https://fortune.com/2026/04/30/big-tech-hyperscalers-will-spend-700-billion-on-ai-infrastructure-this-year-with-no-clear-end-in-sight-eye-on-ai/ | https://www.cnbc.com/2026/04/30/ai-boom-big-tech-capital-expenditures-now-seen-topping-1-trillion-in-2027-.html | https://futurumgroup.com/insights/ai-capex-2026-the-690b-infrastructure-sprint/</w:t>
-      </w:r>
-    </w:p>
-    <w:p>
-      <w:pPr>
-        <w:jc w:val="both"/>
-      </w:pPr>
-      <w:r>
-        <w:rPr>
-          <w:rFonts w:ascii="Arial" w:hAnsi="Arial"/>
-          <w:b w:val="0"/>
-          <w:i w:val="0"/>
-          <w:sz w:val="19"/>
-        </w:rPr>
-        <w:t xml:space="preserve">Tom's Hardware / Statista / Invezz. (Anfang Mai 2026). </w:t>
-      </w:r>
-      <w:r>
-        <w:rPr>
-          <w:rFonts w:ascii="Arial" w:hAnsi="Arial"/>
-          <w:b w:val="0"/>
-          <w:i/>
-          <w:sz w:val="19"/>
-        </w:rPr>
-        <w:t>Google, Microsoft, Meta, and Amazon capex spending to hit $725 billion in 2026, up 77% from last year — analyst says bear thesis is „garbage" / Skyrocketing component prices push Big Tech capex to record $725 billion — Microsoft alone attributes $25 billion of AI budget to increased memory and chip costs / Big Tech's AI Spending to Reach $725 Billion in 2026 / Is Big Tech's $725B AI splurge being funded by mass layoffs?</w:t>
-      </w:r>
-      <w:r>
-        <w:rPr>
-          <w:rFonts w:ascii="Arial" w:hAnsi="Arial"/>
-          <w:b w:val="0"/>
-          <w:i w:val="0"/>
-          <w:sz w:val="19"/>
-        </w:rPr>
-        <w:t xml:space="preserve"> Aggregat-Total nach Q1-2026-Earnings-Calls (28.–30. April 2026), von der </w:t>
-      </w:r>
-      <w:r>
-        <w:rPr>
-          <w:rFonts w:ascii="Arial" w:hAnsi="Arial"/>
-          <w:b w:val="0"/>
-          <w:i/>
-          <w:sz w:val="19"/>
-        </w:rPr>
-        <w:t>Financial Times</w:t>
-      </w:r>
-      <w:r>
-        <w:rPr>
-          <w:rFonts w:ascii="Arial" w:hAnsi="Arial"/>
-          <w:b w:val="0"/>
-          <w:i w:val="0"/>
-          <w:sz w:val="19"/>
-        </w:rPr>
-        <w:t xml:space="preserve"> zusammengeführt: Microsoft 190 Mrd. USD, Alphabet 190 Mrd. USD, Amazon 200 Mrd. USD, Meta 125–145 Mrd. USD; +77 % gegenüber 410 Mrd. USD im Jahr 2025. Komponentenkosten: DRAM-Vertragspreise +95 % q/q im Q1 2026 (TrendForce), +58–63 % für Q2 2026 projiziert; Microsoft führt rund 25 Mrd. USD des Aufschlags auf gestiegene Speicher- und Chip-Kosten zurück. https://www.tomshardware.com/tech-industry/big-tech/big-techs-ai-spending-plans-reach-725-billion | https://www.tomshardware.com/tech-industry/big-tech/microsoft-attributed-25-billion-of-its-record-ai-budget-to-memory-chip-costs | https://www.statista.com/chart/35046/capital-expenditure-of-meta-alphabet-amazon-and-microsoft/ | https://invezz.com/news/2026/05/04/is-big-techs-725b-ai-splurge-being-funded-by-mass-layoffs/</w:t>
-      </w:r>
-    </w:p>
-    <w:p>
-      <w:pPr>
-        <w:jc w:val="both"/>
-      </w:pPr>
-      <w:r>
-        <w:rPr>
-          <w:rFonts w:ascii="Arial" w:hAnsi="Arial"/>
-          <w:b w:val="0"/>
-          <w:i w:val="0"/>
-          <w:sz w:val="19"/>
-        </w:rPr>
-        <w:t xml:space="preserve">Washington Times / WSLS / Boston Globe / Las Vegas Sun / Local10 / Greenfield Reporter. (5. Mai 2026). </w:t>
-      </w:r>
-      <w:r>
-        <w:rPr>
-          <w:rFonts w:ascii="Arial" w:hAnsi="Arial"/>
-          <w:b w:val="0"/>
-          <w:i/>
-          <w:sz w:val="19"/>
-        </w:rPr>
-        <w:t>Man accused of attacking OpenAI CEO Sam Altman's home pleads not guilty to attempted murder.</w:t>
-      </w:r>
-      <w:r>
-        <w:rPr>
-          <w:rFonts w:ascii="Arial" w:hAnsi="Arial"/>
-          <w:b w:val="0"/>
-          <w:i w:val="0"/>
-          <w:sz w:val="19"/>
-        </w:rPr>
-        <w:t xml:space="preserve"> AP-Berichterstattung zur Arraignment-Verhandlung am 5. Mai 2026 (Plädoyer „nicht schuldig", Anordnung psychiatrischer Begutachtung, Folgetermin im Mai 2026). https://www.washingtontimes.com/news/2026/may/5/man-accused-attacking-home-openai-ceo-sam-altman-pleads-not-guilty/ | https://www.bostonglobe.com/2026/05/05/nation/sam-altman-alleged-attacker-pleads-not-guilty-attempted-murder/</w:t>
-      </w:r>
-    </w:p>
-    <w:p>
-      <w:pPr>
-        <w:jc w:val="both"/>
-      </w:pPr>
-      <w:r>
-        <w:rPr>
-          <w:rFonts w:ascii="Arial" w:hAnsi="Arial"/>
-          <w:b w:val="0"/>
-          <w:i w:val="0"/>
-          <w:sz w:val="19"/>
-        </w:rPr>
-        <w:t xml:space="preserve">Goldman Sachs / Fortune. (6. April 2026). </w:t>
-      </w:r>
-      <w:r>
-        <w:rPr>
-          <w:rFonts w:ascii="Arial" w:hAnsi="Arial"/>
-          <w:b w:val="0"/>
-          <w:i/>
-          <w:sz w:val="19"/>
-        </w:rPr>
-        <w:t>AI is cutting 16,000 U.S. jobs a month — and Gen Z is taking the brunt, Goldman Sachs says.</w:t>
-      </w:r>
-      <w:r>
-        <w:rPr>
-          <w:rFonts w:ascii="Arial" w:hAnsi="Arial"/>
-          <w:b w:val="0"/>
-          <w:i w:val="0"/>
-          <w:sz w:val="19"/>
-        </w:rPr>
-        <w:t xml:space="preserve"> Schätzung des US-weiten KI-Verdrängungseffekts auf rund 16.000 Stellen pro Monat mit überproportionaler Wirkung auf Berufseinsteiger in routinisierten Bürotätigkeiten. https://fortune.com/2026/04/06/ai-tech-displacement-effect-gen-z-16000-jobs-per-month/</w:t>
-      </w:r>
-    </w:p>
-    <w:p>
-      <w:pPr>
-        <w:jc w:val="both"/>
-      </w:pPr>
-      <w:r>
-        <w:rPr>
-          <w:rFonts w:ascii="Arial" w:hAnsi="Arial"/>
-          <w:b w:val="0"/>
-          <w:i w:val="0"/>
-          <w:sz w:val="19"/>
-        </w:rPr>
-        <w:t xml:space="preserve">OpenAI Global Affairs / EdTech Innovation Hub. (18. März 2026 / Folgeberichterstattung). </w:t>
-      </w:r>
-      <w:r>
-        <w:rPr>
-          <w:rFonts w:ascii="Arial" w:hAnsi="Arial"/>
-          <w:b w:val="0"/>
-          <w:i/>
-          <w:sz w:val="19"/>
-        </w:rPr>
-        <w:t>OpenAI Worker Participation Forum / Participation Economy Forum (Washington, D.C.) — Konvent mit Randi Weingarten (American Federation of Teachers) und Sean McGarvey (North America's Building Trades Unions).</w:t>
-      </w:r>
-      <w:r>
-        <w:rPr>
-          <w:rFonts w:ascii="Arial" w:hAnsi="Arial"/>
-          <w:b w:val="0"/>
-          <w:i w:val="0"/>
-          <w:sz w:val="19"/>
-        </w:rPr>
-        <w:t xml:space="preserve"> https://www.edtechinnovationhub.com/news/openai-convenes-labor-leaders-to-address-ai-impact-on-jobs-and-skills</w:t>
-      </w:r>
-    </w:p>
-    <w:p>
-      <w:pPr>
-        <w:jc w:val="both"/>
-      </w:pPr>
-      <w:r>
-        <w:rPr>
-          <w:rFonts w:ascii="Arial" w:hAnsi="Arial"/>
-          <w:b w:val="0"/>
-          <w:i w:val="0"/>
-          <w:sz w:val="19"/>
-        </w:rPr>
-        <w:t xml:space="preserve">Washington Post. (1. Mai 2026). </w:t>
-      </w:r>
-      <w:r>
-        <w:rPr>
-          <w:rFonts w:ascii="Arial" w:hAnsi="Arial"/>
-          <w:b w:val="0"/>
-          <w:i/>
-          <w:sz w:val="19"/>
-        </w:rPr>
-        <w:t>Layoffs at Amazon, Meta and Microsoft aren't all about AI.</w:t>
-      </w:r>
-      <w:r>
-        <w:rPr>
-          <w:rFonts w:ascii="Arial" w:hAnsi="Arial"/>
-          <w:b w:val="0"/>
-          <w:i w:val="0"/>
-          <w:sz w:val="19"/>
-        </w:rPr>
-        <w:t xml:space="preserve"> Differenzierende Analyse zur „AI labor crisis"-Lesart; betont neben KI-Effekten Austerity-Logik (Kompensation hoher KI-Investitionen), Korrektur pandemiebedingter Überbeschäftigung und Routine-Restrukturierungen. https://www.washingtonpost.com/technology/2026/05/01/ai-jobs-tech-layoffs-austerity/</w:t>
-      </w:r>
-    </w:p>
-    <w:p>
-      <w:pPr>
-        <w:jc w:val="both"/>
-      </w:pPr>
-      <w:r>
-        <w:rPr>
-          <w:rFonts w:ascii="Arial" w:hAnsi="Arial"/>
-          <w:b w:val="0"/>
-          <w:i w:val="0"/>
-          <w:sz w:val="19"/>
-        </w:rPr>
-        <w:t xml:space="preserve">Bloomberg Editorial Board. (29. April 2026). </w:t>
-      </w:r>
-      <w:r>
-        <w:rPr>
-          <w:rFonts w:ascii="Arial" w:hAnsi="Arial"/>
-          <w:b w:val="0"/>
-          <w:i/>
-          <w:sz w:val="19"/>
-        </w:rPr>
-        <w:t>Taxing Artificial Intelligence Would Hurt Innovation and Prosperity</w:t>
-      </w:r>
-      <w:r>
-        <w:rPr>
-          <w:rFonts w:ascii="Arial" w:hAnsi="Arial"/>
-          <w:b w:val="0"/>
-          <w:i w:val="0"/>
-          <w:sz w:val="19"/>
-        </w:rPr>
-        <w:t xml:space="preserve"> (syndizierte Fassung: </w:t>
-      </w:r>
-      <w:r>
-        <w:rPr>
-          <w:rFonts w:ascii="Arial" w:hAnsi="Arial"/>
-          <w:b w:val="0"/>
-          <w:i/>
-          <w:sz w:val="19"/>
-        </w:rPr>
-        <w:t>Taxing Artificial Intelligence Would Be a Big Mistake</w:t>
-      </w:r>
-      <w:r>
-        <w:rPr>
-          <w:rFonts w:ascii="Arial" w:hAnsi="Arial"/>
-          <w:b w:val="0"/>
-          <w:i w:val="0"/>
-          <w:sz w:val="19"/>
-        </w:rPr>
-        <w:t>, Advisor Perspectives 2. Mai 2026, RealClearPolitics 4. Mai 2026, West Hawaii Today 5. Mai 2026, Las Vegas Sun 6. Mai 2026). Mainstream-finanzpublizistische Gegenstimme zur Sanders/OpenAI-Linie; Argumente: Innovations- und Produktivitätsbremse, internationaler Wettbewerbsnachteil, Unmöglichkeit der Abgrenzung Verdrängung/Augmentation; alternative Empfehlungen: Lockerung berufsrechtlicher Lizenzschranken, Reform der Arbeitslosenversicherung, Steueranreize für Umschulung, Ausweitung der Earned Income Tax Credit. https://www.bloomberg.com/opinion/articles/2026-04-29/taxing-artificial-intelligence-would-hurt-innovation-and-prosperity | https://www.advisorperspectives.com/articles/2026/05/02/taxing-artificial-intelligence-big-mistake | https://www.realclearpolitics.com/2026/05/04/taxing_artificial_intelligence_would_be_a_big_mistake_698781.html | https://lasvegassun.com/news/2026/may/06/taxing-artificial-intelligence-would-be-a-big-mist/</w:t>
-      </w:r>
-    </w:p>
-    <w:p>
-      <w:pPr>
-        <w:jc w:val="both"/>
-      </w:pPr>
-      <w:r>
-        <w:rPr>
-          <w:rFonts w:ascii="Arial" w:hAnsi="Arial"/>
-          <w:b w:val="0"/>
-          <w:i w:val="0"/>
-          <w:sz w:val="19"/>
-        </w:rPr>
-        <w:t xml:space="preserve">Challenger, Gray &amp; Christmas. (2. Juni 2026). </w:t>
-      </w:r>
-      <w:r>
-        <w:rPr>
-          <w:rFonts w:ascii="Arial" w:hAnsi="Arial"/>
-          <w:b w:val="0"/>
-          <w:i/>
-          <w:sz w:val="19"/>
-        </w:rPr>
-        <w:t>Challenger Report: May Job Cuts Rise 16 % from April; Highest May Total Since 2020.</w:t>
-      </w:r>
-      <w:r>
-        <w:rPr>
-          <w:rFonts w:ascii="Arial" w:hAnsi="Arial"/>
-          <w:b w:val="0"/>
-          <w:i w:val="0"/>
-          <w:sz w:val="19"/>
-        </w:rPr>
-        <w:t xml:space="preserve"> 97.006 US-Streichungen im Mai 2026 (+16 % gegenüber April), höchster Mai-Wert seit 2020; KI-bezogen 38.579 = 40 % des Monats (Rekord seit Kategorisierungsbeginn 2023); Tech 38.242 (höchster Monatswert seit August 2024); YTD-KI 87.714 (22 % aller 2026-Streichungspläne). https://www.challengergray.com/blog/challenger-report-may-job-cuts-rise-16-from-april-highest-may-total-since-2020/</w:t>
-      </w:r>
-    </w:p>
-    <w:p>
-      <w:pPr>
-        <w:jc w:val="both"/>
-      </w:pPr>
-      <w:r>
-        <w:rPr>
-          <w:rFonts w:ascii="Arial" w:hAnsi="Arial"/>
-          <w:b w:val="0"/>
-          <w:i w:val="0"/>
-          <w:sz w:val="19"/>
-        </w:rPr>
-        <w:t xml:space="preserve">Challenger, Gray &amp; Christmas. (2. Juli 2026). </w:t>
-      </w:r>
-      <w:r>
-        <w:rPr>
-          <w:rFonts w:ascii="Arial" w:hAnsi="Arial"/>
-          <w:b w:val="0"/>
-          <w:i/>
-          <w:sz w:val="19"/>
-        </w:rPr>
-        <w:t>Challenger Report: June Layoffs Cool to 45,849, Down 53 % From May; AI Leads Reasons for Fourth Consecutive Month.</w:t>
-      </w:r>
-      <w:r>
-        <w:rPr>
-          <w:rFonts w:ascii="Arial" w:hAnsi="Arial"/>
-          <w:b w:val="0"/>
-          <w:i w:val="0"/>
-          <w:sz w:val="19"/>
-        </w:rPr>
-        <w:t xml:space="preserve"> 45.849 US-Streichungen im Juni 2026 (−53 % gegenüber Mai; −4 % gegenüber Juni 2025); KI vierten Monat in Folge führender Einzelgrund mit 14.029 Streichungen (31 %); YTD-KI 101.743 (23 %) und damit rund 86 % über der Gesamtjahressumme 2025 (54.836) bereits im ersten Halbjahr 2026. https://www.challengergray.com/blog/challenger-report-june-layoffs-cool-to-45849-down-53-from-may-ai-leads-reasons-for-fourth-consecutive-month/</w:t>
-      </w:r>
-    </w:p>
-    <w:p>
-      <w:pPr>
-        <w:jc w:val="both"/>
-      </w:pPr>
-      <w:r>
-        <w:rPr>
-          <w:rFonts w:ascii="Arial" w:hAnsi="Arial"/>
-          <w:b w:val="0"/>
-          <w:i w:val="0"/>
-          <w:sz w:val="19"/>
-        </w:rPr>
-        <w:t xml:space="preserve">Microsoft / Tech Startups / BusinessToday. (2. Juli 2026). </w:t>
-      </w:r>
-      <w:r>
-        <w:rPr>
-          <w:rFonts w:ascii="Arial" w:hAnsi="Arial"/>
-          <w:b w:val="0"/>
-          <w:i/>
-          <w:sz w:val="19"/>
-        </w:rPr>
-        <w:t>Microsoft plans to lay off thousands as AI spending reshapes its workforce / Microsoft Cuts ~9,000 Jobs in July 2026 Round / Microsoft to layoff over 5,000 employees across teams.</w:t>
-      </w:r>
-      <w:r>
-        <w:rPr>
-          <w:rFonts w:ascii="Arial" w:hAnsi="Arial"/>
-          <w:b w:val="0"/>
-          <w:i w:val="0"/>
-          <w:sz w:val="19"/>
-        </w:rPr>
-        <w:t xml:space="preserve"> Rund 9.000 Streichungen (&lt; 4 % globale Belegschaft) zum Start des Fiskaljahres 2026; Bereiche Sales, Consulting und Xbox (Xbox-CEO Asha Sharma: „business cannot continue on its current trajectory" nach über 20 Milliarden US-Dollar Investition in Content, Plattform und Hardware-Subventionen über fünf Jahre); geringer als im Vorjahr, weil rund ein Drittel der zum 2. Juli 2026 fälligen VRSAR-Buyouts (Programmangebot vom 7. Mai 2026) angenommen wurde. https://techstartups.com/2026/07/01/microsoft-plans-to-lay-off-thousands-as-ai-spending-reshapes-its-workforce/ | https://icharles.com/articles/microsoft-layoffs-9000-july-2026 | https://www.businesstoday.in/technology/news/story/microsoft-to-layoff-over-5000-employees-across-teams-540239-2026-07-01</w:t>
-      </w:r>
-    </w:p>
-    <w:p>
-      <w:pPr>
-        <w:jc w:val="both"/>
-      </w:pPr>
-      <w:r>
-        <w:rPr>
-          <w:rFonts w:ascii="Arial" w:hAnsi="Arial"/>
-          <w:b w:val="0"/>
-          <w:i w:val="0"/>
-          <w:sz w:val="19"/>
-        </w:rPr>
-        <w:t xml:space="preserve">TechRepublic / Yahoo Finance / Fox Business. (Anfang Juli 2026). </w:t>
-      </w:r>
-      <w:r>
-        <w:rPr>
-          <w:rFonts w:ascii="Arial" w:hAnsi="Arial"/>
-          <w:b w:val="0"/>
-          <w:i/>
-          <w:sz w:val="19"/>
-        </w:rPr>
-        <w:t>Microsoft Layoffs Could Hit Thousands as AI Spending Climbs / Microsoft layoffs 2026: cuts hitting sales, consulting, and Xbox / Microsoft eyes another wave of layoffs that could hit 5,000 workers next week.</w:t>
-      </w:r>
-      <w:r>
-        <w:rPr>
-          <w:rFonts w:ascii="Arial" w:hAnsi="Arial"/>
-          <w:b w:val="0"/>
-          <w:i w:val="0"/>
-          <w:sz w:val="19"/>
-        </w:rPr>
-        <w:t xml:space="preserve"> Präzisierung der Layoff-Größenordnung jenseits der bereits angenommenen VRSAR-Austritte auf voraussichtlich weniger als 5.500 Beschäftigte beziehungsweise unter 2,5 % der weltweiten Belegschaft; Kontext: rund 9.000 im VRSAR angebotsberechtigte Mitarbeitende, davon etwa ein Drittel angenommen. https://www.techrepublic.com/article/news-microsoft-layoffs-ai-spending-2026/ | https://finance.yahoo.com/markets/stocks/articles/microsoft-layoffs-2026-cuts-hitting-144856068.html | https://www.foxbusiness.com/economy/microsoft-eyes-another-wave-layoffs-hit-5000-workers-next-week</w:t>
-      </w:r>
-    </w:p>
-    <w:p>
-      <w:pPr>
-        <w:jc w:val="both"/>
-      </w:pPr>
-      <w:r>
-        <w:rPr>
-          <w:rFonts w:ascii="Arial" w:hAnsi="Arial"/>
-          <w:b w:val="0"/>
-          <w:i w:val="0"/>
-          <w:sz w:val="19"/>
-        </w:rPr>
-        <w:t xml:space="preserve">Anthropic / TechCrunch / Thurrott / PYMNTS. (30. Juni 2026). </w:t>
-      </w:r>
-      <w:r>
-        <w:rPr>
-          <w:rFonts w:ascii="Arial" w:hAnsi="Arial"/>
-          <w:b w:val="0"/>
-          <w:i/>
-          <w:sz w:val="19"/>
-        </w:rPr>
-        <w:t>Introducing Claude Sonnet 5 / Anthropic launches Claude Sonnet 5 as a cheaper way to run agents / Anthropic Launches Claude Sonnet 5 / Anthropic Cuts AI Agent Costs With Claude Sonnet 5 Rollout.</w:t>
-      </w:r>
-      <w:r>
-        <w:rPr>
-          <w:rFonts w:ascii="Arial" w:hAnsi="Arial"/>
-          <w:b w:val="0"/>
-          <w:i w:val="0"/>
-          <w:sz w:val="19"/>
-        </w:rPr>
-        <w:t xml:space="preserve"> Neue Frontier-Modellstufe zu einem Einführungspreis von 2 US-Dollar pro Million Input-Token und 10 US-Dollar pro Million Output-Token bis 31. August 2026, Standardpreis ab 1. September 2026 bei 3 beziehungsweise 15 US-Dollar; ergänzende Rabattstrukturen bis 90 % via Prompt-Caching und 50 % via Batch-Processing; Beleg für die deflationäre Preisdynamik bei Frontier-Inferenz (§ 8.2). https://www.anthropic.com/news/claude-sonnet-5 | https://techcrunch.com/2026/06/30/anthropic-launches-claude-sonnet-5-as-a-cheaper-way-to-run-agents/ | https://www.thurrott.com/a-i/anthropic/338184/anthropic-launches-claude-sonnet-5 | https://www.pymnts.com/news/artificial-intelligence/2026/anthropic-cuts-ai-agent-costs-with-claude-sonnet-5-rollout/</w:t>
-      </w:r>
-    </w:p>
-    <w:p>
-      <w:pPr>
-        <w:jc w:val="both"/>
-      </w:pPr>
-      <w:r>
-        <w:rPr>
-          <w:rFonts w:ascii="Arial" w:hAnsi="Arial"/>
-          <w:b w:val="0"/>
-          <w:i w:val="0"/>
-          <w:sz w:val="19"/>
-        </w:rPr>
-        <w:t xml:space="preserve">CNBC / Quartz / TheNextWeb / Fox Business / Motor1. (1. Juli 2026 / Folgeberichterstattung). </w:t>
-      </w:r>
-      <w:r>
-        <w:rPr>
-          <w:rFonts w:ascii="Arial" w:hAnsi="Arial"/>
-          <w:b w:val="0"/>
-          <w:i/>
-          <w:sz w:val="19"/>
-        </w:rPr>
-        <w:t>Employers who laid off workers citing AI are already starting to regret it / Companies rehire workers laid off for AI as automation falls short / Ford rehired 350 engineers to fix what its AI systems got wrong / Ford rehires experienced engineers after AI misses the mark / Ford Brings Back Veteran Engineers After AI Falls Short: „It's Only As Good As The People Using It".</w:t>
-      </w:r>
-      <w:r>
-        <w:rPr>
-          <w:rFonts w:ascii="Arial" w:hAnsi="Arial"/>
-          <w:b w:val="0"/>
-          <w:i w:val="0"/>
-          <w:sz w:val="19"/>
-        </w:rPr>
-        <w:t xml:space="preserve"> Rebound-Berichterstattung mit Einzelfällen: Ford ~350 rehired „Gray-Beard"-Ingenieure über drei Jahre, JD Power 2026 U.S. Initial Quality Study — 152 Probleme/100 Fahrzeuge, erste Platzierung seit 2010, erwartete Jahres-Kostenersparnis ~1 Mrd. USD; IBM verdreifacht 2026 die Einstellungen für Berufseinsteiger nach KI-HR-Ausfall auf den verbleibenden 6 % ethischer Dilemmata; Commonwealth Bank of Australia rehired &gt; 40 Kundenservicestellen nach AI-Voicebot-Ausfall. https://www.cnbc.com/2026/07/01/employers-who-laid-off-workers-for-ai-are-reversing-their-decisions.html | https://qz.com/companies-rehiring-workers-ai-layoffs-automation-070126 | https://thenextweb.com/news/ford-rehired-350-engineers-ai-quality-jd-power | https://www.foxbusiness.com/technology/ford-rehires-experienced-engineers-after-ai-misses-mark | https://www.motor1.com/news/800343/humans-better-than-ai-inspectors/</w:t>
-      </w:r>
-    </w:p>
-    <w:p>
-      <w:pPr>
-        <w:jc w:val="both"/>
-      </w:pPr>
-      <w:r>
-        <w:rPr>
-          <w:rFonts w:ascii="Arial" w:hAnsi="Arial"/>
-          <w:b w:val="0"/>
-          <w:i w:val="0"/>
-          <w:sz w:val="19"/>
-        </w:rPr>
-        <w:t xml:space="preserve">Orgvue / Vitreous World. (Erhebung Februar–März 2025; Rezeption Juni/Juli 2026). </w:t>
-      </w:r>
-      <w:r>
-        <w:rPr>
-          <w:rFonts w:ascii="Arial" w:hAnsi="Arial"/>
-          <w:b w:val="0"/>
-          <w:i/>
-          <w:sz w:val="19"/>
-        </w:rPr>
-        <w:t>55 % of businesses admit wrong decisions in making employees redundant when bringing AI into the workforce / Human-first, machine enhanced — From optimism to pragmatism in AI-driven workforce transformation.</w:t>
-      </w:r>
-      <w:r>
-        <w:rPr>
-          <w:rFonts w:ascii="Arial" w:hAnsi="Arial"/>
-          <w:b w:val="0"/>
-          <w:i w:val="0"/>
-          <w:sz w:val="19"/>
-        </w:rPr>
-        <w:t xml:space="preserve"> Befragung von 1.163 Senior Decision-Makers (Vorstände, C-Level, Senior-Manager) in Organisationen ab 500 bzw. 2.000 Beschäftigten in den USA, Kanada, dem Vereinigten Königreich, Irland, Australien, Hongkong, Malaysia und Singapur: 39 % KI-bedingte Personalreduktionen; davon 55 % bereuen im Nachhinein zumindest eine Entscheidung; 23 % räumen ein, sie hätten auf allgemeinen Annahmen und nicht auf einer Rollenanalyse basiert. https://www.orgvue.com/news/55-of-businesses-admit-wrong-decisions-in-making-employees-redundant-when-bringing-ai-into-the-workforce/ | https://www.orgvue.com/content/uploads/sites/2/2025/05/Orgvue-AI-and-Workforce-Transformation-eBook-Spring-2025-FULL.pdf</w:t>
-      </w:r>
-    </w:p>
-    <w:p>
-      <w:pPr>
-        <w:jc w:val="both"/>
-      </w:pPr>
-      <w:r>
-        <w:rPr>
-          <w:rFonts w:ascii="Arial" w:hAnsi="Arial"/>
-          <w:b w:val="0"/>
-          <w:i w:val="0"/>
-          <w:sz w:val="19"/>
-        </w:rPr>
-        <w:t xml:space="preserve">IBTimes UK / HR Dive / HRTech Edge / Robert Half (via Fach- und Wirtschaftspresse). (Juni/Juli 2026). </w:t>
-      </w:r>
-      <w:r>
-        <w:rPr>
-          <w:rFonts w:ascii="Arial" w:hAnsi="Arial"/>
-          <w:b w:val="0"/>
-          <w:i/>
-          <w:sz w:val="19"/>
-        </w:rPr>
-        <w:t>AI Layoffs Backfire as 32 % of Bosses Rehire Roles They Thought Robots Could Do / More than half of leaders who laid off workers due to AI admit to screwing up / AI Layoffs Backfire as Firms Rehire Workers: Orgvue Study.</w:t>
-      </w:r>
-      <w:r>
-        <w:rPr>
-          <w:rFonts w:ascii="Arial" w:hAnsi="Arial"/>
-          <w:b w:val="0"/>
-          <w:i w:val="0"/>
-          <w:sz w:val="19"/>
-        </w:rPr>
-        <w:t xml:space="preserve"> Robert-Half-Rückholrate: 32 % der US-Hiring-Manager, die eine Rolle primär KI-bedingt abgebaut haben, mussten sie später wiederbesetzen; Finance 44 %, HR 35 %, Technology 32 %. https://www.ibtimes.co.uk/ai-layoffs-reversed-companies-rehire-staff-1806357 | https://www.hrdive.com/news/leaders-who-laid-off-workers-due-to-ai-regretted-it/746643/ | https://hrtechedge.com/ai-layoffs-backfire-32-of-companies-forced-to-rehire-after-misjudging-automation/</w:t>
-      </w:r>
-    </w:p>
-    <w:p>
-      <w:pPr>
-        <w:jc w:val="both"/>
-      </w:pPr>
-      <w:r>
-        <w:rPr>
-          <w:rFonts w:ascii="Arial" w:hAnsi="Arial"/>
-          <w:b w:val="0"/>
-          <w:i w:val="0"/>
-          <w:sz w:val="19"/>
-        </w:rPr>
-        <w:t xml:space="preserve">SkillSyncer. (Stand 5. Juli 2026). </w:t>
-      </w:r>
-      <w:r>
-        <w:rPr>
-          <w:rFonts w:ascii="Arial" w:hAnsi="Arial"/>
-          <w:b w:val="0"/>
-          <w:i/>
-          <w:sz w:val="19"/>
-        </w:rPr>
-        <w:t>2026 Tech Layoffs Tracker — 185.894 Workers Impacted.</w:t>
-      </w:r>
-      <w:r>
-        <w:rPr>
-          <w:rFonts w:ascii="Arial" w:hAnsi="Arial"/>
-          <w:b w:val="0"/>
-          <w:i w:val="0"/>
-          <w:sz w:val="19"/>
-        </w:rPr>
-        <w:t xml:space="preserve"> 267 Layoff-Ereignisse mit 185.894 betroffenen Beschäftigten (rund 999 Stellen pro Tag; +58.483 gegenüber dem 8. Mai 2026). https://skillsyncer.com/layoffs-tracker</w:t>
-      </w:r>
-    </w:p>
-    <w:p>
-      <w:pPr>
-        <w:jc w:val="both"/>
-      </w:pPr>
-      <w:r>
-        <w:rPr>
-          <w:rFonts w:ascii="Arial" w:hAnsi="Arial"/>
-          <w:b w:val="0"/>
-          <w:i w:val="0"/>
-          <w:sz w:val="19"/>
-        </w:rPr>
-        <w:t xml:space="preserve">TrueUp. (Jahresmitte 2026). </w:t>
-      </w:r>
-      <w:r>
-        <w:rPr>
-          <w:rFonts w:ascii="Arial" w:hAnsi="Arial"/>
-          <w:b w:val="0"/>
-          <w:i/>
-          <w:sz w:val="19"/>
-        </w:rPr>
-        <w:t>Layoffs Tracker — All Tech and Startup Layoffs.</w:t>
-      </w:r>
-      <w:r>
-        <w:rPr>
-          <w:rFonts w:ascii="Arial" w:hAnsi="Arial"/>
-          <w:b w:val="0"/>
-          <w:i w:val="0"/>
-          <w:sz w:val="19"/>
-        </w:rPr>
-        <w:t xml:space="preserve"> 435 Layoff-Ereignisse mit 164.971 betroffenen Beschäftigten (rund 887 Stellen pro Tag); Vergleichswert 2025: 783 Meldungen mit 245.953 Personen (rund 674 pro Tag) — 2026 kumuliert niedriger, tägliche Rate deutlich über Vorjahr. https://www.trueup.io/layoffs</w:t>
-      </w:r>
-    </w:p>
-    <w:p>
-      <w:pPr>
-        <w:jc w:val="both"/>
-      </w:pPr>
-      <w:r>
-        <w:rPr>
-          <w:rFonts w:ascii="Arial" w:hAnsi="Arial"/>
-          <w:b w:val="0"/>
-          <w:i w:val="0"/>
-          <w:sz w:val="19"/>
-        </w:rPr>
-        <w:t xml:space="preserve">Oracle Corp. (Juni 2026). </w:t>
-      </w:r>
-      <w:r>
-        <w:rPr>
-          <w:rFonts w:ascii="Arial" w:hAnsi="Arial"/>
-          <w:b w:val="0"/>
-          <w:i/>
-          <w:sz w:val="19"/>
-        </w:rPr>
-        <w:t>Form 8-K — Fiscal Year 2026 Restructuring and Workforce Update.</w:t>
-      </w:r>
-      <w:r>
-        <w:rPr>
-          <w:rFonts w:ascii="Arial" w:hAnsi="Arial"/>
-          <w:b w:val="0"/>
-          <w:i w:val="0"/>
-          <w:sz w:val="19"/>
-        </w:rPr>
-        <w:t xml:space="preserve"> Konzernabbau von rund 21.000 Stellen im FY2026 (ca. 13 % der Belegschaft; von 162.000 im Mai 2025 auf 141.000 im Mai 2026); Restrukturierungsaufwand ~1,8 Mrd. USD (FY2025: 374 Mio. USD); flankierendes KI- und Cloud-Investitionsvolumen ~50 Mrd. USD im Fiskaljahr; ergänzende Fachberichterstattung Bloomberg, CNBC und Forbes vom 22./23. Juni 2026. https://www.sec.gov/Archives/edgar/data/0001341439/000119312526265848/orcl-ex99_1.htm | https://www.cnbc.com/2026/06/23/oracle-ai-job-cuts-layoffs-21000.html | https://www.bloomberg.com/news/articles/2026-06-22/oracle-layoffs-fueled-by-ai-reduces-workforce-by-21-000</w:t>
-      </w:r>
-    </w:p>
-    <w:p>
-      <w:pPr>
-        <w:jc w:val="both"/>
-      </w:pPr>
-      <w:r>
-        <w:rPr>
-          <w:rFonts w:ascii="Arial" w:hAnsi="Arial"/>
           <w:b/>
           <w:i w:val="0"/>
           <w:sz w:val="19"/>
@@ -11122,7 +11068,7 @@
           <w:i w:val="0"/>
           <w:sz w:val="19"/>
         </w:rPr>
-        <w:t xml:space="preserve"> Dieses Arbeitspapier gibt den Stand Anfang Juli 2026 wieder (Version 27.0, Schnitt am 5. Juli 2026). Die Debatte entwickelt sich dynamisch — offen sind zum Redaktionsschluss insbesondere die parlamentarische Behandlung des GKV-Beitragssatzstabilisierungsgesetzes vor der Sommerpause 2026, das weitere Verfahren zum </w:t>
+        <w:t xml:space="preserve"> Dieses Arbeitspapier gibt den Stand Anfang Juli 2026 wieder (Version 28.0, Schnitt am 5. Juli 2026). Die Debatte entwickelt sich dynamisch — offen sind zum Redaktionsschluss insbesondere die parlamentarische Behandlung des GKV-Beitragssatzstabilisierungsgesetzes vor der Sommerpause 2026, das weitere Verfahren zum </w:t>
       </w:r>
       <w:r>
         <w:rPr>
@@ -11238,7 +11184,7 @@
         <w:color w:val="999999"/>
         <w:sz w:val="15"/>
       </w:rPr>
-      <w:t>Version 27.0 — Mai 2026 — CC BY 4.0</w:t>
+      <w:t>Version 28.0 — Mai 2026 — CC BY 4.0</w:t>
       <w:tab/>
       <w:t xml:space="preserve">Seite </w:t>
     </w:r>

</xml_diff>

<commit_message>
Daily-Update 2026-07-08 — Version 28.0 (Cluster: I, A/E)
Zwei belegbare Fortschreibungen aus dem 7-Tage-/48-Stunden-Fenster:

- § 8.2 (Cluster I, 48h): NVIDIA-Kyber-Rack für Rubin Ultra um >12
  Monate auf 2028 verschoben (SemiAnalysis via CNBC, Tom's Hardware,
  The Next Web, Seeking Alpha, 6. Juli 2026). PCB-Midplane-Ursache
  (78 Lagen, <25 μm Toleranz, 448 Gb/s); Notfall-Doppel-Rack-Plan
  gestrichen; Öffnung für AMD MI455X (CDNA-5, 432 GB, 40 PFLOPS
  NVFP4) und Google TPUs am oberen Marktende.

- § 3.5 (Cluster A/E, 7d): OECD Country Note Germany (6 S.) und
  OECD Non-Compete-Länderdatei Germany (8 S.), beide 7. Juli 2026.
  Nachvertragsbindungen betreffen im 15-Länder-Mittel rund 30 %
  der Beschäftigten — deutschlandbezogene Präzisierung des in
  Lauf 001 vom 7. Juli 2026 aufgenommenen OECD-Employment-Outlook-
  Absatzes.

Versionssprung 27.0 → 28.0 in KI-Ökonomie.md, README.md und
Validierung-Ergebnisse.md. Build von PDF und DOCX erfolgreich.
Validierung ohne Fehler.
</commit_message>
<xml_diff>
--- a/KI-Ökonomie.docx
+++ b/KI-Ökonomie.docx
@@ -112,7 +112,7 @@
           <w:color w:val="666666"/>
           <w:sz w:val="18"/>
         </w:rPr>
-        <w:t>Version 27.0</w:t>
+        <w:t>Version 28.0</w:t>
       </w:r>
     </w:p>
     <w:p>
@@ -2160,7 +2160,25 @@
           <w:i w:val="0"/>
           <w:sz w:val="19"/>
         </w:rPr>
-        <w:t xml:space="preserve"> fügt der Debatte eine regionalökonomische Perspektive hinzu: Nach OECD-Ausweis dokumentiert der 392-seitige Bericht große und beharrliche Beschäftigungs-, Arbeitslosigkeits- und Einkommensunterschiede innerhalb einzelner Mitgliedsländer und führt aus, dass lokale Arbeitsmärkte durch Handels- und Technologieschocks — einschließlich Künstlicher Intelligenz — asymmetrisch umgebaut würden, wobei manche Regionen Industrie-Arbeitsplätze verlören, während andere im nicht-routinisierten Dienstleistungssegment aufbauten; die Anpassung erfolge dabei überwiegend nicht über sektorale Wechsel bestehender Beschäftigter, sondern über den Weg in vorübergehende Arbeitslosigkeit und über neue Einstiegskohorten, sodass verdrängte Beschäftigte dauerhafte Einkommensnachteile („lasting scars") tragen könnten. Für den Sozialstaat sei nach den Kernbotschaften des Berichts eine ortsbezogene, integrierte Politik erforderlich, die Regionalpolitik, Industriepolitik und aktive Arbeitsmarktpolitik verknüpft. Cormann verweist ergänzend darauf, dass die OECD-weite erwerbsfähige Bevölkerung bis 2060 um rund 8 % schrumpfe und Qualifikationspolitik dringend erforderlich sei, damit Beschäftigte von KI-Werkzeugen profitieren könnten. Der Bericht behandelt darüber hinaus die Ausbreitung nicht-Konkurrenz-Klauseln (Non-Compete Clauses) — nach OECD-Beobachtung inzwischen bis zu ein Viertel der Beschäftigten in einigen Mitgliedsländern und zunehmend auch in niedrig vergüteten Tätigkeiten — und ordnet sie als hemmend für Arbeitsmobilität, Innovation, Löhne und Produktivität ein. Für die hier geführte Steuerdebatte ist der Bericht in zweifacher Hinsicht relevant: Erstens untermauert er die szenariorobuste Auslegung des steuerpolitischen Instrumentariums, weil regionalspezifische Verwerfungen bei aggregiert moderater Arbeitsmarktdynamik empirisch dokumentiert sind (§ 8.4). Zweitens verweist er auf die Grenzen einer rein arbeitsmarktbezogenen Steuerung, wenn Anpassung faktisch über Ausscheiden und Neueintritt statt über innerbetriebliche Umschichtung stattfindet — ein Muster, das die Kausalattribution einer zielgerichteten Ersatzabgabe (Typ 5 nach § 2.1, § 9.1) weiter erschwert.</w:t>
+        <w:t xml:space="preserve"> fügt der Debatte eine regionalökonomische Perspektive hinzu: Nach OECD-Ausweis dokumentiert der 392-seitige Bericht große und beharrliche Beschäftigungs-, Arbeitslosigkeits- und Einkommensunterschiede innerhalb einzelner Mitgliedsländer und führt aus, dass lokale Arbeitsmärkte durch Handels- und Technologieschocks — einschließlich Künstlicher Intelligenz — asymmetrisch umgebaut würden, wobei manche Regionen Industrie-Arbeitsplätze verlören, während andere im nicht-routinisierten Dienstleistungssegment aufbauten; die Anpassung erfolge dabei überwiegend nicht über sektorale Wechsel bestehender Beschäftigter, sondern über den Weg in vorübergehende Arbeitslosigkeit und über neue Einstiegskohorten, sodass verdrängte Beschäftigte dauerhafte Einkommensnachteile („lasting scars") tragen könnten. Für den Sozialstaat sei nach den Kernbotschaften des Berichts eine ortsbezogene, integrierte Politik erforderlich, die Regionalpolitik, Industriepolitik und aktive Arbeitsmarktpolitik verknüpft. Cormann verweist ergänzend darauf, dass die OECD-weite erwerbsfähige Bevölkerung bis 2060 um rund 8 % schrumpfe und Qualifikationspolitik dringend erforderlich sei, damit Beschäftigte von KI-Werkzeugen profitieren könnten. Der Bericht behandelt darüber hinaus die Ausbreitung nicht-Konkurrenz-Klauseln (Non-Compete Clauses) — nach OECD-Beobachtung inzwischen bis zu ein Viertel der Beschäftigten in einigen Mitgliedsländern und zunehmend auch in niedrig vergüteten Tätigkeiten — und ordnet sie als hemmend für Arbeitsmobilität, Innovation, Löhne und Produktivität ein. Die am selben Tag (7. Juli 2026) publizierte OECD-Länderdatei zu Non-Compete-Klauseln quantifiziert diese Ausbreitung präziser: In 15 OECD-Ländern seien im Mittel rund 30 % der Beschäftigten durch entsprechende Klauseln oder verwandte Nach-Vertragsbindungen (Kundenschutzabreden, Non-Solicitation-Vereinbarungen) gebunden, was die Verhandlungsposition der Beschäftigten schwäche und Lohnwachstum bremse. Ergänzend liegt der 6-seitige OECD-Länderbericht </w:t>
+      </w:r>
+      <w:r>
+        <w:rPr>
+          <w:rFonts w:ascii="Arial" w:hAnsi="Arial"/>
+          <w:b w:val="0"/>
+          <w:i/>
+          <w:sz w:val="19"/>
+        </w:rPr>
+        <w:t>Employment Outlook 2026 — Deutschland</w:t>
+      </w:r>
+      <w:r>
+        <w:rPr>
+          <w:rFonts w:ascii="Arial" w:hAnsi="Arial"/>
+          <w:b w:val="0"/>
+          <w:i w:val="0"/>
+          <w:sz w:val="19"/>
+        </w:rPr>
+        <w:t xml:space="preserve"> (7. Juli 2026) vor, der die aggregierte OECD-Diagnose auf die deutsche Arbeitsmarktstruktur bezieht (regional asymmetrische Anpassungslasten bei ausgeprägter Süd-Nord-Beschäftigungsspreizung; demografische Kontraktion des Erwerbspersonenpotenzials — vgl. IAB-Frühjahrsprognose in § 1.1 — als zusätzlicher struktureller Faktor). Für die hier geführte Steuerdebatte ist der Bericht in dreifacher Hinsicht relevant: Erstens untermauert er die szenariorobuste Auslegung des steuerpolitischen Instrumentariums, weil regionalspezifische Verwerfungen bei aggregiert moderater Arbeitsmarktdynamik empirisch dokumentiert sind (§ 8.4). Zweitens verweist er auf die Grenzen einer rein arbeitsmarktbezogenen Steuerung, wenn Anpassung faktisch über Ausscheiden und Neueintritt statt über innerbetriebliche Umschichtung stattfindet — ein Muster, das die Kausalattribution einer zielgerichteten Ersatzabgabe (Typ 5 nach § 2.1, § 9.1) weiter erschwert. Drittens verstärkt die dokumentierte Verbreitung von Non-Compete-Klauseln — insbesondere im niedrig vergüteten Segment — das ordnungspolitische Argument für eine Verbreiterung der Sozialstaats-Finanzierungsbasis (§ 5.1), weil die klassische Lohn-Bemessungsgrundlage in einer Ökonomie, in der Beschäftigte Nachvertragsbindungen unterliegen und Anpassung überwiegend über Neueinstellungen erfolgt, tendenziell schmaler wird.</w:t>
       </w:r>
     </w:p>
     <w:p>
@@ -5432,7 +5450,169 @@
           <w:i w:val="0"/>
           <w:sz w:val="19"/>
         </w:rPr>
-        <w:t>-Architektur (Nachfolgegeneration der Blackwell-Plattform, Trainingsleistung nach Herstellerangaben rund 3,5-fach) genutzt; nach übereinstimmender Fachberichterstattung (Wccftech, TradingKey, TechPowerUp, Introl) beginnen die ersten Auslieferungen im Juli 2026, zunächst an fünf nordamerikanische Hyperscaler — Microsoft, Google, Amazon, Meta und Oracle —, während die Volumen-Auslieferungen für das dritte und vierte Quartal 2026 vorgesehen sind (Rack-Fertigung durch Foxconn, Quanta und Wistron; ein erster Vera-Rubin-Rack läuft nach Angaben von Jensen Huang bereits produktiv bei Microsoft Azure). Für die in § 1.1 beschriebene Asymmetrie zwischen Personalreduktion und Capex-Ausbau verdichtet sich damit ein weiteres Bild: Die Hardware-Konzentration schreibt die Rohstoff-Analogie fort und stützt die Anknüpfung der Steuerdebatte an Maschinenkapital und Wertschöpfung (§ 5.1, § 8.3) auf einer weiteren technologischen Generation. Deutschland und die Europäische Union verbleiben in der Rolle der Bezieher — mit den daraus folgenden geopolitischen und fiskalischen Implikationen für die Veredelungsstrategie unten und für die Teilhabefrage in § 8.3.</w:t>
+        <w:t xml:space="preserve">-Architektur (Nachfolgegeneration der Blackwell-Plattform, Trainingsleistung nach Herstellerangaben rund 3,5-fach) genutzt; nach übereinstimmender Fachberichterstattung (Wccftech, TradingKey, TechPowerUp, Introl) beginnen die ersten Auslieferungen im Juli 2026, zunächst an fünf nordamerikanische Hyperscaler — Microsoft, Google, Amazon, Meta und Oracle —, während die Volumen-Auslieferungen für das dritte und vierte Quartal 2026 vorgesehen sind (Rack-Fertigung durch Foxconn, Quanta und Wistron; ein erster Vera-Rubin-Rack läuft nach Angaben von Jensen Huang bereits produktiv bei Microsoft Azure). Am 6. Juli 2026 hat allerdings die Analystenfirma </w:t>
+      </w:r>
+      <w:r>
+        <w:rPr>
+          <w:rFonts w:ascii="Arial" w:hAnsi="Arial"/>
+          <w:b w:val="0"/>
+          <w:i/>
+          <w:sz w:val="19"/>
+        </w:rPr>
+        <w:t>SemiAnalysis</w:t>
+      </w:r>
+      <w:r>
+        <w:rPr>
+          <w:rFonts w:ascii="Arial" w:hAnsi="Arial"/>
+          <w:b w:val="0"/>
+          <w:i w:val="0"/>
+          <w:sz w:val="19"/>
+        </w:rPr>
+        <w:t xml:space="preserve"> (nach übereinstimmender Berichterstattung von </w:t>
+      </w:r>
+      <w:r>
+        <w:rPr>
+          <w:rFonts w:ascii="Arial" w:hAnsi="Arial"/>
+          <w:b w:val="0"/>
+          <w:i/>
+          <w:sz w:val="19"/>
+        </w:rPr>
+        <w:t>CNBC</w:t>
+      </w:r>
+      <w:r>
+        <w:rPr>
+          <w:rFonts w:ascii="Arial" w:hAnsi="Arial"/>
+          <w:b w:val="0"/>
+          <w:i w:val="0"/>
+          <w:sz w:val="19"/>
+        </w:rPr>
+        <w:t xml:space="preserve">, </w:t>
+      </w:r>
+      <w:r>
+        <w:rPr>
+          <w:rFonts w:ascii="Arial" w:hAnsi="Arial"/>
+          <w:b w:val="0"/>
+          <w:i/>
+          <w:sz w:val="19"/>
+        </w:rPr>
+        <w:t>Tom's Hardware</w:t>
+      </w:r>
+      <w:r>
+        <w:rPr>
+          <w:rFonts w:ascii="Arial" w:hAnsi="Arial"/>
+          <w:b w:val="0"/>
+          <w:i w:val="0"/>
+          <w:sz w:val="19"/>
+        </w:rPr>
+        <w:t xml:space="preserve">, </w:t>
+      </w:r>
+      <w:r>
+        <w:rPr>
+          <w:rFonts w:ascii="Arial" w:hAnsi="Arial"/>
+          <w:b w:val="0"/>
+          <w:i/>
+          <w:sz w:val="19"/>
+        </w:rPr>
+        <w:t>The Next Web</w:t>
+      </w:r>
+      <w:r>
+        <w:rPr>
+          <w:rFonts w:ascii="Arial" w:hAnsi="Arial"/>
+          <w:b w:val="0"/>
+          <w:i w:val="0"/>
+          <w:sz w:val="19"/>
+        </w:rPr>
+        <w:t xml:space="preserve"> und </w:t>
+      </w:r>
+      <w:r>
+        <w:rPr>
+          <w:rFonts w:ascii="Arial" w:hAnsi="Arial"/>
+          <w:b w:val="0"/>
+          <w:i/>
+          <w:sz w:val="19"/>
+        </w:rPr>
+        <w:t>Seeking Alpha</w:t>
+      </w:r>
+      <w:r>
+        <w:rPr>
+          <w:rFonts w:ascii="Arial" w:hAnsi="Arial"/>
+          <w:b w:val="0"/>
+          <w:i w:val="0"/>
+          <w:sz w:val="19"/>
+        </w:rPr>
+        <w:t xml:space="preserve">) eine deutliche Verzögerung der nächsten NVIDIA-Systemgeneration bekanntgegeben: Das für die 2027 vorgesehenen </w:t>
+      </w:r>
+      <w:r>
+        <w:rPr>
+          <w:rFonts w:ascii="Arial" w:hAnsi="Arial"/>
+          <w:b w:val="0"/>
+          <w:i/>
+          <w:sz w:val="19"/>
+        </w:rPr>
+        <w:t>Rubin-Ultra</w:t>
+      </w:r>
+      <w:r>
+        <w:rPr>
+          <w:rFonts w:ascii="Arial" w:hAnsi="Arial"/>
+          <w:b w:val="0"/>
+          <w:i w:val="0"/>
+          <w:sz w:val="19"/>
+        </w:rPr>
+        <w:t xml:space="preserve">-Chips geplante Rack-System </w:t>
+      </w:r>
+      <w:r>
+        <w:rPr>
+          <w:rFonts w:ascii="Arial" w:hAnsi="Arial"/>
+          <w:b w:val="0"/>
+          <w:i/>
+          <w:sz w:val="19"/>
+        </w:rPr>
+        <w:t>Kyber</w:t>
+      </w:r>
+      <w:r>
+        <w:rPr>
+          <w:rFonts w:ascii="Arial" w:hAnsi="Arial"/>
+          <w:b w:val="0"/>
+          <w:i w:val="0"/>
+          <w:sz w:val="19"/>
+        </w:rPr>
+        <w:t xml:space="preserve"> (NVL144, für 144 GPUs pro Rack als Scale-Up-Baustein konzipiert) verschiebe sich nach Fertigungsproblemen an der PCB-Midplane um mehr als zwölf Monate auf 2028; ein Notfallplan, zwei Racks der aktuellen Generation zusammenzuschalten, sei nach ablehnender Rückmeldung der Cloud-Kunden ebenfalls gestrichen worden. NVIDIA habe damit vorerst „no proven solution" für die Skalierung von Rubin Ultra über den Rack-Verbund hinaus, wodurch AMD (MI455X mit CDNA-5-Architektur, 2 nm, 432 GB Speicher, 40 PFLOPS NVFP4 im späteren Verlauf von 2026) und Google (TPU-Reihe) am oberen Ende des Marktes eine Öffnung erhielten; die aktuellen </w:t>
+      </w:r>
+      <w:r>
+        <w:rPr>
+          <w:rFonts w:ascii="Arial" w:hAnsi="Arial"/>
+          <w:b w:val="0"/>
+          <w:i/>
+          <w:sz w:val="19"/>
+        </w:rPr>
+        <w:t>Oberon</w:t>
+      </w:r>
+      <w:r>
+        <w:rPr>
+          <w:rFonts w:ascii="Arial" w:hAnsi="Arial"/>
+          <w:b w:val="0"/>
+          <w:i w:val="0"/>
+          <w:sz w:val="19"/>
+        </w:rPr>
+        <w:t xml:space="preserve">- und </w:t>
+      </w:r>
+      <w:r>
+        <w:rPr>
+          <w:rFonts w:ascii="Arial" w:hAnsi="Arial"/>
+          <w:b w:val="0"/>
+          <w:i/>
+          <w:sz w:val="19"/>
+        </w:rPr>
+        <w:t>Rubin</w:t>
+      </w:r>
+      <w:r>
+        <w:rPr>
+          <w:rFonts w:ascii="Arial" w:hAnsi="Arial"/>
+          <w:b w:val="0"/>
+          <w:i w:val="0"/>
+          <w:sz w:val="19"/>
+        </w:rPr>
+        <w:t>-Racks der laufenden Generation blieben davon unberührt und würden ab Herbst 2026 planmäßig an die Cloud-Partner ausgeliefert. Für die hier geführte Steuerdebatte ist die Verzögerung in zweifacher Hinsicht relevant: Sie untermauert einerseits die These der Rohstoff-Konzentration, weil der Engpass in einer einzigen Lieferkette (78-lagige PCB-Midplane mit Toleranzen unter 25 μm) einen ganzen technologischen Sprung um über ein Jahr verschieben kann; andererseits deutet sich mit dem Aufholpotenzial von AMD und Google eine graduelle Diversifizierung der Anbieterseite an, die die Extremposition einer reinen NVIDIA-Rohstoff-Analogie relativiert. Für die in § 1.1 beschriebene Asymmetrie zwischen Personalreduktion und Capex-Ausbau verdichtet sich das Bild weiter: Die Hardware-Konzentration schreibt die Rohstoff-Analogie fort und stützt die Anknüpfung der Steuerdebatte an Maschinenkapital und Wertschöpfung (§ 5.1, § 8.3) auf einer weiteren technologischen Generation. Deutschland und die Europäische Union verbleiben in der Rolle der Bezieher — mit den daraus folgenden geopolitischen und fiskalischen Implikationen für die Veredelungsstrategie unten und für die Teilhabefrage in § 8.3.</w:t>
       </w:r>
     </w:p>
     <w:p>
@@ -8655,6 +8835,88 @@
           <w:i w:val="0"/>
           <w:sz w:val="19"/>
         </w:rPr>
+        <w:t xml:space="preserve">OECD. (7. Juli 2026). </w:t>
+      </w:r>
+      <w:r>
+        <w:rPr>
+          <w:rFonts w:ascii="Arial" w:hAnsi="Arial"/>
+          <w:b w:val="0"/>
+          <w:i/>
+          <w:sz w:val="19"/>
+        </w:rPr>
+        <w:t>OECD Employment Outlook 2026 — Country Note Germany.</w:t>
+      </w:r>
+      <w:r>
+        <w:rPr>
+          <w:rFonts w:ascii="Arial" w:hAnsi="Arial"/>
+          <w:b w:val="0"/>
+          <w:i w:val="0"/>
+          <w:sz w:val="19"/>
+        </w:rPr>
+        <w:t xml:space="preserve"> 6 Seiten. Ländernotiz mit deutschlandbezogener Diagnose zu regionaler Beschäftigungs- und Einkommensspreizung, demografischer Kontraktion und Qualifikationsbedarf. https://www.oecd.org/en/publications/oecd-employment-outlook-2026_7e710f54-en.html</w:t>
+      </w:r>
+    </w:p>
+    <w:p>
+      <w:pPr>
+        <w:jc w:val="both"/>
+      </w:pPr>
+      <w:r>
+        <w:rPr>
+          <w:rFonts w:ascii="Arial" w:hAnsi="Arial"/>
+          <w:b w:val="0"/>
+          <w:i w:val="0"/>
+          <w:sz w:val="19"/>
+        </w:rPr>
+        <w:t xml:space="preserve">OECD. (7. Juli 2026). </w:t>
+      </w:r>
+      <w:r>
+        <w:rPr>
+          <w:rFonts w:ascii="Arial" w:hAnsi="Arial"/>
+          <w:b w:val="0"/>
+          <w:i/>
+          <w:sz w:val="19"/>
+        </w:rPr>
+        <w:t>Non-compete and related agreements: Germany.</w:t>
+      </w:r>
+      <w:r>
+        <w:rPr>
+          <w:rFonts w:ascii="Arial" w:hAnsi="Arial"/>
+          <w:b w:val="0"/>
+          <w:i w:val="0"/>
+          <w:sz w:val="19"/>
+        </w:rPr>
+        <w:t xml:space="preserve"> 8-seitige begleitende Länderdatei zum </w:t>
+      </w:r>
+      <w:r>
+        <w:rPr>
+          <w:rFonts w:ascii="Arial" w:hAnsi="Arial"/>
+          <w:b w:val="0"/>
+          <w:i/>
+          <w:sz w:val="19"/>
+        </w:rPr>
+        <w:t>Employment Outlook 2026</w:t>
+      </w:r>
+      <w:r>
+        <w:rPr>
+          <w:rFonts w:ascii="Arial" w:hAnsi="Arial"/>
+          <w:b w:val="0"/>
+          <w:i w:val="0"/>
+          <w:sz w:val="19"/>
+        </w:rPr>
+        <w:t>; empirische Verbreitung von Non-Compete- und verwandten Nachvertragsbindungen (rund 30 % der Beschäftigten im 15-Länder-Mittel) und Auswirkungen auf Arbeitsmobilität, Innovation, Löhne und Produktivität. https://www.oecd.org/en/publications/oecd-employment-outlook-2026_7e710f54-en.html</w:t>
+      </w:r>
+    </w:p>
+    <w:p>
+      <w:pPr>
+        <w:jc w:val="both"/>
+      </w:pPr>
+      <w:r>
+        <w:rPr>
+          <w:rFonts w:ascii="Arial" w:hAnsi="Arial"/>
+          <w:b w:val="0"/>
+          <w:i w:val="0"/>
+          <w:sz w:val="19"/>
+        </w:rPr>
         <w:t xml:space="preserve">US House of Representatives, 119th Congress. (3. Dezember 2025). </w:t>
       </w:r>
       <w:r>
@@ -11932,6 +12194,74 @@
           <w:i w:val="0"/>
           <w:sz w:val="19"/>
         </w:rPr>
+        <w:t xml:space="preserve">CNBC / Tom's Hardware / The Next Web / Seeking Alpha. (6. Juli 2026). </w:t>
+      </w:r>
+      <w:r>
+        <w:rPr>
+          <w:rFonts w:ascii="Arial" w:hAnsi="Arial"/>
+          <w:b w:val="0"/>
+          <w:i/>
+          <w:sz w:val="19"/>
+        </w:rPr>
+        <w:t>Nvidia's next-gen AI rack system delayed to 2028 on manufacturing snags, SemiAnalysis says / Nvidia's Kyber rack for Rubin Ultra reportedly delayed to 2028, stopgap solution also axed due to customer pushback / Nvidia's Kyber AI rack is delayed to 2028 / Nvidia next-gen 'Kyber' AI rack delayed to 2028 on manufacturing snags: report.</w:t>
+      </w:r>
+      <w:r>
+        <w:rPr>
+          <w:rFonts w:ascii="Arial" w:hAnsi="Arial"/>
+          <w:b w:val="0"/>
+          <w:i w:val="0"/>
+          <w:sz w:val="19"/>
+        </w:rPr>
+        <w:t xml:space="preserve"> Analystenbericht </w:t>
+      </w:r>
+      <w:r>
+        <w:rPr>
+          <w:rFonts w:ascii="Arial" w:hAnsi="Arial"/>
+          <w:b w:val="0"/>
+          <w:i/>
+          <w:sz w:val="19"/>
+        </w:rPr>
+        <w:t>SemiAnalysis</w:t>
+      </w:r>
+      <w:r>
+        <w:rPr>
+          <w:rFonts w:ascii="Arial" w:hAnsi="Arial"/>
+          <w:b w:val="0"/>
+          <w:i w:val="0"/>
+          <w:sz w:val="19"/>
+        </w:rPr>
+        <w:t xml:space="preserve"> zur Verzögerung des NVIDIA-</w:t>
+      </w:r>
+      <w:r>
+        <w:rPr>
+          <w:rFonts w:ascii="Arial" w:hAnsi="Arial"/>
+          <w:b w:val="0"/>
+          <w:i/>
+          <w:sz w:val="19"/>
+        </w:rPr>
+        <w:t>Kyber</w:t>
+      </w:r>
+      <w:r>
+        <w:rPr>
+          <w:rFonts w:ascii="Arial" w:hAnsi="Arial"/>
+          <w:b w:val="0"/>
+          <w:i w:val="0"/>
+          <w:sz w:val="19"/>
+        </w:rPr>
+        <w:t>-Rack-Systems (NVL144 für 144 GPUs pro Rack) für die Rubin-Ultra-Chip-Generation um über zwölf Monate auf 2028 wegen PCB-Midplane-Fertigungsproblemen (78 Lagen, Toleranzen unter 25 μm, Impedanz-Toleranz 5 % für 448-Gb/s-Signalisierung); ablehnende Rückmeldung der Cloud-Kunden zur Notfall-Doppel-Rack-Lösung; laufende Oberon- und Rubin-Racks der aktuellen Generation unverändert für Herbst-Auslieferung an AWS, Microsoft Azure und Google Cloud vorgesehen; Wettbewerbsöffnung für AMD (MI455X, CDNA-5, 2 nm, 432 GB, 40 PFLOPS NVFP4) und Google TPU-Reihe am oberen Marktende. https://www.cnbc.com/2026/07/06/nvidia-kyber-rack-system-delays-manufacturing-taiwan-rubin-chips-.html | https://www.tomshardware.com/pc-components/gpus/nvidias-kyber-rack-for-rubin-ultra-slips-to-2028 | https://thenextweb.com/news/nvidia-kyber-rack-delay-2028 | https://seekingalpha.com/news/4611538-nvidia-next-gen-kyber-ai-rack-delayed-to-2028-on-manufacturing-snags</w:t>
+      </w:r>
+    </w:p>
+    <w:p>
+      <w:pPr>
+        <w:jc w:val="both"/>
+      </w:pPr>
+      <w:r>
+        <w:rPr>
+          <w:rFonts w:ascii="Arial" w:hAnsi="Arial"/>
+          <w:b w:val="0"/>
+          <w:i w:val="0"/>
+          <w:sz w:val="19"/>
+        </w:rPr>
         <w:t xml:space="preserve">Wccftech / TradingKey / TechPowerUp / Introl. (Mai – Juli 2026). </w:t>
       </w:r>
       <w:r>
@@ -11973,7 +12303,7 @@
           <w:i w:val="0"/>
           <w:sz w:val="19"/>
         </w:rPr>
-        <w:t xml:space="preserve"> Dieses Arbeitspapier gibt den Stand Anfang Juli 2026 (Schnitt am 7. Juli 2026 — Lauf 001 vom 7. Juli 2026) wieder. Die Debatte entwickelt sich dynamisch, insbesondere im Zuge der OpenAI-Strategiepapiere und der Eröffnung des OpenAI Workshop in Washington, D.C. im Mai 2026, des Erstdurchgangs des GKV-Beitragssatzstabilisierungsgesetzes in der 1065. Bundesratssitzung am 8. Mai 2026 mit 79 Tagesordnungspunkten (Kabinettsbeschluss 29. April 2026, parlamentarische Behandlung vor der Sommerpause 2026 angekündigt), der laufenden Trilog-Verhandlungen zum Digital Omnibus on AI (zweite Runde 28. April 2026 ohne Einigung; nächste Runde 13. Mai 2026 — Knackpunkt ist nicht die Verschiebung der Hochrisiko-Pflichten, sondern die Konformitätsbewertungs-Architektur für Anhang I; die zypriotische Ratspräsidentschaft strebt einen Abschluss vor Ablauf ihrer Amtszeit am 30. Juni 2026 an, andernfalls übernimmt die irische Präsidentschaft), der am 5. Mai 2026 erfolgten Arraignment-Verhandlung im Altman-Verfahren mit „nicht schuldig"-Plädoyer und angeordneter psychiatrischer Begutachtung, des am 7. Mai 2026 versandten individuellen Microsoft-Buyout-Angebots (Annahmefrist 8. Juni 2026, VRSAR-Unterzeichnung 9.–22. Juni 2026, bis zu fünfjährige Krankenversicherungs-Verlängerung), des am 1. Mai 2026 vom Connecticut-Repräsentantenhaus mit 131 zu 17 Stimmen verabschiedeten </w:t>
+        <w:t xml:space="preserve"> Dieses Arbeitspapier gibt den Stand Anfang Juli 2026 (Schnitt am 8. Juli 2026 — Lauf 001 vom 8. Juli 2026) wieder. Die Debatte entwickelt sich dynamisch, insbesondere im Zuge der OpenAI-Strategiepapiere und der Eröffnung des OpenAI Workshop in Washington, D.C. im Mai 2026, des Erstdurchgangs des GKV-Beitragssatzstabilisierungsgesetzes in der 1065. Bundesratssitzung am 8. Mai 2026 mit 79 Tagesordnungspunkten (Kabinettsbeschluss 29. April 2026, parlamentarische Behandlung vor der Sommerpause 2026 angekündigt), der laufenden Trilog-Verhandlungen zum Digital Omnibus on AI (zweite Runde 28. April 2026 ohne Einigung; nächste Runde 13. Mai 2026 — Knackpunkt ist nicht die Verschiebung der Hochrisiko-Pflichten, sondern die Konformitätsbewertungs-Architektur für Anhang I; die zypriotische Ratspräsidentschaft strebt einen Abschluss vor Ablauf ihrer Amtszeit am 30. Juni 2026 an, andernfalls übernimmt die irische Präsidentschaft), der am 5. Mai 2026 erfolgten Arraignment-Verhandlung im Altman-Verfahren mit „nicht schuldig"-Plädoyer und angeordneter psychiatrischer Begutachtung, des am 7. Mai 2026 versandten individuellen Microsoft-Buyout-Angebots (Annahmefrist 8. Juni 2026, VRSAR-Unterzeichnung 9.–22. Juni 2026, bis zu fünfjährige Krankenversicherungs-Verlängerung), des am 1. Mai 2026 vom Connecticut-Repräsentantenhaus mit 131 zu 17 Stimmen verabschiedeten </w:t>
       </w:r>
       <w:r>
         <w:rPr>
@@ -12423,7 +12753,79 @@
           <w:i w:val="0"/>
           <w:sz w:val="19"/>
         </w:rPr>
-        <w:t xml:space="preserve"> mit Fokus auf regional asymmetrische Anpassungen an KI-/Technologie- und Handelsschocks (Anpassung überwiegend über den Weg in vorübergehende Arbeitslosigkeit und neue Einstiegskohorten; dauerhafte Einkommensnachteile für Verdrängte; Ausbreitung von Non-Compete-Klauseln auf bis zu ein Viertel der Beschäftigten in einigen OECD-Mitgliedsländern; erwerbsfähige Bevölkerung −8 % bis 2060 als Anlass verstärkter Qualifikationspolitik — § 3.5, § 11.3). Eine regelmäßige Aktualisierung ist vorgesehen.</w:t>
+        <w:t xml:space="preserve"> mit Fokus auf regional asymmetrische Anpassungen an KI-/Technologie- und Handelsschocks (Anpassung überwiegend über den Weg in vorübergehende Arbeitslosigkeit und neue Einstiegskohorten; dauerhafte Einkommensnachteile für Verdrängte; Ausbreitung von Non-Compete-Klauseln auf bis zu ein Viertel der Beschäftigten in einigen OECD-Mitgliedsländern; erwerbsfähige Bevölkerung −8 % bis 2060 als Anlass verstärkter Qualifikationspolitik — § 3.5, § 11.3). Lauf 001 vom 8. Juli 2026 ergänzt zwei weitere Fortschreibungen: die am 6. Juli 2026 durch </w:t>
+      </w:r>
+      <w:r>
+        <w:rPr>
+          <w:rFonts w:ascii="Arial" w:hAnsi="Arial"/>
+          <w:b w:val="0"/>
+          <w:i/>
+          <w:sz w:val="19"/>
+        </w:rPr>
+        <w:t>SemiAnalysis</w:t>
+      </w:r>
+      <w:r>
+        <w:rPr>
+          <w:rFonts w:ascii="Arial" w:hAnsi="Arial"/>
+          <w:b w:val="0"/>
+          <w:i w:val="0"/>
+          <w:sz w:val="19"/>
+        </w:rPr>
+        <w:t xml:space="preserve"> (aufgegriffen von CNBC, Tom's Hardware, The Next Web und Seeking Alpha) berichtete Verzögerung des NVIDIA-</w:t>
+      </w:r>
+      <w:r>
+        <w:rPr>
+          <w:rFonts w:ascii="Arial" w:hAnsi="Arial"/>
+          <w:b w:val="0"/>
+          <w:i/>
+          <w:sz w:val="19"/>
+        </w:rPr>
+        <w:t>Kyber</w:t>
+      </w:r>
+      <w:r>
+        <w:rPr>
+          <w:rFonts w:ascii="Arial" w:hAnsi="Arial"/>
+          <w:b w:val="0"/>
+          <w:i w:val="0"/>
+          <w:sz w:val="19"/>
+        </w:rPr>
+        <w:t xml:space="preserve">-Rack-Systems (NVL144) für die Rubin-Ultra-Generation um über zwölf Monate auf 2028 wegen PCB-Midplane-Fertigungsproblemen samt gestrichenem Notfall-Doppel-Rack-Plan und Öffnung für AMD (MI455X, CDNA-5, 432 GB, 40 PFLOPS NVFP4) und Google TPUs am oberen Marktende (§ 8.2); die am 7. Juli 2026 nachgereichten OECD-Länderdateien </w:t>
+      </w:r>
+      <w:r>
+        <w:rPr>
+          <w:rFonts w:ascii="Arial" w:hAnsi="Arial"/>
+          <w:b w:val="0"/>
+          <w:i/>
+          <w:sz w:val="19"/>
+        </w:rPr>
+        <w:t>Employment Outlook 2026 — Country Note Germany</w:t>
+      </w:r>
+      <w:r>
+        <w:rPr>
+          <w:rFonts w:ascii="Arial" w:hAnsi="Arial"/>
+          <w:b w:val="0"/>
+          <w:i w:val="0"/>
+          <w:sz w:val="19"/>
+        </w:rPr>
+        <w:t xml:space="preserve"> (6 Seiten) und </w:t>
+      </w:r>
+      <w:r>
+        <w:rPr>
+          <w:rFonts w:ascii="Arial" w:hAnsi="Arial"/>
+          <w:b w:val="0"/>
+          <w:i/>
+          <w:sz w:val="19"/>
+        </w:rPr>
+        <w:t>Non-compete and related agreements: Germany</w:t>
+      </w:r>
+      <w:r>
+        <w:rPr>
+          <w:rFonts w:ascii="Arial" w:hAnsi="Arial"/>
+          <w:b w:val="0"/>
+          <w:i w:val="0"/>
+          <w:sz w:val="19"/>
+        </w:rPr>
+        <w:t xml:space="preserve"> (8 Seiten, mit dem Befund, dass im 15-Länder-Mittel rund 30 % der Beschäftigten durch Nach-Vertragsbindungen gebunden sind, mit hemmender Wirkung auf Mobilität, Löhne und Produktivität — § 3.5, § 11.3). Eine regelmäßige Aktualisierung ist vorgesehen.</w:t>
       </w:r>
     </w:p>
     <w:p>
@@ -12503,7 +12905,7 @@
         <w:color w:val="999999"/>
         <w:sz w:val="15"/>
       </w:rPr>
-      <w:t>Version 27.0 — Mai 2026 — CC BY 4.0</w:t>
+      <w:t>Version 28.0 — Mai 2026 — CC BY 4.0</w:t>
       <w:tab/>
       <w:t xml:space="preserve">Seite </w:t>
     </w:r>

</xml_diff>

<commit_message>
Daily-Update 2026-07-09 — Version 29.0 (Cluster: I, F)
Zwei belegbare Fortschreibungen aus dem 7-Tage-Fenster 2.–9. Juli 2026:
- § 8.2: DeepMind-Talent-Exodus (Shazeer zu OpenAI; Jumper/Adler/Pritzel zu
  Anthropic) und Verschiebung Gemini 3.5 Pro auf 17.07.2026 nach Vollumbau
  der 2.5-Pro-Basisarchitektur; Alphabet-Marktkap-Einbuße 225–270 Mrd. USD.
  Erweitert die Rohstoff-Analogie um die humane Talent-Bestandsdimension und
  liefert ein Volatilitätsargument gegen bestandsorientierte Umverteilung.
- § 1.1: SkillSyncer-Tracker weist zum 9. Juli 2026 erstmals eine explizite
  KI-Kausalquote aus (150 von 267 Ereignissen = 56 %; 156.270 Personen).

§ 11.5, README.md, Aktualitätshinweis und Validierung-Ergebnisse.md
entsprechend fortgeschrieben. PDF und Word neu erstellt.
</commit_message>
<xml_diff>
--- a/KI-Ökonomie.docx
+++ b/KI-Ökonomie.docx
@@ -112,7 +112,7 @@
           <w:color w:val="666666"/>
           <w:sz w:val="18"/>
         </w:rPr>
-        <w:t>Version 28.0</w:t>
+        <w:t>Version 29.0</w:t>
       </w:r>
     </w:p>
     <w:p>
@@ -472,7 +472,25 @@
           <w:i w:val="0"/>
           <w:sz w:val="19"/>
         </w:rPr>
-        <w:t xml:space="preserve"> seinen Layoff-Tracker zum 5. Juli 2026 auf 185.894 betroffene Beschäftigte aus 267 Layoff-Ereignissen fort (rund 999 Stellen pro Tag; +58.483 gegenüber dem 8. Mai 2026); </w:t>
+        <w:t xml:space="preserve"> seinen Layoff-Tracker zum 5. Juli 2026 auf 185.894 betroffene Beschäftigte aus 267 Layoff-Ereignissen fort (rund 999 Stellen pro Tag; +58.483 gegenüber dem 8. Mai 2026) und dokumentiert zum 9. Juli 2026 erstmals eine explizite Aggregat-Kausalzuschreibung: 150 der 267 Layoff-Ereignisse (56 %) mit rund 156.270 betroffenen Beschäftigten (etwa 84 % der Tracker-Gesamtsumme) werden vom Tracker als KI- oder Automatisierungs­getrieben klassifiziert — die erstmals im Verlauf der Trackerbeobachtung veröffentlichte KI-Kausalquote reduziert das in § 9.1 dokumentierte Attributions­problem auf der Aggregat-Ebene teilweise, bleibt aber unterhalb der administrativen Datenqualität einer WARN-AI-Disclosure nach dem Vorbild von </w:t>
+      </w:r>
+      <w:r>
+        <w:rPr>
+          <w:rFonts w:ascii="Arial" w:hAnsi="Arial"/>
+          <w:b w:val="0"/>
+          <w:i/>
+          <w:sz w:val="19"/>
+        </w:rPr>
+        <w:t>SB 5</w:t>
+      </w:r>
+      <w:r>
+        <w:rPr>
+          <w:rFonts w:ascii="Arial" w:hAnsi="Arial"/>
+          <w:b w:val="0"/>
+          <w:i w:val="0"/>
+          <w:sz w:val="19"/>
+        </w:rPr>
+        <w:t xml:space="preserve"> Connecticut; </w:t>
       </w:r>
       <w:r>
         <w:rPr>
@@ -5613,6 +5631,74 @@
           <w:sz w:val="19"/>
         </w:rPr>
         <w:t>-Racks der laufenden Generation blieben davon unberührt und würden ab Herbst 2026 planmäßig an die Cloud-Partner ausgeliefert. Für die hier geführte Steuerdebatte ist die Verzögerung in zweifacher Hinsicht relevant: Sie untermauert einerseits die These der Rohstoff-Konzentration, weil der Engpass in einer einzigen Lieferkette (78-lagige PCB-Midplane mit Toleranzen unter 25 μm) einen ganzen technologischen Sprung um über ein Jahr verschieben kann; andererseits deutet sich mit dem Aufholpotenzial von AMD und Google eine graduelle Diversifizierung der Anbieterseite an, die die Extremposition einer reinen NVIDIA-Rohstoff-Analogie relativiert. Für die in § 1.1 beschriebene Asymmetrie zwischen Personalreduktion und Capex-Ausbau verdichtet sich das Bild weiter: Die Hardware-Konzentration schreibt die Rohstoff-Analogie fort und stützt die Anknüpfung der Steuerdebatte an Maschinenkapital und Wertschöpfung (§ 5.1, § 8.3) auf einer weiteren technologischen Generation. Deutschland und die Europäische Union verbleiben in der Rolle der Bezieher — mit den daraus folgenden geopolitischen und fiskalischen Implikationen für die Veredelungsstrategie unten und für die Teilhabefrage in § 8.3.</w:t>
+      </w:r>
+    </w:p>
+    <w:p>
+      <w:pPr>
+        <w:jc w:val="both"/>
+      </w:pPr>
+      <w:r>
+        <w:rPr>
+          <w:rFonts w:ascii="Arial" w:hAnsi="Arial"/>
+          <w:b w:val="0"/>
+          <w:i w:val="0"/>
+          <w:sz w:val="19"/>
+        </w:rPr>
+        <w:t xml:space="preserve">Parallel zeigt sich auf der Modell- und Talent-Ebene eine spiegelbildliche Bewegung, die die Marktstruktur der Frontier-Modelle zusätzlich beleuchtet: Nach einer Anfang Juli 2026 aufgegriffenen Berichterstattung (Fortune, BigGo Finance, Bind AI, HackerNoon, The Agent Report) hat Google DeepMind die für Juni 2026 zugesagte Veröffentlichung von </w:t>
+      </w:r>
+      <w:r>
+        <w:rPr>
+          <w:rFonts w:ascii="Arial" w:hAnsi="Arial"/>
+          <w:b w:val="0"/>
+          <w:i/>
+          <w:sz w:val="19"/>
+        </w:rPr>
+        <w:t>Gemini 3.5 Pro</w:t>
+      </w:r>
+      <w:r>
+        <w:rPr>
+          <w:rFonts w:ascii="Arial" w:hAnsi="Arial"/>
+          <w:b w:val="0"/>
+          <w:i w:val="0"/>
+          <w:sz w:val="19"/>
+        </w:rPr>
+        <w:t xml:space="preserve"> auf den 17. Juli 2026 verschoben und die bisherige 2.5-Pro-Basisarchitektur zugunsten eines Vollumbaus verworfen; Alphabet verzeichnete unmittelbar nach Bekanntgabe einen Rückgang der Marktkapitalisierung in Größenordnung von 225 bis 270 Milliarden US-Dollar. Zeitgleich wechselten binnen einer Woche vier zentrale DeepMind-Forscher zu direkten Wettbewerbern — Noam Shazeer, der 2024 mit der Character.ai-Übernahme für rund 2,7 Milliarden US-Dollar zu Google zurückgeholt worden war, zu OpenAI, der Nobelpreisträger John Jumper (AlphaFold) sowie Jonas Adler und Alexander Pritzel zu Anthropic. Für die hier geführte Steuerdebatte ergänzt dieser Vorgang die Rohstoff-Analogie um eine wichtige Nuance: Anders als klassische Rohstoffe hängen die Renten der Frontier-Modelle nicht nur an Compute-, sondern in erheblichem Maße an </w:t>
+      </w:r>
+      <w:r>
+        <w:rPr>
+          <w:rFonts w:ascii="Arial" w:hAnsi="Arial"/>
+          <w:b w:val="0"/>
+          <w:i/>
+          <w:sz w:val="19"/>
+        </w:rPr>
+        <w:t>humanen Talent-Beständen</w:t>
+      </w:r>
+      <w:r>
+        <w:rPr>
+          <w:rFonts w:ascii="Arial" w:hAnsi="Arial"/>
+          <w:b w:val="0"/>
+          <w:i w:val="0"/>
+          <w:sz w:val="19"/>
+        </w:rPr>
+        <w:t xml:space="preserve">, deren Mobilität die geografische Konzentration innerhalb der USA und die Marktbewertung einzelner Anbieter binnen Tagen deutlich verschieben kann; für eine bestandsorientierte Umverteilungslogik nach § 8.3 folgt daraus, dass eine Anknüpfung an aktuelle Marktkapitalisierungen einzelner Frontier-Anbieter (wie sie die Sanders-Vorschläge zum </w:t>
+      </w:r>
+      <w:r>
+        <w:rPr>
+          <w:rFonts w:ascii="Arial" w:hAnsi="Arial"/>
+          <w:b w:val="0"/>
+          <w:i/>
+          <w:sz w:val="19"/>
+        </w:rPr>
+        <w:t>American A.I. Sovereign Wealth Fund Act</w:t>
+      </w:r>
+      <w:r>
+        <w:rPr>
+          <w:rFonts w:ascii="Arial" w:hAnsi="Arial"/>
+          <w:b w:val="0"/>
+          <w:i w:val="0"/>
+          <w:sz w:val="19"/>
+        </w:rPr>
+        <w:t xml:space="preserve"> nahelegen) eine hohe fiskalische Volatilität in Kauf nimmt — ein Argument, das die stabileren wertschöpfungsbezogenen Zugriffe der Deutschland-These (§ 8.3) zusätzlich stützt. Für Deutschland und die Europäische Union unterstreicht der Vorgang zugleich, dass die Talent-Basis der Frontier-Modelle weiterhin nahezu ausschließlich transatlantisch zirkuliert; das Aufholpotenzial europäischer Anbieter (Mistral, Aleph Alpha) bleibt in dieser Metrik strukturell unter dem Niveau der US-amerikanischen Kernanbieter.</w:t>
       </w:r>
     </w:p>
     <w:p>
@@ -12262,6 +12348,88 @@
           <w:i w:val="0"/>
           <w:sz w:val="19"/>
         </w:rPr>
+        <w:t xml:space="preserve">Fortune / BigGo Finance / HackerNoon / Bind AI / The Agent Report. (23. Juni – 8. Juli 2026). </w:t>
+      </w:r>
+      <w:r>
+        <w:rPr>
+          <w:rFonts w:ascii="Arial" w:hAnsi="Arial"/>
+          <w:b w:val="0"/>
+          <w:i/>
+          <w:sz w:val="19"/>
+        </w:rPr>
+        <w:t>As top talent leaves Google DeepMind, some question if the lab can remain at the forefront of AI development / Google Delays Gemini 3.5 Pro Launch to July 17 for Full Architectural Rebuild / Google Delays Gemini 3.5 Pro to July 17: The Strategic Play Behind the Scrapped Base Model / Gemini 3.5 Pro Delayed to July 2026: What Developers Should Know / Google Gemini 3.5 Pro Delayed to July 2026: $225B Wiped Off Alphabet as DeepMind Talent Exodus Deepens.</w:t>
+      </w:r>
+      <w:r>
+        <w:rPr>
+          <w:rFonts w:ascii="Arial" w:hAnsi="Arial"/>
+          <w:b w:val="0"/>
+          <w:i w:val="0"/>
+          <w:sz w:val="19"/>
+        </w:rPr>
+        <w:t xml:space="preserve"> Anfang Juli 2026 aufgegriffene Konsolidierung der DeepMind-Talent-Bewegungen (Noam Shazeer zu OpenAI, John Jumper / Jonas Adler / Alexander Pritzel zu Anthropic) mit einer Marktkapitalisierungs­einbuße von rund 225 bis 270 Mrd. USD und der Verschiebung von </w:t>
+      </w:r>
+      <w:r>
+        <w:rPr>
+          <w:rFonts w:ascii="Arial" w:hAnsi="Arial"/>
+          <w:b w:val="0"/>
+          <w:i/>
+          <w:sz w:val="19"/>
+        </w:rPr>
+        <w:t>Gemini 3.5 Pro</w:t>
+      </w:r>
+      <w:r>
+        <w:rPr>
+          <w:rFonts w:ascii="Arial" w:hAnsi="Arial"/>
+          <w:b w:val="0"/>
+          <w:i w:val="0"/>
+          <w:sz w:val="19"/>
+        </w:rPr>
+        <w:t xml:space="preserve"> zunächst auf den 17. Juli 2026 nach Vollumbau der bisherigen 2.5-Pro-Basisarchitektur (Ziel: Verbesserungen in mathematischem Reasoning, SVG-Generierung, Bildqualität). https://fortune.com/2026/06/23/google-deepmind-ai-researcher-departures-raise-doubts-about-ability-to-win-the-ai-race-shazeer-jumper-eye-on-ai/ | https://finance.biggo.com/news/6f0c6bb2-795f-4c57-9d09-6db691d7638a | https://hackernoon.com/google-delays-gemini-35-pro-to-july-17-the-strategic-play-behind-the-scrapped-base-model | https://blog.getbind.co/gemini-3-5-pro-slips-to-july-and-four-senior-google-researchers-just-left-for-anthropic/ | https://the-agent-report.com/2026/07/google-gemini-3-5-pro-delayed-july-2026/</w:t>
+      </w:r>
+    </w:p>
+    <w:p>
+      <w:pPr>
+        <w:jc w:val="both"/>
+      </w:pPr>
+      <w:r>
+        <w:rPr>
+          <w:rFonts w:ascii="Arial" w:hAnsi="Arial"/>
+          <w:b w:val="0"/>
+          <w:i w:val="0"/>
+          <w:sz w:val="19"/>
+        </w:rPr>
+        <w:t xml:space="preserve">SkillSyncer. (Stand 9. Juli 2026). </w:t>
+      </w:r>
+      <w:r>
+        <w:rPr>
+          <w:rFonts w:ascii="Arial" w:hAnsi="Arial"/>
+          <w:b w:val="0"/>
+          <w:i/>
+          <w:sz w:val="19"/>
+        </w:rPr>
+        <w:t>2026 Tech Layoffs Tracker — 267 Events, 185.894 Workers, 56 % AI-attributed.</w:t>
+      </w:r>
+      <w:r>
+        <w:rPr>
+          <w:rFonts w:ascii="Arial" w:hAnsi="Arial"/>
+          <w:b w:val="0"/>
+          <w:i w:val="0"/>
+          <w:sz w:val="19"/>
+        </w:rPr>
+        <w:t xml:space="preserve"> Aktualisierter Trackerstand mit erstmalig explizit ausgewiesener Aggregat-Kausalzuschreibung: 150 der 267 Layoff-Ereignisse (56 %) mit rund 156.270 betroffenen Beschäftigten (etwa 84 % der Tracker-Gesamtsumme) als KI-/Automatisierungs­getrieben klassifiziert; Durchschnitt rund 978 Stellen pro Tag. https://skillsyncer.com/layoffs-tracker</w:t>
+      </w:r>
+    </w:p>
+    <w:p>
+      <w:pPr>
+        <w:jc w:val="both"/>
+      </w:pPr>
+      <w:r>
+        <w:rPr>
+          <w:rFonts w:ascii="Arial" w:hAnsi="Arial"/>
+          <w:b w:val="0"/>
+          <w:i w:val="0"/>
+          <w:sz w:val="19"/>
+        </w:rPr>
         <w:t xml:space="preserve">Wccftech / TradingKey / TechPowerUp / Introl. (Mai – Juli 2026). </w:t>
       </w:r>
       <w:r>
@@ -12303,7 +12471,7 @@
           <w:i w:val="0"/>
           <w:sz w:val="19"/>
         </w:rPr>
-        <w:t xml:space="preserve"> Dieses Arbeitspapier gibt den Stand Anfang Juli 2026 (Schnitt am 8. Juli 2026 — Lauf 001 vom 8. Juli 2026) wieder. Die Debatte entwickelt sich dynamisch, insbesondere im Zuge der OpenAI-Strategiepapiere und der Eröffnung des OpenAI Workshop in Washington, D.C. im Mai 2026, des Erstdurchgangs des GKV-Beitragssatzstabilisierungsgesetzes in der 1065. Bundesratssitzung am 8. Mai 2026 mit 79 Tagesordnungspunkten (Kabinettsbeschluss 29. April 2026, parlamentarische Behandlung vor der Sommerpause 2026 angekündigt), der laufenden Trilog-Verhandlungen zum Digital Omnibus on AI (zweite Runde 28. April 2026 ohne Einigung; nächste Runde 13. Mai 2026 — Knackpunkt ist nicht die Verschiebung der Hochrisiko-Pflichten, sondern die Konformitätsbewertungs-Architektur für Anhang I; die zypriotische Ratspräsidentschaft strebt einen Abschluss vor Ablauf ihrer Amtszeit am 30. Juni 2026 an, andernfalls übernimmt die irische Präsidentschaft), der am 5. Mai 2026 erfolgten Arraignment-Verhandlung im Altman-Verfahren mit „nicht schuldig"-Plädoyer und angeordneter psychiatrischer Begutachtung, des am 7. Mai 2026 versandten individuellen Microsoft-Buyout-Angebots (Annahmefrist 8. Juni 2026, VRSAR-Unterzeichnung 9.–22. Juni 2026, bis zu fünfjährige Krankenversicherungs-Verlängerung), des am 1. Mai 2026 vom Connecticut-Repräsentantenhaus mit 131 zu 17 Stimmen verabschiedeten </w:t>
+        <w:t xml:space="preserve"> Dieses Arbeitspapier gibt den Stand Anfang Juli 2026 (Schnitt am 9. Juli 2026 — Lauf 001 vom 9. Juli 2026) wieder. Die Debatte entwickelt sich dynamisch, insbesondere im Zuge der OpenAI-Strategiepapiere und der Eröffnung des OpenAI Workshop in Washington, D.C. im Mai 2026, des Erstdurchgangs des GKV-Beitragssatzstabilisierungsgesetzes in der 1065. Bundesratssitzung am 8. Mai 2026 mit 79 Tagesordnungspunkten (Kabinettsbeschluss 29. April 2026, parlamentarische Behandlung vor der Sommerpause 2026 angekündigt), der laufenden Trilog-Verhandlungen zum Digital Omnibus on AI (zweite Runde 28. April 2026 ohne Einigung; nächste Runde 13. Mai 2026 — Knackpunkt ist nicht die Verschiebung der Hochrisiko-Pflichten, sondern die Konformitätsbewertungs-Architektur für Anhang I; die zypriotische Ratspräsidentschaft strebt einen Abschluss vor Ablauf ihrer Amtszeit am 30. Juni 2026 an, andernfalls übernimmt die irische Präsidentschaft), der am 5. Mai 2026 erfolgten Arraignment-Verhandlung im Altman-Verfahren mit „nicht schuldig"-Plädoyer und angeordneter psychiatrischer Begutachtung, des am 7. Mai 2026 versandten individuellen Microsoft-Buyout-Angebots (Annahmefrist 8. Juni 2026, VRSAR-Unterzeichnung 9.–22. Juni 2026, bis zu fünfjährige Krankenversicherungs-Verlängerung), des am 1. Mai 2026 vom Connecticut-Repräsentantenhaus mit 131 zu 17 Stimmen verabschiedeten </w:t>
       </w:r>
       <w:r>
         <w:rPr>
@@ -12825,7 +12993,79 @@
           <w:i w:val="0"/>
           <w:sz w:val="19"/>
         </w:rPr>
-        <w:t xml:space="preserve"> (8 Seiten, mit dem Befund, dass im 15-Länder-Mittel rund 30 % der Beschäftigten durch Nach-Vertragsbindungen gebunden sind, mit hemmender Wirkung auf Mobilität, Löhne und Produktivität — § 3.5, § 11.3). Eine regelmäßige Aktualisierung ist vorgesehen.</w:t>
+        <w:t xml:space="preserve"> (8 Seiten, mit dem Befund, dass im 15-Länder-Mittel rund 30 % der Beschäftigten durch Nach-Vertragsbindungen gebunden sind, mit hemmender Wirkung auf Mobilität, Löhne und Produktivität — § 3.5, § 11.3). Lauf 001 vom 9. Juli 2026 ergänzt zwei weitere Fortschreibungen: die Anfang Juli 2026 konsolidierte Berichterstattung (Fortune, BigGo Finance, Bind AI, HackerNoon, The Agent Report) zur DeepMind-Talent-Abwanderung binnen einer Woche — Noam Shazeer zu OpenAI, John Jumper (AlphaFold-Nobelpreis 2024), Jonas Adler und Alexander Pritzel zu Anthropic — und zur zeitgleichen Verschiebung von </w:t>
+      </w:r>
+      <w:r>
+        <w:rPr>
+          <w:rFonts w:ascii="Arial" w:hAnsi="Arial"/>
+          <w:b w:val="0"/>
+          <w:i/>
+          <w:sz w:val="19"/>
+        </w:rPr>
+        <w:t>Gemini 3.5 Pro</w:t>
+      </w:r>
+      <w:r>
+        <w:rPr>
+          <w:rFonts w:ascii="Arial" w:hAnsi="Arial"/>
+          <w:b w:val="0"/>
+          <w:i w:val="0"/>
+          <w:sz w:val="19"/>
+        </w:rPr>
+        <w:t xml:space="preserve"> auf den 17. Juli 2026 nach Vollumbau der 2.5-Pro-Basisarchitektur bei einer Marktkapitalisierungs­einbuße Alphabets von rund 225 bis 270 Milliarden US-Dollar (§ 8.2 als Ergänzung der Rohstoff-Analogie um die </w:t>
+      </w:r>
+      <w:r>
+        <w:rPr>
+          <w:rFonts w:ascii="Arial" w:hAnsi="Arial"/>
+          <w:b w:val="0"/>
+          <w:i/>
+          <w:sz w:val="19"/>
+        </w:rPr>
+        <w:t>humane Talent-Bestands­dimension</w:t>
+      </w:r>
+      <w:r>
+        <w:rPr>
+          <w:rFonts w:ascii="Arial" w:hAnsi="Arial"/>
+          <w:b w:val="0"/>
+          <w:i w:val="0"/>
+          <w:sz w:val="19"/>
+        </w:rPr>
+        <w:t xml:space="preserve"> und als Volatilitätsargument gegen bestandsorientierte Umverteilungs­ansätze, die an aktuellen Marktkapitalisierungen einzelner Frontier-Anbieter anknüpfen — vgl. § 8.3); sowie die zum 9. Juli 2026 vom Layoff-Tracker </w:t>
+      </w:r>
+      <w:r>
+        <w:rPr>
+          <w:rFonts w:ascii="Arial" w:hAnsi="Arial"/>
+          <w:b w:val="0"/>
+          <w:i/>
+          <w:sz w:val="19"/>
+        </w:rPr>
+        <w:t>SkillSyncer</w:t>
+      </w:r>
+      <w:r>
+        <w:rPr>
+          <w:rFonts w:ascii="Arial" w:hAnsi="Arial"/>
+          <w:b w:val="0"/>
+          <w:i w:val="0"/>
+          <w:sz w:val="19"/>
+        </w:rPr>
+        <w:t xml:space="preserve"> erstmals ausgewiesene explizite Aggregat-Kausalzuschreibung von 150 der 267 Layoff-Ereignisse (56 %) mit rund 156.270 betroffenen Beschäftigten (rund 84 % der Tracker-Gesamtsumme) als KI-/Automatisierungs­getrieben — eine Aggregat-Kausalquote, die das in § 9.1 dokumentierte Attributions­problem auf der Aggregat-Ebene teilweise reduziert, aber unterhalb der administrativen Datenqualität einer WARN-AI-Disclosure nach dem Vorbild von </w:t>
+      </w:r>
+      <w:r>
+        <w:rPr>
+          <w:rFonts w:ascii="Arial" w:hAnsi="Arial"/>
+          <w:b w:val="0"/>
+          <w:i/>
+          <w:sz w:val="19"/>
+        </w:rPr>
+        <w:t>SB 5</w:t>
+      </w:r>
+      <w:r>
+        <w:rPr>
+          <w:rFonts w:ascii="Arial" w:hAnsi="Arial"/>
+          <w:b w:val="0"/>
+          <w:i w:val="0"/>
+          <w:sz w:val="19"/>
+        </w:rPr>
+        <w:t xml:space="preserve"> Connecticut bleibt (§ 1.1, § 11.5). Eine regelmäßige Aktualisierung ist vorgesehen.</w:t>
       </w:r>
     </w:p>
     <w:p>
@@ -12905,7 +13145,7 @@
         <w:color w:val="999999"/>
         <w:sz w:val="15"/>
       </w:rPr>
-      <w:t>Version 28.0 — Mai 2026 — CC BY 4.0</w:t>
+      <w:t>Version 29.0 — Mai 2026 — CC BY 4.0</w:t>
       <w:tab/>
       <w:t xml:space="preserve">Seite </w:t>
     </w:r>

</xml_diff>

<commit_message>
Daily-Update 2026-07-10 — Version 30.0 (Cluster: I, I/D)
§ 8.2: GPT-5.6 public release (Sol/Terra/Luna) am 9. Juli 2026;
Cerebras-Wafer-Scale-Deployment Sol mit 750 Token/s (~10x NVIDIA);
Preise Sol 5/30 USD; US-Vor-Freigabe-Praxis nach AI-Cybersecurity-EO.

§ 4.5: Fable-5-Episode (Anthropic): US-Ausfuhrkontrollen 12. Juni,
weltweite Aussetzung, Redeployment 1. Juli mit CAISI-Klassifikatoren.

§ 11.5: Zwei neue Sammelbelege (GPT-5.6, Fable 5); Aktualitätshinweis
und Version 29.0 -> 30.0 an allen vier Stellen aktualisiert.
</commit_message>
<xml_diff>
--- a/KI-Ökonomie.docx
+++ b/KI-Ökonomie.docx
@@ -112,7 +112,7 @@
           <w:color w:val="666666"/>
           <w:sz w:val="18"/>
         </w:rPr>
-        <w:t>Version 29.0</w:t>
+        <w:t>Version 30.0</w:t>
       </w:r>
     </w:p>
     <w:p>
@@ -3668,6 +3668,173 @@
           <w:i w:val="0"/>
           <w:sz w:val="19"/>
         </w:rPr>
+        <w:t>Frontier-Modell-Exportkontrollen — Fable-5-Episode (Juni/Juli 2026):</w:t>
+      </w:r>
+      <w:r>
+        <w:rPr>
+          <w:rFonts w:ascii="Arial" w:hAnsi="Arial"/>
+          <w:b w:val="0"/>
+          <w:i w:val="0"/>
+          <w:sz w:val="19"/>
+        </w:rPr>
+        <w:t xml:space="preserve"> Eine erste operative Anwendung des im Juni 2026 durch Executive Order etablierten US-Vor-Freigabe-Regimes betrifft Anthropic. Am 12. Juni 2026 hat die US-Regierung Ausfuhrkontrollen auf </w:t>
+      </w:r>
+      <w:r>
+        <w:rPr>
+          <w:rFonts w:ascii="Arial" w:hAnsi="Arial"/>
+          <w:b w:val="0"/>
+          <w:i/>
+          <w:sz w:val="19"/>
+        </w:rPr>
+        <w:t>Claude Fable 5</w:t>
+      </w:r>
+      <w:r>
+        <w:rPr>
+          <w:rFonts w:ascii="Arial" w:hAnsi="Arial"/>
+          <w:b w:val="0"/>
+          <w:i w:val="0"/>
+          <w:sz w:val="19"/>
+        </w:rPr>
+        <w:t xml:space="preserve"> und </w:t>
+      </w:r>
+      <w:r>
+        <w:rPr>
+          <w:rFonts w:ascii="Arial" w:hAnsi="Arial"/>
+          <w:b w:val="0"/>
+          <w:i/>
+          <w:sz w:val="19"/>
+        </w:rPr>
+        <w:t>Claude Mythos 5</w:t>
+      </w:r>
+      <w:r>
+        <w:rPr>
+          <w:rFonts w:ascii="Arial" w:hAnsi="Arial"/>
+          <w:b w:val="0"/>
+          <w:i w:val="0"/>
+          <w:sz w:val="19"/>
+        </w:rPr>
+        <w:t xml:space="preserve"> verhängt, nachdem Amazon-Sicherheitsforschende ein Umgehungsverfahren dokumentiert hatten, mit dem sich Fable 5 zur Identifikation und in einem Einzelfall zur exemplarischen Ausnutzung einer Software-Schwachstelle bewegen ließ. Weil die Kontrollen ausländischen Staatsangehörigen den Zugriff untersagten und eine Nationalitätsprüfung in Echtzeit nicht praktikabel war, hat Anthropic beide Modelle zunächst weltweit ausgesetzt. Nach Aufhebung der Kontrollen am 30. Juni 2026 wurde </w:t>
+      </w:r>
+      <w:r>
+        <w:rPr>
+          <w:rFonts w:ascii="Arial" w:hAnsi="Arial"/>
+          <w:b w:val="0"/>
+          <w:i/>
+          <w:sz w:val="19"/>
+        </w:rPr>
+        <w:t>Fable 5</w:t>
+      </w:r>
+      <w:r>
+        <w:rPr>
+          <w:rFonts w:ascii="Arial" w:hAnsi="Arial"/>
+          <w:b w:val="0"/>
+          <w:i w:val="0"/>
+          <w:sz w:val="19"/>
+        </w:rPr>
+        <w:t xml:space="preserve"> zum 1. Juli 2026 weltweit erneut ausgerollt — nunmehr mit gemeinsam mit dem US Center for AI Safety Institute (CAISI) trainierten Klassifikatoren, die nach Anbieterangaben die dokumentierte Umgehungsroutine in über 99 % der Fälle blockieren, dabei aber eine erhöhte Fehlalarmquote bei regulären Debugging- und Programmierarbeiten aufweisen; auf den kostenpflichtigen Tarifen (</w:t>
+      </w:r>
+      <w:r>
+        <w:rPr>
+          <w:rFonts w:ascii="Arial" w:hAnsi="Arial"/>
+          <w:b w:val="0"/>
+          <w:i/>
+          <w:sz w:val="19"/>
+        </w:rPr>
+        <w:t>Pro</w:t>
+      </w:r>
+      <w:r>
+        <w:rPr>
+          <w:rFonts w:ascii="Arial" w:hAnsi="Arial"/>
+          <w:b w:val="0"/>
+          <w:i w:val="0"/>
+          <w:sz w:val="19"/>
+        </w:rPr>
+        <w:t xml:space="preserve">, </w:t>
+      </w:r>
+      <w:r>
+        <w:rPr>
+          <w:rFonts w:ascii="Arial" w:hAnsi="Arial"/>
+          <w:b w:val="0"/>
+          <w:i/>
+          <w:sz w:val="19"/>
+        </w:rPr>
+        <w:t>Max</w:t>
+      </w:r>
+      <w:r>
+        <w:rPr>
+          <w:rFonts w:ascii="Arial" w:hAnsi="Arial"/>
+          <w:b w:val="0"/>
+          <w:i w:val="0"/>
+          <w:sz w:val="19"/>
+        </w:rPr>
+        <w:t xml:space="preserve">, </w:t>
+      </w:r>
+      <w:r>
+        <w:rPr>
+          <w:rFonts w:ascii="Arial" w:hAnsi="Arial"/>
+          <w:b w:val="0"/>
+          <w:i/>
+          <w:sz w:val="19"/>
+        </w:rPr>
+        <w:t>Team</w:t>
+      </w:r>
+      <w:r>
+        <w:rPr>
+          <w:rFonts w:ascii="Arial" w:hAnsi="Arial"/>
+          <w:b w:val="0"/>
+          <w:i w:val="0"/>
+          <w:sz w:val="19"/>
+        </w:rPr>
+        <w:t xml:space="preserve">, ausgewählte </w:t>
+      </w:r>
+      <w:r>
+        <w:rPr>
+          <w:rFonts w:ascii="Arial" w:hAnsi="Arial"/>
+          <w:b w:val="0"/>
+          <w:i/>
+          <w:sz w:val="19"/>
+        </w:rPr>
+        <w:t>Enterprise</w:t>
+      </w:r>
+      <w:r>
+        <w:rPr>
+          <w:rFonts w:ascii="Arial" w:hAnsi="Arial"/>
+          <w:b w:val="0"/>
+          <w:i w:val="0"/>
+          <w:sz w:val="19"/>
+        </w:rPr>
+        <w:t xml:space="preserve">) blieb </w:t>
+      </w:r>
+      <w:r>
+        <w:rPr>
+          <w:rFonts w:ascii="Arial" w:hAnsi="Arial"/>
+          <w:b w:val="0"/>
+          <w:i/>
+          <w:sz w:val="19"/>
+        </w:rPr>
+        <w:t>Fable 5</w:t>
+      </w:r>
+      <w:r>
+        <w:rPr>
+          <w:rFonts w:ascii="Arial" w:hAnsi="Arial"/>
+          <w:b w:val="0"/>
+          <w:i w:val="0"/>
+          <w:sz w:val="19"/>
+        </w:rPr>
+        <w:t xml:space="preserve"> zunächst bis zum 7., später bis zum 12. Juli 2026 im vollen Kontingent enthalten und wurde danach über Nutzungsguthaben abgerechnet. Für die hier geführte Steuer- und Governance-Debatte ist die Episode relevant, weil sie zeigt, dass die frontier-nahen KI-Anbieter inzwischen in einem Regulierungskontext operieren, in dem US-exekutive Sicherheitsauflagen (Cybersecurity Executive Order, koordinierte Klassifikatoren) den Zugriff auf importierte Modelle unmittelbar einschränken können — mit denselben Rückwirkungen auf europäische Nutzerinnen und Nutzer, wie sie die AI-Act-Konformitätsschritte auf der Angebotsseite auslösen. Der administrative Zugriff auf einen KI-Wertschöpfungsstrang wird damit vorerst stärker exekutiv-sicherheitspolitisch als steuer- oder wettbewerbsrechtlich vermittelt; für die in § 8.3 skizzierten Zugriffspfade heißt das, dass Wertschöpfungsabgabe und Fondslogik zusätzlich robust gegenüber Verfügbarkeitsstörungen der Basismodelle konstruiert werden müssen.</w:t>
+      </w:r>
+    </w:p>
+    <w:p>
+      <w:pPr>
+        <w:jc w:val="both"/>
+      </w:pPr>
+      <w:r>
+        <w:rPr>
+          <w:rFonts w:ascii="Arial" w:hAnsi="Arial"/>
+          <w:b/>
+          <w:i w:val="0"/>
+          <w:sz w:val="19"/>
+        </w:rPr>
         <w:t>Andrew Yang (CNBC-Interview, März 2026):</w:t>
       </w:r>
       <w:r>
@@ -5699,6 +5866,164 @@
           <w:sz w:val="19"/>
         </w:rPr>
         <w:t xml:space="preserve"> nahelegen) eine hohe fiskalische Volatilität in Kauf nimmt — ein Argument, das die stabileren wertschöpfungsbezogenen Zugriffe der Deutschland-These (§ 8.3) zusätzlich stützt. Für Deutschland und die Europäische Union unterstreicht der Vorgang zugleich, dass die Talent-Basis der Frontier-Modelle weiterhin nahezu ausschließlich transatlantisch zirkuliert; das Aufholpotenzial europäischer Anbieter (Mistral, Aleph Alpha) bleibt in dieser Metrik strukturell unter dem Niveau der US-amerikanischen Kernanbieter.</w:t>
+      </w:r>
+    </w:p>
+    <w:p>
+      <w:pPr>
+        <w:jc w:val="both"/>
+      </w:pPr>
+      <w:r>
+        <w:rPr>
+          <w:rFonts w:ascii="Arial" w:hAnsi="Arial"/>
+          <w:b w:val="0"/>
+          <w:i w:val="0"/>
+          <w:sz w:val="19"/>
+        </w:rPr>
+        <w:t xml:space="preserve">Zeitgleich zum DeepMind-Vorgang verdichtet sich ein weiteres Signal an der Modell- und Deployment-Front: Am 9. Juli 2026 hat OpenAI seine im Juni angekündigte </w:t>
+      </w:r>
+      <w:r>
+        <w:rPr>
+          <w:rFonts w:ascii="Arial" w:hAnsi="Arial"/>
+          <w:b w:val="0"/>
+          <w:i/>
+          <w:sz w:val="19"/>
+        </w:rPr>
+        <w:t>GPT-5.6</w:t>
+      </w:r>
+      <w:r>
+        <w:rPr>
+          <w:rFonts w:ascii="Arial" w:hAnsi="Arial"/>
+          <w:b w:val="0"/>
+          <w:i w:val="0"/>
+          <w:sz w:val="19"/>
+        </w:rPr>
+        <w:t xml:space="preserve">-Reihe mit den drei Modellstufen </w:t>
+      </w:r>
+      <w:r>
+        <w:rPr>
+          <w:rFonts w:ascii="Arial" w:hAnsi="Arial"/>
+          <w:b w:val="0"/>
+          <w:i/>
+          <w:sz w:val="19"/>
+        </w:rPr>
+        <w:t>Sol</w:t>
+      </w:r>
+      <w:r>
+        <w:rPr>
+          <w:rFonts w:ascii="Arial" w:hAnsi="Arial"/>
+          <w:b w:val="0"/>
+          <w:i w:val="0"/>
+          <w:sz w:val="19"/>
+        </w:rPr>
+        <w:t xml:space="preserve">, </w:t>
+      </w:r>
+      <w:r>
+        <w:rPr>
+          <w:rFonts w:ascii="Arial" w:hAnsi="Arial"/>
+          <w:b w:val="0"/>
+          <w:i/>
+          <w:sz w:val="19"/>
+        </w:rPr>
+        <w:t>Terra</w:t>
+      </w:r>
+      <w:r>
+        <w:rPr>
+          <w:rFonts w:ascii="Arial" w:hAnsi="Arial"/>
+          <w:b w:val="0"/>
+          <w:i w:val="0"/>
+          <w:sz w:val="19"/>
+        </w:rPr>
+        <w:t xml:space="preserve"> und </w:t>
+      </w:r>
+      <w:r>
+        <w:rPr>
+          <w:rFonts w:ascii="Arial" w:hAnsi="Arial"/>
+          <w:b w:val="0"/>
+          <w:i/>
+          <w:sz w:val="19"/>
+        </w:rPr>
+        <w:t>Luna</w:t>
+      </w:r>
+      <w:r>
+        <w:rPr>
+          <w:rFonts w:ascii="Arial" w:hAnsi="Arial"/>
+          <w:b w:val="0"/>
+          <w:i w:val="0"/>
+          <w:sz w:val="19"/>
+        </w:rPr>
+        <w:t xml:space="preserve"> für die Öffentlichkeit freigegeben, nachdem eine erste Preview-Kohorte am 26. Juni 2026 angelaufen war. Die Spitzenstufe </w:t>
+      </w:r>
+      <w:r>
+        <w:rPr>
+          <w:rFonts w:ascii="Arial" w:hAnsi="Arial"/>
+          <w:b w:val="0"/>
+          <w:i/>
+          <w:sz w:val="19"/>
+        </w:rPr>
+        <w:t>Sol</w:t>
+      </w:r>
+      <w:r>
+        <w:rPr>
+          <w:rFonts w:ascii="Arial" w:hAnsi="Arial"/>
+          <w:b w:val="0"/>
+          <w:i w:val="0"/>
+          <w:sz w:val="19"/>
+        </w:rPr>
+        <w:t xml:space="preserve"> wird nach Herstellerangaben und übereinstimmender Fachberichterstattung (Nextgov, Engadget, BigGo Finance, Value Add Pulse, techjacksolutions) im Juli 2026 zusätzlich auf Cerebras-Wafer-Scale-Hardware ausgerollt und erreicht dort Inferenzgeschwindigkeiten von bis zu 750 Token pro Sekunde — etwa das Zehnfache typischer NVIDIA-GPU-Deployments produktiver Frontier-Modelle. Die Standard-API-Preise (Sol 5 US-Dollar pro Million Input-Token, 30 US-Dollar pro Million Output-Token; Cache-Reads 0,50 US-Dollar; </w:t>
+      </w:r>
+      <w:r>
+        <w:rPr>
+          <w:rFonts w:ascii="Arial" w:hAnsi="Arial"/>
+          <w:b w:val="0"/>
+          <w:i/>
+          <w:sz w:val="19"/>
+        </w:rPr>
+        <w:t>Terra</w:t>
+      </w:r>
+      <w:r>
+        <w:rPr>
+          <w:rFonts w:ascii="Arial" w:hAnsi="Arial"/>
+          <w:b w:val="0"/>
+          <w:i w:val="0"/>
+          <w:sz w:val="19"/>
+        </w:rPr>
+        <w:t xml:space="preserve"> mit annähernder GPT-5.5-Leistung zum halben Sol-Satz; </w:t>
+      </w:r>
+      <w:r>
+        <w:rPr>
+          <w:rFonts w:ascii="Arial" w:hAnsi="Arial"/>
+          <w:b w:val="0"/>
+          <w:i/>
+          <w:sz w:val="19"/>
+        </w:rPr>
+        <w:t>Luna</w:t>
+      </w:r>
+      <w:r>
+        <w:rPr>
+          <w:rFonts w:ascii="Arial" w:hAnsi="Arial"/>
+          <w:b w:val="0"/>
+          <w:i w:val="0"/>
+          <w:sz w:val="19"/>
+        </w:rPr>
+        <w:t xml:space="preserve"> als preisgünstigste Stufe) untermauern die in diesem Kapitel referierte Preis­deflation an der Inferenzfront, ohne die geografische Konzentration der Modellproduktion aufzuheben. Institutionell ist der Vorgang bemerkenswert, weil OpenAI die Modelle Ende Juni 2026 zunächst einem „kleinen Kreis vertrauenswürdiger Partner" zugänglich gemacht und die öffentliche Freigabe von einer Zustimmung der US-Bundesregierung abhängig gemacht hätte: Eine im Juni 2026 unterzeichnete AI-Cybersecurity-Executive-Order fordert die Anbieter der leistungsfähigsten Modelle auf, diese der Bundesregierung mindestens dreißig Tage vor der öffentlichen Freigabe zur sicherheitsbezogenen Überprüfung vorzulegen. Für die in § 4.5 verortete Governance-Debatte folgt daraus, dass sich neben der europäischen AI-Act-Regulierung eine informelle </w:t>
+      </w:r>
+      <w:r>
+        <w:rPr>
+          <w:rFonts w:ascii="Arial" w:hAnsi="Arial"/>
+          <w:b w:val="0"/>
+          <w:i/>
+          <w:sz w:val="19"/>
+        </w:rPr>
+        <w:t>US-Vor-Freigabe-Praxis</w:t>
+      </w:r>
+      <w:r>
+        <w:rPr>
+          <w:rFonts w:ascii="Arial" w:hAnsi="Arial"/>
+          <w:b w:val="0"/>
+          <w:i w:val="0"/>
+          <w:sz w:val="19"/>
+        </w:rPr>
+        <w:t xml:space="preserve"> etabliert, in der Frontier-Anbieter und US-Regierung einen sicherheitsbezogenen Vorlauf koordinieren — mit unmittelbarer Rückwirkung auf die Verfügbarkeit importierter KI-Modelle in europäischen Anwendungen und damit auf die von der Deutschland-These (§ 8.3) unterstellten stabilen Zugriffspfade auf inländische KI-Wertschöpfung.</w:t>
       </w:r>
     </w:p>
     <w:p>
@@ -12458,6 +12783,70 @@
       <w:r>
         <w:rPr>
           <w:rFonts w:ascii="Arial" w:hAnsi="Arial"/>
+          <w:b w:val="0"/>
+          <w:i w:val="0"/>
+          <w:sz w:val="19"/>
+        </w:rPr>
+        <w:t xml:space="preserve">OpenAI / Nextgov / Engadget / BigGo Finance / Value Add Pulse / techjacksolutions / Coursiv. (9. Juli 2026 und Folgeberichterstattung). </w:t>
+      </w:r>
+      <w:r>
+        <w:rPr>
+          <w:rFonts w:ascii="Arial" w:hAnsi="Arial"/>
+          <w:b w:val="0"/>
+          <w:i/>
+          <w:sz w:val="19"/>
+        </w:rPr>
+        <w:t>Previewing GPT-5.6 Sol: a next-generation model / OpenAI's advanced GPT-5.6 models to be publicly released / OpenAI gets permission to roll out GPT-5.6 to the public on July 9 / GPT-5.6 Sol Debuts Tomorrow: Inference Speed Hits 750 Tokens/s as Cerebras Pours Billions into European Expansion / Cerebras Runs OpenAI GPT-5.6 Sol at 750 Tokens per Second, Setting a New Frontier-Model Speed Record / GPT-5.6 Pricing (2026): Sol, Terra &amp; Luna API Costs / OpenAI GPT-5.6 Sol: ChatGPT Release Date, Price &amp; Review.</w:t>
+      </w:r>
+      <w:r>
+        <w:rPr>
+          <w:rFonts w:ascii="Arial" w:hAnsi="Arial"/>
+          <w:b w:val="0"/>
+          <w:i w:val="0"/>
+          <w:sz w:val="19"/>
+        </w:rPr>
+        <w:t xml:space="preserve"> Public Release der GPT-5.6-Reihe zum 9. Juli 2026 mit drei Modellstufen (Sol, Terra, Luna) nach vorheriger Preview-Kohorte ab 26. Juni 2026; Cerebras-Wafer-Scale-Deployment der Spitzenstufe Sol mit bis zu 750 Token pro Sekunde (rund zehnfach gegenüber typischer NVIDIA-GPU-Inferenz); Standard-API-Preise Sol 5 USD / 30 USD pro Million Input/Output-Token, Cache-Read 0,50 USD; Freigabe an einen 30-Tage-Sicherheitsvorlauf durch das White House gebunden (AI-Cybersecurity-Executive-Order, Juni 2026). https://openai.com/index/previewing-gpt-5-6-sol/ | https://www.nextgov.com/artificial-intelligence/2026/07/openais-advanced-gpt-56-models-be-available-public/414651/ | https://www.engadget.com/2210308/openai-rolls-out-gpt5-6-july-9/ | https://finance.biggo.com/news/8891f78a-c330-4652-bf49-ee1c3204e108 | https://valueaddvc.com/pulse/cerebras-openai-gpt-5-6-sol-750-tokens-2026 | https://techjacksolutions.com/ai-tools/chatgpt/gpt-5-6-pricing/ | https://coursiv.io/blog/chatgpt-5-6-sol</w:t>
+      </w:r>
+    </w:p>
+    <w:p>
+      <w:pPr>
+        <w:jc w:val="both"/>
+      </w:pPr>
+      <w:r>
+        <w:rPr>
+          <w:rFonts w:ascii="Arial" w:hAnsi="Arial"/>
+          <w:b w:val="0"/>
+          <w:i w:val="0"/>
+          <w:sz w:val="19"/>
+        </w:rPr>
+        <w:t xml:space="preserve">Anthropic / The New Stack / Gizmodo / Forbes / ExplainX. (30. Juni – 12. Juli 2026). </w:t>
+      </w:r>
+      <w:r>
+        <w:rPr>
+          <w:rFonts w:ascii="Arial" w:hAnsi="Arial"/>
+          <w:b w:val="0"/>
+          <w:i/>
+          <w:sz w:val="19"/>
+        </w:rPr>
+        <w:t>Redeploying Claude Fable 5 / How Anthropic is bringing Fable 5 back — and when it'll cost you / Claude Fable 5 Will Be Back Online Wednesday, Anthropic Says / Claude Fable 5 Extends By Five More Days. 10 Moves To Make Now / Fable 5 Is Available Again — Ban Lifted July 1, 2026.</w:t>
+      </w:r>
+      <w:r>
+        <w:rPr>
+          <w:rFonts w:ascii="Arial" w:hAnsi="Arial"/>
+          <w:b w:val="0"/>
+          <w:i w:val="0"/>
+          <w:sz w:val="19"/>
+        </w:rPr>
+        <w:t xml:space="preserve"> Ausfuhrkontrollen der US-Regierung auf Claude Fable 5 und Claude Mythos 5 vom 12. Juni 2026 nach Amazon-Sicherheitsbericht zur Umgehung eines Fable-5-Safeguards; weltweite Aussetzung durch Anthropic bis 30. Juni 2026; Redeployment ab 1. Juli 2026 mit gemeinsam mit CAISI trainierten Klassifikatoren (&gt;99 % Blockade der dokumentierten Umgehung, erhöhte Fehlalarmquote auf regulären Debugging-/Programmier-Prompts); Kontingent-Verlängerung auf kostenpflichtigen Tarifen bis 12. Juli 2026. Beleg für die exekutiv-sicherheitspolitische Vermittlung des Zugriffs auf importierte Frontier-Modelle (§ 4.5). https://www.anthropic.com/news/redeploying-fable-5 | https://thenewstack.io/how-anthropic-is-bringing-fable-5-back/ | https://gizmodo.com/claude-fable-5-will-be-back-online-wednesday-anthropic-says-2000779882 | https://www.forbes.com/sites/sandycarter/2026/07/07/claude-fable-5-extends-by-five-more-days-10-moves-to-make-now/ | https://explainx.ai/blog/is-fable-5-back-2026</w:t>
+      </w:r>
+    </w:p>
+    <w:p>
+      <w:pPr>
+        <w:jc w:val="both"/>
+      </w:pPr>
+      <w:r>
+        <w:rPr>
+          <w:rFonts w:ascii="Arial" w:hAnsi="Arial"/>
           <w:b/>
           <w:i w:val="0"/>
           <w:sz w:val="19"/>
@@ -12471,7 +12860,7 @@
           <w:i w:val="0"/>
           <w:sz w:val="19"/>
         </w:rPr>
-        <w:t xml:space="preserve"> Dieses Arbeitspapier gibt den Stand Anfang Juli 2026 (Schnitt am 9. Juli 2026 — Lauf 001 vom 9. Juli 2026) wieder. Die Debatte entwickelt sich dynamisch, insbesondere im Zuge der OpenAI-Strategiepapiere und der Eröffnung des OpenAI Workshop in Washington, D.C. im Mai 2026, des Erstdurchgangs des GKV-Beitragssatzstabilisierungsgesetzes in der 1065. Bundesratssitzung am 8. Mai 2026 mit 79 Tagesordnungspunkten (Kabinettsbeschluss 29. April 2026, parlamentarische Behandlung vor der Sommerpause 2026 angekündigt), der laufenden Trilog-Verhandlungen zum Digital Omnibus on AI (zweite Runde 28. April 2026 ohne Einigung; nächste Runde 13. Mai 2026 — Knackpunkt ist nicht die Verschiebung der Hochrisiko-Pflichten, sondern die Konformitätsbewertungs-Architektur für Anhang I; die zypriotische Ratspräsidentschaft strebt einen Abschluss vor Ablauf ihrer Amtszeit am 30. Juni 2026 an, andernfalls übernimmt die irische Präsidentschaft), der am 5. Mai 2026 erfolgten Arraignment-Verhandlung im Altman-Verfahren mit „nicht schuldig"-Plädoyer und angeordneter psychiatrischer Begutachtung, des am 7. Mai 2026 versandten individuellen Microsoft-Buyout-Angebots (Annahmefrist 8. Juni 2026, VRSAR-Unterzeichnung 9.–22. Juni 2026, bis zu fünfjährige Krankenversicherungs-Verlängerung), des am 1. Mai 2026 vom Connecticut-Repräsentantenhaus mit 131 zu 17 Stimmen verabschiedeten </w:t>
+        <w:t xml:space="preserve"> Dieses Arbeitspapier gibt den Stand Anfang Juli 2026 (Schnitt am 10. Juli 2026 — Lauf 001 vom 10. Juli 2026) wieder. Die Debatte entwickelt sich dynamisch, insbesondere im Zuge der OpenAI-Strategiepapiere und der Eröffnung des OpenAI Workshop in Washington, D.C. im Mai 2026, des Erstdurchgangs des GKV-Beitragssatzstabilisierungsgesetzes in der 1065. Bundesratssitzung am 8. Mai 2026 mit 79 Tagesordnungspunkten (Kabinettsbeschluss 29. April 2026, parlamentarische Behandlung vor der Sommerpause 2026 angekündigt), der laufenden Trilog-Verhandlungen zum Digital Omnibus on AI (zweite Runde 28. April 2026 ohne Einigung; nächste Runde 13. Mai 2026 — Knackpunkt ist nicht die Verschiebung der Hochrisiko-Pflichten, sondern die Konformitätsbewertungs-Architektur für Anhang I; die zypriotische Ratspräsidentschaft strebt einen Abschluss vor Ablauf ihrer Amtszeit am 30. Juni 2026 an, andernfalls übernimmt die irische Präsidentschaft), der am 5. Mai 2026 erfolgten Arraignment-Verhandlung im Altman-Verfahren mit „nicht schuldig"-Plädoyer und angeordneter psychiatrischer Begutachtung, des am 7. Mai 2026 versandten individuellen Microsoft-Buyout-Angebots (Annahmefrist 8. Juni 2026, VRSAR-Unterzeichnung 9.–22. Juni 2026, bis zu fünfjährige Krankenversicherungs-Verlängerung), des am 1. Mai 2026 vom Connecticut-Repräsentantenhaus mit 131 zu 17 Stimmen verabschiedeten </w:t>
       </w:r>
       <w:r>
         <w:rPr>
@@ -13065,7 +13454,151 @@
           <w:i w:val="0"/>
           <w:sz w:val="19"/>
         </w:rPr>
-        <w:t xml:space="preserve"> Connecticut bleibt (§ 1.1, § 11.5). Eine regelmäßige Aktualisierung ist vorgesehen.</w:t>
+        <w:t xml:space="preserve"> Connecticut bleibt (§ 1.1, § 11.5). Lauf 001 vom 10. Juli 2026 ergänzt zwei weitere Fortschreibungen: die öffentliche Freigabe der </w:t>
+      </w:r>
+      <w:r>
+        <w:rPr>
+          <w:rFonts w:ascii="Arial" w:hAnsi="Arial"/>
+          <w:b w:val="0"/>
+          <w:i/>
+          <w:sz w:val="19"/>
+        </w:rPr>
+        <w:t>OpenAI-GPT-5.6</w:t>
+      </w:r>
+      <w:r>
+        <w:rPr>
+          <w:rFonts w:ascii="Arial" w:hAnsi="Arial"/>
+          <w:b w:val="0"/>
+          <w:i w:val="0"/>
+          <w:sz w:val="19"/>
+        </w:rPr>
+        <w:t xml:space="preserve">-Reihe (Modellstufen </w:t>
+      </w:r>
+      <w:r>
+        <w:rPr>
+          <w:rFonts w:ascii="Arial" w:hAnsi="Arial"/>
+          <w:b w:val="0"/>
+          <w:i/>
+          <w:sz w:val="19"/>
+        </w:rPr>
+        <w:t>Sol</w:t>
+      </w:r>
+      <w:r>
+        <w:rPr>
+          <w:rFonts w:ascii="Arial" w:hAnsi="Arial"/>
+          <w:b w:val="0"/>
+          <w:i w:val="0"/>
+          <w:sz w:val="19"/>
+        </w:rPr>
+        <w:t xml:space="preserve">, </w:t>
+      </w:r>
+      <w:r>
+        <w:rPr>
+          <w:rFonts w:ascii="Arial" w:hAnsi="Arial"/>
+          <w:b w:val="0"/>
+          <w:i/>
+          <w:sz w:val="19"/>
+        </w:rPr>
+        <w:t>Terra</w:t>
+      </w:r>
+      <w:r>
+        <w:rPr>
+          <w:rFonts w:ascii="Arial" w:hAnsi="Arial"/>
+          <w:b w:val="0"/>
+          <w:i w:val="0"/>
+          <w:sz w:val="19"/>
+        </w:rPr>
+        <w:t xml:space="preserve">, </w:t>
+      </w:r>
+      <w:r>
+        <w:rPr>
+          <w:rFonts w:ascii="Arial" w:hAnsi="Arial"/>
+          <w:b w:val="0"/>
+          <w:i/>
+          <w:sz w:val="19"/>
+        </w:rPr>
+        <w:t>Luna</w:t>
+      </w:r>
+      <w:r>
+        <w:rPr>
+          <w:rFonts w:ascii="Arial" w:hAnsi="Arial"/>
+          <w:b w:val="0"/>
+          <w:i w:val="0"/>
+          <w:sz w:val="19"/>
+        </w:rPr>
+        <w:t xml:space="preserve">) am 9. Juli 2026 nach vorheriger Preview-Kohorte ab 26. Juni 2026 und einer 30-tägigen Sicherheitsvor­prüfung durch die US-Bundesregierung (AI-Cybersecurity-Executive-Order Juni 2026); Cerebras-Wafer-Scale-Deployment der Spitzenstufe </w:t>
+      </w:r>
+      <w:r>
+        <w:rPr>
+          <w:rFonts w:ascii="Arial" w:hAnsi="Arial"/>
+          <w:b w:val="0"/>
+          <w:i/>
+          <w:sz w:val="19"/>
+        </w:rPr>
+        <w:t>Sol</w:t>
+      </w:r>
+      <w:r>
+        <w:rPr>
+          <w:rFonts w:ascii="Arial" w:hAnsi="Arial"/>
+          <w:b w:val="0"/>
+          <w:i w:val="0"/>
+          <w:sz w:val="19"/>
+        </w:rPr>
+        <w:t xml:space="preserve"> mit bis zu 750 Token pro Sekunde (rund zehnfach gegenüber typischer NVIDIA-GPU-Inferenz produktiver Frontier-Modelle) und Standard-API-Preise Sol 5/30 US-Dollar pro Million Input-/Output-Token; für § 8.2 als Fortschreibung der deflationären Preisdynamik und für § 4.5 als Beleg einer sich etablierenden </w:t>
+      </w:r>
+      <w:r>
+        <w:rPr>
+          <w:rFonts w:ascii="Arial" w:hAnsi="Arial"/>
+          <w:b w:val="0"/>
+          <w:i/>
+          <w:sz w:val="19"/>
+        </w:rPr>
+        <w:t>US-Vor-Freigabe-Praxis</w:t>
+      </w:r>
+      <w:r>
+        <w:rPr>
+          <w:rFonts w:ascii="Arial" w:hAnsi="Arial"/>
+          <w:b w:val="0"/>
+          <w:i w:val="0"/>
+          <w:sz w:val="19"/>
+        </w:rPr>
+        <w:t xml:space="preserve"> aufgenommen; sowie die Fable-5-Episode (Anthropic): Ausfuhrkontrollen der US-Regierung vom 12. Juni 2026 auf </w:t>
+      </w:r>
+      <w:r>
+        <w:rPr>
+          <w:rFonts w:ascii="Arial" w:hAnsi="Arial"/>
+          <w:b w:val="0"/>
+          <w:i/>
+          <w:sz w:val="19"/>
+        </w:rPr>
+        <w:t>Claude Fable 5</w:t>
+      </w:r>
+      <w:r>
+        <w:rPr>
+          <w:rFonts w:ascii="Arial" w:hAnsi="Arial"/>
+          <w:b w:val="0"/>
+          <w:i w:val="0"/>
+          <w:sz w:val="19"/>
+        </w:rPr>
+        <w:t xml:space="preserve"> und </w:t>
+      </w:r>
+      <w:r>
+        <w:rPr>
+          <w:rFonts w:ascii="Arial" w:hAnsi="Arial"/>
+          <w:b w:val="0"/>
+          <w:i/>
+          <w:sz w:val="19"/>
+        </w:rPr>
+        <w:t>Claude Mythos 5</w:t>
+      </w:r>
+      <w:r>
+        <w:rPr>
+          <w:rFonts w:ascii="Arial" w:hAnsi="Arial"/>
+          <w:b w:val="0"/>
+          <w:i w:val="0"/>
+          <w:sz w:val="19"/>
+        </w:rPr>
+        <w:t xml:space="preserve"> nach dokumentiertem Amazon-Umgehungsverfahren, weltweite Aussetzung durch Anthropic, Redeployment ab 1. Juli 2026 mit gemeinsam mit dem US Center for AI Safety Institute (CAISI) trainierten Klassifikatoren (&gt;99 % Blockade der Umgehungsroutine, erhöhte Fehlalarmquote auf regulären Debugging-/Programmier-Prompts); Kontingent-Verlängerung auf kostenpflichtigen Tarifen bis 12. Juli 2026 — Aufnahme in § 4.5 (US-Vor-Freigabe-Regime, exekutiv-sicherheitspolitische Vermittlung des Zugriffs auf Frontier-Modelle) und Rückwirkung auf § 8.3 (Robustheits­anforderungen an Wertschöpfungsabgabe und Fondslogik gegenüber Verfügbarkeits­störungen der Basismodelle). Eine regelmäßige Aktualisierung ist vorgesehen.</w:t>
       </w:r>
     </w:p>
     <w:p>
@@ -13145,7 +13678,7 @@
         <w:color w:val="999999"/>
         <w:sz w:val="15"/>
       </w:rPr>
-      <w:t>Version 29.0 — Mai 2026 — CC BY 4.0</w:t>
+      <w:t>Version 30.0 — Mai 2026 — CC BY 4.0</w:t>
       <w:tab/>
       <w:t xml:space="preserve">Seite </w:t>
     </w:r>

</xml_diff>

<commit_message>
Daily-Update 2026-07-11 — Version 31.0 (Cluster: B, I)
- § 4.4: KI-MIG-Absatz aktualisiert (Bundesrat 10.07. Passage; Vermittlungsausschuss ohne Mehrheit; Bundesnetzagentur-Rolle konkretisiert inkl. KI-Reallabor-Auftrag)
- § 8.2: Neuer Absatz zu Meta Muse Spark 1.1 (Freigabe 09.07., 1-Mio-Token-Kontext, Preis 1,25/4,25 USD/M)
- § 11.3 Bundesrat-Eintrag aktualisiert, § 11.5 neuer Sammelbeleg Meta
- Aktualitätshinweis am Dokumentende ergänzt
- README.md und Validierung-Ergebnisse.md 30.0 -> 31.0
- Neuer Änderungshistorie-Block; neuer Validierungs­block; PDF und DOCX neu gebaut
</commit_message>
<xml_diff>
--- a/KI-Ökonomie.docx
+++ b/KI-Ökonomie.docx
@@ -112,7 +112,7 @@
           <w:color w:val="666666"/>
           <w:sz w:val="18"/>
         </w:rPr>
-        <w:t>Version 30.0</w:t>
+        <w:t>Version 31.0</w:t>
       </w:r>
     </w:p>
     <w:p>
@@ -2676,7 +2676,7 @@
           <w:i w:val="0"/>
           <w:sz w:val="19"/>
         </w:rPr>
-        <w:t xml:space="preserve"> (KI-MIG) beschlossen, das die Bundesnetzagentur zur zentralen Marktüberwachungsbehörde für den Bund benennt und der Datenschutzaufsicht die Zuständigkeit für die grundrechtssensiblen Bereiche zuweist. Der Bundesrat berät am 10. Juli 2026 in seiner 1067. Sitzung über den Gesetzestext. Der </w:t>
+        <w:t xml:space="preserve"> (KI-MIG) beschlossen, das die Bundesnetzagentur zur zentralen Marktüberwachungsbehörde für den Bund benennt und der Datenschutzaufsicht die Zuständigkeit für die grundrechtssensiblen Bereiche zuweist. In seiner 1067. Sitzung am 10. Juli 2026 hat der Bundesrat das KI-MIG passieren lassen; der Antrag, den </w:t>
       </w:r>
       <w:r>
         <w:rPr>
@@ -2685,6 +2685,24 @@
           <w:i/>
           <w:sz w:val="19"/>
         </w:rPr>
+        <w:t>Vermittlungsausschuss</w:t>
+      </w:r>
+      <w:r>
+        <w:rPr>
+          <w:rFonts w:ascii="Arial" w:hAnsi="Arial"/>
+          <w:b w:val="0"/>
+          <w:i w:val="0"/>
+          <w:sz w:val="19"/>
+        </w:rPr>
+        <w:t xml:space="preserve"> anzurufen, den der </w:t>
+      </w:r>
+      <w:r>
+        <w:rPr>
+          <w:rFonts w:ascii="Arial" w:hAnsi="Arial"/>
+          <w:b w:val="0"/>
+          <w:i/>
+          <w:sz w:val="19"/>
+        </w:rPr>
         <w:t>Ausschuss für Digitalisierung und Staatsmodernisierung</w:t>
       </w:r>
       <w:r>
@@ -2694,7 +2712,7 @@
           <w:i w:val="0"/>
           <w:sz w:val="19"/>
         </w:rPr>
-        <w:t xml:space="preserve"> hat am 30. Juni 2026 empfohlen, den </w:t>
+        <w:t xml:space="preserve"> am 30. Juni 2026 empfohlen hatte („grundlegende Überarbeitung" zur Beseitigung einer aus Ausschusssicht drohenden </w:t>
       </w:r>
       <w:r>
         <w:rPr>
@@ -2703,16 +2721,16 @@
           <w:i/>
           <w:sz w:val="19"/>
         </w:rPr>
-        <w:t>Vermittlungsausschuss</w:t>
-      </w:r>
-      <w:r>
-        <w:rPr>
-          <w:rFonts w:ascii="Arial" w:hAnsi="Arial"/>
-          <w:b w:val="0"/>
-          <w:i w:val="0"/>
-          <w:sz w:val="19"/>
-        </w:rPr>
-        <w:t xml:space="preserve"> anzurufen, um das Gesetz „grundlegend zu überarbeiten"; kritisiert wird primär, dass die Marktüberwachung durch die Bundesnetzagentur nur für den Bundes-Bereich vorgesehen ist, während KI-Anwendungen in Länder- und Kommunalverwaltungen den jeweiligen Ländern überlassen bleiben — der Ausschuss sieht darin die Gefahr einer </w:t>
+        <w:t>Zersplitterung der Marktüberwachung</w:t>
+      </w:r>
+      <w:r>
+        <w:rPr>
+          <w:rFonts w:ascii="Arial" w:hAnsi="Arial"/>
+          <w:b w:val="0"/>
+          <w:i w:val="0"/>
+          <w:sz w:val="19"/>
+        </w:rPr>
+        <w:t xml:space="preserve"> zwischen Bundesnetzagentur und Ländern), fand im Plenum keine Mehrheit. Das Gesetz kann damit ohne weiteres parlamentarisches Verfahren in Kraft treten. Nach der beschlossenen Fassung übernimmt die Bundesnetzagentur die Rolle einer zentralen Marktüberwachungs- und Anlaufstelle mit Koordinierungs- und Kompetenzzentrum, gebündelter KI-Expertise gegenüber anderen Behörden, zentraler Beschwerdestelle für Bürgerinnen und Bürger und dem Auftrag, mindestens ein KI-</w:t>
       </w:r>
       <w:r>
         <w:rPr>
@@ -2721,16 +2739,16 @@
           <w:i/>
           <w:sz w:val="19"/>
         </w:rPr>
-        <w:t>Zersplitterung der Marktüberwachung</w:t>
-      </w:r>
-      <w:r>
-        <w:rPr>
-          <w:rFonts w:ascii="Arial" w:hAnsi="Arial"/>
-          <w:b w:val="0"/>
-          <w:i w:val="0"/>
-          <w:sz w:val="19"/>
-        </w:rPr>
-        <w:t>, unklarer Zuständigkeiten und divergierender Interpretationen der europäischen Vorgaben. Für die Steuerdebatte ist der Vorgang mittelbar relevant, weil die AI-Act-Kategorien (Anhang I/III, Hochrisiko-Systeme, GPAI) über die Marktüberwachungsstellen operationalisiert werden — eine mögliche spätere Anknüpfung steuerlicher Tatbestände an diese Kategorien (etwa im Rahmen einer inländischen KI-Nutzungsabgabe, § 8.3) hängt davon ab, dass Definitionen, Meldedatenflüsse und Prüfmaßstäbe verlässlich harmonisiert vorliegen. Der Ausgang der Bundesratssitzung ist zum Redaktionsschluss offen.</w:t>
+        <w:t>Reallabor</w:t>
+      </w:r>
+      <w:r>
+        <w:rPr>
+          <w:rFonts w:ascii="Arial" w:hAnsi="Arial"/>
+          <w:b w:val="0"/>
+          <w:i w:val="0"/>
+          <w:sz w:val="19"/>
+        </w:rPr>
+        <w:t xml:space="preserve"> für die beaufsichtigte Erprobung neuer Anwendungen (insbesondere für kleine und mittlere Unternehmen) einzurichten; ausdrücklich ausgenommen von ihrer Marktüberwachungsbefugnis bleibt der KI-Einsatz in öffentlichen Institutionen der Länder und Kommunen. Für die Steuerdebatte ist der Vorgang mittelbar relevant, weil die AI-Act-Kategorien (Anhang I/III, Hochrisiko-Systeme, GPAI) über die Marktüberwachungsstellen operationalisiert werden — eine mögliche spätere Anknüpfung steuerlicher Tatbestände an diese Kategorien (etwa im Rahmen einer inländischen KI-Nutzungsabgabe, § 8.3) hängt davon ab, dass Definitionen, Meldedatenflüsse und Prüfmaßstäbe verlässlich harmonisiert vorliegen; die im Ausschussvotum kritisierte Zersplitterung zwischen Bundes- und Länderebene bleibt damit ein für spätere steuerliche Anknüpfungen offener Reibungspunkt.</w:t>
       </w:r>
     </w:p>
     <w:p>
@@ -6024,6 +6042,110 @@
           <w:sz w:val="19"/>
         </w:rPr>
         <w:t xml:space="preserve"> etabliert, in der Frontier-Anbieter und US-Regierung einen sicherheitsbezogenen Vorlauf koordinieren — mit unmittelbarer Rückwirkung auf die Verfügbarkeit importierter KI-Modelle in europäischen Anwendungen und damit auf die von der Deutschland-These (§ 8.3) unterstellten stabilen Zugriffspfade auf inländische KI-Wertschöpfung.</w:t>
+      </w:r>
+    </w:p>
+    <w:p>
+      <w:pPr>
+        <w:jc w:val="both"/>
+      </w:pPr>
+      <w:r>
+        <w:rPr>
+          <w:rFonts w:ascii="Arial" w:hAnsi="Arial"/>
+          <w:b w:val="0"/>
+          <w:i w:val="0"/>
+          <w:sz w:val="19"/>
+        </w:rPr>
+        <w:t xml:space="preserve">Am selben Tag (9. Juli 2026) hat Meta über </w:t>
+      </w:r>
+      <w:r>
+        <w:rPr>
+          <w:rFonts w:ascii="Arial" w:hAnsi="Arial"/>
+          <w:b w:val="0"/>
+          <w:i/>
+          <w:sz w:val="19"/>
+        </w:rPr>
+        <w:t>Meta Superintelligence Labs</w:t>
+      </w:r>
+      <w:r>
+        <w:rPr>
+          <w:rFonts w:ascii="Arial" w:hAnsi="Arial"/>
+          <w:b w:val="0"/>
+          <w:i w:val="0"/>
+          <w:sz w:val="19"/>
+        </w:rPr>
+        <w:t xml:space="preserve"> das agentische Multimodalmodell </w:t>
+      </w:r>
+      <w:r>
+        <w:rPr>
+          <w:rFonts w:ascii="Arial" w:hAnsi="Arial"/>
+          <w:b w:val="0"/>
+          <w:i/>
+          <w:sz w:val="19"/>
+        </w:rPr>
+        <w:t>Muse Spark 1.1</w:t>
+      </w:r>
+      <w:r>
+        <w:rPr>
+          <w:rFonts w:ascii="Arial" w:hAnsi="Arial"/>
+          <w:b w:val="0"/>
+          <w:i w:val="0"/>
+          <w:sz w:val="19"/>
+        </w:rPr>
+        <w:t xml:space="preserve"> über eine kostenpflichtige </w:t>
+      </w:r>
+      <w:r>
+        <w:rPr>
+          <w:rFonts w:ascii="Arial" w:hAnsi="Arial"/>
+          <w:b w:val="0"/>
+          <w:i/>
+          <w:sz w:val="19"/>
+        </w:rPr>
+        <w:t>Meta Model API</w:t>
+      </w:r>
+      <w:r>
+        <w:rPr>
+          <w:rFonts w:ascii="Arial" w:hAnsi="Arial"/>
+          <w:b w:val="0"/>
+          <w:i w:val="0"/>
+          <w:sz w:val="19"/>
+        </w:rPr>
+        <w:t xml:space="preserve"> freigegeben (Fortune, CNBC, TechCrunch, Datacamp, AI Weekly, Storyboard18): Kontextfenster 1 Million Token, aktives Kontextmanagement, spezifische Fortschritte in Werkzeug- und Rechnerbedienung, Programmieren und multimodalem Verständnis. Der Einstiegspreis liegt bei 1,25 US-Dollar pro Million Input-Token und 4,25 US-Dollar pro Million Output-Token — nach Berichterstattung von TechTimes und Quartz rund ein Viertel bis ein Drittel des vergleichbaren Anthropic-/OpenAI-Preisniveaus (Anthropic </w:t>
+      </w:r>
+      <w:r>
+        <w:rPr>
+          <w:rFonts w:ascii="Arial" w:hAnsi="Arial"/>
+          <w:b w:val="0"/>
+          <w:i/>
+          <w:sz w:val="19"/>
+        </w:rPr>
+        <w:t>Claude Sonnet 5</w:t>
+      </w:r>
+      <w:r>
+        <w:rPr>
+          <w:rFonts w:ascii="Arial" w:hAnsi="Arial"/>
+          <w:b w:val="0"/>
+          <w:i w:val="0"/>
+          <w:sz w:val="19"/>
+        </w:rPr>
+        <w:t xml:space="preserve"> 2/10 US-Dollar Einführungspreis, OpenAI </w:t>
+      </w:r>
+      <w:r>
+        <w:rPr>
+          <w:rFonts w:ascii="Arial" w:hAnsi="Arial"/>
+          <w:b w:val="0"/>
+          <w:i/>
+          <w:sz w:val="19"/>
+        </w:rPr>
+        <w:t>GPT-5.6 Sol</w:t>
+      </w:r>
+      <w:r>
+        <w:rPr>
+          <w:rFonts w:ascii="Arial" w:hAnsi="Arial"/>
+          <w:b w:val="0"/>
+          <w:i w:val="0"/>
+          <w:sz w:val="19"/>
+        </w:rPr>
+        <w:t xml:space="preserve"> 5/30 US-Dollar). Fortune ordnet den Vorstoß in eine breitere KI-Beschleunigung unter Alexandr Wang ein, TechCrunch verweist auf die Positionierung als Herausforderer im agentischen Programmier-Segment. Für die in diesem Kapitel geführte Diskussion ist der Vorgang in doppelter Hinsicht relevant: Er bestätigt die Preis­deflation an der Inferenzfront auf einer weiteren Modellstufe und verdichtet die Angebotsseite an der US-Frontier — mit zusätzlicher struktureller Symmetrie zwischen Personalabbau (Meta-Streichungen 20. Mai 2026, § 1.1) und paralleler Modell- und Compute-Offensive (Chip-Produktion September 2026, § 8.2) —, ohne die geografische Konzentration der Basismodellproduktion aufzuheben. Für die in § 8.3 skizzierten Zugriffspfade auf inländische KI-Wertschöpfung schreibt sich damit das Muster fort, dass die im Inland realisierte Wertschöpfung an die Verfügbarkeit dieser Modelle gekoppelt bleibt und dieselben Robustheits­anforderungen (Fable-5-Episode, § 4.5) auch für die neu hinzutretenden Anbieter greifen.</w:t>
       </w:r>
     </w:p>
     <w:p>
@@ -9063,16 +9185,124 @@
           <w:i/>
           <w:sz w:val="19"/>
         </w:rPr>
-        <w:t>1067. Sitzung des Bundesrates — Ausblick zur Plenarsitzung; Beratung zum Gesetz zur Durchführung der KI-Verordnung (KI-MIG). Ausschussempfehlung des Ausschusses für Digitalisierung und Staatsmodernisierung vom 30. Juni 2026: Anrufung des Vermittlungsausschusses zur grundlegenden Überarbeitung; Kritik an Zersplitterung der Marktüberwachung (Bundesnetzagentur nur für Bundes-Bereich, Länderzuständigkeit für Länder- und Kommunalverwaltungen).</w:t>
-      </w:r>
-      <w:r>
-        <w:rPr>
-          <w:rFonts w:ascii="Arial" w:hAnsi="Arial"/>
-          <w:b w:val="0"/>
-          <w:i w:val="0"/>
-          <w:sz w:val="19"/>
-        </w:rPr>
-        <w:t xml:space="preserve"> https://www.bundesrat.de/DE/plenum/bundesrat-kompakt/26/1067/1067-pk.html | https://www.bundesrat.de/DE/plenum/bundesrat-kompakt/26/1067/1067-node.html</w:t>
+        <w:t>1067. Sitzung des Bundesrates — Gesetz zur Durchführung der KI-Verordnung (KI-MIG) passiert den Bundesrat.</w:t>
+      </w:r>
+      <w:r>
+        <w:rPr>
+          <w:rFonts w:ascii="Arial" w:hAnsi="Arial"/>
+          <w:b w:val="0"/>
+          <w:i w:val="0"/>
+          <w:sz w:val="19"/>
+        </w:rPr>
+        <w:t xml:space="preserve"> Bundesratsbeschluss vom 10. Juli 2026: Antrag auf Anrufung des Vermittlungsausschusses (Empfehlung des Ausschusses für Digitalisierung und Staatsmodernisierung vom 30. Juni 2026) fand keine Mehrheit; das Gesetz kann ohne weiteres parlamentarisches Verfahren in Kraft treten. Bundesnetzagentur als zentrale Marktüberwachungs- und Anlaufstelle (Koordinierungs- und Kompetenzzentrum, gebündelte KI-Expertise, zentrale Beschwerdestelle, Auftrag zur Einrichtung mindestens eines KI-</w:t>
+      </w:r>
+      <w:r>
+        <w:rPr>
+          <w:rFonts w:ascii="Arial" w:hAnsi="Arial"/>
+          <w:b w:val="0"/>
+          <w:i/>
+          <w:sz w:val="19"/>
+        </w:rPr>
+        <w:t>Reallabors</w:t>
+      </w:r>
+      <w:r>
+        <w:rPr>
+          <w:rFonts w:ascii="Arial" w:hAnsi="Arial"/>
+          <w:b w:val="0"/>
+          <w:i w:val="0"/>
+          <w:sz w:val="19"/>
+        </w:rPr>
+        <w:t xml:space="preserve">); Marktüberwachungsbefugnis exkludiert den KI-Einsatz öffentlicher Institutionen der Länder und Kommunen. Ergänzend berichten </w:t>
+      </w:r>
+      <w:r>
+        <w:rPr>
+          <w:rFonts w:ascii="Arial" w:hAnsi="Arial"/>
+          <w:b w:val="0"/>
+          <w:i/>
+          <w:sz w:val="19"/>
+        </w:rPr>
+        <w:t>DATEV magazin</w:t>
+      </w:r>
+      <w:r>
+        <w:rPr>
+          <w:rFonts w:ascii="Arial" w:hAnsi="Arial"/>
+          <w:b w:val="0"/>
+          <w:i w:val="0"/>
+          <w:sz w:val="19"/>
+        </w:rPr>
+        <w:t xml:space="preserve"> (10. Juli 2026, „Länder billigen Gesetz zur KI-Aufsicht in Deutschland"), </w:t>
+      </w:r>
+      <w:r>
+        <w:rPr>
+          <w:rFonts w:ascii="Arial" w:hAnsi="Arial"/>
+          <w:b w:val="0"/>
+          <w:i/>
+          <w:sz w:val="19"/>
+        </w:rPr>
+        <w:t>Rechtsanwalt Ferner</w:t>
+      </w:r>
+      <w:r>
+        <w:rPr>
+          <w:rFonts w:ascii="Arial" w:hAnsi="Arial"/>
+          <w:b w:val="0"/>
+          <w:i w:val="0"/>
+          <w:sz w:val="19"/>
+        </w:rPr>
+        <w:t xml:space="preserve"> („Deutschland bekommt ein KI-Gesetz: Bündelung der nationalen KI-Aufsicht bei der Bundesnetzagentur"), </w:t>
+      </w:r>
+      <w:r>
+        <w:rPr>
+          <w:rFonts w:ascii="Arial" w:hAnsi="Arial"/>
+          <w:b w:val="0"/>
+          <w:i/>
+          <w:sz w:val="19"/>
+        </w:rPr>
+        <w:t>ADVISORI</w:t>
+      </w:r>
+      <w:r>
+        <w:rPr>
+          <w:rFonts w:ascii="Arial" w:hAnsi="Arial"/>
+          <w:b w:val="0"/>
+          <w:i w:val="0"/>
+          <w:sz w:val="19"/>
+        </w:rPr>
+        <w:t xml:space="preserve"> („KI-MIG beschlossen: Was das AI-Act-Durchführungsgesetz für Unternehmen bedeutet"), </w:t>
+      </w:r>
+      <w:r>
+        <w:rPr>
+          <w:rFonts w:ascii="Arial" w:hAnsi="Arial"/>
+          <w:b w:val="0"/>
+          <w:i/>
+          <w:sz w:val="19"/>
+        </w:rPr>
+        <w:t>Bundesregierung</w:t>
+      </w:r>
+      <w:r>
+        <w:rPr>
+          <w:rFonts w:ascii="Arial" w:hAnsi="Arial"/>
+          <w:b w:val="0"/>
+          <w:i w:val="0"/>
+          <w:sz w:val="19"/>
+        </w:rPr>
+        <w:t xml:space="preserve"> („KI-Verordnung beschlossen") und </w:t>
+      </w:r>
+      <w:r>
+        <w:rPr>
+          <w:rFonts w:ascii="Arial" w:hAnsi="Arial"/>
+          <w:b w:val="0"/>
+          <w:i/>
+          <w:sz w:val="19"/>
+        </w:rPr>
+        <w:t>TÜV-Verband</w:t>
+      </w:r>
+      <w:r>
+        <w:rPr>
+          <w:rFonts w:ascii="Arial" w:hAnsi="Arial"/>
+          <w:b w:val="0"/>
+          <w:i w:val="0"/>
+          <w:sz w:val="19"/>
+        </w:rPr>
+        <w:t xml:space="preserve"> („Begrüßt gebündelte KI-Aufsicht"). https://www.bundesrat.de/DE/plenum/bundesrat-kompakt/26/1067/1067-node.html | https://www.bundesrat.de/DE/plenum/bundesrat-kompakt/26/1067/1067-pk.html | https://www.datev-magazin.de/nachrichten-steuern-recht/recht/laender-billigen-gesetz-zur-ki-aufsicht-in-deutschland-147779 | https://www.ferner-alsdorf.de/deutschland-bekommt-ein-ki-gesetz-buendelung-der-nationalen-ki-aufsicht-bei-der-bundesnetzagentur/ | https://www.advisori.de/blog/ki-mig-ai-act-durchfuehrungsgesetz-unternehmen | https://www.bundesregierung.de/breg-de/aktuelles/umsetzung-ki-verordnung-2406638 | https://www.mittelstandcafe.de/ki-mig-t-v-verband-begr-t-geb-ndelte-ki-aufsicht-2261610.html</w:t>
       </w:r>
     </w:p>
     <w:p>
@@ -12847,6 +13077,92 @@
       <w:r>
         <w:rPr>
           <w:rFonts w:ascii="Arial" w:hAnsi="Arial"/>
+          <w:b w:val="0"/>
+          <w:i w:val="0"/>
+          <w:sz w:val="19"/>
+        </w:rPr>
+        <w:t xml:space="preserve">Meta / Fortune / CNBC / TechCrunch / TechTimes / Quartz / DataCamp / AI Weekly / Storyboard18 / cxotoday. (9. Juli 2026). </w:t>
+      </w:r>
+      <w:r>
+        <w:rPr>
+          <w:rFonts w:ascii="Arial" w:hAnsi="Arial"/>
+          <w:b w:val="0"/>
+          <w:i/>
+          <w:sz w:val="19"/>
+        </w:rPr>
+        <w:t>Introducing Muse Spark 1.1 / Meta releases latest update of AI model Muse Spark as tech giant accelerates AI push under Alexandr Wang / Meta jumps into AI coding market in effort to chase Anthropic and OpenAI / Meta enters the crowded AI coding battle with Muse Spark 1.1 / Meta's Muse Spark 1.1 Opens Paid API at One-Quarter of Anthropic, OpenAI Rates / Meta launches paid Muse Spark 1.1 API to compete with OpenAI, Anthropic / Muse Spark 1.1: Meta's Agentic Model and API / Meta prices Muse Spark 1.1 API at $1.25/$4.25 per M tokens / What is Muse Spark 1.1? Meta's new AI model takes on OpenAI and Anthropic with agentic computing / After SpaceX, Meta Now Launches Muse Spark 1.1 Model, to Begin AI Chip Production in Sept.</w:t>
+      </w:r>
+      <w:r>
+        <w:rPr>
+          <w:rFonts w:ascii="Arial" w:hAnsi="Arial"/>
+          <w:b w:val="0"/>
+          <w:i w:val="0"/>
+          <w:sz w:val="19"/>
+        </w:rPr>
+        <w:t xml:space="preserve"> Öffentliche Freigabe des agentischen Multimodalmodells </w:t>
+      </w:r>
+      <w:r>
+        <w:rPr>
+          <w:rFonts w:ascii="Arial" w:hAnsi="Arial"/>
+          <w:b w:val="0"/>
+          <w:i/>
+          <w:sz w:val="19"/>
+        </w:rPr>
+        <w:t>Muse Spark 1.1</w:t>
+      </w:r>
+      <w:r>
+        <w:rPr>
+          <w:rFonts w:ascii="Arial" w:hAnsi="Arial"/>
+          <w:b w:val="0"/>
+          <w:i w:val="0"/>
+          <w:sz w:val="19"/>
+        </w:rPr>
+        <w:t xml:space="preserve"> über die kostenpflichtige </w:t>
+      </w:r>
+      <w:r>
+        <w:rPr>
+          <w:rFonts w:ascii="Arial" w:hAnsi="Arial"/>
+          <w:b w:val="0"/>
+          <w:i/>
+          <w:sz w:val="19"/>
+        </w:rPr>
+        <w:t>Meta Model API</w:t>
+      </w:r>
+      <w:r>
+        <w:rPr>
+          <w:rFonts w:ascii="Arial" w:hAnsi="Arial"/>
+          <w:b w:val="0"/>
+          <w:i w:val="0"/>
+          <w:sz w:val="19"/>
+        </w:rPr>
+        <w:t xml:space="preserve"> zum 9. Juli 2026 aus dem </w:t>
+      </w:r>
+      <w:r>
+        <w:rPr>
+          <w:rFonts w:ascii="Arial" w:hAnsi="Arial"/>
+          <w:b w:val="0"/>
+          <w:i/>
+          <w:sz w:val="19"/>
+        </w:rPr>
+        <w:t>Meta Superintelligence Labs</w:t>
+      </w:r>
+      <w:r>
+        <w:rPr>
+          <w:rFonts w:ascii="Arial" w:hAnsi="Arial"/>
+          <w:b w:val="0"/>
+          <w:i w:val="0"/>
+          <w:sz w:val="19"/>
+        </w:rPr>
+        <w:t xml:space="preserve"> unter Alexandr Wang (Kontextfenster 1 Million Token mit aktivem Kontextmanagement, Fortschritte in Werkzeug- und Rechnerbedienung, Programmieren und multimodalem Verständnis; Einstiegspreis 1,25 US-Dollar Input / 4,25 US-Dollar Output pro Million Token, 20 US-Dollar Startguthaben — rund ein Viertel bis ein Drittel des Anthropic-/OpenAI-Preisniveaus). Weitere strategische Einordnung: Meta-Chip-Produktion ab September 2026 angekündigt. Beleg für die deflationäre Preisdynamik der Frontier-Inferenz und die Verdichtung der Angebotsseite an der US-Frontier (§ 8.2). https://ai.meta.com/blog/introducing-muse-spark-meta-model-api/ | https://fortune.com/2026/07/09/meta-muse-spark-1-1-release-alexandr-wang-superintelligence-labs-mark-zuckerberg/ | https://www.cnbc.com/2026/07/09/meta-jumps-into-ai-coding-market-to-chase-anthropic-and-openai.html | https://techcrunch.com/2026/07/09/meta-enters-the-crowded-ai-coding-battle-with-muse-spark-1-1/ | https://www.techtimes.com/articles/320088/20260710/metas-muse-spark-11-opens-paid-api-one-quarter-anthropic-openai-rates.htm | https://qz.com/meta-muse-spark-api-developers-paid-anthropic-openai-070926 | https://www.datacamp.com/blog/muse-spark-1-1 | https://aiweekly.co/alerts/meta-prices-muse-spark-11-api-at-125425-per-m-tokens | https://www.storyboard18.com/digital/what-is-muse-spark-1-1-metas-new-ai-model-takes-on-openai-and-anthropic-with-agentic-computing-103831.htm | https://cxotoday.com/big-tech/after-spacex-meta-now-launches-muse-spark-1-1-model-to-begin-ai-chip-production-in-sept/</w:t>
+      </w:r>
+    </w:p>
+    <w:p>
+      <w:pPr>
+        <w:jc w:val="both"/>
+      </w:pPr>
+      <w:r>
+        <w:rPr>
+          <w:rFonts w:ascii="Arial" w:hAnsi="Arial"/>
           <w:b/>
           <w:i w:val="0"/>
           <w:sz w:val="19"/>
@@ -12860,7 +13176,7 @@
           <w:i w:val="0"/>
           <w:sz w:val="19"/>
         </w:rPr>
-        <w:t xml:space="preserve"> Dieses Arbeitspapier gibt den Stand Anfang Juli 2026 (Schnitt am 10. Juli 2026 — Lauf 001 vom 10. Juli 2026) wieder. Die Debatte entwickelt sich dynamisch, insbesondere im Zuge der OpenAI-Strategiepapiere und der Eröffnung des OpenAI Workshop in Washington, D.C. im Mai 2026, des Erstdurchgangs des GKV-Beitragssatzstabilisierungsgesetzes in der 1065. Bundesratssitzung am 8. Mai 2026 mit 79 Tagesordnungspunkten (Kabinettsbeschluss 29. April 2026, parlamentarische Behandlung vor der Sommerpause 2026 angekündigt), der laufenden Trilog-Verhandlungen zum Digital Omnibus on AI (zweite Runde 28. April 2026 ohne Einigung; nächste Runde 13. Mai 2026 — Knackpunkt ist nicht die Verschiebung der Hochrisiko-Pflichten, sondern die Konformitätsbewertungs-Architektur für Anhang I; die zypriotische Ratspräsidentschaft strebt einen Abschluss vor Ablauf ihrer Amtszeit am 30. Juni 2026 an, andernfalls übernimmt die irische Präsidentschaft), der am 5. Mai 2026 erfolgten Arraignment-Verhandlung im Altman-Verfahren mit „nicht schuldig"-Plädoyer und angeordneter psychiatrischer Begutachtung, des am 7. Mai 2026 versandten individuellen Microsoft-Buyout-Angebots (Annahmefrist 8. Juni 2026, VRSAR-Unterzeichnung 9.–22. Juni 2026, bis zu fünfjährige Krankenversicherungs-Verlängerung), des am 1. Mai 2026 vom Connecticut-Repräsentantenhaus mit 131 zu 17 Stimmen verabschiedeten </w:t>
+        <w:t xml:space="preserve"> Dieses Arbeitspapier gibt den Stand Anfang Juli 2026 (Schnitt am 11. Juli 2026 — Lauf 001 vom 11. Juli 2026) wieder. Die Debatte entwickelt sich dynamisch, insbesondere im Zuge der OpenAI-Strategiepapiere und der Eröffnung des OpenAI Workshop in Washington, D.C. im Mai 2026, des Erstdurchgangs des GKV-Beitragssatzstabilisierungsgesetzes in der 1065. Bundesratssitzung am 8. Mai 2026 mit 79 Tagesordnungspunkten (Kabinettsbeschluss 29. April 2026, parlamentarische Behandlung vor der Sommerpause 2026 angekündigt), der laufenden Trilog-Verhandlungen zum Digital Omnibus on AI (zweite Runde 28. April 2026 ohne Einigung; nächste Runde 13. Mai 2026 — Knackpunkt ist nicht die Verschiebung der Hochrisiko-Pflichten, sondern die Konformitätsbewertungs-Architektur für Anhang I; die zypriotische Ratspräsidentschaft strebt einen Abschluss vor Ablauf ihrer Amtszeit am 30. Juni 2026 an, andernfalls übernimmt die irische Präsidentschaft), der am 5. Mai 2026 erfolgten Arraignment-Verhandlung im Altman-Verfahren mit „nicht schuldig"-Plädoyer und angeordneter psychiatrischer Begutachtung, des am 7. Mai 2026 versandten individuellen Microsoft-Buyout-Angebots (Annahmefrist 8. Juni 2026, VRSAR-Unterzeichnung 9.–22. Juni 2026, bis zu fünfjährige Krankenversicherungs-Verlängerung), des am 1. Mai 2026 vom Connecticut-Repräsentantenhaus mit 131 zu 17 Stimmen verabschiedeten </w:t>
       </w:r>
       <w:r>
         <w:rPr>
@@ -13598,7 +13914,115 @@
           <w:i w:val="0"/>
           <w:sz w:val="19"/>
         </w:rPr>
-        <w:t xml:space="preserve"> nach dokumentiertem Amazon-Umgehungsverfahren, weltweite Aussetzung durch Anthropic, Redeployment ab 1. Juli 2026 mit gemeinsam mit dem US Center for AI Safety Institute (CAISI) trainierten Klassifikatoren (&gt;99 % Blockade der Umgehungsroutine, erhöhte Fehlalarmquote auf regulären Debugging-/Programmier-Prompts); Kontingent-Verlängerung auf kostenpflichtigen Tarifen bis 12. Juli 2026 — Aufnahme in § 4.5 (US-Vor-Freigabe-Regime, exekutiv-sicherheitspolitische Vermittlung des Zugriffs auf Frontier-Modelle) und Rückwirkung auf § 8.3 (Robustheits­anforderungen an Wertschöpfungsabgabe und Fondslogik gegenüber Verfügbarkeits­störungen der Basismodelle). Eine regelmäßige Aktualisierung ist vorgesehen.</w:t>
+        <w:t xml:space="preserve"> nach dokumentiertem Amazon-Umgehungsverfahren, weltweite Aussetzung durch Anthropic, Redeployment ab 1. Juli 2026 mit gemeinsam mit dem US Center for AI Safety Institute (CAISI) trainierten Klassifikatoren (&gt;99 % Blockade der Umgehungsroutine, erhöhte Fehlalarmquote auf regulären Debugging-/Programmier-Prompts); Kontingent-Verlängerung auf kostenpflichtigen Tarifen bis 12. Juli 2026 — Aufnahme in § 4.5 (US-Vor-Freigabe-Regime, exekutiv-sicherheitspolitische Vermittlung des Zugriffs auf Frontier-Modelle) und Rückwirkung auf § 8.3 (Robustheits­anforderungen an Wertschöpfungsabgabe und Fondslogik gegenüber Verfügbarkeits­störungen der Basismodelle). Lauf 001 vom 11. Juli 2026 ergänzt zwei weitere Fortschreibungen: die Verabschiedung des </w:t>
+      </w:r>
+      <w:r>
+        <w:rPr>
+          <w:rFonts w:ascii="Arial" w:hAnsi="Arial"/>
+          <w:b w:val="0"/>
+          <w:i/>
+          <w:sz w:val="19"/>
+        </w:rPr>
+        <w:t>KI-MIG</w:t>
+      </w:r>
+      <w:r>
+        <w:rPr>
+          <w:rFonts w:ascii="Arial" w:hAnsi="Arial"/>
+          <w:b w:val="0"/>
+          <w:i w:val="0"/>
+          <w:sz w:val="19"/>
+        </w:rPr>
+        <w:t xml:space="preserve"> durch den Bundesrat am 10. Juli 2026 in seiner 1067. Sitzung (Ausschussempfehlung des </w:t>
+      </w:r>
+      <w:r>
+        <w:rPr>
+          <w:rFonts w:ascii="Arial" w:hAnsi="Arial"/>
+          <w:b w:val="0"/>
+          <w:i/>
+          <w:sz w:val="19"/>
+        </w:rPr>
+        <w:t>Ausschusses für Digitalisierung und Staatsmodernisierung</w:t>
+      </w:r>
+      <w:r>
+        <w:rPr>
+          <w:rFonts w:ascii="Arial" w:hAnsi="Arial"/>
+          <w:b w:val="0"/>
+          <w:i w:val="0"/>
+          <w:sz w:val="19"/>
+        </w:rPr>
+        <w:t xml:space="preserve"> vom 30. Juni 2026 zur Anrufung des Vermittlungsausschusses fand im Plenum keine Mehrheit; das Gesetz kann ohne weiteres parlamentarisches Verfahren in Kraft treten — Bundesnetzagentur als zentrale Marktüberwachungs- und Anlaufstelle mit Koordinierungs- und Kompetenzzentrum, gebündelter KI-Expertise, zentraler Beschwerdestelle für Bürgerinnen und Bürger und Auftrag zur Einrichtung mindestens eines KI-</w:t>
+      </w:r>
+      <w:r>
+        <w:rPr>
+          <w:rFonts w:ascii="Arial" w:hAnsi="Arial"/>
+          <w:b w:val="0"/>
+          <w:i/>
+          <w:sz w:val="19"/>
+        </w:rPr>
+        <w:t>Reallabors</w:t>
+      </w:r>
+      <w:r>
+        <w:rPr>
+          <w:rFonts w:ascii="Arial" w:hAnsi="Arial"/>
+          <w:b w:val="0"/>
+          <w:i w:val="0"/>
+          <w:sz w:val="19"/>
+        </w:rPr>
+        <w:t xml:space="preserve">; Marktüberwachungsbefugnis exkludiert den KI-Einsatz öffentlicher Institutionen der Länder und Kommunen — § 4.4); sowie die am 9. Juli 2026 durch </w:t>
+      </w:r>
+      <w:r>
+        <w:rPr>
+          <w:rFonts w:ascii="Arial" w:hAnsi="Arial"/>
+          <w:b w:val="0"/>
+          <w:i/>
+          <w:sz w:val="19"/>
+        </w:rPr>
+        <w:t>Meta Superintelligence Labs</w:t>
+      </w:r>
+      <w:r>
+        <w:rPr>
+          <w:rFonts w:ascii="Arial" w:hAnsi="Arial"/>
+          <w:b w:val="0"/>
+          <w:i w:val="0"/>
+          <w:sz w:val="19"/>
+        </w:rPr>
+        <w:t xml:space="preserve"> freigegebene kostenpflichtige </w:t>
+      </w:r>
+      <w:r>
+        <w:rPr>
+          <w:rFonts w:ascii="Arial" w:hAnsi="Arial"/>
+          <w:b w:val="0"/>
+          <w:i/>
+          <w:sz w:val="19"/>
+        </w:rPr>
+        <w:t>Meta Model API</w:t>
+      </w:r>
+      <w:r>
+        <w:rPr>
+          <w:rFonts w:ascii="Arial" w:hAnsi="Arial"/>
+          <w:b w:val="0"/>
+          <w:i w:val="0"/>
+          <w:sz w:val="19"/>
+        </w:rPr>
+        <w:t xml:space="preserve"> für das agentische Multimodalmodell </w:t>
+      </w:r>
+      <w:r>
+        <w:rPr>
+          <w:rFonts w:ascii="Arial" w:hAnsi="Arial"/>
+          <w:b w:val="0"/>
+          <w:i/>
+          <w:sz w:val="19"/>
+        </w:rPr>
+        <w:t>Muse Spark 1.1</w:t>
+      </w:r>
+      <w:r>
+        <w:rPr>
+          <w:rFonts w:ascii="Arial" w:hAnsi="Arial"/>
+          <w:b w:val="0"/>
+          <w:i w:val="0"/>
+          <w:sz w:val="19"/>
+        </w:rPr>
+        <w:t xml:space="preserve"> (Kontextfenster 1 Million Token mit aktivem Kontextmanagement; Einstiegspreis 1,25 US-Dollar Input / 4,25 US-Dollar Output pro Million Token, 20 US-Dollar Startguthaben — rund ein Viertel bis ein Drittel des Anthropic-/OpenAI-Preisniveaus; angekündigte Meta-Chip-Produktion ab September 2026) als weiterer Beleg der Preisdeflation an der Inferenzfront und der Verdichtung der Angebotsseite an der US-Frontier — Aufnahme in § 8.2 mit Rückwirkung auf § 8.3 (Zugriffspfade und Robustheits­anforderungen gegenüber Verfügbarkeits­störungen). Eine regelmäßige Aktualisierung ist vorgesehen.</w:t>
       </w:r>
     </w:p>
     <w:p>
@@ -13678,7 +14102,7 @@
         <w:color w:val="999999"/>
         <w:sz w:val="15"/>
       </w:rPr>
-      <w:t>Version 30.0 — Mai 2026 — CC BY 4.0</w:t>
+      <w:t>Version 31.0 — Mai 2026 — CC BY 4.0</w:t>
       <w:tab/>
       <w:t xml:space="preserve">Seite </w:t>
     </w:r>

</xml_diff>

<commit_message>
Daily-Update 2026-07-13 — Version 33.0 (Cluster: B/E, I)
- § 5.2: GKV-Beitragssatzstabilisierungsgesetz Bundestagsverabschiedung am 10. Juli 2026 (namentliche Abstimmung 318 zu 284, Kalenderwoche 28; erste Lesung 12. Juni 2026; zweiter Bundesratsdurchgang steht noch aus)
- § 8.2: Apple Inc. v. OpenAI, OpenAI OpCo LLC & io Products, Inc. (10. Juli 2026, N.D. Cal.) — 41-seitige Trade-Secret-Klage; ueber 400 ehemalige Apple-Beschaeftigte bei OpenAI; ergaenzt DeepMind-Talent-Bestandsdimension aus Version 29.0 um rechtsfoermige Ebene
- § 11.3 / § 11.5: zwei neue Sammelbelege
- Dokumentkopf, Aktualitaetshinweis, README, Validierung-Ergebnisse: Version 33.0
</commit_message>
<xml_diff>
--- a/KI-Ökonomie.docx
+++ b/KI-Ökonomie.docx
@@ -112,7 +112,7 @@
           <w:color w:val="666666"/>
           <w:sz w:val="18"/>
         </w:rPr>
-        <w:t>Version 32.0</w:t>
+        <w:t>Version 33.0</w:t>
       </w:r>
     </w:p>
     <w:p>
@@ -4655,7 +4655,7 @@
           <w:i w:val="0"/>
           <w:sz w:val="19"/>
         </w:rPr>
-        <w:t xml:space="preserve"> beschlossen; im Verlauf der Ressortabstimmung wurde das Sparvolumen je nach Berichterstattung mit rund 16,3 Milliarden Euro (Frühberichterstattung) bzw. rund 19,6 Milliarden Euro (BMG-Tabellen Stand Anfang Mai 2026, gegliedert in 4,9 Milliarden einnahmen­seitige und rund 15 Milliarden ausgaben­seitige Komponenten) für 2027 angegeben; bis 2030 sieht das BMG eine Steigerung des Konsolidierungseffekts auf rund 42,8 Milliarden Euro vor. Die parlamentarische Behandlung soll laut BMG-Zeitplan vor der Sommerpause 2026 abgeschlossen werden — der Kabinettentwurf wird dem Bundesrat im ersten Durchgang am 8. Mai 2026 zugeleitet (1065. Sitzung; insgesamt 79 Tagesordnungspunkte, darunter eine flankierende Thüringer Entschließung zum Bürokratieabbau in der gesetzlichen Krankenversicherung); die erste Bundestagslesung ist im weiteren Verlauf des Mai/Juni 2026 vorgesehen. Die Reform belastet Krankenhäuser, pharmazeutische Industrie, Apotheken, Ärzteschaft, Versicherte, Arbeitgeber und Krankenkassen gemeinsam; sie folgt dem Leitsatz „Ausgaben an Einnahmen koppeln" und greift damit fiskalisch genau die Logik auf, die § 5.1 in der Beitrags­seite spiegelbildlich zu erweitern vorschlägt. Auch wenn die GKV-Reform primär ausgaben- und strukturseitig ansetzt, bestätigt sie den in § 5.1 angerissenen finanzpolitischen Befund: Die lohnbasierten Sicherungszweige geraten gleichzeitig durch demografischen Druck und durch die in § 1.1 dokumentierten KI-induzierten Beschäftigungsverschiebungen unter Spannung — eine Verbreiterung der Bemessungsgrundlage gewinnt damit zusätzlich an Plausibilität.</w:t>
+        <w:t xml:space="preserve"> beschlossen; im Verlauf der Ressortabstimmung wurde das Sparvolumen je nach Berichterstattung mit rund 16,3 Milliarden Euro (Frühberichterstattung) bzw. rund 19,6 Milliarden Euro (BMG-Tabellen Stand Anfang Mai 2026, gegliedert in 4,9 Milliarden einnahmen­seitige und rund 15 Milliarden ausgaben­seitige Komponenten) für 2027 angegeben; bis 2030 sieht das BMG eine Steigerung des Konsolidierungseffekts auf rund 42,8 Milliarden Euro vor. Die parlamentarische Behandlung soll laut BMG-Zeitplan vor der Sommerpause 2026 abgeschlossen werden — der Kabinettentwurf wird dem Bundesrat im ersten Durchgang am 8. Mai 2026 zugeleitet (1065. Sitzung; insgesamt 79 Tagesordnungspunkte, darunter eine flankierende Thüringer Entschließung zum Bürokratieabbau in der gesetzlichen Krankenversicherung); die erste Bundestagslesung findet am 12. Juni 2026 statt, die 2./3. Lesung folgt am 10. Juli 2026 in namentlicher Abstimmung mit 318 zu 284 Stimmen (Bundestag, Kalenderwoche 28) — das Gesetz ist damit vor der Sommerpause 2026 im Bundestag verabschiedet, mit noch anstehendem zweiten Durchgang im Bundesrat. Die Reform belastet Krankenhäuser, pharmazeutische Industrie, Apotheken, Ärzteschaft, Versicherte, Arbeitgeber und Krankenkassen gemeinsam; sie folgt dem Leitsatz „Ausgaben an Einnahmen koppeln" und greift damit fiskalisch genau die Logik auf, die § 5.1 in der Beitrags­seite spiegelbildlich zu erweitern vorschlägt. Auch wenn die GKV-Reform primär ausgaben- und strukturseitig ansetzt, bestätigt sie den in § 5.1 angerissenen finanzpolitischen Befund: Die lohnbasierten Sicherungszweige geraten gleichzeitig durch demografischen Druck und durch die in § 1.1 dokumentierten KI-induzierten Beschäftigungsverschiebungen unter Spannung — eine Verbreiterung der Bemessungsgrundlage gewinnt damit zusätzlich an Plausibilität.</w:t>
       </w:r>
     </w:p>
     <w:p>
@@ -6123,6 +6123,218 @@
           <w:sz w:val="19"/>
         </w:rPr>
         <w:t xml:space="preserve"> nahelegen) eine hohe fiskalische Volatilität in Kauf nimmt — ein Argument, das die stabileren wertschöpfungsbezogenen Zugriffe der Deutschland-These (§ 8.3) zusätzlich stützt. Für Deutschland und die Europäische Union unterstreicht der Vorgang zugleich, dass die Talent-Basis der Frontier-Modelle weiterhin nahezu ausschließlich transatlantisch zirkuliert; das Aufholpotenzial europäischer Anbieter (Mistral, Aleph Alpha) bleibt in dieser Metrik strukturell unter dem Niveau der US-amerikanischen Kernanbieter.</w:t>
+      </w:r>
+    </w:p>
+    <w:p>
+      <w:pPr>
+        <w:jc w:val="both"/>
+      </w:pPr>
+      <w:r>
+        <w:rPr>
+          <w:rFonts w:ascii="Arial" w:hAnsi="Arial"/>
+          <w:b w:val="0"/>
+          <w:i w:val="0"/>
+          <w:sz w:val="19"/>
+        </w:rPr>
+        <w:t xml:space="preserve">Am 10. Juli 2026 tritt neben die intra-Frontier-Bewegung erstmals ein prominenter Rechtskonflikt zwischen einem US-Konsumelektronik-Konzern und einem US-Frontier-Anbieter über die Talent-Basis: </w:t>
+      </w:r>
+      <w:r>
+        <w:rPr>
+          <w:rFonts w:ascii="Arial" w:hAnsi="Arial"/>
+          <w:b w:val="0"/>
+          <w:i/>
+          <w:sz w:val="19"/>
+        </w:rPr>
+        <w:t>Apple</w:t>
+      </w:r>
+      <w:r>
+        <w:rPr>
+          <w:rFonts w:ascii="Arial" w:hAnsi="Arial"/>
+          <w:b w:val="0"/>
+          <w:i w:val="0"/>
+          <w:sz w:val="19"/>
+        </w:rPr>
+        <w:t xml:space="preserve"> reichte beim United States District Court for the Northern District of California eine 41 Seiten umfassende Klageschrift gegen OpenAI, dessen Hardware-Tochter </w:t>
+      </w:r>
+      <w:r>
+        <w:rPr>
+          <w:rFonts w:ascii="Arial" w:hAnsi="Arial"/>
+          <w:b w:val="0"/>
+          <w:i/>
+          <w:sz w:val="19"/>
+        </w:rPr>
+        <w:t>io Products, Inc.</w:t>
+      </w:r>
+      <w:r>
+        <w:rPr>
+          <w:rFonts w:ascii="Arial" w:hAnsi="Arial"/>
+          <w:b w:val="0"/>
+          <w:i w:val="0"/>
+          <w:sz w:val="19"/>
+        </w:rPr>
+        <w:t xml:space="preserve">, den </w:t>
+      </w:r>
+      <w:r>
+        <w:rPr>
+          <w:rFonts w:ascii="Arial" w:hAnsi="Arial"/>
+          <w:b w:val="0"/>
+          <w:i/>
+          <w:sz w:val="19"/>
+        </w:rPr>
+        <w:t>Chief Hardware Officer</w:t>
+      </w:r>
+      <w:r>
+        <w:rPr>
+          <w:rFonts w:ascii="Arial" w:hAnsi="Arial"/>
+          <w:b w:val="0"/>
+          <w:i w:val="0"/>
+          <w:sz w:val="19"/>
+        </w:rPr>
+        <w:t xml:space="preserve"> Tang Yew Tan (früher Vice President bei Apple) und den früheren </w:t>
+      </w:r>
+      <w:r>
+        <w:rPr>
+          <w:rFonts w:ascii="Arial" w:hAnsi="Arial"/>
+          <w:b w:val="0"/>
+          <w:i/>
+          <w:sz w:val="19"/>
+        </w:rPr>
+        <w:t>Senior Systems Electrical Engineer</w:t>
+      </w:r>
+      <w:r>
+        <w:rPr>
+          <w:rFonts w:ascii="Arial" w:hAnsi="Arial"/>
+          <w:b w:val="0"/>
+          <w:i w:val="0"/>
+          <w:sz w:val="19"/>
+        </w:rPr>
+        <w:t xml:space="preserve"> Chang Liu ein (Bloomberg, CNBC, Axios, Engadget, TechCrunch, Cybersecurity News; Aktenzeichen zum 10. Juli 2026 in Auszügen wiedergegeben). Apple stützt die Klage auf den Vorwurf systematischer Trade-Secret-Aneignung „auf jeder Ebene, von </w:t>
+      </w:r>
+      <w:r>
+        <w:rPr>
+          <w:rFonts w:ascii="Arial" w:hAnsi="Arial"/>
+          <w:b w:val="0"/>
+          <w:i/>
+          <w:sz w:val="19"/>
+        </w:rPr>
+        <w:t>members of technical staff</w:t>
+      </w:r>
+      <w:r>
+        <w:rPr>
+          <w:rFonts w:ascii="Arial" w:hAnsi="Arial"/>
+          <w:b w:val="0"/>
+          <w:i w:val="0"/>
+          <w:sz w:val="19"/>
+        </w:rPr>
+        <w:t xml:space="preserve"> bis zum </w:t>
+      </w:r>
+      <w:r>
+        <w:rPr>
+          <w:rFonts w:ascii="Arial" w:hAnsi="Arial"/>
+          <w:b w:val="0"/>
+          <w:i/>
+          <w:sz w:val="19"/>
+        </w:rPr>
+        <w:t>Chief Hardware Officer</w:t>
+      </w:r>
+      <w:r>
+        <w:rPr>
+          <w:rFonts w:ascii="Arial" w:hAnsi="Arial"/>
+          <w:b w:val="0"/>
+          <w:i w:val="0"/>
+          <w:sz w:val="19"/>
+        </w:rPr>
+        <w:t xml:space="preserve">, und in Abstimmung mit </w:t>
+      </w:r>
+      <w:r>
+        <w:rPr>
+          <w:rFonts w:ascii="Arial" w:hAnsi="Arial"/>
+          <w:b w:val="0"/>
+          <w:i/>
+          <w:sz w:val="19"/>
+        </w:rPr>
+        <w:t>business partners</w:t>
+      </w:r>
+      <w:r>
+        <w:rPr>
+          <w:rFonts w:ascii="Arial" w:hAnsi="Arial"/>
+          <w:b w:val="0"/>
+          <w:i w:val="0"/>
+          <w:sz w:val="19"/>
+        </w:rPr>
+        <w:t xml:space="preserve">", und flankiert sie mit der Angabe, dass inzwischen über 400 ehemalige Apple-Beschäftigte bei OpenAI arbeiteten. Zu den in der Klageschrift genannten Einzelvorwürfen zählen die Aufforderung an Bewerberinnen und Bewerber, „actual parts" aus Apple-Beständen zu </w:t>
+      </w:r>
+      <w:r>
+        <w:rPr>
+          <w:rFonts w:ascii="Arial" w:hAnsi="Arial"/>
+          <w:b w:val="0"/>
+          <w:i/>
+          <w:sz w:val="19"/>
+        </w:rPr>
+        <w:t>Show-and-Tell</w:t>
+      </w:r>
+      <w:r>
+        <w:rPr>
+          <w:rFonts w:ascii="Arial" w:hAnsi="Arial"/>
+          <w:b w:val="0"/>
+          <w:i w:val="0"/>
+          <w:sz w:val="19"/>
+        </w:rPr>
+        <w:t xml:space="preserve">-Interviews mitzubringen, das Fortbestehen eines dienstlich ausgegebenen Apple-Notebooks nach Beschäftigungsende und ein Zugriff auf über </w:t>
+      </w:r>
+      <w:r>
+        <w:rPr>
+          <w:rFonts w:ascii="Arial" w:hAnsi="Arial"/>
+          <w:b w:val="0"/>
+          <w:i/>
+          <w:sz w:val="19"/>
+        </w:rPr>
+        <w:t>Dutzend</w:t>
+      </w:r>
+      <w:r>
+        <w:rPr>
+          <w:rFonts w:ascii="Arial" w:hAnsi="Arial"/>
+          <w:b w:val="0"/>
+          <w:i w:val="0"/>
+          <w:sz w:val="19"/>
+        </w:rPr>
+        <w:t xml:space="preserve"> interne Apple-Dateien nach Wechsel zu OpenAI sowie die interne Weitergabe eines Apple-Offboarding-Dokuments mit Umgehungsanleitungen für Apple-Exit-Sicherheitskontrollen. Für die in diesem Kapitel entwickelte Rohstoff-Analogie ergänzt der Vorgang die Talent-Bestandsdimension aus dem DeepMind-Fall um eine explizit </w:t>
+      </w:r>
+      <w:r>
+        <w:rPr>
+          <w:rFonts w:ascii="Arial" w:hAnsi="Arial"/>
+          <w:b w:val="0"/>
+          <w:i/>
+          <w:sz w:val="19"/>
+        </w:rPr>
+        <w:t>rechtsförmige</w:t>
+      </w:r>
+      <w:r>
+        <w:rPr>
+          <w:rFonts w:ascii="Arial" w:hAnsi="Arial"/>
+          <w:b w:val="0"/>
+          <w:i w:val="0"/>
+          <w:sz w:val="19"/>
+        </w:rPr>
+        <w:t xml:space="preserve"> Ebene: Die humanen Talent-Bestände der Frontier-Modelle bewegen sich nicht nur ökonomisch, sondern zunehmend auch in Auseinandersetzungen um </w:t>
+      </w:r>
+      <w:r>
+        <w:rPr>
+          <w:rFonts w:ascii="Arial" w:hAnsi="Arial"/>
+          <w:b w:val="0"/>
+          <w:i/>
+          <w:sz w:val="19"/>
+        </w:rPr>
+        <w:t>Trade Secrets</w:t>
+      </w:r>
+      <w:r>
+        <w:rPr>
+          <w:rFonts w:ascii="Arial" w:hAnsi="Arial"/>
+          <w:b w:val="0"/>
+          <w:i w:val="0"/>
+          <w:sz w:val="19"/>
+        </w:rPr>
+        <w:t>, deren Ausgang die Marktstruktur — insbesondere im Übergang Frontier-Modell / KI-Hardware — mitprägen kann. Für die Deutschland-These (§ 8.3) unterstützt der Vorgang die These der fiskalischen Volatilität einer bestands­orientierten Umverteilung: Sobald Marktkapitalisierungen einzelner Frontier-Anbieter zusätzlich durch Trade-Secret-Verfahren adressierbar werden, verstärkt sich das Argument für wertschöpfungsbezogene statt marktkapitalisierungs­bezogene Zugriffe.</w:t>
       </w:r>
     </w:p>
     <w:p>
@@ -13456,6 +13668,124 @@
           <w:i w:val="0"/>
           <w:sz w:val="19"/>
         </w:rPr>
+        <w:t xml:space="preserve">Bundestag (BT-Drs. Kalenderwoche 28) / BMG / Pharma Deutschland / abgeordnetenwatch / transkript. (10. Juli 2026). </w:t>
+      </w:r>
+      <w:r>
+        <w:rPr>
+          <w:rFonts w:ascii="Arial" w:hAnsi="Arial"/>
+          <w:b w:val="0"/>
+          <w:i/>
+          <w:sz w:val="19"/>
+        </w:rPr>
+        <w:t>Bundestag verabschiedet GKV-Beitragssatzstabilisierungsgesetz — 2./3. Lesung; namentliche Abstimmung 318 zu 284 Stimmen / Bundestag beschließt GKV-Beitragssatzstabilisierungsgesetz.</w:t>
+      </w:r>
+      <w:r>
+        <w:rPr>
+          <w:rFonts w:ascii="Arial" w:hAnsi="Arial"/>
+          <w:b w:val="0"/>
+          <w:i w:val="0"/>
+          <w:sz w:val="19"/>
+        </w:rPr>
+        <w:t xml:space="preserve"> Zweiter und dritter Lesung des Kabinettsentwurfs vom 29. April 2026 (erste Lesung 12. Juni 2026) mit namentlicher Abstimmung in der 28. Kalenderwoche 2026; Konsolidierungspfad rund 15 bis 19,6 Milliarden Euro für 2027 bis rund 42,8 Milliarden Euro bis 2030; parlamentarische Fortsetzung im zweiten Bundesratsdurchgang angekündigt. Beleg für die Fortsetzung der GKV-Reformschiene in § 5.2. https://www.bundesgesundheitsministerium.de/ministerium/meldungen/bundestag-beschliesst-gkv-beitragssatzstabilisierunggesetz-pm-10-07-2026 | https://www.bundestag.de/dokumente/textarchiv/2026/kw28-de-gkv-1184352 | https://www.pharmadeutschland.de/newsroom/news/gkv-beitragssatzstabilisierungsgesetz-im-bundestag-beschlossen/ | https://www.abgeordnetenwatch.de/bundestag/21/abstimmungen/gkv-reform | https://transkript.de/artikel/2026/bundestag-beschliesst-gkv-beitragssatzstabilisierungsgesetz/</w:t>
+      </w:r>
+    </w:p>
+    <w:p>
+      <w:pPr>
+        <w:jc w:val="both"/>
+      </w:pPr>
+      <w:r>
+        <w:rPr>
+          <w:rFonts w:ascii="Arial" w:hAnsi="Arial"/>
+          <w:b w:val="0"/>
+          <w:i w:val="0"/>
+          <w:sz w:val="19"/>
+        </w:rPr>
+        <w:t xml:space="preserve">Apple Inc. v. OpenAI, OpenAI OpCo LLC &amp; io Products, Inc. / Bloomberg / CNBC / Axios / TechCrunch / Engadget / Cybersecurity News. (10. Juli 2026). </w:t>
+      </w:r>
+      <w:r>
+        <w:rPr>
+          <w:rFonts w:ascii="Arial" w:hAnsi="Arial"/>
+          <w:b w:val="0"/>
+          <w:i/>
+          <w:sz w:val="19"/>
+        </w:rPr>
+        <w:t>Complaint filed in the United States District Court for the Northern District of California / Apple sues OpenAI alleging trade secret theft, says scheme was „at every level" / Apple Sues OpenAI for Trade Secret Theft Over AI Hardware Designs / Apple sues OpenAI for trade secret theft / Apple sues OpenAI over alleged trade secret theft / Apple calls OpenAI's hardware business „rotten to its core" in trade secret theft lawsuit / Apple Sues OpenAI and Former Employees for Alleged Theft of Trade Secrets.</w:t>
+      </w:r>
+      <w:r>
+        <w:rPr>
+          <w:rFonts w:ascii="Arial" w:hAnsi="Arial"/>
+          <w:b w:val="0"/>
+          <w:i w:val="0"/>
+          <w:sz w:val="19"/>
+        </w:rPr>
+        <w:t xml:space="preserve"> 41-seitige Klageschrift gegen OpenAI, dessen Hardware-Tochter </w:t>
+      </w:r>
+      <w:r>
+        <w:rPr>
+          <w:rFonts w:ascii="Arial" w:hAnsi="Arial"/>
+          <w:b w:val="0"/>
+          <w:i/>
+          <w:sz w:val="19"/>
+        </w:rPr>
+        <w:t>io Products, Inc.</w:t>
+      </w:r>
+      <w:r>
+        <w:rPr>
+          <w:rFonts w:ascii="Arial" w:hAnsi="Arial"/>
+          <w:b w:val="0"/>
+          <w:i w:val="0"/>
+          <w:sz w:val="19"/>
+        </w:rPr>
+        <w:t xml:space="preserve">, den </w:t>
+      </w:r>
+      <w:r>
+        <w:rPr>
+          <w:rFonts w:ascii="Arial" w:hAnsi="Arial"/>
+          <w:b w:val="0"/>
+          <w:i/>
+          <w:sz w:val="19"/>
+        </w:rPr>
+        <w:t>Chief Hardware Officer</w:t>
+      </w:r>
+      <w:r>
+        <w:rPr>
+          <w:rFonts w:ascii="Arial" w:hAnsi="Arial"/>
+          <w:b w:val="0"/>
+          <w:i w:val="0"/>
+          <w:sz w:val="19"/>
+        </w:rPr>
+        <w:t xml:space="preserve"> Tang Yew Tan (früher Vice President bei Apple) und den früheren </w:t>
+      </w:r>
+      <w:r>
+        <w:rPr>
+          <w:rFonts w:ascii="Arial" w:hAnsi="Arial"/>
+          <w:b w:val="0"/>
+          <w:i/>
+          <w:sz w:val="19"/>
+        </w:rPr>
+        <w:t>Senior Systems Electrical Engineer</w:t>
+      </w:r>
+      <w:r>
+        <w:rPr>
+          <w:rFonts w:ascii="Arial" w:hAnsi="Arial"/>
+          <w:b w:val="0"/>
+          <w:i w:val="0"/>
+          <w:sz w:val="19"/>
+        </w:rPr>
+        <w:t xml:space="preserve"> Chang Liu wegen systematischer Aneignung von Trade Secrets „at every level, from members of technical staff to its Chief Hardware Officer, and in coordination with business partners"; Apple gibt an, dass über 400 ehemalige Apple-Beschäftigte inzwischen bei OpenAI arbeiten und nennt Show-and-Tell-Interviews mit „actual parts", Fortbestehen eines Apple-Notebooks nach Beschäftigungsende sowie Weitergabe eines Apple-Offboarding-Dokuments zur Umgehung der Exit-Sicherheitskontrollen. Ergänzt die rechtliche Dimension der DeepMind-Talent-Bestandsdimension in § 8.2. https://www.bloomberg.com/news/articles/2026-07-10/apple-sues-openai-for-trade-secret-theft-in-blockbuster-case | https://www.cnbc.com/2026/07/10/apple-openai-lawsuit-trade-secrets.html | https://www.axios.com/2026/07/10/apple-sues-openai-trade-secret-theft | https://techcrunch.com/2026/07/10/apple-sues-openai-over-alleged-trade-secret-theft/ | https://www.engadget.com/2212759/apple-calls-openais-hardware-business-rotten-to-its-core-in-trade-secret-theft-lawsuit/ | https://cybersecuritynews.com/apple-sues-openai/</w:t>
+      </w:r>
+    </w:p>
+    <w:p>
+      <w:pPr>
+        <w:jc w:val="both"/>
+      </w:pPr>
+      <w:r>
+        <w:rPr>
+          <w:rFonts w:ascii="Arial" w:hAnsi="Arial"/>
+          <w:b w:val="0"/>
+          <w:i w:val="0"/>
+          <w:sz w:val="19"/>
+        </w:rPr>
         <w:t xml:space="preserve">Meta / Fortune / CNBC / TechCrunch / TechTimes / Quartz / DataCamp / AI Weekly / Storyboard18 / cxotoday. (9. Juli 2026). </w:t>
       </w:r>
       <w:r>
@@ -13551,7 +13881,7 @@
           <w:i w:val="0"/>
           <w:sz w:val="19"/>
         </w:rPr>
-        <w:t xml:space="preserve"> Dieses Arbeitspapier gibt den Stand Anfang Juli 2026 (Schnitt am 12. Juli 2026 — Lauf 001 vom 12. Juli 2026) wieder. Die Debatte entwickelt sich dynamisch, insbesondere im Zuge der OpenAI-Strategiepapiere und der Eröffnung des OpenAI Workshop in Washington, D.C. im Mai 2026, des Erstdurchgangs des GKV-Beitragssatzstabilisierungsgesetzes in der 1065. Bundesratssitzung am 8. Mai 2026 mit 79 Tagesordnungspunkten (Kabinettsbeschluss 29. April 2026, parlamentarische Behandlung vor der Sommerpause 2026 angekündigt), der laufenden Trilog-Verhandlungen zum Digital Omnibus on AI (zweite Runde 28. April 2026 ohne Einigung; nächste Runde 13. Mai 2026 — Knackpunkt ist nicht die Verschiebung der Hochrisiko-Pflichten, sondern die Konformitätsbewertungs-Architektur für Anhang I; die zypriotische Ratspräsidentschaft strebt einen Abschluss vor Ablauf ihrer Amtszeit am 30. Juni 2026 an, andernfalls übernimmt die irische Präsidentschaft), der am 5. Mai 2026 erfolgten Arraignment-Verhandlung im Altman-Verfahren mit „nicht schuldig"-Plädoyer und angeordneter psychiatrischer Begutachtung, des am 7. Mai 2026 versandten individuellen Microsoft-Buyout-Angebots (Annahmefrist 8. Juni 2026, VRSAR-Unterzeichnung 9.–22. Juni 2026, bis zu fünfjährige Krankenversicherungs-Verlängerung), des am 1. Mai 2026 vom Connecticut-Repräsentantenhaus mit 131 zu 17 Stimmen verabschiedeten </w:t>
+        <w:t xml:space="preserve"> Dieses Arbeitspapier gibt den Stand Mitte Juli 2026 (Schnitt am 13. Juli 2026 — Lauf 001 vom 13. Juli 2026) wieder. Die Debatte entwickelt sich dynamisch, insbesondere im Zuge der OpenAI-Strategiepapiere und der Eröffnung des OpenAI Workshop in Washington, D.C. im Mai 2026, des Erstdurchgangs des GKV-Beitragssatzstabilisierungsgesetzes in der 1065. Bundesratssitzung am 8. Mai 2026 mit 79 Tagesordnungspunkten (Kabinettsbeschluss 29. April 2026, parlamentarische Behandlung vor der Sommerpause 2026 angekündigt), der laufenden Trilog-Verhandlungen zum Digital Omnibus on AI (zweite Runde 28. April 2026 ohne Einigung; nächste Runde 13. Mai 2026 — Knackpunkt ist nicht die Verschiebung der Hochrisiko-Pflichten, sondern die Konformitätsbewertungs-Architektur für Anhang I; die zypriotische Ratspräsidentschaft strebt einen Abschluss vor Ablauf ihrer Amtszeit am 30. Juni 2026 an, andernfalls übernimmt die irische Präsidentschaft), der am 5. Mai 2026 erfolgten Arraignment-Verhandlung im Altman-Verfahren mit „nicht schuldig"-Plädoyer und angeordneter psychiatrischer Begutachtung, des am 7. Mai 2026 versandten individuellen Microsoft-Buyout-Angebots (Annahmefrist 8. Juni 2026, VRSAR-Unterzeichnung 9.–22. Juni 2026, bis zu fünfjährige Krankenversicherungs-Verlängerung), des am 1. Mai 2026 vom Connecticut-Repräsentantenhaus mit 131 zu 17 Stimmen verabschiedeten </w:t>
       </w:r>
       <w:r>
         <w:rPr>
@@ -14541,7 +14871,115 @@
           <w:i w:val="0"/>
           <w:sz w:val="19"/>
         </w:rPr>
-        <w:t>-Modell mit Aufforderung an Anthropic, Alphabet/Google, Meta und xAI zu einer spiegelbildlichen 5-%-Beteiligung; informelle Gespräche mit Präsident Trump, Handelsminister Lutnick und Finanzminister Bessent — Aufnahme in § 4.5 (Fenstererweiterung wegen § 4.5-Kohärenz mit dem bereits eingearbeiteten Sanders-SWF-Act) als konzeptioneller Konter- und Ergänzungsvorschlag mit deutlich reduzierter Dotierung, freiwilliger Trägerlogik und offener institutioneller Kontrolle. Eine regelmäßige Aktualisierung ist vorgesehen.</w:t>
+        <w:t xml:space="preserve">-Modell mit Aufforderung an Anthropic, Alphabet/Google, Meta und xAI zu einer spiegelbildlichen 5-%-Beteiligung; informelle Gespräche mit Präsident Trump, Handelsminister Lutnick und Finanzminister Bessent — Aufnahme in § 4.5 (Fenstererweiterung wegen § 4.5-Kohärenz mit dem bereits eingearbeiteten Sanders-SWF-Act) als konzeptioneller Konter- und Ergänzungsvorschlag mit deutlich reduzierter Dotierung, freiwilliger Trägerlogik und offener institutioneller Kontrolle. Lauf 001 vom 13. Juli 2026 ergänzt zwei weitere Fortschreibungen: die zweite und dritte Lesung des </w:t>
+      </w:r>
+      <w:r>
+        <w:rPr>
+          <w:rFonts w:ascii="Arial" w:hAnsi="Arial"/>
+          <w:b w:val="0"/>
+          <w:i/>
+          <w:sz w:val="19"/>
+        </w:rPr>
+        <w:t>GKV-Beitragssatzstabilisierungsgesetzes</w:t>
+      </w:r>
+      <w:r>
+        <w:rPr>
+          <w:rFonts w:ascii="Arial" w:hAnsi="Arial"/>
+          <w:b w:val="0"/>
+          <w:i w:val="0"/>
+          <w:sz w:val="19"/>
+        </w:rPr>
+        <w:t xml:space="preserve"> im Bundestag am 10. Juli 2026 (namentliche Abstimmung 318 zu 284 Stimmen in Kalenderwoche 28; erste Lesung 12. Juni 2026, Kabinettsbeschluss 29. April 2026, erster Bundesratsdurchgang 8. Mai 2026 — 1065. Sitzung; zweiter Bundesratsdurchgang steht noch aus — die Beitragsseite bleibt ausdrücklich unberührt, das Gesetz zielt ausgaben- und strukturseitig auf einen Konsolidierungspfad von rund 15 bis 19,6 Mrd. Euro für 2027 mit einer Steigerung auf rund 42,8 Mrd. Euro bis 2030 — § 5.2); sowie die am 10. Juli 2026 vor dem </w:t>
+      </w:r>
+      <w:r>
+        <w:rPr>
+          <w:rFonts w:ascii="Arial" w:hAnsi="Arial"/>
+          <w:b w:val="0"/>
+          <w:i/>
+          <w:sz w:val="19"/>
+        </w:rPr>
+        <w:t>United States District Court for the Northern District of California</w:t>
+      </w:r>
+      <w:r>
+        <w:rPr>
+          <w:rFonts w:ascii="Arial" w:hAnsi="Arial"/>
+          <w:b w:val="0"/>
+          <w:i w:val="0"/>
+          <w:sz w:val="19"/>
+        </w:rPr>
+        <w:t xml:space="preserve"> eingereichte 41-seitige Klageschrift </w:t>
+      </w:r>
+      <w:r>
+        <w:rPr>
+          <w:rFonts w:ascii="Arial" w:hAnsi="Arial"/>
+          <w:b w:val="0"/>
+          <w:i/>
+          <w:sz w:val="19"/>
+        </w:rPr>
+        <w:t>Apple Inc. v. OpenAI, OpenAI OpCo LLC &amp; io Products, Inc.</w:t>
+      </w:r>
+      <w:r>
+        <w:rPr>
+          <w:rFonts w:ascii="Arial" w:hAnsi="Arial"/>
+          <w:b w:val="0"/>
+          <w:i w:val="0"/>
+          <w:sz w:val="19"/>
+        </w:rPr>
+        <w:t xml:space="preserve"> (Bloomberg, CNBC, Axios, Engadget, TechCrunch, Cybersecurity News) mit dem Vorwurf systematischer Aneignung von Trade Secrets „at every level, from members of technical staff to its Chief Hardware Officer, and in coordination with business partners"; Apple gibt an, dass inzwischen über 400 ehemalige Apple-Beschäftigte bei OpenAI arbeiten, benannt sind unter anderem der OpenAI </w:t>
+      </w:r>
+      <w:r>
+        <w:rPr>
+          <w:rFonts w:ascii="Arial" w:hAnsi="Arial"/>
+          <w:b w:val="0"/>
+          <w:i/>
+          <w:sz w:val="19"/>
+        </w:rPr>
+        <w:t>Chief Hardware Officer</w:t>
+      </w:r>
+      <w:r>
+        <w:rPr>
+          <w:rFonts w:ascii="Arial" w:hAnsi="Arial"/>
+          <w:b w:val="0"/>
+          <w:i w:val="0"/>
+          <w:sz w:val="19"/>
+        </w:rPr>
+        <w:t xml:space="preserve"> Tang Yew Tan (früher Vice President bei Apple) sowie der frühere </w:t>
+      </w:r>
+      <w:r>
+        <w:rPr>
+          <w:rFonts w:ascii="Arial" w:hAnsi="Arial"/>
+          <w:b w:val="0"/>
+          <w:i/>
+          <w:sz w:val="19"/>
+        </w:rPr>
+        <w:t>Senior Systems Electrical Engineer</w:t>
+      </w:r>
+      <w:r>
+        <w:rPr>
+          <w:rFonts w:ascii="Arial" w:hAnsi="Arial"/>
+          <w:b w:val="0"/>
+          <w:i w:val="0"/>
+          <w:sz w:val="19"/>
+        </w:rPr>
+        <w:t xml:space="preserve"> Chang Liu — Aufnahme in § 8.2 als </w:t>
+      </w:r>
+      <w:r>
+        <w:rPr>
+          <w:rFonts w:ascii="Arial" w:hAnsi="Arial"/>
+          <w:b w:val="0"/>
+          <w:i/>
+          <w:sz w:val="19"/>
+        </w:rPr>
+        <w:t>rechtsförmige</w:t>
+      </w:r>
+      <w:r>
+        <w:rPr>
+          <w:rFonts w:ascii="Arial" w:hAnsi="Arial"/>
+          <w:b w:val="0"/>
+          <w:i w:val="0"/>
+          <w:sz w:val="19"/>
+        </w:rPr>
+        <w:t xml:space="preserve"> Fortschreibung der DeepMind-Talent-Bestandsdimension aus Version 29.0 und als weiteres Volatilitätsargument gegen eine bestandsorientierte Umverteilungs­logik (§ 8.3). Eine regelmäßige Aktualisierung ist vorgesehen.</w:t>
       </w:r>
     </w:p>
     <w:p>
@@ -14621,7 +15059,7 @@
         <w:color w:val="999999"/>
         <w:sz w:val="15"/>
       </w:rPr>
-      <w:t>Version 32.0 — Mai 2026 — CC BY 4.0</w:t>
+      <w:t>Version 33.0 — Mai 2026 — CC BY 4.0</w:t>
       <w:tab/>
       <w:t xml:space="preserve">Seite </w:t>
     </w:r>

</xml_diff>

<commit_message>
Daily-Update 2026-07-14 — Version 34.0 (Cluster: B/E)
Vollzug des zweiten Bundesratsdurchgangs des GKV-Beitragssatzstabilisierungsgesetzes
am 10. Juli 2026: Antrag von 6 Ländern (Saarland, Bremen, Hamburg,
Mecklenburg-Vorpommern, Niedersachsen, Sachsen-Anhalt) auf Anrufung des
Vermittlungsausschusses scheitert an der Zweidrittelmehrheit; Bundesregierung
sichert in Protokollerklärung Zugeständnisse zu (~550 Mio. EUR zusätzliche
Krankenhausmittel, Angleichung Kostenaufwuchsgrenze, Abbau PPR 2.0, Pharma-
Ausnahmen bis Januar 2027, interministerielles Fachgremium bis Ende September
2026). Der im Vorlauf offene Punkt ist damit erledigt; das Gesetz kann ohne
weitere parlamentarische Behandlung in Kraft treten.

- § 5.2 aktualisiert; § 11.3 um Sammelbeleg (Ärzteblatt, DATEV, STB Treuhand,
  ZDFheute) ergänzt.
- Version 33.0 → 34.0 in Dokumentkopf, Dokumentende, README, Validierung.
- PDF und Word neu erstellt.
- Neuer Block in Änderungshistorie.md und Validierung-Ergebnisse.md.
</commit_message>
<xml_diff>
--- a/KI-Ökonomie.docx
+++ b/KI-Ökonomie.docx
@@ -112,7 +112,7 @@
           <w:color w:val="666666"/>
           <w:sz w:val="18"/>
         </w:rPr>
-        <w:t>Version 33.0</w:t>
+        <w:t>Version 34.0</w:t>
       </w:r>
     </w:p>
     <w:p>
@@ -4655,7 +4655,7 @@
           <w:i w:val="0"/>
           <w:sz w:val="19"/>
         </w:rPr>
-        <w:t xml:space="preserve"> beschlossen; im Verlauf der Ressortabstimmung wurde das Sparvolumen je nach Berichterstattung mit rund 16,3 Milliarden Euro (Frühberichterstattung) bzw. rund 19,6 Milliarden Euro (BMG-Tabellen Stand Anfang Mai 2026, gegliedert in 4,9 Milliarden einnahmen­seitige und rund 15 Milliarden ausgaben­seitige Komponenten) für 2027 angegeben; bis 2030 sieht das BMG eine Steigerung des Konsolidierungseffekts auf rund 42,8 Milliarden Euro vor. Die parlamentarische Behandlung soll laut BMG-Zeitplan vor der Sommerpause 2026 abgeschlossen werden — der Kabinettentwurf wird dem Bundesrat im ersten Durchgang am 8. Mai 2026 zugeleitet (1065. Sitzung; insgesamt 79 Tagesordnungspunkte, darunter eine flankierende Thüringer Entschließung zum Bürokratieabbau in der gesetzlichen Krankenversicherung); die erste Bundestagslesung findet am 12. Juni 2026 statt, die 2./3. Lesung folgt am 10. Juli 2026 in namentlicher Abstimmung mit 318 zu 284 Stimmen (Bundestag, Kalenderwoche 28) — das Gesetz ist damit vor der Sommerpause 2026 im Bundestag verabschiedet, mit noch anstehendem zweiten Durchgang im Bundesrat. Die Reform belastet Krankenhäuser, pharmazeutische Industrie, Apotheken, Ärzteschaft, Versicherte, Arbeitgeber und Krankenkassen gemeinsam; sie folgt dem Leitsatz „Ausgaben an Einnahmen koppeln" und greift damit fiskalisch genau die Logik auf, die § 5.1 in der Beitrags­seite spiegelbildlich zu erweitern vorschlägt. Auch wenn die GKV-Reform primär ausgaben- und strukturseitig ansetzt, bestätigt sie den in § 5.1 angerissenen finanzpolitischen Befund: Die lohnbasierten Sicherungszweige geraten gleichzeitig durch demografischen Druck und durch die in § 1.1 dokumentierten KI-induzierten Beschäftigungsverschiebungen unter Spannung — eine Verbreiterung der Bemessungsgrundlage gewinnt damit zusätzlich an Plausibilität.</w:t>
+        <w:t xml:space="preserve"> beschlossen; im Verlauf der Ressortabstimmung wurde das Sparvolumen je nach Berichterstattung mit rund 16,3 Milliarden Euro (Frühberichterstattung) bzw. rund 19,6 Milliarden Euro (BMG-Tabellen Stand Anfang Mai 2026, gegliedert in 4,9 Milliarden einnahmen­seitige und rund 15 Milliarden ausgaben­seitige Komponenten) für 2027 angegeben; bis 2030 sieht das BMG eine Steigerung des Konsolidierungseffekts auf rund 42,8 Milliarden Euro vor. Die parlamentarische Behandlung soll laut BMG-Zeitplan vor der Sommerpause 2026 abgeschlossen werden — der Kabinettentwurf wird dem Bundesrat im ersten Durchgang am 8. Mai 2026 zugeleitet (1065. Sitzung; insgesamt 79 Tagesordnungspunkte, darunter eine flankierende Thüringer Entschließung zum Bürokratieabbau in der gesetzlichen Krankenversicherung); die erste Bundestagslesung findet am 12. Juni 2026 statt, die 2./3. Lesung folgt am 10. Juli 2026 in namentlicher Abstimmung mit 318 zu 284 Stimmen (Bundestag, Kalenderwoche 28); der zweite Bundesratsdurchgang findet am selben 10. Juli 2026 statt und billigt das Gesetz — ein von den Ländern Saarland, Bremen, Hamburg, Mecklenburg-Vorpommern, Niedersachsen und Sachsen-Anhalt gestellter Antrag auf Anrufung des Vermittlungsausschusses scheitert an der Zweidrittelmehrheit, nachdem die Bundesregierung in einer Protokollerklärung Zugeständnisse zusichert (rund 550 Millionen Euro zusätzliche Krankenhausmittel, davon 100 Millionen für Universitätskliniken ab 2027 und 450 Millionen über einen erhöhten Rechnungszuschlag, Angleichung der Kostenaufwuchsgrenze 2027–2029, Abbau von Bürokratie einschließlich PPR 2.0 und Pflegepersonaluntergrenzen sowie erweiterte Ausnahmen vom 15,5-%-Herstellerabschlag im Pharmabereich bis Januar 2027 und ein interministerielles Fachgremium bis Ende September 2026) — das Gesetz kann damit ohne weitere parlamentarische Behandlung in Kraft treten. Die Reform belastet Krankenhäuser, pharmazeutische Industrie, Apotheken, Ärzteschaft, Versicherte, Arbeitgeber und Krankenkassen gemeinsam; sie folgt dem Leitsatz „Ausgaben an Einnahmen koppeln" und greift damit fiskalisch genau die Logik auf, die § 5.1 in der Beitrags­seite spiegelbildlich zu erweitern vorschlägt. Auch wenn die GKV-Reform primär ausgaben- und strukturseitig ansetzt, bestätigt sie den in § 5.1 angerissenen finanzpolitischen Befund: Die lohnbasierten Sicherungszweige geraten gleichzeitig durch demografischen Druck und durch die in § 1.1 dokumentierten KI-induzierten Beschäftigungsverschiebungen unter Spannung — eine Verbreiterung der Bemessungsgrundlage gewinnt damit zusätzlich an Plausibilität.</w:t>
       </w:r>
     </w:p>
     <w:p>
@@ -13668,6 +13668,56 @@
           <w:i w:val="0"/>
           <w:sz w:val="19"/>
         </w:rPr>
+        <w:t xml:space="preserve">Bundesrat / Deutsches Ärzteblatt / DATEV-Magazin / STB Treuhand / ZDFheute. (10. Juli 2026). </w:t>
+      </w:r>
+      <w:r>
+        <w:rPr>
+          <w:rFonts w:ascii="Arial" w:hAnsi="Arial"/>
+          <w:b w:val="0"/>
+          <w:i/>
+          <w:sz w:val="19"/>
+        </w:rPr>
+        <w:t>GKV-Reform passiert Bundesrat, Entlastung für Kliniken und Pharma versprochen / Bundesrat billigt Reform der gesetzlichen Krankenkassen / Beschlüsse aus Berlin: Von Gesundheitsreform bis E-Scooter-Regeln.</w:t>
+      </w:r>
+      <w:r>
+        <w:rPr>
+          <w:rFonts w:ascii="Arial" w:hAnsi="Arial"/>
+          <w:b w:val="0"/>
+          <w:i w:val="0"/>
+          <w:sz w:val="19"/>
+        </w:rPr>
+        <w:t xml:space="preserve"> Zweiter Bundesratsdurchgang des </w:t>
+      </w:r>
+      <w:r>
+        <w:rPr>
+          <w:rFonts w:ascii="Arial" w:hAnsi="Arial"/>
+          <w:b w:val="0"/>
+          <w:i/>
+          <w:sz w:val="19"/>
+        </w:rPr>
+        <w:t>GKV-Beitragssatzstabilisierungsgesetzes</w:t>
+      </w:r>
+      <w:r>
+        <w:rPr>
+          <w:rFonts w:ascii="Arial" w:hAnsi="Arial"/>
+          <w:b w:val="0"/>
+          <w:i w:val="0"/>
+          <w:sz w:val="19"/>
+        </w:rPr>
+        <w:t xml:space="preserve"> am 10. Juli 2026; der von sechs Ländern (Saarland, Bremen, Hamburg, Mecklenburg-Vorpommern, Niedersachsen, Sachsen-Anhalt) gestellte Antrag auf Anrufung des Vermittlungsausschusses scheitert an der Zweidrittelmehrheit; Bundesregierung sichert in Protokollerklärung Zugeständnisse zu (~550 Mio. EUR zusätzliche Krankenhausmittel — davon 100 Mio. EUR Universitätskliniken ab 2027 und 450 Mio. EUR erhöhter Rechnungszuschlag —, Angleichung der Kostenaufwuchsgrenze 2027–2029, Abbau PPR 2.0 und Pflegepersonaluntergrenzen, Ausnahmen vom 15,5-%-Herstellerabschlag bis Januar 2027, interministerielles Fachgremium bis Ende September 2026). Vervollständigt den Gesetzgebungspfad der GKV-Reform in § 5.2. https://www.aerzteblatt.de/news/gkv-reform-passiert-bundesrat-entlastung-fur-kliniken-und-pharma-versprochen-9999ba6d-930c-46a0-b239-34417cf620ec | https://www.datev-magazin.de/nachrichten-steuern-recht/recht/bundesrat-billigt-reform-der-gesetzlichen-krankenkassen-147794 | https://stb-treuhand.de/blog/bundesrat-billigt-reform-der-gesetzlichen-krankenkassen/ | https://www.zdfheute.de/politik/deutschland/bundestag-bundesrat-entscheidungen-ueberblick-100.html</w:t>
+      </w:r>
+    </w:p>
+    <w:p>
+      <w:pPr>
+        <w:jc w:val="both"/>
+      </w:pPr>
+      <w:r>
+        <w:rPr>
+          <w:rFonts w:ascii="Arial" w:hAnsi="Arial"/>
+          <w:b w:val="0"/>
+          <w:i w:val="0"/>
+          <w:sz w:val="19"/>
+        </w:rPr>
         <w:t xml:space="preserve">Bundestag (BT-Drs. Kalenderwoche 28) / BMG / Pharma Deutschland / abgeordnetenwatch / transkript. (10. Juli 2026). </w:t>
       </w:r>
       <w:r>
@@ -13881,7 +13931,7 @@
           <w:i w:val="0"/>
           <w:sz w:val="19"/>
         </w:rPr>
-        <w:t xml:space="preserve"> Dieses Arbeitspapier gibt den Stand Mitte Juli 2026 (Schnitt am 13. Juli 2026 — Lauf 001 vom 13. Juli 2026) wieder. Die Debatte entwickelt sich dynamisch, insbesondere im Zuge der OpenAI-Strategiepapiere und der Eröffnung des OpenAI Workshop in Washington, D.C. im Mai 2026, des Erstdurchgangs des GKV-Beitragssatzstabilisierungsgesetzes in der 1065. Bundesratssitzung am 8. Mai 2026 mit 79 Tagesordnungspunkten (Kabinettsbeschluss 29. April 2026, parlamentarische Behandlung vor der Sommerpause 2026 angekündigt), der laufenden Trilog-Verhandlungen zum Digital Omnibus on AI (zweite Runde 28. April 2026 ohne Einigung; nächste Runde 13. Mai 2026 — Knackpunkt ist nicht die Verschiebung der Hochrisiko-Pflichten, sondern die Konformitätsbewertungs-Architektur für Anhang I; die zypriotische Ratspräsidentschaft strebt einen Abschluss vor Ablauf ihrer Amtszeit am 30. Juni 2026 an, andernfalls übernimmt die irische Präsidentschaft), der am 5. Mai 2026 erfolgten Arraignment-Verhandlung im Altman-Verfahren mit „nicht schuldig"-Plädoyer und angeordneter psychiatrischer Begutachtung, des am 7. Mai 2026 versandten individuellen Microsoft-Buyout-Angebots (Annahmefrist 8. Juni 2026, VRSAR-Unterzeichnung 9.–22. Juni 2026, bis zu fünfjährige Krankenversicherungs-Verlängerung), des am 1. Mai 2026 vom Connecticut-Repräsentantenhaus mit 131 zu 17 Stimmen verabschiedeten </w:t>
+        <w:t xml:space="preserve"> Dieses Arbeitspapier gibt den Stand Mitte Juli 2026 (Schnitt am 14. Juli 2026 — Lauf 001 vom 14. Juli 2026) wieder. Die Debatte entwickelt sich dynamisch, insbesondere im Zuge der OpenAI-Strategiepapiere und der Eröffnung des OpenAI Workshop in Washington, D.C. im Mai 2026, des Erstdurchgangs des GKV-Beitragssatzstabilisierungsgesetzes in der 1065. Bundesratssitzung am 8. Mai 2026 mit 79 Tagesordnungspunkten (Kabinettsbeschluss 29. April 2026, parlamentarische Behandlung vor der Sommerpause 2026 angekündigt), der laufenden Trilog-Verhandlungen zum Digital Omnibus on AI (zweite Runde 28. April 2026 ohne Einigung; nächste Runde 13. Mai 2026 — Knackpunkt ist nicht die Verschiebung der Hochrisiko-Pflichten, sondern die Konformitätsbewertungs-Architektur für Anhang I; die zypriotische Ratspräsidentschaft strebt einen Abschluss vor Ablauf ihrer Amtszeit am 30. Juni 2026 an, andernfalls übernimmt die irische Präsidentschaft), der am 5. Mai 2026 erfolgten Arraignment-Verhandlung im Altman-Verfahren mit „nicht schuldig"-Plädoyer und angeordneter psychiatrischer Begutachtung, des am 7. Mai 2026 versandten individuellen Microsoft-Buyout-Angebots (Annahmefrist 8. Juni 2026, VRSAR-Unterzeichnung 9.–22. Juni 2026, bis zu fünfjährige Krankenversicherungs-Verlängerung), des am 1. Mai 2026 vom Connecticut-Repräsentantenhaus mit 131 zu 17 Stimmen verabschiedeten </w:t>
       </w:r>
       <w:r>
         <w:rPr>
@@ -14979,7 +15029,25 @@
           <w:i w:val="0"/>
           <w:sz w:val="19"/>
         </w:rPr>
-        <w:t xml:space="preserve"> Fortschreibung der DeepMind-Talent-Bestandsdimension aus Version 29.0 und als weiteres Volatilitätsargument gegen eine bestandsorientierte Umverteilungs­logik (§ 8.3). Eine regelmäßige Aktualisierung ist vorgesehen.</w:t>
+        <w:t xml:space="preserve"> Fortschreibung der DeepMind-Talent-Bestandsdimension aus Version 29.0 und als weiteres Volatilitätsargument gegen eine bestandsorientierte Umverteilungs­logik (§ 8.3). Lauf 001 vom 14. Juli 2026 ergänzt eine weitere Fortschreibung: den Vollzug des zweiten Bundesratsdurchgangs des </w:t>
+      </w:r>
+      <w:r>
+        <w:rPr>
+          <w:rFonts w:ascii="Arial" w:hAnsi="Arial"/>
+          <w:b w:val="0"/>
+          <w:i/>
+          <w:sz w:val="19"/>
+        </w:rPr>
+        <w:t>GKV-Beitragssatzstabilisierungsgesetzes</w:t>
+      </w:r>
+      <w:r>
+        <w:rPr>
+          <w:rFonts w:ascii="Arial" w:hAnsi="Arial"/>
+          <w:b w:val="0"/>
+          <w:i w:val="0"/>
+          <w:sz w:val="19"/>
+        </w:rPr>
+        <w:t xml:space="preserve"> am 10. Juli 2026 (Deutsches Ärzteblatt, DATEV-Magazin, STB Treuhand, ZDFheute); der Antrag von sechs Ländern (Saarland, Bremen, Hamburg, Mecklenburg-Vorpommern, Niedersachsen, Sachsen-Anhalt) auf Anrufung des Vermittlungsausschusses scheitert an der Zweidrittelmehrheit, nachdem die Bundesregierung in einer Protokollerklärung Zugeständnisse zusichert — rund 550 Millionen Euro zusätzliche Krankenhausmittel (davon 100 Millionen Euro für Universitätskliniken ab 2027 und 450 Millionen Euro über einen erhöhten Rechnungszuschlag), Angleichung der Kostenaufwuchsgrenze 2027–2029, Abbau von Bürokratie einschließlich PPR 2.0 und Pflegepersonaluntergrenzen, erweiterte Ausnahmen vom 15,5-%-Herstellerabschlag im Pharmabereich bis Januar 2027 sowie ein interministerielles Fachgremium bis Ende September 2026; das Gesetz kann damit ohne weitere parlamentarische Behandlung in Kraft treten und schließt damit die in § 5.2 dokumentierte GKV-Reformschiene ab. Eine regelmäßige Aktualisierung ist vorgesehen.</w:t>
       </w:r>
     </w:p>
     <w:p>
@@ -15059,7 +15127,7 @@
         <w:color w:val="999999"/>
         <w:sz w:val="15"/>
       </w:rPr>
-      <w:t>Version 33.0 — Mai 2026 — CC BY 4.0</w:t>
+      <w:t>Version 34.0 — Mai 2026 — CC BY 4.0</w:t>
       <w:tab/>
       <w:t xml:space="preserve">Seite </w:t>
     </w:r>

</xml_diff>

<commit_message>
Daily-Update 2026-07-15 — Version 35.0 (Cluster: D, E/H)
- § 5.2: Regierungserklärung Bundeskanzler Merz vom 9. Juli 2026 mit
  Zwischenbilanz nach 14 Monaten, 34-Punkte-Reformpaket (Steuer, Rente,
  Gesundheit, Arbeit), Startup-Verband-Zahlen (> 3.000 Neugründungen H1
  2026, > 1/3 mit KI-Bezug), Halbleiterproduktion Dresden, 33 ASK-
  Empfehlungen bis Ende 2026.
- § 1.1: BMWK-Monatspublikation vom 14. Juli 2026 als amtlicher
  Standbericht (Erwerbstätigkeit −8.000 Mai, sv-Beschäftigung −5.000
  April; KI + Demografie als strukturelle Herausforderungen; KI-Boom
  stützt Asien-Handel, +2,3 % Exporte DV-Geräte).
- § 11.3: Drei neue Einträge (BMWK, Regierungserklärung Merz,
  Koalitionsausschuss-Papier).
- Version 34.0 → 35.0 (Dokumentkopf, Aktualitätshinweis, README.md,
  Validierung-Ergebnisse.md).
- PDF und DOCX neu erstellt.
</commit_message>
<xml_diff>
--- a/KI-Ökonomie.docx
+++ b/KI-Ökonomie.docx
@@ -112,7 +112,7 @@
           <w:color w:val="666666"/>
           <w:sz w:val="18"/>
         </w:rPr>
-        <w:t>Version 34.0</w:t>
+        <w:t>Version 35.0</w:t>
       </w:r>
     </w:p>
     <w:p>
@@ -778,7 +778,25 @@
           <w:i w:val="0"/>
           <w:sz w:val="19"/>
         </w:rPr>
-        <w:t xml:space="preserve"> aus dem Frühjahr 2026 zeigt in dieselbe Richtung: 32 % der US-Hiring-Manager, die eine Rolle primär aufgrund von KI abgebaut haben, mussten dieselbe oder eine ähnliche Rolle später wiederbesetzen; die höchsten Rückholquoten liegen im Finanzsektor (44 %), gefolgt von HR (35 %) und Technology (32 %). Für die Steuerdebatte hat dieser Befund eine doppelte Bedeutung: Zum einen dämpft er die für eine zielgerichtete Ersatzabgabe (Typ 5 nach § 2.1) benötigte Kausalzuweisung „nachgewiesene KI-Verdrängung" zusätzlich (vgl. § 9.1), zum anderen stützt er die in § 3.4 referierte Warnung, symbolische oder voreilige Automatisierungssteuern könnten sich als kontraproduktiv erweisen, weil die zugrundeliegende Verdrängungshypothese nur teilweise erhärtet ist. Andererseits steht die Finanzierung der sozialen Sicherungssysteme — insbesondere der paritätisch über Löhne finanzierten Zweige Kranken-, Pflege-, Renten- und Arbeitslosenversicherung — vor strukturellen Herausforderungen durch den demografischen Wandel.</w:t>
+        <w:t xml:space="preserve"> aus dem Frühjahr 2026 zeigt in dieselbe Richtung: 32 % der US-Hiring-Manager, die eine Rolle primär aufgrund von KI abgebaut haben, mussten dieselbe oder eine ähnliche Rolle später wiederbesetzen; die höchsten Rückholquoten liegen im Finanzsektor (44 %), gefolgt von HR (35 %) und Technology (32 %). Für die Steuerdebatte hat dieser Befund eine doppelte Bedeutung: Zum einen dämpft er die für eine zielgerichtete Ersatzabgabe (Typ 5 nach § 2.1) benötigte Kausalzuweisung „nachgewiesene KI-Verdrängung" zusätzlich (vgl. § 9.1), zum anderen stützt er die in § 3.4 referierte Warnung, symbolische oder voreilige Automatisierungssteuern könnten sich als kontraproduktiv erweisen, weil die zugrundeliegende Verdrängungshypothese nur teilweise erhärtet ist. Diese binnenwirtschaftliche Grundlagenspannung wird durch die am 14. Juli 2026 veröffentlichte Monatspublikation </w:t>
+      </w:r>
+      <w:r>
+        <w:rPr>
+          <w:rFonts w:ascii="Arial" w:hAnsi="Arial"/>
+          <w:b w:val="0"/>
+          <w:i/>
+          <w:sz w:val="19"/>
+        </w:rPr>
+        <w:t>„Die wirtschaftliche Lage in Deutschland im Juli 2026"</w:t>
+      </w:r>
+      <w:r>
+        <w:rPr>
+          <w:rFonts w:ascii="Arial" w:hAnsi="Arial"/>
+          <w:b w:val="0"/>
+          <w:i w:val="0"/>
+          <w:sz w:val="19"/>
+        </w:rPr>
+        <w:t xml:space="preserve"> des Bundesministeriums für Wirtschaft und Energie (BMWK) im amtlichen Standbericht bestätigt: Die Erwerbstätigkeit sank im Mai 2026 um 8.000 Personen, die sozialversicherungspflichtige Beschäftigung im April 2026 um 5.000 Personen, während die Arbeitslosigkeit im Juni stabil blieb; das Ministerium ordnet die Perspektive als „noch keine Verbesserung der Arbeitsmarktperspektiven" ein und benennt „die zunehmende Bedeutung künstlicher Intelligenz und den demografischen Wandel" ausdrücklich als strukturelle Herausforderungen. Zugleich hebt der Bericht hervor, dass „die starke Handelsdynamik in Asien im Zusammenhang mit dem KI-Boom" den Welthandel stützt und im Mai 2026 zu einem Anstieg der Exporte von Datenverarbeitungsgeräten um 2,3 % beigetragen hat — die KI-Nachfrage wird damit erstmals auf amtlicher Ebene als eigenständiger, kurzfristig konjunkturstützender Faktor in einer Monatsbetrachtung aus­gewiesen. Andererseits steht die Finanzierung der sozialen Sicherungssysteme — insbesondere der paritätisch über Löhne finanzierten Zweige Kranken-, Pflege-, Renten- und Arbeitslosenversicherung — vor strukturellen Herausforderungen durch den demografischen Wandel.</w:t>
       </w:r>
     </w:p>
     <w:p>
@@ -4656,6 +4674,47 @@
           <w:sz w:val="19"/>
         </w:rPr>
         <w:t xml:space="preserve"> beschlossen; im Verlauf der Ressortabstimmung wurde das Sparvolumen je nach Berichterstattung mit rund 16,3 Milliarden Euro (Frühberichterstattung) bzw. rund 19,6 Milliarden Euro (BMG-Tabellen Stand Anfang Mai 2026, gegliedert in 4,9 Milliarden einnahmen­seitige und rund 15 Milliarden ausgaben­seitige Komponenten) für 2027 angegeben; bis 2030 sieht das BMG eine Steigerung des Konsolidierungseffekts auf rund 42,8 Milliarden Euro vor. Die parlamentarische Behandlung soll laut BMG-Zeitplan vor der Sommerpause 2026 abgeschlossen werden — der Kabinettentwurf wird dem Bundesrat im ersten Durchgang am 8. Mai 2026 zugeleitet (1065. Sitzung; insgesamt 79 Tagesordnungspunkte, darunter eine flankierende Thüringer Entschließung zum Bürokratieabbau in der gesetzlichen Krankenversicherung); die erste Bundestagslesung findet am 12. Juni 2026 statt, die 2./3. Lesung folgt am 10. Juli 2026 in namentlicher Abstimmung mit 318 zu 284 Stimmen (Bundestag, Kalenderwoche 28); der zweite Bundesratsdurchgang findet am selben 10. Juli 2026 statt und billigt das Gesetz — ein von den Ländern Saarland, Bremen, Hamburg, Mecklenburg-Vorpommern, Niedersachsen und Sachsen-Anhalt gestellter Antrag auf Anrufung des Vermittlungsausschusses scheitert an der Zweidrittelmehrheit, nachdem die Bundesregierung in einer Protokollerklärung Zugeständnisse zusichert (rund 550 Millionen Euro zusätzliche Krankenhausmittel, davon 100 Millionen für Universitätskliniken ab 2027 und 450 Millionen über einen erhöhten Rechnungszuschlag, Angleichung der Kostenaufwuchsgrenze 2027–2029, Abbau von Bürokratie einschließlich PPR 2.0 und Pflegepersonaluntergrenzen sowie erweiterte Ausnahmen vom 15,5-%-Herstellerabschlag im Pharmabereich bis Januar 2027 und ein interministerielles Fachgremium bis Ende September 2026) — das Gesetz kann damit ohne weitere parlamentarische Behandlung in Kraft treten. Die Reform belastet Krankenhäuser, pharmazeutische Industrie, Apotheken, Ärzteschaft, Versicherte, Arbeitgeber und Krankenkassen gemeinsam; sie folgt dem Leitsatz „Ausgaben an Einnahmen koppeln" und greift damit fiskalisch genau die Logik auf, die § 5.1 in der Beitrags­seite spiegelbildlich zu erweitern vorschlägt. Auch wenn die GKV-Reform primär ausgaben- und strukturseitig ansetzt, bestätigt sie den in § 5.1 angerissenen finanzpolitischen Befund: Die lohnbasierten Sicherungszweige geraten gleichzeitig durch demografischen Druck und durch die in § 1.1 dokumentierten KI-induzierten Beschäftigungsverschiebungen unter Spannung — eine Verbreiterung der Bemessungsgrundlage gewinnt damit zusätzlich an Plausibilität.</w:t>
+      </w:r>
+    </w:p>
+    <w:p>
+      <w:pPr>
+        <w:jc w:val="both"/>
+      </w:pPr>
+      <w:r>
+        <w:rPr>
+          <w:rFonts w:ascii="Arial" w:hAnsi="Arial"/>
+          <w:b/>
+          <w:i w:val="0"/>
+          <w:sz w:val="19"/>
+        </w:rPr>
+        <w:t>Regierungserklärung Bundeskanzler Merz zur Zwischenbilanz und Reformpaket (9. Juli 2026):</w:t>
+      </w:r>
+      <w:r>
+        <w:rPr>
+          <w:rFonts w:ascii="Arial" w:hAnsi="Arial"/>
+          <w:b w:val="0"/>
+          <w:i w:val="0"/>
+          <w:sz w:val="19"/>
+        </w:rPr>
+        <w:t xml:space="preserve"> Am 9. Juli 2026 hat Bundeskanzler Friedrich Merz in der 89. Sitzung des 21. Deutschen Bundestages eine Regierungserklärung „zur aktuellen politischen Lage" abgegeben und dabei eine positive Zwischenbilanz der Union-SPD-Koalition nach 14 Monaten Amtszeit gezogen. Für die in § 5.1 und § 5.2 diskutierte Reformschiene ist der Auftritt in zweifacher Hinsicht relevant. Erstens hat Merz das im Koalitionsausschuss am 1./2. Juli 2026 beschlossene 34-Punkte-Programm „für Aufschwung und Beschäftigung" als „substanzielles Paket, das in seiner Größenordnung in den vergangenen Jahren von keiner Bundesregierung so angepackt wurde" charakterisiert; das Programm verklammert die Reformen der Steuer, der gesetzlichen Rentenversicherung, der gesetzlichen Krankenversicherung und des Arbeitsmarkts und bezieht ausdrücklich die vollständige Umsetzung der 33 Empfehlungen der Alterssicherungskommission (Bericht vom 23. Juni 2026) mit ein — die legislative Umsetzung soll dem Kanzler zufolge bis Ende 2026 abgeschlossen sein. Zweitens hat Merz für die deutsche KI-Wirtschaft Zahlen vom </w:t>
+      </w:r>
+      <w:r>
+        <w:rPr>
+          <w:rFonts w:ascii="Arial" w:hAnsi="Arial"/>
+          <w:b w:val="0"/>
+          <w:i/>
+          <w:sz w:val="19"/>
+        </w:rPr>
+        <w:t>Startup-Verband</w:t>
+      </w:r>
+      <w:r>
+        <w:rPr>
+          <w:rFonts w:ascii="Arial" w:hAnsi="Arial"/>
+          <w:b w:val="0"/>
+          <w:i w:val="0"/>
+          <w:sz w:val="19"/>
+        </w:rPr>
+        <w:t xml:space="preserve"> zitiert, wonach im ersten Halbjahr 2026 in Deutschland über 3.000 neue Unternehmen gegründet wurden — nahezu so viele wie im gesamten Jahr 2025 — und „mehr als ein Drittel" davon einen direkten KI-Bezug aufweise; er hat den Vorgang mit der Inbetriebnahme des in Dresden entstehenden Halbleiterwerks („nach eigener Charakterisierung weltweit größte Halbleiterproduktion") als Beleg dafür verknüpft, dass Deutschland „an den Wertschöpfungsketten der Zukunft nicht nur teilnehmen, sondern auch profitieren und gewinnen" könne und wolle. Für die in § 5.1 vorgeschlagene wertschöpfungsseitige Verbreiterung der Sozialstaatsfinanzierung und für die in Kapitel 8 entwickelte Deutschland-These (Veredelungsstrategie, § 8.2) liefert die Regierungserklärung damit eine aktuelle Standort­einordnung, die den in § 5.2 dokumentierten Reformzeitplan flankiert; eine spezifische fiskalische Robotersteuer oder KI-Abgabe ist im Regierungsprogramm dagegen weiterhin nicht vorgesehen.</w:t>
       </w:r>
     </w:p>
     <w:p>
@@ -10265,6 +10324,120 @@
           <w:i w:val="0"/>
           <w:sz w:val="19"/>
         </w:rPr>
+        <w:t xml:space="preserve">Bundesministerium für Wirtschaft und Energie (BMWK). (14. Juli 2026). </w:t>
+      </w:r>
+      <w:r>
+        <w:rPr>
+          <w:rFonts w:ascii="Arial" w:hAnsi="Arial"/>
+          <w:b w:val="0"/>
+          <w:i/>
+          <w:sz w:val="19"/>
+        </w:rPr>
+        <w:t>Die wirtschaftliche Lage in Deutschland im Juli 2026.</w:t>
+      </w:r>
+      <w:r>
+        <w:rPr>
+          <w:rFonts w:ascii="Arial" w:hAnsi="Arial"/>
+          <w:b w:val="0"/>
+          <w:i w:val="0"/>
+          <w:sz w:val="19"/>
+        </w:rPr>
+        <w:t xml:space="preserve"> Monatspublikation; KI-Boom als Stütze der asiatischen Handelsdynamik (Exporte Datenverarbeitungsgeräte +2,3 % im Mai 2026), Erwerbstätigkeit −8.000 im Mai, sozialversicherungspflichtige Beschäftigung −5.000 im April; strukturelle Herausforderungen durch „zunehmende Bedeutung künstlicher Intelligenz und demografischen Wandel". Ergänzt durch </w:t>
+      </w:r>
+      <w:r>
+        <w:rPr>
+          <w:rFonts w:ascii="Arial" w:hAnsi="Arial"/>
+          <w:b w:val="0"/>
+          <w:i/>
+          <w:sz w:val="19"/>
+        </w:rPr>
+        <w:t>DATEV magazin</w:t>
+      </w:r>
+      <w:r>
+        <w:rPr>
+          <w:rFonts w:ascii="Arial" w:hAnsi="Arial"/>
+          <w:b w:val="0"/>
+          <w:i w:val="0"/>
+          <w:sz w:val="19"/>
+        </w:rPr>
+        <w:t xml:space="preserve"> (Aufbereitung 14. Juli 2026). https://www.bundeswirtschaftsministerium.de/Redaktion/DE/Pressemitteilungen/Wirtschaftliche-Lage/2026/20260714-wirt-lage-deutschland-juli-2026.html | https://www.datev-magazin.de/nachrichten-steuern-recht/wirtschaft/die-wirtschaftliche-lage-in-deutschland-im-juli-2026-147829</w:t>
+      </w:r>
+    </w:p>
+    <w:p>
+      <w:pPr>
+        <w:jc w:val="both"/>
+      </w:pPr>
+      <w:r>
+        <w:rPr>
+          <w:rFonts w:ascii="Arial" w:hAnsi="Arial"/>
+          <w:b w:val="0"/>
+          <w:i w:val="0"/>
+          <w:sz w:val="19"/>
+        </w:rPr>
+        <w:t xml:space="preserve">Bundesregierung / Deutscher Bundestag. (9. Juli 2026). </w:t>
+      </w:r>
+      <w:r>
+        <w:rPr>
+          <w:rFonts w:ascii="Arial" w:hAnsi="Arial"/>
+          <w:b w:val="0"/>
+          <w:i/>
+          <w:sz w:val="19"/>
+        </w:rPr>
+        <w:t>Regierungserklärung des Bundeskanzlers Friedrich Merz — Zwischenbilanz nach 14 Monaten und Reformpaket „für Aufschwung und Beschäftigung".</w:t>
+      </w:r>
+      <w:r>
+        <w:rPr>
+          <w:rFonts w:ascii="Arial" w:hAnsi="Arial"/>
+          <w:b w:val="0"/>
+          <w:i w:val="0"/>
+          <w:sz w:val="19"/>
+        </w:rPr>
+        <w:t xml:space="preserve"> 89. Sitzung des 21. Bundestages (Kalenderwoche 28). Zitierte Startup-Verband-Zahlen: &gt; 3.000 Unternehmensgründungen im ersten Halbjahr 2026 (nahezu Vorjahres­gesamtwert), &gt; 1/3 mit direktem KI-Bezug; verankert die vollständige Umsetzung der 33 Empfehlungen der Alterssicherungskommission (Bericht 23. Juni 2026) im Koalitionsprogramm; Inbetriebnahme der Halbleiterproduktion Dresden als Beleg der Wertschöpfungsteilhabe. Zeitplan: legislative Umsetzung bis Ende 2026. https://www.bundesregierung.de/breg-de/aktuelles/regierungserklaerung-merz-juli-26-2446298 | https://www.bundestag.de/dokumente/textarchiv/2026/kw28-de-regierungserklaerung-1193984 | https://www.bundesregierung.de/breg-de/suche/video-regierungserklaerung-juli-26-2446352</w:t>
+      </w:r>
+    </w:p>
+    <w:p>
+      <w:pPr>
+        <w:jc w:val="both"/>
+      </w:pPr>
+      <w:r>
+        <w:rPr>
+          <w:rFonts w:ascii="Arial" w:hAnsi="Arial"/>
+          <w:b w:val="0"/>
+          <w:i w:val="0"/>
+          <w:sz w:val="19"/>
+        </w:rPr>
+        <w:t xml:space="preserve">Koalitionsausschuss / Bundeskanzleramt. (1./2. Juli 2026). </w:t>
+      </w:r>
+      <w:r>
+        <w:rPr>
+          <w:rFonts w:ascii="Arial" w:hAnsi="Arial"/>
+          <w:b w:val="0"/>
+          <w:i/>
+          <w:sz w:val="19"/>
+        </w:rPr>
+        <w:t>Ein Programm für Aufschwung und Beschäftigung — 34 Reformpunkte für Steuer, Rente, Gesundheit und Arbeit.</w:t>
+      </w:r>
+      <w:r>
+        <w:rPr>
+          <w:rFonts w:ascii="Arial" w:hAnsi="Arial"/>
+          <w:b w:val="0"/>
+          <w:i w:val="0"/>
+          <w:sz w:val="19"/>
+        </w:rPr>
+        <w:t xml:space="preserve"> Ergebnispapier des Koalitionsausschusses vom 1./2. Juli 2026 (12 Seiten); Aufgriff der 33 Empfehlungen der Alterssicherungskommission (Bericht 23. Juni 2026), arbeitsrechtliche Vereinfachungen bei KI-Software-Updates innerhalb der Betriebsverfassungs­rechte (Sozialpartnergespräch bis Mitte Oktober 2026 vorgesehen). https://www.bundeskanzler.de/resource/blob/1832584/2445592/bc8e5e160d879f0bdd593121a96a45d2/2026-07-02-koaausschuss-data.pdf</w:t>
+      </w:r>
+    </w:p>
+    <w:p>
+      <w:pPr>
+        <w:jc w:val="both"/>
+      </w:pPr>
+      <w:r>
+        <w:rPr>
+          <w:rFonts w:ascii="Arial" w:hAnsi="Arial"/>
+          <w:b w:val="0"/>
+          <w:i w:val="0"/>
+          <w:sz w:val="19"/>
+        </w:rPr>
         <w:t xml:space="preserve">Polnisches Finanzministerium / Tax Agency. (2022 ff.). </w:t>
       </w:r>
       <w:r>
@@ -13931,7 +14104,7 @@
           <w:i w:val="0"/>
           <w:sz w:val="19"/>
         </w:rPr>
-        <w:t xml:space="preserve"> Dieses Arbeitspapier gibt den Stand Mitte Juli 2026 (Schnitt am 14. Juli 2026 — Lauf 001 vom 14. Juli 2026) wieder. Die Debatte entwickelt sich dynamisch, insbesondere im Zuge der OpenAI-Strategiepapiere und der Eröffnung des OpenAI Workshop in Washington, D.C. im Mai 2026, des Erstdurchgangs des GKV-Beitragssatzstabilisierungsgesetzes in der 1065. Bundesratssitzung am 8. Mai 2026 mit 79 Tagesordnungspunkten (Kabinettsbeschluss 29. April 2026, parlamentarische Behandlung vor der Sommerpause 2026 angekündigt), der laufenden Trilog-Verhandlungen zum Digital Omnibus on AI (zweite Runde 28. April 2026 ohne Einigung; nächste Runde 13. Mai 2026 — Knackpunkt ist nicht die Verschiebung der Hochrisiko-Pflichten, sondern die Konformitätsbewertungs-Architektur für Anhang I; die zypriotische Ratspräsidentschaft strebt einen Abschluss vor Ablauf ihrer Amtszeit am 30. Juni 2026 an, andernfalls übernimmt die irische Präsidentschaft), der am 5. Mai 2026 erfolgten Arraignment-Verhandlung im Altman-Verfahren mit „nicht schuldig"-Plädoyer und angeordneter psychiatrischer Begutachtung, des am 7. Mai 2026 versandten individuellen Microsoft-Buyout-Angebots (Annahmefrist 8. Juni 2026, VRSAR-Unterzeichnung 9.–22. Juni 2026, bis zu fünfjährige Krankenversicherungs-Verlängerung), des am 1. Mai 2026 vom Connecticut-Repräsentantenhaus mit 131 zu 17 Stimmen verabschiedeten </w:t>
+        <w:t xml:space="preserve"> Dieses Arbeitspapier gibt den Stand Mitte Juli 2026 (Schnitt am 15. Juli 2026 — Lauf 001 vom 15. Juli 2026) wieder. Die Debatte entwickelt sich dynamisch, insbesondere im Zuge der OpenAI-Strategiepapiere und der Eröffnung des OpenAI Workshop in Washington, D.C. im Mai 2026, des Erstdurchgangs des GKV-Beitragssatzstabilisierungsgesetzes in der 1065. Bundesratssitzung am 8. Mai 2026 mit 79 Tagesordnungspunkten (Kabinettsbeschluss 29. April 2026, parlamentarische Behandlung vor der Sommerpause 2026 angekündigt), der laufenden Trilog-Verhandlungen zum Digital Omnibus on AI (zweite Runde 28. April 2026 ohne Einigung; nächste Runde 13. Mai 2026 — Knackpunkt ist nicht die Verschiebung der Hochrisiko-Pflichten, sondern die Konformitätsbewertungs-Architektur für Anhang I; die zypriotische Ratspräsidentschaft strebt einen Abschluss vor Ablauf ihrer Amtszeit am 30. Juni 2026 an, andernfalls übernimmt die irische Präsidentschaft), der am 5. Mai 2026 erfolgten Arraignment-Verhandlung im Altman-Verfahren mit „nicht schuldig"-Plädoyer und angeordneter psychiatrischer Begutachtung, des am 7. Mai 2026 versandten individuellen Microsoft-Buyout-Angebots (Annahmefrist 8. Juni 2026, VRSAR-Unterzeichnung 9.–22. Juni 2026, bis zu fünfjährige Krankenversicherungs-Verlängerung), des am 1. Mai 2026 vom Connecticut-Repräsentantenhaus mit 131 zu 17 Stimmen verabschiedeten </w:t>
       </w:r>
       <w:r>
         <w:rPr>
@@ -15047,7 +15220,25 @@
           <w:i w:val="0"/>
           <w:sz w:val="19"/>
         </w:rPr>
-        <w:t xml:space="preserve"> am 10. Juli 2026 (Deutsches Ärzteblatt, DATEV-Magazin, STB Treuhand, ZDFheute); der Antrag von sechs Ländern (Saarland, Bremen, Hamburg, Mecklenburg-Vorpommern, Niedersachsen, Sachsen-Anhalt) auf Anrufung des Vermittlungsausschusses scheitert an der Zweidrittelmehrheit, nachdem die Bundesregierung in einer Protokollerklärung Zugeständnisse zusichert — rund 550 Millionen Euro zusätzliche Krankenhausmittel (davon 100 Millionen Euro für Universitätskliniken ab 2027 und 450 Millionen Euro über einen erhöhten Rechnungszuschlag), Angleichung der Kostenaufwuchsgrenze 2027–2029, Abbau von Bürokratie einschließlich PPR 2.0 und Pflegepersonaluntergrenzen, erweiterte Ausnahmen vom 15,5-%-Herstellerabschlag im Pharmabereich bis Januar 2027 sowie ein interministerielles Fachgremium bis Ende September 2026; das Gesetz kann damit ohne weitere parlamentarische Behandlung in Kraft treten und schließt damit die in § 5.2 dokumentierte GKV-Reformschiene ab. Eine regelmäßige Aktualisierung ist vorgesehen.</w:t>
+        <w:t xml:space="preserve"> am 10. Juli 2026 (Deutsches Ärzteblatt, DATEV-Magazin, STB Treuhand, ZDFheute); der Antrag von sechs Ländern (Saarland, Bremen, Hamburg, Mecklenburg-Vorpommern, Niedersachsen, Sachsen-Anhalt) auf Anrufung des Vermittlungsausschusses scheitert an der Zweidrittelmehrheit, nachdem die Bundesregierung in einer Protokollerklärung Zugeständnisse zusichert — rund 550 Millionen Euro zusätzliche Krankenhausmittel (davon 100 Millionen Euro für Universitätskliniken ab 2027 und 450 Millionen Euro über einen erhöhten Rechnungszuschlag), Angleichung der Kostenaufwuchsgrenze 2027–2029, Abbau von Bürokratie einschließlich PPR 2.0 und Pflegepersonaluntergrenzen, erweiterte Ausnahmen vom 15,5-%-Herstellerabschlag im Pharmabereich bis Januar 2027 sowie ein interministerielles Fachgremium bis Ende September 2026; das Gesetz kann damit ohne weitere parlamentarische Behandlung in Kraft treten und schließt damit die in § 5.2 dokumentierte GKV-Reformschiene ab. Lauf 001 vom 15. Juli 2026 ergänzt zwei weitere Fortschreibungen: die Regierungserklärung des Bundeskanzlers Friedrich Merz in der 89. Sitzung des 21. Bundestages am 9. Juli 2026 („Regierungserklärung zur aktuellen politischen Lage") mit Zwischenbilanz nach 14 Monaten und Verankerung des 34-Punkte-Koalitionsausschuss-Programms vom 1./2. Juli 2026 („für Aufschwung und Beschäftigung"); Merz zitiert Startup-Verband-Zahlen für das erste Halbjahr 2026 (&gt; 3.000 neue Unternehmen, nahezu Vorjahres­gesamtwert; &gt; 1/3 mit direktem KI-Bezug) und verweist auf die Inbetriebnahme der Halbleiterproduktion in Dresden, formuliert die vollständige und zeitnahe Umsetzung der 33 Empfehlungen der Alterssicherungskommission (Bericht 23. Juni 2026) bis Ende 2026 als Ziel und ordnet Steuer-, Renten-, Gesundheits- und Arbeitsmarktreform als kohärentes Reformpaket ein — Aufnahme in § 5.2 (Reformprozess und deutsche Startup-/Wertschöpfungs­einordnung; Rückwirkung auf § 8.2 Deutschland-These/Veredelungsstrategie); sowie die am 14. Juli 2026 veröffentlichte Monatspublikation </w:t>
+      </w:r>
+      <w:r>
+        <w:rPr>
+          <w:rFonts w:ascii="Arial" w:hAnsi="Arial"/>
+          <w:b w:val="0"/>
+          <w:i/>
+          <w:sz w:val="19"/>
+        </w:rPr>
+        <w:t>„Die wirtschaftliche Lage in Deutschland im Juli 2026"</w:t>
+      </w:r>
+      <w:r>
+        <w:rPr>
+          <w:rFonts w:ascii="Arial" w:hAnsi="Arial"/>
+          <w:b w:val="0"/>
+          <w:i w:val="0"/>
+          <w:sz w:val="19"/>
+        </w:rPr>
+        <w:t xml:space="preserve"> des Bundesministeriums für Wirtschaft und Energie mit dem amtlichen Standbericht zum Arbeitsmarkt (Erwerbstätigkeit −8.000 im Mai 2026, sozialversicherungspflichtige Beschäftigung −5.000 im April 2026, „noch keine Verbesserung der Arbeitsmarktperspektiven"), zur strukturellen Rolle künstlicher Intelligenz („zunehmende Bedeutung künstlicher Intelligenz und demografischer Wandel" als strukturelle Herausforderungen) und zur asiatisch-getriebenen KI-Handelsdynamik (Exporte Datenverarbeitungsgeräte +2,3 % im Mai 2026) — Aufnahme in § 1.1 als amtlicher, kurzfristig konjunkturstützender KI-Befund parallel zu den Trackerständen und Layoff-Aggregaten. Eine regelmäßige Aktualisierung ist vorgesehen.</w:t>
       </w:r>
     </w:p>
     <w:p>
@@ -15127,7 +15318,7 @@
         <w:color w:val="999999"/>
         <w:sz w:val="15"/>
       </w:rPr>
-      <w:t>Version 34.0 — Mai 2026 — CC BY 4.0</w:t>
+      <w:t>Version 35.0 — Mai 2026 — CC BY 4.0</w:t>
       <w:tab/>
       <w:t xml:space="preserve">Seite </w:t>
     </w:r>

</xml_diff>

<commit_message>
Daily-Update 2026-07-16 — Version 36.0 (Cluster: F, I, D)
- § 8.2: SpaceXAI *Grok 4.5* (Release 8.7., "Opus-Klasse", 2/6 USD Standard, 4/18 USD schnell) mit Long-Horizon-Terminal-Bench-Führung 14.7. und Grok-Build-Datenschutz-Vorfall
- § 8.2: TechCrunch (Bellan, 14.7.) — Open-Weight-Marktverschiebung (HF 41 % CN, Vercel 33 % Open, OpenRouter Top-6 Open, Opus 4.7 Platz 7); stützt Veredelungslogik
- § 5.4: Bloomberg 15.7. — Anthropic-IPO-Vorbereitung; Bewertung 1,11–1,14 Bio. USD, Ticker $ANTH, Q4 2026, > 60 Mrd. USD; Argument gegen bestandsorientierte Umverteilungs­logik
- § 1.1: Intel-WARN-Layoff Oregon 15.7. — 2.392 Beschäftigte, 4 Standorte, Foundry-Verlust 3 Mrd. USD Q2/25, AI-Chip-Anteil 1 %
- § 11.5: 5 neue Einträge; Versionssprung 35.0 → 36.0

Cluster G 18× ohne KI-spezifischen G-BA-/gematik-/BfArM-Beschluss.
Phase 5b: Fallback-Dateien geschrieben (kein Graph/WhatsApp-Send-MCP in Session).
</commit_message>
<xml_diff>
--- a/KI-Ökonomie.docx
+++ b/KI-Ökonomie.docx
@@ -112,7 +112,7 @@
           <w:color w:val="666666"/>
           <w:sz w:val="18"/>
         </w:rPr>
-        <w:t>Version 35.0</w:t>
+        <w:t>Version 36.0</w:t>
       </w:r>
     </w:p>
     <w:p>
@@ -796,7 +796,97 @@
           <w:i w:val="0"/>
           <w:sz w:val="19"/>
         </w:rPr>
-        <w:t xml:space="preserve"> des Bundesministeriums für Wirtschaft und Energie (BMWK) im amtlichen Standbericht bestätigt: Die Erwerbstätigkeit sank im Mai 2026 um 8.000 Personen, die sozialversicherungspflichtige Beschäftigung im April 2026 um 5.000 Personen, während die Arbeitslosigkeit im Juni stabil blieb; das Ministerium ordnet die Perspektive als „noch keine Verbesserung der Arbeitsmarktperspektiven" ein und benennt „die zunehmende Bedeutung künstlicher Intelligenz und den demografischen Wandel" ausdrücklich als strukturelle Herausforderungen. Zugleich hebt der Bericht hervor, dass „die starke Handelsdynamik in Asien im Zusammenhang mit dem KI-Boom" den Welthandel stützt und im Mai 2026 zu einem Anstieg der Exporte von Datenverarbeitungsgeräten um 2,3 % beigetragen hat — die KI-Nachfrage wird damit erstmals auf amtlicher Ebene als eigenständiger, kurzfristig konjunkturstützender Faktor in einer Monatsbetrachtung aus­gewiesen. Andererseits steht die Finanzierung der sozialen Sicherungssysteme — insbesondere der paritätisch über Löhne finanzierten Zweige Kranken-, Pflege-, Renten- und Arbeitslosenversicherung — vor strukturellen Herausforderungen durch den demografischen Wandel.</w:t>
+        <w:t xml:space="preserve"> des Bundesministeriums für Wirtschaft und Energie (BMWK) im amtlichen Standbericht bestätigt: Die Erwerbstätigkeit sank im Mai 2026 um 8.000 Personen, die sozialversicherungspflichtige Beschäftigung im April 2026 um 5.000 Personen, während die Arbeitslosigkeit im Juni stabil blieb; das Ministerium ordnet die Perspektive als „noch keine Verbesserung der Arbeitsmarktperspektiven" ein und benennt „die zunehmende Bedeutung künstlicher Intelligenz und den demografischen Wandel" ausdrücklich als strukturelle Herausforderungen. Zugleich hebt der Bericht hervor, dass „die starke Handelsdynamik in Asien im Zusammenhang mit dem KI-Boom" den Welthandel stützt und im Mai 2026 zu einem Anstieg der Exporte von Datenverarbeitungsgeräten um 2,3 % beigetragen hat — die KI-Nachfrage wird damit erstmals auf amtlicher Ebene als eigenständiger, kurzfristig konjunkturstützender Faktor in einer Monatsbetrachtung aus­gewiesen. In derselben Woche verdichtet sich die Personal­reduktions­seite auf der Hardware-Achse durch eine mit WARN-Notice hinterlegte Intel-Layoff-Runde: Nach der Bericht­erstattung von KATU, KOIN, KGW und Data Center Dynamics werden zum 15. Juli 2026 rund 2.392 Beschäftigte an vier Intel-Standorten im Großraum Portland (Aloha, Ronler Acres, Hawthorne Farms und Jones Farm) entlassen; nach dem Layoff-Aggregat byteiota entfallen davon 412 </w:t>
+      </w:r>
+      <w:r>
+        <w:rPr>
+          <w:rFonts w:ascii="Arial" w:hAnsi="Arial"/>
+          <w:b w:val="0"/>
+          <w:i/>
+          <w:sz w:val="19"/>
+        </w:rPr>
+        <w:t>Module Equipment Technicians</w:t>
+      </w:r>
+      <w:r>
+        <w:rPr>
+          <w:rFonts w:ascii="Arial" w:hAnsi="Arial"/>
+          <w:b w:val="0"/>
+          <w:i w:val="0"/>
+          <w:sz w:val="19"/>
+        </w:rPr>
+        <w:t xml:space="preserve">, 307 </w:t>
+      </w:r>
+      <w:r>
+        <w:rPr>
+          <w:rFonts w:ascii="Arial" w:hAnsi="Arial"/>
+          <w:b w:val="0"/>
+          <w:i/>
+          <w:sz w:val="19"/>
+        </w:rPr>
+        <w:t>Module Development Engineers</w:t>
+      </w:r>
+      <w:r>
+        <w:rPr>
+          <w:rFonts w:ascii="Arial" w:hAnsi="Arial"/>
+          <w:b w:val="0"/>
+          <w:i w:val="0"/>
+          <w:sz w:val="19"/>
+        </w:rPr>
+        <w:t xml:space="preserve">, 148 </w:t>
+      </w:r>
+      <w:r>
+        <w:rPr>
+          <w:rFonts w:ascii="Arial" w:hAnsi="Arial"/>
+          <w:b w:val="0"/>
+          <w:i/>
+          <w:sz w:val="19"/>
+        </w:rPr>
+        <w:t>Module Engineers</w:t>
+      </w:r>
+      <w:r>
+        <w:rPr>
+          <w:rFonts w:ascii="Arial" w:hAnsi="Arial"/>
+          <w:b w:val="0"/>
+          <w:i w:val="0"/>
+          <w:sz w:val="19"/>
+        </w:rPr>
+        <w:t xml:space="preserve"> sowie eine Reihe von </w:t>
+      </w:r>
+      <w:r>
+        <w:rPr>
+          <w:rFonts w:ascii="Arial" w:hAnsi="Arial"/>
+          <w:b w:val="0"/>
+          <w:i/>
+          <w:sz w:val="19"/>
+        </w:rPr>
+        <w:t>Process Integration Engineers</w:t>
+      </w:r>
+      <w:r>
+        <w:rPr>
+          <w:rFonts w:ascii="Arial" w:hAnsi="Arial"/>
+          <w:b w:val="0"/>
+          <w:i w:val="0"/>
+          <w:sz w:val="19"/>
+        </w:rPr>
+        <w:t xml:space="preserve"> und </w:t>
+      </w:r>
+      <w:r>
+        <w:rPr>
+          <w:rFonts w:ascii="Arial" w:hAnsi="Arial"/>
+          <w:b w:val="0"/>
+          <w:i/>
+          <w:sz w:val="19"/>
+        </w:rPr>
+        <w:t>Manufacturing Technicians</w:t>
+      </w:r>
+      <w:r>
+        <w:rPr>
+          <w:rFonts w:ascii="Arial" w:hAnsi="Arial"/>
+          <w:b w:val="0"/>
+          <w:i w:val="0"/>
+          <w:sz w:val="19"/>
+        </w:rPr>
+        <w:t xml:space="preserve"> — ausdrücklich also die technischen Kernrollen der Chip-Fertigung, nicht administrative Rollen. Betroffene erhalten neun Wochen Gehalt und Leistungen; die Runde ordnet sich in die 2025/2026 unter CEO Lip-Bu Tan fortgesetzte Restrukturierung ein, die den globalen Personalbestand von rund 125.000 auf unter 100.000 senkt und ein zusätzliches Einsparziel von rund 1 Milliarde US-Dollar Betriebskosten für 2026 verfolgt. Ökonomischer Hintergrund ist der Verlust des Intel-Foundry-Segments von rund 3 Milliarden US-Dollar allein im zweiten Quartal 2025 sowie der weiterhin nur einprozentige Marktanteil von Intel im Segment der KI-Beschleuniger gegenüber rund 92 % von NVIDIA — die Layoff-Runde illustriert damit exemplarisch, dass die in § 8.2 dokumentierte Asymmetrie zwischen Hyperscaler-Capex und Personalreduktion inzwischen bis in die klassische Halbleiter­fertigung reicht und bei den Verlierern der KI-Konzentration nicht nur die Anwenderseite, sondern auch die vorgelagerte Produktions­schicht trifft. Andererseits steht die Finanzierung der sozialen Sicherungssysteme — insbesondere der paritätisch über Löhne finanzierten Zweige Kranken-, Pflege-, Renten- und Arbeitslosenversicherung — vor strukturellen Herausforderungen durch den demografischen Wandel.</w:t>
       </w:r>
     </w:p>
     <w:p>
@@ -4818,6 +4908,119 @@
       </w:r>
     </w:p>
     <w:p>
+      <w:pPr>
+        <w:jc w:val="both"/>
+      </w:pPr>
+      <w:r>
+        <w:rPr>
+          <w:rFonts w:ascii="Arial" w:hAnsi="Arial"/>
+          <w:b/>
+          <w:i w:val="0"/>
+          <w:sz w:val="19"/>
+        </w:rPr>
+        <w:t>Anthropic-IPO-Vorbereitung (Bloomberg, 15. Juli 2026):</w:t>
+      </w:r>
+      <w:r>
+        <w:rPr>
+          <w:rFonts w:ascii="Arial" w:hAnsi="Arial"/>
+          <w:b w:val="0"/>
+          <w:i w:val="0"/>
+          <w:sz w:val="19"/>
+        </w:rPr>
+        <w:t xml:space="preserve"> Nach Bloomberg-Bericht­erstattung vom 15. Juli 2026 bereite </w:t>
+      </w:r>
+      <w:r>
+        <w:rPr>
+          <w:rFonts w:ascii="Arial" w:hAnsi="Arial"/>
+          <w:b w:val="0"/>
+          <w:i/>
+          <w:sz w:val="19"/>
+        </w:rPr>
+        <w:t>Anthropic</w:t>
+      </w:r>
+      <w:r>
+        <w:rPr>
+          <w:rFonts w:ascii="Arial" w:hAnsi="Arial"/>
+          <w:b w:val="0"/>
+          <w:i w:val="0"/>
+          <w:sz w:val="19"/>
+        </w:rPr>
+        <w:t xml:space="preserve"> eine Serie von IPO-Investoren­meetings vor („Anthropic Is Said to Plan IPO Investor Meetings as Listing Nears"). Die Sekundärmarkt-Bewertung des Unternehmens habe zum 14. Juli 2026 rund 1,11 bis 1,14 Billionen US-Dollar erreicht (nach 965 Milliarden US-Dollar in der letzten primären Runde und einer im Mai 2026 gemeldeten Bewertung von rund 96,5 Milliarden US-Dollar noch vor der jüngsten Aufwertung); auf Prognose­plattformen (Polymarket) läge die höchste Wahrscheinlichkeit für einen IPO-Ticker bei $ANTH (46 bis 48 %), auf ein Emissions­zieldatum im vierten Quartal 2026 (Median­schätzung November 2026) entfalle rund 78 % Wahrscheinlichkeit; als Konsortial­banken würden Goldman Sachs (52–55 % Prognose als Lead-Underwriter), JPMorgan und Morgan Stanley geführt, das Emissions­volumen zeichne sich auf über 60 Milliarden US-Dollar ab. Für die in § 5.4 skizzierte Fondslogik und für die in Kapitel 8 entwickelte Teilhabefrage ist der Vorgang in doppelter Hinsicht relevant. Erstens würde eine Börsen­notierung von Anthropic — spiegelbildlich zum am 8. Juni 2026 vertraulich eingereichten OpenAI-</w:t>
+      </w:r>
+      <w:r>
+        <w:rPr>
+          <w:rFonts w:ascii="Arial" w:hAnsi="Arial"/>
+          <w:b w:val="0"/>
+          <w:i/>
+          <w:sz w:val="19"/>
+        </w:rPr>
+        <w:t>S-1</w:t>
+      </w:r>
+      <w:r>
+        <w:rPr>
+          <w:rFonts w:ascii="Arial" w:hAnsi="Arial"/>
+          <w:b w:val="0"/>
+          <w:i w:val="0"/>
+          <w:sz w:val="19"/>
+        </w:rPr>
+        <w:t xml:space="preserve"> — die Marktkapitalisierung eines zweiten US-Frontier-Anbieters öffentlich handelbar machen und damit die von Sanders-</w:t>
+      </w:r>
+      <w:r>
+        <w:rPr>
+          <w:rFonts w:ascii="Arial" w:hAnsi="Arial"/>
+          <w:b w:val="0"/>
+          <w:i/>
+          <w:sz w:val="19"/>
+        </w:rPr>
+        <w:t>American A.I. Sovereign Wealth Fund Act</w:t>
+      </w:r>
+      <w:r>
+        <w:rPr>
+          <w:rFonts w:ascii="Arial" w:hAnsi="Arial"/>
+          <w:b w:val="0"/>
+          <w:i w:val="0"/>
+          <w:sz w:val="19"/>
+        </w:rPr>
+        <w:t xml:space="preserve"> (§ 4.5) unterstellte 50-%-Zwangs­abgabe und den OpenAI-Gegenvorschlag von Sam Altman (freiwillige 5-%-Equity-Dotierung, § 4.5) auf eine breitere Aktionärs­basis ausweiten; die dokumentierte Bewertungs­spreizung binnen weniger Wochen (Mai 96,5 Mrd. USD → Juli 1,11–1,14 Bio. USD) unterstreicht dabei erneut die in § 8.2 aufgenommene </w:t>
+      </w:r>
+      <w:r>
+        <w:rPr>
+          <w:rFonts w:ascii="Arial" w:hAnsi="Arial"/>
+          <w:b w:val="0"/>
+          <w:i/>
+          <w:sz w:val="19"/>
+        </w:rPr>
+        <w:t>fiskalische Volatilität einer bestands­orientierten Umverteilungs­logik</w:t>
+      </w:r>
+      <w:r>
+        <w:rPr>
+          <w:rFonts w:ascii="Arial" w:hAnsi="Arial"/>
+          <w:b w:val="0"/>
+          <w:i w:val="0"/>
+          <w:sz w:val="19"/>
+        </w:rPr>
+        <w:t>, die an aktuellen Marktkapitalisierungen einzelner Frontier-Anbieter anknüpft. Zweitens verstärkt der Vorgang das Argument für den in § 8.3 vorgeschlagenen Zugriff auf inländische KI-</w:t>
+      </w:r>
+      <w:r>
+        <w:rPr>
+          <w:rFonts w:ascii="Arial" w:hAnsi="Arial"/>
+          <w:b w:val="0"/>
+          <w:i/>
+          <w:sz w:val="19"/>
+        </w:rPr>
+        <w:t>Wertschöpfung</w:t>
+      </w:r>
+      <w:r>
+        <w:rPr>
+          <w:rFonts w:ascii="Arial" w:hAnsi="Arial"/>
+          <w:b w:val="0"/>
+          <w:i w:val="0"/>
+          <w:sz w:val="19"/>
+        </w:rPr>
+        <w:t xml:space="preserve"> statt auf Anbieter-Marktkapitalisierungen: Die Fondslogik bleibt auch dann tragfähig, wenn einzelne Anbieter — durch Börsengang, Sekundär­markt-Bewegung oder Trade-Secret-Verfahren (§ 8.2) — massive Bewertungs­verschiebungen erfahren. Die Anthropic-IPO-Vorbereitung ist damit für die Deutschland-These kein Anlass zur Nachahmung, sondern eine weitere Bestätigung der Robustheits­überlegenheit einer wertschöpfungs­bezogenen gegenüber einer bewertungs­bezogenen Zugriffsarchitektur.</w:t>
+      </w:r>
+    </w:p>
+    <w:p>
       <w:r>
         <w:br w:type="page"/>
       </w:r>
@@ -6565,7 +6768,431 @@
           <w:i w:val="0"/>
           <w:sz w:val="19"/>
         </w:rPr>
-        <w:t xml:space="preserve">Am selben Tag (9. Juli 2026) hat Meta über </w:t>
+        <w:t xml:space="preserve">Einen Tag vorher (8. Juli 2026) hatte </w:t>
+      </w:r>
+      <w:r>
+        <w:rPr>
+          <w:rFonts w:ascii="Arial" w:hAnsi="Arial"/>
+          <w:b w:val="0"/>
+          <w:i/>
+          <w:sz w:val="19"/>
+        </w:rPr>
+        <w:t>SpaceXAI</w:t>
+      </w:r>
+      <w:r>
+        <w:rPr>
+          <w:rFonts w:ascii="Arial" w:hAnsi="Arial"/>
+          <w:b w:val="0"/>
+          <w:i w:val="0"/>
+          <w:sz w:val="19"/>
+        </w:rPr>
+        <w:t xml:space="preserve"> — die aus dem Rebrand von xAI im Februar 2026 hervorgegangene AI-Tochter von SpaceX — </w:t>
+      </w:r>
+      <w:r>
+        <w:rPr>
+          <w:rFonts w:ascii="Arial" w:hAnsi="Arial"/>
+          <w:b w:val="0"/>
+          <w:i/>
+          <w:sz w:val="19"/>
+        </w:rPr>
+        <w:t>Grok 4.5</w:t>
+      </w:r>
+      <w:r>
+        <w:rPr>
+          <w:rFonts w:ascii="Arial" w:hAnsi="Arial"/>
+          <w:b w:val="0"/>
+          <w:i w:val="0"/>
+          <w:sz w:val="19"/>
+        </w:rPr>
+        <w:t xml:space="preserve"> als „Opus-Klasse"-Modell öffentlich freigegeben (Bloomberg, TechCrunch, Axios, MarkTechPost, Memeburn, FourWeekMBA): gemeinsam mit </w:t>
+      </w:r>
+      <w:r>
+        <w:rPr>
+          <w:rFonts w:ascii="Arial" w:hAnsi="Arial"/>
+          <w:b w:val="0"/>
+          <w:i/>
+          <w:sz w:val="19"/>
+        </w:rPr>
+        <w:t>Cursor</w:t>
+      </w:r>
+      <w:r>
+        <w:rPr>
+          <w:rFonts w:ascii="Arial" w:hAnsi="Arial"/>
+          <w:b w:val="0"/>
+          <w:i w:val="0"/>
+          <w:sz w:val="19"/>
+        </w:rPr>
+        <w:t xml:space="preserve"> trainiertes Mixture-of-Experts-Modell für Programmier-, Agent- und Wissensarbeit, verfügbar über Grok Build, Cursor und die SpaceXAI-API. Der Einstiegspreis liegt bei 2 US-Dollar pro Million Input-Token und 6 US-Dollar pro Million Output-Token; für die schnellere Variante bei 4 beziehungsweise 18 US-Dollar; Cache-Read 0,50 US-Dollar. Am 14. Juli 2026 verweist Elon Musk auf einen Platz eins von Grok 4.5 im </w:t>
+      </w:r>
+      <w:r>
+        <w:rPr>
+          <w:rFonts w:ascii="Arial" w:hAnsi="Arial"/>
+          <w:b w:val="0"/>
+          <w:i/>
+          <w:sz w:val="19"/>
+        </w:rPr>
+        <w:t>Long-Horizon Terminal-Bench</w:t>
+      </w:r>
+      <w:r>
+        <w:rPr>
+          <w:rFonts w:ascii="Arial" w:hAnsi="Arial"/>
+          <w:b w:val="0"/>
+          <w:i w:val="0"/>
+          <w:sz w:val="19"/>
+        </w:rPr>
+        <w:t xml:space="preserve"> für ausgedehnte Agent-Aufgaben (Reuters, The Register); am selben Tag dokumentiert ein Sicherheitsforscher, dass Grok Build ganze Nutzer-Codebasen unautorisiert in die SpaceXAI-Cloud übertragen hatte, was zu einer serverseitigen Abschaltung und einer öffentlichen Zusage der vollständigen Löschung führte (The Register 14. Juli 2026, TechTimes 14. Juli 2026). Für die in diesem Kapitel geführte Diskussion ergänzt der Vorgang die Rohstoff-Analogie um eine strukturelle Nuance: Die Angebotsseite an der US-Frontier verdichtet sich um einen weiteren, dem SpaceX-Konzernverbund unterstellten Anbieter — mit Preispunkten, die spürbar unter denen von </w:t>
+      </w:r>
+      <w:r>
+        <w:rPr>
+          <w:rFonts w:ascii="Arial" w:hAnsi="Arial"/>
+          <w:b w:val="0"/>
+          <w:i/>
+          <w:sz w:val="19"/>
+        </w:rPr>
+        <w:t>OpenAI GPT-5.6 Sol</w:t>
+      </w:r>
+      <w:r>
+        <w:rPr>
+          <w:rFonts w:ascii="Arial" w:hAnsi="Arial"/>
+          <w:b w:val="0"/>
+          <w:i w:val="0"/>
+          <w:sz w:val="19"/>
+        </w:rPr>
+        <w:t xml:space="preserve"> (5/30 US-Dollar) und </w:t>
+      </w:r>
+      <w:r>
+        <w:rPr>
+          <w:rFonts w:ascii="Arial" w:hAnsi="Arial"/>
+          <w:b w:val="0"/>
+          <w:i/>
+          <w:sz w:val="19"/>
+        </w:rPr>
+        <w:t>Anthropic Claude Opus 4.8</w:t>
+      </w:r>
+      <w:r>
+        <w:rPr>
+          <w:rFonts w:ascii="Arial" w:hAnsi="Arial"/>
+          <w:b w:val="0"/>
+          <w:i w:val="0"/>
+          <w:sz w:val="19"/>
+        </w:rPr>
+        <w:t xml:space="preserve"> (5/25 US-Dollar) liegen, aber über den </w:t>
+      </w:r>
+      <w:r>
+        <w:rPr>
+          <w:rFonts w:ascii="Arial" w:hAnsi="Arial"/>
+          <w:b w:val="0"/>
+          <w:i/>
+          <w:sz w:val="19"/>
+        </w:rPr>
+        <w:t>Meta-Muse-Spark-1.1</w:t>
+      </w:r>
+      <w:r>
+        <w:rPr>
+          <w:rFonts w:ascii="Arial" w:hAnsi="Arial"/>
+          <w:b w:val="0"/>
+          <w:i w:val="0"/>
+          <w:sz w:val="19"/>
+        </w:rPr>
+        <w:t xml:space="preserve">- und </w:t>
+      </w:r>
+      <w:r>
+        <w:rPr>
+          <w:rFonts w:ascii="Arial" w:hAnsi="Arial"/>
+          <w:b w:val="0"/>
+          <w:i/>
+          <w:sz w:val="19"/>
+        </w:rPr>
+        <w:t>Claude-Sonnet-5</w:t>
+      </w:r>
+      <w:r>
+        <w:rPr>
+          <w:rFonts w:ascii="Arial" w:hAnsi="Arial"/>
+          <w:b w:val="0"/>
+          <w:i w:val="0"/>
+          <w:sz w:val="19"/>
+        </w:rPr>
+        <w:t xml:space="preserve">-Sätzen (1,25/4,25 bzw. 2/10 US-Dollar) und damit die in § 8.2 dokumentierte Preisspreizung zwischen supply-constrained Frontier-Klasse (aufwärts, </w:t>
+      </w:r>
+      <w:r>
+        <w:rPr>
+          <w:rFonts w:ascii="Arial" w:hAnsi="Arial"/>
+          <w:b w:val="0"/>
+          <w:i/>
+          <w:sz w:val="19"/>
+        </w:rPr>
+        <w:t>Fable 5</w:t>
+      </w:r>
+      <w:r>
+        <w:rPr>
+          <w:rFonts w:ascii="Arial" w:hAnsi="Arial"/>
+          <w:b w:val="0"/>
+          <w:i w:val="0"/>
+          <w:sz w:val="19"/>
+        </w:rPr>
+        <w:t xml:space="preserve">) und Workhorse-Klasse (abwärts) auf einer weiteren Modellstufe ausdifferenzieren. Gleichzeitig unterstreicht der </w:t>
+      </w:r>
+      <w:r>
+        <w:rPr>
+          <w:rFonts w:ascii="Arial" w:hAnsi="Arial"/>
+          <w:b w:val="0"/>
+          <w:i/>
+          <w:sz w:val="19"/>
+        </w:rPr>
+        <w:t>Grok-Build</w:t>
+      </w:r>
+      <w:r>
+        <w:rPr>
+          <w:rFonts w:ascii="Arial" w:hAnsi="Arial"/>
+          <w:b w:val="0"/>
+          <w:i w:val="0"/>
+          <w:sz w:val="19"/>
+        </w:rPr>
+        <w:t>-Zwischenfall vom 14. Juli 2026 die Robustheits­anforderungen, die die Deutschland-These (§ 8.3) an eine wertschöpfungsbezogene Anknüpfung importierter Frontier-Modelle stellt: Ohne belastbare Absicherung der Datenflüsse bleibt die inländische KI-Wertschöpfung an Verfügbarkeits- und Vertrauens­risiken einzelner externer Anbieter gekoppelt.</w:t>
+      </w:r>
+    </w:p>
+    <w:p>
+      <w:pPr>
+        <w:jc w:val="both"/>
+      </w:pPr>
+      <w:r>
+        <w:rPr>
+          <w:rFonts w:ascii="Arial" w:hAnsi="Arial"/>
+          <w:b w:val="0"/>
+          <w:i w:val="0"/>
+          <w:sz w:val="19"/>
+        </w:rPr>
+        <w:t xml:space="preserve">Am selben Tag (14. Juli 2026) verdichtet sich in einem TechCrunch-Beitrag von Rebecca Bellan („The real AI race may no longer be at the frontier") eine strukturell wichtige Beobachtung zur Marktstruktur, die die Rohstoff-Analogie um eine weitere Nuance ergänzt. Danach entfielen im Frühjahr 2026 bereits rund 41 % der Modell-Downloads auf </w:t>
+      </w:r>
+      <w:r>
+        <w:rPr>
+          <w:rFonts w:ascii="Arial" w:hAnsi="Arial"/>
+          <w:b w:val="0"/>
+          <w:i/>
+          <w:sz w:val="19"/>
+        </w:rPr>
+        <w:t>Hugging Face</w:t>
+      </w:r>
+      <w:r>
+        <w:rPr>
+          <w:rFonts w:ascii="Arial" w:hAnsi="Arial"/>
+          <w:b w:val="0"/>
+          <w:i w:val="0"/>
+          <w:sz w:val="19"/>
+        </w:rPr>
+        <w:t xml:space="preserve"> auf chinesische </w:t>
+      </w:r>
+      <w:r>
+        <w:rPr>
+          <w:rFonts w:ascii="Arial" w:hAnsi="Arial"/>
+          <w:b w:val="0"/>
+          <w:i/>
+          <w:sz w:val="19"/>
+        </w:rPr>
+        <w:t>Open-Weight</w:t>
+      </w:r>
+      <w:r>
+        <w:rPr>
+          <w:rFonts w:ascii="Arial" w:hAnsi="Arial"/>
+          <w:b w:val="0"/>
+          <w:i w:val="0"/>
+          <w:sz w:val="19"/>
+        </w:rPr>
+        <w:t xml:space="preserve">-Modelle; nach Angaben von </w:t>
+      </w:r>
+      <w:r>
+        <w:rPr>
+          <w:rFonts w:ascii="Arial" w:hAnsi="Arial"/>
+          <w:b w:val="0"/>
+          <w:i/>
+          <w:sz w:val="19"/>
+        </w:rPr>
+        <w:t>Vercel</w:t>
+      </w:r>
+      <w:r>
+        <w:rPr>
+          <w:rFonts w:ascii="Arial" w:hAnsi="Arial"/>
+          <w:b w:val="0"/>
+          <w:i w:val="0"/>
+          <w:sz w:val="19"/>
+        </w:rPr>
+        <w:t xml:space="preserve"> liefen im Juni 2026 rund 33 % der KI-Anfragen der Plattform über Open-Weight-Modelle; auf der Aggregator-Plattform </w:t>
+      </w:r>
+      <w:r>
+        <w:rPr>
+          <w:rFonts w:ascii="Arial" w:hAnsi="Arial"/>
+          <w:b w:val="0"/>
+          <w:i/>
+          <w:sz w:val="19"/>
+        </w:rPr>
+        <w:t>OpenRouter</w:t>
+      </w:r>
+      <w:r>
+        <w:rPr>
+          <w:rFonts w:ascii="Arial" w:hAnsi="Arial"/>
+          <w:b w:val="0"/>
+          <w:i w:val="0"/>
+          <w:sz w:val="19"/>
+        </w:rPr>
+        <w:t xml:space="preserve"> belegten alle sechs am häufigsten genutzten Modelle den Top-Rängen Angebote von </w:t>
+      </w:r>
+      <w:r>
+        <w:rPr>
+          <w:rFonts w:ascii="Arial" w:hAnsi="Arial"/>
+          <w:b w:val="0"/>
+          <w:i/>
+          <w:sz w:val="19"/>
+        </w:rPr>
+        <w:t>Tencent</w:t>
+      </w:r>
+      <w:r>
+        <w:rPr>
+          <w:rFonts w:ascii="Arial" w:hAnsi="Arial"/>
+          <w:b w:val="0"/>
+          <w:i w:val="0"/>
+          <w:sz w:val="19"/>
+        </w:rPr>
+        <w:t xml:space="preserve">, </w:t>
+      </w:r>
+      <w:r>
+        <w:rPr>
+          <w:rFonts w:ascii="Arial" w:hAnsi="Arial"/>
+          <w:b w:val="0"/>
+          <w:i/>
+          <w:sz w:val="19"/>
+        </w:rPr>
+        <w:t>Xiaomi</w:t>
+      </w:r>
+      <w:r>
+        <w:rPr>
+          <w:rFonts w:ascii="Arial" w:hAnsi="Arial"/>
+          <w:b w:val="0"/>
+          <w:i w:val="0"/>
+          <w:sz w:val="19"/>
+        </w:rPr>
+        <w:t xml:space="preserve">, </w:t>
+      </w:r>
+      <w:r>
+        <w:rPr>
+          <w:rFonts w:ascii="Arial" w:hAnsi="Arial"/>
+          <w:b w:val="0"/>
+          <w:i/>
+          <w:sz w:val="19"/>
+        </w:rPr>
+        <w:t>DeepSeek</w:t>
+      </w:r>
+      <w:r>
+        <w:rPr>
+          <w:rFonts w:ascii="Arial" w:hAnsi="Arial"/>
+          <w:b w:val="0"/>
+          <w:i w:val="0"/>
+          <w:sz w:val="19"/>
+        </w:rPr>
+        <w:t xml:space="preserve">, </w:t>
+      </w:r>
+      <w:r>
+        <w:rPr>
+          <w:rFonts w:ascii="Arial" w:hAnsi="Arial"/>
+          <w:b w:val="0"/>
+          <w:i/>
+          <w:sz w:val="19"/>
+        </w:rPr>
+        <w:t>MiniMax</w:t>
+      </w:r>
+      <w:r>
+        <w:rPr>
+          <w:rFonts w:ascii="Arial" w:hAnsi="Arial"/>
+          <w:b w:val="0"/>
+          <w:i w:val="0"/>
+          <w:sz w:val="19"/>
+        </w:rPr>
+        <w:t xml:space="preserve"> und </w:t>
+      </w:r>
+      <w:r>
+        <w:rPr>
+          <w:rFonts w:ascii="Arial" w:hAnsi="Arial"/>
+          <w:b w:val="0"/>
+          <w:i/>
+          <w:sz w:val="19"/>
+        </w:rPr>
+        <w:t>Z.ai</w:t>
+      </w:r>
+      <w:r>
+        <w:rPr>
+          <w:rFonts w:ascii="Arial" w:hAnsi="Arial"/>
+          <w:b w:val="0"/>
+          <w:i w:val="0"/>
+          <w:sz w:val="19"/>
+        </w:rPr>
+        <w:t xml:space="preserve">, während </w:t>
+      </w:r>
+      <w:r>
+        <w:rPr>
+          <w:rFonts w:ascii="Arial" w:hAnsi="Arial"/>
+          <w:b w:val="0"/>
+          <w:i/>
+          <w:sz w:val="19"/>
+        </w:rPr>
+        <w:t>Anthropic Claude Opus 4.7</w:t>
+      </w:r>
+      <w:r>
+        <w:rPr>
+          <w:rFonts w:ascii="Arial" w:hAnsi="Arial"/>
+          <w:b w:val="0"/>
+          <w:i w:val="0"/>
+          <w:sz w:val="19"/>
+        </w:rPr>
+        <w:t xml:space="preserve"> nur auf Platz 7 lag; die Gesamtzahl öffentlich gelisteter Modelle auf </w:t>
+      </w:r>
+      <w:r>
+        <w:rPr>
+          <w:rFonts w:ascii="Arial" w:hAnsi="Arial"/>
+          <w:b w:val="0"/>
+          <w:i/>
+          <w:sz w:val="19"/>
+        </w:rPr>
+        <w:t>Hugging Face</w:t>
+      </w:r>
+      <w:r>
+        <w:rPr>
+          <w:rFonts w:ascii="Arial" w:hAnsi="Arial"/>
+          <w:b w:val="0"/>
+          <w:i w:val="0"/>
+          <w:sz w:val="19"/>
+        </w:rPr>
+        <w:t xml:space="preserve"> erreichte drei Millionen. </w:t>
+      </w:r>
+      <w:r>
+        <w:rPr>
+          <w:rFonts w:ascii="Arial" w:hAnsi="Arial"/>
+          <w:b w:val="0"/>
+          <w:i/>
+          <w:sz w:val="19"/>
+        </w:rPr>
+        <w:t>Hugging-Face</w:t>
+      </w:r>
+      <w:r>
+        <w:rPr>
+          <w:rFonts w:ascii="Arial" w:hAnsi="Arial"/>
+          <w:b w:val="0"/>
+          <w:i w:val="0"/>
+          <w:sz w:val="19"/>
+        </w:rPr>
+        <w:t>-CEO Clem Delangue prognostiziert, dass Frontier-Modelle mittelfristig auf hochwertige Aufgaben beschränkt bleiben und der überwiegende Teil der Produktions-Workloads von Open-Weight-Modellen bedient werde; Microsoft-CEO Satya Nadella warnt vor Single-Provider-Abhängigkeit und fordert Datenhoheit für Unternehmen. Für die Rohstoff-Analogie folgt daraus eine spezifisch europäische Implikation: Die Verlagerung der produktiven Nutzung in Richtung Open-Weight-Modelle verringert die strukturelle Import-Abhängigkeit Deutschlands und der EU von den US-Frontier-Anbietern, ohne die Rohstoff-Konzentration bei Compute-Hardware, Trainings-Kapazitäten und Talent-Basis aufzuheben; für die in § 8.3 skizzierten Zugriffspfade (Wertschöpfungsabgabe, Digitalabgabe, Datenrenten) bedeutet die Verschiebung, dass ein wachsender Teil der inländischen KI-Wertschöpfung an frei verfügbaren Modell-Substraten ansetzt — mit entsprechend robusterer Verfügbarkeit gegenüber US-Export­kontrollen (vgl. Fable-5-Episode, § 4.5), aber zugleich verminderter direkter Abschöpfungs­fläche über Anbieter-Umsätze. Die Veredelungs­strategie (unten) gewinnt damit zusätzlich an Plausibilität: Nicht der Zugriff auf die Frontier, sondern die branchen- und daten­spezifische Anreicherung offener Basismodelle wird zum operativen Kern einer deutschen KI-Wertschöpfung.</w:t>
+      </w:r>
+    </w:p>
+    <w:p>
+      <w:pPr>
+        <w:jc w:val="both"/>
+      </w:pPr>
+      <w:r>
+        <w:rPr>
+          <w:rFonts w:ascii="Arial" w:hAnsi="Arial"/>
+          <w:b w:val="0"/>
+          <w:i w:val="0"/>
+          <w:sz w:val="19"/>
+        </w:rPr>
+        <w:t xml:space="preserve">Zeitlich parallel zur GPT-5.6-Freigabe (9. Juli 2026) hat Meta über </w:t>
       </w:r>
       <w:r>
         <w:rPr>
@@ -14009,6 +14636,220 @@
           <w:i w:val="0"/>
           <w:sz w:val="19"/>
         </w:rPr>
+        <w:t xml:space="preserve">SpaceXAI / Bloomberg / TechCrunch / Axios / MarkTechPost / Memeburn / FourWeekMBA / Cursor. (8. Juli 2026). </w:t>
+      </w:r>
+      <w:r>
+        <w:rPr>
+          <w:rFonts w:ascii="Arial" w:hAnsi="Arial"/>
+          <w:b w:val="0"/>
+          <w:i/>
+          <w:sz w:val="19"/>
+        </w:rPr>
+        <w:t>Introducing Grok 4.5 · Cursor / SpaceXAI Releases Grok 4.5, a Cursor-Trained Model for Coding, Agentic Tasks, and Knowledge Work at $2/M Input / SpaceXAI, Cursor Launch Grok 4.5 AI Model for Finance, Legal Applications / SpaceXAI releases Grok 4.5, which Elon describes as an 'Opus-class model' / Scoop: Musk's SpaceXAI releases new model, Grok 4.5 / Grok 4.5 Launches With Budget Pricing and Cursor Integration / Cursor Grok 4.5 Pricing: $2 Cost &amp; Opus-Class Power.</w:t>
+      </w:r>
+      <w:r>
+        <w:rPr>
+          <w:rFonts w:ascii="Arial" w:hAnsi="Arial"/>
+          <w:b w:val="0"/>
+          <w:i w:val="0"/>
+          <w:sz w:val="19"/>
+        </w:rPr>
+        <w:t xml:space="preserve"> Öffentliche Freigabe des gemeinsam mit Cursor trainierten Mixture-of-Experts-Modells </w:t>
+      </w:r>
+      <w:r>
+        <w:rPr>
+          <w:rFonts w:ascii="Arial" w:hAnsi="Arial"/>
+          <w:b w:val="0"/>
+          <w:i/>
+          <w:sz w:val="19"/>
+        </w:rPr>
+        <w:t>Grok 4.5</w:t>
+      </w:r>
+      <w:r>
+        <w:rPr>
+          <w:rFonts w:ascii="Arial" w:hAnsi="Arial"/>
+          <w:b w:val="0"/>
+          <w:i w:val="0"/>
+          <w:sz w:val="19"/>
+        </w:rPr>
+        <w:t xml:space="preserve"> aus dem SpaceX-Konzernverbund über Grok Build, Cursor und SpaceXAI-API zum 8. Juli 2026; API-Preise 2 US-Dollar Input / 6 US-Dollar Output pro Million Token für die Standardvariante, 4 / 18 US-Dollar für die schnellere Variante, Cache-Read 0,50 US-Dollar; „Opus-Klasse"-Positionierung durch Elon Musk. Beleg für die Preisspreizung an der US-Frontier zwischen supply-constrained Frontier-Klasse und Workhorse-Klasse (§ 8.2). https://cursor.com/blog/grok-4-5 | https://www.marktechpost.com/2026/07/08/spacexai-releases-grok-4-5/ | https://www.bloomberg.com/news/articles/2026-07-08/spacexai-cursor-unveil-grok-ai-model-for-legal-finance-tasks | https://techcrunch.com/2026/07/08/spacexai-releases-grok-4-5-which-elon-describes-as-an-opus-class-model/ | https://www.axios.com/2026/07/08/spacexai-grok-new-model</w:t>
+      </w:r>
+    </w:p>
+    <w:p>
+      <w:pPr>
+        <w:jc w:val="both"/>
+      </w:pPr>
+      <w:r>
+        <w:rPr>
+          <w:rFonts w:ascii="Arial" w:hAnsi="Arial"/>
+          <w:b w:val="0"/>
+          <w:i w:val="0"/>
+          <w:sz w:val="19"/>
+        </w:rPr>
+        <w:t xml:space="preserve">The Register / TechTimes / Reuters. (14. Juli 2026). </w:t>
+      </w:r>
+      <w:r>
+        <w:rPr>
+          <w:rFonts w:ascii="Arial" w:hAnsi="Arial"/>
+          <w:b w:val="0"/>
+          <w:i/>
+          <w:sz w:val="19"/>
+        </w:rPr>
+        <w:t>Musk promises purge after Grok Build caught sending entire repos to the cloud / Grok Build Shipped Entire Codebases to xAI Cloud; Privacy Toggle Did Nothing / Grok 4.5 tops Long-Horizon Terminal-Bench.</w:t>
+      </w:r>
+      <w:r>
+        <w:rPr>
+          <w:rFonts w:ascii="Arial" w:hAnsi="Arial"/>
+          <w:b w:val="0"/>
+          <w:i w:val="0"/>
+          <w:sz w:val="19"/>
+        </w:rPr>
+        <w:t xml:space="preserve"> Bericht­erstattung zum unautorisierten Upload ganzer Nutzer-Codebasen aus Grok Build in die SpaceXAI-Cloud (Server-Abschaltung nach Frontpage-Meldung Hacker News; öffentliche Zusage der vollständigen Löschung) und zur Bench-Führung von Grok 4.5 im Long-Horizon Terminal-Bench. Ergänzt die in § 8.2 dokumentierten Robustheits­anforderungen an importierte Frontier-Modelle (§ 8.3). https://www.theregister.com/ai-and-ml/2026/07/14/musk-promises-purge-after-grok-build-caught-sending-entire-repos-to-the-cloud/5271123 | https://www.techtimes.com/articles/320420/20260714/grok-build-shipped-entire-codebases-xai-cloud-privacy-toggle-did-nothing.htm</w:t>
+      </w:r>
+    </w:p>
+    <w:p>
+      <w:pPr>
+        <w:jc w:val="both"/>
+      </w:pPr>
+      <w:r>
+        <w:rPr>
+          <w:rFonts w:ascii="Arial" w:hAnsi="Arial"/>
+          <w:b w:val="0"/>
+          <w:i w:val="0"/>
+          <w:sz w:val="19"/>
+        </w:rPr>
+        <w:t xml:space="preserve">TechCrunch (Bellan). (14. Juli 2026). </w:t>
+      </w:r>
+      <w:r>
+        <w:rPr>
+          <w:rFonts w:ascii="Arial" w:hAnsi="Arial"/>
+          <w:b w:val="0"/>
+          <w:i/>
+          <w:sz w:val="19"/>
+        </w:rPr>
+        <w:t>The real AI race may no longer be at the frontier.</w:t>
+      </w:r>
+      <w:r>
+        <w:rPr>
+          <w:rFonts w:ascii="Arial" w:hAnsi="Arial"/>
+          <w:b w:val="0"/>
+          <w:i w:val="0"/>
+          <w:sz w:val="19"/>
+        </w:rPr>
+        <w:t xml:space="preserve"> Marktstruktur-Beitrag mit Zahlen zur Verlagerung produktiver KI-Nutzung auf Open-Weight-Modelle: rund 41 % der Hugging-Face-Modell-Downloads im Frühjahr 2026 auf chinesische Open-Weight-Modelle; rund 33 % der Vercel-KI-Anfragen im Juni 2026 über Open-Weight-Modelle; sämtliche Top-6-Modelle auf </w:t>
+      </w:r>
+      <w:r>
+        <w:rPr>
+          <w:rFonts w:ascii="Arial" w:hAnsi="Arial"/>
+          <w:b w:val="0"/>
+          <w:i/>
+          <w:sz w:val="19"/>
+        </w:rPr>
+        <w:t>OpenRouter</w:t>
+      </w:r>
+      <w:r>
+        <w:rPr>
+          <w:rFonts w:ascii="Arial" w:hAnsi="Arial"/>
+          <w:b w:val="0"/>
+          <w:i w:val="0"/>
+          <w:sz w:val="19"/>
+        </w:rPr>
+        <w:t xml:space="preserve"> (Tencent, Xiaomi, DeepSeek, MiniMax, Z.ai) Open-Weight-basiert, </w:t>
+      </w:r>
+      <w:r>
+        <w:rPr>
+          <w:rFonts w:ascii="Arial" w:hAnsi="Arial"/>
+          <w:b w:val="0"/>
+          <w:i/>
+          <w:sz w:val="19"/>
+        </w:rPr>
+        <w:t>Claude Opus 4.7</w:t>
+      </w:r>
+      <w:r>
+        <w:rPr>
+          <w:rFonts w:ascii="Arial" w:hAnsi="Arial"/>
+          <w:b w:val="0"/>
+          <w:i w:val="0"/>
+          <w:sz w:val="19"/>
+        </w:rPr>
+        <w:t xml:space="preserve"> nur auf Platz 7; drei Millionen öffentlich gelistete Modelle auf Hugging Face; Zitate von Hugging-Face-CEO Clem Delangue und Microsoft-CEO Satya Nadella. Ergänzt die Rohstoff-Analogie um die Marktverschiebung der produktiven Nutzung (§ 8.2) und stützt die Veredelungslogik der Deutschland-These (§ 8.3). https://techcrunch.com/2026/07/14/the-real-ai-race-may-no-longer-be-at-the-frontier-open-models-hugging-face/</w:t>
+      </w:r>
+    </w:p>
+    <w:p>
+      <w:pPr>
+        <w:jc w:val="both"/>
+      </w:pPr>
+      <w:r>
+        <w:rPr>
+          <w:rFonts w:ascii="Arial" w:hAnsi="Arial"/>
+          <w:b w:val="0"/>
+          <w:i w:val="0"/>
+          <w:sz w:val="19"/>
+        </w:rPr>
+        <w:t xml:space="preserve">Bloomberg / Moonberg / Polymarket / GuruFocus. (15. Juli 2026). </w:t>
+      </w:r>
+      <w:r>
+        <w:rPr>
+          <w:rFonts w:ascii="Arial" w:hAnsi="Arial"/>
+          <w:b w:val="0"/>
+          <w:i/>
+          <w:sz w:val="19"/>
+        </w:rPr>
+        <w:t>Anthropic Is Said to Plan IPO Investor Meetings as Listing Nears / Anthropic stock: valuation &amp; IPO odds 2026 / Anthropic Prepares for Potential IPO, Outpacing OpenAI / Anthropic IPO by __? Predictions &amp; Odds 2026.</w:t>
+      </w:r>
+      <w:r>
+        <w:rPr>
+          <w:rFonts w:ascii="Arial" w:hAnsi="Arial"/>
+          <w:b w:val="0"/>
+          <w:i w:val="0"/>
+          <w:sz w:val="19"/>
+        </w:rPr>
+        <w:t xml:space="preserve"> Vorbereitung einer IPO-Investoren­meetings-Serie durch Anthropic; Sekundärmarkt-Bewertung 1,11–1,14 Bio. USD (Stand 14. Juli 2026); Prognose­plattform-Wahrscheinlichkeiten für IPO-Ticker $ANTH 46–48 %, IPO im Q4 2026 rund 78 %, Lead-Underwriter Goldman Sachs 52–55 %; erwartetes Emissions­volumen &gt; 60 Mrd. USD. Aufnahme in § 5.4 mit Rückwirkung auf § 8.3 (fiskalische Volatilität bestands­orientierter Umverteilungs­logik). https://moonberg.xyz/anthropic/ | https://polymarket.com/event/anthropic-ipo-by | https://www.gurufocus.com/news/8960658/anthropic-prepares-for-potential-ipo-outpacing-openai</w:t>
+      </w:r>
+    </w:p>
+    <w:p>
+      <w:pPr>
+        <w:jc w:val="both"/>
+      </w:pPr>
+      <w:r>
+        <w:rPr>
+          <w:rFonts w:ascii="Arial" w:hAnsi="Arial"/>
+          <w:b w:val="0"/>
+          <w:i w:val="0"/>
+          <w:sz w:val="19"/>
+        </w:rPr>
+        <w:t xml:space="preserve">Intel Corp. (WARN-Notice) / KATU / KOIN / KGW / Data Center Dynamics / byteiota. (15. Juli 2026). </w:t>
+      </w:r>
+      <w:r>
+        <w:rPr>
+          <w:rFonts w:ascii="Arial" w:hAnsi="Arial"/>
+          <w:b w:val="0"/>
+          <w:i/>
+          <w:sz w:val="19"/>
+        </w:rPr>
+        <w:t>Intel now to lay off nearly 2,400 employees in Oregon / Intel layoffs: Tech giant now expected to lay off over 2K Oregon workers / Intel to lay off nearly 530 workers in Oregon starting in July / Fresh Intel layoffs impact almost 2,400 Oregon workers, more cuts expected globally / Intel Layoffs Jump 5x to 2,400 Workers in 2026 Chip Crisis.</w:t>
+      </w:r>
+      <w:r>
+        <w:rPr>
+          <w:rFonts w:ascii="Arial" w:hAnsi="Arial"/>
+          <w:b w:val="0"/>
+          <w:i w:val="0"/>
+          <w:sz w:val="19"/>
+        </w:rPr>
+        <w:t xml:space="preserve"> Manufacturing-Layoff-Runde mit Wirksamkeit zum 15. Juli 2026 an vier Oregon-Standorten (Aloha, Ronler Acres, Hawthorne Farms, Jones Farm); 2.392 Beschäftigte, davon 412 Module Equipment Technicians, 307 Module Development Engineers, 148 Module Engineers plus Process Integration Engineers und Manufacturing Technicians; neun Wochen Gehalt und Leistungen; Restrukturierungs­kontext CEO Lip-Bu Tan (Personalbestand ~125.000 → unter 100.000, +1 Mrd. USD Betriebskosten­kürzung 2026); Foundry-Verlust ~3 Mrd. USD Q2 2025; AI-Chip-Marktanteil Intel ~1 % vs. NVIDIA ~92 %. Aufnahme in § 1.1 als Hardware-seitige Personalreduktion und Ergänzung zur Asymmetrie Hyperscaler-Capex/Personalreduktion (§ 8.2). https://katu.com/news/local/intel-now-to-lay-off-nearly-2400-employees-in-oregon | https://www.koin.com/local/washington-county/intel-now-expected-to-lay-off-over-2000-oregon-employees/ | https://www.kgw.com/article/money/business/intel-layoff-nearly-530-people-oregon-july-start/283-4fb7e7f8-3d58-4753-9bd1-1d058d1f7f9c | https://byteiota.com/intel-layoffs-jump-5x-to-2400-workers-in-2026-chip-crisis/</w:t>
+      </w:r>
+    </w:p>
+    <w:p>
+      <w:pPr>
+        <w:jc w:val="both"/>
+      </w:pPr>
+      <w:r>
+        <w:rPr>
+          <w:rFonts w:ascii="Arial" w:hAnsi="Arial"/>
+          <w:b w:val="0"/>
+          <w:i w:val="0"/>
+          <w:sz w:val="19"/>
+        </w:rPr>
         <w:t xml:space="preserve">Meta / Fortune / CNBC / TechCrunch / TechTimes / Quartz / DataCamp / AI Weekly / Storyboard18 / cxotoday. (9. Juli 2026). </w:t>
       </w:r>
       <w:r>
@@ -14104,7 +14945,7 @@
           <w:i w:val="0"/>
           <w:sz w:val="19"/>
         </w:rPr>
-        <w:t xml:space="preserve"> Dieses Arbeitspapier gibt den Stand Mitte Juli 2026 (Schnitt am 15. Juli 2026 — Lauf 001 vom 15. Juli 2026) wieder. Die Debatte entwickelt sich dynamisch, insbesondere im Zuge der OpenAI-Strategiepapiere und der Eröffnung des OpenAI Workshop in Washington, D.C. im Mai 2026, des Erstdurchgangs des GKV-Beitragssatzstabilisierungsgesetzes in der 1065. Bundesratssitzung am 8. Mai 2026 mit 79 Tagesordnungspunkten (Kabinettsbeschluss 29. April 2026, parlamentarische Behandlung vor der Sommerpause 2026 angekündigt), der laufenden Trilog-Verhandlungen zum Digital Omnibus on AI (zweite Runde 28. April 2026 ohne Einigung; nächste Runde 13. Mai 2026 — Knackpunkt ist nicht die Verschiebung der Hochrisiko-Pflichten, sondern die Konformitätsbewertungs-Architektur für Anhang I; die zypriotische Ratspräsidentschaft strebt einen Abschluss vor Ablauf ihrer Amtszeit am 30. Juni 2026 an, andernfalls übernimmt die irische Präsidentschaft), der am 5. Mai 2026 erfolgten Arraignment-Verhandlung im Altman-Verfahren mit „nicht schuldig"-Plädoyer und angeordneter psychiatrischer Begutachtung, des am 7. Mai 2026 versandten individuellen Microsoft-Buyout-Angebots (Annahmefrist 8. Juni 2026, VRSAR-Unterzeichnung 9.–22. Juni 2026, bis zu fünfjährige Krankenversicherungs-Verlängerung), des am 1. Mai 2026 vom Connecticut-Repräsentantenhaus mit 131 zu 17 Stimmen verabschiedeten </w:t>
+        <w:t xml:space="preserve"> Dieses Arbeitspapier gibt den Stand Mitte Juli 2026 (Schnitt am 16. Juli 2026 — Lauf 001 vom 16. Juli 2026) wieder. Die Debatte entwickelt sich dynamisch, insbesondere im Zuge der OpenAI-Strategiepapiere und der Eröffnung des OpenAI Workshop in Washington, D.C. im Mai 2026, des Erstdurchgangs des GKV-Beitragssatzstabilisierungsgesetzes in der 1065. Bundesratssitzung am 8. Mai 2026 mit 79 Tagesordnungspunkten (Kabinettsbeschluss 29. April 2026, parlamentarische Behandlung vor der Sommerpause 2026 angekündigt), der laufenden Trilog-Verhandlungen zum Digital Omnibus on AI (zweite Runde 28. April 2026 ohne Einigung; nächste Runde 13. Mai 2026 — Knackpunkt ist nicht die Verschiebung der Hochrisiko-Pflichten, sondern die Konformitätsbewertungs-Architektur für Anhang I; die zypriotische Ratspräsidentschaft strebt einen Abschluss vor Ablauf ihrer Amtszeit am 30. Juni 2026 an, andernfalls übernimmt die irische Präsidentschaft), der am 5. Mai 2026 erfolgten Arraignment-Verhandlung im Altman-Verfahren mit „nicht schuldig"-Plädoyer und angeordneter psychiatrischer Begutachtung, des am 7. Mai 2026 versandten individuellen Microsoft-Buyout-Angebots (Annahmefrist 8. Juni 2026, VRSAR-Unterzeichnung 9.–22. Juni 2026, bis zu fünfjährige Krankenversicherungs-Verlängerung), des am 1. Mai 2026 vom Connecticut-Repräsentantenhaus mit 131 zu 17 Stimmen verabschiedeten </w:t>
       </w:r>
       <w:r>
         <w:rPr>
@@ -15238,7 +16079,151 @@
           <w:i w:val="0"/>
           <w:sz w:val="19"/>
         </w:rPr>
-        <w:t xml:space="preserve"> des Bundesministeriums für Wirtschaft und Energie mit dem amtlichen Standbericht zum Arbeitsmarkt (Erwerbstätigkeit −8.000 im Mai 2026, sozialversicherungspflichtige Beschäftigung −5.000 im April 2026, „noch keine Verbesserung der Arbeitsmarktperspektiven"), zur strukturellen Rolle künstlicher Intelligenz („zunehmende Bedeutung künstlicher Intelligenz und demografischer Wandel" als strukturelle Herausforderungen) und zur asiatisch-getriebenen KI-Handelsdynamik (Exporte Datenverarbeitungsgeräte +2,3 % im Mai 2026) — Aufnahme in § 1.1 als amtlicher, kurzfristig konjunkturstützender KI-Befund parallel zu den Trackerständen und Layoff-Aggregaten. Eine regelmäßige Aktualisierung ist vorgesehen.</w:t>
+        <w:t xml:space="preserve"> des Bundesministeriums für Wirtschaft und Energie mit dem amtlichen Standbericht zum Arbeitsmarkt (Erwerbstätigkeit −8.000 im Mai 2026, sozialversicherungspflichtige Beschäftigung −5.000 im April 2026, „noch keine Verbesserung der Arbeitsmarktperspektiven"), zur strukturellen Rolle künstlicher Intelligenz („zunehmende Bedeutung künstlicher Intelligenz und demografischer Wandel" als strukturelle Herausforderungen) und zur asiatisch-getriebenen KI-Handelsdynamik (Exporte Datenverarbeitungsgeräte +2,3 % im Mai 2026) — Aufnahme in § 1.1 als amtlicher, kurzfristig konjunkturstützender KI-Befund parallel zu den Trackerständen und Layoff-Aggregaten. Lauf 001 vom 16. Juli 2026 ergänzt drei weitere Fortschreibungen: die öffentliche Freigabe des Modells </w:t>
+      </w:r>
+      <w:r>
+        <w:rPr>
+          <w:rFonts w:ascii="Arial" w:hAnsi="Arial"/>
+          <w:b w:val="0"/>
+          <w:i/>
+          <w:sz w:val="19"/>
+        </w:rPr>
+        <w:t>Grok 4.5</w:t>
+      </w:r>
+      <w:r>
+        <w:rPr>
+          <w:rFonts w:ascii="Arial" w:hAnsi="Arial"/>
+          <w:b w:val="0"/>
+          <w:i w:val="0"/>
+          <w:sz w:val="19"/>
+        </w:rPr>
+        <w:t xml:space="preserve"> durch </w:t>
+      </w:r>
+      <w:r>
+        <w:rPr>
+          <w:rFonts w:ascii="Arial" w:hAnsi="Arial"/>
+          <w:b w:val="0"/>
+          <w:i/>
+          <w:sz w:val="19"/>
+        </w:rPr>
+        <w:t>SpaceXAI</w:t>
+      </w:r>
+      <w:r>
+        <w:rPr>
+          <w:rFonts w:ascii="Arial" w:hAnsi="Arial"/>
+          <w:b w:val="0"/>
+          <w:i w:val="0"/>
+          <w:sz w:val="19"/>
+        </w:rPr>
+        <w:t xml:space="preserve"> (Rebrand xAI → SpaceXAI Februar 2026) zum 8. Juli 2026 (Bloomberg, TechCrunch, Axios, MarkTechPost, Memeburn, FourWeekMBA) als „Opus-Klasse"-Modell mit Preispunkten 2/6 US-Dollar Input/Output pro Million Token (schnelle Variante 4/18 US-Dollar; Cache-Read 0,50 US-Dollar) über Grok Build, Cursor und SpaceXAI-API; ergänzt um den </w:t>
+      </w:r>
+      <w:r>
+        <w:rPr>
+          <w:rFonts w:ascii="Arial" w:hAnsi="Arial"/>
+          <w:b w:val="0"/>
+          <w:i/>
+          <w:sz w:val="19"/>
+        </w:rPr>
+        <w:t>Grok-Build</w:t>
+      </w:r>
+      <w:r>
+        <w:rPr>
+          <w:rFonts w:ascii="Arial" w:hAnsi="Arial"/>
+          <w:b w:val="0"/>
+          <w:i w:val="0"/>
+          <w:sz w:val="19"/>
+        </w:rPr>
+        <w:t xml:space="preserve">-Zwischenfall vom 14. Juli 2026 (The Register, TechTimes: unautorisierter Upload ganzer Nutzer-Codebasen, Server-Abschaltung, öffentliche Zusage der Löschung) und die am 14. Juli 2026 gemeldete Führung im Long-Horizon Terminal-Bench — Aufnahme in § 8.2 (differenzierte Preisspreizung zwischen supply-constrained Frontier-Klasse und Workhorse-Klasse; Robustheits­anforderungen an importierte Frontier-Modelle mit Rückwirkung auf § 8.3); die am 14. Juli 2026 durch TechCrunch (Rebecca Bellan, </w:t>
+      </w:r>
+      <w:r>
+        <w:rPr>
+          <w:rFonts w:ascii="Arial" w:hAnsi="Arial"/>
+          <w:b w:val="0"/>
+          <w:i/>
+          <w:sz w:val="19"/>
+        </w:rPr>
+        <w:t>„The real AI race may no longer be at the frontier"</w:t>
+      </w:r>
+      <w:r>
+        <w:rPr>
+          <w:rFonts w:ascii="Arial" w:hAnsi="Arial"/>
+          <w:b w:val="0"/>
+          <w:i w:val="0"/>
+          <w:sz w:val="19"/>
+        </w:rPr>
+        <w:t xml:space="preserve">) verdichtete Marktstruktur-Beobachtung zur Verlagerung produktiver KI-Nutzung auf Open-Weight-Modelle (rund 41 % der Hugging-Face-Downloads Frühjahr 2026 auf chinesische Open-Weight-Modelle; rund 33 % der Vercel-KI-Anfragen im Juni 2026 über Open-Weight-Modelle; sämtliche Top-6-Modelle auf </w:t>
+      </w:r>
+      <w:r>
+        <w:rPr>
+          <w:rFonts w:ascii="Arial" w:hAnsi="Arial"/>
+          <w:b w:val="0"/>
+          <w:i/>
+          <w:sz w:val="19"/>
+        </w:rPr>
+        <w:t>OpenRouter</w:t>
+      </w:r>
+      <w:r>
+        <w:rPr>
+          <w:rFonts w:ascii="Arial" w:hAnsi="Arial"/>
+          <w:b w:val="0"/>
+          <w:i w:val="0"/>
+          <w:sz w:val="19"/>
+        </w:rPr>
+        <w:t xml:space="preserve"> Open-Weight-basiert — Tencent, Xiaomi, DeepSeek, MiniMax, Z.ai; drei Millionen öffentlich gelistete Modelle auf Hugging Face; Anthropic </w:t>
+      </w:r>
+      <w:r>
+        <w:rPr>
+          <w:rFonts w:ascii="Arial" w:hAnsi="Arial"/>
+          <w:b w:val="0"/>
+          <w:i/>
+          <w:sz w:val="19"/>
+        </w:rPr>
+        <w:t>Claude Opus 4.7</w:t>
+      </w:r>
+      <w:r>
+        <w:rPr>
+          <w:rFonts w:ascii="Arial" w:hAnsi="Arial"/>
+          <w:b w:val="0"/>
+          <w:i w:val="0"/>
+          <w:sz w:val="19"/>
+        </w:rPr>
+        <w:t xml:space="preserve"> nur Platz 7; Zitate CEO Clem Delangue und Microsoft-CEO Nadella) — Aufnahme in § 8.2 als Ergänzung der Rohstoff-Analogie um die Verschiebung der produktiven Nutzung mit Rückwirkung auf § 8.3 (verminderte direkte Abschöpfungs­fläche über Anbieter-Umsätze und Stützung der Veredelungs­logik); die Bloomberg-Bericht­erstattung vom 15. Juli 2026 zur </w:t>
+      </w:r>
+      <w:r>
+        <w:rPr>
+          <w:rFonts w:ascii="Arial" w:hAnsi="Arial"/>
+          <w:b w:val="0"/>
+          <w:i/>
+          <w:sz w:val="19"/>
+        </w:rPr>
+        <w:t>Anthropic-IPO-Vorbereitung</w:t>
+      </w:r>
+      <w:r>
+        <w:rPr>
+          <w:rFonts w:ascii="Arial" w:hAnsi="Arial"/>
+          <w:b w:val="0"/>
+          <w:i w:val="0"/>
+          <w:sz w:val="19"/>
+        </w:rPr>
+        <w:t xml:space="preserve"> (Investoren­meetings-Serie; Sekundärmarkt-Bewertung 1,11–1,14 Bio. USD zum 14. Juli 2026 nach 96,5 Mrd. USD im Mai 2026; Ticker-Prognose $ANTH 46–48 %, IPO im Q4 2026 rund 78 %, Lead-Underwriter Goldman Sachs 52–55 %, Emissions­volumen &gt; 60 Mrd. USD) — Aufnahme in § 5.4 mit Rückwirkung auf § 8.3 (fiskalische Volatilität einer bestands­orientierten Umverteilungs­logik gegenüber einer wertschöpfungs­bezogenen Zugriffsarchitektur); sowie die am 15. Juli 2026 mit WARN-Notice wirksam werdende </w:t>
+      </w:r>
+      <w:r>
+        <w:rPr>
+          <w:rFonts w:ascii="Arial" w:hAnsi="Arial"/>
+          <w:b w:val="0"/>
+          <w:i/>
+          <w:sz w:val="19"/>
+        </w:rPr>
+        <w:t>Intel-Manufacturing-Layoff-Runde</w:t>
+      </w:r>
+      <w:r>
+        <w:rPr>
+          <w:rFonts w:ascii="Arial" w:hAnsi="Arial"/>
+          <w:b w:val="0"/>
+          <w:i w:val="0"/>
+          <w:sz w:val="19"/>
+        </w:rPr>
+        <w:t xml:space="preserve"> an vier Oregon-Standorten (Aloha, Ronler Acres, Hawthorne Farms, Jones Farm) mit 2.392 Beschäftigten — davon 412 Module Equipment Technicians, 307 Module Development Engineers, 148 Module Engineers plus Process Integration Engineers und Manufacturing Technicians — als Hardware-seitige Personalreduktion im Restrukturierungs­rahmen CEO Lip-Bu Tan (Personalbestand ~125.000 → unter 100.000, zusätzliche 1 Milliarde US-Dollar Betriebskosten­kürzung 2026; Foundry-Verlust ~3 Milliarden US-Dollar Q2 2025; AI-Chip-Marktanteil Intel ~1 % vs. NVIDIA ~92 %) — Aufnahme in § 1.1 als weitere Illustration der in § 8.2 dokumentierten Asymmetrie zwischen Hyperscaler-Capex und Personalreduktion und als Erweiterung des Layoff-Aggregats um die vorgelagerte Halbleiter­produktionsschicht. Eine regelmäßige Aktualisierung ist vorgesehen.</w:t>
       </w:r>
     </w:p>
     <w:p>
@@ -15318,7 +16303,7 @@
         <w:color w:val="999999"/>
         <w:sz w:val="15"/>
       </w:rPr>
-      <w:t>Version 35.0 — Mai 2026 — CC BY 4.0</w:t>
+      <w:t>Version 36.0 — Mai 2026 — CC BY 4.0</w:t>
       <w:tab/>
       <w:t xml:space="preserve">Seite </w:t>
     </w:r>

</xml_diff>

<commit_message>
Daily-Update 2026-07-22 — Version 42.0 (Cluster: D/I, F)
Zwei belegbare Fortschreibungen aus dem 7-Tage- bzw. 48-Stunden-Fenster:
- Cluster D/I: Final Approval des 1,5-Mrd-USD-Vergleichs zwischen Anthropic
  und Sammelklaegern durch Richterin Martinez-Olguin (US District Court
  N.D. Cal.) am 20. Juli 2026 (500.000 Werke x 3.000 USD; groesster
  US-Copyright-Vergleich; keine Praezedenzwirkung; Trennung Fair-Use auf
  legal erworbenen Trainingsdaten vs. Piraterie-Beschaffung). Aufnahme in
  Sec. 8.2 als erster grossmassstaeblicher monetaerer Referenzwert fuer
  die Trainingsdaten-Ebene der KI-Wertschoepfungskette mit Rueckwirkung
  auf Sec. 8.3.
- Cluster F: SkillSyncer-Tracker fortgeschrieben zum 22. Juli 2026 auf
  322 Ereignisse / 205.832 Betroffene / 173 KI-Ereignisse / 170.945
  KI-Betroffene (Aggregat-Kausalquote stabil bei 54 Prozent). Aufnahme
  in Sec. 1.1.

Validierung im Block "Validierung 22. Juli 2026" in
Validierung-Ergebnisse.md dokumentiert. PDF und Word neu erzeugt.
</commit_message>
<xml_diff>
--- a/KI-Ökonomie.docx
+++ b/KI-Ökonomie.docx
@@ -112,7 +112,7 @@
           <w:color w:val="666666"/>
           <w:sz w:val="18"/>
         </w:rPr>
-        <w:t>Version 41.0</w:t>
+        <w:t>Version 42.0</w:t>
       </w:r>
     </w:p>
     <w:p>
@@ -508,7 +508,25 @@
           <w:i w:val="0"/>
           <w:sz w:val="19"/>
         </w:rPr>
-        <w:t xml:space="preserve">-Stand auf 302 Layoff-Ereignisse mit 201.754 betroffenen Beschäftigten (rund 1.024 Stellen pro Tag; +35 Ereignisse und +15.860 Personen gegenüber dem 9. Juli 2026) und weist zugleich 164 KI-attribuierte Einzelereignisse mit rund 168.770 betroffenen Beschäftigten aus — die Aggregat-KI-Kausalquote sinkt damit tendenziell von 56 auf 54 %, während die Zahl der KI-attribuierten Betroffenen von 156.270 auf 168.770 steigt; die Fortschreibung bestätigt die Beobachtung, dass die 54-%-Quote inzwischen als stabile obere Grenze der Aggregat-Attribution durch den Tracker anzusehen ist, ohne die in § 9.1 dokumentierten Attribuierungs­grenzen aufzulösen. </w:t>
+        <w:t xml:space="preserve">-Stand auf 302 Layoff-Ereignisse mit 201.754 betroffenen Beschäftigten (rund 1.024 Stellen pro Tag; +35 Ereignisse und +15.860 Personen gegenüber dem 9. Juli 2026) und weist zugleich 164 KI-attribuierte Einzelereignisse mit rund 168.770 betroffenen Beschäftigten aus — die Aggregat-KI-Kausalquote sinkt damit tendenziell von 56 auf 54 %, während die Zahl der KI-attribuierten Betroffenen von 156.270 auf 168.770 steigt; die Fortschreibung bestätigt die Beobachtung, dass die 54-%-Quote inzwischen als stabile obere Grenze der Aggregat-Attribution durch den Tracker anzusehen ist, ohne die in § 9.1 dokumentierten Attribuierungs­grenzen aufzulösen. Die nochmalige Aktualisierung zum 22. Juli 2026 hebt den </w:t>
+      </w:r>
+      <w:r>
+        <w:rPr>
+          <w:rFonts w:ascii="Arial" w:hAnsi="Arial"/>
+          <w:b w:val="0"/>
+          <w:i/>
+          <w:sz w:val="19"/>
+        </w:rPr>
+        <w:t>SkillSyncer</w:t>
+      </w:r>
+      <w:r>
+        <w:rPr>
+          <w:rFonts w:ascii="Arial" w:hAnsi="Arial"/>
+          <w:b w:val="0"/>
+          <w:i w:val="0"/>
+          <w:sz w:val="19"/>
+        </w:rPr>
+        <w:t xml:space="preserve">-Stand auf 322 Layoff-Ereignisse mit 205.832 betroffenen Beschäftigten (rund 1.014 Stellen pro Tag; +20 Ereignisse und +4.078 Personen gegenüber dem 19. Juli 2026) und weist 173 KI-attribuierte Einzelereignisse mit rund 170.945 betroffenen Beschäftigten aus — die Aggregat-KI-Kausalquote bleibt stabil bei 54 %, die absolute Zahl KI-attribuierter Ereignisse steigt um neun (+5,5 %), die Zahl KI-attribuierter Betroffener um 2.175 (+1,3 %); die Fortschreibung untermauert die stabile Position der 54-%-Quote als obere Aggregat-Attributionsgrenze und dokumentiert eine gleichmäßige, nicht sprunghafte Weiterrollung der Trackerbasis um rund 700 Stellen pro Tag im 72-Stunden-Fenster. </w:t>
       </w:r>
       <w:r>
         <w:rPr>
@@ -8658,6 +8676,218 @@
           <w:sz w:val="19"/>
         </w:rPr>
         <w:t xml:space="preserve"> eine zusätzliche Volatilitätsschicht erhält: Ein Kausalitätsschock in einer einzigen Design-Lieferkette kann die Frontier-Umsätze mehrerer Anbieter simultan berühren, was den bestandsbezogenen Zugriff zusätzlich fragilisiert.</w:t>
+      </w:r>
+    </w:p>
+    <w:p>
+      <w:pPr>
+        <w:jc w:val="both"/>
+      </w:pPr>
+      <w:r>
+        <w:rPr>
+          <w:rFonts w:ascii="Arial" w:hAnsi="Arial"/>
+          <w:b w:val="0"/>
+          <w:i w:val="0"/>
+          <w:sz w:val="19"/>
+        </w:rPr>
+        <w:t xml:space="preserve">Auf der Trainingsdaten-Ebene der KI-Wertschöpfungskette hat am 20. Juli 2026 US-Bezirksrichterin Araceli Martinez-Olguin am United States District Court for the Northern District of California nach dem altersbedingten Rückzug von Richter William Alsup den zwischen </w:t>
+      </w:r>
+      <w:r>
+        <w:rPr>
+          <w:rFonts w:ascii="Arial" w:hAnsi="Arial"/>
+          <w:b w:val="0"/>
+          <w:i/>
+          <w:sz w:val="19"/>
+        </w:rPr>
+        <w:t>Anthropic</w:t>
+      </w:r>
+      <w:r>
+        <w:rPr>
+          <w:rFonts w:ascii="Arial" w:hAnsi="Arial"/>
+          <w:b w:val="0"/>
+          <w:i w:val="0"/>
+          <w:sz w:val="19"/>
+        </w:rPr>
+        <w:t xml:space="preserve"> und einer Sammelklägergemeinschaft von Autorinnen, Autoren und Verlegern (Verfahrensname </w:t>
+      </w:r>
+      <w:r>
+        <w:rPr>
+          <w:rFonts w:ascii="Arial" w:hAnsi="Arial"/>
+          <w:b w:val="0"/>
+          <w:i/>
+          <w:sz w:val="19"/>
+        </w:rPr>
+        <w:t>Bartz et al. v. Anthropic</w:t>
+      </w:r>
+      <w:r>
+        <w:rPr>
+          <w:rFonts w:ascii="Arial" w:hAnsi="Arial"/>
+          <w:b w:val="0"/>
+          <w:i w:val="0"/>
+          <w:sz w:val="19"/>
+        </w:rPr>
+        <w:t>) ausgehandelten 1,5-Milliarden-Dollar-Vergleich endgültig genehmigt (TechCrunch, hothardware, Yahoo Finance, Publishers Weekly, TechTimes, Benzinga, Claims Journal). Nach übereinstimmender Berichterstattung handelt es sich um den größten Copyright-Vergleich in der US-Rechtsgeschichte: Rund 500.000 Werke von Autoren und Verlegern werden mit rund 3.000 US-Dollar pro Werk vergütet; der Vergleich schließt Objekt- und Verfahrensverzeichnis ohne rechtsbindende Präzedenzwirkung für andere Verfahren gegen KI-Anbieter ab. Der Streitgegenstand liegt nicht im KI-Training als solchem, sondern in der Beschaffungslogik: Richter Alsup hatte im Vorlauf entschieden, dass das Training auf legal erworbenen urheberrechtlich geschützten Texten unter die US-Fair-Use-Doktrin fällt, das systematische Herunterladen und Speichern von mehr als sieben Millionen Büchern aus Piraterie-Quellen (</w:t>
+      </w:r>
+      <w:r>
+        <w:rPr>
+          <w:rFonts w:ascii="Arial" w:hAnsi="Arial"/>
+          <w:b w:val="0"/>
+          <w:i/>
+          <w:sz w:val="19"/>
+        </w:rPr>
+        <w:t>Library Genesis</w:t>
+      </w:r>
+      <w:r>
+        <w:rPr>
+          <w:rFonts w:ascii="Arial" w:hAnsi="Arial"/>
+          <w:b w:val="0"/>
+          <w:i w:val="0"/>
+          <w:sz w:val="19"/>
+        </w:rPr>
+        <w:t xml:space="preserve">, </w:t>
+      </w:r>
+      <w:r>
+        <w:rPr>
+          <w:rFonts w:ascii="Arial" w:hAnsi="Arial"/>
+          <w:b w:val="0"/>
+          <w:i/>
+          <w:sz w:val="19"/>
+        </w:rPr>
+        <w:t>Pirate Library Mirror</w:t>
+      </w:r>
+      <w:r>
+        <w:rPr>
+          <w:rFonts w:ascii="Arial" w:hAnsi="Arial"/>
+          <w:b w:val="0"/>
+          <w:i w:val="0"/>
+          <w:sz w:val="19"/>
+        </w:rPr>
+        <w:t xml:space="preserve">) hingegen nicht — Richterin Martinez-Olguin genehmigte den Vergleich nun trotz Einwendungen einzelner Klägerinnen und Kläger, denen die Zahlung zu gering erschien. Für die in diesem Kapitel geführte Rohstoff-Analogie und die Veredelungsstrategie der Deutschland-These sind zwei Implikationen zu markieren: Erstens etabliert der Vergleich einen ersten großmaßstäblichen monetären Referenzwert für die </w:t>
+      </w:r>
+      <w:r>
+        <w:rPr>
+          <w:rFonts w:ascii="Arial" w:hAnsi="Arial"/>
+          <w:b w:val="0"/>
+          <w:i/>
+          <w:sz w:val="19"/>
+        </w:rPr>
+        <w:t>Trainingsdaten</w:t>
+      </w:r>
+      <w:r>
+        <w:rPr>
+          <w:rFonts w:ascii="Arial" w:hAnsi="Arial"/>
+          <w:b w:val="0"/>
+          <w:i w:val="0"/>
+          <w:sz w:val="19"/>
+        </w:rPr>
+        <w:t xml:space="preserve">-Ebene der KI-Wertschöpfungskette (rund 3.000 US-Dollar pro Werk × 500.000 Werke ≈ 1,5 Milliarden US-Dollar) — ein Rechenzeichen, das die bislang zu weiten Teilen unentgoltene Rohstoffnutzung im generativen KI-Sektor erstmals in einer justiziablen Größenordnung sichtbar macht. Zweitens verläuft der Vergleich am </w:t>
+      </w:r>
+      <w:r>
+        <w:rPr>
+          <w:rFonts w:ascii="Arial" w:hAnsi="Arial"/>
+          <w:b w:val="0"/>
+          <w:i/>
+          <w:sz w:val="19"/>
+        </w:rPr>
+        <w:t>Ort der Rohstoffproduktion</w:t>
+      </w:r>
+      <w:r>
+        <w:rPr>
+          <w:rFonts w:ascii="Arial" w:hAnsi="Arial"/>
+          <w:b w:val="0"/>
+          <w:i w:val="0"/>
+          <w:sz w:val="19"/>
+        </w:rPr>
+        <w:t xml:space="preserve"> (Autorinnen, Autoren und Verlage) und nicht am </w:t>
+      </w:r>
+      <w:r>
+        <w:rPr>
+          <w:rFonts w:ascii="Arial" w:hAnsi="Arial"/>
+          <w:b w:val="0"/>
+          <w:i/>
+          <w:sz w:val="19"/>
+        </w:rPr>
+        <w:t>Ort der Veredelungsrendite</w:t>
+      </w:r>
+      <w:r>
+        <w:rPr>
+          <w:rFonts w:ascii="Arial" w:hAnsi="Arial"/>
+          <w:b w:val="0"/>
+          <w:i w:val="0"/>
+          <w:sz w:val="19"/>
+        </w:rPr>
+        <w:t xml:space="preserve"> (Frontier-Anbieter), wodurch die in § 8.3 formulierte Teilhabefonds-Logik einer öffentlich-institutionellen Beteiligung an der Veredelungsrendite konzeptionell ergänzt, nicht ersetzt wird: Zivilrechtliche Vergütungen an Rohstoffproduzenten und öffentlich-rechtliche Zugriffe auf Veredelungsrenten adressieren unterschiedliche Ebenen derselben Wertschöpfungskette. Ohne bindende Präzedenzwirkung entfaltet der Vergleich seine strukturelle Wirkung vor allem als Signalwert an die weiterhin anhängigen Sammelklagen gegen </w:t>
+      </w:r>
+      <w:r>
+        <w:rPr>
+          <w:rFonts w:ascii="Arial" w:hAnsi="Arial"/>
+          <w:b w:val="0"/>
+          <w:i/>
+          <w:sz w:val="19"/>
+        </w:rPr>
+        <w:t>Google</w:t>
+      </w:r>
+      <w:r>
+        <w:rPr>
+          <w:rFonts w:ascii="Arial" w:hAnsi="Arial"/>
+          <w:b w:val="0"/>
+          <w:i w:val="0"/>
+          <w:sz w:val="19"/>
+        </w:rPr>
+        <w:t xml:space="preserve">, </w:t>
+      </w:r>
+      <w:r>
+        <w:rPr>
+          <w:rFonts w:ascii="Arial" w:hAnsi="Arial"/>
+          <w:b w:val="0"/>
+          <w:i/>
+          <w:sz w:val="19"/>
+        </w:rPr>
+        <w:t>Meta</w:t>
+      </w:r>
+      <w:r>
+        <w:rPr>
+          <w:rFonts w:ascii="Arial" w:hAnsi="Arial"/>
+          <w:b w:val="0"/>
+          <w:i w:val="0"/>
+          <w:sz w:val="19"/>
+        </w:rPr>
+        <w:t xml:space="preserve">, </w:t>
+      </w:r>
+      <w:r>
+        <w:rPr>
+          <w:rFonts w:ascii="Arial" w:hAnsi="Arial"/>
+          <w:b w:val="0"/>
+          <w:i/>
+          <w:sz w:val="19"/>
+        </w:rPr>
+        <w:t>Midjourney</w:t>
+      </w:r>
+      <w:r>
+        <w:rPr>
+          <w:rFonts w:ascii="Arial" w:hAnsi="Arial"/>
+          <w:b w:val="0"/>
+          <w:i w:val="0"/>
+          <w:sz w:val="19"/>
+        </w:rPr>
+        <w:t xml:space="preserve"> und </w:t>
+      </w:r>
+      <w:r>
+        <w:rPr>
+          <w:rFonts w:ascii="Arial" w:hAnsi="Arial"/>
+          <w:b w:val="0"/>
+          <w:i/>
+          <w:sz w:val="19"/>
+        </w:rPr>
+        <w:t>OpenAI</w:t>
+      </w:r>
+      <w:r>
+        <w:rPr>
+          <w:rFonts w:ascii="Arial" w:hAnsi="Arial"/>
+          <w:b w:val="0"/>
+          <w:i w:val="0"/>
+          <w:sz w:val="19"/>
+        </w:rPr>
+        <w:t>; die dortigen wirtschaftlichen Größenordnungen bleiben zunächst offen, das monetäre Rechenzeichen — und die Trennung zwischen Trainings-Fair-Use einerseits und rechtswidriger Beschaffung andererseits — ist mit dem Vergleich vom 20. Juli 2026 nun gesetzt.</w:t>
       </w:r>
     </w:p>
     <w:p>
@@ -13779,6 +14009,214 @@
           <w:i w:val="0"/>
           <w:sz w:val="19"/>
         </w:rPr>
+        <w:t xml:space="preserve">TechCrunch / hothardware / Yahoo Finance / Publishers Weekly / TechTimes / Benzinga / Claims Journal. (20./21. Juli 2026). </w:t>
+      </w:r>
+      <w:r>
+        <w:rPr>
+          <w:rFonts w:ascii="Arial" w:hAnsi="Arial"/>
+          <w:b w:val="0"/>
+          <w:i/>
+          <w:sz w:val="19"/>
+        </w:rPr>
+        <w:t>Anthropic's landmark $1.5B copyright settlement is approved / Judge Approves Historic $1.5 Billion Anthropic AI Copyright Settlement / US judge approves Anthropic's $1.5 billion settlement of copyright lawsuit / Judge Gives Final Approval of $1.5 Billion Anthropic Settlement / Anthropic Copyright Settlement Gets Final Approval: $3,000 Per Book, No Binding Precedent / Anthropic Secures Final Approval for $1.5 Billion AI Copyright Settlement Despite Authors' Objections / Judge Approves Anthropic's $1.5B Settlement of Copyright Lawsuit.</w:t>
+      </w:r>
+      <w:r>
+        <w:rPr>
+          <w:rFonts w:ascii="Arial" w:hAnsi="Arial"/>
+          <w:b w:val="0"/>
+          <w:i w:val="0"/>
+          <w:sz w:val="19"/>
+        </w:rPr>
+        <w:t xml:space="preserve"> Berichterstattung zur endgültigen Genehmigung des zwischen </w:t>
+      </w:r>
+      <w:r>
+        <w:rPr>
+          <w:rFonts w:ascii="Arial" w:hAnsi="Arial"/>
+          <w:b w:val="0"/>
+          <w:i/>
+          <w:sz w:val="19"/>
+        </w:rPr>
+        <w:t>Anthropic</w:t>
+      </w:r>
+      <w:r>
+        <w:rPr>
+          <w:rFonts w:ascii="Arial" w:hAnsi="Arial"/>
+          <w:b w:val="0"/>
+          <w:i w:val="0"/>
+          <w:sz w:val="19"/>
+        </w:rPr>
+        <w:t xml:space="preserve"> und einer Sammelklägergemeinschaft von Autorinnen, Autoren und Verlegern (Verfahren </w:t>
+      </w:r>
+      <w:r>
+        <w:rPr>
+          <w:rFonts w:ascii="Arial" w:hAnsi="Arial"/>
+          <w:b w:val="0"/>
+          <w:i/>
+          <w:sz w:val="19"/>
+        </w:rPr>
+        <w:t>Bartz et al. v. Anthropic</w:t>
+      </w:r>
+      <w:r>
+        <w:rPr>
+          <w:rFonts w:ascii="Arial" w:hAnsi="Arial"/>
+          <w:b w:val="0"/>
+          <w:i w:val="0"/>
+          <w:sz w:val="19"/>
+        </w:rPr>
+        <w:t>, US District Court for the Northern District of California) ausgehandelten 1,5-Milliarden-Dollar-Vergleichs durch US-Bezirksrichterin Araceli Martinez-Olguin am 20. Juli 2026 (Nachfolge des in den Ruhestand gegangenen Richters William Alsup): rund 500.000 Werke, rund 3.000 US-Dollar pro Werk; größter Copyright-Vergleich in der US-Rechtsgeschichte; keine rechtsbindende Präzedenzwirkung. Alsup hatte im Vorlauf entschieden, dass das Training auf legal erworbenen urheberrechtlich geschützten Texten unter die US-Fair-Use-Doktrin fällt, während das systematische Herunterladen und Speichern von über sieben Millionen Büchern aus Piraterie-Quellen (</w:t>
+      </w:r>
+      <w:r>
+        <w:rPr>
+          <w:rFonts w:ascii="Arial" w:hAnsi="Arial"/>
+          <w:b w:val="0"/>
+          <w:i/>
+          <w:sz w:val="19"/>
+        </w:rPr>
+        <w:t>Library Genesis</w:t>
+      </w:r>
+      <w:r>
+        <w:rPr>
+          <w:rFonts w:ascii="Arial" w:hAnsi="Arial"/>
+          <w:b w:val="0"/>
+          <w:i w:val="0"/>
+          <w:sz w:val="19"/>
+        </w:rPr>
+        <w:t xml:space="preserve">, </w:t>
+      </w:r>
+      <w:r>
+        <w:rPr>
+          <w:rFonts w:ascii="Arial" w:hAnsi="Arial"/>
+          <w:b w:val="0"/>
+          <w:i/>
+          <w:sz w:val="19"/>
+        </w:rPr>
+        <w:t>Pirate Library Mirror</w:t>
+      </w:r>
+      <w:r>
+        <w:rPr>
+          <w:rFonts w:ascii="Arial" w:hAnsi="Arial"/>
+          <w:b w:val="0"/>
+          <w:i w:val="0"/>
+          <w:sz w:val="19"/>
+        </w:rPr>
+        <w:t xml:space="preserve">) rechtswidrig sei; Martinez-Olguin überstimmte Einwendungen einzelner Klägerinnen und Kläger zur Zahlungshöhe. Signal an weitere anhängige Verfahren gegen </w:t>
+      </w:r>
+      <w:r>
+        <w:rPr>
+          <w:rFonts w:ascii="Arial" w:hAnsi="Arial"/>
+          <w:b w:val="0"/>
+          <w:i/>
+          <w:sz w:val="19"/>
+        </w:rPr>
+        <w:t>Google</w:t>
+      </w:r>
+      <w:r>
+        <w:rPr>
+          <w:rFonts w:ascii="Arial" w:hAnsi="Arial"/>
+          <w:b w:val="0"/>
+          <w:i w:val="0"/>
+          <w:sz w:val="19"/>
+        </w:rPr>
+        <w:t xml:space="preserve">, </w:t>
+      </w:r>
+      <w:r>
+        <w:rPr>
+          <w:rFonts w:ascii="Arial" w:hAnsi="Arial"/>
+          <w:b w:val="0"/>
+          <w:i/>
+          <w:sz w:val="19"/>
+        </w:rPr>
+        <w:t>Meta</w:t>
+      </w:r>
+      <w:r>
+        <w:rPr>
+          <w:rFonts w:ascii="Arial" w:hAnsi="Arial"/>
+          <w:b w:val="0"/>
+          <w:i w:val="0"/>
+          <w:sz w:val="19"/>
+        </w:rPr>
+        <w:t xml:space="preserve">, </w:t>
+      </w:r>
+      <w:r>
+        <w:rPr>
+          <w:rFonts w:ascii="Arial" w:hAnsi="Arial"/>
+          <w:b w:val="0"/>
+          <w:i/>
+          <w:sz w:val="19"/>
+        </w:rPr>
+        <w:t>Midjourney</w:t>
+      </w:r>
+      <w:r>
+        <w:rPr>
+          <w:rFonts w:ascii="Arial" w:hAnsi="Arial"/>
+          <w:b w:val="0"/>
+          <w:i w:val="0"/>
+          <w:sz w:val="19"/>
+        </w:rPr>
+        <w:t xml:space="preserve"> und </w:t>
+      </w:r>
+      <w:r>
+        <w:rPr>
+          <w:rFonts w:ascii="Arial" w:hAnsi="Arial"/>
+          <w:b w:val="0"/>
+          <w:i/>
+          <w:sz w:val="19"/>
+        </w:rPr>
+        <w:t>OpenAI</w:t>
+      </w:r>
+      <w:r>
+        <w:rPr>
+          <w:rFonts w:ascii="Arial" w:hAnsi="Arial"/>
+          <w:b w:val="0"/>
+          <w:i w:val="0"/>
+          <w:sz w:val="19"/>
+        </w:rPr>
+        <w:t>; erster großmaßstäblicher monetärer Referenzwert für die Trainingsdaten-Ebene der KI-Wertschöpfungskette. Aufnahme in § 8.2 mit Rückwirkung auf § 8.3. https://techcrunch.com/2026/07/20/anthropics-landmark-1-5b-copyright-settlement-is-approved/ | https://hothardware.com/news/judge-approves-historic-15-billion-anthropic-ai-copyright-settlement | https://finance.yahoo.com/technology/ai/articles/us-judge-approves-anthropics-1-204851948.html | https://www.publishersweekly.com/pw/by-topic/digital/copyright/article/100888-judge-gives-final-approval-in-1-5-billion-settlement-in-anthropic-copyright-case.html | https://www.techtimes.com/articles/321156/20260721/anthropic-copyright-settlement-gets-final-approval-3000-per-book-no-binding-precedent.htm | https://www.benzinga.com/news/legal/26/07/60569679/anthropic-secures-final-approval-for-1-5-billion-ai-copyright-settlement-despite-authors-objections | https://www.claimsjournal.com/news/national/2026/07/21/338959.htm</w:t>
+      </w:r>
+    </w:p>
+    <w:p>
+      <w:pPr>
+        <w:jc w:val="both"/>
+      </w:pPr>
+      <w:r>
+        <w:rPr>
+          <w:rFonts w:ascii="Arial" w:hAnsi="Arial"/>
+          <w:b w:val="0"/>
+          <w:i w:val="0"/>
+          <w:sz w:val="19"/>
+        </w:rPr>
+        <w:t xml:space="preserve">SkillSyncer. (Stand 22. Juli 2026). </w:t>
+      </w:r>
+      <w:r>
+        <w:rPr>
+          <w:rFonts w:ascii="Arial" w:hAnsi="Arial"/>
+          <w:b w:val="0"/>
+          <w:i/>
+          <w:sz w:val="19"/>
+        </w:rPr>
+        <w:t>2026 Tech Layoffs Tracker — 322 Events, 205.832 Workers, 173 AI-attributed (~54 %).</w:t>
+      </w:r>
+      <w:r>
+        <w:rPr>
+          <w:rFonts w:ascii="Arial" w:hAnsi="Arial"/>
+          <w:b w:val="0"/>
+          <w:i w:val="0"/>
+          <w:sz w:val="19"/>
+        </w:rPr>
+        <w:t xml:space="preserve"> Aktualisierter Trackerstand: 322 Layoff-Ereignisse mit 205.832 betroffenen Beschäftigten (rund 1.014 Stellen pro Tag); 173 KI-attribuierte Einzelereignisse mit rund 170.945 betroffenen Beschäftigten (etwa 54 % der Ereignisse und rund 83 % der Betroffenen). Fortschreibung des 19.-Juli-2026-Stands (302/201.754/164/168.770) um +20 Ereignisse (+6,6 %), +4.078 Betroffene (+2,0 %), +9 KI-attribuierte Ereignisse (+5,5 %) und +2.175 KI-attribuierte Betroffene (+1,3 %); die Aggregat-KI-Kausalquote bleibt stabil bei 54 %. Aufnahme in § 1.1 als Aggregat-Beleg der weiterhin gleichmäßigen Tech-Restrukturierung und Präzisierung der KI-Kausalquote (§ 9.1). https://skillsyncer.com/layoffs-tracker</w:t>
+      </w:r>
+    </w:p>
+    <w:p>
+      <w:pPr>
+        <w:jc w:val="both"/>
+      </w:pPr>
+      <w:r>
+        <w:rPr>
+          <w:rFonts w:ascii="Arial" w:hAnsi="Arial"/>
+          <w:b w:val="0"/>
+          <w:i w:val="0"/>
+          <w:sz w:val="19"/>
+        </w:rPr>
         <w:t>BornCity. (April 2026). OpenAI fordert Robotersteuer und 32-Stunden-Woche.</w:t>
       </w:r>
     </w:p>
@@ -17310,7 +17748,7 @@
           <w:i w:val="0"/>
           <w:sz w:val="19"/>
         </w:rPr>
-        <w:t xml:space="preserve"> Dieses Arbeitspapier gibt den Stand Mitte Juli 2026 (Schnitt am 21. Juli 2026 — Lauf 001 vom 21. Juli 2026) wieder. Die Debatte entwickelt sich dynamisch, insbesondere im Zuge der OpenAI-Strategiepapiere und der Eröffnung des OpenAI Workshop in Washington, D.C. im Mai 2026, des Erstdurchgangs des GKV-Beitragssatzstabilisierungsgesetzes in der 1065. Bundesratssitzung am 8. Mai 2026 mit 79 Tagesordnungspunkten (Kabinettsbeschluss 29. April 2026, parlamentarische Behandlung vor der Sommerpause 2026 angekündigt), der laufenden Trilog-Verhandlungen zum Digital Omnibus on AI (zweite Runde 28. April 2026 ohne Einigung; nächste Runde 13. Mai 2026 — Knackpunkt ist nicht die Verschiebung der Hochrisiko-Pflichten, sondern die Konformitätsbewertungs-Architektur für Anhang I; die zypriotische Ratspräsidentschaft strebt einen Abschluss vor Ablauf ihrer Amtszeit am 30. Juni 2026 an, andernfalls übernimmt die irische Präsidentschaft), der am 5. Mai 2026 erfolgten Arraignment-Verhandlung im Altman-Verfahren mit „nicht schuldig"-Plädoyer und angeordneter psychiatrischer Begutachtung, des am 7. Mai 2026 versandten individuellen Microsoft-Buyout-Angebots (Annahmefrist 8. Juni 2026, VRSAR-Unterzeichnung 9.–22. Juni 2026, bis zu fünfjährige Krankenversicherungs-Verlängerung), des am 1. Mai 2026 vom Connecticut-Repräsentantenhaus mit 131 zu 17 Stimmen verabschiedeten </w:t>
+        <w:t xml:space="preserve"> Dieses Arbeitspapier gibt den Stand Mitte Juli 2026 (Schnitt am 22. Juli 2026 — Lauf 001 vom 22. Juli 2026) wieder. Die Debatte entwickelt sich dynamisch, insbesondere im Zuge der OpenAI-Strategiepapiere und der Eröffnung des OpenAI Workshop in Washington, D.C. im Mai 2026, des Erstdurchgangs des GKV-Beitragssatzstabilisierungsgesetzes in der 1065. Bundesratssitzung am 8. Mai 2026 mit 79 Tagesordnungspunkten (Kabinettsbeschluss 29. April 2026, parlamentarische Behandlung vor der Sommerpause 2026 angekündigt), der laufenden Trilog-Verhandlungen zum Digital Omnibus on AI (zweite Runde 28. April 2026 ohne Einigung; nächste Runde 13. Mai 2026 — Knackpunkt ist nicht die Verschiebung der Hochrisiko-Pflichten, sondern die Konformitätsbewertungs-Architektur für Anhang I; die zypriotische Ratspräsidentschaft strebt einen Abschluss vor Ablauf ihrer Amtszeit am 30. Juni 2026 an, andernfalls übernimmt die irische Präsidentschaft), der am 5. Mai 2026 erfolgten Arraignment-Verhandlung im Altman-Verfahren mit „nicht schuldig"-Plädoyer und angeordneter psychiatrischer Begutachtung, des am 7. Mai 2026 versandten individuellen Microsoft-Buyout-Angebots (Annahmefrist 8. Juni 2026, VRSAR-Unterzeichnung 9.–22. Juni 2026, bis zu fünfjährige Krankenversicherungs-Verlängerung), des am 1. Mai 2026 vom Connecticut-Repräsentantenhaus mit 131 zu 17 Stimmen verabschiedeten </w:t>
       </w:r>
       <w:r>
         <w:rPr>
@@ -19452,7 +19890,97 @@
           <w:i w:val="0"/>
           <w:sz w:val="19"/>
         </w:rPr>
-        <w:t xml:space="preserve"> (14./15. Juli 2026) und einer UVA-Darden-Erläuterung zur Rolle Korineks vom 15. Juli 2026, organisiert von Erik Brynjolfsson (Stanford), Ajay Agrawal (Toronto), Anton Korinek (UVA / Anthropic) und Tom Cunningham (METR) und zum Startzeitpunkt von mehr als 200 Ökonominnen, Ökonomen und KI-Forschenden unterzeichnet — darunter sechzehn Nobelpreisträger (u. a. Daron Acemoglu, Simon Johnson, Joseph Stiglitz, Paul Krugman, Michael Spence, Ben Bernanke) und Vertreter aus KI-Unternehmen (Jack Clark / Anthropic, Sarah Friar / OpenAI, Jeff Dean / Google, Yoshua Bengio, Yann LeCun, Eric Schmidt); Kernaussage: KI könne eine Transformation größer als die Industrielle Revolution auslösen, aber in Jahren statt Jahrzehnten, weshalb umgehend „Anreize, Leitplanken und Institutionen" erforderlich seien. Aufnahme in § 3.3 als politisch-institutionelle Verankerung des Korinek-Lockwood-Rahmens und als dokumentierte Positionsbewegung von Acemoglu/Johnson mit Rückwirkung auf § 3.5 und § 11.3. Eine regelmäßige Aktualisierung ist vorgesehen.</w:t>
+        <w:t xml:space="preserve"> (14./15. Juli 2026) und einer UVA-Darden-Erläuterung zur Rolle Korineks vom 15. Juli 2026, organisiert von Erik Brynjolfsson (Stanford), Ajay Agrawal (Toronto), Anton Korinek (UVA / Anthropic) und Tom Cunningham (METR) und zum Startzeitpunkt von mehr als 200 Ökonominnen, Ökonomen und KI-Forschenden unterzeichnet — darunter sechzehn Nobelpreisträger (u. a. Daron Acemoglu, Simon Johnson, Joseph Stiglitz, Paul Krugman, Michael Spence, Ben Bernanke) und Vertreter aus KI-Unternehmen (Jack Clark / Anthropic, Sarah Friar / OpenAI, Jeff Dean / Google, Yoshua Bengio, Yann LeCun, Eric Schmidt); Kernaussage: KI könne eine Transformation größer als die Industrielle Revolution auslösen, aber in Jahren statt Jahrzehnten, weshalb umgehend „Anreize, Leitplanken und Institutionen" erforderlich seien. Aufnahme in § 3.3 als politisch-institutionelle Verankerung des Korinek-Lockwood-Rahmens und als dokumentierte Positionsbewegung von Acemoglu/Johnson mit Rückwirkung auf § 3.5 und § 11.3. Mit Schnitt am 22. Juli 2026 (Lauf 001 vom 22. Juli 2026) tritt Version 42.0 hinzu und ergänzt zwei belegbare Fortschreibungen aus dem 7-Tage-Fenster bzw. 48-Stunden-Fenster für Cluster F: die am 20. Juli 2026 durch US-Bezirksrichterin Araceli Martinez-Olguin (in Nachfolge des in den Ruhestand gegangenen Richters William Alsup) am United States District Court for the Northern District of California erteilte endgültige Genehmigung des 1,5-Milliarden-Dollar-Vergleichs zwischen </w:t>
+      </w:r>
+      <w:r>
+        <w:rPr>
+          <w:rFonts w:ascii="Arial" w:hAnsi="Arial"/>
+          <w:b w:val="0"/>
+          <w:i/>
+          <w:sz w:val="19"/>
+        </w:rPr>
+        <w:t>Anthropic</w:t>
+      </w:r>
+      <w:r>
+        <w:rPr>
+          <w:rFonts w:ascii="Arial" w:hAnsi="Arial"/>
+          <w:b w:val="0"/>
+          <w:i w:val="0"/>
+          <w:sz w:val="19"/>
+        </w:rPr>
+        <w:t xml:space="preserve"> und einer Sammelklägergemeinschaft von Autorinnen, Autoren und Verlegern (Verfahren </w:t>
+      </w:r>
+      <w:r>
+        <w:rPr>
+          <w:rFonts w:ascii="Arial" w:hAnsi="Arial"/>
+          <w:b w:val="0"/>
+          <w:i/>
+          <w:sz w:val="19"/>
+        </w:rPr>
+        <w:t>Bartz et al. v. Anthropic</w:t>
+      </w:r>
+      <w:r>
+        <w:rPr>
+          <w:rFonts w:ascii="Arial" w:hAnsi="Arial"/>
+          <w:b w:val="0"/>
+          <w:i w:val="0"/>
+          <w:sz w:val="19"/>
+        </w:rPr>
+        <w:t>) mit rund 500.000 Werken zu je rund 3.000 US-Dollar (TechCrunch, hothardware, Yahoo Finance, Publishers Weekly, TechTimes, Benzinga, Claims Journal 20./21. Juli 2026) — größter Copyright-Vergleich der US-Rechtsgeschichte, keine bindende Präzedenzwirkung; Alsup hatte im Vorlauf entschieden, dass das Training auf legal erworbenen urheberrechtlich geschützten Texten unter die US-Fair-Use-Doktrin fällt, während das Herunterladen aus Piraterie-Quellen (</w:t>
+      </w:r>
+      <w:r>
+        <w:rPr>
+          <w:rFonts w:ascii="Arial" w:hAnsi="Arial"/>
+          <w:b w:val="0"/>
+          <w:i/>
+          <w:sz w:val="19"/>
+        </w:rPr>
+        <w:t>Library Genesis</w:t>
+      </w:r>
+      <w:r>
+        <w:rPr>
+          <w:rFonts w:ascii="Arial" w:hAnsi="Arial"/>
+          <w:b w:val="0"/>
+          <w:i w:val="0"/>
+          <w:sz w:val="19"/>
+        </w:rPr>
+        <w:t xml:space="preserve">, </w:t>
+      </w:r>
+      <w:r>
+        <w:rPr>
+          <w:rFonts w:ascii="Arial" w:hAnsi="Arial"/>
+          <w:b w:val="0"/>
+          <w:i/>
+          <w:sz w:val="19"/>
+        </w:rPr>
+        <w:t>Pirate Library Mirror</w:t>
+      </w:r>
+      <w:r>
+        <w:rPr>
+          <w:rFonts w:ascii="Arial" w:hAnsi="Arial"/>
+          <w:b w:val="0"/>
+          <w:i w:val="0"/>
+          <w:sz w:val="19"/>
+        </w:rPr>
+        <w:t xml:space="preserve">) rechtswidrig sei — Aufnahme in § 8.2 als erster großmaßstäblicher monetärer Referenzwert für die Trainingsdaten-Ebene der KI-Wertschöpfungskette mit Rückwirkung auf § 8.3 (Trennung zwischen zivilrechtlicher Vergütung am Ort der Rohstoffproduktion und öffentlich-rechtlichem Zugriff am Ort der Veredelungsrendite); sowie die Fortschreibung des </w:t>
+      </w:r>
+      <w:r>
+        <w:rPr>
+          <w:rFonts w:ascii="Arial" w:hAnsi="Arial"/>
+          <w:b w:val="0"/>
+          <w:i/>
+          <w:sz w:val="19"/>
+        </w:rPr>
+        <w:t>SkillSyncer</w:t>
+      </w:r>
+      <w:r>
+        <w:rPr>
+          <w:rFonts w:ascii="Arial" w:hAnsi="Arial"/>
+          <w:b w:val="0"/>
+          <w:i w:val="0"/>
+          <w:sz w:val="19"/>
+        </w:rPr>
+        <w:t>-Layoff-Trackers zum 22. Juli 2026 (322 Layoff-Ereignisse, 205.832 betroffene Beschäftigte, 173 KI-attribuierte Ereignisse mit rund 170.945 KI-attribuierten Personen; +20 Ereignisse und +4.078 Personen gegenüber dem 19. Juli 2026; die Aggregat-KI-Kausalquote bleibt stabil bei 54 %) — Aufnahme in § 1.1 als Aggregat-Beleg der weiterhin gleichmäßigen Tech-Restrukturierung und Präzisierung der KI-Kausalquote (§ 9.1). Eine regelmäßige Aktualisierung ist vorgesehen.</w:t>
       </w:r>
     </w:p>
     <w:p>
@@ -19532,7 +20060,7 @@
         <w:color w:val="999999"/>
         <w:sz w:val="15"/>
       </w:rPr>
-      <w:t>Version 41.0 — Mai 2026 — CC BY 4.0</w:t>
+      <w:t>Version 42.0 — Mai 2026 — CC BY 4.0</w:t>
       <w:tab/>
       <w:t xml:space="preserve">Seite </w:t>
     </w:r>

</xml_diff>

<commit_message>
Daily-Update 2026-07-23 — Version 43.0 (Cluster: A/E, F, J)
- § 1.1 (eingebetteter Absatz): Meta 1.395 Washington-Streichungen (22.7.) und Amazon-AGI-Unit-Streichungen (22.7.) + Fed-FEDS-Note "The AI Buildout and the Economy" (Soto/Thieu/Allen, 17.7.).
- § 8.2 (eingebetteter Absatz): Tesla Q2 2026 Earnings Call (22.7.) - Fremont-Optimus-Gen-3-Erstlinien, "Terafab"-Ankündigung, Capex > 25 Mrd. USD, AI-Compute-Partnerschaften Samsung/TSMC.
- § 11.3: neuer Eintrag Soto/Thieu/Allen (Federal Reserve FEDS Note).
- § 11.5: drei neue Einträge (Meta Washington, Amazon AGI Unit, Tesla Q2 2026); SkillSyncer-Eintrag um 23.-Juli-Präzisierung erweitert.
- § 1.1: Redundanzbereinigung - Duplikat-TrueUp-Satz reduziert.
- Version 42.0 -> 43.0 an allen vier Stellen (Dokumentkopf, Aktualitätshinweis, README, Validierung-Ergebnisse).

Recherche: 18 Suchanfragen ueber alle 10 Cluster (A-J); 11 Treffer geprueft, 4 uebernommen, 7 verworfen.
Validierung: OK (Redundanz-Fehler behoben); PDF/DOCX neu erstellt.
</commit_message>
<xml_diff>
--- a/KI-Ökonomie.docx
+++ b/KI-Ökonomie.docx
@@ -112,7 +112,7 @@
           <w:color w:val="666666"/>
           <w:sz w:val="18"/>
         </w:rPr>
-        <w:t>Version 42.0</w:t>
+        <w:t>Version 43.0</w:t>
       </w:r>
     </w:p>
     <w:p>
@@ -526,25 +526,151 @@
           <w:i w:val="0"/>
           <w:sz w:val="19"/>
         </w:rPr>
-        <w:t xml:space="preserve">-Stand auf 322 Layoff-Ereignisse mit 205.832 betroffenen Beschäftigten (rund 1.014 Stellen pro Tag; +20 Ereignisse und +4.078 Personen gegenüber dem 19. Juli 2026) und weist 173 KI-attribuierte Einzelereignisse mit rund 170.945 betroffenen Beschäftigten aus — die Aggregat-KI-Kausalquote bleibt stabil bei 54 %, die absolute Zahl KI-attribuierter Ereignisse steigt um neun (+5,5 %), die Zahl KI-attribuierter Betroffener um 2.175 (+1,3 %); die Fortschreibung untermauert die stabile Position der 54-%-Quote als obere Aggregat-Attributionsgrenze und dokumentiert eine gleichmäßige, nicht sprunghafte Weiterrollung der Trackerbasis um rund 700 Stellen pro Tag im 72-Stunden-Fenster. </w:t>
-      </w:r>
-      <w:r>
-        <w:rPr>
-          <w:rFonts w:ascii="Arial" w:hAnsi="Arial"/>
-          <w:b w:val="0"/>
-          <w:i/>
-          <w:sz w:val="19"/>
-        </w:rPr>
-        <w:t>TrueUp</w:t>
-      </w:r>
-      <w:r>
-        <w:rPr>
-          <w:rFonts w:ascii="Arial" w:hAnsi="Arial"/>
-          <w:b w:val="0"/>
-          <w:i w:val="0"/>
-          <w:sz w:val="19"/>
-        </w:rPr>
-        <w:t xml:space="preserve"> zählt zur Jahresmitte 2026 rund 164.971 Personen aus 435 Layoff-Meldungen (rund 887 pro Tag) und dokumentiert damit ein 2026 kumuliert niedrigeres Volumen als 2025 (245.953 Personen aus 783 Meldungen), aber eine deutlich höhere tägliche Rate (887 gegenüber 674 pro Tag). </w:t>
+        <w:t xml:space="preserve">-Stand auf 322 Layoff-Ereignisse mit 205.832 betroffenen Beschäftigten (rund 1.014 Stellen pro Tag; +20 Ereignisse und +4.078 Personen gegenüber dem 19. Juli 2026) und weist 173 KI-attribuierte Einzelereignisse mit rund 170.945 betroffenen Beschäftigten aus — die Aggregat-KI-Kausalquote bleibt stabil bei 54 %, die absolute Zahl KI-attribuierter Ereignisse steigt um neun (+5,5 %), die Zahl KI-attribuierter Betroffener um 2.175 (+1,3 %); die Fortschreibung untermauert die stabile Position der 54-%-Quote als obere Aggregat-Attributionsgrenze und dokumentiert eine gleichmäßige, nicht sprunghafte Weiterrollung der Trackerbasis um rund 700 Stellen pro Tag im 72-Stunden-Fenster. Am 22. Juli 2026 verdichten zwei parallele Ankündigungen aus Cluster F die Trackerbasis um zwei substanziell KI-getriebene Einzelereignisse: Nach Berichterstattung von GeekWire, KUOW, Fox Business, Fox13 Seattle und Business Insider hat </w:t>
+      </w:r>
+      <w:r>
+        <w:rPr>
+          <w:rFonts w:ascii="Arial" w:hAnsi="Arial"/>
+          <w:b w:val="0"/>
+          <w:i/>
+          <w:sz w:val="19"/>
+        </w:rPr>
+        <w:t>Meta</w:t>
+      </w:r>
+      <w:r>
+        <w:rPr>
+          <w:rFonts w:ascii="Arial" w:hAnsi="Arial"/>
+          <w:b w:val="0"/>
+          <w:i w:val="0"/>
+          <w:sz w:val="19"/>
+        </w:rPr>
+        <w:t xml:space="preserve"> zum Wirksamkeitsstichtag 22. Juli 2026 (Ankündigungsmail an die Belegschaft 20. Mai 2026) rund 1.395 Beschäftigte im US-Bundesstaat Washington entlassen — nach der Aufschlüsselung aus Bellevue (699), Seattle (259 aus zwei Büros), Redmond (206) und Remote-Positionen (231) — als Teil des im Mai 2026 gestarteten konzernweiten 8.000-Stellen-Restrukturierungsprogramms zur Umschichtung „hin zu geschäftskritischen Prioritäten"; das Konzernstatement („The changes we are implementing vary by team and include layoffs, open role closures and moving thousands of employees to business critical priorities across the company") verankert den Vorgang wortgleich in der bereits in § 3.5 und § 8.3 diskutierten AI-Reorganisationslogik, das Abfindungspaket umfasst 16 Wochen Grundvergütung plus zwei Wochen pro Dienstjahr bei einer globalen März-2026-Belegschaft von knapp 78.000 Beschäftigten. Parallel dazu hat </w:t>
+      </w:r>
+      <w:r>
+        <w:rPr>
+          <w:rFonts w:ascii="Arial" w:hAnsi="Arial"/>
+          <w:b w:val="0"/>
+          <w:i/>
+          <w:sz w:val="19"/>
+        </w:rPr>
+        <w:t>Amazon</w:t>
+      </w:r>
+      <w:r>
+        <w:rPr>
+          <w:rFonts w:ascii="Arial" w:hAnsi="Arial"/>
+          <w:b w:val="0"/>
+          <w:i w:val="0"/>
+          <w:sz w:val="19"/>
+        </w:rPr>
+        <w:t xml:space="preserve"> am selben 22. Juli 2026 nach CNBC-, Yahoo-Finance- und American-Bazaar-Berichterstattung Streichungen in der </w:t>
+      </w:r>
+      <w:r>
+        <w:rPr>
+          <w:rFonts w:ascii="Arial" w:hAnsi="Arial"/>
+          <w:b w:val="0"/>
+          <w:i/>
+          <w:sz w:val="19"/>
+        </w:rPr>
+        <w:t>Artificial-General-Intelligence</w:t>
+      </w:r>
+      <w:r>
+        <w:rPr>
+          <w:rFonts w:ascii="Arial" w:hAnsi="Arial"/>
+          <w:b w:val="0"/>
+          <w:i w:val="0"/>
+          <w:sz w:val="19"/>
+        </w:rPr>
+        <w:t xml:space="preserve">-Organisation angekündigt — jener Einheit, die für die </w:t>
+      </w:r>
+      <w:r>
+        <w:rPr>
+          <w:rFonts w:ascii="Arial" w:hAnsi="Arial"/>
+          <w:b w:val="0"/>
+          <w:i/>
+          <w:sz w:val="19"/>
+        </w:rPr>
+        <w:t>Nova</w:t>
+      </w:r>
+      <w:r>
+        <w:rPr>
+          <w:rFonts w:ascii="Arial" w:hAnsi="Arial"/>
+          <w:b w:val="0"/>
+          <w:i w:val="0"/>
+          <w:sz w:val="19"/>
+        </w:rPr>
+        <w:t xml:space="preserve">-Foundation-Modelle (unter anderem </w:t>
+      </w:r>
+      <w:r>
+        <w:rPr>
+          <w:rFonts w:ascii="Arial" w:hAnsi="Arial"/>
+          <w:b w:val="0"/>
+          <w:i/>
+          <w:sz w:val="19"/>
+        </w:rPr>
+        <w:t>Amazon Nova Act</w:t>
+      </w:r>
+      <w:r>
+        <w:rPr>
+          <w:rFonts w:ascii="Arial" w:hAnsi="Arial"/>
+          <w:b w:val="0"/>
+          <w:i w:val="0"/>
+          <w:sz w:val="19"/>
+        </w:rPr>
+        <w:t xml:space="preserve">) sowie für Silizium- und Quantencomputing-Programme zuständig ist und in den vorangegangenen Monaten die Abgänge der Führungskräfte Rohit Prasad und David Luan verzeichnete; die Streichungen betreffen die Teams der Vice Presidents Adeeb Shanaa (AGI Data Services) und Vishal Sharma (AGI Information) und werden vom Konzern ohne konkrete Personenanzahl kommuniziert, jedoch als strategische Verschiebung „hin zu kundenzentrierter KI" begründet, wörtlich: „This is a fast-moving space, and we're sharpening our focus on the initiatives that matter most for customers, so we can move faster on what counts." Die Streichungen fallen in einen Zeitraum, in dem AWS parallel eine Milliarden-US-Dollar-Initiative zur Einbettung eigener Ingenieurinnen und Ingenieure in Enterprise-Kundenprojekte für agentische KI-Systeme aufsetzt; betroffene US-Beschäftigte erhalten 90 Tage Gehalts- und Leistungsfortzahlung, Outplacement-Zugang sowie einen Übergangsanspruch auf Krankenversicherung. Die beiden Ankündigungen fügen sich in die in § 3.4 referierte Rebound-Beobachtung insofern ein, als </w:t>
+      </w:r>
+      <w:r>
+        <w:rPr>
+          <w:rFonts w:ascii="Arial" w:hAnsi="Arial"/>
+          <w:b w:val="0"/>
+          <w:i/>
+          <w:sz w:val="19"/>
+        </w:rPr>
+        <w:t>Amazon</w:t>
+      </w:r>
+      <w:r>
+        <w:rPr>
+          <w:rFonts w:ascii="Arial" w:hAnsi="Arial"/>
+          <w:b w:val="0"/>
+          <w:i w:val="0"/>
+          <w:sz w:val="19"/>
+        </w:rPr>
+        <w:t xml:space="preserve"> seine strategische Neuausrichtung ausdrücklich auf Deployment statt Grundlagenforschung verlagert, während </w:t>
+      </w:r>
+      <w:r>
+        <w:rPr>
+          <w:rFonts w:ascii="Arial" w:hAnsi="Arial"/>
+          <w:b w:val="0"/>
+          <w:i/>
+          <w:sz w:val="19"/>
+        </w:rPr>
+        <w:t>Meta</w:t>
+      </w:r>
+      <w:r>
+        <w:rPr>
+          <w:rFonts w:ascii="Arial" w:hAnsi="Arial"/>
+          <w:b w:val="0"/>
+          <w:i w:val="0"/>
+          <w:sz w:val="19"/>
+        </w:rPr>
+        <w:t xml:space="preserve"> im Rahmen desselben AI-Restrukturierungsprogramms rund 7.000 Beschäftigte in neu geschaffene AI-Rollen umschichtet — die Kausalattributions-Grenze zwischen KI-Verdrängung und strategischem Portfolio-Wechsel innerhalb desselben Konzerns bleibt damit auch am aktuellen Rand präsent. Diese binnenwirtschaftliche Kausalunschärfe wird durch eine am 17. Juli 2026 vom US-Board of Governors veröffentlichte FEDS Note </w:t>
+      </w:r>
+      <w:r>
+        <w:rPr>
+          <w:rFonts w:ascii="Arial" w:hAnsi="Arial"/>
+          <w:b w:val="0"/>
+          <w:i/>
+          <w:sz w:val="19"/>
+        </w:rPr>
+        <w:t>„The AI Buildout and the Economy: Publicly Available Data to Assess AI's Impact"</w:t>
+      </w:r>
+      <w:r>
+        <w:rPr>
+          <w:rFonts w:ascii="Arial" w:hAnsi="Arial"/>
+          <w:b w:val="0"/>
+          <w:i w:val="0"/>
+          <w:sz w:val="19"/>
+        </w:rPr>
+        <w:t xml:space="preserve"> der Federal-Reserve-Ökonominnen und -Ökonomen Paul E. Soto, Mason Thieu und Jeffrey S. Allen aggregiert und institutionalisiert: Die Autoren ordnen die aktuelle Phase — bei zugleich anhaltend hohem Capex-Wachstum der Hyperscaler und rasch steigenden Adoptionsraten — als „Buildout-Phase" ein, in der die makroökonomischen Arbeitsmarkteffekte „konzentriert bleiben und sich im Aggregat noch nicht verbreitert haben"; die Produktivitätstrends zwischen Sektoren mit hoher (Information, Finanzen, professionelle Dienstleistungen), mittlerer (Verarbeitendes Gewerbe, Handel) und niedriger KI-Exposition (Bau, Gastgewerbe, Verkehr) hätten sich „relativ konsistent über die Zeit" entwickelt — ein Befund, den die Autoren als „Mikro-Ebenen-Produktivitätsgewinne, die sich im Aggregat noch nicht summieren" bezeichnen. Für die Arbeitsmarktseite dokumentiert die Note eine Zweiteilung nach Altersgruppen: Bei jüngeren Beschäftigten (20 – 24 Jahre) zeige sich der KI-Effekt „primär in verlangsamter Einstellungsdynamik statt in unmittelbaren Entlassungen" (Referenz: Lichtinger &amp; Hosseini Maasoum 2025), während für Erwerbspersonen im Haupterwerbsalter (25 – 54 Jahre) kein vergleichbares Signal identifiziert werde; die höchste sektorale Exposition liege bei Programmier- und Analysetätigkeiten (NAICS 51 Information, NAICS 54 Professional/Technical Services). Für die Steuerdebatte wirkt die Fed-Note in doppelter Weise: Sie stützt die in § 8.3 dokumentierte Diagnose, dass die Beitragsseite der lohnbasierten Sozialversicherung sich strukturell schneller erodiert als die aggregierte Statistik derzeit ausweist — der Aggregatbefund maskiere „kompositionelle Verschiebungen, die möglicherweise mit KI zusammenhängen" — und stützt zugleich die in § 9.1 dokumentierte Kausalattributionsproblematik einer engen Typ-5-Ersatzabgabe, weil auf der Ebene US-weiter administrativer Daten die Attribution „Verdrängung / verlangsamte Einstellung / Restrukturierung / Sektor-Reallokation" noch nicht trennscharf isolierbar ist. </w:t>
       </w:r>
       <w:r>
         <w:rPr>
@@ -8888,6 +9014,128 @@
           <w:sz w:val="19"/>
         </w:rPr>
         <w:t>; die dortigen wirtschaftlichen Größenordnungen bleiben zunächst offen, das monetäre Rechenzeichen — und die Trennung zwischen Trainings-Fair-Use einerseits und rechtswidriger Beschaffung andererseits — ist mit dem Vergleich vom 20. Juli 2026 nun gesetzt.</w:t>
+      </w:r>
+    </w:p>
+    <w:p>
+      <w:pPr>
+        <w:jc w:val="both"/>
+      </w:pPr>
+      <w:r>
+        <w:rPr>
+          <w:rFonts w:ascii="Arial" w:hAnsi="Arial"/>
+          <w:b w:val="0"/>
+          <w:i w:val="0"/>
+          <w:sz w:val="19"/>
+        </w:rPr>
+        <w:t xml:space="preserve">Auf der physisch-robotischen Ebene derselben Frontier-Capex-Achse verdichtete der </w:t>
+      </w:r>
+      <w:r>
+        <w:rPr>
+          <w:rFonts w:ascii="Arial" w:hAnsi="Arial"/>
+          <w:b w:val="0"/>
+          <w:i/>
+          <w:sz w:val="19"/>
+        </w:rPr>
+        <w:t>Tesla</w:t>
+      </w:r>
+      <w:r>
+        <w:rPr>
+          <w:rFonts w:ascii="Arial" w:hAnsi="Arial"/>
+          <w:b w:val="0"/>
+          <w:i w:val="0"/>
+          <w:sz w:val="19"/>
+        </w:rPr>
+        <w:t xml:space="preserve">-Q2-2026-Earnings-Call am 22. Juli 2026 (Ankündigungsberichterstattung: Seeking Alpha, MarketScreener, CNBC, Not-a-Tesla-App, Yahoo Finance, BigGo Finance) das bislang offene Kapitel humanoider Produktionsrobotik: Tesla hat den ursprünglichen </w:t>
+      </w:r>
+      <w:r>
+        <w:rPr>
+          <w:rFonts w:ascii="Arial" w:hAnsi="Arial"/>
+          <w:b w:val="0"/>
+          <w:i/>
+          <w:sz w:val="19"/>
+        </w:rPr>
+        <w:t>Model-S</w:t>
+      </w:r>
+      <w:r>
+        <w:rPr>
+          <w:rFonts w:ascii="Arial" w:hAnsi="Arial"/>
+          <w:b w:val="0"/>
+          <w:i w:val="0"/>
+          <w:sz w:val="19"/>
+        </w:rPr>
+        <w:t>/</w:t>
+      </w:r>
+      <w:r>
+        <w:rPr>
+          <w:rFonts w:ascii="Arial" w:hAnsi="Arial"/>
+          <w:b w:val="0"/>
+          <w:i/>
+          <w:sz w:val="19"/>
+        </w:rPr>
+        <w:t>Model-X</w:t>
+      </w:r>
+      <w:r>
+        <w:rPr>
+          <w:rFonts w:ascii="Arial" w:hAnsi="Arial"/>
+          <w:b w:val="0"/>
+          <w:i w:val="0"/>
+          <w:sz w:val="19"/>
+        </w:rPr>
+        <w:t xml:space="preserve">-Montagelinien-Abbau in Fremont innerhalb von rund 46 Tagen abgeschlossen und danach die </w:t>
+      </w:r>
+      <w:r>
+        <w:rPr>
+          <w:rFonts w:ascii="Arial" w:hAnsi="Arial"/>
+          <w:b w:val="0"/>
+          <w:i/>
+          <w:sz w:val="19"/>
+        </w:rPr>
+        <w:t>Optimus-Gen-3</w:t>
+      </w:r>
+      <w:r>
+        <w:rPr>
+          <w:rFonts w:ascii="Arial" w:hAnsi="Arial"/>
+          <w:b w:val="0"/>
+          <w:i w:val="0"/>
+          <w:sz w:val="19"/>
+        </w:rPr>
+        <w:t xml:space="preserve">-Erstproduktionslinien installiert; die eigentliche Produktion soll nach den Konzernangaben zeitnah — bei Musk konjunktivisch: „start production soon" — anlaufen. Die Erstlinie sei nach Konzernangaben langfristig auf eine Jahres­kapazität von bis zu einer Million Roboter ausgelegt, die tatsächliche Anlaufphase werde jedoch nach Musks eigener Diagnose „quite flat and long" ausfallen — begründet mit rund 10.000 unikalen Bauteilen ohne bestehende Zulieferkette und der Selbst­einordnung als „hardest product to scale manufacturing that we've ever made at Tesla, because everything on the robot is new". Erste Roboter würden ausdrücklich zur Trainings­datensammlung und Funktions­weiter­entwicklung eingesetzt, nicht an Kunden ausgeliefert; parallel verhandelt Tesla mit Samsung und TSMC über die AI-Compute-Zulieferung für Optimus und </w:t>
+      </w:r>
+      <w:r>
+        <w:rPr>
+          <w:rFonts w:ascii="Arial" w:hAnsi="Arial"/>
+          <w:b w:val="0"/>
+          <w:i/>
+          <w:sz w:val="19"/>
+        </w:rPr>
+        <w:t>Robotaxi</w:t>
+      </w:r>
+      <w:r>
+        <w:rPr>
+          <w:rFonts w:ascii="Arial" w:hAnsi="Arial"/>
+          <w:b w:val="0"/>
+          <w:i w:val="0"/>
+          <w:sz w:val="19"/>
+        </w:rPr>
+        <w:t xml:space="preserve">, und Musk kündigte den Standort­auswahl-Abschluss für einen als „Terafab" bezeichneten Optimus-/AI-Fertigungs-Großstandort in absehbarer Zeit an. Ökonomisch flankiert wird der Vorgang durch eine bestätigte Full-Year-Capex-Guidance von über 25 Milliarden US-Dollar für 2026 (in Verbindung mit einer neu gesicherten 30-Milliarden-US-Dollar-Fremdfinanzierungslinie), einen im zweiten Quartal auf −1,1 Milliarden US-Dollar gedrehten Free Cashflow sowie eine parallele Robotaxi-Ausweitung auf sieben US-Metropolregionen mit rund 380.000 unbeaufsichtigten Meilen ohne meldepflichtige Vorfälle bei rund 1,5 Millionen FSD-Abonnenten. Für die Rohstoff-Analogie ist der Vorgang insofern instruktiv, als er die in § 8.2 bereits dokumentierte Compute- und Silicon-Design-Konzentration um eine im Aufbau befindliche </w:t>
+      </w:r>
+      <w:r>
+        <w:rPr>
+          <w:rFonts w:ascii="Arial" w:hAnsi="Arial"/>
+          <w:b w:val="0"/>
+          <w:i/>
+          <w:sz w:val="19"/>
+        </w:rPr>
+        <w:t>physisch-robotische</w:t>
+      </w:r>
+      <w:r>
+        <w:rPr>
+          <w:rFonts w:ascii="Arial" w:hAnsi="Arial"/>
+          <w:b w:val="0"/>
+          <w:i w:val="0"/>
+          <w:sz w:val="19"/>
+        </w:rPr>
+        <w:t xml:space="preserve"> Wertschöpfungs­schicht ergänzt: Wenn die im Konzernstatement genannte Kapazitätsprojektion (Ein-Millionen-Jahres-Line-Kapazität) und der Gen-3-Fremont-24/7-Zellendauereinsatz mittelfristig realisiert werden, entsteht am oberen Ende der KI-Wertschöpfungskette eine weitere geographisch stark konzentrierte Kapital­schicht (Fremont, avisierte Terafab) mit derselben Design-Partner-Konzentration (Samsung, TSMC, Broadcom) wie im Custom-Silicon-Segment — und für die Deutschland-These (§ 8.3) folgt daraus, dass die inländisch verfügbaren Anknüpfungspunkte für eine Teilhabe­abgabe im Physisch-KI-Segment schneller enger werden als in der klassischen Industrierobotik (Fanuc, KUKA, ABB), weil die Wertschöpfung im humanoiden Segment vom Zeitpunkt der Serienfertigung an mit der ausländischen Basismodell- und Chip-Produktion gekoppelt bleibt.</w:t>
       </w:r>
     </w:p>
     <w:p>
@@ -13919,6 +14167,38 @@
     </w:p>
     <w:p>
       <w:pPr>
+        <w:jc w:val="both"/>
+      </w:pPr>
+      <w:r>
+        <w:rPr>
+          <w:rFonts w:ascii="Arial" w:hAnsi="Arial"/>
+          <w:b w:val="0"/>
+          <w:i w:val="0"/>
+          <w:sz w:val="19"/>
+        </w:rPr>
+        <w:t xml:space="preserve">Soto, P. E., Thieu, M., &amp; Allen, J. S. (17. Juli 2026). </w:t>
+      </w:r>
+      <w:r>
+        <w:rPr>
+          <w:rFonts w:ascii="Arial" w:hAnsi="Arial"/>
+          <w:b w:val="0"/>
+          <w:i/>
+          <w:sz w:val="19"/>
+        </w:rPr>
+        <w:t>The AI Buildout and the Economy: Publicly Available Data to Assess AI's Impact.</w:t>
+      </w:r>
+      <w:r>
+        <w:rPr>
+          <w:rFonts w:ascii="Arial" w:hAnsi="Arial"/>
+          <w:b w:val="0"/>
+          <w:i w:val="0"/>
+          <w:sz w:val="19"/>
+        </w:rPr>
+        <w:t xml:space="preserve"> FEDS Note, Board of Governors of the Federal Reserve System. Aggregatanalyse der US-KI-Investitions-, Produktivitäts- und Arbeitsmarktdaten: Einordnung der aktuellen Phase als „Buildout-Phase" bei anhaltend hohem Hyperscaler-Capex, mit „konzentrierten" Arbeitsmarkteffekten, die „sich im Aggregat noch nicht verbreitert" hätten; konsistente Produktivitätstrends zwischen Sektoren hoher (Information, Finanzen, professionelle Dienstleistungen), mittlerer (Verarbeitendes Gewerbe, Handel) und niedriger KI-Exposition; KI-Effekt bei jüngeren Beschäftigten (20 – 24 Jahre) „primär in verlangsamter Einstellungsdynamik statt in unmittelbaren Entlassungen" (Referenz: Lichtinger &amp; Hosseini Maasoum 2025), kein vergleichbares Signal für Erwerbspersonen im Haupterwerbsalter (25 – 54 Jahre); höchste sektorale Exposition in NAICS 51 (Information) und NAICS 54 (Professional/Technical Services). Aufnahme in § 1.1 mit Rückwirkung auf § 8.3 und § 9.1. https://www.federalreserve.gov/econres/notes/feds-notes/the-ai-buildout-and-the-economy-publicly-available-data-to-assess-ais-impact-20260717.html</w:t>
+      </w:r>
+    </w:p>
+    <w:p>
+      <w:pPr>
         <w:spacing w:before="120" w:after="80"/>
       </w:pPr>
       <w:r>
@@ -14203,7 +14483,7 @@
           <w:i w:val="0"/>
           <w:sz w:val="19"/>
         </w:rPr>
-        <w:t xml:space="preserve"> Aktualisierter Trackerstand: 322 Layoff-Ereignisse mit 205.832 betroffenen Beschäftigten (rund 1.014 Stellen pro Tag); 173 KI-attribuierte Einzelereignisse mit rund 170.945 betroffenen Beschäftigten (etwa 54 % der Ereignisse und rund 83 % der Betroffenen). Fortschreibung des 19.-Juli-2026-Stands (302/201.754/164/168.770) um +20 Ereignisse (+6,6 %), +4.078 Betroffene (+2,0 %), +9 KI-attribuierte Ereignisse (+5,5 %) und +2.175 KI-attribuierte Betroffene (+1,3 %); die Aggregat-KI-Kausalquote bleibt stabil bei 54 %. Aufnahme in § 1.1 als Aggregat-Beleg der weiterhin gleichmäßigen Tech-Restrukturierung und Präzisierung der KI-Kausalquote (§ 9.1). https://skillsyncer.com/layoffs-tracker</w:t>
+        <w:t xml:space="preserve"> Aktualisierter Trackerstand: 322 Layoff-Ereignisse mit 205.832 betroffenen Beschäftigten (rund 1.014 Stellen pro Tag); 173 KI-attribuierte Einzelereignisse mit rund 170.945 betroffenen Beschäftigten (etwa 54 % der Ereignisse und rund 83 % der Betroffenen). Fortschreibung des 19.-Juli-2026-Stands (302/201.754/164/168.770) um +20 Ereignisse (+6,6 %), +4.078 Betroffene (+2,0 %), +9 KI-attribuierte Ereignisse (+5,5 %) und +2.175 KI-attribuierte Betroffene (+1,3 %); die Aggregat-KI-Kausalquote bleibt stabil bei 54 %. Aufnahme in § 1.1 als Aggregat-Beleg der weiterhin gleichmäßigen Tech-Restrukturierung und Präzisierung der KI-Kausalquote (§ 9.1). Der Trackerstand vom 23. Juli 2026 ist unverändert gegenüber dem 22.-Juli-Stand (322/205.832/173/170.945); die Aggregat-KI-Kausalquote bleibt bei 54 %. https://skillsyncer.com/layoffs-tracker</w:t>
       </w:r>
     </w:p>
     <w:p>
@@ -14217,6 +14497,210 @@
           <w:i w:val="0"/>
           <w:sz w:val="19"/>
         </w:rPr>
+        <w:t xml:space="preserve">GeekWire / KUOW / Fox Business / Fox13 Seattle / Business Insider / Outlook Business / OpenTools / People Matters / NewsX. (22. Juli 2026). </w:t>
+      </w:r>
+      <w:r>
+        <w:rPr>
+          <w:rFonts w:ascii="Arial" w:hAnsi="Arial"/>
+          <w:b w:val="0"/>
+          <w:i/>
+          <w:sz w:val="19"/>
+        </w:rPr>
+        <w:t>Meta cuts nearly 1,400 jobs in Washington state, 20% of local workforce, in sweeping AI revamp / Meta layoffs affect nearly 1,400 Washington state workers / Meta lays off nearly 1,400 Washington employees in latest tech workforce cut.</w:t>
+      </w:r>
+      <w:r>
+        <w:rPr>
+          <w:rFonts w:ascii="Arial" w:hAnsi="Arial"/>
+          <w:b w:val="0"/>
+          <w:i w:val="0"/>
+          <w:sz w:val="19"/>
+        </w:rPr>
+        <w:t xml:space="preserve"> Berichterstattung zur zum 22. Juli 2026 wirksam werdenden Meta-Entlassungswelle im US-Bundesstaat Washington: 1.395 Beschäftigte (699 in Bellevue, 259 in Seattle über zwei Büros, 206 in Redmond, 231 Remote), Ankündigungsmail an die Belegschaft 20. Mai 2026, Abfindungspaket 16 Wochen Grundvergütung plus zwei Wochen pro Dienstjahr; Teil der konzernweiten 8.000-Stellen-AI-Restrukturierung bei einer globalen März-2026-Belegschaft von knapp 78.000. Aufnahme in § 1.1 als Cluster-F-Beleg der weiterlaufenden AI-Restrukturierungswelle mit expliziter Umschichtung „hin zu geschäftskritischen Prioritäten". https://www.geekwire.com/2026/meta-cuts-nearly-1400-jobs-in-washington-state-20-of-local-workforce-in-sweeping-ai-revamp/ | https://www.kuow.org/stories/meta-layoffs-affect-nearly-1-400-washington-state-workers | https://www.foxbusiness.com/technology/meta-lays-off-nearly-1400-washington-employees-latest-tech-workforce-cut</w:t>
+      </w:r>
+    </w:p>
+    <w:p>
+      <w:pPr>
+        <w:jc w:val="both"/>
+      </w:pPr>
+      <w:r>
+        <w:rPr>
+          <w:rFonts w:ascii="Arial" w:hAnsi="Arial"/>
+          <w:b w:val="0"/>
+          <w:i w:val="0"/>
+          <w:sz w:val="19"/>
+        </w:rPr>
+        <w:t xml:space="preserve">CNBC / Yahoo Finance / American Bazaar / GeekWire / Startup Fortune / Quartz / Insider Finance. (22. Juli 2026). </w:t>
+      </w:r>
+      <w:r>
+        <w:rPr>
+          <w:rFonts w:ascii="Arial" w:hAnsi="Arial"/>
+          <w:b w:val="0"/>
+          <w:i/>
+          <w:sz w:val="19"/>
+        </w:rPr>
+        <w:t>Amazon lays off some employees in its AGI unit / Amazon fires its AGI researchers and bets a billion dollars on deployment instead / Amazon cuts jobs in AGI group as it puts more focus on customer-facing AI.</w:t>
+      </w:r>
+      <w:r>
+        <w:rPr>
+          <w:rFonts w:ascii="Arial" w:hAnsi="Arial"/>
+          <w:b w:val="0"/>
+          <w:i w:val="0"/>
+          <w:sz w:val="19"/>
+        </w:rPr>
+        <w:t xml:space="preserve"> Berichterstattung zur ohne Personenanzahl kommunizierten Entlassungswelle in der </w:t>
+      </w:r>
+      <w:r>
+        <w:rPr>
+          <w:rFonts w:ascii="Arial" w:hAnsi="Arial"/>
+          <w:b w:val="0"/>
+          <w:i/>
+          <w:sz w:val="19"/>
+        </w:rPr>
+        <w:t>Amazon-Artificial-General-Intelligence</w:t>
+      </w:r>
+      <w:r>
+        <w:rPr>
+          <w:rFonts w:ascii="Arial" w:hAnsi="Arial"/>
+          <w:b w:val="0"/>
+          <w:i w:val="0"/>
+          <w:sz w:val="19"/>
+        </w:rPr>
+        <w:t xml:space="preserve">-Organisation (verantwortlich für die </w:t>
+      </w:r>
+      <w:r>
+        <w:rPr>
+          <w:rFonts w:ascii="Arial" w:hAnsi="Arial"/>
+          <w:b w:val="0"/>
+          <w:i/>
+          <w:sz w:val="19"/>
+        </w:rPr>
+        <w:t>Nova</w:t>
+      </w:r>
+      <w:r>
+        <w:rPr>
+          <w:rFonts w:ascii="Arial" w:hAnsi="Arial"/>
+          <w:b w:val="0"/>
+          <w:i w:val="0"/>
+          <w:sz w:val="19"/>
+        </w:rPr>
+        <w:t xml:space="preserve">-Foundation-Modelle einschließlich </w:t>
+      </w:r>
+      <w:r>
+        <w:rPr>
+          <w:rFonts w:ascii="Arial" w:hAnsi="Arial"/>
+          <w:b w:val="0"/>
+          <w:i/>
+          <w:sz w:val="19"/>
+        </w:rPr>
+        <w:t>Amazon Nova Act</w:t>
+      </w:r>
+      <w:r>
+        <w:rPr>
+          <w:rFonts w:ascii="Arial" w:hAnsi="Arial"/>
+          <w:b w:val="0"/>
+          <w:i w:val="0"/>
+          <w:sz w:val="19"/>
+        </w:rPr>
+        <w:t xml:space="preserve"> sowie für Silizium- und Quantencomputing-Programme): Betroffen sind die Teams der Vice Presidents Adeeb Shanaa (AGI Data Services) und Vishal Sharma (AGI Information), 90 Tage Gehalts- und Leistungsfortzahlung, Outplacement-Zugang und Übergangs­kranken­versicherung; Konzernstatement zur strategischen Neuausrichtung „hin zu kundenzentrierter KI" mit paralleler Milliarden-US-Dollar-Initiative zur Einbettung von AWS-Ingenieurinnen und -Ingenieuren in Enterprise-Kundenprojekte für agentische KI-Systeme. Aufnahme in § 1.1 als Cluster-F-Beleg des Deployment-vor-Grundlagenforschung-Umschwungs auf der Hyperscaler-Ebene. https://www.cnbc.com/2026/07/22/amazon-lays-off-some-employees-in-its-agi-unit.html | https://americanbazaaronline.com/2026/07/22/amazon-layoffs-artificial-general-intelligence-agi-unit-485056/ | https://www.geekwire.com/2026/amazon-cuts-jobs-in-agi-group-as-it-puts-more-focus-on-customer-facing-ai/ | https://startupfortune.com/amazon-fires-its-agi-researchers-and-bets-a-billion-dollars-on-deployment-instead/</w:t>
+      </w:r>
+    </w:p>
+    <w:p>
+      <w:pPr>
+        <w:jc w:val="both"/>
+      </w:pPr>
+      <w:r>
+        <w:rPr>
+          <w:rFonts w:ascii="Arial" w:hAnsi="Arial"/>
+          <w:b w:val="0"/>
+          <w:i w:val="0"/>
+          <w:sz w:val="19"/>
+        </w:rPr>
+        <w:t xml:space="preserve">Seeking Alpha / MarketScreener / CNBC / Not-a-Tesla-App / Yahoo Finance / BigGo Finance / Alphastreet / Moomoo / Basenor / Cryptobriefing / Teslarati / NexusVolt. (22. Juli 2026). </w:t>
+      </w:r>
+      <w:r>
+        <w:rPr>
+          <w:rFonts w:ascii="Arial" w:hAnsi="Arial"/>
+          <w:b w:val="0"/>
+          <w:i/>
+          <w:sz w:val="19"/>
+        </w:rPr>
+        <w:t>Tesla, Inc. (TSLA) Q2 2026 Earnings Call Transcript / Summary of Tesla's 2026 Q2 Earnings Call: Cybercab, FSD, AI4+ and More / Record Q2 Deliveries, 55 % FSD Attach Rate Drive Demand; $25B+ CapEx Cycle Begins / Tesla Optimus Production: Fremont Assembly Confirmed for Late July 2026.</w:t>
+      </w:r>
+      <w:r>
+        <w:rPr>
+          <w:rFonts w:ascii="Arial" w:hAnsi="Arial"/>
+          <w:b w:val="0"/>
+          <w:i w:val="0"/>
+          <w:sz w:val="19"/>
+        </w:rPr>
+        <w:t xml:space="preserve"> Berichterstattung zum Tesla-Q2-2026-Earnings-Call am 22. Juli 2026: Full-Year-Capex-Guidance über 25 Milliarden US-Dollar bei neuer 30-Milliarden-US-Dollar-Fremdfinanzierungslinie; Fremont-Model-S-/-X-Linien-Abbau innerhalb rund 46 Tagen mit unmittelbarer </w:t>
+      </w:r>
+      <w:r>
+        <w:rPr>
+          <w:rFonts w:ascii="Arial" w:hAnsi="Arial"/>
+          <w:b w:val="0"/>
+          <w:i/>
+          <w:sz w:val="19"/>
+        </w:rPr>
+        <w:t>Optimus-Gen-3</w:t>
+      </w:r>
+      <w:r>
+        <w:rPr>
+          <w:rFonts w:ascii="Arial" w:hAnsi="Arial"/>
+          <w:b w:val="0"/>
+          <w:i w:val="0"/>
+          <w:sz w:val="19"/>
+        </w:rPr>
+        <w:t xml:space="preserve">-Erstlinien-Installation (Long-Term-Auslegung bis eine Million Roboter pro Jahr, Anlauf laut Musk „quite flat and long"); Musk: „hardest product to scale manufacturing that we've ever made at Tesla"; rund 10.000 unikale Bauteile ohne bestehende Zulieferkette; erste Roboter zur Trainingsdatensammlung, nicht an Kunden; AI-Compute-Partnerschaften mit </w:t>
+      </w:r>
+      <w:r>
+        <w:rPr>
+          <w:rFonts w:ascii="Arial" w:hAnsi="Arial"/>
+          <w:b w:val="0"/>
+          <w:i/>
+          <w:sz w:val="19"/>
+        </w:rPr>
+        <w:t>Samsung Foundry</w:t>
+      </w:r>
+      <w:r>
+        <w:rPr>
+          <w:rFonts w:ascii="Arial" w:hAnsi="Arial"/>
+          <w:b w:val="0"/>
+          <w:i w:val="0"/>
+          <w:sz w:val="19"/>
+        </w:rPr>
+        <w:t xml:space="preserve"> und </w:t>
+      </w:r>
+      <w:r>
+        <w:rPr>
+          <w:rFonts w:ascii="Arial" w:hAnsi="Arial"/>
+          <w:b w:val="0"/>
+          <w:i/>
+          <w:sz w:val="19"/>
+        </w:rPr>
+        <w:t>TSMC</w:t>
+      </w:r>
+      <w:r>
+        <w:rPr>
+          <w:rFonts w:ascii="Arial" w:hAnsi="Arial"/>
+          <w:b w:val="0"/>
+          <w:i w:val="0"/>
+          <w:sz w:val="19"/>
+        </w:rPr>
+        <w:t>; Ankündigung einer „Terafab" als Optimus-/AI-Fertigungs-Großstandort; FCF Q2 −1,1 Milliarden US-Dollar; Robotaxi-Ausweitung auf sieben US-Metropolregionen (Austin, Miami, Orlando, Tampa u. a.) mit rund 380.000 unbeaufsichtigten Meilen ohne meldepflichtige Vorfälle; rund 1,5 Millionen FSD-Abonnenten und 55 % FSD-Attach-Rate in Nordamerika. Aufnahme in § 8.2 mit Rückwirkung auf § 8.3. https://seekingalpha.com/article/4924452-tesla-inc-tsla-q2-2026-earnings-call-transcript | https://www.notateslaapp.com/news/4481/summary-of-teslas-2026-q2-earnings-call-cybercab-fsd-ai4-and-more | https://www.cnbc.com/2026/07/22/tesla-tsla-q2-2026-earnings-report.html | https://finance.biggo.com/news/US_TSLA_2026-07-22 | https://cryptobriefing.com/tesla-optimus-production-line-fremont/ | https://nexusvolt.com/post/tesla-optimus-production-fremont-assembly-confirmed-for-late-july-2026</w:t>
+      </w:r>
+    </w:p>
+    <w:p>
+      <w:pPr>
+        <w:jc w:val="both"/>
+      </w:pPr>
+      <w:r>
+        <w:rPr>
+          <w:rFonts w:ascii="Arial" w:hAnsi="Arial"/>
+          <w:b w:val="0"/>
+          <w:i w:val="0"/>
+          <w:sz w:val="19"/>
+        </w:rPr>
         <w:t>BornCity. (April 2026). OpenAI fordert Robotersteuer und 32-Stunden-Woche.</w:t>
       </w:r>
     </w:p>
@@ -19980,7 +20464,79 @@
           <w:i w:val="0"/>
           <w:sz w:val="19"/>
         </w:rPr>
-        <w:t>-Layoff-Trackers zum 22. Juli 2026 (322 Layoff-Ereignisse, 205.832 betroffene Beschäftigte, 173 KI-attribuierte Ereignisse mit rund 170.945 KI-attribuierten Personen; +20 Ereignisse und +4.078 Personen gegenüber dem 19. Juli 2026; die Aggregat-KI-Kausalquote bleibt stabil bei 54 %) — Aufnahme in § 1.1 als Aggregat-Beleg der weiterhin gleichmäßigen Tech-Restrukturierung und Präzisierung der KI-Kausalquote (§ 9.1). Eine regelmäßige Aktualisierung ist vorgesehen.</w:t>
+        <w:t xml:space="preserve">-Layoff-Trackers zum 22. Juli 2026 (322 Layoff-Ereignisse, 205.832 betroffene Beschäftigte, 173 KI-attribuierte Ereignisse mit rund 170.945 KI-attribuierten Personen; +20 Ereignisse und +4.078 Personen gegenüber dem 19. Juli 2026; die Aggregat-KI-Kausalquote bleibt stabil bei 54 %) — Aufnahme in § 1.1 als Aggregat-Beleg der weiterhin gleichmäßigen Tech-Restrukturierung und Präzisierung der KI-Kausalquote (§ 9.1). Mit Schnitt am 23. Juli 2026 (Lauf 001 vom 23. Juli 2026) tritt Version 43.0 hinzu und ergänzt drei belegbare Fortschreibungen aus dem 7-Tage-Fenster bzw. 48-Stunden-Fenster für Cluster F und J: die am 17. Juli 2026 vom Board of Governors of the Federal Reserve System veröffentlichte FEDS Note </w:t>
+      </w:r>
+      <w:r>
+        <w:rPr>
+          <w:rFonts w:ascii="Arial" w:hAnsi="Arial"/>
+          <w:b w:val="0"/>
+          <w:i/>
+          <w:sz w:val="19"/>
+        </w:rPr>
+        <w:t>„The AI Buildout and the Economy: Publicly Available Data to Assess AI's Impact"</w:t>
+      </w:r>
+      <w:r>
+        <w:rPr>
+          <w:rFonts w:ascii="Arial" w:hAnsi="Arial"/>
+          <w:b w:val="0"/>
+          <w:i w:val="0"/>
+          <w:sz w:val="19"/>
+        </w:rPr>
+        <w:t xml:space="preserve"> von Paul E. Soto, Mason Thieu und Jeffrey S. Allen mit der Einordnung der aktuellen Phase als „Buildout-Phase" (konzentrierte, im Aggregat nicht verbreiterte Arbeitsmarkteffekte; konsistente Produktivitätstrends zwischen Sektoren hoher/mittlerer/niedriger KI-Exposition; KI-Effekt bei jüngeren Beschäftigten „primär in verlangsamter Einstellungsdynamik statt in unmittelbaren Entlassungen"; höchste sektorale Exposition in NAICS 51 und 54) — Aufnahme in § 1.1 mit Rückwirkung auf § 8.3 und § 9.1; die zum 22. Juli 2026 in Kraft tretende Meta-Entlassungswelle im US-Bundesstaat Washington mit 1.395 Beschäftigten (Bellevue 699, Seattle 259 aus zwei Büros, Redmond 206, Remote 231) als Teil der konzernweiten 8.000-Stellen-AI-Restrukturierung bei einer globalen März-2026-Belegschaft von knapp 78.000 sowie die parallel am 22. Juli 2026 kommunizierten Amazon-Streichungen in der </w:t>
+      </w:r>
+      <w:r>
+        <w:rPr>
+          <w:rFonts w:ascii="Arial" w:hAnsi="Arial"/>
+          <w:b w:val="0"/>
+          <w:i/>
+          <w:sz w:val="19"/>
+        </w:rPr>
+        <w:t>Artificial-General-Intelligence</w:t>
+      </w:r>
+      <w:r>
+        <w:rPr>
+          <w:rFonts w:ascii="Arial" w:hAnsi="Arial"/>
+          <w:b w:val="0"/>
+          <w:i w:val="0"/>
+          <w:sz w:val="19"/>
+        </w:rPr>
+        <w:t xml:space="preserve">-Organisation (Nova-Foundation-Modelle, Silizium- und Quantencomputing-Programme; Teams der Vice Presidents Adeeb Shanaa und Vishal Sharma; strategische Verschiebung „hin zu kundenzentrierter KI") — Aufnahme in § 1.1 als Cluster-F-Beleg des Deployment-vor-Grundlagenforschung-Umschwungs; sowie den </w:t>
+      </w:r>
+      <w:r>
+        <w:rPr>
+          <w:rFonts w:ascii="Arial" w:hAnsi="Arial"/>
+          <w:b w:val="0"/>
+          <w:i/>
+          <w:sz w:val="19"/>
+        </w:rPr>
+        <w:t>Tesla</w:t>
+      </w:r>
+      <w:r>
+        <w:rPr>
+          <w:rFonts w:ascii="Arial" w:hAnsi="Arial"/>
+          <w:b w:val="0"/>
+          <w:i w:val="0"/>
+          <w:sz w:val="19"/>
+        </w:rPr>
+        <w:t xml:space="preserve">-Q2-2026-Earnings-Call am 22. Juli 2026 mit Full-Year-Capex-Guidance über 25 Milliarden US-Dollar bei neuer 30-Milliarden-US-Dollar-Fremdfinanzierungslinie, dem 46-Tage-Abbau der Model-S-/-X-Linien in Fremont, der Installation der </w:t>
+      </w:r>
+      <w:r>
+        <w:rPr>
+          <w:rFonts w:ascii="Arial" w:hAnsi="Arial"/>
+          <w:b w:val="0"/>
+          <w:i/>
+          <w:sz w:val="19"/>
+        </w:rPr>
+        <w:t>Optimus-Gen-3</w:t>
+      </w:r>
+      <w:r>
+        <w:rPr>
+          <w:rFonts w:ascii="Arial" w:hAnsi="Arial"/>
+          <w:b w:val="0"/>
+          <w:i w:val="0"/>
+          <w:sz w:val="19"/>
+        </w:rPr>
+        <w:t>-Erstlinien (Long-Term-Auslegung bis eine Million Roboter pro Jahr, Anlauf „quite flat and long"), rund 10.000 unikalen Bauteilen ohne bestehende Zulieferkette, Musks Selbst­einordnung als „hardest product to scale manufacturing that we've ever made at Tesla", AI-Compute-Partnerschaften mit Samsung Foundry und TSMC, der „Terafab"-Ankündigung, dem Free Cashflow Q2 von −1,1 Milliarden US-Dollar und der Robotaxi-Ausweitung auf sieben US-Metropolregionen mit rund 380.000 unbeaufsichtigten Meilen — Aufnahme in § 8.2 mit Rückwirkung auf § 8.3 als physisch-robotische Ergänzung der Compute- und Silicon-Design-Konzentration. Eine regelmäßige Aktualisierung ist vorgesehen.</w:t>
       </w:r>
     </w:p>
     <w:p>
@@ -20060,7 +20616,7 @@
         <w:color w:val="999999"/>
         <w:sz w:val="15"/>
       </w:rPr>
-      <w:t>Version 42.0 — Mai 2026 — CC BY 4.0</w:t>
+      <w:t>Version 43.0 — Mai 2026 — CC BY 4.0</w:t>
       <w:tab/>
       <w:t xml:space="preserve">Seite </w:t>
     </w:r>

</xml_diff>

<commit_message>
Daily-Update 2026-07-27 — Version 47.0 (Cluster: F, I)
- § 1.1: monday.com Ltd. (NASDAQ: MNDY) AI-First-Restrukturierung vom
  22. Juli 2026 (620 Streichungen / 20 % der globalen Belegschaft, davon
  rund 350 in Tel Aviv; 45–55 Mio. USD Restrukturierungsaufwand;
  Non-GAAP-Operating-Margin-Guidance 2026 auf 15 %) mit wörtlicher
  Konzernselbstpositionierung „not a cost-cutting initiative or a direct
  replacement" und Rückverweisen auf § 9.1 und § 4.4.
- § 8.2: Anthropic Claude Opus 5-Freigabe vom 24. Juli 2026 (5 USD Input
  / 25 USD Output pro Mio. Token, halbes Preisniveau gegenüber Fable 5)
  als weiterer Datenpunkt der deflationären Inferenzpreis-Dynamik mit
  Rückwirkung auf die Veredelungsstrategie (§ 8.3).
- § 11.5: zwei neue Einträge (monday.com, Claude Opus 5).
- Aktualitätshinweis, Dokumentkopf und README auf Version 47.0 angehoben.
- Validierung-Ergebnisse.md + Änderungshistorie.md um Lauf-001-vom-
  27.-Juli-2026-Block ergänzt.
- PDF und DOCX neu erstellt.
</commit_message>
<xml_diff>
--- a/KI-Ökonomie.docx
+++ b/KI-Ökonomie.docx
@@ -112,7 +112,7 @@
           <w:color w:val="666666"/>
           <w:sz w:val="18"/>
         </w:rPr>
-        <w:t>Version 46.0</w:t>
+        <w:t>Version 47.0</w:t>
       </w:r>
     </w:p>
     <w:p>
@@ -1408,7 +1408,115 @@
           <w:i w:val="0"/>
           <w:sz w:val="19"/>
         </w:rPr>
-        <w:t xml:space="preserve"> als laufendem Beobachtungsformat.</w:t>
+        <w:t xml:space="preserve"> als laufendem Beobachtungsformat. Am 22. Juli 2026 verdichtet eine weitere Layoff-Ankündigung aus dem israelischen Enterprise-SaaS-Segment die in § 3.5 und § 9.1 referierte Kausalattributions­grenze konzernintern: Nach Berichterstattung von TechCrunch, Yahoo Finance, Haaretz, The Times of Israel, Ctech, TheNextWeb und americanbazaaronline gab der Work-Management-Anbieter </w:t>
+      </w:r>
+      <w:r>
+        <w:rPr>
+          <w:rFonts w:ascii="Arial" w:hAnsi="Arial"/>
+          <w:b w:val="0"/>
+          <w:i/>
+          <w:sz w:val="19"/>
+        </w:rPr>
+        <w:t>monday.com Ltd.</w:t>
+      </w:r>
+      <w:r>
+        <w:rPr>
+          <w:rFonts w:ascii="Arial" w:hAnsi="Arial"/>
+          <w:b w:val="0"/>
+          <w:i w:val="0"/>
+          <w:sz w:val="19"/>
+        </w:rPr>
+        <w:t xml:space="preserve"> (NASDAQ: MNDY) eine Reduktion von rund 620 Beschäftigten — 20 % der globalen Belegschaft, davon rund 350 am Tel-Aviver Hauptsitz — bekannt und verankerte sie in einem gemeinsamen Mitarbeitendenbrief der Mitgründer Roy Mann und Eran Zinman ausdrücklich als strategische AI-First-Restrukturierung, nicht als Kostenmaßnahme: wörtlich, die Streichungen „are not intended as a cost-cutting initiative or a direct replacement of employees with artificial intelligence" (Konjunktiv nach § 4.2 Claude.md), begründet mit „We entered a new era where AI is transforming the role of software, creating the greatest opportunity our industry has ever seen" und der Positionierung „moving from managing work to doing the work for our customers, with people and AI agents working together"; der Restrukturierungs­aufwand ist mit 45 bis 55 Millionen US-Dollar (Abfindungen und Büroflächenreduktion) beziffert, die </w:t>
+      </w:r>
+      <w:r>
+        <w:rPr>
+          <w:rFonts w:ascii="Arial" w:hAnsi="Arial"/>
+          <w:b w:val="0"/>
+          <w:i/>
+          <w:sz w:val="19"/>
+        </w:rPr>
+        <w:t>Non-GAAP-Operating-Margin</w:t>
+      </w:r>
+      <w:r>
+        <w:rPr>
+          <w:rFonts w:ascii="Arial" w:hAnsi="Arial"/>
+          <w:b w:val="0"/>
+          <w:i w:val="0"/>
+          <w:sz w:val="19"/>
+        </w:rPr>
+        <w:t xml:space="preserve">-Guidance für 2026 wird von 13 % auf 15 % angehoben, die Umsatz­wachstumsziele bleiben bei 19 bis 20 %. Der Fall illustriert doppelt: Er stützt die in § 3.5 dokumentierte Ausweitung der Restrukturierungs­dynamik auf konsolidierte SaaS-Geschäftsmodelle (in der Reihe </w:t>
+      </w:r>
+      <w:r>
+        <w:rPr>
+          <w:rFonts w:ascii="Arial" w:hAnsi="Arial"/>
+          <w:b w:val="0"/>
+          <w:i/>
+          <w:sz w:val="19"/>
+        </w:rPr>
+        <w:t>Sprout Social</w:t>
+      </w:r>
+      <w:r>
+        <w:rPr>
+          <w:rFonts w:ascii="Arial" w:hAnsi="Arial"/>
+          <w:b w:val="0"/>
+          <w:i w:val="0"/>
+          <w:sz w:val="19"/>
+        </w:rPr>
+        <w:t xml:space="preserve">, </w:t>
+      </w:r>
+      <w:r>
+        <w:rPr>
+          <w:rFonts w:ascii="Arial" w:hAnsi="Arial"/>
+          <w:b w:val="0"/>
+          <w:i/>
+          <w:sz w:val="19"/>
+        </w:rPr>
+        <w:t>Thomson Reuters</w:t>
+      </w:r>
+      <w:r>
+        <w:rPr>
+          <w:rFonts w:ascii="Arial" w:hAnsi="Arial"/>
+          <w:b w:val="0"/>
+          <w:i w:val="0"/>
+          <w:sz w:val="19"/>
+        </w:rPr>
+        <w:t xml:space="preserve">, </w:t>
+      </w:r>
+      <w:r>
+        <w:rPr>
+          <w:rFonts w:ascii="Arial" w:hAnsi="Arial"/>
+          <w:b w:val="0"/>
+          <w:i/>
+          <w:sz w:val="19"/>
+        </w:rPr>
+        <w:t>Cloudflare</w:t>
+      </w:r>
+      <w:r>
+        <w:rPr>
+          <w:rFonts w:ascii="Arial" w:hAnsi="Arial"/>
+          <w:b w:val="0"/>
+          <w:i w:val="0"/>
+          <w:sz w:val="19"/>
+        </w:rPr>
+        <w:t xml:space="preserve">), und er verschärft die in § 9.1 diskutierte Kausalattributions­problematik einer Typ-5-Ersatzabgabe: Die Konzern­kommunikation dementiert die direkte Substitutionskausalität ausdrücklich, hält aber zugleich den strategischen AI-Anlass ausdrücklich aufrecht — eine für WARN-AI-Disclosure-Regime (vgl. </w:t>
+      </w:r>
+      <w:r>
+        <w:rPr>
+          <w:rFonts w:ascii="Arial" w:hAnsi="Arial"/>
+          <w:b w:val="0"/>
+          <w:i/>
+          <w:sz w:val="19"/>
+        </w:rPr>
+        <w:t>SB 5</w:t>
+      </w:r>
+      <w:r>
+        <w:rPr>
+          <w:rFonts w:ascii="Arial" w:hAnsi="Arial"/>
+          <w:b w:val="0"/>
+          <w:i w:val="0"/>
+          <w:sz w:val="19"/>
+        </w:rPr>
+        <w:t xml:space="preserve"> Connecticut, § 4.4) definitorisch schwer greifbare Selbstpositionierung.</w:t>
       </w:r>
     </w:p>
     <w:p>
@@ -9798,7 +9906,97 @@
           <w:i w:val="0"/>
           <w:sz w:val="19"/>
         </w:rPr>
-        <w:t xml:space="preserve"> (&gt;25 Milliarden US-Dollar Full-Year, § 8.2) im 48-Stunden-Fenster den in § 8.2 dokumentierten Konzentrations- und Ausweitungstrend auf einer weiteren Stichtags­ebene fort, ohne die Deutschland-Position im nachgelagerten Verarbeiter-Segment (§ 8.2, unten) zu verändern.</w:t>
+        <w:t xml:space="preserve"> (&gt;25 Milliarden US-Dollar Full-Year, § 8.2) im 48-Stunden-Fenster den in § 8.2 dokumentierten Konzentrations- und Ausweitungstrend auf einer weiteren Stichtags­ebene fort, ohne die Deutschland-Position im nachgelagerten Verarbeiter-Segment (§ 8.2, unten) zu verändern. Fortlaufend zu diesem Datenpunkt hat </w:t>
+      </w:r>
+      <w:r>
+        <w:rPr>
+          <w:rFonts w:ascii="Arial" w:hAnsi="Arial"/>
+          <w:b w:val="0"/>
+          <w:i/>
+          <w:sz w:val="19"/>
+        </w:rPr>
+        <w:t>Anthropic</w:t>
+      </w:r>
+      <w:r>
+        <w:rPr>
+          <w:rFonts w:ascii="Arial" w:hAnsi="Arial"/>
+          <w:b w:val="0"/>
+          <w:i w:val="0"/>
+          <w:sz w:val="19"/>
+        </w:rPr>
+        <w:t xml:space="preserve"> am 24. Juli 2026 nach Berichterstattung von Axios, Quartz, MarkTechPost, tech-ish, DigitalApplied und benchlm.ai das Foundation-Modell </w:t>
+      </w:r>
+      <w:r>
+        <w:rPr>
+          <w:rFonts w:ascii="Arial" w:hAnsi="Arial"/>
+          <w:b w:val="0"/>
+          <w:i/>
+          <w:sz w:val="19"/>
+        </w:rPr>
+        <w:t>Claude Opus 5</w:t>
+      </w:r>
+      <w:r>
+        <w:rPr>
+          <w:rFonts w:ascii="Arial" w:hAnsi="Arial"/>
+          <w:b w:val="0"/>
+          <w:i w:val="0"/>
+          <w:sz w:val="19"/>
+        </w:rPr>
+        <w:t xml:space="preserve"> veröffentlicht — mit dem für die vorliegende Steuerdebatte relevanten Preisniveau von 5 US-Dollar je Million Input-Token und 25 US-Dollar je Million Output-Token, also der Hälfte der </w:t>
+      </w:r>
+      <w:r>
+        <w:rPr>
+          <w:rFonts w:ascii="Arial" w:hAnsi="Arial"/>
+          <w:b w:val="0"/>
+          <w:i/>
+          <w:sz w:val="19"/>
+        </w:rPr>
+        <w:t>Claude Fable 5</w:t>
+      </w:r>
+      <w:r>
+        <w:rPr>
+          <w:rFonts w:ascii="Arial" w:hAnsi="Arial"/>
+          <w:b w:val="0"/>
+          <w:i w:val="0"/>
+          <w:sz w:val="19"/>
+        </w:rPr>
+        <w:t xml:space="preserve">-Preise (10/50 US-Dollar) bei nach Herstellerangaben nahe dem Fable-5-Fähigkeitsniveau liegenden Leistungswerten und identischem Preisniveau zum Vorgänger </w:t>
+      </w:r>
+      <w:r>
+        <w:rPr>
+          <w:rFonts w:ascii="Arial" w:hAnsi="Arial"/>
+          <w:b w:val="0"/>
+          <w:i/>
+          <w:sz w:val="19"/>
+        </w:rPr>
+        <w:t>Opus 4.8</w:t>
+      </w:r>
+      <w:r>
+        <w:rPr>
+          <w:rFonts w:ascii="Arial" w:hAnsi="Arial"/>
+          <w:b w:val="0"/>
+          <w:i w:val="0"/>
+          <w:sz w:val="19"/>
+        </w:rPr>
+        <w:t xml:space="preserve">. Der Release illustriert die in § 8.2 dokumentierte deflationäre Inferenzpreis-Dynamik auf der Frontier-Modell-Achse: Innerhalb einer Modellgeneration halbieren sich die Inferenzkosten pro Fähigkeitseinheit, während die Rohstoff- und Capex-Seite (Compute, Rechenzentren, Netzwerk-Ausrüstung) in ihren absoluten Ausgaben­volumina weiter beschleunigt. Für die Deutschland-These (§ 8.2) verstärkt der Preisverfall auf der Inferenzseite bei gleichzeitiger Rohstoff-Konzentration die Position des nachgelagerten Verarbeiter-Segments doppelt — er verbilligt die für die </w:t>
+      </w:r>
+      <w:r>
+        <w:rPr>
+          <w:rFonts w:ascii="Arial" w:hAnsi="Arial"/>
+          <w:b w:val="0"/>
+          <w:i/>
+          <w:sz w:val="19"/>
+        </w:rPr>
+        <w:t>Veredelungsstrategie</w:t>
+      </w:r>
+      <w:r>
+        <w:rPr>
+          <w:rFonts w:ascii="Arial" w:hAnsi="Arial"/>
+          <w:b w:val="0"/>
+          <w:i w:val="0"/>
+          <w:sz w:val="19"/>
+        </w:rPr>
+        <w:t xml:space="preserve"> nötigen Basismodelle und macht die fiskalische Anknüpfung an Ertrag der Basismodell-Anbieter zunehmend unattraktiv, weil die Renten sich im Verhältnis zwischen Compute-Vorleistung und Anwender-Wertschöpfung neu verteilen.</w:t>
       </w:r>
     </w:p>
     <w:p>
@@ -19110,6 +19308,268 @@
       <w:r>
         <w:rPr>
           <w:rFonts w:ascii="Arial" w:hAnsi="Arial"/>
+          <w:b w:val="0"/>
+          <w:i w:val="0"/>
+          <w:sz w:val="19"/>
+        </w:rPr>
+        <w:t xml:space="preserve">Anthropic / Axios / Quartz / MarkTechPost / tech-ish / DigitalApplied / benchlm.ai. (24. Juli 2026). </w:t>
+      </w:r>
+      <w:r>
+        <w:rPr>
+          <w:rFonts w:ascii="Arial" w:hAnsi="Arial"/>
+          <w:b w:val="0"/>
+          <w:i/>
+          <w:sz w:val="19"/>
+        </w:rPr>
+        <w:t>Introducing Claude Opus 5 / Anthropic releases new model, Opus 5 / Anthropic launches Claude Opus 5 at half the price of Fable 5 / Claude Opus 5 is here at half the price of Anthropic's best model / Meet the New Claude Opus 5: Frontier-Class Agentic Coding and Computer Use at Unchanged Opus Pricing / Claude Opus 5: Frontier Intelligence at Half the Price / Claude API Pricing (July 2026): All Models per 1M Tokens.</w:t>
+      </w:r>
+      <w:r>
+        <w:rPr>
+          <w:rFonts w:ascii="Arial" w:hAnsi="Arial"/>
+          <w:b w:val="0"/>
+          <w:i w:val="0"/>
+          <w:sz w:val="19"/>
+        </w:rPr>
+        <w:t xml:space="preserve"> Öffentliche Freigabe des Foundation-Modells </w:t>
+      </w:r>
+      <w:r>
+        <w:rPr>
+          <w:rFonts w:ascii="Arial" w:hAnsi="Arial"/>
+          <w:b w:val="0"/>
+          <w:i/>
+          <w:sz w:val="19"/>
+        </w:rPr>
+        <w:t>Claude Opus 5</w:t>
+      </w:r>
+      <w:r>
+        <w:rPr>
+          <w:rFonts w:ascii="Arial" w:hAnsi="Arial"/>
+          <w:b w:val="0"/>
+          <w:i w:val="0"/>
+          <w:sz w:val="19"/>
+        </w:rPr>
+        <w:t xml:space="preserve"> durch Anthropic zum 24. Juli 2026 mit 1-Millionen-Token-Kontextfenster, bis zu 128 000 Output-Token, adaptivem Denkmodus und fünfstufiger </w:t>
+      </w:r>
+      <w:r>
+        <w:rPr>
+          <w:rFonts w:ascii="Arial" w:hAnsi="Arial"/>
+          <w:b w:val="0"/>
+          <w:i/>
+          <w:sz w:val="19"/>
+        </w:rPr>
+        <w:t>effort</w:t>
+      </w:r>
+      <w:r>
+        <w:rPr>
+          <w:rFonts w:ascii="Arial" w:hAnsi="Arial"/>
+          <w:b w:val="0"/>
+          <w:i w:val="0"/>
+          <w:sz w:val="19"/>
+        </w:rPr>
+        <w:t xml:space="preserve">-Skala; laut Hersteller frontiernaher Fähigkeitsstand bei </w:t>
+      </w:r>
+      <w:r>
+        <w:rPr>
+          <w:rFonts w:ascii="Arial" w:hAnsi="Arial"/>
+          <w:b w:val="0"/>
+          <w:i/>
+          <w:sz w:val="19"/>
+        </w:rPr>
+        <w:t>Claude Fable 5</w:t>
+      </w:r>
+      <w:r>
+        <w:rPr>
+          <w:rFonts w:ascii="Arial" w:hAnsi="Arial"/>
+          <w:b w:val="0"/>
+          <w:i w:val="0"/>
+          <w:sz w:val="19"/>
+        </w:rPr>
+        <w:t xml:space="preserve"> — 3 US-Dollar Input / 25 US-Dollar Output pro Million Token — bei identischem Preisniveau zum Vorgänger </w:t>
+      </w:r>
+      <w:r>
+        <w:rPr>
+          <w:rFonts w:ascii="Arial" w:hAnsi="Arial"/>
+          <w:b w:val="0"/>
+          <w:i/>
+          <w:sz w:val="19"/>
+        </w:rPr>
+        <w:t>Opus 4.8</w:t>
+      </w:r>
+      <w:r>
+        <w:rPr>
+          <w:rFonts w:ascii="Arial" w:hAnsi="Arial"/>
+          <w:b w:val="0"/>
+          <w:i w:val="0"/>
+          <w:sz w:val="19"/>
+        </w:rPr>
+        <w:t xml:space="preserve"> und Halbierung gegenüber Fable 5 (10 US-Dollar Input / 50 US-Dollar Output). Anthropic bewirbt Opus 5 als bislang am stärksten aligniertes Modell mit den niedrigsten Raten täuschenden Verhaltens und geringster Anfälligkeit gegenüber Missbrauchsversuchen (Konjunktiv nach § 4.2 Claude.md). Aufnahme in § 8.2 als Datenpunkt der deflationären Inferenzpreis-Dynamik und deren Rückwirkung auf die </w:t>
+      </w:r>
+      <w:r>
+        <w:rPr>
+          <w:rFonts w:ascii="Arial" w:hAnsi="Arial"/>
+          <w:b w:val="0"/>
+          <w:i/>
+          <w:sz w:val="19"/>
+        </w:rPr>
+        <w:t>Veredelungsstrategie</w:t>
+      </w:r>
+      <w:r>
+        <w:rPr>
+          <w:rFonts w:ascii="Arial" w:hAnsi="Arial"/>
+          <w:b w:val="0"/>
+          <w:i w:val="0"/>
+          <w:sz w:val="19"/>
+        </w:rPr>
+        <w:t xml:space="preserve"> der Deutschland-These (§ 8.3). https://www.axios.com/2026/07/24/anthropic-releases-new-model-opus-5 | https://qz.com/anthropic-claude-opus-5-fable-5-price-072426 | https://www.marktechpost.com/2026/07/24/meet-the-new-claude-opus-5-frontier-class-agentic-coding-and-computer-use-at-unchanged-opus-pricing/ | https://tech-ish.com/2026/07/24/claude-opus-5-launch-benchmarks-price/ | https://www.digitalapplied.com/blog/claude-opus-5-launch-benchmarks-pricing-2026 | https://benchlm.ai/anthropic/api-pricing</w:t>
+      </w:r>
+    </w:p>
+    <w:p>
+      <w:pPr>
+        <w:jc w:val="both"/>
+      </w:pPr>
+      <w:r>
+        <w:rPr>
+          <w:rFonts w:ascii="Arial" w:hAnsi="Arial"/>
+          <w:b w:val="0"/>
+          <w:i w:val="0"/>
+          <w:sz w:val="19"/>
+        </w:rPr>
+        <w:t xml:space="preserve">monday.com Ltd. / TechCrunch / Yahoo Finance / Haaretz / The Times of Israel / Ctech / TheNextWeb / americanbazaaronline / machinebrief. (22. Juli 2026). </w:t>
+      </w:r>
+      <w:r>
+        <w:rPr>
+          <w:rFonts w:ascii="Arial" w:hAnsi="Arial"/>
+          <w:b w:val="0"/>
+          <w:i/>
+          <w:sz w:val="19"/>
+        </w:rPr>
+        <w:t>Monday.com lays off hundreds to focus on AI / Monday.com cuts hundreds of jobs as it restructures around AI strategy / Israeli tech firm monday.com to lay off fifth of workers / Monday.com is cutting 20 percent of its workforce as it pivots to an AI work platform / Monday.com cuts 20% of workforce as it restructures for the AI era / Monday.com cutting hundreds of jobs as it embraces AI / Monday.com cuts 20% of workforce to restructure for AI era / Monday.com Cuts 620 Jobs in AI Restructuring.</w:t>
+      </w:r>
+      <w:r>
+        <w:rPr>
+          <w:rFonts w:ascii="Arial" w:hAnsi="Arial"/>
+          <w:b w:val="0"/>
+          <w:i w:val="0"/>
+          <w:sz w:val="19"/>
+        </w:rPr>
+        <w:t xml:space="preserve"> Konzernweite Ankündigung des israelischen Work-Management-Anbieters </w:t>
+      </w:r>
+      <w:r>
+        <w:rPr>
+          <w:rFonts w:ascii="Arial" w:hAnsi="Arial"/>
+          <w:b w:val="0"/>
+          <w:i/>
+          <w:sz w:val="19"/>
+        </w:rPr>
+        <w:t>monday.com Ltd.</w:t>
+      </w:r>
+      <w:r>
+        <w:rPr>
+          <w:rFonts w:ascii="Arial" w:hAnsi="Arial"/>
+          <w:b w:val="0"/>
+          <w:i w:val="0"/>
+          <w:sz w:val="19"/>
+        </w:rPr>
+        <w:t xml:space="preserve"> (NASDAQ: MNDY) vom 22. Juli 2026, rund 620 Beschäftigte — 20 % der globalen Belegschaft, davon rund 350 am Tel-Aviver Hauptsitz — zu entlassen; gemeinsamer Mitarbeitendenbrief der Mitgründer und Co-CEOs Roy Mann und Eran Zinman ordnet die Reduktion ausdrücklich als AI-First-Strategie und </w:t>
+      </w:r>
+      <w:r>
+        <w:rPr>
+          <w:rFonts w:ascii="Arial" w:hAnsi="Arial"/>
+          <w:b w:val="0"/>
+          <w:i/>
+          <w:sz w:val="19"/>
+        </w:rPr>
+        <w:t>nicht</w:t>
+      </w:r>
+      <w:r>
+        <w:rPr>
+          <w:rFonts w:ascii="Arial" w:hAnsi="Arial"/>
+          <w:b w:val="0"/>
+          <w:i w:val="0"/>
+          <w:sz w:val="19"/>
+        </w:rPr>
+        <w:t xml:space="preserve"> als Kostenmaßnahme oder Substitution ein (wörtlich: „the layoffs are not intended as a cost-cutting initiative or a direct replacement of employees with artificial intelligence"; „We entered a new era where AI is transforming the role of software" — Konjunktiv nach § 4.2 Claude.md); Restrukturierungsaufwand 45 bis 55 Millionen US-Dollar (Abfindungen und Büroflächenreduktion), </w:t>
+      </w:r>
+      <w:r>
+        <w:rPr>
+          <w:rFonts w:ascii="Arial" w:hAnsi="Arial"/>
+          <w:b w:val="0"/>
+          <w:i/>
+          <w:sz w:val="19"/>
+        </w:rPr>
+        <w:t>Non-GAAP-Operating-Margin</w:t>
+      </w:r>
+      <w:r>
+        <w:rPr>
+          <w:rFonts w:ascii="Arial" w:hAnsi="Arial"/>
+          <w:b w:val="0"/>
+          <w:i w:val="0"/>
+          <w:sz w:val="19"/>
+        </w:rPr>
+        <w:t xml:space="preserve">-Guidance für 2026 von 13 % auf 15 % angehoben, Umsatzwachstumsziele bei 19 bis 20 % gehalten. Aufnahme in § 1.1 als Fortschreibung der Enterprise-SaaS-Restrukturierungswelle (Reihe </w:t>
+      </w:r>
+      <w:r>
+        <w:rPr>
+          <w:rFonts w:ascii="Arial" w:hAnsi="Arial"/>
+          <w:b w:val="0"/>
+          <w:i/>
+          <w:sz w:val="19"/>
+        </w:rPr>
+        <w:t>Sprout Social</w:t>
+      </w:r>
+      <w:r>
+        <w:rPr>
+          <w:rFonts w:ascii="Arial" w:hAnsi="Arial"/>
+          <w:b w:val="0"/>
+          <w:i w:val="0"/>
+          <w:sz w:val="19"/>
+        </w:rPr>
+        <w:t xml:space="preserve">, </w:t>
+      </w:r>
+      <w:r>
+        <w:rPr>
+          <w:rFonts w:ascii="Arial" w:hAnsi="Arial"/>
+          <w:b w:val="0"/>
+          <w:i/>
+          <w:sz w:val="19"/>
+        </w:rPr>
+        <w:t>Thomson Reuters</w:t>
+      </w:r>
+      <w:r>
+        <w:rPr>
+          <w:rFonts w:ascii="Arial" w:hAnsi="Arial"/>
+          <w:b w:val="0"/>
+          <w:i w:val="0"/>
+          <w:sz w:val="19"/>
+        </w:rPr>
+        <w:t xml:space="preserve">, </w:t>
+      </w:r>
+      <w:r>
+        <w:rPr>
+          <w:rFonts w:ascii="Arial" w:hAnsi="Arial"/>
+          <w:b w:val="0"/>
+          <w:i/>
+          <w:sz w:val="19"/>
+        </w:rPr>
+        <w:t>Cloudflare</w:t>
+      </w:r>
+      <w:r>
+        <w:rPr>
+          <w:rFonts w:ascii="Arial" w:hAnsi="Arial"/>
+          <w:b w:val="0"/>
+          <w:i w:val="0"/>
+          <w:sz w:val="19"/>
+        </w:rPr>
+        <w:t>) und mit Rückwirkung auf § 9.1 (Kausalattributions­problematik selbstpositionierter „AI-First"-Layoffs, die Substitutions­kausalität dementieren, aber KI als strategischen Anlass benennen). https://techcrunch.com/2026/07/22/monday-com-lays-off-hundreds-to-focuses-on-ai/ | https://finance.yahoo.com/technology/ai/articles/monday-com-cuts-hundreds-jobs-155900591.html | https://www.haaretz.com/israel-news/tech-news/2026-07-22/ty-article/.premium/israeli-tech-firm-monday-com-to-lay-off-fifth-of-workers-as-shares-dip-by-50/0000019f-8934-d460-abff-cf7cb8f90000 | https://www.timesofisrael.com/liveblog_entry/monday-com-cutting-hundreds-of-jobs-as-it-embraces-ai/ | https://www.calcalistech.com/ctechnews/article/udx1nmbdq | https://thenextweb.com/news/monday-com-layoffs-20-percent-ai-growth-strategy | https://americanbazaaronline.com/2026/07/23/monday-com-cuts-20-of-workforce-to-restructure-for-ai-era-485112/ | https://www.machinebrief.com/news/monday-com-620-layoffs-20-percent-workforce-ai-restructuring-july-2026</w:t>
+      </w:r>
+    </w:p>
+    <w:p>
+      <w:pPr>
+        <w:jc w:val="both"/>
+      </w:pPr>
+      <w:r>
+        <w:rPr>
+          <w:rFonts w:ascii="Arial" w:hAnsi="Arial"/>
           <w:b/>
           <w:i w:val="0"/>
           <w:sz w:val="19"/>
@@ -19123,7 +19583,7 @@
           <w:i w:val="0"/>
           <w:sz w:val="19"/>
         </w:rPr>
-        <w:t xml:space="preserve"> Dieses Arbeitspapier gibt den Stand Ende Juli 2026 (Schnitt am 26. Juli 2026 — Lauf 001 vom 26. Juli 2026) wieder. Die Debatte entwickelt sich dynamisch, insbesondere im Zuge der OpenAI-Strategiepapiere und der Eröffnung des OpenAI Workshop in Washington, D.C. im Mai 2026, des Erstdurchgangs des GKV-Beitragssatzstabilisierungsgesetzes in der 1065. Bundesratssitzung am 8. Mai 2026 mit 79 Tagesordnungspunkten (Kabinettsbeschluss 29. April 2026, parlamentarische Behandlung vor der Sommerpause 2026 angekündigt), der laufenden Trilog-Verhandlungen zum Digital Omnibus on AI (zweite Runde 28. April 2026 ohne Einigung; nächste Runde 13. Mai 2026 — Knackpunkt ist nicht die Verschiebung der Hochrisiko-Pflichten, sondern die Konformitätsbewertungs-Architektur für Anhang I; die zypriotische Ratspräsidentschaft strebt einen Abschluss vor Ablauf ihrer Amtszeit am 30. Juni 2026 an, andernfalls übernimmt die irische Präsidentschaft), der am 5. Mai 2026 erfolgten Arraignment-Verhandlung im Altman-Verfahren mit „nicht schuldig"-Plädoyer und angeordneter psychiatrischer Begutachtung, des am 7. Mai 2026 versandten individuellen Microsoft-Buyout-Angebots (Annahmefrist 8. Juni 2026, VRSAR-Unterzeichnung 9.–22. Juni 2026, bis zu fünfjährige Krankenversicherungs-Verlängerung), des am 1. Mai 2026 vom Connecticut-Repräsentantenhaus mit 131 zu 17 Stimmen verabschiedeten </w:t>
+        <w:t xml:space="preserve"> Dieses Arbeitspapier gibt den Stand Ende Juli 2026 (Schnitt am 27. Juli 2026 — Lauf 001 vom 27. Juli 2026) wieder. Die Debatte entwickelt sich dynamisch, insbesondere im Zuge der OpenAI-Strategiepapiere und der Eröffnung des OpenAI Workshop in Washington, D.C. im Mai 2026, des Erstdurchgangs des GKV-Beitragssatzstabilisierungsgesetzes in der 1065. Bundesratssitzung am 8. Mai 2026 mit 79 Tagesordnungspunkten (Kabinettsbeschluss 29. April 2026, parlamentarische Behandlung vor der Sommerpause 2026 angekündigt), der laufenden Trilog-Verhandlungen zum Digital Omnibus on AI (zweite Runde 28. April 2026 ohne Einigung; nächste Runde 13. Mai 2026 — Knackpunkt ist nicht die Verschiebung der Hochrisiko-Pflichten, sondern die Konformitätsbewertungs-Architektur für Anhang I; die zypriotische Ratspräsidentschaft strebt einen Abschluss vor Ablauf ihrer Amtszeit am 30. Juni 2026 an, andernfalls übernimmt die irische Präsidentschaft), der am 5. Mai 2026 erfolgten Arraignment-Verhandlung im Altman-Verfahren mit „nicht schuldig"-Plädoyer und angeordneter psychiatrischer Begutachtung, des am 7. Mai 2026 versandten individuellen Microsoft-Buyout-Angebots (Annahmefrist 8. Juni 2026, VRSAR-Unterzeichnung 9.–22. Juni 2026, bis zu fünfjährige Krankenversicherungs-Verlängerung), des am 1. Mai 2026 vom Connecticut-Repräsentantenhaus mit 131 zu 17 Stimmen verabschiedeten </w:t>
       </w:r>
       <w:r>
         <w:rPr>
@@ -21589,7 +22049,115 @@
           <w:i w:val="0"/>
           <w:sz w:val="19"/>
         </w:rPr>
-        <w:t>-Analysen (US-Arbeitslosenquote 4,2 % im Juni 2026, Prime-Age-Employment nahe Mehrdekaden-Hoch, keine relative Verschlechterung KI-exponierter Berufe, „stubbornly jagged" AI-Fähigkeitsprofil, frühe Warnsignale schwächerer Einstellungsdynamik bei jüngeren Beschäftigten in exponierten Rollen; datenbasierte Zurücknahme der Amodei-50-%-White-Collar-Prognose) — Aufnahme in § 3.5 mit Rückwirkung auf § 8.4 und § 9.1 sowie Neueintrag in § 11.3. Eine regelmäßige Aktualisierung ist vorgesehen.</w:t>
+        <w:t xml:space="preserve">-Analysen (US-Arbeitslosenquote 4,2 % im Juni 2026, Prime-Age-Employment nahe Mehrdekaden-Hoch, keine relative Verschlechterung KI-exponierter Berufe, „stubbornly jagged" AI-Fähigkeitsprofil, frühe Warnsignale schwächerer Einstellungsdynamik bei jüngeren Beschäftigten in exponierten Rollen; datenbasierte Zurücknahme der Amodei-50-%-White-Collar-Prognose) — Aufnahme in § 3.5 mit Rückwirkung auf § 8.4 und § 9.1 sowie Neueintrag in § 11.3. In Version 47.0 (Schnitt am 27. Juli 2026 — Lauf 001 vom 27. Juli 2026) werden zwei belegbare Neuzugänge aus dem 7-Tage- bzw. 48-Stunden-Fenster ergänzt: (1) die am 22. Juli 2026 vom israelischen Work-Management-Anbieter </w:t>
+      </w:r>
+      <w:r>
+        <w:rPr>
+          <w:rFonts w:ascii="Arial" w:hAnsi="Arial"/>
+          <w:b w:val="0"/>
+          <w:i/>
+          <w:sz w:val="19"/>
+        </w:rPr>
+        <w:t>monday.com Ltd.</w:t>
+      </w:r>
+      <w:r>
+        <w:rPr>
+          <w:rFonts w:ascii="Arial" w:hAnsi="Arial"/>
+          <w:b w:val="0"/>
+          <w:i w:val="0"/>
+          <w:sz w:val="19"/>
+        </w:rPr>
+        <w:t xml:space="preserve"> (NASDAQ: MNDY) angekündigte AI-First-Restrukturierung mit rund 620 Streichungen (20 % der globalen Belegschaft, davon rund 350 in Tel Aviv), 45–55 Millionen US-Dollar Restrukturierungsaufwand und expliziter Selbstpositionierung als strategische, nicht substitutions- oder kostenbezogene Reduktion — Aufnahme in § 1.1 mit Rückwirkung auf § 9.1 (Kausalattributions­problematik selbstpositionierter „AI-First"-Layoffs) und Neueintrag in § 11.5; und (2) die am 24. Juli 2026 von </w:t>
+      </w:r>
+      <w:r>
+        <w:rPr>
+          <w:rFonts w:ascii="Arial" w:hAnsi="Arial"/>
+          <w:b w:val="0"/>
+          <w:i/>
+          <w:sz w:val="19"/>
+        </w:rPr>
+        <w:t>Anthropic</w:t>
+      </w:r>
+      <w:r>
+        <w:rPr>
+          <w:rFonts w:ascii="Arial" w:hAnsi="Arial"/>
+          <w:b w:val="0"/>
+          <w:i w:val="0"/>
+          <w:sz w:val="19"/>
+        </w:rPr>
+        <w:t xml:space="preserve"> veröffentlichte Frontier-Modell-Freigabe </w:t>
+      </w:r>
+      <w:r>
+        <w:rPr>
+          <w:rFonts w:ascii="Arial" w:hAnsi="Arial"/>
+          <w:b w:val="0"/>
+          <w:i/>
+          <w:sz w:val="19"/>
+        </w:rPr>
+        <w:t>Claude Opus 5</w:t>
+      </w:r>
+      <w:r>
+        <w:rPr>
+          <w:rFonts w:ascii="Arial" w:hAnsi="Arial"/>
+          <w:b w:val="0"/>
+          <w:i w:val="0"/>
+          <w:sz w:val="19"/>
+        </w:rPr>
+        <w:t xml:space="preserve"> — 5 US-Dollar Input / 25 US-Dollar Output pro Million Token, halbes Preisniveau gegenüber </w:t>
+      </w:r>
+      <w:r>
+        <w:rPr>
+          <w:rFonts w:ascii="Arial" w:hAnsi="Arial"/>
+          <w:b w:val="0"/>
+          <w:i/>
+          <w:sz w:val="19"/>
+        </w:rPr>
+        <w:t>Claude Fable 5</w:t>
+      </w:r>
+      <w:r>
+        <w:rPr>
+          <w:rFonts w:ascii="Arial" w:hAnsi="Arial"/>
+          <w:b w:val="0"/>
+          <w:i w:val="0"/>
+          <w:sz w:val="19"/>
+        </w:rPr>
+        <w:t xml:space="preserve"> bei nahe Fable-5 liegenden Fähigkeitsniveaus, 1-Millionen-Token-Kontextfenster, adaptiver Denkmodus, fünfstufige </w:t>
+      </w:r>
+      <w:r>
+        <w:rPr>
+          <w:rFonts w:ascii="Arial" w:hAnsi="Arial"/>
+          <w:b w:val="0"/>
+          <w:i/>
+          <w:sz w:val="19"/>
+        </w:rPr>
+        <w:t>effort</w:t>
+      </w:r>
+      <w:r>
+        <w:rPr>
+          <w:rFonts w:ascii="Arial" w:hAnsi="Arial"/>
+          <w:b w:val="0"/>
+          <w:i w:val="0"/>
+          <w:sz w:val="19"/>
+        </w:rPr>
+        <w:t xml:space="preserve">-Skala, laut Hersteller bislang stärkste Alignment-Leistung — Aufnahme in § 8.2 als weiterer Datenpunkt der deflationären Inferenzpreis-Dynamik mit Rückwirkung auf die </w:t>
+      </w:r>
+      <w:r>
+        <w:rPr>
+          <w:rFonts w:ascii="Arial" w:hAnsi="Arial"/>
+          <w:b w:val="0"/>
+          <w:i/>
+          <w:sz w:val="19"/>
+        </w:rPr>
+        <w:t>Veredelungsstrategie</w:t>
+      </w:r>
+      <w:r>
+        <w:rPr>
+          <w:rFonts w:ascii="Arial" w:hAnsi="Arial"/>
+          <w:b w:val="0"/>
+          <w:i w:val="0"/>
+          <w:sz w:val="19"/>
+        </w:rPr>
+        <w:t xml:space="preserve"> (§ 8.3) und Neueintrag in § 11.5. Eine regelmäßige Aktualisierung ist vorgesehen.</w:t>
       </w:r>
     </w:p>
     <w:p>
@@ -21669,7 +22237,7 @@
         <w:color w:val="999999"/>
         <w:sz w:val="15"/>
       </w:rPr>
-      <w:t>Version 46.0 — Mai 2026 — CC BY 4.0</w:t>
+      <w:t>Version 47.0 — Mai 2026 — CC BY 4.0</w:t>
       <w:tab/>
       <w:t xml:space="preserve">Seite </w:t>
     </w:r>

</xml_diff>